<commit_message>
Updating Intro Lab Manual to latest version of required tools
</commit_message>
<xml_diff>
--- a/.internal/Manual/Intro to PSOC Edge E84 - Part 2 (E2)/PSoC Edge E84 Introductory E2 Training Manual -WIP_10_21_2025.docx
+++ b/.internal/Manual/Intro to PSOC Edge E84 - Part 2 (E2)/PSoC Edge E84 Introductory E2 Training Manual -WIP_10_21_2025.docx
@@ -10,71 +10,69 @@
         </w:rPr>
       </w:pPr>
       <w:bookmarkStart w:id="0" w:name="_Toc385505508"/>
-      <w:bookmarkStart w:id="1" w:name="_GoBack"/>
+      <w:r>
+        <w:rPr>
+          <w:b w:val="0"/>
+        </w:rPr>
+        <w:t>Training</w:t>
+      </w:r>
+      <w:r>
+        <w:rPr>
+          <w:b w:val="0"/>
+        </w:rPr>
+        <w:t xml:space="preserve"> Manual for getting started with PS</w:t>
+      </w:r>
+      <w:r>
+        <w:rPr>
+          <w:b w:val="0"/>
+        </w:rPr>
+        <w:t>O</w:t>
+      </w:r>
+      <w:r>
+        <w:rPr>
+          <w:b w:val="0"/>
+        </w:rPr>
+        <w:t xml:space="preserve">C™ Edge E84 MCU applications </w:t>
+      </w:r>
+      <w:r>
+        <w:rPr>
+          <w:b w:val="0"/>
+        </w:rPr>
+        <w:t xml:space="preserve">using </w:t>
+      </w:r>
+      <w:r>
+        <w:rPr>
+          <w:b w:val="0"/>
+        </w:rPr>
+        <w:t>Modus Toolbox™ software</w:t>
+      </w:r>
+    </w:p>
+    <w:p>
+      <w:pPr>
+        <w:pStyle w:val="HeadingPreface"/>
+        <w:rPr>
+          <w:b w:val="0"/>
+        </w:rPr>
+      </w:pPr>
+      <w:bookmarkStart w:id="1" w:name="_Toc430947631"/>
+      <w:bookmarkStart w:id="2" w:name="_Toc431284129"/>
+      <w:bookmarkStart w:id="3" w:name="_Toc431374932"/>
+      <w:bookmarkStart w:id="4" w:name="_Toc431889535"/>
+      <w:bookmarkStart w:id="5" w:name="_Toc431980074"/>
+      <w:bookmarkStart w:id="6" w:name="_Toc192780010"/>
+      <w:r>
+        <w:rPr>
+          <w:b w:val="0"/>
+        </w:rPr>
+        <w:t>About this document</w:t>
+      </w:r>
+      <w:bookmarkEnd w:id="0"/>
       <w:bookmarkEnd w:id="1"/>
-      <w:r>
-        <w:rPr>
-          <w:b w:val="0"/>
-        </w:rPr>
-        <w:t>Training</w:t>
-      </w:r>
-      <w:r>
-        <w:rPr>
-          <w:b w:val="0"/>
-        </w:rPr>
-        <w:t xml:space="preserve"> Manual for getting started with PS</w:t>
-      </w:r>
-      <w:r>
-        <w:rPr>
-          <w:b w:val="0"/>
-        </w:rPr>
-        <w:t>O</w:t>
-      </w:r>
-      <w:r>
-        <w:rPr>
-          <w:b w:val="0"/>
-        </w:rPr>
-        <w:t xml:space="preserve">C™ Edge E84 MCU applications </w:t>
-      </w:r>
-      <w:r>
-        <w:rPr>
-          <w:b w:val="0"/>
-        </w:rPr>
-        <w:t xml:space="preserve">using </w:t>
-      </w:r>
-      <w:r>
-        <w:rPr>
-          <w:b w:val="0"/>
-        </w:rPr>
-        <w:t>Modus Toolbox™ software</w:t>
-      </w:r>
-    </w:p>
-    <w:p>
-      <w:pPr>
-        <w:pStyle w:val="HeadingPreface"/>
-        <w:rPr>
-          <w:b w:val="0"/>
-        </w:rPr>
-      </w:pPr>
-      <w:bookmarkStart w:id="2" w:name="_Toc430947631"/>
-      <w:bookmarkStart w:id="3" w:name="_Toc431284129"/>
-      <w:bookmarkStart w:id="4" w:name="_Toc431374932"/>
-      <w:bookmarkStart w:id="5" w:name="_Toc431889535"/>
-      <w:bookmarkStart w:id="6" w:name="_Toc431980074"/>
-      <w:bookmarkStart w:id="7" w:name="_Toc192780010"/>
-      <w:r>
-        <w:rPr>
-          <w:b w:val="0"/>
-        </w:rPr>
-        <w:t>About this document</w:t>
-      </w:r>
-      <w:bookmarkEnd w:id="0"/>
       <w:bookmarkEnd w:id="2"/>
       <w:bookmarkEnd w:id="3"/>
       <w:bookmarkEnd w:id="4"/>
       <w:bookmarkEnd w:id="5"/>
       <w:bookmarkEnd w:id="6"/>
-      <w:bookmarkEnd w:id="7"/>
     </w:p>
     <w:p>
       <w:pPr>
@@ -171,19 +169,19 @@
           <w:b w:val="0"/>
         </w:rPr>
       </w:pPr>
-      <w:bookmarkStart w:id="8" w:name="_Toc431889536"/>
-      <w:bookmarkStart w:id="9" w:name="_Toc431980075"/>
-      <w:bookmarkStart w:id="10" w:name="_Toc192780011"/>
-      <w:bookmarkStart w:id="11" w:name="_Toc430947633"/>
+      <w:bookmarkStart w:id="7" w:name="_Toc431889536"/>
+      <w:bookmarkStart w:id="8" w:name="_Toc431980075"/>
+      <w:bookmarkStart w:id="9" w:name="_Toc192780011"/>
+      <w:bookmarkStart w:id="10" w:name="_Toc430947633"/>
       <w:r>
         <w:rPr>
           <w:b w:val="0"/>
         </w:rPr>
         <w:t>Table of contents</w:t>
       </w:r>
+      <w:bookmarkEnd w:id="7"/>
       <w:bookmarkEnd w:id="8"/>
       <w:bookmarkEnd w:id="9"/>
-      <w:bookmarkEnd w:id="10"/>
     </w:p>
     <w:sdt>
       <w:sdtPr>
@@ -1999,13 +1997,13 @@
           <w:tab w:val="num" w:pos="1762"/>
         </w:tabs>
       </w:pPr>
-      <w:bookmarkStart w:id="12" w:name="_Toc192780012"/>
-      <w:bookmarkEnd w:id="11"/>
+      <w:bookmarkStart w:id="11" w:name="_Toc192780012"/>
+      <w:bookmarkEnd w:id="10"/>
       <w:r>
         <w:lastRenderedPageBreak/>
         <w:t>Introduction</w:t>
       </w:r>
-      <w:bookmarkEnd w:id="12"/>
+      <w:bookmarkEnd w:id="11"/>
     </w:p>
     <w:p>
       <w:pPr>
@@ -2111,13 +2109,13 @@
           <w:tab w:val="num" w:pos="1762"/>
         </w:tabs>
       </w:pPr>
-      <w:bookmarkStart w:id="13" w:name="_Required_development_tools"/>
-      <w:bookmarkStart w:id="14" w:name="_Toc192780013"/>
+      <w:bookmarkStart w:id="12" w:name="_Required_development_tools"/>
+      <w:bookmarkStart w:id="13" w:name="_Toc192780013"/>
+      <w:bookmarkEnd w:id="12"/>
+      <w:r>
+        <w:t>Required development tools</w:t>
+      </w:r>
       <w:bookmarkEnd w:id="13"/>
-      <w:r>
-        <w:t>Required development tools</w:t>
-      </w:r>
-      <w:bookmarkEnd w:id="14"/>
     </w:p>
     <w:p>
       <w:pPr>
@@ -2137,6 +2135,7 @@
         </w:rPr>
       </w:pPr>
       <w:hyperlink r:id="rId16" w:history="1">
+        <w:proofErr w:type="spellStart"/>
         <w:r>
           <w:rPr>
             <w:rFonts w:cs="Arial"/>
@@ -2147,7 +2146,20 @@
             <w:u w:val="single"/>
             <w:lang w:val="en-IN" w:eastAsia="en-IN"/>
           </w:rPr>
-          <w:t>ModusToolbox™ software</w:t>
+          <w:t>ModusToolbox</w:t>
+        </w:r>
+        <w:proofErr w:type="spellEnd"/>
+        <w:r>
+          <w:rPr>
+            <w:rFonts w:cs="Arial"/>
+            <w:color w:val="0000FF"/>
+            <w:spacing w:val="3"/>
+            <w:sz w:val="24"/>
+            <w:szCs w:val="24"/>
+            <w:u w:val="single"/>
+            <w:lang w:val="en-IN" w:eastAsia="en-IN"/>
+          </w:rPr>
+          <w:t>™ software</w:t>
         </w:r>
       </w:hyperlink>
       <w:r>
@@ -2170,7 +2182,7 @@
           <w:szCs w:val="24"/>
           <w:lang w:val="en-IN" w:eastAsia="en-IN"/>
         </w:rPr>
-        <w:t>3</w:t>
+        <w:t>6</w:t>
       </w:r>
       <w:r>
         <w:rPr>
@@ -2192,7 +2204,7 @@
           <w:szCs w:val="24"/>
           <w:lang w:val="en-IN" w:eastAsia="en-IN"/>
         </w:rPr>
-        <w:t>3</w:t>
+        <w:t>6</w:t>
       </w:r>
       <w:r>
         <w:rPr>
@@ -2223,6 +2235,7 @@
           <w:lang w:val="en-IN" w:eastAsia="en-IN"/>
         </w:rPr>
       </w:pPr>
+      <w:proofErr w:type="spellStart"/>
       <w:r>
         <w:rPr>
           <w:rFonts w:cs="Arial"/>
@@ -2232,18 +2245,10 @@
           <w:szCs w:val="24"/>
           <w:lang w:val="en-IN" w:eastAsia="en-IN"/>
         </w:rPr>
-        <w:t>ModusToolbox™ Programming Tools v1.2.1.</w:t>
-      </w:r>
-    </w:p>
-    <w:p>
-      <w:pPr>
-        <w:keepNext/>
-        <w:numPr>
-          <w:ilvl w:val="0"/>
-          <w:numId w:val="26"/>
-        </w:numPr>
-        <w:shd w:val="clear" w:color="auto" w:fill="FFFFFF"/>
-        <w:spacing w:before="160" w:after="160"/>
+        <w:t>ModusToolbox</w:t>
+      </w:r>
+      <w:proofErr w:type="spellEnd"/>
+      <w:r>
         <w:rPr>
           <w:rFonts w:cs="Arial"/>
           <w:color w:val="2D3D50"/>
@@ -2252,28 +2257,7 @@
           <w:szCs w:val="24"/>
           <w:lang w:val="en-IN" w:eastAsia="en-IN"/>
         </w:rPr>
-      </w:pPr>
-      <w:bookmarkStart w:id="15" w:name="_Hlk159938679"/>
-      <w:r>
-        <w:rPr>
-          <w:rFonts w:cs="Arial"/>
-          <w:spacing w:val="3"/>
-          <w:sz w:val="24"/>
-          <w:szCs w:val="24"/>
-          <w:lang w:val="en-IN" w:eastAsia="en-IN"/>
-        </w:rPr>
-        <w:t xml:space="preserve">ModusToolbox™ PSOC™ E84 Early Access </w:t>
-      </w:r>
-      <w:bookmarkEnd w:id="15"/>
-      <w:r>
-        <w:rPr>
-          <w:rFonts w:cs="Arial"/>
-          <w:spacing w:val="3"/>
-          <w:sz w:val="24"/>
-          <w:szCs w:val="24"/>
-          <w:lang w:val="en-IN" w:eastAsia="en-IN"/>
-        </w:rPr>
-        <w:t>Pack v0.2.5</w:t>
+        <w:t>™ Programming Tools v1.</w:t>
       </w:r>
       <w:r>
         <w:rPr>
@@ -2284,36 +2268,7 @@
           <w:szCs w:val="24"/>
           <w:lang w:val="en-IN" w:eastAsia="en-IN"/>
         </w:rPr>
-        <w:t xml:space="preserve">. </w:t>
-      </w:r>
-    </w:p>
-    <w:p>
-      <w:pPr>
-        <w:numPr>
-          <w:ilvl w:val="1"/>
-          <w:numId w:val="26"/>
-        </w:numPr>
-        <w:shd w:val="clear" w:color="auto" w:fill="FFFFFF"/>
-        <w:spacing w:before="160" w:after="160"/>
-        <w:rPr>
-          <w:rFonts w:cs="Arial"/>
-          <w:color w:val="2D3D50"/>
-          <w:spacing w:val="3"/>
-          <w:sz w:val="24"/>
-          <w:szCs w:val="24"/>
-          <w:lang w:val="en-IN" w:eastAsia="en-IN"/>
-        </w:rPr>
-      </w:pPr>
-      <w:r>
-        <w:rPr>
-          <w:rFonts w:cs="Arial"/>
-          <w:color w:val="2D3D50"/>
-          <w:spacing w:val="3"/>
-          <w:sz w:val="24"/>
-          <w:szCs w:val="24"/>
-          <w:lang w:val="en-IN" w:eastAsia="en-IN"/>
-        </w:rPr>
-        <w:t>Edge Protect Tools v1.1.0.10253.</w:t>
+        <w:t>6.0</w:t>
       </w:r>
     </w:p>
     <w:p>
@@ -2533,7 +2488,40 @@
           <w:szCs w:val="20"/>
           <w:lang w:val="en-IN" w:eastAsia="en-IN"/>
         </w:rPr>
-        <w:t>KIT_PSOCE84_EVK</w:t>
+        <w:t>KIT_P</w:t>
+      </w:r>
+      <w:r>
+        <w:rPr>
+          <w:rFonts w:cs="Arial"/>
+          <w:color w:val="2D3D50"/>
+          <w:spacing w:val="3"/>
+          <w:sz w:val="20"/>
+          <w:szCs w:val="20"/>
+          <w:lang w:val="en-IN" w:eastAsia="en-IN"/>
+        </w:rPr>
+        <w:t>S</w:t>
+      </w:r>
+      <w:r>
+        <w:rPr>
+          <w:rFonts w:cs="Arial"/>
+          <w:color w:val="2D3D50"/>
+          <w:spacing w:val="3"/>
+          <w:sz w:val="20"/>
+          <w:szCs w:val="20"/>
+          <w:lang w:val="en-IN" w:eastAsia="en-IN"/>
+        </w:rPr>
+        <w:t>E84_EV</w:t>
+      </w:r>
+      <w:r>
+        <w:rPr>
+          <w:rFonts w:cs="Arial"/>
+          <w:color w:val="2D3D50"/>
+          <w:spacing w:val="3"/>
+          <w:sz w:val="20"/>
+          <w:szCs w:val="20"/>
+          <w:lang w:val="en-IN" w:eastAsia="en-IN"/>
+        </w:rPr>
+        <w:t>AL Rev G</w:t>
       </w:r>
       <w:r>
         <w:rPr>
@@ -2574,7 +2562,7 @@
           <w:szCs w:val="24"/>
           <w:lang w:val="en-IN" w:eastAsia="en-IN"/>
         </w:rPr>
-        <w:t>Ensure BOOT SW should be in 'High'/ON position</w:t>
+        <w:t xml:space="preserve">Ensure BOOT SW </w:t>
       </w:r>
       <w:r>
         <w:rPr>
@@ -2585,6 +2573,28 @@
           <w:szCs w:val="24"/>
           <w:lang w:val="en-IN" w:eastAsia="en-IN"/>
         </w:rPr>
+        <w:t xml:space="preserve">(SW6) </w:t>
+      </w:r>
+      <w:r>
+        <w:rPr>
+          <w:rFonts w:cs="Arial"/>
+          <w:color w:val="2D3D50"/>
+          <w:spacing w:val="3"/>
+          <w:sz w:val="24"/>
+          <w:szCs w:val="24"/>
+          <w:lang w:val="en-IN" w:eastAsia="en-IN"/>
+        </w:rPr>
+        <w:t>should be in 'High'/ON position</w:t>
+      </w:r>
+      <w:r>
+        <w:rPr>
+          <w:rFonts w:cs="Arial"/>
+          <w:color w:val="2D3D50"/>
+          <w:spacing w:val="3"/>
+          <w:sz w:val="24"/>
+          <w:szCs w:val="24"/>
+          <w:lang w:val="en-IN" w:eastAsia="en-IN"/>
+        </w:rPr>
         <w:t>.</w:t>
       </w:r>
     </w:p>
@@ -2605,7 +2615,7 @@
           <w:lang w:val="en-IN" w:eastAsia="en-IN"/>
         </w:rPr>
       </w:pPr>
-      <w:bookmarkStart w:id="16" w:name="_mioConsistencyCheck20"/>
+      <w:bookmarkStart w:id="14" w:name="_mioConsistencyCheck20"/>
       <w:r>
         <w:rPr>
           <w:b/>
@@ -2620,10 +2630,38 @@
           <w:sz w:val="24"/>
           <w:szCs w:val="24"/>
         </w:rPr>
-        <w:t xml:space="preserve"> For KIT_PSOCE84_EVK rev. **, BOOT SW pin is BOOT.1 (P17.6).</w:t>
-      </w:r>
-    </w:p>
-    <w:bookmarkEnd w:id="16"/>
+        <w:t xml:space="preserve"> For KIT_PSE84_EV</w:t>
+      </w:r>
+      <w:r>
+        <w:rPr>
+          <w:sz w:val="24"/>
+          <w:szCs w:val="24"/>
+        </w:rPr>
+        <w:t>AL</w:t>
+      </w:r>
+      <w:r>
+        <w:rPr>
+          <w:sz w:val="24"/>
+          <w:szCs w:val="24"/>
+        </w:rPr>
+        <w:t xml:space="preserve"> rev. </w:t>
+      </w:r>
+      <w:r>
+        <w:rPr>
+          <w:sz w:val="24"/>
+          <w:szCs w:val="24"/>
+        </w:rPr>
+        <w:t>G</w:t>
+      </w:r>
+      <w:r>
+        <w:rPr>
+          <w:sz w:val="24"/>
+          <w:szCs w:val="24"/>
+        </w:rPr>
+        <w:t>, BOOT SW pin is BOOT.1 (P17.6)</w:t>
+      </w:r>
+    </w:p>
+    <w:bookmarkEnd w:id="14"/>
     <w:p>
       <w:pPr>
         <w:numPr>
@@ -2681,6 +2719,30 @@
         </w:rPr>
         <w:t>Tera Term</w:t>
       </w:r>
+      <w:r>
+        <w:rPr>
+          <w:rFonts w:cs="Arial"/>
+          <w:color w:val="2D3D50"/>
+          <w:spacing w:val="3"/>
+          <w:sz w:val="24"/>
+          <w:szCs w:val="24"/>
+          <w:lang w:val="en-IN" w:eastAsia="en-IN"/>
+        </w:rPr>
+        <w:t xml:space="preserve"> or Pu</w:t>
+      </w:r>
+      <w:r>
+        <w:rPr>
+          <w:rFonts w:cs="Arial"/>
+          <w:color w:val="2D3D50"/>
+          <w:spacing w:val="3"/>
+          <w:sz w:val="24"/>
+          <w:szCs w:val="24"/>
+          <w:lang w:val="en-IN" w:eastAsia="en-IN"/>
+        </w:rPr>
+        <w:t>TTY</w:t>
+      </w:r>
+      <w:bookmarkStart w:id="15" w:name="_GoBack"/>
+      <w:bookmarkEnd w:id="15"/>
     </w:p>
     <w:p>
       <w:pPr>
@@ -2690,16 +2752,16 @@
           <w:tab w:val="num" w:pos="1762"/>
         </w:tabs>
       </w:pPr>
-      <w:bookmarkStart w:id="17" w:name="_Toc192780014"/>
+      <w:bookmarkStart w:id="16" w:name="_Toc192780014"/>
       <w:r>
         <w:t>Prerequisites</w:t>
       </w:r>
-      <w:bookmarkEnd w:id="17"/>
+      <w:bookmarkEnd w:id="16"/>
       <w:r>
         <w:t xml:space="preserve"> </w:t>
       </w:r>
     </w:p>
-    <w:bookmarkStart w:id="18" w:name="_mioConsistencyCheck465"/>
+    <w:bookmarkStart w:id="17" w:name="_mioConsistencyCheck465"/>
     <w:p>
       <w:pPr>
         <w:pStyle w:val="Body"/>
@@ -2750,7 +2812,7 @@
         </w:rPr>
         <w:fldChar w:fldCharType="end"/>
       </w:r>
-      <w:bookmarkEnd w:id="18"/>
+      <w:bookmarkEnd w:id="17"/>
       <w:r>
         <w:rPr>
           <w:sz w:val="24"/>
@@ -2870,7 +2932,7 @@
           <w:szCs w:val="24"/>
         </w:rPr>
       </w:pPr>
-      <w:bookmarkStart w:id="19" w:name="_mioConsistencyCheck25"/>
+      <w:bookmarkStart w:id="18" w:name="_mioConsistencyCheck25"/>
       <w:r>
         <w:rPr>
           <w:sz w:val="24"/>
@@ -2878,7 +2940,7 @@
         </w:rPr>
         <w:t xml:space="preserve">Download and install the </w:t>
       </w:r>
-      <w:bookmarkEnd w:id="19"/>
+      <w:bookmarkEnd w:id="18"/>
       <w:r>
         <w:rPr>
           <w:rFonts w:cs="Segoe UI"/>
@@ -2890,8 +2952,8 @@
         </w:rPr>
         <w:t> </w:t>
       </w:r>
-      <w:bookmarkStart w:id="20" w:name="_mioConsistencyCheck26"/>
-      <w:bookmarkStart w:id="21" w:name="_mioConsistencyCheck469"/>
+      <w:bookmarkStart w:id="19" w:name="_mioConsistencyCheck26"/>
+      <w:bookmarkStart w:id="20" w:name="_mioConsistencyCheck469"/>
       <w:r>
         <w:fldChar w:fldCharType="begin"/>
       </w:r>
@@ -2924,8 +2986,8 @@
         <w:fldChar w:fldCharType="end"/>
       </w:r>
     </w:p>
+    <w:bookmarkEnd w:id="19"/>
     <w:bookmarkEnd w:id="20"/>
-    <w:bookmarkEnd w:id="21"/>
     <w:p>
       <w:pPr>
         <w:pStyle w:val="Body"/>
@@ -3027,7 +3089,7 @@
         </w:rPr>
         <w:t>: C:\Users\ {username} \</w:t>
       </w:r>
-      <w:bookmarkStart w:id="22" w:name="_mioConsistencyCheck1025"/>
+      <w:bookmarkStart w:id="21" w:name="_mioConsistencyCheck1025"/>
       <w:r>
         <w:rPr>
           <w:i/>
@@ -3037,7 +3099,7 @@
         </w:rPr>
         <w:t>ModusToolbox</w:t>
       </w:r>
-      <w:bookmarkEnd w:id="22"/>
+      <w:bookmarkEnd w:id="21"/>
       <w:r>
         <w:rPr>
           <w:i/>
@@ -3084,7 +3146,7 @@
         </w:rPr>
         <w:t>/opt/Tools/</w:t>
       </w:r>
-      <w:bookmarkStart w:id="23" w:name="_mioConsistencyCheck1026"/>
+      <w:bookmarkStart w:id="22" w:name="_mioConsistencyCheck1026"/>
       <w:r>
         <w:rPr>
           <w:i/>
@@ -3094,7 +3156,7 @@
         </w:rPr>
         <w:t>ModusToolbox</w:t>
       </w:r>
-      <w:bookmarkEnd w:id="23"/>
+      <w:bookmarkEnd w:id="22"/>
       <w:r>
         <w:rPr>
           <w:i/>
@@ -3465,7 +3527,7 @@
           <w:lang w:eastAsia="de-DE"/>
         </w:rPr>
       </w:pPr>
-      <w:bookmarkStart w:id="24" w:name="_Toc192780015"/>
+      <w:bookmarkStart w:id="23" w:name="_Toc192780015"/>
       <w:r>
         <w:rPr>
           <w:b/>
@@ -3497,7 +3559,7 @@
         </w:rPr>
         <w:t>using HAL</w:t>
       </w:r>
-      <w:bookmarkEnd w:id="24"/>
+      <w:bookmarkEnd w:id="23"/>
       <w:r>
         <w:rPr>
           <w:b/>
@@ -3539,7 +3601,7 @@
           <w:lang w:eastAsia="de-DE"/>
         </w:rPr>
       </w:pPr>
-      <w:bookmarkStart w:id="25" w:name="_Toc192780016"/>
+      <w:bookmarkStart w:id="24" w:name="_Toc192780016"/>
       <w:r>
         <w:rPr>
           <w:b/>
@@ -3550,7 +3612,7 @@
         </w:rPr>
         <w:t>Objective</w:t>
       </w:r>
-      <w:bookmarkEnd w:id="25"/>
+      <w:bookmarkEnd w:id="24"/>
     </w:p>
     <w:p>
       <w:pPr>
@@ -3621,11 +3683,11 @@
       <w:pPr>
         <w:pStyle w:val="Heading2"/>
       </w:pPr>
-      <w:bookmarkStart w:id="26" w:name="_Toc192780017"/>
+      <w:bookmarkStart w:id="25" w:name="_Toc192780017"/>
       <w:r>
         <w:t>Description</w:t>
       </w:r>
-      <w:bookmarkEnd w:id="26"/>
+      <w:bookmarkEnd w:id="25"/>
     </w:p>
     <w:p>
       <w:pPr>
@@ -3882,7 +3944,7 @@
           <w:b w:val="0"/>
         </w:rPr>
       </w:pPr>
-      <w:bookmarkStart w:id="27" w:name="_Toc192780018"/>
+      <w:bookmarkStart w:id="26" w:name="_Toc192780018"/>
       <w:r>
         <w:rPr>
           <w:b w:val="0"/>
@@ -3890,7 +3952,7 @@
         <w:lastRenderedPageBreak/>
         <w:t>Flowchart</w:t>
       </w:r>
-      <w:bookmarkEnd w:id="27"/>
+      <w:bookmarkEnd w:id="26"/>
     </w:p>
     <w:p>
       <w:pPr>
@@ -3936,10 +3998,10 @@
             <v:path o:extrusionok="f" gradientshapeok="t" o:connecttype="rect"/>
             <o:lock v:ext="edit" aspectratio="t"/>
           </v:shapetype>
-          <v:shape id="_x0000_i1025" type="#_x0000_t75" style="width:475.8pt;height:588pt" o:ole="">
+          <v:shape id="_x0000_i1025" type="#_x0000_t75" style="width:475.7pt;height:588.05pt" o:ole="">
             <v:imagedata r:id="rId22" o:title=""/>
           </v:shape>
-          <o:OLEObject Type="Embed" ProgID="Visio.Drawing.15" ShapeID="_x0000_i1025" DrawAspect="Content" ObjectID="_1822455336" r:id="rId23"/>
+          <o:OLEObject Type="Embed" ProgID="Visio.Drawing.15" ShapeID="_x0000_i1025" DrawAspect="Content" ObjectID="_1822625767" r:id="rId23"/>
         </w:object>
       </w:r>
     </w:p>
@@ -3985,10 +4047,10 @@
       </w:pPr>
       <w:r>
         <w:object w:dxaOrig="4404" w:dyaOrig="4296" w14:anchorId="54967411">
-          <v:shape id="_x0000_i1026" type="#_x0000_t75" style="width:117pt;height:114pt" o:ole="">
+          <v:shape id="_x0000_i1026" type="#_x0000_t75" style="width:116.95pt;height:114.05pt" o:ole="">
             <v:imagedata r:id="rId24" o:title=""/>
           </v:shape>
-          <o:OLEObject Type="Embed" ProgID="Visio.Drawing.15" ShapeID="_x0000_i1026" DrawAspect="Content" ObjectID="_1822455337" r:id="rId25"/>
+          <o:OLEObject Type="Embed" ProgID="Visio.Drawing.15" ShapeID="_x0000_i1026" DrawAspect="Content" ObjectID="_1822625768" r:id="rId25"/>
         </w:object>
       </w:r>
     </w:p>
@@ -4005,14 +4067,14 @@
           <w:b w:val="0"/>
         </w:rPr>
       </w:pPr>
-      <w:bookmarkStart w:id="28" w:name="_Toc192780019"/>
+      <w:bookmarkStart w:id="27" w:name="_Toc192780019"/>
       <w:r>
         <w:rPr>
           <w:b w:val="0"/>
         </w:rPr>
         <w:t>Hardware Block Diagram</w:t>
       </w:r>
-      <w:bookmarkEnd w:id="28"/>
+      <w:bookmarkEnd w:id="27"/>
     </w:p>
     <w:p>
       <w:pPr>
@@ -4187,8 +4249,8 @@
           <w:lang w:eastAsia="de-DE"/>
         </w:rPr>
       </w:pPr>
-      <w:bookmarkStart w:id="29" w:name="_Toc192780020"/>
-      <w:bookmarkStart w:id="30" w:name="_Hlk190961414"/>
+      <w:bookmarkStart w:id="28" w:name="_Toc192780020"/>
+      <w:bookmarkStart w:id="29" w:name="_Hlk190961414"/>
       <w:r>
         <w:rPr>
           <w:snapToGrid w:val="0"/>
@@ -4199,7 +4261,7 @@
         <w:lastRenderedPageBreak/>
         <w:t>Hardware Setup</w:t>
       </w:r>
-      <w:bookmarkEnd w:id="29"/>
+      <w:bookmarkEnd w:id="28"/>
       <w:r>
         <w:rPr>
           <w:snapToGrid w:val="0"/>
@@ -4256,7 +4318,7 @@
         </w:drawing>
       </w:r>
     </w:p>
-    <w:bookmarkEnd w:id="30"/>
+    <w:bookmarkEnd w:id="29"/>
     <w:p>
       <w:pPr>
         <w:pStyle w:val="Body"/>
@@ -4283,7 +4345,7 @@
           <w:lang w:eastAsia="de-DE"/>
         </w:rPr>
       </w:pPr>
-      <w:bookmarkStart w:id="31" w:name="_Toc192780021"/>
+      <w:bookmarkStart w:id="30" w:name="_Toc192780021"/>
       <w:r>
         <w:rPr>
           <w:b/>
@@ -4294,7 +4356,7 @@
         </w:rPr>
         <w:t>Project Creation</w:t>
       </w:r>
-      <w:bookmarkEnd w:id="31"/>
+      <w:bookmarkEnd w:id="30"/>
       <w:r>
         <w:rPr>
           <w:b/>
@@ -10342,7 +10404,7 @@
           <w:szCs w:val="18"/>
         </w:rPr>
       </w:pPr>
-      <w:bookmarkStart w:id="32" w:name="_Hlk192779201"/>
+      <w:bookmarkStart w:id="31" w:name="_Hlk192779201"/>
       <w:r>
         <w:rPr>
           <w:rFonts w:ascii="Courier New" w:hAnsi="Courier New" w:cs="Courier New"/>
@@ -10352,7 +10414,7 @@
         <w:t>/* Main loop */</w:t>
       </w:r>
     </w:p>
-    <w:bookmarkEnd w:id="32"/>
+    <w:bookmarkEnd w:id="31"/>
     <w:p>
       <w:pPr>
         <w:autoSpaceDE w:val="0"/>
@@ -14988,7 +15050,7 @@
           <w:lang w:eastAsia="de-DE"/>
         </w:rPr>
       </w:pPr>
-      <w:bookmarkStart w:id="33" w:name="_Toc192780022"/>
+      <w:bookmarkStart w:id="32" w:name="_Toc192780022"/>
       <w:r>
         <w:rPr>
           <w:b/>
@@ -14999,7 +15061,7 @@
         </w:rPr>
         <w:t>Conclusion</w:t>
       </w:r>
-      <w:bookmarkEnd w:id="33"/>
+      <w:bookmarkEnd w:id="32"/>
       <w:r>
         <w:rPr>
           <w:b/>
@@ -15103,7 +15165,7 @@
           <w:lang w:eastAsia="de-DE"/>
         </w:rPr>
       </w:pPr>
-      <w:bookmarkStart w:id="34" w:name="_Toc192780023"/>
+      <w:bookmarkStart w:id="33" w:name="_Toc192780023"/>
       <w:r>
         <w:rPr>
           <w:b/>
@@ -15115,44 +15177,44 @@
         <w:lastRenderedPageBreak/>
         <w:t>Code Example 2: IPC queues using HAL</w:t>
       </w:r>
+      <w:bookmarkEnd w:id="33"/>
+    </w:p>
+    <w:p>
+      <w:pPr>
+        <w:pStyle w:val="Body"/>
+      </w:pPr>
+    </w:p>
+    <w:p>
+      <w:pPr>
+        <w:pStyle w:val="Heading2"/>
+      </w:pPr>
+      <w:r>
+        <w:t xml:space="preserve"> </w:t>
+      </w:r>
+      <w:bookmarkStart w:id="34" w:name="_Toc192780024"/>
+      <w:r>
+        <w:t>Objective</w:t>
+      </w:r>
       <w:bookmarkEnd w:id="34"/>
     </w:p>
     <w:p>
       <w:pPr>
         <w:pStyle w:val="Body"/>
-      </w:pPr>
+        <w:ind w:left="1418"/>
+      </w:pPr>
+      <w:r>
+        <w:t>This code example demonstrates how to use the inter-processor communication (IPC) HAL driver to implement a message queue in PSOC™ Edge MCU. The queues are used to send messages between CPUs.</w:t>
+      </w:r>
     </w:p>
     <w:p>
       <w:pPr>
         <w:pStyle w:val="Heading2"/>
       </w:pPr>
-      <w:r>
-        <w:t xml:space="preserve"> </w:t>
-      </w:r>
-      <w:bookmarkStart w:id="35" w:name="_Toc192780024"/>
-      <w:r>
-        <w:t>Objective</w:t>
+      <w:bookmarkStart w:id="35" w:name="_Toc192780025"/>
+      <w:r>
+        <w:t>Description</w:t>
       </w:r>
       <w:bookmarkEnd w:id="35"/>
-    </w:p>
-    <w:p>
-      <w:pPr>
-        <w:pStyle w:val="Body"/>
-        <w:ind w:left="1418"/>
-      </w:pPr>
-      <w:r>
-        <w:t>This code example demonstrates how to use the inter-processor communication (IPC) HAL driver to implement a message queue in PSOC™ Edge MCU. The queues are used to send messages between CPUs.</w:t>
-      </w:r>
-    </w:p>
-    <w:p>
-      <w:pPr>
-        <w:pStyle w:val="Heading2"/>
-      </w:pPr>
-      <w:bookmarkStart w:id="36" w:name="_Toc192780025"/>
-      <w:r>
-        <w:t>Description</w:t>
-      </w:r>
-      <w:bookmarkEnd w:id="36"/>
     </w:p>
     <w:p>
       <w:pPr>
@@ -15349,11 +15411,11 @@
       <w:pPr>
         <w:pStyle w:val="Heading2"/>
       </w:pPr>
-      <w:bookmarkStart w:id="37" w:name="_Toc192780026"/>
+      <w:bookmarkStart w:id="36" w:name="_Toc192780026"/>
       <w:r>
         <w:t>Flowchart</w:t>
       </w:r>
-      <w:bookmarkEnd w:id="37"/>
+      <w:bookmarkEnd w:id="36"/>
     </w:p>
     <w:p>
       <w:pPr>
@@ -15424,12 +15486,12 @@
       <w:pPr>
         <w:pStyle w:val="Heading2"/>
       </w:pPr>
-      <w:bookmarkStart w:id="38" w:name="_Toc192780027"/>
+      <w:bookmarkStart w:id="37" w:name="_Toc192780027"/>
       <w:r>
         <w:lastRenderedPageBreak/>
         <w:t>Hardware Block Diagram</w:t>
       </w:r>
-      <w:bookmarkEnd w:id="38"/>
+      <w:bookmarkEnd w:id="37"/>
     </w:p>
     <w:p>
       <w:pPr>
@@ -15494,11 +15556,11 @@
       <w:pPr>
         <w:pStyle w:val="Heading2"/>
       </w:pPr>
-      <w:bookmarkStart w:id="39" w:name="_Toc192780028"/>
+      <w:bookmarkStart w:id="38" w:name="_Toc192780028"/>
       <w:r>
         <w:t>Hardware Setup</w:t>
       </w:r>
-      <w:bookmarkEnd w:id="39"/>
+      <w:bookmarkEnd w:id="38"/>
     </w:p>
     <w:p>
       <w:pPr>
@@ -15580,12 +15642,12 @@
       <w:pPr>
         <w:pStyle w:val="Heading2"/>
       </w:pPr>
-      <w:bookmarkStart w:id="40" w:name="_Toc192780029"/>
+      <w:bookmarkStart w:id="39" w:name="_Toc192780029"/>
       <w:r>
         <w:lastRenderedPageBreak/>
         <w:t>Project Creation</w:t>
       </w:r>
-      <w:bookmarkEnd w:id="40"/>
+      <w:bookmarkEnd w:id="39"/>
       <w:r>
         <w:t xml:space="preserve"> </w:t>
       </w:r>
@@ -17073,7 +17135,7 @@
           <w:noProof/>
         </w:rPr>
       </w:pPr>
-      <w:bookmarkStart w:id="41" w:name="_Hlk147320247"/>
+      <w:bookmarkStart w:id="40" w:name="_Hlk147320247"/>
       <w:r>
         <w:rPr>
           <w:b w:val="0"/>
@@ -17853,8 +17915,8 @@
           <w:bCs/>
         </w:rPr>
       </w:pPr>
-      <w:bookmarkStart w:id="42" w:name="_Hlk147320439"/>
-      <w:bookmarkEnd w:id="41"/>
+      <w:bookmarkStart w:id="41" w:name="_Hlk147320439"/>
+      <w:bookmarkEnd w:id="40"/>
       <w:r>
         <w:rPr>
           <w:b w:val="0"/>
@@ -18470,11 +18532,11 @@
       <w:r>
         <w:t xml:space="preserve"> </w:t>
       </w:r>
-      <w:bookmarkStart w:id="43" w:name="_Hlk147313194"/>
+      <w:bookmarkStart w:id="42" w:name="_Hlk147313194"/>
       <w:r>
         <w:t xml:space="preserve">&lt;code snippet&gt; </w:t>
       </w:r>
-      <w:bookmarkEnd w:id="43"/>
+      <w:bookmarkEnd w:id="42"/>
       <w:r>
         <w:rPr>
           <w:b w:val="0"/>
@@ -18492,7 +18554,7 @@
         </w:rPr>
         <w:t xml:space="preserve"> file</w:t>
       </w:r>
-      <w:bookmarkEnd w:id="42"/>
+      <w:bookmarkEnd w:id="41"/>
       <w:r>
         <w:rPr>
           <w:b w:val="0"/>
@@ -19788,7 +19850,7 @@
           <w:lang w:val="en-IN"/>
         </w:rPr>
       </w:pPr>
-      <w:bookmarkStart w:id="44" w:name="_Hlk147320910"/>
+      <w:bookmarkStart w:id="43" w:name="_Hlk147320910"/>
       <w:r>
         <w:rPr>
           <w:lang w:val="en-IN"/>
@@ -19796,7 +19858,7 @@
         <w:t>The below code is the variables required for the communication between the cores:</w:t>
       </w:r>
     </w:p>
-    <w:bookmarkEnd w:id="44"/>
+    <w:bookmarkEnd w:id="43"/>
     <w:p>
       <w:pPr>
         <w:autoSpaceDE w:val="0"/>
@@ -33458,7 +33520,7 @@
           <w:lang w:eastAsia="de-DE"/>
         </w:rPr>
       </w:pPr>
-      <w:bookmarkStart w:id="45" w:name="_Toc192780030"/>
+      <w:bookmarkStart w:id="44" w:name="_Toc192780030"/>
       <w:r>
         <w:rPr>
           <w:b/>
@@ -33469,7 +33531,7 @@
         </w:rPr>
         <w:t>Conclusion</w:t>
       </w:r>
-      <w:bookmarkEnd w:id="45"/>
+      <w:bookmarkEnd w:id="44"/>
       <w:r>
         <w:rPr>
           <w:b/>
@@ -33509,12 +33571,12 @@
       <w:pPr>
         <w:pStyle w:val="Heading1"/>
       </w:pPr>
-      <w:bookmarkStart w:id="46" w:name="_Toc192780031"/>
+      <w:bookmarkStart w:id="45" w:name="_Toc192780031"/>
       <w:r>
         <w:lastRenderedPageBreak/>
         <w:t>References</w:t>
       </w:r>
-      <w:bookmarkEnd w:id="46"/>
+      <w:bookmarkEnd w:id="45"/>
       <w:r>
         <w:t xml:space="preserve"> </w:t>
       </w:r>
@@ -33740,27 +33802,14 @@
     <w:r>
       <w:t xml:space="preserve"> of </w:t>
     </w:r>
-    <w:r>
-      <w:fldChar w:fldCharType="begin"/>
-    </w:r>
-    <w:r>
-      <w:instrText xml:space="preserve"> NUMPAGES  \* Arabic  \* MERGEFORMAT </w:instrText>
-    </w:r>
-    <w:r>
-      <w:fldChar w:fldCharType="separate"/>
-    </w:r>
-    <w:r>
-      <w:rPr>
-        <w:noProof/>
-      </w:rPr>
-      <w:t>5</w:t>
-    </w:r>
-    <w:r>
-      <w:rPr>
-        <w:noProof/>
-      </w:rPr>
-      <w:fldChar w:fldCharType="end"/>
-    </w:r>
+    <w:fldSimple w:instr=" NUMPAGES  \* Arabic  \* MERGEFORMAT ">
+      <w:r>
+        <w:rPr>
+          <w:noProof/>
+        </w:rPr>
+        <w:t>5</w:t>
+      </w:r>
+    </w:fldSimple>
     <w:r>
       <w:tab/>
     </w:r>
@@ -33834,27 +33883,14 @@
     <w:r>
       <w:t xml:space="preserve"> of </w:t>
     </w:r>
-    <w:r>
-      <w:fldChar w:fldCharType="begin"/>
-    </w:r>
-    <w:r>
-      <w:instrText xml:space="preserve"> NUMPAGES  \* Arabic  \* MERGEFORMAT </w:instrText>
-    </w:r>
-    <w:r>
-      <w:fldChar w:fldCharType="separate"/>
-    </w:r>
-    <w:r>
-      <w:rPr>
-        <w:noProof/>
-      </w:rPr>
-      <w:t>5</w:t>
-    </w:r>
-    <w:r>
-      <w:rPr>
-        <w:noProof/>
-      </w:rPr>
-      <w:fldChar w:fldCharType="end"/>
-    </w:r>
+    <w:fldSimple w:instr=" NUMPAGES  \* Arabic  \* MERGEFORMAT ">
+      <w:r>
+        <w:rPr>
+          <w:noProof/>
+        </w:rPr>
+        <w:t>5</w:t>
+      </w:r>
+    </w:fldSimple>
     <w:r>
       <w:tab/>
     </w:r>
@@ -34034,8 +34070,13 @@
                                 <w:r>
                                   <w:fldChar w:fldCharType="separate"/>
                                 </w:r>
+                                <w:proofErr w:type="spellStart"/>
                                 <w:r>
-                                  <w:t>AppNote Number</w:t>
+                                  <w:t>AppNote</w:t>
+                                </w:r>
+                                <w:proofErr w:type="spellEnd"/>
+                                <w:r>
+                                  <w:t xml:space="preserve"> Number</w:t>
                                 </w:r>
                                 <w:r>
                                   <w:fldChar w:fldCharType="end"/>
@@ -34132,7 +34173,7 @@
               <v:stroke joinstyle="miter"/>
               <v:path gradientshapeok="t" o:connecttype="rect"/>
             </v:shapetype>
-            <v:shape id="Text Box 401" o:spid="_x0000_s1037" type="#_x0000_t202" style="position:absolute;margin-left:40.5pt;margin-top:587.25pt;width:138pt;height:174.75pt;z-index:251655168;visibility:visible;mso-wrap-style:square;mso-width-percent:0;mso-height-percent:0;mso-wrap-distance-left:9pt;mso-wrap-distance-top:0;mso-wrap-distance-right:9pt;mso-wrap-distance-bottom:0;mso-position-horizontal:absolute;mso-position-horizontal-relative:page;mso-position-vertical:absolute;mso-position-vertical-relative:page;mso-width-percent:0;mso-height-percent:0;mso-width-relative:page;mso-height-relative:page;v-text-anchor:top" o:gfxdata="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" filled="f" stroked="f" strokeweight="0">
+            <v:shape id="Text Box 401" o:spid="_x0000_s1037" type="#_x0000_t202" style="position:absolute;margin-left:40.5pt;margin-top:587.25pt;width:138pt;height:174.75pt;z-index:251655168;visibility:visible;mso-wrap-style:square;mso-width-percent:0;mso-height-percent:0;mso-wrap-distance-left:9pt;mso-wrap-distance-top:0;mso-wrap-distance-right:9pt;mso-wrap-distance-bottom:0;mso-position-horizontal:absolute;mso-position-horizontal-relative:page;mso-position-vertical:absolute;mso-position-vertical-relative:page;mso-width-percent:0;mso-height-percent:0;mso-width-relative:page;mso-height-relative:page;v-text-anchor:top" o:gfxdata="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" filled="f" stroked="f" strokeweight="0">
               <v:textbox inset="0,0,0,0">
                 <w:txbxContent>
                   <w:p>
@@ -34237,8 +34278,13 @@
                           <w:r>
                             <w:fldChar w:fldCharType="separate"/>
                           </w:r>
+                          <w:proofErr w:type="spellStart"/>
                           <w:r>
-                            <w:t>AppNote Number</w:t>
+                            <w:t>AppNote</w:t>
+                          </w:r>
+                          <w:proofErr w:type="spellEnd"/>
+                          <w:r>
+                            <w:t xml:space="preserve"> Number</w:t>
                           </w:r>
                           <w:r>
                             <w:fldChar w:fldCharType="end"/>
@@ -34445,7 +34491,7 @@
         </mc:Choice>
         <mc:Fallback>
           <w:pict>
-            <v:shape w14:anchorId="2FE1E5E7" id="Text Box 2" o:spid="_x0000_s1038" type="#_x0000_t202" style="position:absolute;margin-left:.2pt;margin-top:24.9pt;width:511.15pt;height:28pt;z-index:251646976;visibility:visible;mso-wrap-style:square;mso-width-percent:0;mso-height-percent:0;mso-wrap-distance-left:9pt;mso-wrap-distance-top:0;mso-wrap-distance-right:9pt;mso-wrap-distance-bottom:0;mso-position-horizontal:absolute;mso-position-horizontal-relative:text;mso-position-vertical:absolute;mso-position-vertical-relative:text;mso-width-percent:0;mso-height-percent:0;mso-width-relative:margin;mso-height-relative:margin;v-text-anchor:top" o:gfxdata="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" filled="f" stroked="f">
+            <v:shape w14:anchorId="2FE1E5E7" id="Text Box 2" o:spid="_x0000_s1038" type="#_x0000_t202" style="position:absolute;margin-left:.2pt;margin-top:24.9pt;width:511.15pt;height:28pt;z-index:251646976;visibility:visible;mso-wrap-style:square;mso-width-percent:0;mso-height-percent:0;mso-wrap-distance-left:9pt;mso-wrap-distance-top:0;mso-wrap-distance-right:9pt;mso-wrap-distance-bottom:0;mso-position-horizontal:absolute;mso-position-horizontal-relative:text;mso-position-vertical:absolute;mso-position-vertical-relative:text;mso-width-percent:0;mso-height-percent:0;mso-width-relative:margin;mso-height-relative:margin;v-text-anchor:top" o:gfxdata="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" filled="f" stroked="f">
               <v:textbox inset="0,0,0,0">
                 <w:txbxContent>
                   <w:p>
@@ -34497,7 +34543,7 @@
       </mc:AlternateContent>
     </w:r>
     <w:r>
-      <w:object w:dxaOrig="1440" w:dyaOrig="1440" w14:anchorId="400CF152">
+      <w:object w:dxaOrig="0" w:dyaOrig="0" w14:anchorId="400CF152">
         <v:shapetype id="_x0000_t75" coordsize="21600,21600" o:spt="75" o:preferrelative="t" path="m@4@5l@4@11@9@11@9@5xe" filled="f" stroked="f">
           <v:stroke joinstyle="miter"/>
           <v:formulas>
@@ -34517,10 +34563,10 @@
           <v:path o:extrusionok="f" gradientshapeok="t" o:connecttype="rect"/>
           <o:lock v:ext="edit" aspectratio="t"/>
         </v:shapetype>
-        <v:shape id="_x0000_s1028" type="#_x0000_t75" style="position:absolute;margin-left:-45.75pt;margin-top:62.5pt;width:602.45pt;height:287.2pt;z-index:-251642880;mso-position-horizontal-relative:text;mso-position-vertical-relative:text">
+        <v:shape id="_x0000_s2052" type="#_x0000_t75" style="position:absolute;margin-left:-45.75pt;margin-top:62.5pt;width:602.45pt;height:287.2pt;z-index:-251642880;mso-position-horizontal-relative:text;mso-position-vertical-relative:text">
           <v:imagedata r:id="rId1" o:title=""/>
         </v:shape>
-        <o:OLEObject Type="Embed" ProgID="Visio.Drawing.15" ShapeID="_x0000_s1028" DrawAspect="Content" ObjectID="_1822455338" r:id="rId2"/>
+        <o:OLEObject Type="Embed" ProgID="Visio.Drawing.15" ShapeID="_x0000_s2052" DrawAspect="Content" ObjectID="_1822625769" r:id="rId2"/>
       </w:object>
     </w:r>
     <w:r>
@@ -35357,8 +35403,13 @@
                                 <w:r>
                                   <w:fldChar w:fldCharType="separate"/>
                                 </w:r>
+                                <w:proofErr w:type="spellStart"/>
                                 <w:r>
-                                  <w:t>AppNote Number</w:t>
+                                  <w:t>AppNote</w:t>
+                                </w:r>
+                                <w:proofErr w:type="spellEnd"/>
+                                <w:r>
+                                  <w:t xml:space="preserve"> Number</w:t>
                                 </w:r>
                                 <w:r>
                                   <w:fldChar w:fldCharType="end"/>
@@ -35455,7 +35506,7 @@
               <v:stroke joinstyle="miter"/>
               <v:path gradientshapeok="t" o:connecttype="rect"/>
             </v:shapetype>
-            <v:shape id="_x0000_s1040" type="#_x0000_t202" style="position:absolute;margin-left:40.5pt;margin-top:587.25pt;width:138pt;height:174.75pt;z-index:251642880;visibility:visible;mso-wrap-style:square;mso-width-percent:0;mso-height-percent:0;mso-wrap-distance-left:9pt;mso-wrap-distance-top:0;mso-wrap-distance-right:9pt;mso-wrap-distance-bottom:0;mso-position-horizontal:absolute;mso-position-horizontal-relative:page;mso-position-vertical:absolute;mso-position-vertical-relative:page;mso-width-percent:0;mso-height-percent:0;mso-width-relative:page;mso-height-relative:page;v-text-anchor:top" o:gfxdata="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" filled="f" stroked="f" strokeweight="0">
+            <v:shape id="_x0000_s1040" type="#_x0000_t202" style="position:absolute;margin-left:40.5pt;margin-top:587.25pt;width:138pt;height:174.75pt;z-index:251642880;visibility:visible;mso-wrap-style:square;mso-width-percent:0;mso-height-percent:0;mso-wrap-distance-left:9pt;mso-wrap-distance-top:0;mso-wrap-distance-right:9pt;mso-wrap-distance-bottom:0;mso-position-horizontal:absolute;mso-position-horizontal-relative:page;mso-position-vertical:absolute;mso-position-vertical-relative:page;mso-width-percent:0;mso-height-percent:0;mso-width-relative:page;mso-height-relative:page;v-text-anchor:top" o:gfxdata="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" filled="f" stroked="f" strokeweight="0">
               <v:textbox inset="0,0,0,0">
                 <w:txbxContent>
                   <w:p>
@@ -35560,8 +35611,13 @@
                           <w:r>
                             <w:fldChar w:fldCharType="separate"/>
                           </w:r>
+                          <w:proofErr w:type="spellStart"/>
                           <w:r>
-                            <w:t>AppNote Number</w:t>
+                            <w:t>AppNote</w:t>
+                          </w:r>
+                          <w:proofErr w:type="spellEnd"/>
+                          <w:r>
+                            <w:t xml:space="preserve"> Number</w:t>
                           </w:r>
                           <w:r>
                             <w:fldChar w:fldCharType="end"/>
@@ -35768,7 +35824,7 @@
         </mc:Choice>
         <mc:Fallback>
           <w:pict>
-            <v:shape w14:anchorId="1C821D04" id="_x0000_s1041" type="#_x0000_t202" style="position:absolute;margin-left:.2pt;margin-top:24.9pt;width:511.15pt;height:28pt;z-index:251641856;visibility:visible;mso-wrap-style:square;mso-width-percent:0;mso-height-percent:0;mso-wrap-distance-left:9pt;mso-wrap-distance-top:0;mso-wrap-distance-right:9pt;mso-wrap-distance-bottom:0;mso-position-horizontal:absolute;mso-position-horizontal-relative:text;mso-position-vertical:absolute;mso-position-vertical-relative:text;mso-width-percent:0;mso-height-percent:0;mso-width-relative:margin;mso-height-relative:margin;v-text-anchor:top" o:gfxdata="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" filled="f" stroked="f">
+            <v:shape w14:anchorId="1C821D04" id="_x0000_s1041" type="#_x0000_t202" style="position:absolute;margin-left:.2pt;margin-top:24.9pt;width:511.15pt;height:28pt;z-index:251641856;visibility:visible;mso-wrap-style:square;mso-width-percent:0;mso-height-percent:0;mso-wrap-distance-left:9pt;mso-wrap-distance-top:0;mso-wrap-distance-right:9pt;mso-wrap-distance-bottom:0;mso-position-horizontal:absolute;mso-position-horizontal-relative:text;mso-position-vertical:absolute;mso-position-vertical-relative:text;mso-width-percent:0;mso-height-percent:0;mso-width-relative:margin;mso-height-relative:margin;v-text-anchor:top" o:gfxdata="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" filled="f" stroked="f">
               <v:textbox inset="0,0,0,0">
                 <w:txbxContent>
                   <w:p>
@@ -35820,7 +35876,7 @@
       </mc:AlternateContent>
     </w:r>
     <w:r>
-      <w:object w:dxaOrig="1440" w:dyaOrig="1440" w14:anchorId="7E268E63">
+      <w:object w:dxaOrig="0" w:dyaOrig="0" w14:anchorId="7E268E63">
         <v:shapetype id="_x0000_t75" coordsize="21600,21600" o:spt="75" o:preferrelative="t" path="m@4@5l@4@11@9@11@9@5xe" filled="f" stroked="f">
           <v:stroke joinstyle="miter"/>
           <v:formulas>
@@ -35840,10 +35896,10 @@
           <v:path o:extrusionok="f" gradientshapeok="t" o:connecttype="rect"/>
           <o:lock v:ext="edit" aspectratio="t"/>
         </v:shapetype>
-        <v:shape id="_x0000_s1027" type="#_x0000_t75" style="position:absolute;margin-left:-45.75pt;margin-top:62.5pt;width:602.45pt;height:287.2pt;z-index:-251643904;mso-position-horizontal-relative:text;mso-position-vertical-relative:text">
+        <v:shape id="_x0000_s2051" type="#_x0000_t75" style="position:absolute;margin-left:-45.75pt;margin-top:62.5pt;width:602.45pt;height:287.2pt;z-index:-251643904;mso-position-horizontal-relative:text;mso-position-vertical-relative:text">
           <v:imagedata r:id="rId1" o:title=""/>
         </v:shape>
-        <o:OLEObject Type="Embed" ProgID="Visio.Drawing.15" ShapeID="_x0000_s1027" DrawAspect="Content" ObjectID="_1822455339" r:id="rId2"/>
+        <o:OLEObject Type="Embed" ProgID="Visio.Drawing.15" ShapeID="_x0000_s2051" DrawAspect="Content" ObjectID="_1822625770" r:id="rId2"/>
       </w:object>
     </w:r>
     <w:r>
@@ -36051,8 +36107,8 @@
                                 <w:r>
                                   <w:t>IMPORTANT NOTICE</w:t>
                                 </w:r>
-                                <w:bookmarkStart w:id="47" w:name="ImportantNotice"/>
-                                <w:bookmarkEnd w:id="47"/>
+                                <w:bookmarkStart w:id="46" w:name="ImportantNotice"/>
+                                <w:bookmarkEnd w:id="46"/>
                               </w:p>
                               <w:p>
                                 <w:pPr>
@@ -36358,8 +36414,8 @@
                           <w:r>
                             <w:t>IMPORTANT NOTICE</w:t>
                           </w:r>
-                          <w:bookmarkStart w:id="48" w:name="ImportantNotice"/>
-                          <w:bookmarkEnd w:id="48"/>
+                          <w:bookmarkStart w:id="47" w:name="ImportantNotice"/>
+                          <w:bookmarkEnd w:id="47"/>
                         </w:p>
                         <w:p>
                           <w:pPr>
@@ -36724,7 +36780,7 @@
               <v:stroke joinstyle="miter"/>
               <v:path gradientshapeok="t" o:connecttype="rect"/>
             </v:shapetype>
-            <v:shape id="Text Box 71" o:spid="_x0000_s1026" type="#_x0000_t202" style="position:absolute;margin-left:.65pt;margin-top:11.85pt;width:424.75pt;height:13.75pt;z-index:251665408;visibility:visible;mso-wrap-style:square;mso-width-percent:0;mso-height-percent:0;mso-wrap-distance-left:9pt;mso-wrap-distance-top:0;mso-wrap-distance-right:9pt;mso-wrap-distance-bottom:0;mso-position-horizontal:absolute;mso-position-horizontal-relative:margin;mso-position-vertical:absolute;mso-position-vertical-relative:page;mso-width-percent:0;mso-height-percent:0;mso-width-relative:page;mso-height-relative:page;v-text-anchor:top" o:gfxdata="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" filled="f" stroked="f" strokeweight="0">
+            <v:shape id="Text Box 71" o:spid="_x0000_s1026" type="#_x0000_t202" style="position:absolute;margin-left:.65pt;margin-top:11.85pt;width:424.75pt;height:13.75pt;z-index:251665408;visibility:visible;mso-wrap-style:square;mso-width-percent:0;mso-height-percent:0;mso-wrap-distance-left:9pt;mso-wrap-distance-top:0;mso-wrap-distance-right:9pt;mso-wrap-distance-bottom:0;mso-position-horizontal:absolute;mso-position-horizontal-relative:margin;mso-position-vertical:absolute;mso-position-vertical-relative:page;mso-width-percent:0;mso-height-percent:0;mso-width-relative:page;mso-height-relative:page;v-text-anchor:top" o:gfxdata="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" filled="f" stroked="f" strokeweight="0">
               <v:textbox inset="0,0,0,0">
                 <w:txbxContent>
                   <w:p>
@@ -36827,24 +36883,11 @@
                           <w:pPr>
                             <w:pStyle w:val="Breadcrumb"/>
                           </w:pPr>
-                          <w:r>
-                            <w:fldChar w:fldCharType="begin"/>
-                          </w:r>
-                          <w:r>
-                            <w:instrText xml:space="preserve"> STYLEREF  "Headin</w:instrText>
-                          </w:r>
-                          <w:r>
-                            <w:instrText xml:space="preserve">g1,Heading1"  \* MERGEFORMAT </w:instrText>
-                          </w:r>
-                          <w:r>
-                            <w:fldChar w:fldCharType="separate"/>
-                          </w:r>
-                          <w:r>
-                            <w:t>Introduction</w:t>
-                          </w:r>
-                          <w:r>
-                            <w:fldChar w:fldCharType="end"/>
-                          </w:r>
+                          <w:fldSimple w:instr=" STYLEREF  &quot;Heading1,Heading1&quot;  \* MERGEFORMAT ">
+                            <w:r>
+                              <w:t>Introduction</w:t>
+                            </w:r>
+                          </w:fldSimple>
                         </w:p>
                       </w:txbxContent>
                     </wps:txbx>
@@ -36865,31 +36908,18 @@
         </mc:Choice>
         <mc:Fallback>
           <w:pict>
-            <v:shape w14:anchorId="6347C9A7" id="Text Box 72" o:spid="_x0000_s1027" type="#_x0000_t202" style="position:absolute;margin-left:42.8pt;margin-top:60.85pt;width:424.75pt;height:28.1pt;z-index:251663360;visibility:visible;mso-wrap-style:square;mso-width-percent:0;mso-height-percent:0;mso-wrap-distance-left:9pt;mso-wrap-distance-top:0;mso-wrap-distance-right:9pt;mso-wrap-distance-bottom:0;mso-position-horizontal:absolute;mso-position-horizontal-relative:page;mso-position-vertical:absolute;mso-position-vertical-relative:page;mso-width-percent:0;mso-height-percent:0;mso-width-relative:page;mso-height-relative:page;v-text-anchor:top" o:gfxdata="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" filled="f" stroked="f" strokeweight="0">
+            <v:shape w14:anchorId="6347C9A7" id="Text Box 72" o:spid="_x0000_s1027" type="#_x0000_t202" style="position:absolute;margin-left:42.8pt;margin-top:60.85pt;width:424.75pt;height:28.1pt;z-index:251663360;visibility:visible;mso-wrap-style:square;mso-width-percent:0;mso-height-percent:0;mso-wrap-distance-left:9pt;mso-wrap-distance-top:0;mso-wrap-distance-right:9pt;mso-wrap-distance-bottom:0;mso-position-horizontal:absolute;mso-position-horizontal-relative:page;mso-position-vertical:absolute;mso-position-vertical-relative:page;mso-width-percent:0;mso-height-percent:0;mso-width-relative:page;mso-height-relative:page;v-text-anchor:top" o:gfxdata="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" filled="f" stroked="f" strokeweight="0">
               <v:textbox inset="0,0,0,0">
                 <w:txbxContent>
                   <w:p>
                     <w:pPr>
                       <w:pStyle w:val="Breadcrumb"/>
                     </w:pPr>
-                    <w:r>
-                      <w:fldChar w:fldCharType="begin"/>
-                    </w:r>
-                    <w:r>
-                      <w:instrText xml:space="preserve"> STYLEREF  "Headin</w:instrText>
-                    </w:r>
-                    <w:r>
-                      <w:instrText xml:space="preserve">g1,Heading1"  \* MERGEFORMAT </w:instrText>
-                    </w:r>
-                    <w:r>
-                      <w:fldChar w:fldCharType="separate"/>
-                    </w:r>
-                    <w:r>
-                      <w:t>Introduction</w:t>
-                    </w:r>
-                    <w:r>
-                      <w:fldChar w:fldCharType="end"/>
-                    </w:r>
+                    <w:fldSimple w:instr=" STYLEREF  &quot;Heading1,Heading1&quot;  \* MERGEFORMAT ">
+                      <w:r>
+                        <w:t>Introduction</w:t>
+                      </w:r>
+                    </w:fldSimple>
                   </w:p>
                 </w:txbxContent>
               </v:textbox>
@@ -37002,9 +37032,11 @@
                           <w:r>
                             <w:fldChar w:fldCharType="separate"/>
                           </w:r>
+                          <w:proofErr w:type="spellStart"/>
                           <w:r>
                             <w:t>Title_continued</w:t>
                           </w:r>
+                          <w:proofErr w:type="spellEnd"/>
                           <w:r>
                             <w:fldChar w:fldCharType="end"/>
                           </w:r>
@@ -37028,7 +37060,7 @@
         </mc:Choice>
         <mc:Fallback>
           <w:pict>
-            <v:shape w14:anchorId="0493537C" id="Text Box 73" o:spid="_x0000_s1028" type="#_x0000_t202" style="position:absolute;margin-left:43.05pt;margin-top:23.9pt;width:424.2pt;height:34.5pt;z-index:251662336;visibility:visible;mso-wrap-style:square;mso-width-percent:0;mso-height-percent:0;mso-wrap-distance-left:9pt;mso-wrap-distance-top:0;mso-wrap-distance-right:9pt;mso-wrap-distance-bottom:0;mso-position-horizontal:absolute;mso-position-horizontal-relative:page;mso-position-vertical:absolute;mso-position-vertical-relative:page;mso-width-percent:0;mso-height-percent:0;mso-width-relative:page;mso-height-relative:page;v-text-anchor:top" o:gfxdata="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" filled="f" stroked="f" strokeweight="0">
+            <v:shape w14:anchorId="0493537C" id="Text Box 73" o:spid="_x0000_s1028" type="#_x0000_t202" style="position:absolute;margin-left:43.05pt;margin-top:23.9pt;width:424.2pt;height:34.5pt;z-index:251662336;visibility:visible;mso-wrap-style:square;mso-width-percent:0;mso-height-percent:0;mso-wrap-distance-left:9pt;mso-wrap-distance-top:0;mso-wrap-distance-right:9pt;mso-wrap-distance-bottom:0;mso-position-horizontal:absolute;mso-position-horizontal-relative:page;mso-position-vertical:absolute;mso-position-vertical-relative:page;mso-width-percent:0;mso-height-percent:0;mso-width-relative:page;mso-height-relative:page;v-text-anchor:top" o:gfxdata="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" filled="f" stroked="f" strokeweight="0">
               <v:textbox inset="0,0,0,0">
                 <w:txbxContent>
                   <w:p>
@@ -37070,9 +37102,11 @@
                     <w:r>
                       <w:fldChar w:fldCharType="separate"/>
                     </w:r>
+                    <w:proofErr w:type="spellStart"/>
                     <w:r>
                       <w:t>Title_continued</w:t>
                     </w:r>
+                    <w:proofErr w:type="spellEnd"/>
                     <w:r>
                       <w:fldChar w:fldCharType="end"/>
                     </w:r>
@@ -37438,7 +37472,7 @@
               <v:stroke joinstyle="miter"/>
               <v:path gradientshapeok="t" o:connecttype="rect"/>
             </v:shapetype>
-            <v:shape id="Text Box 20" o:spid="_x0000_s1029" type="#_x0000_t202" style="position:absolute;margin-left:13pt;margin-top:23pt;width:440.95pt;height:48.85pt;z-index:251654144;visibility:visible;mso-wrap-style:square;mso-width-percent:0;mso-height-percent:0;mso-wrap-distance-left:9pt;mso-wrap-distance-top:0;mso-wrap-distance-right:9pt;mso-wrap-distance-bottom:0;mso-position-horizontal:absolute;mso-position-horizontal-relative:page;mso-position-vertical:absolute;mso-position-vertical-relative:page;mso-width-percent:0;mso-height-percent:0;mso-width-relative:page;mso-height-relative:page;v-text-anchor:top" o:gfxdata="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" filled="f" stroked="f" strokeweight="0">
+            <v:shape id="Text Box 20" o:spid="_x0000_s1029" type="#_x0000_t202" style="position:absolute;margin-left:13pt;margin-top:23pt;width:440.95pt;height:48.85pt;z-index:251654144;visibility:visible;mso-wrap-style:square;mso-width-percent:0;mso-height-percent:0;mso-wrap-distance-left:9pt;mso-wrap-distance-top:0;mso-wrap-distance-right:9pt;mso-wrap-distance-bottom:0;mso-position-horizontal:absolute;mso-position-horizontal-relative:page;mso-position-vertical:absolute;mso-position-vertical-relative:page;mso-width-percent:0;mso-height-percent:0;mso-width-relative:page;mso-height-relative:page;v-text-anchor:top" o:gfxdata="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" filled="f" stroked="f" strokeweight="0">
               <v:textbox inset="0,0,0,0">
                 <w:txbxContent>
                   <w:p>
@@ -37594,7 +37628,7 @@
         </mc:Choice>
         <mc:Fallback>
           <w:pict>
-            <v:shape w14:anchorId="31C374F2" id="Text Box 68" o:spid="_x0000_s1030" type="#_x0000_t202" style="position:absolute;margin-left:14.15pt;margin-top:11.65pt;width:374.25pt;height:14.15pt;z-index:251656192;visibility:visible;mso-wrap-style:square;mso-width-percent:0;mso-height-percent:0;mso-wrap-distance-left:9pt;mso-wrap-distance-top:0;mso-wrap-distance-right:9pt;mso-wrap-distance-bottom:0;mso-position-horizontal:absolute;mso-position-horizontal-relative:page;mso-position-vertical:absolute;mso-position-vertical-relative:page;mso-width-percent:0;mso-height-percent:0;mso-width-relative:page;mso-height-relative:page;v-text-anchor:top" o:gfxdata="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" filled="f" stroked="f" strokeweight="0">
+            <v:shape w14:anchorId="31C374F2" id="Text Box 68" o:spid="_x0000_s1030" type="#_x0000_t202" style="position:absolute;margin-left:14.15pt;margin-top:11.65pt;width:374.25pt;height:14.15pt;z-index:251656192;visibility:visible;mso-wrap-style:square;mso-width-percent:0;mso-height-percent:0;mso-wrap-distance-left:9pt;mso-wrap-distance-top:0;mso-wrap-distance-right:9pt;mso-wrap-distance-bottom:0;mso-position-horizontal:absolute;mso-position-horizontal-relative:page;mso-position-vertical:absolute;mso-position-vertical-relative:page;mso-width-percent:0;mso-height-percent:0;mso-width-relative:page;mso-height-relative:page;v-text-anchor:top" o:gfxdata="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" filled="f" stroked="f" strokeweight="0">
               <v:textbox inset="0,0,0,0">
                 <w:txbxContent>
                   <w:p>
@@ -38018,7 +38052,7 @@
               <v:stroke joinstyle="miter"/>
               <v:path gradientshapeok="t" o:connecttype="rect"/>
             </v:shapetype>
-            <v:shape id="Text Box 14" o:spid="_x0000_s1031" type="#_x0000_t202" style="position:absolute;margin-left:.65pt;margin-top:11.85pt;width:424.75pt;height:13.75pt;z-index:251657216;visibility:visible;mso-wrap-style:square;mso-width-percent:0;mso-height-percent:0;mso-wrap-distance-left:9pt;mso-wrap-distance-top:0;mso-wrap-distance-right:9pt;mso-wrap-distance-bottom:0;mso-position-horizontal:absolute;mso-position-horizontal-relative:margin;mso-position-vertical:absolute;mso-position-vertical-relative:page;mso-width-percent:0;mso-height-percent:0;mso-width-relative:page;mso-height-relative:page;v-text-anchor:top" o:gfxdata="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" filled="f" stroked="f" strokeweight="0">
+            <v:shape id="Text Box 14" o:spid="_x0000_s1031" type="#_x0000_t202" style="position:absolute;margin-left:.65pt;margin-top:11.85pt;width:424.75pt;height:13.75pt;z-index:251657216;visibility:visible;mso-wrap-style:square;mso-width-percent:0;mso-height-percent:0;mso-wrap-distance-left:9pt;mso-wrap-distance-top:0;mso-wrap-distance-right:9pt;mso-wrap-distance-bottom:0;mso-position-horizontal:absolute;mso-position-horizontal-relative:margin;mso-position-vertical:absolute;mso-position-vertical-relative:page;mso-width-percent:0;mso-height-percent:0;mso-width-relative:page;mso-height-relative:page;v-text-anchor:top" o:gfxdata="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" filled="f" stroked="f" strokeweight="0">
               <v:textbox inset="0,0,0,0">
                 <w:txbxContent>
                   <w:p>
@@ -38122,7 +38156,7 @@
         </mc:Choice>
         <mc:Fallback>
           <w:pict>
-            <v:shape w14:anchorId="3BB298E2" id="Text Box 65" o:spid="_x0000_s1032" type="#_x0000_t202" style="position:absolute;margin-left:42.8pt;margin-top:60.85pt;width:424.75pt;height:28.1pt;z-index:251651072;visibility:visible;mso-wrap-style:square;mso-width-percent:0;mso-height-percent:0;mso-wrap-distance-left:9pt;mso-wrap-distance-top:0;mso-wrap-distance-right:9pt;mso-wrap-distance-bottom:0;mso-position-horizontal:absolute;mso-position-horizontal-relative:page;mso-position-vertical:absolute;mso-position-vertical-relative:page;mso-width-percent:0;mso-height-percent:0;mso-width-relative:page;mso-height-relative:page;v-text-anchor:top" o:gfxdata="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" filled="f" stroked="f" strokeweight="0">
+            <v:shape w14:anchorId="3BB298E2" id="Text Box 65" o:spid="_x0000_s1032" type="#_x0000_t202" style="position:absolute;margin-left:42.8pt;margin-top:60.85pt;width:424.75pt;height:28.1pt;z-index:251651072;visibility:visible;mso-wrap-style:square;mso-width-percent:0;mso-height-percent:0;mso-wrap-distance-left:9pt;mso-wrap-distance-top:0;mso-wrap-distance-right:9pt;mso-wrap-distance-bottom:0;mso-position-horizontal:absolute;mso-position-horizontal-relative:page;mso-position-vertical:absolute;mso-position-vertical-relative:page;mso-width-percent:0;mso-height-percent:0;mso-width-relative:page;mso-height-relative:page;v-text-anchor:top" o:gfxdata="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" filled="f" stroked="f" strokeweight="0">
               <v:textbox inset="0,0,0,0">
                 <w:txbxContent>
                   <w:p>
@@ -38226,7 +38260,7 @@
         </mc:Choice>
         <mc:Fallback>
           <w:pict>
-            <v:shape w14:anchorId="0BFB5FC5" id="Text Box 64" o:spid="_x0000_s1033" type="#_x0000_t202" style="position:absolute;margin-left:43.2pt;margin-top:24pt;width:453pt;height:124.2pt;z-index:251650048;visibility:visible;mso-wrap-style:square;mso-width-percent:0;mso-height-percent:0;mso-wrap-distance-left:9pt;mso-wrap-distance-top:0;mso-wrap-distance-right:9pt;mso-wrap-distance-bottom:0;mso-position-horizontal:absolute;mso-position-horizontal-relative:page;mso-position-vertical:absolute;mso-position-vertical-relative:page;mso-width-percent:0;mso-height-percent:0;mso-width-relative:page;mso-height-relative:page;v-text-anchor:top" o:gfxdata="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" filled="f" stroked="f" strokeweight="0">
+            <v:shape w14:anchorId="0BFB5FC5" id="Text Box 64" o:spid="_x0000_s1033" type="#_x0000_t202" style="position:absolute;margin-left:43.2pt;margin-top:24pt;width:453pt;height:124.2pt;z-index:251650048;visibility:visible;mso-wrap-style:square;mso-width-percent:0;mso-height-percent:0;mso-wrap-distance-left:9pt;mso-wrap-distance-top:0;mso-wrap-distance-right:9pt;mso-wrap-distance-bottom:0;mso-position-horizontal:absolute;mso-position-horizontal-relative:page;mso-position-vertical:absolute;mso-position-vertical-relative:page;mso-width-percent:0;mso-height-percent:0;mso-width-relative:page;mso-height-relative:page;v-text-anchor:top" o:gfxdata="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" filled="f" stroked="f" strokeweight="0">
               <v:textbox inset="0,0,0,0">
                 <w:txbxContent>
                   <w:p>
@@ -38594,7 +38628,7 @@
               <v:stroke joinstyle="miter"/>
               <v:path gradientshapeok="t" o:connecttype="rect"/>
             </v:shapetype>
-            <v:shape id="Text Box 6" o:spid="_x0000_s1034" type="#_x0000_t202" style="position:absolute;margin-left:.65pt;margin-top:11.85pt;width:424.75pt;height:13.75pt;z-index:251671552;visibility:visible;mso-wrap-style:square;mso-width-percent:0;mso-height-percent:0;mso-wrap-distance-left:9pt;mso-wrap-distance-top:0;mso-wrap-distance-right:9pt;mso-wrap-distance-bottom:0;mso-position-horizontal:absolute;mso-position-horizontal-relative:margin;mso-position-vertical:absolute;mso-position-vertical-relative:page;mso-width-percent:0;mso-height-percent:0;mso-width-relative:page;mso-height-relative:page;v-text-anchor:top" o:gfxdata="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" filled="f" stroked="f" strokeweight="0">
+            <v:shape id="Text Box 6" o:spid="_x0000_s1034" type="#_x0000_t202" style="position:absolute;margin-left:.65pt;margin-top:11.85pt;width:424.75pt;height:13.75pt;z-index:251671552;visibility:visible;mso-wrap-style:square;mso-width-percent:0;mso-height-percent:0;mso-wrap-distance-left:9pt;mso-wrap-distance-top:0;mso-wrap-distance-right:9pt;mso-wrap-distance-bottom:0;mso-position-horizontal:absolute;mso-position-horizontal-relative:margin;mso-position-vertical:absolute;mso-position-vertical-relative:page;mso-width-percent:0;mso-height-percent:0;mso-width-relative:page;mso-height-relative:page;v-text-anchor:top" o:gfxdata="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" filled="f" stroked="f" strokeweight="0">
               <v:textbox inset="0,0,0,0">
                 <w:txbxContent>
                   <w:p>
@@ -38744,7 +38778,7 @@
         </mc:Choice>
         <mc:Fallback>
           <w:pict>
-            <v:shape w14:anchorId="576C1D36" id="Text Box 10" o:spid="_x0000_s1035" type="#_x0000_t202" style="position:absolute;margin-left:42.8pt;margin-top:60.85pt;width:424.75pt;height:28.1pt;z-index:251669504;visibility:visible;mso-wrap-style:square;mso-width-percent:0;mso-height-percent:0;mso-wrap-distance-left:9pt;mso-wrap-distance-top:0;mso-wrap-distance-right:9pt;mso-wrap-distance-bottom:0;mso-position-horizontal:absolute;mso-position-horizontal-relative:page;mso-position-vertical:absolute;mso-position-vertical-relative:page;mso-width-percent:0;mso-height-percent:0;mso-width-relative:page;mso-height-relative:page;v-text-anchor:top" o:gfxdata="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" filled="f" stroked="f" strokeweight="0">
+            <v:shape w14:anchorId="576C1D36" id="Text Box 10" o:spid="_x0000_s1035" type="#_x0000_t202" style="position:absolute;margin-left:42.8pt;margin-top:60.85pt;width:424.75pt;height:28.1pt;z-index:251669504;visibility:visible;mso-wrap-style:square;mso-width-percent:0;mso-height-percent:0;mso-wrap-distance-left:9pt;mso-wrap-distance-top:0;mso-wrap-distance-right:9pt;mso-wrap-distance-bottom:0;mso-position-horizontal:absolute;mso-position-horizontal-relative:page;mso-position-vertical:absolute;mso-position-vertical-relative:page;mso-width-percent:0;mso-height-percent:0;mso-width-relative:page;mso-height-relative:page;v-text-anchor:top" o:gfxdata="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" filled="f" stroked="f" strokeweight="0">
               <v:textbox inset="0,0,0,0">
                 <w:txbxContent>
                   <w:p>
@@ -38881,9 +38915,11 @@
                           <w:r>
                             <w:fldChar w:fldCharType="separate"/>
                           </w:r>
+                          <w:proofErr w:type="spellStart"/>
                           <w:r>
                             <w:t>Title_continued</w:t>
                           </w:r>
+                          <w:proofErr w:type="spellEnd"/>
                           <w:r>
                             <w:fldChar w:fldCharType="end"/>
                           </w:r>
@@ -38907,7 +38943,7 @@
         </mc:Choice>
         <mc:Fallback>
           <w:pict>
-            <v:shape w14:anchorId="259ACE60" id="Text Box 15" o:spid="_x0000_s1036" type="#_x0000_t202" style="position:absolute;margin-left:43.05pt;margin-top:23.9pt;width:424.2pt;height:34.5pt;z-index:251668480;visibility:visible;mso-wrap-style:square;mso-width-percent:0;mso-height-percent:0;mso-wrap-distance-left:9pt;mso-wrap-distance-top:0;mso-wrap-distance-right:9pt;mso-wrap-distance-bottom:0;mso-position-horizontal:absolute;mso-position-horizontal-relative:page;mso-position-vertical:absolute;mso-position-vertical-relative:page;mso-width-percent:0;mso-height-percent:0;mso-width-relative:page;mso-height-relative:page;v-text-anchor:top" o:gfxdata="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" filled="f" stroked="f" strokeweight="0">
+            <v:shape w14:anchorId="259ACE60" id="Text Box 15" o:spid="_x0000_s1036" type="#_x0000_t202" style="position:absolute;margin-left:43.05pt;margin-top:23.9pt;width:424.2pt;height:34.5pt;z-index:251668480;visibility:visible;mso-wrap-style:square;mso-width-percent:0;mso-height-percent:0;mso-wrap-distance-left:9pt;mso-wrap-distance-top:0;mso-wrap-distance-right:9pt;mso-wrap-distance-bottom:0;mso-position-horizontal:absolute;mso-position-horizontal-relative:page;mso-position-vertical:absolute;mso-position-vertical-relative:page;mso-width-percent:0;mso-height-percent:0;mso-width-relative:page;mso-height-relative:page;v-text-anchor:top" o:gfxdata="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" filled="f" stroked="f" strokeweight="0">
               <v:textbox inset="0,0,0,0">
                 <w:txbxContent>
                   <w:p>
@@ -38949,9 +38985,11 @@
                     <w:r>
                       <w:fldChar w:fldCharType="separate"/>
                     </w:r>
+                    <w:proofErr w:type="spellStart"/>
                     <w:r>
                       <w:t>Title_continued</w:t>
                     </w:r>
+                    <w:proofErr w:type="spellEnd"/>
                     <w:r>
                       <w:fldChar w:fldCharType="end"/>
                     </w:r>
@@ -46763,12 +46801,21 @@
 </file>
 
 <file path=customXml/item1.xml><?xml version="1.0" encoding="utf-8"?>
+<?mso-contentType ?>
+<FormTemplates xmlns="http://schemas.microsoft.com/sharepoint/v3/contenttype/forms">
+  <Display>DocumentLibraryForm</Display>
+  <Edit>DocumentLibraryForm</Edit>
+  <New>DocumentLibraryForm</New>
+</FormTemplates>
+</file>
+
+<file path=customXml/item2.xml><?xml version="1.0" encoding="utf-8"?>
 <p:properties xmlns:p="http://schemas.microsoft.com/office/2006/metadata/properties" xmlns:xsi="http://www.w3.org/2001/XMLSchema-instance" xmlns:pc="http://schemas.microsoft.com/office/infopath/2007/PartnerControls">
   <documentManagement/>
 </p:properties>
 </file>
 
-<file path=customXml/item2.xml><?xml version="1.0" encoding="utf-8"?>
+<file path=customXml/item3.xml><?xml version="1.0" encoding="utf-8"?>
 <ct:contentTypeSchema xmlns:ct="http://schemas.microsoft.com/office/2006/metadata/contentType" xmlns:ma="http://schemas.microsoft.com/office/2006/metadata/properties/metaAttributes" ct:_="" ma:_="" ma:contentTypeName="Document" ma:contentTypeID="0x01010030347378EA1C7B40B791B4A9FAEBC72E" ma:contentTypeVersion="1" ma:contentTypeDescription="Create a new document." ma:contentTypeScope="" ma:versionID="dac419b5e4b08ef6434e405bf3dae512">
   <xsd:schema xmlns:xsd="http://www.w3.org/2001/XMLSchema" xmlns:xs="http://www.w3.org/2001/XMLSchema" xmlns:p="http://schemas.microsoft.com/office/2006/metadata/properties" xmlns:ns2="0ff2502a-f5fc-4900-8b9d-01d591984867" targetNamespace="http://schemas.microsoft.com/office/2006/metadata/properties" ma:root="true" ma:fieldsID="8df1d2d8bf6da93316c8b7386a9c82fd" ns2:_="">
     <xsd:import namespace="0ff2502a-f5fc-4900-8b9d-01d591984867"/>
@@ -46908,36 +46955,28 @@
 </ct:contentTypeSchema>
 </file>
 
-<file path=customXml/item3.xml><?xml version="1.0" encoding="utf-8"?>
-<?mso-contentType ?>
-<FormTemplates xmlns="http://schemas.microsoft.com/sharepoint/v3/contenttype/forms">
-  <Display>DocumentLibraryForm</Display>
-  <Edit>DocumentLibraryForm</Edit>
-  <New>DocumentLibraryForm</New>
-</FormTemplates>
-</file>
-
 <file path=customXml/item4.xml><?xml version="1.0" encoding="utf-8"?>
 <b:Sources xmlns:b="http://schemas.openxmlformats.org/officeDocument/2006/bibliography" xmlns="http://schemas.openxmlformats.org/officeDocument/2006/bibliography" SelectedStyle="\APA.XSL" StyleName="APA"/>
 </file>
 
 <file path=customXml/itemProps1.xml><?xml version="1.0" encoding="utf-8"?>
-<ds:datastoreItem xmlns:ds="http://schemas.openxmlformats.org/officeDocument/2006/customXml" ds:itemID="{2D743F90-B02F-45D5-9835-EA3B57C055FC}">
+<ds:datastoreItem xmlns:ds="http://schemas.openxmlformats.org/officeDocument/2006/customXml" ds:itemID="{A6A899CE-B708-4D9D-B4A9-81256E8EE869}">
   <ds:schemaRefs>
-    <ds:schemaRef ds:uri="http://www.w3.org/XML/1998/namespace"/>
-    <ds:schemaRef ds:uri="http://purl.org/dc/terms/"/>
-    <ds:schemaRef ds:uri="http://schemas.microsoft.com/office/2006/documentManagement/types"/>
-    <ds:schemaRef ds:uri="http://schemas.microsoft.com/office/infopath/2007/PartnerControls"/>
-    <ds:schemaRef ds:uri="http://schemas.openxmlformats.org/package/2006/metadata/core-properties"/>
-    <ds:schemaRef ds:uri="http://purl.org/dc/dcmitype/"/>
-    <ds:schemaRef ds:uri="http://purl.org/dc/elements/1.1/"/>
-    <ds:schemaRef ds:uri="0ff2502a-f5fc-4900-8b9d-01d591984867"/>
-    <ds:schemaRef ds:uri="http://schemas.microsoft.com/office/2006/metadata/properties"/>
+    <ds:schemaRef ds:uri="http://schemas.microsoft.com/sharepoint/v3/contenttype/forms"/>
   </ds:schemaRefs>
 </ds:datastoreItem>
 </file>
 
 <file path=customXml/itemProps2.xml><?xml version="1.0" encoding="utf-8"?>
+<ds:datastoreItem xmlns:ds="http://schemas.openxmlformats.org/officeDocument/2006/customXml" ds:itemID="{2D743F90-B02F-45D5-9835-EA3B57C055FC}">
+  <ds:schemaRefs>
+    <ds:schemaRef ds:uri="http://schemas.microsoft.com/office/2006/metadata/properties"/>
+    <ds:schemaRef ds:uri="http://schemas.microsoft.com/office/infopath/2007/PartnerControls"/>
+  </ds:schemaRefs>
+</ds:datastoreItem>
+</file>
+
+<file path=customXml/itemProps3.xml><?xml version="1.0" encoding="utf-8"?>
 <ds:datastoreItem xmlns:ds="http://schemas.openxmlformats.org/officeDocument/2006/customXml" ds:itemID="{348D6D5F-AF49-4DAF-BEBA-00EA06977ED2}">
   <ds:schemaRefs>
     <ds:schemaRef ds:uri="http://schemas.microsoft.com/office/2006/metadata/contentType"/>
@@ -46955,16 +46994,8 @@
 </ds:datastoreItem>
 </file>
 
-<file path=customXml/itemProps3.xml><?xml version="1.0" encoding="utf-8"?>
-<ds:datastoreItem xmlns:ds="http://schemas.openxmlformats.org/officeDocument/2006/customXml" ds:itemID="{A6A899CE-B708-4D9D-B4A9-81256E8EE869}">
-  <ds:schemaRefs>
-    <ds:schemaRef ds:uri="http://schemas.microsoft.com/sharepoint/v3/contenttype/forms"/>
-  </ds:schemaRefs>
-</ds:datastoreItem>
-</file>
-
 <file path=customXml/itemProps4.xml><?xml version="1.0" encoding="utf-8"?>
-<ds:datastoreItem xmlns:ds="http://schemas.openxmlformats.org/officeDocument/2006/customXml" ds:itemID="{3AB32B57-F9B6-4442-9680-BBD231475525}">
+<ds:datastoreItem xmlns:ds="http://schemas.openxmlformats.org/officeDocument/2006/customXml" ds:itemID="{2F8E7927-647B-4592-A0AA-E753E703F04A}">
   <ds:schemaRefs>
     <ds:schemaRef ds:uri="http://schemas.openxmlformats.org/officeDocument/2006/bibliography"/>
   </ds:schemaRefs>

</xml_diff>

<commit_message>
Removing pre-requisite for updating/checking extended boot
</commit_message>
<xml_diff>
--- a/.internal/Manual/Intro to PSOC Edge E84 - Part 2 (E2)/PSoC Edge E84 Introductory E2 Training Manual -WIP_10_21_2025.docx
+++ b/.internal/Manual/Intro to PSOC Edge E84 - Part 2 (E2)/PSoC Edge E84 Introductory E2 Training Manual -WIP_10_21_2025.docx
@@ -2741,8 +2741,6 @@
         </w:rPr>
         <w:t>TTY</w:t>
       </w:r>
-      <w:bookmarkStart w:id="15" w:name="_GoBack"/>
-      <w:bookmarkEnd w:id="15"/>
     </w:p>
     <w:p>
       <w:pPr>
@@ -2752,16 +2750,16 @@
           <w:tab w:val="num" w:pos="1762"/>
         </w:tabs>
       </w:pPr>
-      <w:bookmarkStart w:id="16" w:name="_Toc192780014"/>
+      <w:bookmarkStart w:id="15" w:name="_Toc192780014"/>
       <w:r>
         <w:t>Prerequisites</w:t>
       </w:r>
-      <w:bookmarkEnd w:id="16"/>
+      <w:bookmarkEnd w:id="15"/>
       <w:r>
         <w:t xml:space="preserve"> </w:t>
       </w:r>
     </w:p>
-    <w:bookmarkStart w:id="17" w:name="_mioConsistencyCheck465"/>
+    <w:bookmarkStart w:id="16" w:name="_mioConsistencyCheck465"/>
     <w:p>
       <w:pPr>
         <w:pStyle w:val="Body"/>
@@ -2812,7 +2810,7 @@
         </w:rPr>
         <w:fldChar w:fldCharType="end"/>
       </w:r>
-      <w:bookmarkEnd w:id="17"/>
+      <w:bookmarkEnd w:id="16"/>
       <w:r>
         <w:rPr>
           <w:sz w:val="24"/>
@@ -2830,7 +2828,7 @@
         <w:t xml:space="preserve">Install the </w:t>
       </w:r>
       <w:r>
-        <w:t>software’s</w:t>
+        <w:t>software</w:t>
       </w:r>
       <w:r>
         <w:t xml:space="preserve"> listed below </w:t>
@@ -2845,6 +2843,7 @@
         </w:numPr>
       </w:pPr>
       <w:hyperlink r:id="rId18" w:history="1">
+        <w:proofErr w:type="spellStart"/>
         <w:r>
           <w:rPr>
             <w:rFonts w:cs="Arial"/>
@@ -2855,7 +2854,20 @@
             <w:u w:val="single"/>
             <w:lang w:val="en-IN" w:eastAsia="en-IN"/>
           </w:rPr>
-          <w:t>ModusToolbox™ software</w:t>
+          <w:t>ModusToolbox</w:t>
+        </w:r>
+        <w:proofErr w:type="spellEnd"/>
+        <w:r>
+          <w:rPr>
+            <w:rFonts w:cs="Arial"/>
+            <w:color w:val="0000FF"/>
+            <w:spacing w:val="3"/>
+            <w:sz w:val="24"/>
+            <w:szCs w:val="24"/>
+            <w:u w:val="single"/>
+            <w:lang w:val="en-IN" w:eastAsia="en-IN"/>
+          </w:rPr>
+          <w:t>™ software</w:t>
         </w:r>
       </w:hyperlink>
       <w:r>
@@ -2869,6 +2881,7 @@
         </w:rPr>
         <w:t> v3.</w:t>
       </w:r>
+      <w:commentRangeStart w:id="17"/>
       <w:r>
         <w:rPr>
           <w:rFonts w:cs="Arial"/>
@@ -2878,7 +2891,15 @@
           <w:szCs w:val="24"/>
           <w:lang w:val="en-IN" w:eastAsia="en-IN"/>
         </w:rPr>
-        <w:t>3</w:t>
+        <w:t>6</w:t>
+      </w:r>
+      <w:commentRangeEnd w:id="17"/>
+      <w:r>
+        <w:rPr>
+          <w:rStyle w:val="CommentReference"/>
+          <w:lang w:eastAsia="en-US"/>
+        </w:rPr>
+        <w:commentReference w:id="17"/>
       </w:r>
     </w:p>
     <w:p>
@@ -2890,75 +2911,14 @@
         </w:numPr>
       </w:pPr>
       <w:r>
-        <w:rPr>
-          <w:rFonts w:cs="Segoe UI"/>
-          <w:bCs/>
-          <w:color w:val="2D3D50"/>
-          <w:spacing w:val="3"/>
-          <w:shd w:val="clear" w:color="auto" w:fill="FFFFFF"/>
-        </w:rPr>
-        <w:t>ModusToolbox™ PS</w:t>
-      </w:r>
-      <w:r>
-        <w:rPr>
-          <w:rFonts w:cs="Segoe UI"/>
-          <w:bCs/>
-          <w:color w:val="2D3D50"/>
-          <w:spacing w:val="3"/>
-          <w:shd w:val="clear" w:color="auto" w:fill="FFFFFF"/>
-        </w:rPr>
-        <w:t>O</w:t>
-      </w:r>
-      <w:r>
-        <w:rPr>
-          <w:rFonts w:cs="Segoe UI"/>
-          <w:bCs/>
-          <w:color w:val="2D3D50"/>
-          <w:spacing w:val="3"/>
-          <w:shd w:val="clear" w:color="auto" w:fill="FFFFFF"/>
-        </w:rPr>
-        <w:t>C™ E84 Early Access Pack</w:t>
-      </w:r>
-    </w:p>
-    <w:p>
-      <w:pPr>
-        <w:pStyle w:val="Body"/>
-        <w:numPr>
-          <w:ilvl w:val="1"/>
-          <w:numId w:val="34"/>
-        </w:numPr>
-        <w:rPr>
-          <w:sz w:val="24"/>
-          <w:szCs w:val="24"/>
-        </w:rPr>
-      </w:pPr>
-      <w:bookmarkStart w:id="18" w:name="_mioConsistencyCheck25"/>
-      <w:r>
-        <w:rPr>
-          <w:sz w:val="24"/>
-          <w:szCs w:val="24"/>
-        </w:rPr>
-        <w:t xml:space="preserve">Download and install the </w:t>
-      </w:r>
-      <w:bookmarkEnd w:id="18"/>
-      <w:r>
-        <w:rPr>
-          <w:rFonts w:cs="Segoe UI"/>
-          <w:color w:val="2D3D50"/>
-          <w:spacing w:val="3"/>
-          <w:sz w:val="24"/>
-          <w:szCs w:val="24"/>
-          <w:shd w:val="clear" w:color="auto" w:fill="FFFFFF"/>
-        </w:rPr>
-        <w:t> </w:t>
-      </w:r>
-      <w:bookmarkStart w:id="19" w:name="_mioConsistencyCheck26"/>
-      <w:bookmarkStart w:id="20" w:name="_mioConsistencyCheck469"/>
+        <w:t xml:space="preserve">Install a terminal emulator if you do not have one. Instructions in this document use </w:t>
+      </w:r>
+      <w:commentRangeStart w:id="18"/>
       <w:r>
         <w:fldChar w:fldCharType="begin"/>
       </w:r>
       <w:r>
-        <w:instrText>HYPERLINK "https://www.infineon.com/cms/en/design-support/tools/utilities/infineon-developer-center-idc-launcher/"</w:instrText>
+        <w:instrText xml:space="preserve"> HYPERLINK "https://ttssh2.osdn.jp/index.html.en" </w:instrText>
       </w:r>
       <w:r>
         <w:fldChar w:fldCharType="separate"/>
@@ -2968,531 +2928,50 @@
           <w:rStyle w:val="Hyperlink"/>
           <w:rFonts w:cs="Segoe UI"/>
           <w:spacing w:val="3"/>
-          <w:sz w:val="24"/>
-          <w:szCs w:val="24"/>
           <w:shd w:val="clear" w:color="auto" w:fill="FFFFFF"/>
         </w:rPr>
-        <w:t>Infineon Developer Center Launcher</w:t>
+        <w:t>Te</w:t>
       </w:r>
       <w:r>
         <w:rPr>
           <w:rStyle w:val="Hyperlink"/>
           <w:rFonts w:cs="Segoe UI"/>
           <w:spacing w:val="3"/>
-          <w:sz w:val="24"/>
-          <w:szCs w:val="24"/>
           <w:shd w:val="clear" w:color="auto" w:fill="FFFFFF"/>
         </w:rPr>
+        <w:t>r</w:t>
+      </w:r>
+      <w:r>
+        <w:rPr>
+          <w:rStyle w:val="Hyperlink"/>
+          <w:rFonts w:cs="Segoe UI"/>
+          <w:spacing w:val="3"/>
+          <w:shd w:val="clear" w:color="auto" w:fill="FFFFFF"/>
+        </w:rPr>
+        <w:t>a Term</w:t>
+      </w:r>
+      <w:r>
+        <w:rPr>
+          <w:rStyle w:val="Hyperlink"/>
+          <w:rFonts w:cs="Segoe UI"/>
+          <w:spacing w:val="3"/>
+          <w:shd w:val="clear" w:color="auto" w:fill="FFFFFF"/>
+        </w:rPr>
         <w:fldChar w:fldCharType="end"/>
       </w:r>
-    </w:p>
-    <w:bookmarkEnd w:id="19"/>
-    <w:bookmarkEnd w:id="20"/>
-    <w:p>
-      <w:pPr>
-        <w:pStyle w:val="Body"/>
-        <w:numPr>
-          <w:ilvl w:val="1"/>
-          <w:numId w:val="34"/>
-        </w:numPr>
-        <w:rPr>
-          <w:sz w:val="24"/>
-          <w:szCs w:val="24"/>
-        </w:rPr>
-      </w:pPr>
-      <w:r>
-        <w:rPr>
-          <w:sz w:val="24"/>
-          <w:szCs w:val="24"/>
-        </w:rPr>
-        <w:t>Login using your Infineon credentials.</w:t>
-      </w:r>
-    </w:p>
-    <w:p>
-      <w:pPr>
-        <w:pStyle w:val="Body"/>
-        <w:numPr>
-          <w:ilvl w:val="1"/>
-          <w:numId w:val="34"/>
-        </w:numPr>
-        <w:rPr>
-          <w:sz w:val="24"/>
-          <w:szCs w:val="24"/>
-        </w:rPr>
-      </w:pPr>
-      <w:r>
-        <w:rPr>
-          <w:sz w:val="24"/>
-          <w:szCs w:val="24"/>
-        </w:rPr>
-        <w:t>Download and install the “ModusToolbox™ PS</w:t>
-      </w:r>
-      <w:r>
-        <w:rPr>
-          <w:sz w:val="24"/>
-          <w:szCs w:val="24"/>
-        </w:rPr>
-        <w:t>O</w:t>
-      </w:r>
-      <w:r>
-        <w:rPr>
-          <w:sz w:val="24"/>
-          <w:szCs w:val="24"/>
-        </w:rPr>
-        <w:t>C™ E84 Early Access Pack” from Developer Center Launcher.</w:t>
-      </w:r>
-    </w:p>
-    <w:p>
-      <w:pPr>
-        <w:pStyle w:val="Body"/>
-        <w:keepNext/>
-        <w:ind w:left="2498"/>
-        <w:rPr>
-          <w:sz w:val="24"/>
-          <w:szCs w:val="24"/>
-        </w:rPr>
-      </w:pPr>
-      <w:r>
-        <w:rPr>
-          <w:sz w:val="24"/>
-          <w:szCs w:val="24"/>
-        </w:rPr>
-        <w:t>Note: The default installation directory of the Early Access pack are as follows:</w:t>
-      </w:r>
-    </w:p>
-    <w:p>
-      <w:pPr>
-        <w:pStyle w:val="Body"/>
-        <w:keepNext/>
-        <w:ind w:left="2498"/>
-        <w:rPr>
-          <w:i/>
-          <w:sz w:val="24"/>
-          <w:szCs w:val="24"/>
-        </w:rPr>
-      </w:pPr>
-      <w:r>
-        <w:rPr>
-          <w:b/>
-          <w:i/>
-          <w:sz w:val="24"/>
-          <w:szCs w:val="24"/>
-        </w:rPr>
-        <w:t>Windows</w:t>
-      </w:r>
-      <w:r>
-        <w:rPr>
-          <w:i/>
-          <w:sz w:val="24"/>
-          <w:szCs w:val="24"/>
-          <w:u w:val="single"/>
-        </w:rPr>
-        <w:t>: C:\Users\ {username} \</w:t>
-      </w:r>
-      <w:bookmarkStart w:id="21" w:name="_mioConsistencyCheck1025"/>
-      <w:r>
-        <w:rPr>
-          <w:i/>
-          <w:sz w:val="24"/>
-          <w:szCs w:val="24"/>
-          <w:u w:val="single"/>
-        </w:rPr>
-        <w:t>ModusToolbox</w:t>
-      </w:r>
-      <w:bookmarkEnd w:id="21"/>
-      <w:r>
-        <w:rPr>
-          <w:i/>
-          <w:sz w:val="24"/>
-          <w:szCs w:val="24"/>
-          <w:u w:val="single"/>
-        </w:rPr>
-        <w:t>\packs</w:t>
-      </w:r>
-    </w:p>
-    <w:p>
-      <w:pPr>
-        <w:pStyle w:val="Body"/>
-        <w:ind w:left="2494"/>
-        <w:rPr>
-          <w:i/>
-          <w:sz w:val="24"/>
-          <w:szCs w:val="24"/>
-        </w:rPr>
-      </w:pPr>
-      <w:r>
-        <w:rPr>
-          <w:b/>
-          <w:i/>
-          <w:sz w:val="24"/>
-          <w:szCs w:val="24"/>
-        </w:rPr>
-        <w:t>Linux</w:t>
-      </w:r>
-      <w:r>
-        <w:rPr>
-          <w:i/>
-          <w:sz w:val="24"/>
-          <w:szCs w:val="24"/>
-        </w:rPr>
-        <w:t xml:space="preserve">: </w:t>
-      </w:r>
-      <w:r>
-        <w:rPr>
-          <w:i/>
-          <w:sz w:val="24"/>
-          <w:szCs w:val="24"/>
-          <w:u w:val="single"/>
-        </w:rPr>
-        <w:t>/opt/Tools/</w:t>
-      </w:r>
-      <w:bookmarkStart w:id="22" w:name="_mioConsistencyCheck1026"/>
-      <w:r>
-        <w:rPr>
-          <w:i/>
-          <w:sz w:val="24"/>
-          <w:szCs w:val="24"/>
-          <w:u w:val="single"/>
-        </w:rPr>
-        <w:t>ModusToolbox</w:t>
-      </w:r>
-      <w:bookmarkEnd w:id="22"/>
-      <w:r>
-        <w:rPr>
-          <w:i/>
-          <w:sz w:val="24"/>
-          <w:szCs w:val="24"/>
-          <w:u w:val="single"/>
-        </w:rPr>
-        <w:t>/packs</w:t>
-      </w:r>
-    </w:p>
-    <w:p>
-      <w:pPr>
-        <w:pStyle w:val="Body"/>
-        <w:keepNext/>
-        <w:numPr>
-          <w:ilvl w:val="1"/>
-          <w:numId w:val="34"/>
-        </w:numPr>
-        <w:rPr>
-          <w:sz w:val="24"/>
-          <w:szCs w:val="24"/>
-        </w:rPr>
-      </w:pPr>
-      <w:r>
-        <w:rPr>
-          <w:sz w:val="24"/>
-          <w:szCs w:val="24"/>
-        </w:rPr>
-        <w:lastRenderedPageBreak/>
-        <w:t>After installing the Early Access Pack, use the following system variable to enable the early access environment</w:t>
-      </w:r>
-    </w:p>
-    <w:p>
-      <w:pPr>
-        <w:pStyle w:val="Body"/>
-        <w:keepNext/>
-        <w:ind w:left="2074"/>
-        <w:rPr>
-          <w:i/>
-          <w:sz w:val="24"/>
-          <w:szCs w:val="24"/>
-        </w:rPr>
-      </w:pPr>
-      <w:r>
-        <w:rPr>
-          <w:b/>
-          <w:i/>
-          <w:sz w:val="24"/>
-          <w:szCs w:val="24"/>
-        </w:rPr>
-        <w:t>Variable name</w:t>
-      </w:r>
-      <w:r>
-        <w:rPr>
-          <w:i/>
-          <w:sz w:val="24"/>
-          <w:szCs w:val="24"/>
-        </w:rPr>
-        <w:t xml:space="preserve">: </w:t>
-      </w:r>
-      <w:r>
-        <w:rPr>
-          <w:i/>
-          <w:sz w:val="24"/>
-          <w:szCs w:val="24"/>
-        </w:rPr>
-        <w:t>MTB_ENABLE_EARLY_ACCESS</w:t>
-      </w:r>
-    </w:p>
-    <w:p>
-      <w:pPr>
-        <w:pStyle w:val="Body"/>
-        <w:keepNext/>
-        <w:ind w:left="2074"/>
-        <w:rPr>
-          <w:i/>
-          <w:sz w:val="24"/>
-          <w:szCs w:val="24"/>
-          <w:u w:val="single"/>
-        </w:rPr>
-      </w:pPr>
-      <w:r>
-        <w:rPr>
-          <w:b/>
-          <w:i/>
-          <w:sz w:val="24"/>
-          <w:szCs w:val="24"/>
-        </w:rPr>
-        <w:t>Variable value</w:t>
-      </w:r>
-      <w:r>
-        <w:rPr>
-          <w:i/>
-          <w:sz w:val="24"/>
-          <w:szCs w:val="24"/>
-        </w:rPr>
-        <w:t xml:space="preserve">: </w:t>
-      </w:r>
-      <w:r>
-        <w:rPr>
-          <w:i/>
-          <w:sz w:val="24"/>
-          <w:szCs w:val="24"/>
-        </w:rPr>
-        <w:t>com.ifx.tb.tool.modustoolboxpackpsoce84</w:t>
-      </w:r>
-    </w:p>
-    <w:p>
-      <w:pPr>
-        <w:pStyle w:val="Body"/>
-        <w:ind w:left="2070"/>
-        <w:jc w:val="center"/>
-        <w:rPr>
-          <w:i/>
-          <w:sz w:val="24"/>
-          <w:szCs w:val="24"/>
-        </w:rPr>
-      </w:pPr>
-      <w:r>
-        <w:rPr>
-          <w:noProof/>
-          <w:sz w:val="24"/>
-          <w:szCs w:val="24"/>
-        </w:rPr>
-        <w:drawing>
-          <wp:inline distT="0" distB="0" distL="0" distR="0" wp14:anchorId="0F756896" wp14:editId="2639F346">
-            <wp:extent cx="4996576" cy="1009498"/>
-            <wp:effectExtent l="0" t="0" r="0" b="635"/>
-            <wp:docPr id="24" name="Picture 24"/>
-            <wp:cNvGraphicFramePr>
-              <a:graphicFrameLocks xmlns:a="http://schemas.openxmlformats.org/drawingml/2006/main" noChangeAspect="1"/>
-            </wp:cNvGraphicFramePr>
-            <a:graphic xmlns:a="http://schemas.openxmlformats.org/drawingml/2006/main">
-              <a:graphicData uri="http://schemas.openxmlformats.org/drawingml/2006/picture">
-                <pic:pic xmlns:pic="http://schemas.openxmlformats.org/drawingml/2006/picture">
-                  <pic:nvPicPr>
-                    <pic:cNvPr id="1" name=""/>
-                    <pic:cNvPicPr/>
-                  </pic:nvPicPr>
-                  <pic:blipFill>
-                    <a:blip r:embed="rId19"/>
-                    <a:stretch>
-                      <a:fillRect/>
-                    </a:stretch>
-                  </pic:blipFill>
-                  <pic:spPr>
-                    <a:xfrm>
-                      <a:off x="0" y="0"/>
-                      <a:ext cx="5111580" cy="1032733"/>
-                    </a:xfrm>
-                    <a:prstGeom prst="rect">
-                      <a:avLst/>
-                    </a:prstGeom>
-                  </pic:spPr>
-                </pic:pic>
-              </a:graphicData>
-            </a:graphic>
-          </wp:inline>
-        </w:drawing>
-      </w:r>
-    </w:p>
-    <w:p>
-      <w:pPr>
-        <w:pStyle w:val="Body"/>
-        <w:numPr>
-          <w:ilvl w:val="1"/>
-          <w:numId w:val="34"/>
-        </w:numPr>
-        <w:rPr>
-          <w:sz w:val="24"/>
-          <w:szCs w:val="24"/>
-        </w:rPr>
-      </w:pPr>
-      <w:r>
-        <w:rPr>
-          <w:sz w:val="24"/>
-          <w:szCs w:val="24"/>
-        </w:rPr>
-        <w:t xml:space="preserve">Save the Environment variables and </w:t>
-      </w:r>
-      <w:r>
-        <w:rPr>
-          <w:b/>
-          <w:sz w:val="24"/>
-          <w:szCs w:val="24"/>
-        </w:rPr>
-        <w:t>restart</w:t>
-      </w:r>
-      <w:r>
-        <w:rPr>
-          <w:sz w:val="24"/>
-          <w:szCs w:val="24"/>
-        </w:rPr>
-        <w:t xml:space="preserve"> ModusToolbox™ software</w:t>
-      </w:r>
-    </w:p>
-    <w:p>
-      <w:pPr>
-        <w:pStyle w:val="ListParagraph"/>
-        <w:keepNext/>
-        <w:numPr>
-          <w:ilvl w:val="0"/>
-          <w:numId w:val="34"/>
-        </w:numPr>
-        <w:spacing w:before="160" w:after="160"/>
-        <w:ind w:left="1710"/>
-        <w:contextualSpacing w:val="0"/>
-        <w:rPr>
-          <w:sz w:val="24"/>
-          <w:szCs w:val="24"/>
-          <w:lang w:val="en-IN" w:eastAsia="en-IN"/>
-        </w:rPr>
-      </w:pPr>
-      <w:r>
-        <w:rPr>
-          <w:b/>
-          <w:bCs/>
-          <w:sz w:val="24"/>
-          <w:szCs w:val="24"/>
-          <w:lang w:val="en-IN" w:eastAsia="en-IN"/>
-        </w:rPr>
-        <w:t>Extended Boot</w:t>
-      </w:r>
-      <w:r>
-        <w:rPr>
-          <w:sz w:val="24"/>
-          <w:szCs w:val="24"/>
-          <w:lang w:val="en-IN" w:eastAsia="en-IN"/>
-        </w:rPr>
-        <w:t xml:space="preserve"> </w:t>
-      </w:r>
-    </w:p>
-    <w:p>
-      <w:pPr>
-        <w:pStyle w:val="NormalWeb"/>
-        <w:keepNext/>
-        <w:keepLines/>
-        <w:spacing w:before="160" w:beforeAutospacing="0" w:after="160" w:afterAutospacing="0"/>
-        <w:ind w:left="1714"/>
-        <w:rPr>
-          <w:rFonts w:ascii="Source Sans Pro" w:hAnsi="Source Sans Pro"/>
-        </w:rPr>
-      </w:pPr>
-      <w:r>
-        <w:rPr>
-          <w:rFonts w:ascii="Source Sans Pro" w:hAnsi="Source Sans Pro"/>
-        </w:rPr>
-        <w:t xml:space="preserve">These code examples expect the Extended Boot version 1.1.0.1333 or later. If your device has an older version, you will have to update it before running this code example. To check the version of Extended Boot, open modus-shell and execute the following command: </w:t>
-      </w:r>
-    </w:p>
-    <w:p>
-      <w:pPr>
-        <w:pStyle w:val="NormalWeb"/>
-        <w:keepNext/>
-        <w:spacing w:before="160" w:beforeAutospacing="0" w:after="160" w:afterAutospacing="0"/>
-        <w:ind w:left="2131"/>
-        <w:rPr>
-          <w:rFonts w:ascii="Source Sans Pro" w:hAnsi="Source Sans Pro"/>
-        </w:rPr>
-      </w:pPr>
-      <w:r>
-        <w:rPr>
-          <w:rFonts w:ascii="Source Sans Pro" w:hAnsi="Source Sans Pro"/>
-        </w:rPr>
-        <w:t>edgeprotecttools -t pse84 device-info</w:t>
-      </w:r>
-    </w:p>
-    <w:p>
-      <w:pPr>
-        <w:pStyle w:val="NormalWeb"/>
-        <w:numPr>
-          <w:ilvl w:val="1"/>
-          <w:numId w:val="34"/>
-        </w:numPr>
-        <w:spacing w:before="160" w:beforeAutospacing="0" w:after="160" w:afterAutospacing="0"/>
-        <w:ind w:left="2070"/>
-        <w:rPr>
-          <w:rFonts w:ascii="Source Sans Pro" w:hAnsi="Source Sans Pro"/>
-        </w:rPr>
-      </w:pPr>
-      <w:r>
-        <w:rPr>
-          <w:rFonts w:ascii="Source Sans Pro" w:hAnsi="Source Sans Pro"/>
-        </w:rPr>
-        <w:t>To update/replace Extended Boot in the PS</w:t>
-      </w:r>
-      <w:r>
-        <w:rPr>
-          <w:rFonts w:ascii="Source Sans Pro" w:hAnsi="Source Sans Pro"/>
-        </w:rPr>
-        <w:t>O</w:t>
-      </w:r>
-      <w:r>
-        <w:rPr>
-          <w:rFonts w:ascii="Source Sans Pro" w:hAnsi="Source Sans Pro"/>
-        </w:rPr>
-        <w:t>C™ Edge MCU device, see section Replacing the Extended Boot in AN237849 - Getting Started with PS</w:t>
-      </w:r>
-      <w:r>
-        <w:rPr>
-          <w:rFonts w:ascii="Source Sans Pro" w:hAnsi="Source Sans Pro"/>
-        </w:rPr>
-        <w:t>O</w:t>
-      </w:r>
-      <w:r>
-        <w:rPr>
-          <w:rFonts w:ascii="Source Sans Pro" w:hAnsi="Source Sans Pro"/>
-        </w:rPr>
-        <w:t>C™ Edge Security.</w:t>
-      </w:r>
-    </w:p>
-    <w:p>
-      <w:pPr>
-        <w:pStyle w:val="Body"/>
-        <w:numPr>
-          <w:ilvl w:val="0"/>
-          <w:numId w:val="34"/>
-        </w:numPr>
-      </w:pPr>
-      <w:r>
-        <w:t xml:space="preserve">Install a terminal emulator if you do not have one. Instructions in this document use </w:t>
-      </w:r>
-      <w:hyperlink r:id="rId20" w:history="1">
-        <w:r>
-          <w:rPr>
-            <w:rStyle w:val="Hyperlink"/>
-            <w:rFonts w:cs="Segoe UI"/>
-            <w:spacing w:val="3"/>
-            <w:shd w:val="clear" w:color="auto" w:fill="FFFFFF"/>
-          </w:rPr>
-          <w:t>Tera Term</w:t>
-        </w:r>
-      </w:hyperlink>
+      <w:commentRangeEnd w:id="18"/>
+      <w:r>
+        <w:rPr>
+          <w:rStyle w:val="CommentReference"/>
+          <w:lang w:eastAsia="en-US"/>
+        </w:rPr>
+        <w:commentReference w:id="18"/>
+      </w:r>
       <w:r>
         <w:t>.</w:t>
       </w:r>
+      <w:bookmarkStart w:id="19" w:name="_GoBack"/>
+      <w:bookmarkEnd w:id="19"/>
     </w:p>
     <w:p>
       <w:pPr>
@@ -3527,7 +3006,7 @@
           <w:lang w:eastAsia="de-DE"/>
         </w:rPr>
       </w:pPr>
-      <w:bookmarkStart w:id="23" w:name="_Toc192780015"/>
+      <w:bookmarkStart w:id="20" w:name="_Toc192780015"/>
       <w:r>
         <w:rPr>
           <w:b/>
@@ -3559,7 +3038,7 @@
         </w:rPr>
         <w:t>using HAL</w:t>
       </w:r>
-      <w:bookmarkEnd w:id="23"/>
+      <w:bookmarkEnd w:id="20"/>
       <w:r>
         <w:rPr>
           <w:b/>
@@ -3601,7 +3080,7 @@
           <w:lang w:eastAsia="de-DE"/>
         </w:rPr>
       </w:pPr>
-      <w:bookmarkStart w:id="24" w:name="_Toc192780016"/>
+      <w:bookmarkStart w:id="21" w:name="_Toc192780016"/>
       <w:r>
         <w:rPr>
           <w:b/>
@@ -3612,7 +3091,7 @@
         </w:rPr>
         <w:t>Objective</w:t>
       </w:r>
-      <w:bookmarkEnd w:id="24"/>
+      <w:bookmarkEnd w:id="21"/>
     </w:p>
     <w:p>
       <w:pPr>
@@ -3683,11 +3162,11 @@
       <w:pPr>
         <w:pStyle w:val="Heading2"/>
       </w:pPr>
-      <w:bookmarkStart w:id="25" w:name="_Toc192780017"/>
+      <w:bookmarkStart w:id="22" w:name="_Toc192780017"/>
       <w:r>
         <w:t>Description</w:t>
       </w:r>
-      <w:bookmarkEnd w:id="25"/>
+      <w:bookmarkEnd w:id="22"/>
     </w:p>
     <w:p>
       <w:pPr>
@@ -3752,7 +3231,7 @@
                     </pic:cNvPicPr>
                   </pic:nvPicPr>
                   <pic:blipFill>
-                    <a:blip r:embed="rId21"/>
+                    <a:blip r:embed="rId22"/>
                     <a:stretch>
                       <a:fillRect/>
                     </a:stretch>
@@ -3944,7 +3423,7 @@
           <w:b w:val="0"/>
         </w:rPr>
       </w:pPr>
-      <w:bookmarkStart w:id="26" w:name="_Toc192780018"/>
+      <w:bookmarkStart w:id="23" w:name="_Toc192780018"/>
       <w:r>
         <w:rPr>
           <w:b w:val="0"/>
@@ -3952,7 +3431,7 @@
         <w:lastRenderedPageBreak/>
         <w:t>Flowchart</w:t>
       </w:r>
-      <w:bookmarkEnd w:id="26"/>
+      <w:bookmarkEnd w:id="23"/>
     </w:p>
     <w:p>
       <w:pPr>
@@ -3999,9 +3478,9 @@
             <o:lock v:ext="edit" aspectratio="t"/>
           </v:shapetype>
           <v:shape id="_x0000_i1025" type="#_x0000_t75" style="width:475.7pt;height:588.05pt" o:ole="">
-            <v:imagedata r:id="rId22" o:title=""/>
+            <v:imagedata r:id="rId23" o:title=""/>
           </v:shape>
-          <o:OLEObject Type="Embed" ProgID="Visio.Drawing.15" ShapeID="_x0000_i1025" DrawAspect="Content" ObjectID="_1822625767" r:id="rId23"/>
+          <o:OLEObject Type="Embed" ProgID="Visio.Drawing.15" ShapeID="_x0000_i1025" DrawAspect="Content" ObjectID="_1822627429" r:id="rId24"/>
         </w:object>
       </w:r>
     </w:p>
@@ -4048,9 +3527,9 @@
       <w:r>
         <w:object w:dxaOrig="4404" w:dyaOrig="4296" w14:anchorId="54967411">
           <v:shape id="_x0000_i1026" type="#_x0000_t75" style="width:116.95pt;height:114.05pt" o:ole="">
-            <v:imagedata r:id="rId24" o:title=""/>
+            <v:imagedata r:id="rId25" o:title=""/>
           </v:shape>
-          <o:OLEObject Type="Embed" ProgID="Visio.Drawing.15" ShapeID="_x0000_i1026" DrawAspect="Content" ObjectID="_1822625768" r:id="rId25"/>
+          <o:OLEObject Type="Embed" ProgID="Visio.Drawing.15" ShapeID="_x0000_i1026" DrawAspect="Content" ObjectID="_1822627430" r:id="rId26"/>
         </w:object>
       </w:r>
     </w:p>
@@ -4067,14 +3546,14 @@
           <w:b w:val="0"/>
         </w:rPr>
       </w:pPr>
-      <w:bookmarkStart w:id="27" w:name="_Toc192780019"/>
+      <w:bookmarkStart w:id="24" w:name="_Toc192780019"/>
       <w:r>
         <w:rPr>
           <w:b w:val="0"/>
         </w:rPr>
         <w:t>Hardware Block Diagram</w:t>
       </w:r>
-      <w:bookmarkEnd w:id="27"/>
+      <w:bookmarkEnd w:id="24"/>
     </w:p>
     <w:p>
       <w:pPr>
@@ -4192,100 +3671,6 @@
             <wp:extent cx="5642610" cy="2631117"/>
             <wp:effectExtent l="0" t="0" r="0" b="0"/>
             <wp:docPr id="1" name="Picture 1"/>
-            <wp:cNvGraphicFramePr>
-              <a:graphicFrameLocks xmlns:a="http://schemas.openxmlformats.org/drawingml/2006/main" noChangeAspect="1"/>
-            </wp:cNvGraphicFramePr>
-            <a:graphic xmlns:a="http://schemas.openxmlformats.org/drawingml/2006/main">
-              <a:graphicData uri="http://schemas.openxmlformats.org/drawingml/2006/picture">
-                <pic:pic xmlns:pic="http://schemas.openxmlformats.org/drawingml/2006/picture">
-                  <pic:nvPicPr>
-                    <pic:cNvPr id="1" name=""/>
-                    <pic:cNvPicPr/>
-                  </pic:nvPicPr>
-                  <pic:blipFill>
-                    <a:blip r:embed="rId26"/>
-                    <a:stretch>
-                      <a:fillRect/>
-                    </a:stretch>
-                  </pic:blipFill>
-                  <pic:spPr>
-                    <a:xfrm>
-                      <a:off x="0" y="0"/>
-                      <a:ext cx="5661036" cy="2639709"/>
-                    </a:xfrm>
-                    <a:prstGeom prst="rect">
-                      <a:avLst/>
-                    </a:prstGeom>
-                  </pic:spPr>
-                </pic:pic>
-              </a:graphicData>
-            </a:graphic>
-          </wp:inline>
-        </w:drawing>
-      </w:r>
-    </w:p>
-    <w:p>
-      <w:pPr>
-        <w:pStyle w:val="Body"/>
-      </w:pPr>
-    </w:p>
-    <w:p>
-      <w:pPr>
-        <w:keepNext/>
-        <w:numPr>
-          <w:ilvl w:val="1"/>
-          <w:numId w:val="1"/>
-        </w:numPr>
-        <w:tabs>
-          <w:tab w:val="left" w:pos="1418"/>
-        </w:tabs>
-        <w:spacing w:before="240" w:after="120"/>
-        <w:ind w:left="1418" w:hanging="1418"/>
-        <w:outlineLvl w:val="1"/>
-        <w:rPr>
-          <w:snapToGrid w:val="0"/>
-          <w:kern w:val="28"/>
-          <w:sz w:val="28"/>
-          <w:lang w:eastAsia="de-DE"/>
-        </w:rPr>
-      </w:pPr>
-      <w:bookmarkStart w:id="28" w:name="_Toc192780020"/>
-      <w:bookmarkStart w:id="29" w:name="_Hlk190961414"/>
-      <w:r>
-        <w:rPr>
-          <w:snapToGrid w:val="0"/>
-          <w:kern w:val="28"/>
-          <w:sz w:val="28"/>
-          <w:lang w:eastAsia="de-DE"/>
-        </w:rPr>
-        <w:lastRenderedPageBreak/>
-        <w:t>Hardware Setup</w:t>
-      </w:r>
-      <w:bookmarkEnd w:id="28"/>
-      <w:r>
-        <w:rPr>
-          <w:snapToGrid w:val="0"/>
-          <w:kern w:val="28"/>
-          <w:sz w:val="28"/>
-          <w:lang w:eastAsia="de-DE"/>
-        </w:rPr>
-        <w:t xml:space="preserve"> </w:t>
-      </w:r>
-    </w:p>
-    <w:p>
-      <w:pPr>
-        <w:pStyle w:val="Body"/>
-        <w:jc w:val="center"/>
-      </w:pPr>
-      <w:r>
-        <w:rPr>
-          <w:noProof/>
-        </w:rPr>
-        <w:drawing>
-          <wp:inline distT="0" distB="0" distL="0" distR="0" wp14:anchorId="57B90902" wp14:editId="709B6FC2">
-            <wp:extent cx="5348500" cy="3059430"/>
-            <wp:effectExtent l="0" t="0" r="5080" b="7620"/>
-            <wp:docPr id="34" name="Picture 34"/>
             <wp:cNvGraphicFramePr>
               <a:graphicFrameLocks xmlns:a="http://schemas.openxmlformats.org/drawingml/2006/main" noChangeAspect="1"/>
             </wp:cNvGraphicFramePr>
@@ -4305,6 +3690,100 @@
                   <pic:spPr>
                     <a:xfrm>
                       <a:off x="0" y="0"/>
+                      <a:ext cx="5661036" cy="2639709"/>
+                    </a:xfrm>
+                    <a:prstGeom prst="rect">
+                      <a:avLst/>
+                    </a:prstGeom>
+                  </pic:spPr>
+                </pic:pic>
+              </a:graphicData>
+            </a:graphic>
+          </wp:inline>
+        </w:drawing>
+      </w:r>
+    </w:p>
+    <w:p>
+      <w:pPr>
+        <w:pStyle w:val="Body"/>
+      </w:pPr>
+    </w:p>
+    <w:p>
+      <w:pPr>
+        <w:keepNext/>
+        <w:numPr>
+          <w:ilvl w:val="1"/>
+          <w:numId w:val="1"/>
+        </w:numPr>
+        <w:tabs>
+          <w:tab w:val="left" w:pos="1418"/>
+        </w:tabs>
+        <w:spacing w:before="240" w:after="120"/>
+        <w:ind w:left="1418" w:hanging="1418"/>
+        <w:outlineLvl w:val="1"/>
+        <w:rPr>
+          <w:snapToGrid w:val="0"/>
+          <w:kern w:val="28"/>
+          <w:sz w:val="28"/>
+          <w:lang w:eastAsia="de-DE"/>
+        </w:rPr>
+      </w:pPr>
+      <w:bookmarkStart w:id="25" w:name="_Toc192780020"/>
+      <w:bookmarkStart w:id="26" w:name="_Hlk190961414"/>
+      <w:r>
+        <w:rPr>
+          <w:snapToGrid w:val="0"/>
+          <w:kern w:val="28"/>
+          <w:sz w:val="28"/>
+          <w:lang w:eastAsia="de-DE"/>
+        </w:rPr>
+        <w:lastRenderedPageBreak/>
+        <w:t>Hardware Setup</w:t>
+      </w:r>
+      <w:bookmarkEnd w:id="25"/>
+      <w:r>
+        <w:rPr>
+          <w:snapToGrid w:val="0"/>
+          <w:kern w:val="28"/>
+          <w:sz w:val="28"/>
+          <w:lang w:eastAsia="de-DE"/>
+        </w:rPr>
+        <w:t xml:space="preserve"> </w:t>
+      </w:r>
+    </w:p>
+    <w:p>
+      <w:pPr>
+        <w:pStyle w:val="Body"/>
+        <w:jc w:val="center"/>
+      </w:pPr>
+      <w:r>
+        <w:rPr>
+          <w:noProof/>
+        </w:rPr>
+        <w:drawing>
+          <wp:inline distT="0" distB="0" distL="0" distR="0" wp14:anchorId="57B90902" wp14:editId="709B6FC2">
+            <wp:extent cx="5348500" cy="3059430"/>
+            <wp:effectExtent l="0" t="0" r="5080" b="7620"/>
+            <wp:docPr id="34" name="Picture 34"/>
+            <wp:cNvGraphicFramePr>
+              <a:graphicFrameLocks xmlns:a="http://schemas.openxmlformats.org/drawingml/2006/main" noChangeAspect="1"/>
+            </wp:cNvGraphicFramePr>
+            <a:graphic xmlns:a="http://schemas.openxmlformats.org/drawingml/2006/main">
+              <a:graphicData uri="http://schemas.openxmlformats.org/drawingml/2006/picture">
+                <pic:pic xmlns:pic="http://schemas.openxmlformats.org/drawingml/2006/picture">
+                  <pic:nvPicPr>
+                    <pic:cNvPr id="1" name=""/>
+                    <pic:cNvPicPr/>
+                  </pic:nvPicPr>
+                  <pic:blipFill>
+                    <a:blip r:embed="rId28"/>
+                    <a:stretch>
+                      <a:fillRect/>
+                    </a:stretch>
+                  </pic:blipFill>
+                  <pic:spPr>
+                    <a:xfrm>
+                      <a:off x="0" y="0"/>
                       <a:ext cx="5353426" cy="3062248"/>
                     </a:xfrm>
                     <a:prstGeom prst="rect">
@@ -4318,7 +3797,7 @@
         </w:drawing>
       </w:r>
     </w:p>
-    <w:bookmarkEnd w:id="29"/>
+    <w:bookmarkEnd w:id="26"/>
     <w:p>
       <w:pPr>
         <w:pStyle w:val="Body"/>
@@ -4345,7 +3824,7 @@
           <w:lang w:eastAsia="de-DE"/>
         </w:rPr>
       </w:pPr>
-      <w:bookmarkStart w:id="30" w:name="_Toc192780021"/>
+      <w:bookmarkStart w:id="27" w:name="_Toc192780021"/>
       <w:r>
         <w:rPr>
           <w:b/>
@@ -4356,7 +3835,7 @@
         </w:rPr>
         <w:t>Project Creation</w:t>
       </w:r>
-      <w:bookmarkEnd w:id="30"/>
+      <w:bookmarkEnd w:id="27"/>
       <w:r>
         <w:rPr>
           <w:b/>
@@ -4465,7 +3944,7 @@
                     </pic:cNvPicPr>
                   </pic:nvPicPr>
                   <pic:blipFill>
-                    <a:blip r:embed="rId28" cstate="print">
+                    <a:blip r:embed="rId29" cstate="print">
                       <a:extLst>
                         <a:ext uri="{28A0092B-C50C-407E-A947-70E740481C1C}">
                           <a14:useLocalDpi xmlns:a14="http://schemas.microsoft.com/office/drawing/2010/main" val="0"/>
@@ -4574,7 +4053,7 @@
                     </pic:cNvPicPr>
                   </pic:nvPicPr>
                   <pic:blipFill>
-                    <a:blip r:embed="rId29">
+                    <a:blip r:embed="rId30">
                       <a:extLst>
                         <a:ext uri="{28A0092B-C50C-407E-A947-70E740481C1C}">
                           <a14:useLocalDpi xmlns:a14="http://schemas.microsoft.com/office/drawing/2010/main" val="0"/>
@@ -4702,7 +4181,7 @@
                     <pic:cNvPicPr/>
                   </pic:nvPicPr>
                   <pic:blipFill>
-                    <a:blip r:embed="rId30"/>
+                    <a:blip r:embed="rId31"/>
                     <a:stretch>
                       <a:fillRect/>
                     </a:stretch>
@@ -4848,7 +4327,7 @@
                     </pic:cNvPicPr>
                   </pic:nvPicPr>
                   <pic:blipFill>
-                    <a:blip r:embed="rId31">
+                    <a:blip r:embed="rId32">
                       <a:extLst>
                         <a:ext uri="{28A0092B-C50C-407E-A947-70E740481C1C}">
                           <a14:useLocalDpi xmlns:a14="http://schemas.microsoft.com/office/drawing/2010/main" val="0"/>
@@ -5097,7 +4576,7 @@
                     </pic:cNvPicPr>
                   </pic:nvPicPr>
                   <pic:blipFill>
-                    <a:blip r:embed="rId32" cstate="print">
+                    <a:blip r:embed="rId33" cstate="print">
                       <a:extLst>
                         <a:ext uri="{28A0092B-C50C-407E-A947-70E740481C1C}">
                           <a14:useLocalDpi xmlns:a14="http://schemas.microsoft.com/office/drawing/2010/main" val="0"/>
@@ -5286,7 +4765,7 @@
                     </pic:cNvPicPr>
                   </pic:nvPicPr>
                   <pic:blipFill>
-                    <a:blip r:embed="rId33" cstate="print">
+                    <a:blip r:embed="rId34" cstate="print">
                       <a:extLst>
                         <a:ext uri="{28A0092B-C50C-407E-A947-70E740481C1C}">
                           <a14:useLocalDpi xmlns:a14="http://schemas.microsoft.com/office/drawing/2010/main" val="0"/>
@@ -5418,7 +4897,7 @@
                     </pic:cNvPicPr>
                   </pic:nvPicPr>
                   <pic:blipFill>
-                    <a:blip r:embed="rId34" cstate="print">
+                    <a:blip r:embed="rId35" cstate="print">
                       <a:extLst>
                         <a:ext uri="{28A0092B-C50C-407E-A947-70E740481C1C}">
                           <a14:useLocalDpi xmlns:a14="http://schemas.microsoft.com/office/drawing/2010/main" val="0"/>
@@ -5505,7 +4984,7 @@
                     <pic:cNvPicPr/>
                   </pic:nvPicPr>
                   <pic:blipFill rotWithShape="1">
-                    <a:blip r:embed="rId35">
+                    <a:blip r:embed="rId36">
                       <a:extLst>
                         <a:ext uri="{28A0092B-C50C-407E-A947-70E740481C1C}">
                           <a14:useLocalDpi xmlns:a14="http://schemas.microsoft.com/office/drawing/2010/main" val="0"/>
@@ -5618,7 +5097,7 @@
                     </pic:cNvPicPr>
                   </pic:nvPicPr>
                   <pic:blipFill>
-                    <a:blip r:embed="rId36">
+                    <a:blip r:embed="rId37">
                       <a:extLst>
                         <a:ext uri="{28A0092B-C50C-407E-A947-70E740481C1C}">
                           <a14:useLocalDpi xmlns:a14="http://schemas.microsoft.com/office/drawing/2010/main" val="0"/>
@@ -5818,7 +5297,7 @@
                     </pic:cNvPicPr>
                   </pic:nvPicPr>
                   <pic:blipFill>
-                    <a:blip r:embed="rId37" cstate="print">
+                    <a:blip r:embed="rId38" cstate="print">
                       <a:extLst>
                         <a:ext uri="{28A0092B-C50C-407E-A947-70E740481C1C}">
                           <a14:useLocalDpi xmlns:a14="http://schemas.microsoft.com/office/drawing/2010/main" val="0"/>
@@ -6005,7 +5484,7 @@
                     </pic:cNvPicPr>
                   </pic:nvPicPr>
                   <pic:blipFill>
-                    <a:blip r:embed="rId38">
+                    <a:blip r:embed="rId39">
                       <a:extLst>
                         <a:ext uri="{28A0092B-C50C-407E-A947-70E740481C1C}">
                           <a14:useLocalDpi xmlns:a14="http://schemas.microsoft.com/office/drawing/2010/main" val="0"/>
@@ -6121,7 +5600,7 @@
                     </pic:cNvPicPr>
                   </pic:nvPicPr>
                   <pic:blipFill>
-                    <a:blip r:embed="rId39" cstate="print">
+                    <a:blip r:embed="rId40" cstate="print">
                       <a:extLst>
                         <a:ext uri="{28A0092B-C50C-407E-A947-70E740481C1C}">
                           <a14:useLocalDpi xmlns:a14="http://schemas.microsoft.com/office/drawing/2010/main" val="0"/>
@@ -6382,7 +5861,7 @@
                     </pic:cNvPicPr>
                   </pic:nvPicPr>
                   <pic:blipFill>
-                    <a:blip r:embed="rId40" cstate="print">
+                    <a:blip r:embed="rId41" cstate="print">
                       <a:extLst>
                         <a:ext uri="{28A0092B-C50C-407E-A947-70E740481C1C}">
                           <a14:useLocalDpi xmlns:a14="http://schemas.microsoft.com/office/drawing/2010/main" val="0"/>
@@ -6497,7 +5976,7 @@
                     <pic:cNvPicPr/>
                   </pic:nvPicPr>
                   <pic:blipFill>
-                    <a:blip r:embed="rId41" cstate="print">
+                    <a:blip r:embed="rId42" cstate="print">
                       <a:extLst>
                         <a:ext uri="{28A0092B-C50C-407E-A947-70E740481C1C}">
                           <a14:useLocalDpi xmlns:a14="http://schemas.microsoft.com/office/drawing/2010/main" val="0"/>
@@ -6611,7 +6090,7 @@
                     </pic:cNvPicPr>
                   </pic:nvPicPr>
                   <pic:blipFill>
-                    <a:blip r:embed="rId42">
+                    <a:blip r:embed="rId43">
                       <a:extLst>
                         <a:ext uri="{28A0092B-C50C-407E-A947-70E740481C1C}">
                           <a14:useLocalDpi xmlns:a14="http://schemas.microsoft.com/office/drawing/2010/main" val="0"/>
@@ -6693,7 +6172,7 @@
                     <pic:cNvPicPr/>
                   </pic:nvPicPr>
                   <pic:blipFill>
-                    <a:blip r:embed="rId43"/>
+                    <a:blip r:embed="rId44"/>
                     <a:stretch>
                       <a:fillRect/>
                     </a:stretch>
@@ -6897,7 +6376,7 @@
                     <pic:cNvPicPr/>
                   </pic:nvPicPr>
                   <pic:blipFill>
-                    <a:blip r:embed="rId44"/>
+                    <a:blip r:embed="rId45"/>
                     <a:stretch>
                       <a:fillRect/>
                     </a:stretch>
@@ -7035,7 +6514,7 @@
                     </pic:cNvPicPr>
                   </pic:nvPicPr>
                   <pic:blipFill>
-                    <a:blip r:embed="rId45">
+                    <a:blip r:embed="rId46">
                       <a:extLst>
                         <a:ext uri="{28A0092B-C50C-407E-A947-70E740481C1C}">
                           <a14:useLocalDpi xmlns:a14="http://schemas.microsoft.com/office/drawing/2010/main" val="0"/>
@@ -7109,7 +6588,7 @@
                     </pic:cNvPicPr>
                   </pic:nvPicPr>
                   <pic:blipFill>
-                    <a:blip r:embed="rId46">
+                    <a:blip r:embed="rId47">
                       <a:extLst>
                         <a:ext uri="{28A0092B-C50C-407E-A947-70E740481C1C}">
                           <a14:useLocalDpi xmlns:a14="http://schemas.microsoft.com/office/drawing/2010/main" val="0"/>
@@ -7295,7 +6774,7 @@
                     <pic:cNvPicPr/>
                   </pic:nvPicPr>
                   <pic:blipFill>
-                    <a:blip r:embed="rId47"/>
+                    <a:blip r:embed="rId48"/>
                     <a:stretch>
                       <a:fillRect/>
                     </a:stretch>
@@ -7756,7 +7235,7 @@
                     <pic:cNvPicPr/>
                   </pic:nvPicPr>
                   <pic:blipFill>
-                    <a:blip r:embed="rId48">
+                    <a:blip r:embed="rId49">
                       <a:extLst>
                         <a:ext uri="{28A0092B-C50C-407E-A947-70E740481C1C}">
                           <a14:useLocalDpi xmlns:a14="http://schemas.microsoft.com/office/drawing/2010/main" val="0"/>
@@ -7905,7 +7384,7 @@
                     </pic:cNvPicPr>
                   </pic:nvPicPr>
                   <pic:blipFill>
-                    <a:blip r:embed="rId49" cstate="print">
+                    <a:blip r:embed="rId50" cstate="print">
                       <a:extLst>
                         <a:ext uri="{28A0092B-C50C-407E-A947-70E740481C1C}">
                           <a14:useLocalDpi xmlns:a14="http://schemas.microsoft.com/office/drawing/2010/main" val="0"/>
@@ -7971,7 +7450,7 @@
                     </pic:cNvPicPr>
                   </pic:nvPicPr>
                   <pic:blipFill>
-                    <a:blip r:embed="rId50" cstate="print">
+                    <a:blip r:embed="rId51" cstate="print">
                       <a:extLst>
                         <a:ext uri="{28A0092B-C50C-407E-A947-70E740481C1C}">
                           <a14:useLocalDpi xmlns:a14="http://schemas.microsoft.com/office/drawing/2010/main" val="0"/>
@@ -8600,7 +8079,7 @@
         </w:rPr>
         <w:t xml:space="preserve"> will be available in HAL documentation </w:t>
       </w:r>
-      <w:hyperlink r:id="rId51" w:history="1">
+      <w:hyperlink r:id="rId52" w:history="1">
         <w:r>
           <w:rPr>
             <w:rStyle w:val="Hyperlink"/>
@@ -8702,7 +8181,7 @@
                     <pic:cNvPicPr/>
                   </pic:nvPicPr>
                   <pic:blipFill>
-                    <a:blip r:embed="rId52"/>
+                    <a:blip r:embed="rId53"/>
                     <a:stretch>
                       <a:fillRect/>
                     </a:stretch>
@@ -10404,7 +9883,7 @@
           <w:szCs w:val="18"/>
         </w:rPr>
       </w:pPr>
-      <w:bookmarkStart w:id="31" w:name="_Hlk192779201"/>
+      <w:bookmarkStart w:id="28" w:name="_Hlk192779201"/>
       <w:r>
         <w:rPr>
           <w:rFonts w:ascii="Courier New" w:hAnsi="Courier New" w:cs="Courier New"/>
@@ -10414,7 +9893,7 @@
         <w:t>/* Main loop */</w:t>
       </w:r>
     </w:p>
-    <w:bookmarkEnd w:id="31"/>
+    <w:bookmarkEnd w:id="28"/>
     <w:p>
       <w:pPr>
         <w:autoSpaceDE w:val="0"/>
@@ -14766,7 +14245,7 @@
                     <pic:cNvPicPr/>
                   </pic:nvPicPr>
                   <pic:blipFill>
-                    <a:blip r:embed="rId53">
+                    <a:blip r:embed="rId54">
                       <a:extLst>
                         <a:ext uri="{28A0092B-C50C-407E-A947-70E740481C1C}">
                           <a14:useLocalDpi xmlns:a14="http://schemas.microsoft.com/office/drawing/2010/main" val="0"/>
@@ -14899,7 +14378,7 @@
                     <pic:cNvPicPr/>
                   </pic:nvPicPr>
                   <pic:blipFill>
-                    <a:blip r:embed="rId54">
+                    <a:blip r:embed="rId55">
                       <a:extLst>
                         <a:ext uri="{28A0092B-C50C-407E-A947-70E740481C1C}">
                           <a14:useLocalDpi xmlns:a14="http://schemas.microsoft.com/office/drawing/2010/main" val="0"/>
@@ -15008,7 +14487,7 @@
                     <pic:cNvPicPr/>
                   </pic:nvPicPr>
                   <pic:blipFill>
-                    <a:blip r:embed="rId55"/>
+                    <a:blip r:embed="rId56"/>
                     <a:stretch>
                       <a:fillRect/>
                     </a:stretch>
@@ -15050,7 +14529,7 @@
           <w:lang w:eastAsia="de-DE"/>
         </w:rPr>
       </w:pPr>
-      <w:bookmarkStart w:id="32" w:name="_Toc192780022"/>
+      <w:bookmarkStart w:id="29" w:name="_Toc192780022"/>
       <w:r>
         <w:rPr>
           <w:b/>
@@ -15061,7 +14540,7 @@
         </w:rPr>
         <w:t>Conclusion</w:t>
       </w:r>
-      <w:bookmarkEnd w:id="32"/>
+      <w:bookmarkEnd w:id="29"/>
       <w:r>
         <w:rPr>
           <w:b/>
@@ -15165,7 +14644,7 @@
           <w:lang w:eastAsia="de-DE"/>
         </w:rPr>
       </w:pPr>
-      <w:bookmarkStart w:id="33" w:name="_Toc192780023"/>
+      <w:bookmarkStart w:id="30" w:name="_Toc192780023"/>
       <w:r>
         <w:rPr>
           <w:b/>
@@ -15177,7 +14656,7 @@
         <w:lastRenderedPageBreak/>
         <w:t>Code Example 2: IPC queues using HAL</w:t>
       </w:r>
-      <w:bookmarkEnd w:id="33"/>
+      <w:bookmarkEnd w:id="30"/>
     </w:p>
     <w:p>
       <w:pPr>
@@ -15191,11 +14670,11 @@
       <w:r>
         <w:t xml:space="preserve"> </w:t>
       </w:r>
-      <w:bookmarkStart w:id="34" w:name="_Toc192780024"/>
+      <w:bookmarkStart w:id="31" w:name="_Toc192780024"/>
       <w:r>
         <w:t>Objective</w:t>
       </w:r>
-      <w:bookmarkEnd w:id="34"/>
+      <w:bookmarkEnd w:id="31"/>
     </w:p>
     <w:p>
       <w:pPr>
@@ -15210,11 +14689,11 @@
       <w:pPr>
         <w:pStyle w:val="Heading2"/>
       </w:pPr>
-      <w:bookmarkStart w:id="35" w:name="_Toc192780025"/>
+      <w:bookmarkStart w:id="32" w:name="_Toc192780025"/>
       <w:r>
         <w:t>Description</w:t>
       </w:r>
-      <w:bookmarkEnd w:id="35"/>
+      <w:bookmarkEnd w:id="32"/>
     </w:p>
     <w:p>
       <w:pPr>
@@ -15368,7 +14847,7 @@
                     <pic:cNvPicPr/>
                   </pic:nvPicPr>
                   <pic:blipFill>
-                    <a:blip r:embed="rId56"/>
+                    <a:blip r:embed="rId57"/>
                     <a:stretch>
                       <a:fillRect/>
                     </a:stretch>
@@ -15411,11 +14890,11 @@
       <w:pPr>
         <w:pStyle w:val="Heading2"/>
       </w:pPr>
-      <w:bookmarkStart w:id="36" w:name="_Toc192780026"/>
+      <w:bookmarkStart w:id="33" w:name="_Toc192780026"/>
       <w:r>
         <w:t>Flowchart</w:t>
       </w:r>
-      <w:bookmarkEnd w:id="36"/>
+      <w:bookmarkEnd w:id="33"/>
     </w:p>
     <w:p>
       <w:pPr>
@@ -15450,7 +14929,7 @@
                     <pic:cNvPicPr/>
                   </pic:nvPicPr>
                   <pic:blipFill>
-                    <a:blip r:embed="rId57">
+                    <a:blip r:embed="rId58">
                       <a:extLst>
                         <a:ext uri="{28A0092B-C50C-407E-A947-70E740481C1C}">
                           <a14:useLocalDpi xmlns:a14="http://schemas.microsoft.com/office/drawing/2010/main" val="0"/>
@@ -15486,12 +14965,12 @@
       <w:pPr>
         <w:pStyle w:val="Heading2"/>
       </w:pPr>
-      <w:bookmarkStart w:id="37" w:name="_Toc192780027"/>
+      <w:bookmarkStart w:id="34" w:name="_Toc192780027"/>
       <w:r>
         <w:lastRenderedPageBreak/>
         <w:t>Hardware Block Diagram</w:t>
       </w:r>
-      <w:bookmarkEnd w:id="37"/>
+      <w:bookmarkEnd w:id="34"/>
     </w:p>
     <w:p>
       <w:pPr>
@@ -15520,7 +14999,7 @@
                     </pic:cNvPicPr>
                   </pic:nvPicPr>
                   <pic:blipFill>
-                    <a:blip r:embed="rId58">
+                    <a:blip r:embed="rId59">
                       <a:extLst>
                         <a:ext uri="{28A0092B-C50C-407E-A947-70E740481C1C}">
                           <a14:useLocalDpi xmlns:a14="http://schemas.microsoft.com/office/drawing/2010/main" val="0"/>
@@ -15556,11 +15035,11 @@
       <w:pPr>
         <w:pStyle w:val="Heading2"/>
       </w:pPr>
-      <w:bookmarkStart w:id="38" w:name="_Toc192780028"/>
+      <w:bookmarkStart w:id="35" w:name="_Toc192780028"/>
       <w:r>
         <w:t>Hardware Setup</w:t>
       </w:r>
-      <w:bookmarkEnd w:id="38"/>
+      <w:bookmarkEnd w:id="35"/>
     </w:p>
     <w:p>
       <w:pPr>
@@ -15592,7 +15071,7 @@
                     <pic:cNvPicPr/>
                   </pic:nvPicPr>
                   <pic:blipFill>
-                    <a:blip r:embed="rId27"/>
+                    <a:blip r:embed="rId28"/>
                     <a:stretch>
                       <a:fillRect/>
                     </a:stretch>
@@ -15642,12 +15121,12 @@
       <w:pPr>
         <w:pStyle w:val="Heading2"/>
       </w:pPr>
-      <w:bookmarkStart w:id="39" w:name="_Toc192780029"/>
+      <w:bookmarkStart w:id="36" w:name="_Toc192780029"/>
       <w:r>
         <w:lastRenderedPageBreak/>
         <w:t>Project Creation</w:t>
       </w:r>
-      <w:bookmarkEnd w:id="39"/>
+      <w:bookmarkEnd w:id="36"/>
       <w:r>
         <w:t xml:space="preserve"> </w:t>
       </w:r>
@@ -15776,7 +15255,7 @@
                     </pic:cNvPicPr>
                   </pic:nvPicPr>
                   <pic:blipFill>
-                    <a:blip r:embed="rId31">
+                    <a:blip r:embed="rId32">
                       <a:extLst>
                         <a:ext uri="{28A0092B-C50C-407E-A947-70E740481C1C}">
                           <a14:useLocalDpi xmlns:a14="http://schemas.microsoft.com/office/drawing/2010/main" val="0"/>
@@ -15888,7 +15367,7 @@
                     </pic:cNvPicPr>
                   </pic:nvPicPr>
                   <pic:blipFill>
-                    <a:blip r:embed="rId59" cstate="print">
+                    <a:blip r:embed="rId60" cstate="print">
                       <a:extLst>
                         <a:ext uri="{28A0092B-C50C-407E-A947-70E740481C1C}">
                           <a14:useLocalDpi xmlns:a14="http://schemas.microsoft.com/office/drawing/2010/main" val="0"/>
@@ -16130,7 +15609,7 @@
                     </pic:cNvPicPr>
                   </pic:nvPicPr>
                   <pic:blipFill>
-                    <a:blip r:embed="rId60" cstate="print">
+                    <a:blip r:embed="rId61" cstate="print">
                       <a:extLst>
                         <a:ext uri="{28A0092B-C50C-407E-A947-70E740481C1C}">
                           <a14:useLocalDpi xmlns:a14="http://schemas.microsoft.com/office/drawing/2010/main" val="0"/>
@@ -16219,7 +15698,7 @@
                     </pic:cNvPicPr>
                   </pic:nvPicPr>
                   <pic:blipFill>
-                    <a:blip r:embed="rId61">
+                    <a:blip r:embed="rId62">
                       <a:extLst>
                         <a:ext uri="{28A0092B-C50C-407E-A947-70E740481C1C}">
                           <a14:useLocalDpi xmlns:a14="http://schemas.microsoft.com/office/drawing/2010/main" val="0"/>
@@ -16346,7 +15825,7 @@
                     </pic:cNvPicPr>
                   </pic:nvPicPr>
                   <pic:blipFill>
-                    <a:blip r:embed="rId62">
+                    <a:blip r:embed="rId63">
                       <a:extLst>
                         <a:ext uri="{28A0092B-C50C-407E-A947-70E740481C1C}">
                           <a14:useLocalDpi xmlns:a14="http://schemas.microsoft.com/office/drawing/2010/main" val="0"/>
@@ -16519,7 +15998,7 @@
                     </pic:cNvPicPr>
                   </pic:nvPicPr>
                   <pic:blipFill>
-                    <a:blip r:embed="rId63">
+                    <a:blip r:embed="rId64">
                       <a:extLst>
                         <a:ext uri="{28A0092B-C50C-407E-A947-70E740481C1C}">
                           <a14:useLocalDpi xmlns:a14="http://schemas.microsoft.com/office/drawing/2010/main" val="0"/>
@@ -16710,7 +16189,7 @@
                     </pic:cNvPicPr>
                   </pic:nvPicPr>
                   <pic:blipFill>
-                    <a:blip r:embed="rId64">
+                    <a:blip r:embed="rId65">
                       <a:extLst>
                         <a:ext uri="{28A0092B-C50C-407E-A947-70E740481C1C}">
                           <a14:useLocalDpi xmlns:a14="http://schemas.microsoft.com/office/drawing/2010/main" val="0"/>
@@ -16826,7 +16305,7 @@
                     </pic:cNvPicPr>
                   </pic:nvPicPr>
                   <pic:blipFill>
-                    <a:blip r:embed="rId65" cstate="print">
+                    <a:blip r:embed="rId66" cstate="print">
                       <a:extLst>
                         <a:ext uri="{28A0092B-C50C-407E-A947-70E740481C1C}">
                           <a14:useLocalDpi xmlns:a14="http://schemas.microsoft.com/office/drawing/2010/main" val="0"/>
@@ -17135,7 +16614,7 @@
           <w:noProof/>
         </w:rPr>
       </w:pPr>
-      <w:bookmarkStart w:id="40" w:name="_Hlk147320247"/>
+      <w:bookmarkStart w:id="37" w:name="_Hlk147320247"/>
       <w:r>
         <w:rPr>
           <w:b w:val="0"/>
@@ -17249,7 +16728,7 @@
                     </pic:cNvPicPr>
                   </pic:nvPicPr>
                   <pic:blipFill>
-                    <a:blip r:embed="rId66">
+                    <a:blip r:embed="rId67">
                       <a:extLst>
                         <a:ext uri="{28A0092B-C50C-407E-A947-70E740481C1C}">
                           <a14:useLocalDpi xmlns:a14="http://schemas.microsoft.com/office/drawing/2010/main" val="0"/>
@@ -17397,7 +16876,7 @@
                     </pic:cNvPicPr>
                   </pic:nvPicPr>
                   <pic:blipFill>
-                    <a:blip r:embed="rId67">
+                    <a:blip r:embed="rId68">
                       <a:extLst>
                         <a:ext uri="{28A0092B-C50C-407E-A947-70E740481C1C}">
                           <a14:useLocalDpi xmlns:a14="http://schemas.microsoft.com/office/drawing/2010/main" val="0"/>
@@ -17514,7 +16993,7 @@
                     <pic:cNvPicPr/>
                   </pic:nvPicPr>
                   <pic:blipFill>
-                    <a:blip r:embed="rId68"/>
+                    <a:blip r:embed="rId69"/>
                     <a:stretch>
                       <a:fillRect/>
                     </a:stretch>
@@ -17638,7 +17117,7 @@
                     </pic:cNvPicPr>
                   </pic:nvPicPr>
                   <pic:blipFill>
-                    <a:blip r:embed="rId69">
+                    <a:blip r:embed="rId70">
                       <a:extLst>
                         <a:ext uri="{28A0092B-C50C-407E-A947-70E740481C1C}">
                           <a14:useLocalDpi xmlns:a14="http://schemas.microsoft.com/office/drawing/2010/main" val="0"/>
@@ -17763,7 +17242,7 @@
                     <pic:cNvPicPr/>
                   </pic:nvPicPr>
                   <pic:blipFill>
-                    <a:blip r:embed="rId68"/>
+                    <a:blip r:embed="rId69"/>
                     <a:stretch>
                       <a:fillRect/>
                     </a:stretch>
@@ -17871,7 +17350,7 @@
                     </pic:cNvPicPr>
                   </pic:nvPicPr>
                   <pic:blipFill>
-                    <a:blip r:embed="rId70">
+                    <a:blip r:embed="rId71">
                       <a:extLst>
                         <a:ext uri="{28A0092B-C50C-407E-A947-70E740481C1C}">
                           <a14:useLocalDpi xmlns:a14="http://schemas.microsoft.com/office/drawing/2010/main" val="0"/>
@@ -17915,8 +17394,8 @@
           <w:bCs/>
         </w:rPr>
       </w:pPr>
-      <w:bookmarkStart w:id="41" w:name="_Hlk147320439"/>
-      <w:bookmarkEnd w:id="40"/>
+      <w:bookmarkStart w:id="38" w:name="_Hlk147320439"/>
+      <w:bookmarkEnd w:id="37"/>
       <w:r>
         <w:rPr>
           <w:b w:val="0"/>
@@ -18532,11 +18011,11 @@
       <w:r>
         <w:t xml:space="preserve"> </w:t>
       </w:r>
-      <w:bookmarkStart w:id="42" w:name="_Hlk147313194"/>
+      <w:bookmarkStart w:id="39" w:name="_Hlk147313194"/>
       <w:r>
         <w:t xml:space="preserve">&lt;code snippet&gt; </w:t>
       </w:r>
-      <w:bookmarkEnd w:id="42"/>
+      <w:bookmarkEnd w:id="39"/>
       <w:r>
         <w:rPr>
           <w:b w:val="0"/>
@@ -18554,7 +18033,7 @@
         </w:rPr>
         <w:t xml:space="preserve"> file</w:t>
       </w:r>
-      <w:bookmarkEnd w:id="41"/>
+      <w:bookmarkEnd w:id="38"/>
       <w:r>
         <w:rPr>
           <w:b w:val="0"/>
@@ -19850,7 +19329,7 @@
           <w:lang w:val="en-IN"/>
         </w:rPr>
       </w:pPr>
-      <w:bookmarkStart w:id="43" w:name="_Hlk147320910"/>
+      <w:bookmarkStart w:id="40" w:name="_Hlk147320910"/>
       <w:r>
         <w:rPr>
           <w:lang w:val="en-IN"/>
@@ -19858,7 +19337,7 @@
         <w:t>The below code is the variables required for the communication between the cores:</w:t>
       </w:r>
     </w:p>
-    <w:bookmarkEnd w:id="43"/>
+    <w:bookmarkEnd w:id="40"/>
     <w:p>
       <w:pPr>
         <w:autoSpaceDE w:val="0"/>
@@ -26249,7 +25728,7 @@
                     </pic:cNvPicPr>
                   </pic:nvPicPr>
                   <pic:blipFill>
-                    <a:blip r:embed="rId71">
+                    <a:blip r:embed="rId72">
                       <a:extLst>
                         <a:ext uri="{28A0092B-C50C-407E-A947-70E740481C1C}">
                           <a14:useLocalDpi xmlns:a14="http://schemas.microsoft.com/office/drawing/2010/main" val="0"/>
@@ -33127,7 +32606,7 @@
                     </pic:cNvPicPr>
                   </pic:nvPicPr>
                   <pic:blipFill>
-                    <a:blip r:embed="rId72">
+                    <a:blip r:embed="rId73">
                       <a:extLst>
                         <a:ext uri="{28A0092B-C50C-407E-A947-70E740481C1C}">
                           <a14:useLocalDpi xmlns:a14="http://schemas.microsoft.com/office/drawing/2010/main" val="0"/>
@@ -33282,7 +32761,7 @@
                     </pic:cNvPicPr>
                   </pic:nvPicPr>
                   <pic:blipFill>
-                    <a:blip r:embed="rId73">
+                    <a:blip r:embed="rId74">
                       <a:extLst>
                         <a:ext uri="{28A0092B-C50C-407E-A947-70E740481C1C}">
                           <a14:useLocalDpi xmlns:a14="http://schemas.microsoft.com/office/drawing/2010/main" val="0"/>
@@ -33472,7 +32951,7 @@
                     <pic:cNvPicPr/>
                   </pic:nvPicPr>
                   <pic:blipFill>
-                    <a:blip r:embed="rId74">
+                    <a:blip r:embed="rId75">
                       <a:extLst>
                         <a:ext uri="{28A0092B-C50C-407E-A947-70E740481C1C}">
                           <a14:useLocalDpi xmlns:a14="http://schemas.microsoft.com/office/drawing/2010/main" val="0"/>
@@ -33520,7 +32999,7 @@
           <w:lang w:eastAsia="de-DE"/>
         </w:rPr>
       </w:pPr>
-      <w:bookmarkStart w:id="44" w:name="_Toc192780030"/>
+      <w:bookmarkStart w:id="41" w:name="_Toc192780030"/>
       <w:r>
         <w:rPr>
           <w:b/>
@@ -33531,7 +33010,7 @@
         </w:rPr>
         <w:t>Conclusion</w:t>
       </w:r>
-      <w:bookmarkEnd w:id="44"/>
+      <w:bookmarkEnd w:id="41"/>
       <w:r>
         <w:rPr>
           <w:b/>
@@ -33571,12 +33050,12 @@
       <w:pPr>
         <w:pStyle w:val="Heading1"/>
       </w:pPr>
-      <w:bookmarkStart w:id="45" w:name="_Toc192780031"/>
+      <w:bookmarkStart w:id="42" w:name="_Toc192780031"/>
       <w:r>
         <w:lastRenderedPageBreak/>
         <w:t>References</w:t>
       </w:r>
-      <w:bookmarkEnd w:id="45"/>
+      <w:bookmarkEnd w:id="42"/>
       <w:r>
         <w:t xml:space="preserve"> </w:t>
       </w:r>
@@ -33638,7 +33117,7 @@
           <w:lang w:eastAsia="de-DE"/>
         </w:rPr>
       </w:pPr>
-      <w:hyperlink r:id="rId75" w:history="1">
+      <w:hyperlink r:id="rId76" w:history="1">
         <w:r>
           <w:rPr>
             <w:rStyle w:val="Hyperlink"/>
@@ -33686,7 +33165,7 @@
           <w:b w:val="0"/>
         </w:rPr>
         <w:sectPr>
-          <w:headerReference w:type="default" r:id="rId76"/>
+          <w:headerReference w:type="default" r:id="rId77"/>
           <w:footnotePr>
             <w:numRestart w:val="eachPage"/>
           </w:footnotePr>
@@ -33711,9 +33190,9 @@
       <w:pPr>
         <w:pStyle w:val="Body"/>
         <w:sectPr>
-          <w:headerReference w:type="even" r:id="rId77"/>
-          <w:headerReference w:type="default" r:id="rId78"/>
-          <w:footerReference w:type="default" r:id="rId79"/>
+          <w:headerReference w:type="even" r:id="rId78"/>
+          <w:headerReference w:type="default" r:id="rId79"/>
+          <w:footerReference w:type="default" r:id="rId80"/>
           <w:footnotePr>
             <w:numRestart w:val="eachPage"/>
           </w:footnotePr>
@@ -33736,9 +33215,9 @@
     </w:p>
     <w:p/>
     <w:sectPr>
-      <w:headerReference w:type="even" r:id="rId80"/>
-      <w:headerReference w:type="default" r:id="rId81"/>
-      <w:footerReference w:type="default" r:id="rId82"/>
+      <w:headerReference w:type="even" r:id="rId81"/>
+      <w:headerReference w:type="default" r:id="rId82"/>
+      <w:footerReference w:type="default" r:id="rId83"/>
       <w:footnotePr>
         <w:numRestart w:val="eachPage"/>
       </w:footnotePr>
@@ -33751,6 +33230,57 @@
     </w:sectPr>
   </w:body>
 </w:document>
+</file>
+
+<file path=word/comments.xml><?xml version="1.0" encoding="utf-8"?>
+<w:comments xmlns:wpc="http://schemas.microsoft.com/office/word/2010/wordprocessingCanvas" xmlns:cx="http://schemas.microsoft.com/office/drawing/2014/chartex" xmlns:cx1="http://schemas.microsoft.com/office/drawing/2015/9/8/chartex" xmlns:cx2="http://schemas.microsoft.com/office/drawing/2015/10/21/chartex" xmlns:cx3="http://schemas.microsoft.com/office/drawing/2016/5/9/chartex" xmlns:cx4="http://schemas.microsoft.com/office/drawing/2016/5/10/chartex" xmlns:cx5="http://schemas.microsoft.com/office/drawing/2016/5/11/chartex" xmlns:cx6="http://schemas.microsoft.com/office/drawing/2016/5/12/chartex" xmlns:cx7="http://schemas.microsoft.com/office/drawing/2016/5/13/chartex" xmlns:cx8="http://schemas.microsoft.com/office/drawing/2016/5/14/chartex" xmlns:mc="http://schemas.openxmlformats.org/markup-compatibility/2006" xmlns:aink="http://schemas.microsoft.com/office/drawing/2016/ink" xmlns:am3d="http://schemas.microsoft.com/office/drawing/2017/model3d" xmlns:o="urn:schemas-microsoft-com:office:office" xmlns:r="http://schemas.openxmlformats.org/officeDocument/2006/relationships" xmlns:m="http://schemas.openxmlformats.org/officeDocument/2006/math" xmlns:v="urn:schemas-microsoft-com:vml" xmlns:wp14="http://schemas.microsoft.com/office/word/2010/wordprocessingDrawing" xmlns:wp="http://schemas.openxmlformats.org/drawingml/2006/wordprocessingDrawing" xmlns:w10="urn:schemas-microsoft-com:office:word" xmlns:w="http://schemas.openxmlformats.org/wordprocessingml/2006/main" xmlns:w14="http://schemas.microsoft.com/office/word/2010/wordml" xmlns:w15="http://schemas.microsoft.com/office/word/2012/wordml" xmlns:w16cid="http://schemas.microsoft.com/office/word/2016/wordml/cid" xmlns:w16se="http://schemas.microsoft.com/office/word/2015/wordml/symex" xmlns:wpg="http://schemas.microsoft.com/office/word/2010/wordprocessingGroup" xmlns:wpi="http://schemas.microsoft.com/office/word/2010/wordprocessingInk" xmlns:wne="http://schemas.microsoft.com/office/word/2006/wordml" xmlns:wps="http://schemas.microsoft.com/office/word/2010/wordprocessingShape" mc:Ignorable="w14 w15 w16se w16cid wp14">
+  <w:comment w:id="17" w:author="Phillips Craig (CSS ICW MCU APP CES)" w:date="2025-10-22T08:27:00Z" w:initials="PC(IMAC">
+    <w:p>
+      <w:pPr>
+        <w:pStyle w:val="CommentText"/>
+      </w:pPr>
+      <w:r>
+        <w:rPr>
+          <w:rStyle w:val="CommentReference"/>
+        </w:rPr>
+        <w:annotationRef/>
+      </w:r>
+      <w:r>
+        <w:t>Considering adding the list of needs tools/middleware needed as well?</w:t>
+      </w:r>
+    </w:p>
+  </w:comment>
+  <w:comment w:id="18" w:author="Phillips Craig (CSS ICW MCU APP CES)" w:date="2025-10-22T08:28:00Z" w:initials="PC(IMAC">
+    <w:p>
+      <w:pPr>
+        <w:pStyle w:val="CommentText"/>
+      </w:pPr>
+      <w:r>
+        <w:rPr>
+          <w:rStyle w:val="CommentReference"/>
+        </w:rPr>
+        <w:annotationRef/>
+      </w:r>
+      <w:r>
+        <w:t>Tera Term instruction link is dead</w:t>
+      </w:r>
+    </w:p>
+  </w:comment>
+</w:comments>
+</file>
+
+<file path=word/commentsExtended.xml><?xml version="1.0" encoding="utf-8"?>
+<w15:commentsEx xmlns:wpc="http://schemas.microsoft.com/office/word/2010/wordprocessingCanvas" xmlns:cx="http://schemas.microsoft.com/office/drawing/2014/chartex" xmlns:cx1="http://schemas.microsoft.com/office/drawing/2015/9/8/chartex" xmlns:cx2="http://schemas.microsoft.com/office/drawing/2015/10/21/chartex" xmlns:cx3="http://schemas.microsoft.com/office/drawing/2016/5/9/chartex" xmlns:cx4="http://schemas.microsoft.com/office/drawing/2016/5/10/chartex" xmlns:cx5="http://schemas.microsoft.com/office/drawing/2016/5/11/chartex" xmlns:cx6="http://schemas.microsoft.com/office/drawing/2016/5/12/chartex" xmlns:cx7="http://schemas.microsoft.com/office/drawing/2016/5/13/chartex" xmlns:cx8="http://schemas.microsoft.com/office/drawing/2016/5/14/chartex" xmlns:mc="http://schemas.openxmlformats.org/markup-compatibility/2006" xmlns:aink="http://schemas.microsoft.com/office/drawing/2016/ink" xmlns:am3d="http://schemas.microsoft.com/office/drawing/2017/model3d" xmlns:o="urn:schemas-microsoft-com:office:office" xmlns:r="http://schemas.openxmlformats.org/officeDocument/2006/relationships" xmlns:m="http://schemas.openxmlformats.org/officeDocument/2006/math" xmlns:v="urn:schemas-microsoft-com:vml" xmlns:wp14="http://schemas.microsoft.com/office/word/2010/wordprocessingDrawing" xmlns:wp="http://schemas.openxmlformats.org/drawingml/2006/wordprocessingDrawing" xmlns:w10="urn:schemas-microsoft-com:office:word" xmlns:w="http://schemas.openxmlformats.org/wordprocessingml/2006/main" xmlns:w14="http://schemas.microsoft.com/office/word/2010/wordml" xmlns:w15="http://schemas.microsoft.com/office/word/2012/wordml" xmlns:w16cid="http://schemas.microsoft.com/office/word/2016/wordml/cid" xmlns:w16se="http://schemas.microsoft.com/office/word/2015/wordml/symex" xmlns:wpg="http://schemas.microsoft.com/office/word/2010/wordprocessingGroup" xmlns:wpi="http://schemas.microsoft.com/office/word/2010/wordprocessingInk" xmlns:wne="http://schemas.microsoft.com/office/word/2006/wordml" xmlns:wps="http://schemas.microsoft.com/office/word/2010/wordprocessingShape" mc:Ignorable="w14 w15 w16se w16cid wp14">
+  <w15:commentEx w15:paraId="440E422D" w15:done="0"/>
+  <w15:commentEx w15:paraId="39A6E7FE" w15:done="0"/>
+</w15:commentsEx>
+</file>
+
+<file path=word/commentsIds.xml><?xml version="1.0" encoding="utf-8"?>
+<w16cid:commentsIds xmlns:wpc="http://schemas.microsoft.com/office/word/2010/wordprocessingCanvas" xmlns:cx="http://schemas.microsoft.com/office/drawing/2014/chartex" xmlns:cx1="http://schemas.microsoft.com/office/drawing/2015/9/8/chartex" xmlns:cx2="http://schemas.microsoft.com/office/drawing/2015/10/21/chartex" xmlns:cx3="http://schemas.microsoft.com/office/drawing/2016/5/9/chartex" xmlns:cx4="http://schemas.microsoft.com/office/drawing/2016/5/10/chartex" xmlns:cx5="http://schemas.microsoft.com/office/drawing/2016/5/11/chartex" xmlns:cx6="http://schemas.microsoft.com/office/drawing/2016/5/12/chartex" xmlns:cx7="http://schemas.microsoft.com/office/drawing/2016/5/13/chartex" xmlns:cx8="http://schemas.microsoft.com/office/drawing/2016/5/14/chartex" xmlns:mc="http://schemas.openxmlformats.org/markup-compatibility/2006" xmlns:aink="http://schemas.microsoft.com/office/drawing/2016/ink" xmlns:am3d="http://schemas.microsoft.com/office/drawing/2017/model3d" xmlns:o="urn:schemas-microsoft-com:office:office" xmlns:r="http://schemas.openxmlformats.org/officeDocument/2006/relationships" xmlns:m="http://schemas.openxmlformats.org/officeDocument/2006/math" xmlns:v="urn:schemas-microsoft-com:vml" xmlns:wp14="http://schemas.microsoft.com/office/word/2010/wordprocessingDrawing" xmlns:wp="http://schemas.openxmlformats.org/drawingml/2006/wordprocessingDrawing" xmlns:w10="urn:schemas-microsoft-com:office:word" xmlns:w="http://schemas.openxmlformats.org/wordprocessingml/2006/main" xmlns:w14="http://schemas.microsoft.com/office/word/2010/wordml" xmlns:w15="http://schemas.microsoft.com/office/word/2012/wordml" xmlns:w16cid="http://schemas.microsoft.com/office/word/2016/wordml/cid" xmlns:w16se="http://schemas.microsoft.com/office/word/2015/wordml/symex" xmlns:wpg="http://schemas.microsoft.com/office/word/2010/wordprocessingGroup" xmlns:wpi="http://schemas.microsoft.com/office/word/2010/wordprocessingInk" xmlns:wne="http://schemas.microsoft.com/office/word/2006/wordml" xmlns:wps="http://schemas.microsoft.com/office/word/2010/wordprocessingShape" mc:Ignorable="w14 w15 w16se w16cid wp14">
+  <w16cid:commentId w16cid:paraId="440E422D" w16cid:durableId="2CA3140F"/>
+  <w16cid:commentId w16cid:paraId="39A6E7FE" w16cid:durableId="2CA31440"/>
+</w16cid:commentsIds>
 </file>
 
 <file path=word/endnotes.xml><?xml version="1.0" encoding="utf-8"?>
@@ -34566,7 +34096,7 @@
         <v:shape id="_x0000_s2052" type="#_x0000_t75" style="position:absolute;margin-left:-45.75pt;margin-top:62.5pt;width:602.45pt;height:287.2pt;z-index:-251642880;mso-position-horizontal-relative:text;mso-position-vertical-relative:text">
           <v:imagedata r:id="rId1" o:title=""/>
         </v:shape>
-        <o:OLEObject Type="Embed" ProgID="Visio.Drawing.15" ShapeID="_x0000_s2052" DrawAspect="Content" ObjectID="_1822625769" r:id="rId2"/>
+        <o:OLEObject Type="Embed" ProgID="Visio.Drawing.15" ShapeID="_x0000_s2052" DrawAspect="Content" ObjectID="_1822627431" r:id="rId2"/>
       </w:object>
     </w:r>
     <w:r>
@@ -35899,7 +35429,7 @@
         <v:shape id="_x0000_s2051" type="#_x0000_t75" style="position:absolute;margin-left:-45.75pt;margin-top:62.5pt;width:602.45pt;height:287.2pt;z-index:-251643904;mso-position-horizontal-relative:text;mso-position-vertical-relative:text">
           <v:imagedata r:id="rId1" o:title=""/>
         </v:shape>
-        <o:OLEObject Type="Embed" ProgID="Visio.Drawing.15" ShapeID="_x0000_s2051" DrawAspect="Content" ObjectID="_1822625770" r:id="rId2"/>
+        <o:OLEObject Type="Embed" ProgID="Visio.Drawing.15" ShapeID="_x0000_s2051" DrawAspect="Content" ObjectID="_1822627432" r:id="rId2"/>
       </w:object>
     </w:r>
     <w:r>
@@ -36107,8 +35637,8 @@
                                 <w:r>
                                   <w:t>IMPORTANT NOTICE</w:t>
                                 </w:r>
-                                <w:bookmarkStart w:id="46" w:name="ImportantNotice"/>
-                                <w:bookmarkEnd w:id="46"/>
+                                <w:bookmarkStart w:id="43" w:name="ImportantNotice"/>
+                                <w:bookmarkEnd w:id="43"/>
                               </w:p>
                               <w:p>
                                 <w:pPr>
@@ -36414,8 +35944,8 @@
                           <w:r>
                             <w:t>IMPORTANT NOTICE</w:t>
                           </w:r>
-                          <w:bookmarkStart w:id="47" w:name="ImportantNotice"/>
-                          <w:bookmarkEnd w:id="47"/>
+                          <w:bookmarkStart w:id="44" w:name="ImportantNotice"/>
+                          <w:bookmarkEnd w:id="44"/>
                         </w:p>
                         <w:p>
                           <w:pPr>
@@ -43946,6 +43476,14 @@
 </w:numbering>
 </file>
 
+<file path=word/people.xml><?xml version="1.0" encoding="utf-8"?>
+<w15:people xmlns:wpc="http://schemas.microsoft.com/office/word/2010/wordprocessingCanvas" xmlns:cx="http://schemas.microsoft.com/office/drawing/2014/chartex" xmlns:cx1="http://schemas.microsoft.com/office/drawing/2015/9/8/chartex" xmlns:cx2="http://schemas.microsoft.com/office/drawing/2015/10/21/chartex" xmlns:cx3="http://schemas.microsoft.com/office/drawing/2016/5/9/chartex" xmlns:cx4="http://schemas.microsoft.com/office/drawing/2016/5/10/chartex" xmlns:cx5="http://schemas.microsoft.com/office/drawing/2016/5/11/chartex" xmlns:cx6="http://schemas.microsoft.com/office/drawing/2016/5/12/chartex" xmlns:cx7="http://schemas.microsoft.com/office/drawing/2016/5/13/chartex" xmlns:cx8="http://schemas.microsoft.com/office/drawing/2016/5/14/chartex" xmlns:mc="http://schemas.openxmlformats.org/markup-compatibility/2006" xmlns:aink="http://schemas.microsoft.com/office/drawing/2016/ink" xmlns:am3d="http://schemas.microsoft.com/office/drawing/2017/model3d" xmlns:o="urn:schemas-microsoft-com:office:office" xmlns:r="http://schemas.openxmlformats.org/officeDocument/2006/relationships" xmlns:m="http://schemas.openxmlformats.org/officeDocument/2006/math" xmlns:v="urn:schemas-microsoft-com:vml" xmlns:wp14="http://schemas.microsoft.com/office/word/2010/wordprocessingDrawing" xmlns:wp="http://schemas.openxmlformats.org/drawingml/2006/wordprocessingDrawing" xmlns:w10="urn:schemas-microsoft-com:office:word" xmlns:w="http://schemas.openxmlformats.org/wordprocessingml/2006/main" xmlns:w14="http://schemas.microsoft.com/office/word/2010/wordml" xmlns:w15="http://schemas.microsoft.com/office/word/2012/wordml" xmlns:w16cid="http://schemas.microsoft.com/office/word/2016/wordml/cid" xmlns:w16se="http://schemas.microsoft.com/office/word/2015/wordml/symex" xmlns:wpg="http://schemas.microsoft.com/office/word/2010/wordprocessingGroup" xmlns:wpi="http://schemas.microsoft.com/office/word/2010/wordprocessingInk" xmlns:wne="http://schemas.microsoft.com/office/word/2006/wordml" xmlns:wps="http://schemas.microsoft.com/office/word/2010/wordprocessingShape" mc:Ignorable="w14 w15 w16se w16cid wp14">
+  <w15:person w15:author="Phillips Craig (CSS ICW MCU APP CES)">
+    <w15:presenceInfo w15:providerId="AD" w15:userId="S-1-5-21-839522115-1659004503-725345543-837383"/>
+  </w15:person>
+</w15:people>
+</file>
+
 <file path=word/styles.xml><?xml version="1.0" encoding="utf-8"?>
 <w:styles xmlns:mc="http://schemas.openxmlformats.org/markup-compatibility/2006" xmlns:r="http://schemas.openxmlformats.org/officeDocument/2006/relationships" xmlns:w="http://schemas.openxmlformats.org/wordprocessingml/2006/main" xmlns:w14="http://schemas.microsoft.com/office/word/2010/wordml" xmlns:w15="http://schemas.microsoft.com/office/word/2012/wordml" xmlns:w16cid="http://schemas.microsoft.com/office/word/2016/wordml/cid" xmlns:w16se="http://schemas.microsoft.com/office/word/2015/wordml/symex" mc:Ignorable="w14 w15 w16se w16cid">
   <w:docDefaults>
@@ -46995,7 +46533,7 @@
 </file>
 
 <file path=customXml/itemProps4.xml><?xml version="1.0" encoding="utf-8"?>
-<ds:datastoreItem xmlns:ds="http://schemas.openxmlformats.org/officeDocument/2006/customXml" ds:itemID="{2F8E7927-647B-4592-A0AA-E753E703F04A}">
+<ds:datastoreItem xmlns:ds="http://schemas.openxmlformats.org/officeDocument/2006/customXml" ds:itemID="{3BE6193B-3AC9-426E-BECA-5A1499FF2DFC}">
   <ds:schemaRefs>
     <ds:schemaRef ds:uri="http://schemas.openxmlformats.org/officeDocument/2006/bibliography"/>
   </ds:schemaRefs>

</xml_diff>

<commit_message>
Adding screen captures and photos for Section 4.6 of the Intro E2 Manual
</commit_message>
<xml_diff>
--- a/.internal/Manual/Intro to PSOC Edge E84 - Part 2 (E2)/PSoC Edge E84 Introductory E2 Training Manual -WIP_10_21_2025.docx
+++ b/.internal/Manual/Intro to PSOC Edge E84 - Part 2 (E2)/PSoC Edge E84 Introductory E2 Training Manual -WIP_10_21_2025.docx
@@ -2914,6 +2914,8 @@
         <w:t xml:space="preserve">Install a terminal emulator if you do not have one. Instructions in this document use </w:t>
       </w:r>
       <w:commentRangeStart w:id="18"/>
+      <w:commentRangeStart w:id="19"/>
+      <w:commentRangeStart w:id="20"/>
       <w:r>
         <w:fldChar w:fldCharType="begin"/>
       </w:r>
@@ -2967,11 +2969,28 @@
         </w:rPr>
         <w:commentReference w:id="18"/>
       </w:r>
+      <w:commentRangeEnd w:id="19"/>
+      <w:r>
+        <w:rPr>
+          <w:rStyle w:val="CommentReference"/>
+          <w:lang w:eastAsia="en-US"/>
+        </w:rPr>
+        <w:commentReference w:id="19"/>
+      </w:r>
+      <w:commentRangeEnd w:id="20"/>
+      <w:r>
+        <w:rPr>
+          <w:rStyle w:val="CommentReference"/>
+          <w:lang w:eastAsia="en-US"/>
+        </w:rPr>
+        <w:commentReference w:id="20"/>
+      </w:r>
       <w:r>
         <w:t>.</w:t>
       </w:r>
-      <w:bookmarkStart w:id="19" w:name="_GoBack"/>
-      <w:bookmarkEnd w:id="19"/>
+      <w:r>
+        <w:t>.</w:t>
+      </w:r>
     </w:p>
     <w:p>
       <w:pPr>
@@ -3006,7 +3025,7 @@
           <w:lang w:eastAsia="de-DE"/>
         </w:rPr>
       </w:pPr>
-      <w:bookmarkStart w:id="20" w:name="_Toc192780015"/>
+      <w:bookmarkStart w:id="21" w:name="_Toc192780015"/>
       <w:r>
         <w:rPr>
           <w:b/>
@@ -3038,7 +3057,7 @@
         </w:rPr>
         <w:t>using HAL</w:t>
       </w:r>
-      <w:bookmarkEnd w:id="20"/>
+      <w:bookmarkEnd w:id="21"/>
       <w:r>
         <w:rPr>
           <w:b/>
@@ -3080,7 +3099,7 @@
           <w:lang w:eastAsia="de-DE"/>
         </w:rPr>
       </w:pPr>
-      <w:bookmarkStart w:id="21" w:name="_Toc192780016"/>
+      <w:bookmarkStart w:id="22" w:name="_Toc192780016"/>
       <w:r>
         <w:rPr>
           <w:b/>
@@ -3091,7 +3110,7 @@
         </w:rPr>
         <w:t>Objective</w:t>
       </w:r>
-      <w:bookmarkEnd w:id="21"/>
+      <w:bookmarkEnd w:id="22"/>
     </w:p>
     <w:p>
       <w:pPr>
@@ -3119,7 +3138,19 @@
         <w:rPr>
           <w:lang w:eastAsia="de-DE"/>
         </w:rPr>
-        <w:t>ch you to create a simple UART communication by printing the “Hello world” message on a terminal and blinking an LED using a timer resource in PS</w:t>
+        <w:t xml:space="preserve">ch you to create a simple UART communication by printing the “Hello </w:t>
+      </w:r>
+      <w:r>
+        <w:rPr>
+          <w:lang w:eastAsia="de-DE"/>
+        </w:rPr>
+        <w:t>W</w:t>
+      </w:r>
+      <w:r>
+        <w:rPr>
+          <w:lang w:eastAsia="de-DE"/>
+        </w:rPr>
+        <w:t>orld” message on a terminal and blinking an LED using a timer resource in PS</w:t>
       </w:r>
       <w:r>
         <w:rPr>
@@ -3131,7 +3162,14 @@
         <w:rPr>
           <w:lang w:eastAsia="de-DE"/>
         </w:rPr>
-        <w:t xml:space="preserve">C™ Edge E84. </w:t>
+        <w:t>C™ Edge E84</w:t>
+      </w:r>
+      <w:proofErr w:type="gramStart"/>
+      <w:r>
+        <w:rPr>
+          <w:lang w:eastAsia="de-DE"/>
+        </w:rPr>
+        <w:t xml:space="preserve">. </w:t>
       </w:r>
       <w:r>
         <w:rPr>
@@ -3139,15 +3177,16 @@
           <w:szCs w:val="24"/>
           <w:lang w:eastAsia="de-DE"/>
         </w:rPr>
-        <w:t xml:space="preserve">. The code example uses the HAL (Hardware Abstraction Layer) </w:t>
-      </w:r>
+        <w:t>.</w:t>
+      </w:r>
+      <w:proofErr w:type="gramEnd"/>
       <w:r>
         <w:rPr>
           <w:sz w:val="24"/>
           <w:szCs w:val="24"/>
           <w:lang w:eastAsia="de-DE"/>
         </w:rPr>
-        <w:t>library</w:t>
+        <w:t xml:space="preserve"> The code example uses the HAL (Hardware Abstraction Layer) </w:t>
       </w:r>
       <w:r>
         <w:rPr>
@@ -3155,6 +3194,14 @@
           <w:szCs w:val="24"/>
           <w:lang w:eastAsia="de-DE"/>
         </w:rPr>
+        <w:t>library</w:t>
+      </w:r>
+      <w:r>
+        <w:rPr>
+          <w:sz w:val="24"/>
+          <w:szCs w:val="24"/>
+          <w:lang w:eastAsia="de-DE"/>
+        </w:rPr>
         <w:t>.</w:t>
       </w:r>
     </w:p>
@@ -3162,11 +3209,11 @@
       <w:pPr>
         <w:pStyle w:val="Heading2"/>
       </w:pPr>
-      <w:bookmarkStart w:id="22" w:name="_Toc192780017"/>
+      <w:bookmarkStart w:id="23" w:name="_Toc192780017"/>
       <w:r>
         <w:t>Description</w:t>
       </w:r>
-      <w:bookmarkEnd w:id="22"/>
+      <w:bookmarkEnd w:id="23"/>
     </w:p>
     <w:p>
       <w:pPr>
@@ -3423,7 +3470,7 @@
           <w:b w:val="0"/>
         </w:rPr>
       </w:pPr>
-      <w:bookmarkStart w:id="23" w:name="_Toc192780018"/>
+      <w:bookmarkStart w:id="24" w:name="_Toc192780018"/>
       <w:r>
         <w:rPr>
           <w:b w:val="0"/>
@@ -3431,7 +3478,7 @@
         <w:lastRenderedPageBreak/>
         <w:t>Flowchart</w:t>
       </w:r>
-      <w:bookmarkEnd w:id="23"/>
+      <w:bookmarkEnd w:id="24"/>
     </w:p>
     <w:p>
       <w:pPr>
@@ -3480,7 +3527,7 @@
           <v:shape id="_x0000_i1025" type="#_x0000_t75" style="width:475.7pt;height:588.05pt" o:ole="">
             <v:imagedata r:id="rId23" o:title=""/>
           </v:shape>
-          <o:OLEObject Type="Embed" ProgID="Visio.Drawing.15" ShapeID="_x0000_i1025" DrawAspect="Content" ObjectID="_1822627429" r:id="rId24"/>
+          <o:OLEObject Type="Embed" ProgID="Visio.Drawing.15" ShapeID="_x0000_i1025" DrawAspect="Content" ObjectID="_1822631884" r:id="rId24"/>
         </w:object>
       </w:r>
     </w:p>
@@ -3529,7 +3576,7 @@
           <v:shape id="_x0000_i1026" type="#_x0000_t75" style="width:116.95pt;height:114.05pt" o:ole="">
             <v:imagedata r:id="rId25" o:title=""/>
           </v:shape>
-          <o:OLEObject Type="Embed" ProgID="Visio.Drawing.15" ShapeID="_x0000_i1026" DrawAspect="Content" ObjectID="_1822627430" r:id="rId26"/>
+          <o:OLEObject Type="Embed" ProgID="Visio.Drawing.15" ShapeID="_x0000_i1026" DrawAspect="Content" ObjectID="_1822631885" r:id="rId26"/>
         </w:object>
       </w:r>
     </w:p>
@@ -3546,14 +3593,14 @@
           <w:b w:val="0"/>
         </w:rPr>
       </w:pPr>
-      <w:bookmarkStart w:id="24" w:name="_Toc192780019"/>
+      <w:bookmarkStart w:id="25" w:name="_Toc192780019"/>
       <w:r>
         <w:rPr>
           <w:b w:val="0"/>
         </w:rPr>
         <w:t>Hardware Block Diagram</w:t>
       </w:r>
-      <w:bookmarkEnd w:id="24"/>
+      <w:bookmarkEnd w:id="25"/>
     </w:p>
     <w:p>
       <w:pPr>
@@ -3728,8 +3775,8 @@
           <w:lang w:eastAsia="de-DE"/>
         </w:rPr>
       </w:pPr>
-      <w:bookmarkStart w:id="25" w:name="_Toc192780020"/>
-      <w:bookmarkStart w:id="26" w:name="_Hlk190961414"/>
+      <w:bookmarkStart w:id="26" w:name="_Toc192780020"/>
+      <w:bookmarkStart w:id="27" w:name="_Hlk190961414"/>
       <w:r>
         <w:rPr>
           <w:snapToGrid w:val="0"/>
@@ -3740,7 +3787,7 @@
         <w:lastRenderedPageBreak/>
         <w:t>Hardware Setup</w:t>
       </w:r>
-      <w:bookmarkEnd w:id="25"/>
+      <w:bookmarkEnd w:id="26"/>
       <w:r>
         <w:rPr>
           <w:snapToGrid w:val="0"/>
@@ -3797,7 +3844,7 @@
         </w:drawing>
       </w:r>
     </w:p>
-    <w:bookmarkEnd w:id="26"/>
+    <w:bookmarkEnd w:id="27"/>
     <w:p>
       <w:pPr>
         <w:pStyle w:val="Body"/>
@@ -3824,7 +3871,7 @@
           <w:lang w:eastAsia="de-DE"/>
         </w:rPr>
       </w:pPr>
-      <w:bookmarkStart w:id="27" w:name="_Toc192780021"/>
+      <w:bookmarkStart w:id="28" w:name="_Toc192780021"/>
       <w:r>
         <w:rPr>
           <w:b/>
@@ -3835,7 +3882,7 @@
         </w:rPr>
         <w:t>Project Creation</w:t>
       </w:r>
-      <w:bookmarkEnd w:id="27"/>
+      <w:bookmarkEnd w:id="28"/>
       <w:r>
         <w:rPr>
           <w:b/>
@@ -3927,9 +3974,9 @@
           <w:noProof/>
         </w:rPr>
         <w:drawing>
-          <wp:inline distT="0" distB="0" distL="0" distR="0" wp14:anchorId="161B641C" wp14:editId="33DC38C0">
-            <wp:extent cx="3697463" cy="3047870"/>
-            <wp:effectExtent l="0" t="0" r="0" b="635"/>
+          <wp:inline distT="0" distB="0" distL="0" distR="0" wp14:anchorId="161B641C" wp14:editId="42FDE3F9">
+            <wp:extent cx="3784454" cy="3540296"/>
+            <wp:effectExtent l="0" t="0" r="6985" b="3175"/>
             <wp:docPr id="7" name="Picture 7"/>
             <wp:cNvGraphicFramePr>
               <a:graphicFrameLocks xmlns:a="http://schemas.openxmlformats.org/drawingml/2006/main" noChangeAspect="1"/>
@@ -3944,14 +3991,13 @@
                     </pic:cNvPicPr>
                   </pic:nvPicPr>
                   <pic:blipFill>
-                    <a:blip r:embed="rId29" cstate="print">
+                    <a:blip r:embed="rId29">
                       <a:extLst>
                         <a:ext uri="{28A0092B-C50C-407E-A947-70E740481C1C}">
                           <a14:useLocalDpi xmlns:a14="http://schemas.microsoft.com/office/drawing/2010/main" val="0"/>
                         </a:ext>
                       </a:extLst>
                     </a:blip>
-                    <a:srcRect/>
                     <a:stretch>
                       <a:fillRect/>
                     </a:stretch>
@@ -3959,7 +4005,7 @@
                   <pic:spPr bwMode="auto">
                     <a:xfrm>
                       <a:off x="0" y="0"/>
-                      <a:ext cx="3711991" cy="3059846"/>
+                      <a:ext cx="3792462" cy="3547787"/>
                     </a:xfrm>
                     <a:prstGeom prst="rect">
                       <a:avLst/>
@@ -4000,7 +4046,6 @@
         <w:rPr>
           <w:b/>
         </w:rPr>
-        <w:lastRenderedPageBreak/>
         <w:t>Next</w:t>
       </w:r>
       <w:r>
@@ -4036,9 +4081,9 @@
           <w:noProof/>
         </w:rPr>
         <w:drawing>
-          <wp:inline distT="0" distB="0" distL="0" distR="0" wp14:anchorId="2279E888" wp14:editId="39DA6786">
-            <wp:extent cx="4505739" cy="1950720"/>
-            <wp:effectExtent l="0" t="0" r="9525" b="0"/>
+          <wp:inline distT="0" distB="0" distL="0" distR="0" wp14:anchorId="2279E888" wp14:editId="637D300C">
+            <wp:extent cx="4333041" cy="1956434"/>
+            <wp:effectExtent l="0" t="0" r="0" b="6350"/>
             <wp:docPr id="30" name="Picture 30"/>
             <wp:cNvGraphicFramePr>
               <a:graphicFrameLocks xmlns:a="http://schemas.openxmlformats.org/drawingml/2006/main" noChangeAspect="1"/>
@@ -4060,7 +4105,6 @@
                         </a:ext>
                       </a:extLst>
                     </a:blip>
-                    <a:srcRect/>
                     <a:stretch>
                       <a:fillRect/>
                     </a:stretch>
@@ -4068,7 +4112,7 @@
                   <pic:spPr bwMode="auto">
                     <a:xfrm>
                       <a:off x="0" y="0"/>
-                      <a:ext cx="4518936" cy="1956434"/>
+                      <a:ext cx="4333041" cy="1956434"/>
                     </a:xfrm>
                     <a:prstGeom prst="rect">
                       <a:avLst/>
@@ -4084,6 +4128,8 @@
           </wp:inline>
         </w:drawing>
       </w:r>
+      <w:bookmarkStart w:id="29" w:name="_GoBack"/>
+      <w:bookmarkEnd w:id="29"/>
     </w:p>
     <w:p>
       <w:pPr>
@@ -4166,9 +4212,9 @@
           <w:noProof/>
         </w:rPr>
         <w:drawing>
-          <wp:inline distT="0" distB="0" distL="0" distR="0" wp14:anchorId="0AC2496A" wp14:editId="5A8710CB">
-            <wp:extent cx="4870450" cy="1864954"/>
-            <wp:effectExtent l="0" t="0" r="6350" b="2540"/>
+          <wp:inline distT="0" distB="0" distL="0" distR="0" wp14:anchorId="0AC2496A" wp14:editId="12F4DF5A">
+            <wp:extent cx="4898924" cy="2599569"/>
+            <wp:effectExtent l="0" t="0" r="0" b="0"/>
             <wp:docPr id="29" name="Picture 29"/>
             <wp:cNvGraphicFramePr>
               <a:graphicFrameLocks xmlns:a="http://schemas.openxmlformats.org/drawingml/2006/main" noChangeAspect="1"/>
@@ -4181,7 +4227,13 @@
                     <pic:cNvPicPr/>
                   </pic:nvPicPr>
                   <pic:blipFill>
-                    <a:blip r:embed="rId31"/>
+                    <a:blip r:embed="rId31" cstate="print">
+                      <a:extLst>
+                        <a:ext uri="{28A0092B-C50C-407E-A947-70E740481C1C}">
+                          <a14:useLocalDpi xmlns:a14="http://schemas.microsoft.com/office/drawing/2010/main" val="0"/>
+                        </a:ext>
+                      </a:extLst>
+                    </a:blip>
                     <a:stretch>
                       <a:fillRect/>
                     </a:stretch>
@@ -4189,7 +4241,7 @@
                   <pic:spPr>
                     <a:xfrm>
                       <a:off x="0" y="0"/>
-                      <a:ext cx="4878475" cy="1868027"/>
+                      <a:ext cx="4939507" cy="2621104"/>
                     </a:xfrm>
                     <a:prstGeom prst="rect">
                       <a:avLst/>
@@ -4375,6 +4427,7 @@
         <w:rPr>
           <w:lang w:eastAsia="de-DE"/>
         </w:rPr>
+        <w:lastRenderedPageBreak/>
         <w:t xml:space="preserve">Clicking New Application will open the </w:t>
       </w:r>
       <w:r>
@@ -4431,11 +4484,7 @@
         <w:t>design.modus</w:t>
       </w:r>
       <w:r>
-        <w:t xml:space="preserve"> file that configures clocks and other board-specific capabilities. That file is used by the ModusToolbox™ configurators. A BSP </w:t>
-      </w:r>
-      <w:r>
-        <w:lastRenderedPageBreak/>
-        <w:t>also includes the required device support code for the device on the board. You can modify the configuration to suit your application.</w:t>
+        <w:t xml:space="preserve"> file that configures clocks and other board-specific capabilities. That file is used by the ModusToolbox™ configurators. A BSP also includes the required device support code for the device on the board. You can modify the configuration to suit your application.</w:t>
       </w:r>
     </w:p>
     <w:p>
@@ -4878,7 +4927,6 @@
           <w:noProof/>
           <w:lang w:eastAsia="de-DE"/>
         </w:rPr>
-        <w:lastRenderedPageBreak/>
         <w:drawing>
           <wp:inline distT="0" distB="0" distL="0" distR="0" wp14:anchorId="3141F7CF" wp14:editId="5455B40E">
             <wp:extent cx="2944156" cy="2494396"/>
@@ -9883,7 +9931,7 @@
           <w:szCs w:val="18"/>
         </w:rPr>
       </w:pPr>
-      <w:bookmarkStart w:id="28" w:name="_Hlk192779201"/>
+      <w:bookmarkStart w:id="30" w:name="_Hlk192779201"/>
       <w:r>
         <w:rPr>
           <w:rFonts w:ascii="Courier New" w:hAnsi="Courier New" w:cs="Courier New"/>
@@ -9893,7 +9941,7 @@
         <w:t>/* Main loop */</w:t>
       </w:r>
     </w:p>
-    <w:bookmarkEnd w:id="28"/>
+    <w:bookmarkEnd w:id="30"/>
     <w:p>
       <w:pPr>
         <w:autoSpaceDE w:val="0"/>
@@ -14529,7 +14577,7 @@
           <w:lang w:eastAsia="de-DE"/>
         </w:rPr>
       </w:pPr>
-      <w:bookmarkStart w:id="29" w:name="_Toc192780022"/>
+      <w:bookmarkStart w:id="31" w:name="_Toc192780022"/>
       <w:r>
         <w:rPr>
           <w:b/>
@@ -14540,7 +14588,7 @@
         </w:rPr>
         <w:t>Conclusion</w:t>
       </w:r>
-      <w:bookmarkEnd w:id="29"/>
+      <w:bookmarkEnd w:id="31"/>
       <w:r>
         <w:rPr>
           <w:b/>
@@ -14644,7 +14692,7 @@
           <w:lang w:eastAsia="de-DE"/>
         </w:rPr>
       </w:pPr>
-      <w:bookmarkStart w:id="30" w:name="_Toc192780023"/>
+      <w:bookmarkStart w:id="32" w:name="_Toc192780023"/>
       <w:r>
         <w:rPr>
           <w:b/>
@@ -14656,7 +14704,7 @@
         <w:lastRenderedPageBreak/>
         <w:t>Code Example 2: IPC queues using HAL</w:t>
       </w:r>
-      <w:bookmarkEnd w:id="30"/>
+      <w:bookmarkEnd w:id="32"/>
     </w:p>
     <w:p>
       <w:pPr>
@@ -14670,11 +14718,11 @@
       <w:r>
         <w:t xml:space="preserve"> </w:t>
       </w:r>
-      <w:bookmarkStart w:id="31" w:name="_Toc192780024"/>
+      <w:bookmarkStart w:id="33" w:name="_Toc192780024"/>
       <w:r>
         <w:t>Objective</w:t>
       </w:r>
-      <w:bookmarkEnd w:id="31"/>
+      <w:bookmarkEnd w:id="33"/>
     </w:p>
     <w:p>
       <w:pPr>
@@ -14689,11 +14737,11 @@
       <w:pPr>
         <w:pStyle w:val="Heading2"/>
       </w:pPr>
-      <w:bookmarkStart w:id="32" w:name="_Toc192780025"/>
+      <w:bookmarkStart w:id="34" w:name="_Toc192780025"/>
       <w:r>
         <w:t>Description</w:t>
       </w:r>
-      <w:bookmarkEnd w:id="32"/>
+      <w:bookmarkEnd w:id="34"/>
     </w:p>
     <w:p>
       <w:pPr>
@@ -14890,11 +14938,11 @@
       <w:pPr>
         <w:pStyle w:val="Heading2"/>
       </w:pPr>
-      <w:bookmarkStart w:id="33" w:name="_Toc192780026"/>
+      <w:bookmarkStart w:id="35" w:name="_Toc192780026"/>
       <w:r>
         <w:t>Flowchart</w:t>
       </w:r>
-      <w:bookmarkEnd w:id="33"/>
+      <w:bookmarkEnd w:id="35"/>
     </w:p>
     <w:p>
       <w:pPr>
@@ -14965,12 +15013,12 @@
       <w:pPr>
         <w:pStyle w:val="Heading2"/>
       </w:pPr>
-      <w:bookmarkStart w:id="34" w:name="_Toc192780027"/>
+      <w:bookmarkStart w:id="36" w:name="_Toc192780027"/>
       <w:r>
         <w:lastRenderedPageBreak/>
         <w:t>Hardware Block Diagram</w:t>
       </w:r>
-      <w:bookmarkEnd w:id="34"/>
+      <w:bookmarkEnd w:id="36"/>
     </w:p>
     <w:p>
       <w:pPr>
@@ -15035,11 +15083,11 @@
       <w:pPr>
         <w:pStyle w:val="Heading2"/>
       </w:pPr>
-      <w:bookmarkStart w:id="35" w:name="_Toc192780028"/>
+      <w:bookmarkStart w:id="37" w:name="_Toc192780028"/>
       <w:r>
         <w:t>Hardware Setup</w:t>
       </w:r>
-      <w:bookmarkEnd w:id="35"/>
+      <w:bookmarkEnd w:id="37"/>
     </w:p>
     <w:p>
       <w:pPr>
@@ -15121,12 +15169,12 @@
       <w:pPr>
         <w:pStyle w:val="Heading2"/>
       </w:pPr>
-      <w:bookmarkStart w:id="36" w:name="_Toc192780029"/>
+      <w:bookmarkStart w:id="38" w:name="_Toc192780029"/>
       <w:r>
         <w:lastRenderedPageBreak/>
         <w:t>Project Creation</w:t>
       </w:r>
-      <w:bookmarkEnd w:id="36"/>
+      <w:bookmarkEnd w:id="38"/>
       <w:r>
         <w:t xml:space="preserve"> </w:t>
       </w:r>
@@ -16614,7 +16662,7 @@
           <w:noProof/>
         </w:rPr>
       </w:pPr>
-      <w:bookmarkStart w:id="37" w:name="_Hlk147320247"/>
+      <w:bookmarkStart w:id="39" w:name="_Hlk147320247"/>
       <w:r>
         <w:rPr>
           <w:b w:val="0"/>
@@ -17394,8 +17442,8 @@
           <w:bCs/>
         </w:rPr>
       </w:pPr>
-      <w:bookmarkStart w:id="38" w:name="_Hlk147320439"/>
-      <w:bookmarkEnd w:id="37"/>
+      <w:bookmarkStart w:id="40" w:name="_Hlk147320439"/>
+      <w:bookmarkEnd w:id="39"/>
       <w:r>
         <w:rPr>
           <w:b w:val="0"/>
@@ -18011,11 +18059,11 @@
       <w:r>
         <w:t xml:space="preserve"> </w:t>
       </w:r>
-      <w:bookmarkStart w:id="39" w:name="_Hlk147313194"/>
+      <w:bookmarkStart w:id="41" w:name="_Hlk147313194"/>
       <w:r>
         <w:t xml:space="preserve">&lt;code snippet&gt; </w:t>
       </w:r>
-      <w:bookmarkEnd w:id="39"/>
+      <w:bookmarkEnd w:id="41"/>
       <w:r>
         <w:rPr>
           <w:b w:val="0"/>
@@ -18033,7 +18081,7 @@
         </w:rPr>
         <w:t xml:space="preserve"> file</w:t>
       </w:r>
-      <w:bookmarkEnd w:id="38"/>
+      <w:bookmarkEnd w:id="40"/>
       <w:r>
         <w:rPr>
           <w:b w:val="0"/>
@@ -19329,7 +19377,7 @@
           <w:lang w:val="en-IN"/>
         </w:rPr>
       </w:pPr>
-      <w:bookmarkStart w:id="40" w:name="_Hlk147320910"/>
+      <w:bookmarkStart w:id="42" w:name="_Hlk147320910"/>
       <w:r>
         <w:rPr>
           <w:lang w:val="en-IN"/>
@@ -19337,7 +19385,7 @@
         <w:t>The below code is the variables required for the communication between the cores:</w:t>
       </w:r>
     </w:p>
-    <w:bookmarkEnd w:id="40"/>
+    <w:bookmarkEnd w:id="42"/>
     <w:p>
       <w:pPr>
         <w:autoSpaceDE w:val="0"/>
@@ -32999,7 +33047,7 @@
           <w:lang w:eastAsia="de-DE"/>
         </w:rPr>
       </w:pPr>
-      <w:bookmarkStart w:id="41" w:name="_Toc192780030"/>
+      <w:bookmarkStart w:id="43" w:name="_Toc192780030"/>
       <w:r>
         <w:rPr>
           <w:b/>
@@ -33010,7 +33058,7 @@
         </w:rPr>
         <w:t>Conclusion</w:t>
       </w:r>
-      <w:bookmarkEnd w:id="41"/>
+      <w:bookmarkEnd w:id="43"/>
       <w:r>
         <w:rPr>
           <w:b/>
@@ -33050,12 +33098,12 @@
       <w:pPr>
         <w:pStyle w:val="Heading1"/>
       </w:pPr>
-      <w:bookmarkStart w:id="42" w:name="_Toc192780031"/>
+      <w:bookmarkStart w:id="44" w:name="_Toc192780031"/>
       <w:r>
         <w:lastRenderedPageBreak/>
         <w:t>References</w:t>
       </w:r>
-      <w:bookmarkEnd w:id="42"/>
+      <w:bookmarkEnd w:id="44"/>
       <w:r>
         <w:t xml:space="preserve"> </w:t>
       </w:r>
@@ -33266,6 +33314,35 @@
       </w:r>
     </w:p>
   </w:comment>
+  <w:comment w:id="19" w:author="Phillips Craig (CSS ICW MCU APP CES)" w:date="2025-10-22T08:41:00Z" w:initials="PC(IMAC">
+    <w:p>
+      <w:pPr>
+        <w:pStyle w:val="CommentText"/>
+      </w:pPr>
+      <w:r>
+        <w:rPr>
+          <w:rStyle w:val="CommentReference"/>
+        </w:rPr>
+        <w:annotationRef/>
+      </w:r>
+      <w:r>
+        <w:t>Also listed as unwanted on the IFX App Store, maybe we want to switch to PuTTY?</w:t>
+      </w:r>
+    </w:p>
+  </w:comment>
+  <w:comment w:id="20" w:author="Phillips Craig (CSS ICW MCU APP CES)" w:date="2025-10-22T08:41:00Z" w:initials="PC(IMAC">
+    <w:p>
+      <w:pPr>
+        <w:pStyle w:val="CommentText"/>
+      </w:pPr>
+      <w:r>
+        <w:rPr>
+          <w:rStyle w:val="CommentReference"/>
+        </w:rPr>
+        <w:annotationRef/>
+      </w:r>
+    </w:p>
+  </w:comment>
 </w:comments>
 </file>
 
@@ -33273,6 +33350,8 @@
 <w15:commentsEx xmlns:wpc="http://schemas.microsoft.com/office/word/2010/wordprocessingCanvas" xmlns:cx="http://schemas.microsoft.com/office/drawing/2014/chartex" xmlns:cx1="http://schemas.microsoft.com/office/drawing/2015/9/8/chartex" xmlns:cx2="http://schemas.microsoft.com/office/drawing/2015/10/21/chartex" xmlns:cx3="http://schemas.microsoft.com/office/drawing/2016/5/9/chartex" xmlns:cx4="http://schemas.microsoft.com/office/drawing/2016/5/10/chartex" xmlns:cx5="http://schemas.microsoft.com/office/drawing/2016/5/11/chartex" xmlns:cx6="http://schemas.microsoft.com/office/drawing/2016/5/12/chartex" xmlns:cx7="http://schemas.microsoft.com/office/drawing/2016/5/13/chartex" xmlns:cx8="http://schemas.microsoft.com/office/drawing/2016/5/14/chartex" xmlns:mc="http://schemas.openxmlformats.org/markup-compatibility/2006" xmlns:aink="http://schemas.microsoft.com/office/drawing/2016/ink" xmlns:am3d="http://schemas.microsoft.com/office/drawing/2017/model3d" xmlns:o="urn:schemas-microsoft-com:office:office" xmlns:r="http://schemas.openxmlformats.org/officeDocument/2006/relationships" xmlns:m="http://schemas.openxmlformats.org/officeDocument/2006/math" xmlns:v="urn:schemas-microsoft-com:vml" xmlns:wp14="http://schemas.microsoft.com/office/word/2010/wordprocessingDrawing" xmlns:wp="http://schemas.openxmlformats.org/drawingml/2006/wordprocessingDrawing" xmlns:w10="urn:schemas-microsoft-com:office:word" xmlns:w="http://schemas.openxmlformats.org/wordprocessingml/2006/main" xmlns:w14="http://schemas.microsoft.com/office/word/2010/wordml" xmlns:w15="http://schemas.microsoft.com/office/word/2012/wordml" xmlns:w16cid="http://schemas.microsoft.com/office/word/2016/wordml/cid" xmlns:w16se="http://schemas.microsoft.com/office/word/2015/wordml/symex" xmlns:wpg="http://schemas.microsoft.com/office/word/2010/wordprocessingGroup" xmlns:wpi="http://schemas.microsoft.com/office/word/2010/wordprocessingInk" xmlns:wne="http://schemas.microsoft.com/office/word/2006/wordml" xmlns:wps="http://schemas.microsoft.com/office/word/2010/wordprocessingShape" mc:Ignorable="w14 w15 w16se w16cid wp14">
   <w15:commentEx w15:paraId="440E422D" w15:done="0"/>
   <w15:commentEx w15:paraId="39A6E7FE" w15:done="0"/>
+  <w15:commentEx w15:paraId="259800F4" w15:paraIdParent="39A6E7FE" w15:done="0"/>
+  <w15:commentEx w15:paraId="6DC584C0" w15:paraIdParent="39A6E7FE" w15:done="0"/>
 </w15:commentsEx>
 </file>
 
@@ -33280,6 +33359,8 @@
 <w16cid:commentsIds xmlns:wpc="http://schemas.microsoft.com/office/word/2010/wordprocessingCanvas" xmlns:cx="http://schemas.microsoft.com/office/drawing/2014/chartex" xmlns:cx1="http://schemas.microsoft.com/office/drawing/2015/9/8/chartex" xmlns:cx2="http://schemas.microsoft.com/office/drawing/2015/10/21/chartex" xmlns:cx3="http://schemas.microsoft.com/office/drawing/2016/5/9/chartex" xmlns:cx4="http://schemas.microsoft.com/office/drawing/2016/5/10/chartex" xmlns:cx5="http://schemas.microsoft.com/office/drawing/2016/5/11/chartex" xmlns:cx6="http://schemas.microsoft.com/office/drawing/2016/5/12/chartex" xmlns:cx7="http://schemas.microsoft.com/office/drawing/2016/5/13/chartex" xmlns:cx8="http://schemas.microsoft.com/office/drawing/2016/5/14/chartex" xmlns:mc="http://schemas.openxmlformats.org/markup-compatibility/2006" xmlns:aink="http://schemas.microsoft.com/office/drawing/2016/ink" xmlns:am3d="http://schemas.microsoft.com/office/drawing/2017/model3d" xmlns:o="urn:schemas-microsoft-com:office:office" xmlns:r="http://schemas.openxmlformats.org/officeDocument/2006/relationships" xmlns:m="http://schemas.openxmlformats.org/officeDocument/2006/math" xmlns:v="urn:schemas-microsoft-com:vml" xmlns:wp14="http://schemas.microsoft.com/office/word/2010/wordprocessingDrawing" xmlns:wp="http://schemas.openxmlformats.org/drawingml/2006/wordprocessingDrawing" xmlns:w10="urn:schemas-microsoft-com:office:word" xmlns:w="http://schemas.openxmlformats.org/wordprocessingml/2006/main" xmlns:w14="http://schemas.microsoft.com/office/word/2010/wordml" xmlns:w15="http://schemas.microsoft.com/office/word/2012/wordml" xmlns:w16cid="http://schemas.microsoft.com/office/word/2016/wordml/cid" xmlns:w16se="http://schemas.microsoft.com/office/word/2015/wordml/symex" xmlns:wpg="http://schemas.microsoft.com/office/word/2010/wordprocessingGroup" xmlns:wpi="http://schemas.microsoft.com/office/word/2010/wordprocessingInk" xmlns:wne="http://schemas.microsoft.com/office/word/2006/wordml" xmlns:wps="http://schemas.microsoft.com/office/word/2010/wordprocessingShape" mc:Ignorable="w14 w15 w16se w16cid wp14">
   <w16cid:commentId w16cid:paraId="440E422D" w16cid:durableId="2CA3140F"/>
   <w16cid:commentId w16cid:paraId="39A6E7FE" w16cid:durableId="2CA31440"/>
+  <w16cid:commentId w16cid:paraId="259800F4" w16cid:durableId="2CA3171C"/>
+  <w16cid:commentId w16cid:paraId="6DC584C0" w16cid:durableId="2CA3173B"/>
 </w16cid:commentsIds>
 </file>
 
@@ -34096,7 +34177,7 @@
         <v:shape id="_x0000_s2052" type="#_x0000_t75" style="position:absolute;margin-left:-45.75pt;margin-top:62.5pt;width:602.45pt;height:287.2pt;z-index:-251642880;mso-position-horizontal-relative:text;mso-position-vertical-relative:text">
           <v:imagedata r:id="rId1" o:title=""/>
         </v:shape>
-        <o:OLEObject Type="Embed" ProgID="Visio.Drawing.15" ShapeID="_x0000_s2052" DrawAspect="Content" ObjectID="_1822627431" r:id="rId2"/>
+        <o:OLEObject Type="Embed" ProgID="Visio.Drawing.15" ShapeID="_x0000_s2052" DrawAspect="Content" ObjectID="_1822631886" r:id="rId2"/>
       </w:object>
     </w:r>
     <w:r>
@@ -35429,7 +35510,7 @@
         <v:shape id="_x0000_s2051" type="#_x0000_t75" style="position:absolute;margin-left:-45.75pt;margin-top:62.5pt;width:602.45pt;height:287.2pt;z-index:-251643904;mso-position-horizontal-relative:text;mso-position-vertical-relative:text">
           <v:imagedata r:id="rId1" o:title=""/>
         </v:shape>
-        <o:OLEObject Type="Embed" ProgID="Visio.Drawing.15" ShapeID="_x0000_s2051" DrawAspect="Content" ObjectID="_1822627432" r:id="rId2"/>
+        <o:OLEObject Type="Embed" ProgID="Visio.Drawing.15" ShapeID="_x0000_s2051" DrawAspect="Content" ObjectID="_1822631887" r:id="rId2"/>
       </w:object>
     </w:r>
     <w:r>
@@ -35637,8 +35718,8 @@
                                 <w:r>
                                   <w:t>IMPORTANT NOTICE</w:t>
                                 </w:r>
-                                <w:bookmarkStart w:id="43" w:name="ImportantNotice"/>
-                                <w:bookmarkEnd w:id="43"/>
+                                <w:bookmarkStart w:id="45" w:name="ImportantNotice"/>
+                                <w:bookmarkEnd w:id="45"/>
                               </w:p>
                               <w:p>
                                 <w:pPr>
@@ -35944,8 +36025,8 @@
                           <w:r>
                             <w:t>IMPORTANT NOTICE</w:t>
                           </w:r>
-                          <w:bookmarkStart w:id="44" w:name="ImportantNotice"/>
-                          <w:bookmarkEnd w:id="44"/>
+                          <w:bookmarkStart w:id="46" w:name="ImportantNotice"/>
+                          <w:bookmarkEnd w:id="46"/>
                         </w:p>
                         <w:p>
                           <w:pPr>
@@ -46533,7 +46614,7 @@
 </file>
 
 <file path=customXml/itemProps4.xml><?xml version="1.0" encoding="utf-8"?>
-<ds:datastoreItem xmlns:ds="http://schemas.openxmlformats.org/officeDocument/2006/customXml" ds:itemID="{3BE6193B-3AC9-426E-BECA-5A1499FF2DFC}">
+<ds:datastoreItem xmlns:ds="http://schemas.openxmlformats.org/officeDocument/2006/customXml" ds:itemID="{57432582-F4D1-4077-B364-218BC2A81C36}">
   <ds:schemaRefs>
     <ds:schemaRef ds:uri="http://schemas.openxmlformats.org/officeDocument/2006/bibliography"/>
   </ds:schemaRefs>

</xml_diff>

<commit_message>
Updating text and screen captures of Project/App Creation of the Intro E2 Manual
</commit_message>
<xml_diff>
--- a/.internal/Manual/Intro to PSOC Edge E84 - Part 2 (E2)/PSoC Edge E84 Introductory E2 Training Manual -WIP_10_21_2025.docx
+++ b/.internal/Manual/Intro to PSOC Edge E84 - Part 2 (E2)/PSoC Edge E84 Introductory E2 Training Manual -WIP_10_21_2025.docx
@@ -3527,7 +3527,7 @@
           <v:shape id="_x0000_i1025" type="#_x0000_t75" style="width:475.7pt;height:588.05pt" o:ole="">
             <v:imagedata r:id="rId23" o:title=""/>
           </v:shape>
-          <o:OLEObject Type="Embed" ProgID="Visio.Drawing.15" ShapeID="_x0000_i1025" DrawAspect="Content" ObjectID="_1822631884" r:id="rId24"/>
+          <o:OLEObject Type="Embed" ProgID="Visio.Drawing.15" ShapeID="_x0000_i1025" DrawAspect="Content" ObjectID="_1822633264" r:id="rId24"/>
         </w:object>
       </w:r>
     </w:p>
@@ -3576,7 +3576,7 @@
           <v:shape id="_x0000_i1026" type="#_x0000_t75" style="width:116.95pt;height:114.05pt" o:ole="">
             <v:imagedata r:id="rId25" o:title=""/>
           </v:shape>
-          <o:OLEObject Type="Embed" ProgID="Visio.Drawing.15" ShapeID="_x0000_i1026" DrawAspect="Content" ObjectID="_1822631885" r:id="rId26"/>
+          <o:OLEObject Type="Embed" ProgID="Visio.Drawing.15" ShapeID="_x0000_i1026" DrawAspect="Content" ObjectID="_1822633265" r:id="rId26"/>
         </w:object>
       </w:r>
     </w:p>
@@ -3967,6 +3967,7 @@
     <w:p>
       <w:pPr>
         <w:pStyle w:val="Body"/>
+        <w:ind w:left="1418"/>
         <w:jc w:val="center"/>
       </w:pPr>
       <w:r>
@@ -4081,9 +4082,9 @@
           <w:noProof/>
         </w:rPr>
         <w:drawing>
-          <wp:inline distT="0" distB="0" distL="0" distR="0" wp14:anchorId="2279E888" wp14:editId="637D300C">
-            <wp:extent cx="4333041" cy="1956434"/>
-            <wp:effectExtent l="0" t="0" r="0" b="6350"/>
+          <wp:inline distT="0" distB="0" distL="0" distR="0" wp14:anchorId="2279E888" wp14:editId="72B710A9">
+            <wp:extent cx="3588888" cy="1620438"/>
+            <wp:effectExtent l="0" t="0" r="0" b="0"/>
             <wp:docPr id="30" name="Picture 30"/>
             <wp:cNvGraphicFramePr>
               <a:graphicFrameLocks xmlns:a="http://schemas.openxmlformats.org/drawingml/2006/main" noChangeAspect="1"/>
@@ -4112,7 +4113,7 @@
                   <pic:spPr bwMode="auto">
                     <a:xfrm>
                       <a:off x="0" y="0"/>
-                      <a:ext cx="4333041" cy="1956434"/>
+                      <a:ext cx="3649677" cy="1647885"/>
                     </a:xfrm>
                     <a:prstGeom prst="rect">
                       <a:avLst/>
@@ -4128,8 +4129,6 @@
           </wp:inline>
         </w:drawing>
       </w:r>
-      <w:bookmarkStart w:id="29" w:name="_GoBack"/>
-      <w:bookmarkEnd w:id="29"/>
     </w:p>
     <w:p>
       <w:pPr>
@@ -4362,8 +4361,8 @@
           <w:lang w:eastAsia="de-DE"/>
         </w:rPr>
         <w:drawing>
-          <wp:inline distT="0" distB="0" distL="0" distR="0" wp14:anchorId="0A9C18D0" wp14:editId="2170879B">
-            <wp:extent cx="4841240" cy="2631440"/>
+          <wp:inline distT="0" distB="0" distL="0" distR="0" wp14:anchorId="0A9C18D0" wp14:editId="092B2B53">
+            <wp:extent cx="4027589" cy="2923060"/>
             <wp:effectExtent l="0" t="0" r="0" b="0"/>
             <wp:docPr id="28" name="Picture 28"/>
             <wp:cNvGraphicFramePr>
@@ -4379,14 +4378,13 @@
                     </pic:cNvPicPr>
                   </pic:nvPicPr>
                   <pic:blipFill>
-                    <a:blip r:embed="rId32">
+                    <a:blip r:embed="rId32" cstate="print">
                       <a:extLst>
                         <a:ext uri="{28A0092B-C50C-407E-A947-70E740481C1C}">
                           <a14:useLocalDpi xmlns:a14="http://schemas.microsoft.com/office/drawing/2010/main" val="0"/>
                         </a:ext>
                       </a:extLst>
                     </a:blip>
-                    <a:srcRect/>
                     <a:stretch>
                       <a:fillRect/>
                     </a:stretch>
@@ -4394,7 +4392,7 @@
                   <pic:spPr bwMode="auto">
                     <a:xfrm>
                       <a:off x="0" y="0"/>
-                      <a:ext cx="4852864" cy="2637758"/>
+                      <a:ext cx="4062496" cy="2948394"/>
                     </a:xfrm>
                     <a:prstGeom prst="rect">
                       <a:avLst/>
@@ -4537,14 +4535,35 @@
           <w:bCs/>
           <w:lang w:eastAsia="de-DE"/>
         </w:rPr>
-        <w:t>KIT_PSOCE84_EVK</w:t>
+        <w:t>KIT_PSE84_E</w:t>
       </w:r>
       <w:r>
         <w:rPr>
           <w:b/>
-          <w:lang w:eastAsia="de-DE"/>
-        </w:rPr>
-        <w:t xml:space="preserve"> BSP </w:t>
+          <w:bCs/>
+          <w:lang w:eastAsia="de-DE"/>
+        </w:rPr>
+        <w:t>VAL_EPC2</w:t>
+      </w:r>
+      <w:r>
+        <w:rPr>
+          <w:b/>
+          <w:lang w:eastAsia="de-DE"/>
+        </w:rPr>
+        <w:t xml:space="preserve"> </w:t>
+      </w:r>
+      <w:r>
+        <w:rPr>
+          <w:lang w:eastAsia="de-DE"/>
+        </w:rPr>
+        <w:t>BSP</w:t>
+      </w:r>
+      <w:r>
+        <w:rPr>
+          <w:b/>
+          <w:lang w:eastAsia="de-DE"/>
+        </w:rPr>
+        <w:t xml:space="preserve"> </w:t>
       </w:r>
       <w:r>
         <w:rPr>
@@ -4575,12 +4594,20 @@
       </w:r>
       <w:r>
         <w:rPr>
+          <w:bCs/>
+          <w:lang w:eastAsia="de-DE"/>
+        </w:rPr>
+        <w:t xml:space="preserve"> (or Detected Devices if your EVK is already connected)</w:t>
+      </w:r>
+      <w:r>
+        <w:rPr>
           <w:lang w:eastAsia="de-DE"/>
         </w:rPr>
         <w:t xml:space="preserve">. Then click </w:t>
       </w:r>
       <w:r>
         <w:rPr>
+          <w:b/>
           <w:bCs/>
           <w:lang w:eastAsia="de-DE"/>
         </w:rPr>
@@ -4596,7 +4623,7 @@
     <w:p>
       <w:pPr>
         <w:spacing w:before="160" w:after="160"/>
-        <w:ind w:left="709"/>
+        <w:ind w:left="1418"/>
         <w:jc w:val="center"/>
         <w:rPr>
           <w:lang w:eastAsia="de-DE"/>
@@ -4608,9 +4635,9 @@
           <w:lang w:eastAsia="de-DE"/>
         </w:rPr>
         <w:drawing>
-          <wp:inline distT="0" distB="0" distL="0" distR="0" wp14:anchorId="3E8DA693" wp14:editId="74226C74">
-            <wp:extent cx="3611713" cy="2736362"/>
-            <wp:effectExtent l="19050" t="19050" r="27305" b="26035"/>
+          <wp:inline distT="0" distB="0" distL="0" distR="0" wp14:anchorId="3E8DA693" wp14:editId="0FEEDB8C">
+            <wp:extent cx="4731577" cy="3139616"/>
+            <wp:effectExtent l="19050" t="19050" r="12065" b="22860"/>
             <wp:docPr id="54" name="Picture 54"/>
             <wp:cNvGraphicFramePr>
               <a:graphicFrameLocks xmlns:a="http://schemas.openxmlformats.org/drawingml/2006/main" noChangeAspect="1"/>
@@ -4639,7 +4666,7 @@
                   <pic:spPr bwMode="auto">
                     <a:xfrm>
                       <a:off x="0" y="0"/>
-                      <a:ext cx="3611713" cy="2736362"/>
+                      <a:ext cx="4787718" cy="3176868"/>
                     </a:xfrm>
                     <a:prstGeom prst="rect">
                       <a:avLst/>
@@ -4702,6 +4729,14 @@
       </w:r>
       <w:r>
         <w:rPr>
+          <w:b/>
+          <w:bCs/>
+          <w:lang w:eastAsia="de-DE"/>
+        </w:rPr>
+        <w:t>lication</w:t>
+      </w:r>
+      <w:r>
+        <w:rPr>
           <w:lang w:eastAsia="de-DE"/>
         </w:rPr>
         <w:t xml:space="preserve"> under the Getting Started section. You can do this by selecting the </w:t>
@@ -4770,7 +4805,7 @@
           <w:noProof/>
           <w:lang w:eastAsia="de-DE"/>
         </w:rPr>
-        <w:t xml:space="preserve"> as we will be developing a hello world application finally and click on </w:t>
+        <w:t xml:space="preserve"> as we will be developing a hello world application and click on </w:t>
       </w:r>
       <w:r>
         <w:rPr>
@@ -4780,6 +4815,8 @@
         </w:rPr>
         <w:t>Create</w:t>
       </w:r>
+      <w:bookmarkStart w:id="29" w:name="_GoBack"/>
+      <w:bookmarkEnd w:id="29"/>
     </w:p>
     <w:p>
       <w:pPr>
@@ -4797,9 +4834,9 @@
           <w:lang w:eastAsia="de-DE"/>
         </w:rPr>
         <w:drawing>
-          <wp:inline distT="0" distB="0" distL="0" distR="0" wp14:anchorId="4883777D" wp14:editId="76E96DB3">
-            <wp:extent cx="3788494" cy="2866565"/>
-            <wp:effectExtent l="19050" t="19050" r="21590" b="10160"/>
+          <wp:inline distT="0" distB="0" distL="0" distR="0" wp14:anchorId="4883777D" wp14:editId="5F682A60">
+            <wp:extent cx="4507110" cy="2472728"/>
+            <wp:effectExtent l="19050" t="19050" r="27305" b="22860"/>
             <wp:docPr id="55" name="Picture 55"/>
             <wp:cNvGraphicFramePr>
               <a:graphicFrameLocks xmlns:a="http://schemas.openxmlformats.org/drawingml/2006/main" noChangeAspect="1"/>
@@ -4828,7 +4865,7 @@
                   <pic:spPr bwMode="auto">
                     <a:xfrm>
                       <a:off x="0" y="0"/>
-                      <a:ext cx="3788494" cy="2866565"/>
+                      <a:ext cx="4572071" cy="2508368"/>
                     </a:xfrm>
                     <a:prstGeom prst="rect">
                       <a:avLst/>
@@ -15303,7 +15340,7 @@
                     </pic:cNvPicPr>
                   </pic:nvPicPr>
                   <pic:blipFill>
-                    <a:blip r:embed="rId32">
+                    <a:blip r:embed="rId60">
                       <a:extLst>
                         <a:ext uri="{28A0092B-C50C-407E-A947-70E740481C1C}">
                           <a14:useLocalDpi xmlns:a14="http://schemas.microsoft.com/office/drawing/2010/main" val="0"/>
@@ -15415,7 +15452,7 @@
                     </pic:cNvPicPr>
                   </pic:nvPicPr>
                   <pic:blipFill>
-                    <a:blip r:embed="rId60" cstate="print">
+                    <a:blip r:embed="rId61" cstate="print">
                       <a:extLst>
                         <a:ext uri="{28A0092B-C50C-407E-A947-70E740481C1C}">
                           <a14:useLocalDpi xmlns:a14="http://schemas.microsoft.com/office/drawing/2010/main" val="0"/>
@@ -15657,7 +15694,7 @@
                     </pic:cNvPicPr>
                   </pic:nvPicPr>
                   <pic:blipFill>
-                    <a:blip r:embed="rId61" cstate="print">
+                    <a:blip r:embed="rId62" cstate="print">
                       <a:extLst>
                         <a:ext uri="{28A0092B-C50C-407E-A947-70E740481C1C}">
                           <a14:useLocalDpi xmlns:a14="http://schemas.microsoft.com/office/drawing/2010/main" val="0"/>
@@ -15746,7 +15783,7 @@
                     </pic:cNvPicPr>
                   </pic:nvPicPr>
                   <pic:blipFill>
-                    <a:blip r:embed="rId62">
+                    <a:blip r:embed="rId63">
                       <a:extLst>
                         <a:ext uri="{28A0092B-C50C-407E-A947-70E740481C1C}">
                           <a14:useLocalDpi xmlns:a14="http://schemas.microsoft.com/office/drawing/2010/main" val="0"/>
@@ -15873,7 +15910,7 @@
                     </pic:cNvPicPr>
                   </pic:nvPicPr>
                   <pic:blipFill>
-                    <a:blip r:embed="rId63">
+                    <a:blip r:embed="rId64">
                       <a:extLst>
                         <a:ext uri="{28A0092B-C50C-407E-A947-70E740481C1C}">
                           <a14:useLocalDpi xmlns:a14="http://schemas.microsoft.com/office/drawing/2010/main" val="0"/>
@@ -16046,7 +16083,7 @@
                     </pic:cNvPicPr>
                   </pic:nvPicPr>
                   <pic:blipFill>
-                    <a:blip r:embed="rId64">
+                    <a:blip r:embed="rId65">
                       <a:extLst>
                         <a:ext uri="{28A0092B-C50C-407E-A947-70E740481C1C}">
                           <a14:useLocalDpi xmlns:a14="http://schemas.microsoft.com/office/drawing/2010/main" val="0"/>
@@ -16237,7 +16274,7 @@
                     </pic:cNvPicPr>
                   </pic:nvPicPr>
                   <pic:blipFill>
-                    <a:blip r:embed="rId65">
+                    <a:blip r:embed="rId66">
                       <a:extLst>
                         <a:ext uri="{28A0092B-C50C-407E-A947-70E740481C1C}">
                           <a14:useLocalDpi xmlns:a14="http://schemas.microsoft.com/office/drawing/2010/main" val="0"/>
@@ -16353,7 +16390,7 @@
                     </pic:cNvPicPr>
                   </pic:nvPicPr>
                   <pic:blipFill>
-                    <a:blip r:embed="rId66" cstate="print">
+                    <a:blip r:embed="rId67" cstate="print">
                       <a:extLst>
                         <a:ext uri="{28A0092B-C50C-407E-A947-70E740481C1C}">
                           <a14:useLocalDpi xmlns:a14="http://schemas.microsoft.com/office/drawing/2010/main" val="0"/>
@@ -16776,7 +16813,7 @@
                     </pic:cNvPicPr>
                   </pic:nvPicPr>
                   <pic:blipFill>
-                    <a:blip r:embed="rId67">
+                    <a:blip r:embed="rId68">
                       <a:extLst>
                         <a:ext uri="{28A0092B-C50C-407E-A947-70E740481C1C}">
                           <a14:useLocalDpi xmlns:a14="http://schemas.microsoft.com/office/drawing/2010/main" val="0"/>
@@ -16924,7 +16961,7 @@
                     </pic:cNvPicPr>
                   </pic:nvPicPr>
                   <pic:blipFill>
-                    <a:blip r:embed="rId68">
+                    <a:blip r:embed="rId69">
                       <a:extLst>
                         <a:ext uri="{28A0092B-C50C-407E-A947-70E740481C1C}">
                           <a14:useLocalDpi xmlns:a14="http://schemas.microsoft.com/office/drawing/2010/main" val="0"/>
@@ -17041,7 +17078,7 @@
                     <pic:cNvPicPr/>
                   </pic:nvPicPr>
                   <pic:blipFill>
-                    <a:blip r:embed="rId69"/>
+                    <a:blip r:embed="rId70"/>
                     <a:stretch>
                       <a:fillRect/>
                     </a:stretch>
@@ -17165,7 +17202,7 @@
                     </pic:cNvPicPr>
                   </pic:nvPicPr>
                   <pic:blipFill>
-                    <a:blip r:embed="rId70">
+                    <a:blip r:embed="rId71">
                       <a:extLst>
                         <a:ext uri="{28A0092B-C50C-407E-A947-70E740481C1C}">
                           <a14:useLocalDpi xmlns:a14="http://schemas.microsoft.com/office/drawing/2010/main" val="0"/>
@@ -17290,7 +17327,7 @@
                     <pic:cNvPicPr/>
                   </pic:nvPicPr>
                   <pic:blipFill>
-                    <a:blip r:embed="rId69"/>
+                    <a:blip r:embed="rId70"/>
                     <a:stretch>
                       <a:fillRect/>
                     </a:stretch>
@@ -17398,7 +17435,7 @@
                     </pic:cNvPicPr>
                   </pic:nvPicPr>
                   <pic:blipFill>
-                    <a:blip r:embed="rId71">
+                    <a:blip r:embed="rId72">
                       <a:extLst>
                         <a:ext uri="{28A0092B-C50C-407E-A947-70E740481C1C}">
                           <a14:useLocalDpi xmlns:a14="http://schemas.microsoft.com/office/drawing/2010/main" val="0"/>
@@ -25776,7 +25813,7 @@
                     </pic:cNvPicPr>
                   </pic:nvPicPr>
                   <pic:blipFill>
-                    <a:blip r:embed="rId72">
+                    <a:blip r:embed="rId73">
                       <a:extLst>
                         <a:ext uri="{28A0092B-C50C-407E-A947-70E740481C1C}">
                           <a14:useLocalDpi xmlns:a14="http://schemas.microsoft.com/office/drawing/2010/main" val="0"/>
@@ -32654,7 +32691,7 @@
                     </pic:cNvPicPr>
                   </pic:nvPicPr>
                   <pic:blipFill>
-                    <a:blip r:embed="rId73">
+                    <a:blip r:embed="rId74">
                       <a:extLst>
                         <a:ext uri="{28A0092B-C50C-407E-A947-70E740481C1C}">
                           <a14:useLocalDpi xmlns:a14="http://schemas.microsoft.com/office/drawing/2010/main" val="0"/>
@@ -32809,7 +32846,7 @@
                     </pic:cNvPicPr>
                   </pic:nvPicPr>
                   <pic:blipFill>
-                    <a:blip r:embed="rId74">
+                    <a:blip r:embed="rId75">
                       <a:extLst>
                         <a:ext uri="{28A0092B-C50C-407E-A947-70E740481C1C}">
                           <a14:useLocalDpi xmlns:a14="http://schemas.microsoft.com/office/drawing/2010/main" val="0"/>
@@ -32999,7 +33036,7 @@
                     <pic:cNvPicPr/>
                   </pic:nvPicPr>
                   <pic:blipFill>
-                    <a:blip r:embed="rId75">
+                    <a:blip r:embed="rId76">
                       <a:extLst>
                         <a:ext uri="{28A0092B-C50C-407E-A947-70E740481C1C}">
                           <a14:useLocalDpi xmlns:a14="http://schemas.microsoft.com/office/drawing/2010/main" val="0"/>
@@ -33165,7 +33202,7 @@
           <w:lang w:eastAsia="de-DE"/>
         </w:rPr>
       </w:pPr>
-      <w:hyperlink r:id="rId76" w:history="1">
+      <w:hyperlink r:id="rId77" w:history="1">
         <w:r>
           <w:rPr>
             <w:rStyle w:val="Hyperlink"/>
@@ -33213,7 +33250,7 @@
           <w:b w:val="0"/>
         </w:rPr>
         <w:sectPr>
-          <w:headerReference w:type="default" r:id="rId77"/>
+          <w:headerReference w:type="default" r:id="rId78"/>
           <w:footnotePr>
             <w:numRestart w:val="eachPage"/>
           </w:footnotePr>
@@ -33238,9 +33275,9 @@
       <w:pPr>
         <w:pStyle w:val="Body"/>
         <w:sectPr>
-          <w:headerReference w:type="even" r:id="rId78"/>
-          <w:headerReference w:type="default" r:id="rId79"/>
-          <w:footerReference w:type="default" r:id="rId80"/>
+          <w:headerReference w:type="even" r:id="rId79"/>
+          <w:headerReference w:type="default" r:id="rId80"/>
+          <w:footerReference w:type="default" r:id="rId81"/>
           <w:footnotePr>
             <w:numRestart w:val="eachPage"/>
           </w:footnotePr>
@@ -33263,9 +33300,9 @@
     </w:p>
     <w:p/>
     <w:sectPr>
-      <w:headerReference w:type="even" r:id="rId81"/>
-      <w:headerReference w:type="default" r:id="rId82"/>
-      <w:footerReference w:type="default" r:id="rId83"/>
+      <w:headerReference w:type="even" r:id="rId82"/>
+      <w:headerReference w:type="default" r:id="rId83"/>
+      <w:footerReference w:type="default" r:id="rId84"/>
       <w:footnotePr>
         <w:numRestart w:val="eachPage"/>
       </w:footnotePr>
@@ -34177,7 +34214,7 @@
         <v:shape id="_x0000_s2052" type="#_x0000_t75" style="position:absolute;margin-left:-45.75pt;margin-top:62.5pt;width:602.45pt;height:287.2pt;z-index:-251642880;mso-position-horizontal-relative:text;mso-position-vertical-relative:text">
           <v:imagedata r:id="rId1" o:title=""/>
         </v:shape>
-        <o:OLEObject Type="Embed" ProgID="Visio.Drawing.15" ShapeID="_x0000_s2052" DrawAspect="Content" ObjectID="_1822631886" r:id="rId2"/>
+        <o:OLEObject Type="Embed" ProgID="Visio.Drawing.15" ShapeID="_x0000_s2052" DrawAspect="Content" ObjectID="_1822633266" r:id="rId2"/>
       </w:object>
     </w:r>
     <w:r>
@@ -35510,7 +35547,7 @@
         <v:shape id="_x0000_s2051" type="#_x0000_t75" style="position:absolute;margin-left:-45.75pt;margin-top:62.5pt;width:602.45pt;height:287.2pt;z-index:-251643904;mso-position-horizontal-relative:text;mso-position-vertical-relative:text">
           <v:imagedata r:id="rId1" o:title=""/>
         </v:shape>
-        <o:OLEObject Type="Embed" ProgID="Visio.Drawing.15" ShapeID="_x0000_s2051" DrawAspect="Content" ObjectID="_1822631887" r:id="rId2"/>
+        <o:OLEObject Type="Embed" ProgID="Visio.Drawing.15" ShapeID="_x0000_s2051" DrawAspect="Content" ObjectID="_1822633267" r:id="rId2"/>
       </w:object>
     </w:r>
     <w:r>
@@ -46614,7 +46651,7 @@
 </file>
 
 <file path=customXml/itemProps4.xml><?xml version="1.0" encoding="utf-8"?>
-<ds:datastoreItem xmlns:ds="http://schemas.openxmlformats.org/officeDocument/2006/customXml" ds:itemID="{57432582-F4D1-4077-B364-218BC2A81C36}">
+<ds:datastoreItem xmlns:ds="http://schemas.openxmlformats.org/officeDocument/2006/customXml" ds:itemID="{CD65FE1F-94D6-4D93-A4CF-9389E01D7DD5}">
   <ds:schemaRefs>
     <ds:schemaRef ds:uri="http://schemas.openxmlformats.org/officeDocument/2006/bibliography"/>
   </ds:schemaRefs>

</xml_diff>

<commit_message>
Adding images, updating text for Project Explorer in Intro E2 Lab Manual
</commit_message>
<xml_diff>
--- a/.internal/Manual/Intro to PSOC Edge E84 - Part 2 (E2)/PSoC Edge E84 Introductory E2 Training Manual -WIP_10_21_2025.docx
+++ b/.internal/Manual/Intro to PSOC Edge E84 - Part 2 (E2)/PSoC Edge E84 Introductory E2 Training Manual -WIP_10_21_2025.docx
@@ -3527,7 +3527,7 @@
           <v:shape id="_x0000_i1025" type="#_x0000_t75" style="width:475.7pt;height:588.05pt" o:ole="">
             <v:imagedata r:id="rId23" o:title=""/>
           </v:shape>
-          <o:OLEObject Type="Embed" ProgID="Visio.Drawing.15" ShapeID="_x0000_i1025" DrawAspect="Content" ObjectID="_1822633264" r:id="rId24"/>
+          <o:OLEObject Type="Embed" ProgID="Visio.Drawing.15" ShapeID="_x0000_i1025" DrawAspect="Content" ObjectID="_1822635710" r:id="rId24"/>
         </w:object>
       </w:r>
     </w:p>
@@ -3576,7 +3576,7 @@
           <v:shape id="_x0000_i1026" type="#_x0000_t75" style="width:116.95pt;height:114.05pt" o:ole="">
             <v:imagedata r:id="rId25" o:title=""/>
           </v:shape>
-          <o:OLEObject Type="Embed" ProgID="Visio.Drawing.15" ShapeID="_x0000_i1026" DrawAspect="Content" ObjectID="_1822633265" r:id="rId26"/>
+          <o:OLEObject Type="Embed" ProgID="Visio.Drawing.15" ShapeID="_x0000_i1026" DrawAspect="Content" ObjectID="_1822635711" r:id="rId26"/>
         </w:object>
       </w:r>
     </w:p>
@@ -4815,8 +4815,6 @@
         </w:rPr>
         <w:t>Create</w:t>
       </w:r>
-      <w:bookmarkStart w:id="29" w:name="_GoBack"/>
-      <w:bookmarkEnd w:id="29"/>
     </w:p>
     <w:p>
       <w:pPr>
@@ -4953,7 +4951,7 @@
       <w:pPr>
         <w:pStyle w:val="ListParagraph"/>
         <w:spacing w:before="160" w:after="160"/>
-        <w:ind w:left="1778"/>
+        <w:ind w:left="1418"/>
         <w:jc w:val="center"/>
         <w:rPr>
           <w:lang w:eastAsia="de-DE"/>
@@ -4965,9 +4963,9 @@
           <w:lang w:eastAsia="de-DE"/>
         </w:rPr>
         <w:drawing>
-          <wp:inline distT="0" distB="0" distL="0" distR="0" wp14:anchorId="3141F7CF" wp14:editId="5455B40E">
-            <wp:extent cx="2944156" cy="2494396"/>
-            <wp:effectExtent l="19050" t="19050" r="27940" b="20320"/>
+          <wp:inline distT="0" distB="0" distL="0" distR="0" wp14:anchorId="3141F7CF" wp14:editId="3B357284">
+            <wp:extent cx="4370958" cy="2285395"/>
+            <wp:effectExtent l="19050" t="19050" r="10795" b="19685"/>
             <wp:docPr id="59" name="Picture 59"/>
             <wp:cNvGraphicFramePr>
               <a:graphicFrameLocks xmlns:a="http://schemas.openxmlformats.org/drawingml/2006/main" noChangeAspect="1"/>
@@ -4996,7 +4994,7 @@
                   <pic:spPr bwMode="auto">
                     <a:xfrm>
                       <a:off x="0" y="0"/>
-                      <a:ext cx="2944156" cy="2494396"/>
+                      <a:ext cx="4390853" cy="2295797"/>
                     </a:xfrm>
                     <a:prstGeom prst="rect">
                       <a:avLst/>
@@ -5054,9 +5052,9 @@
           <w:noProof/>
         </w:rPr>
         <w:drawing>
-          <wp:inline distT="0" distB="0" distL="0" distR="0" wp14:anchorId="53D41288" wp14:editId="09D7D00A">
-            <wp:extent cx="2827010" cy="2945081"/>
-            <wp:effectExtent l="19050" t="19050" r="12065" b="27305"/>
+          <wp:inline distT="0" distB="0" distL="0" distR="0" wp14:anchorId="53D41288" wp14:editId="66A1A439">
+            <wp:extent cx="1824146" cy="3885196"/>
+            <wp:effectExtent l="19050" t="19050" r="24130" b="20320"/>
             <wp:docPr id="60" name="Picture 60"/>
             <wp:cNvGraphicFramePr>
               <a:graphicFrameLocks xmlns:a="http://schemas.openxmlformats.org/drawingml/2006/main" noChangeAspect="1"/>
@@ -5068,7 +5066,7 @@
                     <pic:cNvPr id="60" name="Picture 60"/>
                     <pic:cNvPicPr/>
                   </pic:nvPicPr>
-                  <pic:blipFill rotWithShape="1">
+                  <pic:blipFill>
                     <a:blip r:embed="rId36">
                       <a:extLst>
                         <a:ext uri="{28A0092B-C50C-407E-A947-70E740481C1C}">
@@ -5076,13 +5074,14 @@
                         </a:ext>
                       </a:extLst>
                     </a:blip>
-                    <a:srcRect b="8792"/>
-                    <a:stretch/>
+                    <a:stretch>
+                      <a:fillRect/>
+                    </a:stretch>
                   </pic:blipFill>
                   <pic:spPr bwMode="auto">
                     <a:xfrm>
                       <a:off x="0" y="0"/>
-                      <a:ext cx="2827394" cy="2945481"/>
+                      <a:ext cx="1824146" cy="3885196"/>
                     </a:xfrm>
                     <a:prstGeom prst="rect">
                       <a:avLst/>
@@ -5104,6 +5103,8 @@
           </wp:inline>
         </w:drawing>
       </w:r>
+      <w:bookmarkStart w:id="29" w:name="_GoBack"/>
+      <w:bookmarkEnd w:id="29"/>
     </w:p>
     <w:p>
       <w:pPr>
@@ -34214,7 +34215,7 @@
         <v:shape id="_x0000_s2052" type="#_x0000_t75" style="position:absolute;margin-left:-45.75pt;margin-top:62.5pt;width:602.45pt;height:287.2pt;z-index:-251642880;mso-position-horizontal-relative:text;mso-position-vertical-relative:text">
           <v:imagedata r:id="rId1" o:title=""/>
         </v:shape>
-        <o:OLEObject Type="Embed" ProgID="Visio.Drawing.15" ShapeID="_x0000_s2052" DrawAspect="Content" ObjectID="_1822633266" r:id="rId2"/>
+        <o:OLEObject Type="Embed" ProgID="Visio.Drawing.15" ShapeID="_x0000_s2052" DrawAspect="Content" ObjectID="_1822635712" r:id="rId2"/>
       </w:object>
     </w:r>
     <w:r>
@@ -35547,7 +35548,7 @@
         <v:shape id="_x0000_s2051" type="#_x0000_t75" style="position:absolute;margin-left:-45.75pt;margin-top:62.5pt;width:602.45pt;height:287.2pt;z-index:-251643904;mso-position-horizontal-relative:text;mso-position-vertical-relative:text">
           <v:imagedata r:id="rId1" o:title=""/>
         </v:shape>
-        <o:OLEObject Type="Embed" ProgID="Visio.Drawing.15" ShapeID="_x0000_s2051" DrawAspect="Content" ObjectID="_1822633267" r:id="rId2"/>
+        <o:OLEObject Type="Embed" ProgID="Visio.Drawing.15" ShapeID="_x0000_s2051" DrawAspect="Content" ObjectID="_1822635713" r:id="rId2"/>
       </w:object>
     </w:r>
     <w:r>
@@ -46651,7 +46652,7 @@
 </file>
 
 <file path=customXml/itemProps4.xml><?xml version="1.0" encoding="utf-8"?>
-<ds:datastoreItem xmlns:ds="http://schemas.openxmlformats.org/officeDocument/2006/customXml" ds:itemID="{CD65FE1F-94D6-4D93-A4CF-9389E01D7DD5}">
+<ds:datastoreItem xmlns:ds="http://schemas.openxmlformats.org/officeDocument/2006/customXml" ds:itemID="{F087B394-4F00-457A-9B60-74E6B3B5FE78}">
   <ds:schemaRefs>
     <ds:schemaRef ds:uri="http://schemas.openxmlformats.org/officeDocument/2006/bibliography"/>
   </ds:schemaRefs>

</xml_diff>

<commit_message>
updating images for removing freertos
</commit_message>
<xml_diff>
--- a/.internal/Manual/Intro to PSOC Edge E84 - Part 2 (E2)/PSoC Edge E84 Introductory E2 Training Manual -WIP_10_21_2025.docx
+++ b/.internal/Manual/Intro to PSOC Edge E84 - Part 2 (E2)/PSoC Edge E84 Introductory E2 Training Manual -WIP_10_21_2025.docx
@@ -3527,7 +3527,7 @@
           <v:shape id="_x0000_i1025" type="#_x0000_t75" style="width:475.7pt;height:588.05pt" o:ole="">
             <v:imagedata r:id="rId23" o:title=""/>
           </v:shape>
-          <o:OLEObject Type="Embed" ProgID="Visio.Drawing.15" ShapeID="_x0000_i1025" DrawAspect="Content" ObjectID="_1822635710" r:id="rId24"/>
+          <o:OLEObject Type="Embed" ProgID="Visio.Drawing.15" ShapeID="_x0000_i1025" DrawAspect="Content" ObjectID="_1822637953" r:id="rId24"/>
         </w:object>
       </w:r>
     </w:p>
@@ -3576,7 +3576,7 @@
           <v:shape id="_x0000_i1026" type="#_x0000_t75" style="width:116.95pt;height:114.05pt" o:ole="">
             <v:imagedata r:id="rId25" o:title=""/>
           </v:shape>
-          <o:OLEObject Type="Embed" ProgID="Visio.Drawing.15" ShapeID="_x0000_i1026" DrawAspect="Content" ObjectID="_1822635711" r:id="rId26"/>
+          <o:OLEObject Type="Embed" ProgID="Visio.Drawing.15" ShapeID="_x0000_i1026" DrawAspect="Content" ObjectID="_1822637954" r:id="rId26"/>
         </w:object>
       </w:r>
     </w:p>
@@ -5103,8 +5103,6 @@
           </wp:inline>
         </w:drawing>
       </w:r>
-      <w:bookmarkStart w:id="29" w:name="_GoBack"/>
-      <w:bookmarkEnd w:id="29"/>
     </w:p>
     <w:p>
       <w:pPr>
@@ -5120,40 +5118,167 @@
       <w:pPr>
         <w:pStyle w:val="ListParagraph"/>
         <w:spacing w:before="160" w:after="160"/>
-        <w:ind w:left="1778"/>
-      </w:pPr>
-      <w:r>
-        <w:t xml:space="preserve">If you explore the folders, you will see the FreeRTOS libraries have been imported into the project. But, since we are making a basic hello world blinky project, the FreeRTOS library is unnecessary. We will remove it using the </w:t>
+        <w:ind w:left="2127" w:hanging="349"/>
+      </w:pPr>
+      <w:r>
+        <w:t xml:space="preserve">If you explore the folders, you will see the FreeRTOS libraries have been imported into the project. But, since we are making a basic hello world blinky project, the </w:t>
+      </w:r>
+      <w:proofErr w:type="spellStart"/>
+      <w:r>
+        <w:t>FreeRTOS</w:t>
+      </w:r>
+      <w:proofErr w:type="spellEnd"/>
+      <w:r>
+        <w:t xml:space="preserve"> library is </w:t>
+      </w:r>
+      <w:r>
+        <w:t>not needed</w:t>
+      </w:r>
+      <w:r>
+        <w:t xml:space="preserve">. We will remove it using the </w:t>
       </w:r>
       <w:r>
         <w:rPr>
           <w:b/>
           <w:bCs/>
         </w:rPr>
-        <w:t>Library Manager Tool</w:t>
+        <w:t xml:space="preserve">Library Manager </w:t>
+      </w:r>
+      <w:r>
+        <w:rPr>
+          <w:bCs/>
+        </w:rPr>
+        <w:t>tool</w:t>
       </w:r>
       <w:r>
         <w:t xml:space="preserve">. </w:t>
       </w:r>
       <w:r>
+        <w:br/>
+      </w:r>
+      <w:r>
+        <w:br/>
+        <w:t xml:space="preserve">The </w:t>
+      </w:r>
+      <w:r>
+        <w:rPr>
+          <w:b/>
+        </w:rPr>
         <w:t>Library Manager</w:t>
       </w:r>
       <w:r>
-        <w:t xml:space="preserve"> can be found in the Quick Panel. Also, </w:t>
+        <w:t xml:space="preserve"> tool</w:t>
+      </w:r>
+      <w:r>
+        <w:t xml:space="preserve"> can be found in the </w:t>
       </w:r>
       <w:r>
         <w:rPr>
           <w:b/>
         </w:rPr>
+        <w:t>Quick Panel</w:t>
+      </w:r>
+      <w:r>
+        <w:t xml:space="preserve"> </w:t>
+      </w:r>
+      <w:r>
+        <w:t>tab</w:t>
+      </w:r>
+      <w:r>
+        <w:t xml:space="preserve"> directly below the </w:t>
+      </w:r>
+      <w:r>
+        <w:rPr>
+          <w:b/>
+        </w:rPr>
+        <w:t>Project Explorer</w:t>
+      </w:r>
+      <w:r>
+        <w:rPr>
+          <w:b/>
+        </w:rPr>
+        <w:t xml:space="preserve"> </w:t>
+      </w:r>
+      <w:r>
+        <w:t xml:space="preserve">in the </w:t>
+      </w:r>
+      <w:r>
+        <w:rPr>
+          <w:b/>
+        </w:rPr>
+        <w:t>Tools</w:t>
+      </w:r>
+      <w:r>
+        <w:t xml:space="preserve"> section</w:t>
+      </w:r>
+      <w:r>
+        <w:t xml:space="preserve">. </w:t>
+      </w:r>
+      <w:r>
+        <w:t>In addition</w:t>
+      </w:r>
+      <w:r>
+        <w:t xml:space="preserve">, </w:t>
+      </w:r>
+      <w:proofErr w:type="spellStart"/>
+      <w:r>
+        <w:rPr>
+          <w:b/>
+        </w:rPr>
         <w:t>retargetIO</w:t>
       </w:r>
-      <w:r>
-        <w:t xml:space="preserve"> is needed for our project for using the UART functionalities. This too can be added using the Library Manager.</w:t>
+      <w:proofErr w:type="spellEnd"/>
+      <w:r>
+        <w:t xml:space="preserve"> </w:t>
+      </w:r>
+      <w:r>
+        <w:t xml:space="preserve">will be </w:t>
+      </w:r>
+      <w:r>
+        <w:t xml:space="preserve">needed for our </w:t>
+      </w:r>
+      <w:r>
+        <w:lastRenderedPageBreak/>
+        <w:t xml:space="preserve">project for using the UART functionalities. This </w:t>
+      </w:r>
+      <w:r>
+        <w:t>will</w:t>
+      </w:r>
+      <w:r>
+        <w:t xml:space="preserve"> be added using the </w:t>
+      </w:r>
+      <w:r>
+        <w:rPr>
+          <w:b/>
+        </w:rPr>
+        <w:t xml:space="preserve">Library </w:t>
+      </w:r>
+      <w:r>
+        <w:rPr>
+          <w:b/>
+        </w:rPr>
+        <w:t>Manager</w:t>
+      </w:r>
+      <w:r>
+        <w:rPr>
+          <w:b/>
+        </w:rPr>
+        <w:t xml:space="preserve"> </w:t>
+      </w:r>
+      <w:r>
+        <w:t>as</w:t>
+      </w:r>
+      <w:r>
+        <w:t xml:space="preserve"> well</w:t>
+      </w:r>
+      <w:r>
+        <w:t>.</w:t>
       </w:r>
     </w:p>
     <w:p>
       <w:pPr>
         <w:spacing w:before="160" w:after="160"/>
+        <w:ind w:left="1418"/>
         <w:jc w:val="center"/>
         <w:rPr>
           <w:lang w:eastAsia="de-DE"/>
@@ -5164,11 +5289,10 @@
           <w:noProof/>
           <w:lang w:eastAsia="de-DE"/>
         </w:rPr>
-        <w:lastRenderedPageBreak/>
         <w:drawing>
-          <wp:inline distT="0" distB="0" distL="0" distR="0" wp14:anchorId="5B927182" wp14:editId="1C197B65">
-            <wp:extent cx="2668414" cy="2363572"/>
-            <wp:effectExtent l="19050" t="19050" r="17780" b="17780"/>
+          <wp:inline distT="0" distB="0" distL="0" distR="0" wp14:anchorId="5B927182" wp14:editId="37693207">
+            <wp:extent cx="1638209" cy="3683804"/>
+            <wp:effectExtent l="19050" t="19050" r="19685" b="12065"/>
             <wp:docPr id="18" name="Picture 18"/>
             <wp:cNvGraphicFramePr>
               <a:graphicFrameLocks xmlns:a="http://schemas.openxmlformats.org/drawingml/2006/main" noChangeAspect="1"/>
@@ -5197,7 +5321,7 @@
                   <pic:spPr bwMode="auto">
                     <a:xfrm>
                       <a:off x="0" y="0"/>
-                      <a:ext cx="2668414" cy="2363572"/>
+                      <a:ext cx="1669039" cy="3753131"/>
                     </a:xfrm>
                     <a:prstGeom prst="rect">
                       <a:avLst/>
@@ -5285,59 +5409,191 @@
       </w:r>
       <w:r>
         <w:rPr>
-          <w:lang w:eastAsia="de-DE"/>
-        </w:rPr>
-        <w:t xml:space="preserve">Open the </w:t>
-      </w:r>
-      <w:r>
-        <w:rPr>
           <w:b/>
           <w:lang w:eastAsia="de-DE"/>
         </w:rPr>
+        <w:t>Open</w:t>
+      </w:r>
+      <w:r>
+        <w:rPr>
+          <w:lang w:eastAsia="de-DE"/>
+        </w:rPr>
+        <w:t xml:space="preserve"> the </w:t>
+      </w:r>
+      <w:r>
+        <w:rPr>
+          <w:b/>
+          <w:lang w:eastAsia="de-DE"/>
+        </w:rPr>
         <w:t>Library Manager</w:t>
       </w:r>
       <w:r>
         <w:rPr>
           <w:lang w:eastAsia="de-DE"/>
         </w:rPr>
-        <w:t xml:space="preserve"> from quick panel</w:t>
-      </w:r>
-      <w:r>
-        <w:rPr>
-          <w:lang w:eastAsia="de-DE"/>
-        </w:rPr>
-        <w:t xml:space="preserve">. You would be able to see the freertos under the proj_cm33_ns </w:t>
-      </w:r>
-      <w:r>
-        <w:rPr>
-          <w:lang w:eastAsia="de-DE"/>
-        </w:rPr>
-        <w:t>and proj_</w:t>
-      </w:r>
-      <w:r>
-        <w:rPr>
-          <w:lang w:eastAsia="de-DE"/>
-        </w:rPr>
-        <w:t xml:space="preserve">cm55 </w:t>
-      </w:r>
-      <w:r>
-        <w:rPr>
-          <w:lang w:eastAsia="de-DE"/>
-        </w:rPr>
-        <w:t xml:space="preserve">Libraries. Click the </w:t>
+        <w:t xml:space="preserve"> from </w:t>
       </w:r>
       <w:r>
         <w:rPr>
           <w:b/>
           <w:lang w:eastAsia="de-DE"/>
         </w:rPr>
+        <w:t>Quick</w:t>
+      </w:r>
+      <w:r>
+        <w:rPr>
+          <w:b/>
+          <w:lang w:eastAsia="de-DE"/>
+        </w:rPr>
+        <w:t xml:space="preserve"> </w:t>
+      </w:r>
+      <w:r>
+        <w:rPr>
+          <w:b/>
+          <w:lang w:eastAsia="de-DE"/>
+        </w:rPr>
+        <w:t>Panel</w:t>
+      </w:r>
+      <w:r>
+        <w:rPr>
+          <w:lang w:eastAsia="de-DE"/>
+        </w:rPr>
+        <w:t xml:space="preserve">. </w:t>
+      </w:r>
+      <w:r>
+        <w:rPr>
+          <w:lang w:eastAsia="de-DE"/>
+        </w:rPr>
+        <w:t>Find</w:t>
+      </w:r>
+      <w:r>
+        <w:rPr>
+          <w:lang w:eastAsia="de-DE"/>
+        </w:rPr>
+        <w:t xml:space="preserve"> the </w:t>
+      </w:r>
+      <w:proofErr w:type="spellStart"/>
+      <w:r>
+        <w:rPr>
+          <w:b/>
+          <w:lang w:eastAsia="de-DE"/>
+        </w:rPr>
+        <w:t>freertos</w:t>
+      </w:r>
+      <w:proofErr w:type="spellEnd"/>
+      <w:r>
+        <w:rPr>
+          <w:lang w:eastAsia="de-DE"/>
+        </w:rPr>
+        <w:t xml:space="preserve"> libraries</w:t>
+      </w:r>
+      <w:r>
+        <w:rPr>
+          <w:lang w:eastAsia="de-DE"/>
+        </w:rPr>
+        <w:t xml:space="preserve"> under the </w:t>
+      </w:r>
+      <w:r>
+        <w:rPr>
+          <w:b/>
+          <w:lang w:eastAsia="de-DE"/>
+        </w:rPr>
+        <w:t>proj_cm33_ns</w:t>
+      </w:r>
+      <w:r>
+        <w:rPr>
+          <w:lang w:eastAsia="de-DE"/>
+        </w:rPr>
+        <w:t xml:space="preserve"> </w:t>
+      </w:r>
+      <w:r>
+        <w:rPr>
+          <w:lang w:eastAsia="de-DE"/>
+        </w:rPr>
+        <w:t xml:space="preserve">and </w:t>
+      </w:r>
+      <w:r>
+        <w:rPr>
+          <w:b/>
+          <w:lang w:eastAsia="de-DE"/>
+        </w:rPr>
+        <w:t>proj_</w:t>
+      </w:r>
+      <w:r>
+        <w:rPr>
+          <w:b/>
+          <w:lang w:eastAsia="de-DE"/>
+        </w:rPr>
+        <w:t>cm55</w:t>
+      </w:r>
+      <w:r>
+        <w:rPr>
+          <w:lang w:eastAsia="de-DE"/>
+        </w:rPr>
+        <w:t xml:space="preserve"> </w:t>
+      </w:r>
+      <w:r>
+        <w:rPr>
+          <w:lang w:eastAsia="de-DE"/>
+        </w:rPr>
+        <w:t>project libraries</w:t>
+      </w:r>
+      <w:r>
+        <w:rPr>
+          <w:lang w:eastAsia="de-DE"/>
+        </w:rPr>
+        <w:t xml:space="preserve">. Click the </w:t>
+      </w:r>
+      <w:r>
+        <w:rPr>
+          <w:b/>
+          <w:lang w:eastAsia="de-DE"/>
+        </w:rPr>
         <w:t>‘X’</w:t>
       </w:r>
       <w:r>
         <w:rPr>
           <w:lang w:eastAsia="de-DE"/>
         </w:rPr>
-        <w:t xml:space="preserve"> mark to remove the library.</w:t>
+        <w:t xml:space="preserve"> mark to remove the </w:t>
+      </w:r>
+      <w:proofErr w:type="spellStart"/>
+      <w:r>
+        <w:rPr>
+          <w:b/>
+        </w:rPr>
+        <w:t>freertos</w:t>
+      </w:r>
+      <w:proofErr w:type="spellEnd"/>
+      <w:r>
+        <w:rPr>
+          <w:lang w:eastAsia="de-DE"/>
+        </w:rPr>
+        <w:t xml:space="preserve"> </w:t>
+      </w:r>
+      <w:r>
+        <w:rPr>
+          <w:lang w:eastAsia="de-DE"/>
+        </w:rPr>
+        <w:t>library</w:t>
+      </w:r>
+      <w:r>
+        <w:rPr>
+          <w:lang w:eastAsia="de-DE"/>
+        </w:rPr>
+        <w:t xml:space="preserve"> in each project</w:t>
+      </w:r>
+      <w:r>
+        <w:rPr>
+          <w:lang w:eastAsia="de-DE"/>
+        </w:rPr>
+        <w:t>’s libraries</w:t>
+      </w:r>
+      <w:r>
+        <w:rPr>
+          <w:lang w:eastAsia="de-DE"/>
+        </w:rPr>
+        <w:t>.</w:t>
       </w:r>
     </w:p>
     <w:p>
@@ -5354,21 +5610,23 @@
       <w:pPr>
         <w:pStyle w:val="ListParagraph"/>
         <w:spacing w:before="160" w:after="160"/>
-        <w:ind w:left="1778"/>
+        <w:ind w:left="1418"/>
         <w:jc w:val="center"/>
         <w:rPr>
           <w:lang w:eastAsia="de-DE"/>
         </w:rPr>
       </w:pPr>
+      <w:bookmarkStart w:id="29" w:name="_GoBack"/>
+      <w:bookmarkEnd w:id="29"/>
       <w:r>
         <w:rPr>
           <w:noProof/>
           <w:lang w:eastAsia="de-DE"/>
         </w:rPr>
         <w:drawing>
-          <wp:inline distT="0" distB="0" distL="0" distR="0" wp14:anchorId="415CBEB9" wp14:editId="6DF1123E">
-            <wp:extent cx="4418277" cy="3865026"/>
-            <wp:effectExtent l="19050" t="19050" r="20955" b="21590"/>
+          <wp:inline distT="0" distB="0" distL="0" distR="0" wp14:anchorId="415CBEB9" wp14:editId="4F5A44FD">
+            <wp:extent cx="4792815" cy="3736875"/>
+            <wp:effectExtent l="19050" t="19050" r="27305" b="16510"/>
             <wp:docPr id="31" name="Picture 31"/>
             <wp:cNvGraphicFramePr>
               <a:graphicFrameLocks xmlns:a="http://schemas.openxmlformats.org/drawingml/2006/main" noChangeAspect="1"/>
@@ -5397,7 +5655,7 @@
                   <pic:spPr bwMode="auto">
                     <a:xfrm>
                       <a:off x="0" y="0"/>
-                      <a:ext cx="4418277" cy="3865026"/>
+                      <a:ext cx="4902402" cy="3822318"/>
                     </a:xfrm>
                     <a:prstGeom prst="rect">
                       <a:avLst/>
@@ -5551,7 +5809,6 @@
           <w:noProof/>
           <w:lang w:eastAsia="de-DE"/>
         </w:rPr>
-        <w:lastRenderedPageBreak/>
         <w:drawing>
           <wp:inline distT="0" distB="0" distL="0" distR="0" wp14:anchorId="3DC2931F" wp14:editId="6C92DD55">
             <wp:extent cx="4908524" cy="3234260"/>
@@ -5845,6 +6102,7 @@
         <w:rPr>
           <w:lang w:eastAsia="de-DE"/>
         </w:rPr>
+        <w:lastRenderedPageBreak/>
         <w:t>O</w:t>
       </w:r>
       <w:r>
@@ -34215,7 +34473,7 @@
         <v:shape id="_x0000_s2052" type="#_x0000_t75" style="position:absolute;margin-left:-45.75pt;margin-top:62.5pt;width:602.45pt;height:287.2pt;z-index:-251642880;mso-position-horizontal-relative:text;mso-position-vertical-relative:text">
           <v:imagedata r:id="rId1" o:title=""/>
         </v:shape>
-        <o:OLEObject Type="Embed" ProgID="Visio.Drawing.15" ShapeID="_x0000_s2052" DrawAspect="Content" ObjectID="_1822635712" r:id="rId2"/>
+        <o:OLEObject Type="Embed" ProgID="Visio.Drawing.15" ShapeID="_x0000_s2052" DrawAspect="Content" ObjectID="_1822637955" r:id="rId2"/>
       </w:object>
     </w:r>
     <w:r>
@@ -35548,7 +35806,7 @@
         <v:shape id="_x0000_s2051" type="#_x0000_t75" style="position:absolute;margin-left:-45.75pt;margin-top:62.5pt;width:602.45pt;height:287.2pt;z-index:-251643904;mso-position-horizontal-relative:text;mso-position-vertical-relative:text">
           <v:imagedata r:id="rId1" o:title=""/>
         </v:shape>
-        <o:OLEObject Type="Embed" ProgID="Visio.Drawing.15" ShapeID="_x0000_s2051" DrawAspect="Content" ObjectID="_1822635713" r:id="rId2"/>
+        <o:OLEObject Type="Embed" ProgID="Visio.Drawing.15" ShapeID="_x0000_s2051" DrawAspect="Content" ObjectID="_1822637956" r:id="rId2"/>
       </w:object>
     </w:r>
     <w:r>
@@ -44135,7 +44393,6 @@
   <w:style w:type="character" w:default="1" w:styleId="DefaultParagraphFont">
     <w:name w:val="Default Paragraph Font"/>
     <w:uiPriority w:val="1"/>
-    <w:semiHidden/>
     <w:unhideWhenUsed/>
   </w:style>
   <w:style w:type="table" w:default="1" w:styleId="TableNormal">
@@ -46652,7 +46909,7 @@
 </file>
 
 <file path=customXml/itemProps4.xml><?xml version="1.0" encoding="utf-8"?>
-<ds:datastoreItem xmlns:ds="http://schemas.openxmlformats.org/officeDocument/2006/customXml" ds:itemID="{F087B394-4F00-457A-9B60-74E6B3B5FE78}">
+<ds:datastoreItem xmlns:ds="http://schemas.openxmlformats.org/officeDocument/2006/customXml" ds:itemID="{68E3C0D5-0E17-4925-B491-9845781FBA47}">
   <ds:schemaRefs>
     <ds:schemaRef ds:uri="http://schemas.openxmlformats.org/officeDocument/2006/bibliography"/>
   </ds:schemaRefs>

</xml_diff>

<commit_message>
adding png image for evk board for uart routing
</commit_message>
<xml_diff>
--- a/.internal/Manual/Intro to PSOC Edge E84 - Part 2 (E2)/PSoC Edge E84 Introductory E2 Training Manual -WIP_10_21_2025.docx
+++ b/.internal/Manual/Intro to PSOC Edge E84 - Part 2 (E2)/PSoC Edge E84 Introductory E2 Training Manual -WIP_10_21_2025.docx
@@ -2932,25 +2932,7 @@
           <w:spacing w:val="3"/>
           <w:shd w:val="clear" w:color="auto" w:fill="FFFFFF"/>
         </w:rPr>
-        <w:t>Te</w:t>
-      </w:r>
-      <w:r>
-        <w:rPr>
-          <w:rStyle w:val="Hyperlink"/>
-          <w:rFonts w:cs="Segoe UI"/>
-          <w:spacing w:val="3"/>
-          <w:shd w:val="clear" w:color="auto" w:fill="FFFFFF"/>
-        </w:rPr>
-        <w:t>r</w:t>
-      </w:r>
-      <w:r>
-        <w:rPr>
-          <w:rStyle w:val="Hyperlink"/>
-          <w:rFonts w:cs="Segoe UI"/>
-          <w:spacing w:val="3"/>
-          <w:shd w:val="clear" w:color="auto" w:fill="FFFFFF"/>
-        </w:rPr>
-        <w:t>a Term</w:t>
+        <w:t>Tera Term</w:t>
       </w:r>
       <w:r>
         <w:rPr>
@@ -3527,7 +3509,7 @@
           <v:shape id="_x0000_i1025" type="#_x0000_t75" style="width:475.7pt;height:588.05pt" o:ole="">
             <v:imagedata r:id="rId23" o:title=""/>
           </v:shape>
-          <o:OLEObject Type="Embed" ProgID="Visio.Drawing.15" ShapeID="_x0000_i1025" DrawAspect="Content" ObjectID="_1822637953" r:id="rId24"/>
+          <o:OLEObject Type="Embed" ProgID="Visio.Drawing.15" ShapeID="_x0000_i1025" DrawAspect="Content" ObjectID="_1823236562" r:id="rId24"/>
         </w:object>
       </w:r>
     </w:p>
@@ -3576,7 +3558,7 @@
           <v:shape id="_x0000_i1026" type="#_x0000_t75" style="width:116.95pt;height:114.05pt" o:ole="">
             <v:imagedata r:id="rId25" o:title=""/>
           </v:shape>
-          <o:OLEObject Type="Embed" ProgID="Visio.Drawing.15" ShapeID="_x0000_i1026" DrawAspect="Content" ObjectID="_1822637954" r:id="rId26"/>
+          <o:OLEObject Type="Embed" ProgID="Visio.Drawing.15" ShapeID="_x0000_i1026" DrawAspect="Content" ObjectID="_1823236563" r:id="rId26"/>
         </w:object>
       </w:r>
     </w:p>
@@ -3601,6 +3583,14 @@
         <w:t>Hardware Block Diagram</w:t>
       </w:r>
       <w:bookmarkEnd w:id="25"/>
+      <w:r>
+        <w:rPr>
+          <w:b w:val="0"/>
+        </w:rPr>
+        <w:t xml:space="preserve"> and Setup</w:t>
+      </w:r>
+      <w:bookmarkStart w:id="26" w:name="_GoBack"/>
+      <w:bookmarkEnd w:id="26"/>
     </w:p>
     <w:p>
       <w:pPr>
@@ -3652,7 +3642,7 @@
         <w:spacing w:after="0"/>
       </w:pPr>
       <w:r>
-        <w:t>P6_7 (UART_TX)</w:t>
+        <w:t>P6_5 (UART_RX)</w:t>
       </w:r>
     </w:p>
     <w:p>
@@ -3665,7 +3655,7 @@
         <w:spacing w:after="0"/>
       </w:pPr>
       <w:r>
-        <w:t>P6_5 (UART_RX)</w:t>
+        <w:t>P6_7 (UART_TX)</w:t>
       </w:r>
     </w:p>
     <w:p>
@@ -3700,7 +3690,13 @@
         <w:spacing w:after="0"/>
       </w:pPr>
       <w:r>
-        <w:t>P16_7 (LED)</w:t>
+        <w:t>P16_7 (</w:t>
+      </w:r>
+      <w:r>
+        <w:t>USER_</w:t>
+      </w:r>
+      <w:r>
+        <w:t>LED)</w:t>
       </w:r>
     </w:p>
     <w:p>
@@ -3714,8 +3710,8 @@
           <w:noProof/>
         </w:rPr>
         <w:drawing>
-          <wp:inline distT="0" distB="0" distL="0" distR="0" wp14:anchorId="2AEF9C86" wp14:editId="45548D2E">
-            <wp:extent cx="5642610" cy="2631117"/>
+          <wp:inline distT="0" distB="0" distL="0" distR="0" wp14:anchorId="2AEF9C86" wp14:editId="2BBD3517">
+            <wp:extent cx="5661036" cy="2504941"/>
             <wp:effectExtent l="0" t="0" r="0" b="0"/>
             <wp:docPr id="1" name="Picture 1"/>
             <wp:cNvGraphicFramePr>
@@ -3729,7 +3725,13 @@
                     <pic:cNvPicPr/>
                   </pic:nvPicPr>
                   <pic:blipFill>
-                    <a:blip r:embed="rId27"/>
+                    <a:blip r:embed="rId27">
+                      <a:extLst>
+                        <a:ext uri="{28A0092B-C50C-407E-A947-70E740481C1C}">
+                          <a14:useLocalDpi xmlns:a14="http://schemas.microsoft.com/office/drawing/2010/main" val="0"/>
+                        </a:ext>
+                      </a:extLst>
+                    </a:blip>
                     <a:stretch>
                       <a:fillRect/>
                     </a:stretch>
@@ -3737,7 +3739,7 @@
                   <pic:spPr>
                     <a:xfrm>
                       <a:off x="0" y="0"/>
-                      <a:ext cx="5661036" cy="2639709"/>
+                      <a:ext cx="5661036" cy="2504941"/>
                     </a:xfrm>
                     <a:prstGeom prst="rect">
                       <a:avLst/>
@@ -3754,95 +3756,7 @@
       <w:pPr>
         <w:pStyle w:val="Body"/>
       </w:pPr>
-    </w:p>
-    <w:p>
-      <w:pPr>
-        <w:keepNext/>
-        <w:numPr>
-          <w:ilvl w:val="1"/>
-          <w:numId w:val="1"/>
-        </w:numPr>
-        <w:tabs>
-          <w:tab w:val="left" w:pos="1418"/>
-        </w:tabs>
-        <w:spacing w:before="240" w:after="120"/>
-        <w:ind w:left="1418" w:hanging="1418"/>
-        <w:outlineLvl w:val="1"/>
-        <w:rPr>
-          <w:snapToGrid w:val="0"/>
-          <w:kern w:val="28"/>
-          <w:sz w:val="28"/>
-          <w:lang w:eastAsia="de-DE"/>
-        </w:rPr>
-      </w:pPr>
-      <w:bookmarkStart w:id="26" w:name="_Toc192780020"/>
       <w:bookmarkStart w:id="27" w:name="_Hlk190961414"/>
-      <w:r>
-        <w:rPr>
-          <w:snapToGrid w:val="0"/>
-          <w:kern w:val="28"/>
-          <w:sz w:val="28"/>
-          <w:lang w:eastAsia="de-DE"/>
-        </w:rPr>
-        <w:lastRenderedPageBreak/>
-        <w:t>Hardware Setup</w:t>
-      </w:r>
-      <w:bookmarkEnd w:id="26"/>
-      <w:r>
-        <w:rPr>
-          <w:snapToGrid w:val="0"/>
-          <w:kern w:val="28"/>
-          <w:sz w:val="28"/>
-          <w:lang w:eastAsia="de-DE"/>
-        </w:rPr>
-        <w:t xml:space="preserve"> </w:t>
-      </w:r>
-    </w:p>
-    <w:p>
-      <w:pPr>
-        <w:pStyle w:val="Body"/>
-        <w:jc w:val="center"/>
-      </w:pPr>
-      <w:r>
-        <w:rPr>
-          <w:noProof/>
-        </w:rPr>
-        <w:drawing>
-          <wp:inline distT="0" distB="0" distL="0" distR="0" wp14:anchorId="57B90902" wp14:editId="709B6FC2">
-            <wp:extent cx="5348500" cy="3059430"/>
-            <wp:effectExtent l="0" t="0" r="5080" b="7620"/>
-            <wp:docPr id="34" name="Picture 34"/>
-            <wp:cNvGraphicFramePr>
-              <a:graphicFrameLocks xmlns:a="http://schemas.openxmlformats.org/drawingml/2006/main" noChangeAspect="1"/>
-            </wp:cNvGraphicFramePr>
-            <a:graphic xmlns:a="http://schemas.openxmlformats.org/drawingml/2006/main">
-              <a:graphicData uri="http://schemas.openxmlformats.org/drawingml/2006/picture">
-                <pic:pic xmlns:pic="http://schemas.openxmlformats.org/drawingml/2006/picture">
-                  <pic:nvPicPr>
-                    <pic:cNvPr id="1" name=""/>
-                    <pic:cNvPicPr/>
-                  </pic:nvPicPr>
-                  <pic:blipFill>
-                    <a:blip r:embed="rId28"/>
-                    <a:stretch>
-                      <a:fillRect/>
-                    </a:stretch>
-                  </pic:blipFill>
-                  <pic:spPr>
-                    <a:xfrm>
-                      <a:off x="0" y="0"/>
-                      <a:ext cx="5353426" cy="3062248"/>
-                    </a:xfrm>
-                    <a:prstGeom prst="rect">
-                      <a:avLst/>
-                    </a:prstGeom>
-                  </pic:spPr>
-                </pic:pic>
-              </a:graphicData>
-            </a:graphic>
-          </wp:inline>
-        </w:drawing>
-      </w:r>
     </w:p>
     <w:bookmarkEnd w:id="27"/>
     <w:p>
@@ -3974,6 +3888,7 @@
         <w:rPr>
           <w:noProof/>
         </w:rPr>
+        <w:lastRenderedPageBreak/>
         <w:drawing>
           <wp:inline distT="0" distB="0" distL="0" distR="0" wp14:anchorId="161B641C" wp14:editId="42FDE3F9">
             <wp:extent cx="3784454" cy="3540296"/>
@@ -3992,7 +3907,7 @@
                     </pic:cNvPicPr>
                   </pic:nvPicPr>
                   <pic:blipFill>
-                    <a:blip r:embed="rId29">
+                    <a:blip r:embed="rId28">
                       <a:extLst>
                         <a:ext uri="{28A0092B-C50C-407E-A947-70E740481C1C}">
                           <a14:useLocalDpi xmlns:a14="http://schemas.microsoft.com/office/drawing/2010/main" val="0"/>
@@ -4099,7 +4014,7 @@
                     </pic:cNvPicPr>
                   </pic:nvPicPr>
                   <pic:blipFill>
-                    <a:blip r:embed="rId30">
+                    <a:blip r:embed="rId29">
                       <a:extLst>
                         <a:ext uri="{28A0092B-C50C-407E-A947-70E740481C1C}">
                           <a14:useLocalDpi xmlns:a14="http://schemas.microsoft.com/office/drawing/2010/main" val="0"/>
@@ -4210,6 +4125,7 @@
         <w:rPr>
           <w:noProof/>
         </w:rPr>
+        <w:lastRenderedPageBreak/>
         <w:drawing>
           <wp:inline distT="0" distB="0" distL="0" distR="0" wp14:anchorId="0AC2496A" wp14:editId="12F4DF5A">
             <wp:extent cx="4898924" cy="2599569"/>
@@ -4226,7 +4142,7 @@
                     <pic:cNvPicPr/>
                   </pic:nvPicPr>
                   <pic:blipFill>
-                    <a:blip r:embed="rId31" cstate="print">
+                    <a:blip r:embed="rId30" cstate="print">
                       <a:extLst>
                         <a:ext uri="{28A0092B-C50C-407E-A947-70E740481C1C}">
                           <a14:useLocalDpi xmlns:a14="http://schemas.microsoft.com/office/drawing/2010/main" val="0"/>
@@ -4378,7 +4294,7 @@
                     </pic:cNvPicPr>
                   </pic:nvPicPr>
                   <pic:blipFill>
-                    <a:blip r:embed="rId32" cstate="print">
+                    <a:blip r:embed="rId31" cstate="print">
                       <a:extLst>
                         <a:ext uri="{28A0092B-C50C-407E-A947-70E740481C1C}">
                           <a14:useLocalDpi xmlns:a14="http://schemas.microsoft.com/office/drawing/2010/main" val="0"/>
@@ -4425,7 +4341,6 @@
         <w:rPr>
           <w:lang w:eastAsia="de-DE"/>
         </w:rPr>
-        <w:lastRenderedPageBreak/>
         <w:t xml:space="preserve">Clicking New Application will open the </w:t>
       </w:r>
       <w:r>
@@ -4634,6 +4549,7 @@
           <w:noProof/>
           <w:lang w:eastAsia="de-DE"/>
         </w:rPr>
+        <w:lastRenderedPageBreak/>
         <w:drawing>
           <wp:inline distT="0" distB="0" distL="0" distR="0" wp14:anchorId="3E8DA693" wp14:editId="0FEEDB8C">
             <wp:extent cx="4731577" cy="3139616"/>
@@ -4652,7 +4568,7 @@
                     </pic:cNvPicPr>
                   </pic:nvPicPr>
                   <pic:blipFill>
-                    <a:blip r:embed="rId33" cstate="print">
+                    <a:blip r:embed="rId32" cstate="print">
                       <a:extLst>
                         <a:ext uri="{28A0092B-C50C-407E-A947-70E740481C1C}">
                           <a14:useLocalDpi xmlns:a14="http://schemas.microsoft.com/office/drawing/2010/main" val="0"/>
@@ -4849,7 +4765,7 @@
                     </pic:cNvPicPr>
                   </pic:nvPicPr>
                   <pic:blipFill>
-                    <a:blip r:embed="rId34" cstate="print">
+                    <a:blip r:embed="rId33" cstate="print">
                       <a:extLst>
                         <a:ext uri="{28A0092B-C50C-407E-A947-70E740481C1C}">
                           <a14:useLocalDpi xmlns:a14="http://schemas.microsoft.com/office/drawing/2010/main" val="0"/>
@@ -4962,6 +4878,7 @@
           <w:noProof/>
           <w:lang w:eastAsia="de-DE"/>
         </w:rPr>
+        <w:lastRenderedPageBreak/>
         <w:drawing>
           <wp:inline distT="0" distB="0" distL="0" distR="0" wp14:anchorId="3141F7CF" wp14:editId="3B357284">
             <wp:extent cx="4370958" cy="2285395"/>
@@ -4980,7 +4897,7 @@
                     </pic:cNvPicPr>
                   </pic:nvPicPr>
                   <pic:blipFill>
-                    <a:blip r:embed="rId35" cstate="print">
+                    <a:blip r:embed="rId34" cstate="print">
                       <a:extLst>
                         <a:ext uri="{28A0092B-C50C-407E-A947-70E740481C1C}">
                           <a14:useLocalDpi xmlns:a14="http://schemas.microsoft.com/office/drawing/2010/main" val="0"/>
@@ -5067,7 +4984,7 @@
                     <pic:cNvPicPr/>
                   </pic:nvPicPr>
                   <pic:blipFill>
-                    <a:blip r:embed="rId36">
+                    <a:blip r:embed="rId35">
                       <a:extLst>
                         <a:ext uri="{28A0092B-C50C-407E-A947-70E740481C1C}">
                           <a14:useLocalDpi xmlns:a14="http://schemas.microsoft.com/office/drawing/2010/main" val="0"/>
@@ -5121,7 +5038,15 @@
         <w:ind w:left="2127" w:hanging="349"/>
       </w:pPr>
       <w:r>
-        <w:t xml:space="preserve">If you explore the folders, you will see the FreeRTOS libraries have been imported into the project. But, since we are making a basic hello world blinky project, the </w:t>
+        <w:t xml:space="preserve">If you explore the folders, you will see the FreeRTOS libraries have been imported into the project. But, since we are making a basic hello world </w:t>
+      </w:r>
+      <w:proofErr w:type="spellStart"/>
+      <w:r>
+        <w:t>blinky</w:t>
+      </w:r>
+      <w:proofErr w:type="spellEnd"/>
+      <w:r>
+        <w:t xml:space="preserve"> project, the </w:t>
       </w:r>
       <w:proofErr w:type="spellStart"/>
       <w:r>
@@ -5235,60 +5160,57 @@
         <w:t xml:space="preserve">will be </w:t>
       </w:r>
       <w:r>
-        <w:t xml:space="preserve">needed for our </w:t>
-      </w:r>
-      <w:r>
+        <w:t xml:space="preserve">needed for our project for using the UART functionalities. This </w:t>
+      </w:r>
+      <w:r>
+        <w:t>will</w:t>
+      </w:r>
+      <w:r>
+        <w:t xml:space="preserve"> be added using the </w:t>
+      </w:r>
+      <w:r>
+        <w:rPr>
+          <w:b/>
+        </w:rPr>
+        <w:t xml:space="preserve">Library </w:t>
+      </w:r>
+      <w:r>
+        <w:rPr>
+          <w:b/>
+        </w:rPr>
+        <w:t>Manager</w:t>
+      </w:r>
+      <w:r>
+        <w:rPr>
+          <w:b/>
+        </w:rPr>
+        <w:t xml:space="preserve"> </w:t>
+      </w:r>
+      <w:r>
+        <w:t>as</w:t>
+      </w:r>
+      <w:r>
+        <w:t xml:space="preserve"> well</w:t>
+      </w:r>
+      <w:r>
+        <w:t>.</w:t>
+      </w:r>
+    </w:p>
+    <w:p>
+      <w:pPr>
+        <w:spacing w:before="160" w:after="160"/>
+        <w:ind w:left="1418"/>
+        <w:jc w:val="center"/>
+        <w:rPr>
+          <w:lang w:eastAsia="de-DE"/>
+        </w:rPr>
+      </w:pPr>
+      <w:r>
+        <w:rPr>
+          <w:noProof/>
+          <w:lang w:eastAsia="de-DE"/>
+        </w:rPr>
         <w:lastRenderedPageBreak/>
-        <w:t xml:space="preserve">project for using the UART functionalities. This </w:t>
-      </w:r>
-      <w:r>
-        <w:t>will</w:t>
-      </w:r>
-      <w:r>
-        <w:t xml:space="preserve"> be added using the </w:t>
-      </w:r>
-      <w:r>
-        <w:rPr>
-          <w:b/>
-        </w:rPr>
-        <w:t xml:space="preserve">Library </w:t>
-      </w:r>
-      <w:r>
-        <w:rPr>
-          <w:b/>
-        </w:rPr>
-        <w:t>Manager</w:t>
-      </w:r>
-      <w:r>
-        <w:rPr>
-          <w:b/>
-        </w:rPr>
-        <w:t xml:space="preserve"> </w:t>
-      </w:r>
-      <w:r>
-        <w:t>as</w:t>
-      </w:r>
-      <w:r>
-        <w:t xml:space="preserve"> well</w:t>
-      </w:r>
-      <w:r>
-        <w:t>.</w:t>
-      </w:r>
-    </w:p>
-    <w:p>
-      <w:pPr>
-        <w:spacing w:before="160" w:after="160"/>
-        <w:ind w:left="1418"/>
-        <w:jc w:val="center"/>
-        <w:rPr>
-          <w:lang w:eastAsia="de-DE"/>
-        </w:rPr>
-      </w:pPr>
-      <w:r>
-        <w:rPr>
-          <w:noProof/>
-          <w:lang w:eastAsia="de-DE"/>
-        </w:rPr>
         <w:drawing>
           <wp:inline distT="0" distB="0" distL="0" distR="0" wp14:anchorId="5B927182" wp14:editId="37693207">
             <wp:extent cx="1638209" cy="3683804"/>
@@ -5307,7 +5229,7 @@
                     </pic:cNvPicPr>
                   </pic:nvPicPr>
                   <pic:blipFill>
-                    <a:blip r:embed="rId37">
+                    <a:blip r:embed="rId36">
                       <a:extLst>
                         <a:ext uri="{28A0092B-C50C-407E-A947-70E740481C1C}">
                           <a14:useLocalDpi xmlns:a14="http://schemas.microsoft.com/office/drawing/2010/main" val="0"/>
@@ -5616,8 +5538,6 @@
           <w:lang w:eastAsia="de-DE"/>
         </w:rPr>
       </w:pPr>
-      <w:bookmarkStart w:id="29" w:name="_GoBack"/>
-      <w:bookmarkEnd w:id="29"/>
       <w:r>
         <w:rPr>
           <w:noProof/>
@@ -5641,7 +5561,7 @@
                     </pic:cNvPicPr>
                   </pic:nvPicPr>
                   <pic:blipFill>
-                    <a:blip r:embed="rId38" cstate="print">
+                    <a:blip r:embed="rId37" cstate="print">
                       <a:extLst>
                         <a:ext uri="{28A0092B-C50C-407E-A947-70E740481C1C}">
                           <a14:useLocalDpi xmlns:a14="http://schemas.microsoft.com/office/drawing/2010/main" val="0"/>
@@ -5707,6 +5627,7 @@
         <w:rPr>
           <w:lang w:eastAsia="de-DE"/>
         </w:rPr>
+        <w:lastRenderedPageBreak/>
         <w:t xml:space="preserve">Now, click the </w:t>
       </w:r>
       <w:r>
@@ -5827,7 +5748,7 @@
                     </pic:cNvPicPr>
                   </pic:nvPicPr>
                   <pic:blipFill>
-                    <a:blip r:embed="rId39">
+                    <a:blip r:embed="rId38">
                       <a:extLst>
                         <a:ext uri="{28A0092B-C50C-407E-A947-70E740481C1C}">
                           <a14:useLocalDpi xmlns:a14="http://schemas.microsoft.com/office/drawing/2010/main" val="0"/>
@@ -5943,7 +5864,7 @@
                     </pic:cNvPicPr>
                   </pic:nvPicPr>
                   <pic:blipFill>
-                    <a:blip r:embed="rId40" cstate="print">
+                    <a:blip r:embed="rId39" cstate="print">
                       <a:extLst>
                         <a:ext uri="{28A0092B-C50C-407E-A947-70E740481C1C}">
                           <a14:useLocalDpi xmlns:a14="http://schemas.microsoft.com/office/drawing/2010/main" val="0"/>
@@ -6102,7 +6023,6 @@
         <w:rPr>
           <w:lang w:eastAsia="de-DE"/>
         </w:rPr>
-        <w:lastRenderedPageBreak/>
         <w:t>O</w:t>
       </w:r>
       <w:r>
@@ -6205,7 +6125,7 @@
                     </pic:cNvPicPr>
                   </pic:nvPicPr>
                   <pic:blipFill>
-                    <a:blip r:embed="rId41" cstate="print">
+                    <a:blip r:embed="rId40" cstate="print">
                       <a:extLst>
                         <a:ext uri="{28A0092B-C50C-407E-A947-70E740481C1C}">
                           <a14:useLocalDpi xmlns:a14="http://schemas.microsoft.com/office/drawing/2010/main" val="0"/>
@@ -6320,7 +6240,7 @@
                     <pic:cNvPicPr/>
                   </pic:nvPicPr>
                   <pic:blipFill>
-                    <a:blip r:embed="rId42" cstate="print">
+                    <a:blip r:embed="rId41" cstate="print">
                       <a:extLst>
                         <a:ext uri="{28A0092B-C50C-407E-A947-70E740481C1C}">
                           <a14:useLocalDpi xmlns:a14="http://schemas.microsoft.com/office/drawing/2010/main" val="0"/>
@@ -6434,7 +6354,7 @@
                     </pic:cNvPicPr>
                   </pic:nvPicPr>
                   <pic:blipFill>
-                    <a:blip r:embed="rId43">
+                    <a:blip r:embed="rId42">
                       <a:extLst>
                         <a:ext uri="{28A0092B-C50C-407E-A947-70E740481C1C}">
                           <a14:useLocalDpi xmlns:a14="http://schemas.microsoft.com/office/drawing/2010/main" val="0"/>
@@ -6516,7 +6436,7 @@
                     <pic:cNvPicPr/>
                   </pic:nvPicPr>
                   <pic:blipFill>
-                    <a:blip r:embed="rId44"/>
+                    <a:blip r:embed="rId43"/>
                     <a:stretch>
                       <a:fillRect/>
                     </a:stretch>
@@ -6720,7 +6640,7 @@
                     <pic:cNvPicPr/>
                   </pic:nvPicPr>
                   <pic:blipFill>
-                    <a:blip r:embed="rId45"/>
+                    <a:blip r:embed="rId44"/>
                     <a:stretch>
                       <a:fillRect/>
                     </a:stretch>
@@ -6858,7 +6778,7 @@
                     </pic:cNvPicPr>
                   </pic:nvPicPr>
                   <pic:blipFill>
-                    <a:blip r:embed="rId46">
+                    <a:blip r:embed="rId45">
                       <a:extLst>
                         <a:ext uri="{28A0092B-C50C-407E-A947-70E740481C1C}">
                           <a14:useLocalDpi xmlns:a14="http://schemas.microsoft.com/office/drawing/2010/main" val="0"/>
@@ -6932,7 +6852,7 @@
                     </pic:cNvPicPr>
                   </pic:nvPicPr>
                   <pic:blipFill>
-                    <a:blip r:embed="rId47">
+                    <a:blip r:embed="rId46">
                       <a:extLst>
                         <a:ext uri="{28A0092B-C50C-407E-A947-70E740481C1C}">
                           <a14:useLocalDpi xmlns:a14="http://schemas.microsoft.com/office/drawing/2010/main" val="0"/>
@@ -7118,7 +7038,7 @@
                     <pic:cNvPicPr/>
                   </pic:nvPicPr>
                   <pic:blipFill>
-                    <a:blip r:embed="rId48"/>
+                    <a:blip r:embed="rId47"/>
                     <a:stretch>
                       <a:fillRect/>
                     </a:stretch>
@@ -7579,7 +7499,7 @@
                     <pic:cNvPicPr/>
                   </pic:nvPicPr>
                   <pic:blipFill>
-                    <a:blip r:embed="rId49">
+                    <a:blip r:embed="rId48">
                       <a:extLst>
                         <a:ext uri="{28A0092B-C50C-407E-A947-70E740481C1C}">
                           <a14:useLocalDpi xmlns:a14="http://schemas.microsoft.com/office/drawing/2010/main" val="0"/>
@@ -7728,7 +7648,7 @@
                     </pic:cNvPicPr>
                   </pic:nvPicPr>
                   <pic:blipFill>
-                    <a:blip r:embed="rId50" cstate="print">
+                    <a:blip r:embed="rId49" cstate="print">
                       <a:extLst>
                         <a:ext uri="{28A0092B-C50C-407E-A947-70E740481C1C}">
                           <a14:useLocalDpi xmlns:a14="http://schemas.microsoft.com/office/drawing/2010/main" val="0"/>
@@ -7794,7 +7714,7 @@
                     </pic:cNvPicPr>
                   </pic:nvPicPr>
                   <pic:blipFill>
-                    <a:blip r:embed="rId51" cstate="print">
+                    <a:blip r:embed="rId50" cstate="print">
                       <a:extLst>
                         <a:ext uri="{28A0092B-C50C-407E-A947-70E740481C1C}">
                           <a14:useLocalDpi xmlns:a14="http://schemas.microsoft.com/office/drawing/2010/main" val="0"/>
@@ -8423,7 +8343,7 @@
         </w:rPr>
         <w:t xml:space="preserve"> will be available in HAL documentation </w:t>
       </w:r>
-      <w:hyperlink r:id="rId52" w:history="1">
+      <w:hyperlink r:id="rId51" w:history="1">
         <w:r>
           <w:rPr>
             <w:rStyle w:val="Hyperlink"/>
@@ -8525,7 +8445,7 @@
                     <pic:cNvPicPr/>
                   </pic:nvPicPr>
                   <pic:blipFill>
-                    <a:blip r:embed="rId53"/>
+                    <a:blip r:embed="rId52"/>
                     <a:stretch>
                       <a:fillRect/>
                     </a:stretch>
@@ -10227,7 +10147,7 @@
           <w:szCs w:val="18"/>
         </w:rPr>
       </w:pPr>
-      <w:bookmarkStart w:id="30" w:name="_Hlk192779201"/>
+      <w:bookmarkStart w:id="29" w:name="_Hlk192779201"/>
       <w:r>
         <w:rPr>
           <w:rFonts w:ascii="Courier New" w:hAnsi="Courier New" w:cs="Courier New"/>
@@ -10237,7 +10157,7 @@
         <w:t>/* Main loop */</w:t>
       </w:r>
     </w:p>
-    <w:bookmarkEnd w:id="30"/>
+    <w:bookmarkEnd w:id="29"/>
     <w:p>
       <w:pPr>
         <w:autoSpaceDE w:val="0"/>
@@ -14589,7 +14509,7 @@
                     <pic:cNvPicPr/>
                   </pic:nvPicPr>
                   <pic:blipFill>
-                    <a:blip r:embed="rId54">
+                    <a:blip r:embed="rId53">
                       <a:extLst>
                         <a:ext uri="{28A0092B-C50C-407E-A947-70E740481C1C}">
                           <a14:useLocalDpi xmlns:a14="http://schemas.microsoft.com/office/drawing/2010/main" val="0"/>
@@ -14722,7 +14642,7 @@
                     <pic:cNvPicPr/>
                   </pic:nvPicPr>
                   <pic:blipFill>
-                    <a:blip r:embed="rId55">
+                    <a:blip r:embed="rId54">
                       <a:extLst>
                         <a:ext uri="{28A0092B-C50C-407E-A947-70E740481C1C}">
                           <a14:useLocalDpi xmlns:a14="http://schemas.microsoft.com/office/drawing/2010/main" val="0"/>
@@ -14831,7 +14751,7 @@
                     <pic:cNvPicPr/>
                   </pic:nvPicPr>
                   <pic:blipFill>
-                    <a:blip r:embed="rId56"/>
+                    <a:blip r:embed="rId55"/>
                     <a:stretch>
                       <a:fillRect/>
                     </a:stretch>
@@ -14873,7 +14793,7 @@
           <w:lang w:eastAsia="de-DE"/>
         </w:rPr>
       </w:pPr>
-      <w:bookmarkStart w:id="31" w:name="_Toc192780022"/>
+      <w:bookmarkStart w:id="30" w:name="_Toc192780022"/>
       <w:r>
         <w:rPr>
           <w:b/>
@@ -14884,7 +14804,7 @@
         </w:rPr>
         <w:t>Conclusion</w:t>
       </w:r>
-      <w:bookmarkEnd w:id="31"/>
+      <w:bookmarkEnd w:id="30"/>
       <w:r>
         <w:rPr>
           <w:b/>
@@ -14988,7 +14908,7 @@
           <w:lang w:eastAsia="de-DE"/>
         </w:rPr>
       </w:pPr>
-      <w:bookmarkStart w:id="32" w:name="_Toc192780023"/>
+      <w:bookmarkStart w:id="31" w:name="_Toc192780023"/>
       <w:r>
         <w:rPr>
           <w:b/>
@@ -15000,44 +14920,44 @@
         <w:lastRenderedPageBreak/>
         <w:t>Code Example 2: IPC queues using HAL</w:t>
       </w:r>
+      <w:bookmarkEnd w:id="31"/>
+    </w:p>
+    <w:p>
+      <w:pPr>
+        <w:pStyle w:val="Body"/>
+      </w:pPr>
+    </w:p>
+    <w:p>
+      <w:pPr>
+        <w:pStyle w:val="Heading2"/>
+      </w:pPr>
+      <w:r>
+        <w:t xml:space="preserve"> </w:t>
+      </w:r>
+      <w:bookmarkStart w:id="32" w:name="_Toc192780024"/>
+      <w:r>
+        <w:t>Objective</w:t>
+      </w:r>
       <w:bookmarkEnd w:id="32"/>
     </w:p>
     <w:p>
       <w:pPr>
         <w:pStyle w:val="Body"/>
-      </w:pPr>
+        <w:ind w:left="1418"/>
+      </w:pPr>
+      <w:r>
+        <w:t>This code example demonstrates how to use the inter-processor communication (IPC) HAL driver to implement a message queue in PSOC™ Edge MCU. The queues are used to send messages between CPUs.</w:t>
+      </w:r>
     </w:p>
     <w:p>
       <w:pPr>
         <w:pStyle w:val="Heading2"/>
       </w:pPr>
-      <w:r>
-        <w:t xml:space="preserve"> </w:t>
-      </w:r>
-      <w:bookmarkStart w:id="33" w:name="_Toc192780024"/>
-      <w:r>
-        <w:t>Objective</w:t>
+      <w:bookmarkStart w:id="33" w:name="_Toc192780025"/>
+      <w:r>
+        <w:t>Description</w:t>
       </w:r>
       <w:bookmarkEnd w:id="33"/>
-    </w:p>
-    <w:p>
-      <w:pPr>
-        <w:pStyle w:val="Body"/>
-        <w:ind w:left="1418"/>
-      </w:pPr>
-      <w:r>
-        <w:t>This code example demonstrates how to use the inter-processor communication (IPC) HAL driver to implement a message queue in PSOC™ Edge MCU. The queues are used to send messages between CPUs.</w:t>
-      </w:r>
-    </w:p>
-    <w:p>
-      <w:pPr>
-        <w:pStyle w:val="Heading2"/>
-      </w:pPr>
-      <w:bookmarkStart w:id="34" w:name="_Toc192780025"/>
-      <w:r>
-        <w:t>Description</w:t>
-      </w:r>
-      <w:bookmarkEnd w:id="34"/>
     </w:p>
     <w:p>
       <w:pPr>
@@ -15191,7 +15111,7 @@
                     <pic:cNvPicPr/>
                   </pic:nvPicPr>
                   <pic:blipFill>
-                    <a:blip r:embed="rId57"/>
+                    <a:blip r:embed="rId56"/>
                     <a:stretch>
                       <a:fillRect/>
                     </a:stretch>
@@ -15234,11 +15154,11 @@
       <w:pPr>
         <w:pStyle w:val="Heading2"/>
       </w:pPr>
-      <w:bookmarkStart w:id="35" w:name="_Toc192780026"/>
+      <w:bookmarkStart w:id="34" w:name="_Toc192780026"/>
       <w:r>
         <w:t>Flowchart</w:t>
       </w:r>
-      <w:bookmarkEnd w:id="35"/>
+      <w:bookmarkEnd w:id="34"/>
     </w:p>
     <w:p>
       <w:pPr>
@@ -15273,7 +15193,7 @@
                     <pic:cNvPicPr/>
                   </pic:nvPicPr>
                   <pic:blipFill>
-                    <a:blip r:embed="rId58">
+                    <a:blip r:embed="rId57">
                       <a:extLst>
                         <a:ext uri="{28A0092B-C50C-407E-A947-70E740481C1C}">
                           <a14:useLocalDpi xmlns:a14="http://schemas.microsoft.com/office/drawing/2010/main" val="0"/>
@@ -15309,12 +15229,12 @@
       <w:pPr>
         <w:pStyle w:val="Heading2"/>
       </w:pPr>
-      <w:bookmarkStart w:id="36" w:name="_Toc192780027"/>
+      <w:bookmarkStart w:id="35" w:name="_Toc192780027"/>
       <w:r>
         <w:lastRenderedPageBreak/>
         <w:t>Hardware Block Diagram</w:t>
       </w:r>
-      <w:bookmarkEnd w:id="36"/>
+      <w:bookmarkEnd w:id="35"/>
     </w:p>
     <w:p>
       <w:pPr>
@@ -15343,7 +15263,7 @@
                     </pic:cNvPicPr>
                   </pic:nvPicPr>
                   <pic:blipFill>
-                    <a:blip r:embed="rId59">
+                    <a:blip r:embed="rId58">
                       <a:extLst>
                         <a:ext uri="{28A0092B-C50C-407E-A947-70E740481C1C}">
                           <a14:useLocalDpi xmlns:a14="http://schemas.microsoft.com/office/drawing/2010/main" val="0"/>
@@ -15379,11 +15299,11 @@
       <w:pPr>
         <w:pStyle w:val="Heading2"/>
       </w:pPr>
-      <w:bookmarkStart w:id="37" w:name="_Toc192780028"/>
+      <w:bookmarkStart w:id="36" w:name="_Toc192780028"/>
       <w:r>
         <w:t>Hardware Setup</w:t>
       </w:r>
-      <w:bookmarkEnd w:id="37"/>
+      <w:bookmarkEnd w:id="36"/>
     </w:p>
     <w:p>
       <w:pPr>
@@ -15415,7 +15335,7 @@
                     <pic:cNvPicPr/>
                   </pic:nvPicPr>
                   <pic:blipFill>
-                    <a:blip r:embed="rId28"/>
+                    <a:blip r:embed="rId59"/>
                     <a:stretch>
                       <a:fillRect/>
                     </a:stretch>
@@ -15465,12 +15385,12 @@
       <w:pPr>
         <w:pStyle w:val="Heading2"/>
       </w:pPr>
-      <w:bookmarkStart w:id="38" w:name="_Toc192780029"/>
+      <w:bookmarkStart w:id="37" w:name="_Toc192780029"/>
       <w:r>
         <w:lastRenderedPageBreak/>
         <w:t>Project Creation</w:t>
       </w:r>
-      <w:bookmarkEnd w:id="38"/>
+      <w:bookmarkEnd w:id="37"/>
       <w:r>
         <w:t xml:space="preserve"> </w:t>
       </w:r>
@@ -16958,7 +16878,7 @@
           <w:noProof/>
         </w:rPr>
       </w:pPr>
-      <w:bookmarkStart w:id="39" w:name="_Hlk147320247"/>
+      <w:bookmarkStart w:id="38" w:name="_Hlk147320247"/>
       <w:r>
         <w:rPr>
           <w:b w:val="0"/>
@@ -17738,8 +17658,8 @@
           <w:bCs/>
         </w:rPr>
       </w:pPr>
-      <w:bookmarkStart w:id="40" w:name="_Hlk147320439"/>
-      <w:bookmarkEnd w:id="39"/>
+      <w:bookmarkStart w:id="39" w:name="_Hlk147320439"/>
+      <w:bookmarkEnd w:id="38"/>
       <w:r>
         <w:rPr>
           <w:b w:val="0"/>
@@ -18355,11 +18275,11 @@
       <w:r>
         <w:t xml:space="preserve"> </w:t>
       </w:r>
-      <w:bookmarkStart w:id="41" w:name="_Hlk147313194"/>
+      <w:bookmarkStart w:id="40" w:name="_Hlk147313194"/>
       <w:r>
         <w:t xml:space="preserve">&lt;code snippet&gt; </w:t>
       </w:r>
-      <w:bookmarkEnd w:id="41"/>
+      <w:bookmarkEnd w:id="40"/>
       <w:r>
         <w:rPr>
           <w:b w:val="0"/>
@@ -18377,7 +18297,7 @@
         </w:rPr>
         <w:t xml:space="preserve"> file</w:t>
       </w:r>
-      <w:bookmarkEnd w:id="40"/>
+      <w:bookmarkEnd w:id="39"/>
       <w:r>
         <w:rPr>
           <w:b w:val="0"/>
@@ -19673,7 +19593,7 @@
           <w:lang w:val="en-IN"/>
         </w:rPr>
       </w:pPr>
-      <w:bookmarkStart w:id="42" w:name="_Hlk147320910"/>
+      <w:bookmarkStart w:id="41" w:name="_Hlk147320910"/>
       <w:r>
         <w:rPr>
           <w:lang w:val="en-IN"/>
@@ -19681,7 +19601,7 @@
         <w:t>The below code is the variables required for the communication between the cores:</w:t>
       </w:r>
     </w:p>
-    <w:bookmarkEnd w:id="42"/>
+    <w:bookmarkEnd w:id="41"/>
     <w:p>
       <w:pPr>
         <w:autoSpaceDE w:val="0"/>
@@ -33343,7 +33263,7 @@
           <w:lang w:eastAsia="de-DE"/>
         </w:rPr>
       </w:pPr>
-      <w:bookmarkStart w:id="43" w:name="_Toc192780030"/>
+      <w:bookmarkStart w:id="42" w:name="_Toc192780030"/>
       <w:r>
         <w:rPr>
           <w:b/>
@@ -33354,7 +33274,7 @@
         </w:rPr>
         <w:t>Conclusion</w:t>
       </w:r>
-      <w:bookmarkEnd w:id="43"/>
+      <w:bookmarkEnd w:id="42"/>
       <w:r>
         <w:rPr>
           <w:b/>
@@ -33394,12 +33314,12 @@
       <w:pPr>
         <w:pStyle w:val="Heading1"/>
       </w:pPr>
-      <w:bookmarkStart w:id="44" w:name="_Toc192780031"/>
+      <w:bookmarkStart w:id="43" w:name="_Toc192780031"/>
       <w:r>
         <w:lastRenderedPageBreak/>
         <w:t>References</w:t>
       </w:r>
-      <w:bookmarkEnd w:id="44"/>
+      <w:bookmarkEnd w:id="43"/>
       <w:r>
         <w:t xml:space="preserve"> </w:t>
       </w:r>
@@ -34473,7 +34393,7 @@
         <v:shape id="_x0000_s2052" type="#_x0000_t75" style="position:absolute;margin-left:-45.75pt;margin-top:62.5pt;width:602.45pt;height:287.2pt;z-index:-251642880;mso-position-horizontal-relative:text;mso-position-vertical-relative:text">
           <v:imagedata r:id="rId1" o:title=""/>
         </v:shape>
-        <o:OLEObject Type="Embed" ProgID="Visio.Drawing.15" ShapeID="_x0000_s2052" DrawAspect="Content" ObjectID="_1822637955" r:id="rId2"/>
+        <o:OLEObject Type="Embed" ProgID="Visio.Drawing.15" ShapeID="_x0000_s2052" DrawAspect="Content" ObjectID="_1823236564" r:id="rId2"/>
       </w:object>
     </w:r>
     <w:r>
@@ -35806,7 +35726,7 @@
         <v:shape id="_x0000_s2051" type="#_x0000_t75" style="position:absolute;margin-left:-45.75pt;margin-top:62.5pt;width:602.45pt;height:287.2pt;z-index:-251643904;mso-position-horizontal-relative:text;mso-position-vertical-relative:text">
           <v:imagedata r:id="rId1" o:title=""/>
         </v:shape>
-        <o:OLEObject Type="Embed" ProgID="Visio.Drawing.15" ShapeID="_x0000_s2051" DrawAspect="Content" ObjectID="_1822637956" r:id="rId2"/>
+        <o:OLEObject Type="Embed" ProgID="Visio.Drawing.15" ShapeID="_x0000_s2051" DrawAspect="Content" ObjectID="_1823236565" r:id="rId2"/>
       </w:object>
     </w:r>
     <w:r>
@@ -36014,8 +35934,8 @@
                                 <w:r>
                                   <w:t>IMPORTANT NOTICE</w:t>
                                 </w:r>
-                                <w:bookmarkStart w:id="45" w:name="ImportantNotice"/>
-                                <w:bookmarkEnd w:id="45"/>
+                                <w:bookmarkStart w:id="44" w:name="ImportantNotice"/>
+                                <w:bookmarkEnd w:id="44"/>
                               </w:p>
                               <w:p>
                                 <w:pPr>
@@ -36175,7 +36095,11 @@
         </mc:Choice>
         <mc:Fallback>
           <w:pict>
-            <v:shape w14:anchorId="28316247" id="_x0000_s1042" type="#_x0000_t202" style="position:absolute;margin-left:40pt;margin-top:575.65pt;width:511.45pt;height:249pt;z-index:251643904;visibility:visible;mso-wrap-style:square;mso-width-percent:0;mso-height-percent:0;mso-wrap-distance-left:9pt;mso-wrap-distance-top:0;mso-wrap-distance-right:9pt;mso-wrap-distance-bottom:0;mso-position-horizontal:absolute;mso-position-horizontal-relative:page;mso-position-vertical:absolute;mso-position-vertical-relative:page;mso-width-percent:0;mso-height-percent:0;mso-width-relative:page;mso-height-relative:page;v-text-anchor:top" o:gfxdata="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" filled="f" stroked="f" strokeweight="0">
+            <v:shapetype w14:anchorId="28316247" id="_x0000_t202" coordsize="21600,21600" o:spt="202" path="m,l,21600r21600,l21600,xe">
+              <v:stroke joinstyle="miter"/>
+              <v:path gradientshapeok="t" o:connecttype="rect"/>
+            </v:shapetype>
+            <v:shape id="_x0000_s1042" type="#_x0000_t202" style="position:absolute;margin-left:40pt;margin-top:575.65pt;width:511.45pt;height:249pt;z-index:251643904;visibility:visible;mso-wrap-style:square;mso-width-percent:0;mso-height-percent:0;mso-wrap-distance-left:9pt;mso-wrap-distance-top:0;mso-wrap-distance-right:9pt;mso-wrap-distance-bottom:0;mso-position-horizontal:absolute;mso-position-horizontal-relative:page;mso-position-vertical:absolute;mso-position-vertical-relative:page;mso-width-percent:0;mso-height-percent:0;mso-width-relative:page;mso-height-relative:page;v-text-anchor:top" o:gfxdata="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" filled="f" stroked="f" strokeweight="0">
               <v:textbox inset="0,0,0,0">
                 <w:txbxContent>
                   <w:tbl>
@@ -36321,8 +36245,8 @@
                           <w:r>
                             <w:t>IMPORTANT NOTICE</w:t>
                           </w:r>
-                          <w:bookmarkStart w:id="46" w:name="ImportantNotice"/>
-                          <w:bookmarkEnd w:id="46"/>
+                          <w:bookmarkStart w:id="45" w:name="ImportantNotice"/>
+                          <w:bookmarkEnd w:id="45"/>
                         </w:p>
                         <w:p>
                           <w:pPr>
@@ -44393,6 +44317,7 @@
   <w:style w:type="character" w:default="1" w:styleId="DefaultParagraphFont">
     <w:name w:val="Default Paragraph Font"/>
     <w:uiPriority w:val="1"/>
+    <w:semiHidden/>
     <w:unhideWhenUsed/>
   </w:style>
   <w:style w:type="table" w:default="1" w:styleId="TableNormal">
@@ -46715,21 +46640,6 @@
 </file>
 
 <file path=customXml/item1.xml><?xml version="1.0" encoding="utf-8"?>
-<?mso-contentType ?>
-<FormTemplates xmlns="http://schemas.microsoft.com/sharepoint/v3/contenttype/forms">
-  <Display>DocumentLibraryForm</Display>
-  <Edit>DocumentLibraryForm</Edit>
-  <New>DocumentLibraryForm</New>
-</FormTemplates>
-</file>
-
-<file path=customXml/item2.xml><?xml version="1.0" encoding="utf-8"?>
-<p:properties xmlns:p="http://schemas.microsoft.com/office/2006/metadata/properties" xmlns:xsi="http://www.w3.org/2001/XMLSchema-instance" xmlns:pc="http://schemas.microsoft.com/office/infopath/2007/PartnerControls">
-  <documentManagement/>
-</p:properties>
-</file>
-
-<file path=customXml/item3.xml><?xml version="1.0" encoding="utf-8"?>
 <ct:contentTypeSchema xmlns:ct="http://schemas.microsoft.com/office/2006/metadata/contentType" xmlns:ma="http://schemas.microsoft.com/office/2006/metadata/properties/metaAttributes" ct:_="" ma:_="" ma:contentTypeName="Document" ma:contentTypeID="0x01010030347378EA1C7B40B791B4A9FAEBC72E" ma:contentTypeVersion="1" ma:contentTypeDescription="Create a new document." ma:contentTypeScope="" ma:versionID="dac419b5e4b08ef6434e405bf3dae512">
   <xsd:schema xmlns:xsd="http://www.w3.org/2001/XMLSchema" xmlns:xs="http://www.w3.org/2001/XMLSchema" xmlns:p="http://schemas.microsoft.com/office/2006/metadata/properties" xmlns:ns2="0ff2502a-f5fc-4900-8b9d-01d591984867" targetNamespace="http://schemas.microsoft.com/office/2006/metadata/properties" ma:root="true" ma:fieldsID="8df1d2d8bf6da93316c8b7386a9c82fd" ns2:_="">
     <xsd:import namespace="0ff2502a-f5fc-4900-8b9d-01d591984867"/>
@@ -46869,28 +46779,26 @@
 </ct:contentTypeSchema>
 </file>
 
+<file path=customXml/item2.xml><?xml version="1.0" encoding="utf-8"?>
+<?mso-contentType ?>
+<FormTemplates xmlns="http://schemas.microsoft.com/sharepoint/v3/contenttype/forms">
+  <Display>DocumentLibraryForm</Display>
+  <Edit>DocumentLibraryForm</Edit>
+  <New>DocumentLibraryForm</New>
+</FormTemplates>
+</file>
+
+<file path=customXml/item3.xml><?xml version="1.0" encoding="utf-8"?>
+<p:properties xmlns:p="http://schemas.microsoft.com/office/2006/metadata/properties" xmlns:xsi="http://www.w3.org/2001/XMLSchema-instance" xmlns:pc="http://schemas.microsoft.com/office/infopath/2007/PartnerControls">
+  <documentManagement/>
+</p:properties>
+</file>
+
 <file path=customXml/item4.xml><?xml version="1.0" encoding="utf-8"?>
 <b:Sources xmlns:b="http://schemas.openxmlformats.org/officeDocument/2006/bibliography" xmlns="http://schemas.openxmlformats.org/officeDocument/2006/bibliography" SelectedStyle="\APA.XSL" StyleName="APA"/>
 </file>
 
 <file path=customXml/itemProps1.xml><?xml version="1.0" encoding="utf-8"?>
-<ds:datastoreItem xmlns:ds="http://schemas.openxmlformats.org/officeDocument/2006/customXml" ds:itemID="{A6A899CE-B708-4D9D-B4A9-81256E8EE869}">
-  <ds:schemaRefs>
-    <ds:schemaRef ds:uri="http://schemas.microsoft.com/sharepoint/v3/contenttype/forms"/>
-  </ds:schemaRefs>
-</ds:datastoreItem>
-</file>
-
-<file path=customXml/itemProps2.xml><?xml version="1.0" encoding="utf-8"?>
-<ds:datastoreItem xmlns:ds="http://schemas.openxmlformats.org/officeDocument/2006/customXml" ds:itemID="{2D743F90-B02F-45D5-9835-EA3B57C055FC}">
-  <ds:schemaRefs>
-    <ds:schemaRef ds:uri="http://schemas.microsoft.com/office/2006/metadata/properties"/>
-    <ds:schemaRef ds:uri="http://schemas.microsoft.com/office/infopath/2007/PartnerControls"/>
-  </ds:schemaRefs>
-</ds:datastoreItem>
-</file>
-
-<file path=customXml/itemProps3.xml><?xml version="1.0" encoding="utf-8"?>
 <ds:datastoreItem xmlns:ds="http://schemas.openxmlformats.org/officeDocument/2006/customXml" ds:itemID="{348D6D5F-AF49-4DAF-BEBA-00EA06977ED2}">
   <ds:schemaRefs>
     <ds:schemaRef ds:uri="http://schemas.microsoft.com/office/2006/metadata/contentType"/>
@@ -46908,8 +46816,25 @@
 </ds:datastoreItem>
 </file>
 
+<file path=customXml/itemProps2.xml><?xml version="1.0" encoding="utf-8"?>
+<ds:datastoreItem xmlns:ds="http://schemas.openxmlformats.org/officeDocument/2006/customXml" ds:itemID="{A6A899CE-B708-4D9D-B4A9-81256E8EE869}">
+  <ds:schemaRefs>
+    <ds:schemaRef ds:uri="http://schemas.microsoft.com/sharepoint/v3/contenttype/forms"/>
+  </ds:schemaRefs>
+</ds:datastoreItem>
+</file>
+
+<file path=customXml/itemProps3.xml><?xml version="1.0" encoding="utf-8"?>
+<ds:datastoreItem xmlns:ds="http://schemas.openxmlformats.org/officeDocument/2006/customXml" ds:itemID="{2D743F90-B02F-45D5-9835-EA3B57C055FC}">
+  <ds:schemaRefs>
+    <ds:schemaRef ds:uri="http://schemas.microsoft.com/office/2006/metadata/properties"/>
+    <ds:schemaRef ds:uri="http://schemas.microsoft.com/office/infopath/2007/PartnerControls"/>
+  </ds:schemaRefs>
+</ds:datastoreItem>
+</file>
+
 <file path=customXml/itemProps4.xml><?xml version="1.0" encoding="utf-8"?>
-<ds:datastoreItem xmlns:ds="http://schemas.openxmlformats.org/officeDocument/2006/customXml" ds:itemID="{68E3C0D5-0E17-4925-B491-9845781FBA47}">
+<ds:datastoreItem xmlns:ds="http://schemas.openxmlformats.org/officeDocument/2006/customXml" ds:itemID="{213910B2-EB22-4A82-BB00-AADD2567B137}">
   <ds:schemaRefs>
     <ds:schemaRef ds:uri="http://schemas.openxmlformats.org/officeDocument/2006/bibliography"/>
   </ds:schemaRefs>

</xml_diff>

<commit_message>
udpating mtb workspace selection image
</commit_message>
<xml_diff>
--- a/.internal/Manual/Intro to PSOC Edge E84 - Part 2 (E2)/PSoC Edge E84 Introductory E2 Training Manual -WIP_10_21_2025.docx
+++ b/.internal/Manual/Intro to PSOC Edge E84 - Part 2 (E2)/PSoC Edge E84 Introductory E2 Training Manual -WIP_10_21_2025.docx
@@ -3509,7 +3509,7 @@
           <v:shape id="_x0000_i1025" type="#_x0000_t75" style="width:475.7pt;height:588.05pt" o:ole="">
             <v:imagedata r:id="rId23" o:title=""/>
           </v:shape>
-          <o:OLEObject Type="Embed" ProgID="Visio.Drawing.15" ShapeID="_x0000_i1025" DrawAspect="Content" ObjectID="_1823236562" r:id="rId24"/>
+          <o:OLEObject Type="Embed" ProgID="Visio.Drawing.15" ShapeID="_x0000_i1025" DrawAspect="Content" ObjectID="_1823238766" r:id="rId24"/>
         </w:object>
       </w:r>
     </w:p>
@@ -3558,7 +3558,7 @@
           <v:shape id="_x0000_i1026" type="#_x0000_t75" style="width:116.95pt;height:114.05pt" o:ole="">
             <v:imagedata r:id="rId25" o:title=""/>
           </v:shape>
-          <o:OLEObject Type="Embed" ProgID="Visio.Drawing.15" ShapeID="_x0000_i1026" DrawAspect="Content" ObjectID="_1823236563" r:id="rId26"/>
+          <o:OLEObject Type="Embed" ProgID="Visio.Drawing.15" ShapeID="_x0000_i1026" DrawAspect="Content" ObjectID="_1823238767" r:id="rId26"/>
         </w:object>
       </w:r>
     </w:p>
@@ -3589,8 +3589,6 @@
         </w:rPr>
         <w:t xml:space="preserve"> and Setup</w:t>
       </w:r>
-      <w:bookmarkStart w:id="26" w:name="_GoBack"/>
-      <w:bookmarkEnd w:id="26"/>
     </w:p>
     <w:p>
       <w:pPr>
@@ -3756,9 +3754,9 @@
       <w:pPr>
         <w:pStyle w:val="Body"/>
       </w:pPr>
-      <w:bookmarkStart w:id="27" w:name="_Hlk190961414"/>
-    </w:p>
-    <w:bookmarkEnd w:id="27"/>
+      <w:bookmarkStart w:id="26" w:name="_Hlk190961414"/>
+    </w:p>
+    <w:bookmarkEnd w:id="26"/>
     <w:p>
       <w:pPr>
         <w:pStyle w:val="Body"/>
@@ -3785,7 +3783,7 @@
           <w:lang w:eastAsia="de-DE"/>
         </w:rPr>
       </w:pPr>
-      <w:bookmarkStart w:id="28" w:name="_Toc192780021"/>
+      <w:bookmarkStart w:id="27" w:name="_Toc192780021"/>
       <w:r>
         <w:rPr>
           <w:b/>
@@ -3796,7 +3794,7 @@
         </w:rPr>
         <w:t>Project Creation</w:t>
       </w:r>
-      <w:bookmarkEnd w:id="28"/>
+      <w:bookmarkEnd w:id="27"/>
       <w:r>
         <w:rPr>
           <w:b/>
@@ -3992,14 +3990,15 @@
         <w:ind w:left="709"/>
         <w:jc w:val="center"/>
       </w:pPr>
+      <w:bookmarkStart w:id="28" w:name="_GoBack"/>
       <w:r>
         <w:rPr>
           <w:noProof/>
         </w:rPr>
         <w:drawing>
-          <wp:inline distT="0" distB="0" distL="0" distR="0" wp14:anchorId="2279E888" wp14:editId="72B710A9">
-            <wp:extent cx="3588888" cy="1620438"/>
-            <wp:effectExtent l="0" t="0" r="0" b="0"/>
+          <wp:inline distT="0" distB="0" distL="0" distR="0" wp14:anchorId="2279E888" wp14:editId="57B80E08">
+            <wp:extent cx="3649677" cy="1515168"/>
+            <wp:effectExtent l="0" t="0" r="8255" b="8890"/>
             <wp:docPr id="30" name="Picture 30"/>
             <wp:cNvGraphicFramePr>
               <a:graphicFrameLocks xmlns:a="http://schemas.openxmlformats.org/drawingml/2006/main" noChangeAspect="1"/>
@@ -4028,7 +4027,7 @@
                   <pic:spPr bwMode="auto">
                     <a:xfrm>
                       <a:off x="0" y="0"/>
-                      <a:ext cx="3649677" cy="1647885"/>
+                      <a:ext cx="3649677" cy="1515168"/>
                     </a:xfrm>
                     <a:prstGeom prst="rect">
                       <a:avLst/>
@@ -4044,6 +4043,7 @@
           </wp:inline>
         </w:drawing>
       </w:r>
+      <w:bookmarkEnd w:id="28"/>
     </w:p>
     <w:p>
       <w:pPr>
@@ -34393,7 +34393,7 @@
         <v:shape id="_x0000_s2052" type="#_x0000_t75" style="position:absolute;margin-left:-45.75pt;margin-top:62.5pt;width:602.45pt;height:287.2pt;z-index:-251642880;mso-position-horizontal-relative:text;mso-position-vertical-relative:text">
           <v:imagedata r:id="rId1" o:title=""/>
         </v:shape>
-        <o:OLEObject Type="Embed" ProgID="Visio.Drawing.15" ShapeID="_x0000_s2052" DrawAspect="Content" ObjectID="_1823236564" r:id="rId2"/>
+        <o:OLEObject Type="Embed" ProgID="Visio.Drawing.15" ShapeID="_x0000_s2052" DrawAspect="Content" ObjectID="_1823238768" r:id="rId2"/>
       </w:object>
     </w:r>
     <w:r>
@@ -35726,7 +35726,7 @@
         <v:shape id="_x0000_s2051" type="#_x0000_t75" style="position:absolute;margin-left:-45.75pt;margin-top:62.5pt;width:602.45pt;height:287.2pt;z-index:-251643904;mso-position-horizontal-relative:text;mso-position-vertical-relative:text">
           <v:imagedata r:id="rId1" o:title=""/>
         </v:shape>
-        <o:OLEObject Type="Embed" ProgID="Visio.Drawing.15" ShapeID="_x0000_s2051" DrawAspect="Content" ObjectID="_1823236565" r:id="rId2"/>
+        <o:OLEObject Type="Embed" ProgID="Visio.Drawing.15" ShapeID="_x0000_s2051" DrawAspect="Content" ObjectID="_1823238769" r:id="rId2"/>
       </w:object>
     </w:r>
     <w:r>
@@ -46834,7 +46834,7 @@
 </file>
 
 <file path=customXml/itemProps4.xml><?xml version="1.0" encoding="utf-8"?>
-<ds:datastoreItem xmlns:ds="http://schemas.openxmlformats.org/officeDocument/2006/customXml" ds:itemID="{213910B2-EB22-4A82-BB00-AADD2567B137}">
+<ds:datastoreItem xmlns:ds="http://schemas.openxmlformats.org/officeDocument/2006/customXml" ds:itemID="{0C3C3185-DEB6-4EA7-9C2F-B37C07AD1D19}">
   <ds:schemaRefs>
     <ds:schemaRef ds:uri="http://schemas.openxmlformats.org/officeDocument/2006/bibliography"/>
   </ds:schemaRefs>

</xml_diff>

<commit_message>
Updating lab manual and images for library manager changes for empty application hello world
</commit_message>
<xml_diff>
--- a/.internal/Manual/Intro to PSOC Edge E84 - Part 2 (E2)/PSoC Edge E84 Introductory E2 Training Manual -WIP_10_21_2025.docx
+++ b/.internal/Manual/Intro to PSOC Edge E84 - Part 2 (E2)/PSoC Edge E84 Introductory E2 Training Manual -WIP_10_21_2025.docx
@@ -3509,7 +3509,7 @@
           <v:shape id="_x0000_i1025" type="#_x0000_t75" style="width:475.7pt;height:588.05pt" o:ole="">
             <v:imagedata r:id="rId23" o:title=""/>
           </v:shape>
-          <o:OLEObject Type="Embed" ProgID="Visio.Drawing.15" ShapeID="_x0000_i1025" DrawAspect="Content" ObjectID="_1823238766" r:id="rId24"/>
+          <o:OLEObject Type="Embed" ProgID="Visio.Drawing.15" ShapeID="_x0000_i1025" DrawAspect="Content" ObjectID="_1823335872" r:id="rId24"/>
         </w:object>
       </w:r>
     </w:p>
@@ -3558,7 +3558,7 @@
           <v:shape id="_x0000_i1026" type="#_x0000_t75" style="width:116.95pt;height:114.05pt" o:ole="">
             <v:imagedata r:id="rId25" o:title=""/>
           </v:shape>
-          <o:OLEObject Type="Embed" ProgID="Visio.Drawing.15" ShapeID="_x0000_i1026" DrawAspect="Content" ObjectID="_1823238767" r:id="rId26"/>
+          <o:OLEObject Type="Embed" ProgID="Visio.Drawing.15" ShapeID="_x0000_i1026" DrawAspect="Content" ObjectID="_1823335873" r:id="rId26"/>
         </w:object>
       </w:r>
     </w:p>
@@ -3990,7 +3990,6 @@
         <w:ind w:left="709"/>
         <w:jc w:val="center"/>
       </w:pPr>
-      <w:bookmarkStart w:id="28" w:name="_GoBack"/>
       <w:r>
         <w:rPr>
           <w:noProof/>
@@ -4043,7 +4042,6 @@
           </wp:inline>
         </w:drawing>
       </w:r>
-      <w:bookmarkEnd w:id="28"/>
     </w:p>
     <w:p>
       <w:pPr>
@@ -4127,8 +4125,8 @@
         </w:rPr>
         <w:lastRenderedPageBreak/>
         <w:drawing>
-          <wp:inline distT="0" distB="0" distL="0" distR="0" wp14:anchorId="0AC2496A" wp14:editId="12F4DF5A">
-            <wp:extent cx="4898924" cy="2599569"/>
+          <wp:inline distT="0" distB="0" distL="0" distR="0" wp14:anchorId="0AC2496A" wp14:editId="5AC8BEA6">
+            <wp:extent cx="4939507" cy="2381435"/>
             <wp:effectExtent l="0" t="0" r="0" b="0"/>
             <wp:docPr id="29" name="Picture 29"/>
             <wp:cNvGraphicFramePr>
@@ -4156,7 +4154,7 @@
                   <pic:spPr>
                     <a:xfrm>
                       <a:off x="0" y="0"/>
-                      <a:ext cx="4939507" cy="2621104"/>
+                      <a:ext cx="4939507" cy="2381435"/>
                     </a:xfrm>
                     <a:prstGeom prst="rect">
                       <a:avLst/>
@@ -4277,9 +4275,9 @@
           <w:lang w:eastAsia="de-DE"/>
         </w:rPr>
         <w:drawing>
-          <wp:inline distT="0" distB="0" distL="0" distR="0" wp14:anchorId="0A9C18D0" wp14:editId="092B2B53">
-            <wp:extent cx="4027589" cy="2923060"/>
-            <wp:effectExtent l="0" t="0" r="0" b="0"/>
+          <wp:inline distT="0" distB="0" distL="0" distR="0" wp14:anchorId="0A9C18D0" wp14:editId="296A48E4">
+            <wp:extent cx="3594174" cy="2987881"/>
+            <wp:effectExtent l="0" t="0" r="6350" b="3175"/>
             <wp:docPr id="28" name="Picture 28"/>
             <wp:cNvGraphicFramePr>
               <a:graphicFrameLocks xmlns:a="http://schemas.openxmlformats.org/drawingml/2006/main" noChangeAspect="1"/>
@@ -4308,7 +4306,7 @@
                   <pic:spPr bwMode="auto">
                     <a:xfrm>
                       <a:off x="0" y="0"/>
-                      <a:ext cx="4062496" cy="2948394"/>
+                      <a:ext cx="3606505" cy="2998132"/>
                     </a:xfrm>
                     <a:prstGeom prst="rect">
                       <a:avLst/>
@@ -4748,9 +4746,9 @@
           <w:lang w:eastAsia="de-DE"/>
         </w:rPr>
         <w:drawing>
-          <wp:inline distT="0" distB="0" distL="0" distR="0" wp14:anchorId="4883777D" wp14:editId="5F682A60">
-            <wp:extent cx="4507110" cy="2472728"/>
-            <wp:effectExtent l="19050" t="19050" r="27305" b="22860"/>
+          <wp:inline distT="0" distB="0" distL="0" distR="0" wp14:anchorId="4883777D" wp14:editId="585E2402">
+            <wp:extent cx="4572070" cy="2508368"/>
+            <wp:effectExtent l="19050" t="19050" r="19050" b="25400"/>
             <wp:docPr id="55" name="Picture 55"/>
             <wp:cNvGraphicFramePr>
               <a:graphicFrameLocks xmlns:a="http://schemas.openxmlformats.org/drawingml/2006/main" noChangeAspect="1"/>
@@ -4779,7 +4777,7 @@
                   <pic:spPr bwMode="auto">
                     <a:xfrm>
                       <a:off x="0" y="0"/>
-                      <a:ext cx="4572071" cy="2508368"/>
+                      <a:ext cx="4572070" cy="2508368"/>
                     </a:xfrm>
                     <a:prstGeom prst="rect">
                       <a:avLst/>
@@ -4950,11 +4948,25 @@
         </w:numPr>
         <w:spacing w:before="160" w:after="160"/>
       </w:pPr>
-      <w:r>
-        <w:rPr>
-          <w:lang w:eastAsia="de-DE"/>
-        </w:rPr>
-        <w:t>If you expand the main project folder, you can see that there are multiple sub-folders within it.</w:t>
+      <w:proofErr w:type="spellStart"/>
+      <w:r>
+        <w:rPr>
+          <w:lang w:eastAsia="de-DE"/>
+        </w:rPr>
+        <w:t>Expaning</w:t>
+      </w:r>
+      <w:proofErr w:type="spellEnd"/>
+      <w:r>
+        <w:rPr>
+          <w:lang w:eastAsia="de-DE"/>
+        </w:rPr>
+        <w:t xml:space="preserve"> </w:t>
+      </w:r>
+      <w:r>
+        <w:rPr>
+          <w:lang w:eastAsia="de-DE"/>
+        </w:rPr>
+        <w:t>the main project folder, you can see that there are multiple sub-folders within it.</w:t>
       </w:r>
     </w:p>
     <w:p>
@@ -5035,10 +5047,13 @@
       <w:pPr>
         <w:pStyle w:val="ListParagraph"/>
         <w:spacing w:before="160" w:after="160"/>
-        <w:ind w:left="2127" w:hanging="349"/>
-      </w:pPr>
-      <w:r>
-        <w:t xml:space="preserve">If you explore the folders, you will see the FreeRTOS libraries have been imported into the project. But, since we are making a basic hello world </w:t>
+        <w:ind w:left="1767"/>
+      </w:pPr>
+      <w:r>
+        <w:t>Exploring</w:t>
+      </w:r>
+      <w:r>
+        <w:t xml:space="preserve"> the folders, you will see the FreeRTOS libraries have been imported into the project. But, since we are making a basic hello world </w:t>
       </w:r>
       <w:proofErr w:type="spellStart"/>
       <w:r>
@@ -5544,9 +5559,9 @@
           <w:lang w:eastAsia="de-DE"/>
         </w:rPr>
         <w:drawing>
-          <wp:inline distT="0" distB="0" distL="0" distR="0" wp14:anchorId="415CBEB9" wp14:editId="4F5A44FD">
-            <wp:extent cx="4792815" cy="3736875"/>
-            <wp:effectExtent l="19050" t="19050" r="27305" b="16510"/>
+          <wp:inline distT="0" distB="0" distL="0" distR="0" wp14:anchorId="415CBEB9" wp14:editId="61F704C6">
+            <wp:extent cx="4902397" cy="3822318"/>
+            <wp:effectExtent l="19050" t="19050" r="12700" b="26035"/>
             <wp:docPr id="31" name="Picture 31"/>
             <wp:cNvGraphicFramePr>
               <a:graphicFrameLocks xmlns:a="http://schemas.openxmlformats.org/drawingml/2006/main" noChangeAspect="1"/>
@@ -5575,7 +5590,7 @@
                   <pic:spPr bwMode="auto">
                     <a:xfrm>
                       <a:off x="0" y="0"/>
-                      <a:ext cx="4902402" cy="3822318"/>
+                      <a:ext cx="4902397" cy="3822318"/>
                     </a:xfrm>
                     <a:prstGeom prst="rect">
                       <a:avLst/>
@@ -5731,9 +5746,9 @@
           <w:lang w:eastAsia="de-DE"/>
         </w:rPr>
         <w:drawing>
-          <wp:inline distT="0" distB="0" distL="0" distR="0" wp14:anchorId="3DC2931F" wp14:editId="6C92DD55">
-            <wp:extent cx="4908524" cy="3234260"/>
-            <wp:effectExtent l="19050" t="19050" r="26035" b="23495"/>
+          <wp:inline distT="0" distB="0" distL="0" distR="0" wp14:anchorId="3DC2931F" wp14:editId="79687BA0">
+            <wp:extent cx="4900995" cy="3234260"/>
+            <wp:effectExtent l="19050" t="19050" r="13970" b="23495"/>
             <wp:docPr id="69" name="Picture 69"/>
             <wp:cNvGraphicFramePr>
               <a:graphicFrameLocks xmlns:a="http://schemas.openxmlformats.org/drawingml/2006/main" noChangeAspect="1"/>
@@ -5762,7 +5777,7 @@
                   <pic:spPr bwMode="auto">
                     <a:xfrm>
                       <a:off x="0" y="0"/>
-                      <a:ext cx="4908524" cy="3234260"/>
+                      <a:ext cx="4900995" cy="3234260"/>
                     </a:xfrm>
                     <a:prstGeom prst="rect">
                       <a:avLst/>
@@ -5841,15 +5856,16 @@
           <w:lang w:eastAsia="de-DE"/>
         </w:rPr>
       </w:pPr>
+      <w:bookmarkStart w:id="28" w:name="_GoBack"/>
       <w:r>
         <w:rPr>
           <w:noProof/>
           <w:lang w:eastAsia="de-DE"/>
         </w:rPr>
         <w:drawing>
-          <wp:inline distT="0" distB="0" distL="0" distR="0" wp14:anchorId="483B4E71" wp14:editId="39F10246">
-            <wp:extent cx="3934618" cy="3447113"/>
-            <wp:effectExtent l="19050" t="19050" r="27940" b="20320"/>
+          <wp:inline distT="0" distB="0" distL="0" distR="0" wp14:anchorId="483B4E71" wp14:editId="572455D5">
+            <wp:extent cx="5063556" cy="3947970"/>
+            <wp:effectExtent l="19050" t="19050" r="22860" b="14605"/>
             <wp:docPr id="70" name="Picture 70"/>
             <wp:cNvGraphicFramePr>
               <a:graphicFrameLocks xmlns:a="http://schemas.openxmlformats.org/drawingml/2006/main" noChangeAspect="1"/>
@@ -5878,7 +5894,7 @@
                   <pic:spPr bwMode="auto">
                     <a:xfrm>
                       <a:off x="0" y="0"/>
-                      <a:ext cx="3934618" cy="3447113"/>
+                      <a:ext cx="5104256" cy="3979703"/>
                     </a:xfrm>
                     <a:prstGeom prst="rect">
                       <a:avLst/>
@@ -5896,6 +5912,7 @@
           </wp:inline>
         </w:drawing>
       </w:r>
+      <w:bookmarkEnd w:id="28"/>
     </w:p>
     <w:p>
       <w:pPr>
@@ -5973,6 +5990,7 @@
         <w:rPr>
           <w:lang w:eastAsia="de-DE"/>
         </w:rPr>
+        <w:lastRenderedPageBreak/>
         <w:t xml:space="preserve">Now </w:t>
       </w:r>
       <w:r>
@@ -34393,7 +34411,7 @@
         <v:shape id="_x0000_s2052" type="#_x0000_t75" style="position:absolute;margin-left:-45.75pt;margin-top:62.5pt;width:602.45pt;height:287.2pt;z-index:-251642880;mso-position-horizontal-relative:text;mso-position-vertical-relative:text">
           <v:imagedata r:id="rId1" o:title=""/>
         </v:shape>
-        <o:OLEObject Type="Embed" ProgID="Visio.Drawing.15" ShapeID="_x0000_s2052" DrawAspect="Content" ObjectID="_1823238768" r:id="rId2"/>
+        <o:OLEObject Type="Embed" ProgID="Visio.Drawing.15" ShapeID="_x0000_s2052" DrawAspect="Content" ObjectID="_1823335874" r:id="rId2"/>
       </w:object>
     </w:r>
     <w:r>
@@ -35726,7 +35744,7 @@
         <v:shape id="_x0000_s2051" type="#_x0000_t75" style="position:absolute;margin-left:-45.75pt;margin-top:62.5pt;width:602.45pt;height:287.2pt;z-index:-251643904;mso-position-horizontal-relative:text;mso-position-vertical-relative:text">
           <v:imagedata r:id="rId1" o:title=""/>
         </v:shape>
-        <o:OLEObject Type="Embed" ProgID="Visio.Drawing.15" ShapeID="_x0000_s2051" DrawAspect="Content" ObjectID="_1823238769" r:id="rId2"/>
+        <o:OLEObject Type="Embed" ProgID="Visio.Drawing.15" ShapeID="_x0000_s2051" DrawAspect="Content" ObjectID="_1823335875" r:id="rId2"/>
       </w:object>
     </w:r>
     <w:r>
@@ -36095,11 +36113,7 @@
         </mc:Choice>
         <mc:Fallback>
           <w:pict>
-            <v:shapetype w14:anchorId="28316247" id="_x0000_t202" coordsize="21600,21600" o:spt="202" path="m,l,21600r21600,l21600,xe">
-              <v:stroke joinstyle="miter"/>
-              <v:path gradientshapeok="t" o:connecttype="rect"/>
-            </v:shapetype>
-            <v:shape id="_x0000_s1042" type="#_x0000_t202" style="position:absolute;margin-left:40pt;margin-top:575.65pt;width:511.45pt;height:249pt;z-index:251643904;visibility:visible;mso-wrap-style:square;mso-width-percent:0;mso-height-percent:0;mso-wrap-distance-left:9pt;mso-wrap-distance-top:0;mso-wrap-distance-right:9pt;mso-wrap-distance-bottom:0;mso-position-horizontal:absolute;mso-position-horizontal-relative:page;mso-position-vertical:absolute;mso-position-vertical-relative:page;mso-width-percent:0;mso-height-percent:0;mso-width-relative:page;mso-height-relative:page;v-text-anchor:top" o:gfxdata="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" filled="f" stroked="f" strokeweight="0">
+            <v:shape w14:anchorId="28316247" id="_x0000_s1042" type="#_x0000_t202" style="position:absolute;margin-left:40pt;margin-top:575.65pt;width:511.45pt;height:249pt;z-index:251643904;visibility:visible;mso-wrap-style:square;mso-width-percent:0;mso-height-percent:0;mso-wrap-distance-left:9pt;mso-wrap-distance-top:0;mso-wrap-distance-right:9pt;mso-wrap-distance-bottom:0;mso-position-horizontal:absolute;mso-position-horizontal-relative:page;mso-position-vertical:absolute;mso-position-vertical-relative:page;mso-width-percent:0;mso-height-percent:0;mso-width-relative:page;mso-height-relative:page;v-text-anchor:top" o:gfxdata="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" filled="f" stroked="f" strokeweight="0">
               <v:textbox inset="0,0,0,0">
                 <w:txbxContent>
                   <w:tbl>
@@ -46640,6 +46654,12 @@
 </file>
 
 <file path=customXml/item1.xml><?xml version="1.0" encoding="utf-8"?>
+<p:properties xmlns:p="http://schemas.microsoft.com/office/2006/metadata/properties" xmlns:xsi="http://www.w3.org/2001/XMLSchema-instance" xmlns:pc="http://schemas.microsoft.com/office/infopath/2007/PartnerControls">
+  <documentManagement/>
+</p:properties>
+</file>
+
+<file path=customXml/item2.xml><?xml version="1.0" encoding="utf-8"?>
 <ct:contentTypeSchema xmlns:ct="http://schemas.microsoft.com/office/2006/metadata/contentType" xmlns:ma="http://schemas.microsoft.com/office/2006/metadata/properties/metaAttributes" ct:_="" ma:_="" ma:contentTypeName="Document" ma:contentTypeID="0x01010030347378EA1C7B40B791B4A9FAEBC72E" ma:contentTypeVersion="1" ma:contentTypeDescription="Create a new document." ma:contentTypeScope="" ma:versionID="dac419b5e4b08ef6434e405bf3dae512">
   <xsd:schema xmlns:xsd="http://www.w3.org/2001/XMLSchema" xmlns:xs="http://www.w3.org/2001/XMLSchema" xmlns:p="http://schemas.microsoft.com/office/2006/metadata/properties" xmlns:ns2="0ff2502a-f5fc-4900-8b9d-01d591984867" targetNamespace="http://schemas.microsoft.com/office/2006/metadata/properties" ma:root="true" ma:fieldsID="8df1d2d8bf6da93316c8b7386a9c82fd" ns2:_="">
     <xsd:import namespace="0ff2502a-f5fc-4900-8b9d-01d591984867"/>
@@ -46779,7 +46799,7 @@
 </ct:contentTypeSchema>
 </file>
 
-<file path=customXml/item2.xml><?xml version="1.0" encoding="utf-8"?>
+<file path=customXml/item3.xml><?xml version="1.0" encoding="utf-8"?>
 <?mso-contentType ?>
 <FormTemplates xmlns="http://schemas.microsoft.com/sharepoint/v3/contenttype/forms">
   <Display>DocumentLibraryForm</Display>
@@ -46788,17 +46808,20 @@
 </FormTemplates>
 </file>
 
-<file path=customXml/item3.xml><?xml version="1.0" encoding="utf-8"?>
-<p:properties xmlns:p="http://schemas.microsoft.com/office/2006/metadata/properties" xmlns:xsi="http://www.w3.org/2001/XMLSchema-instance" xmlns:pc="http://schemas.microsoft.com/office/infopath/2007/PartnerControls">
-  <documentManagement/>
-</p:properties>
-</file>
-
 <file path=customXml/item4.xml><?xml version="1.0" encoding="utf-8"?>
 <b:Sources xmlns:b="http://schemas.openxmlformats.org/officeDocument/2006/bibliography" xmlns="http://schemas.openxmlformats.org/officeDocument/2006/bibliography" SelectedStyle="\APA.XSL" StyleName="APA"/>
 </file>
 
 <file path=customXml/itemProps1.xml><?xml version="1.0" encoding="utf-8"?>
+<ds:datastoreItem xmlns:ds="http://schemas.openxmlformats.org/officeDocument/2006/customXml" ds:itemID="{2D743F90-B02F-45D5-9835-EA3B57C055FC}">
+  <ds:schemaRefs>
+    <ds:schemaRef ds:uri="http://schemas.microsoft.com/office/2006/metadata/properties"/>
+    <ds:schemaRef ds:uri="http://schemas.microsoft.com/office/infopath/2007/PartnerControls"/>
+  </ds:schemaRefs>
+</ds:datastoreItem>
+</file>
+
+<file path=customXml/itemProps2.xml><?xml version="1.0" encoding="utf-8"?>
 <ds:datastoreItem xmlns:ds="http://schemas.openxmlformats.org/officeDocument/2006/customXml" ds:itemID="{348D6D5F-AF49-4DAF-BEBA-00EA06977ED2}">
   <ds:schemaRefs>
     <ds:schemaRef ds:uri="http://schemas.microsoft.com/office/2006/metadata/contentType"/>
@@ -46816,7 +46839,7 @@
 </ds:datastoreItem>
 </file>
 
-<file path=customXml/itemProps2.xml><?xml version="1.0" encoding="utf-8"?>
+<file path=customXml/itemProps3.xml><?xml version="1.0" encoding="utf-8"?>
 <ds:datastoreItem xmlns:ds="http://schemas.openxmlformats.org/officeDocument/2006/customXml" ds:itemID="{A6A899CE-B708-4D9D-B4A9-81256E8EE869}">
   <ds:schemaRefs>
     <ds:schemaRef ds:uri="http://schemas.microsoft.com/sharepoint/v3/contenttype/forms"/>
@@ -46824,17 +46847,8 @@
 </ds:datastoreItem>
 </file>
 
-<file path=customXml/itemProps3.xml><?xml version="1.0" encoding="utf-8"?>
-<ds:datastoreItem xmlns:ds="http://schemas.openxmlformats.org/officeDocument/2006/customXml" ds:itemID="{2D743F90-B02F-45D5-9835-EA3B57C055FC}">
-  <ds:schemaRefs>
-    <ds:schemaRef ds:uri="http://schemas.microsoft.com/office/2006/metadata/properties"/>
-    <ds:schemaRef ds:uri="http://schemas.microsoft.com/office/infopath/2007/PartnerControls"/>
-  </ds:schemaRefs>
-</ds:datastoreItem>
-</file>
-
 <file path=customXml/itemProps4.xml><?xml version="1.0" encoding="utf-8"?>
-<ds:datastoreItem xmlns:ds="http://schemas.openxmlformats.org/officeDocument/2006/customXml" ds:itemID="{0C3C3185-DEB6-4EA7-9C2F-B37C07AD1D19}">
+<ds:datastoreItem xmlns:ds="http://schemas.openxmlformats.org/officeDocument/2006/customXml" ds:itemID="{AD023844-6BDA-4C0A-99BA-91900E9E6831}">
   <ds:schemaRefs>
     <ds:schemaRef ds:uri="http://schemas.openxmlformats.org/officeDocument/2006/bibliography"/>
   </ds:schemaRefs>

</xml_diff>

<commit_message>
updating device configurator images in Hellow World lab
</commit_message>
<xml_diff>
--- a/.internal/Manual/Intro to PSOC Edge E84 - Part 2 (E2)/PSoC Edge E84 Introductory E2 Training Manual -WIP_10_21_2025.docx
+++ b/.internal/Manual/Intro to PSOC Edge E84 - Part 2 (E2)/PSoC Edge E84 Introductory E2 Training Manual -WIP_10_21_2025.docx
@@ -146,10 +146,10 @@
     <w:p>
       <w:pPr>
         <w:sectPr>
-          <w:headerReference w:type="default" r:id="rId11"/>
-          <w:footerReference w:type="default" r:id="rId12"/>
-          <w:headerReference w:type="first" r:id="rId13"/>
-          <w:footerReference w:type="first" r:id="rId14"/>
+          <w:headerReference w:type="default" r:id="rId12"/>
+          <w:footerReference w:type="default" r:id="rId13"/>
+          <w:headerReference w:type="first" r:id="rId14"/>
+          <w:footerReference w:type="first" r:id="rId15"/>
           <w:footnotePr>
             <w:numRestart w:val="eachPage"/>
           </w:footnotePr>
@@ -1977,7 +1977,7 @@
       <w:pPr>
         <w:pStyle w:val="Body"/>
         <w:sectPr>
-          <w:headerReference w:type="default" r:id="rId15"/>
+          <w:headerReference w:type="default" r:id="rId16"/>
           <w:footnotePr>
             <w:numRestart w:val="eachPage"/>
           </w:footnotePr>
@@ -2134,7 +2134,7 @@
           <w:lang w:val="en-IN" w:eastAsia="en-IN"/>
         </w:rPr>
       </w:pPr>
-      <w:hyperlink r:id="rId16" w:history="1">
+      <w:hyperlink r:id="rId17" w:history="1">
         <w:proofErr w:type="spellStart"/>
         <w:r>
           <w:rPr>
@@ -2430,7 +2430,7 @@
           <w:lang w:val="en-IN" w:eastAsia="en-IN"/>
         </w:rPr>
       </w:pPr>
-      <w:hyperlink r:id="rId17" w:history="1">
+      <w:hyperlink r:id="rId18" w:history="1">
         <w:r>
           <w:rPr>
             <w:rFonts w:cs="Arial"/>
@@ -2842,7 +2842,7 @@
           <w:numId w:val="34"/>
         </w:numPr>
       </w:pPr>
-      <w:hyperlink r:id="rId18" w:history="1">
+      <w:hyperlink r:id="rId19" w:history="1">
         <w:proofErr w:type="spellStart"/>
         <w:r>
           <w:rPr>
@@ -3027,17 +3027,7 @@
           <w:sz w:val="32"/>
           <w:lang w:eastAsia="de-DE"/>
         </w:rPr>
-        <w:t xml:space="preserve">+ Blinky </w:t>
-      </w:r>
-      <w:r>
-        <w:rPr>
-          <w:b/>
-          <w:snapToGrid w:val="0"/>
-          <w:kern w:val="28"/>
-          <w:sz w:val="32"/>
-          <w:lang w:eastAsia="de-DE"/>
-        </w:rPr>
-        <w:t>using HAL</w:t>
+        <w:t>+ Blinky</w:t>
       </w:r>
       <w:bookmarkEnd w:id="21"/>
       <w:r>
@@ -3219,70 +3209,6 @@
     </w:p>
     <w:p>
       <w:pPr>
-        <w:spacing w:before="160" w:after="160"/>
-        <w:ind w:left="709" w:firstLine="709"/>
-        <w:rPr>
-          <w:lang w:eastAsia="de-DE"/>
-        </w:rPr>
-      </w:pPr>
-      <w:r>
-        <w:rPr>
-          <w:noProof/>
-          <w:lang w:eastAsia="de-DE"/>
-        </w:rPr>
-        <w:drawing>
-          <wp:inline distT="0" distB="0" distL="0" distR="0" wp14:anchorId="5F5633FF" wp14:editId="091595D5">
-            <wp:extent cx="5514193" cy="2835910"/>
-            <wp:effectExtent l="0" t="0" r="0" b="2540"/>
-            <wp:docPr id="5" name="Picture 11">
-              <a:extLst xmlns:a="http://schemas.openxmlformats.org/drawingml/2006/main">
-                <a:ext uri="{FF2B5EF4-FFF2-40B4-BE49-F238E27FC236}">
-                  <a16:creationId xmlns:a16="http://schemas.microsoft.com/office/drawing/2014/main" id="{DC37612C-71F3-4DB1-A194-9E999FA852C9}"/>
-                </a:ext>
-              </a:extLst>
-            </wp:docPr>
-            <wp:cNvGraphicFramePr>
-              <a:graphicFrameLocks xmlns:a="http://schemas.openxmlformats.org/drawingml/2006/main" noChangeAspect="1"/>
-            </wp:cNvGraphicFramePr>
-            <a:graphic xmlns:a="http://schemas.openxmlformats.org/drawingml/2006/main">
-              <a:graphicData uri="http://schemas.openxmlformats.org/drawingml/2006/picture">
-                <pic:pic xmlns:pic="http://schemas.openxmlformats.org/drawingml/2006/picture">
-                  <pic:nvPicPr>
-                    <pic:cNvPr id="12" name="Picture 11">
-                      <a:extLst>
-                        <a:ext uri="{FF2B5EF4-FFF2-40B4-BE49-F238E27FC236}">
-                          <a16:creationId xmlns:a16="http://schemas.microsoft.com/office/drawing/2014/main" id="{DC37612C-71F3-4DB1-A194-9E999FA852C9}"/>
-                        </a:ext>
-                      </a:extLst>
-                    </pic:cNvPr>
-                    <pic:cNvPicPr>
-                      <a:picLocks noChangeAspect="1"/>
-                    </pic:cNvPicPr>
-                  </pic:nvPicPr>
-                  <pic:blipFill>
-                    <a:blip r:embed="rId22"/>
-                    <a:stretch>
-                      <a:fillRect/>
-                    </a:stretch>
-                  </pic:blipFill>
-                  <pic:spPr>
-                    <a:xfrm>
-                      <a:off x="0" y="0"/>
-                      <a:ext cx="5579613" cy="2869555"/>
-                    </a:xfrm>
-                    <a:prstGeom prst="rect">
-                      <a:avLst/>
-                    </a:prstGeom>
-                  </pic:spPr>
-                </pic:pic>
-              </a:graphicData>
-            </a:graphic>
-          </wp:inline>
-        </w:drawing>
-      </w:r>
-    </w:p>
-    <w:p>
-      <w:pPr>
         <w:pStyle w:val="ListParagraph"/>
         <w:spacing w:before="160" w:after="160"/>
         <w:ind w:left="2138"/>
@@ -3291,155 +3217,130 @@
         </w:rPr>
       </w:pPr>
     </w:p>
-    <w:p>
-      <w:pPr>
-        <w:pStyle w:val="ListParagraph"/>
+    <w:sdt>
+      <w:sdtPr>
+        <w:alias w:val="mioTextBlock"/>
+        <w:tag w:val="81c2738b-584a-4fa9-a420-fa91ec5ce67e"/>
+        <w:id w:val="-2060620793"/>
+        <w:placeholder>
+          <w:docPart w:val="DefaultPlaceholder_-1854013440"/>
+        </w:placeholder>
+        <w15:appearance w15:val="hidden"/>
+      </w:sdtPr>
+      <w:sdtEndPr>
+        <w:rPr>
+          <w:b/>
+        </w:rPr>
+      </w:sdtEndPr>
+      <w:sdtContent>
+        <w:tbl>
+          <w:tblPr>
+            <w:tblStyle w:val="InfineonPicture"/>
+            <w:tblW w:w="5000" w:type="pct"/>
+            <w:tblCellMar>
+              <w:left w:w="0" w:type="dxa"/>
+              <w:right w:w="0" w:type="dxa"/>
+            </w:tblCellMar>
+            <w:tblLook w:val="05E0" w:firstRow="1" w:lastRow="1" w:firstColumn="1" w:lastColumn="1" w:noHBand="0" w:noVBand="1"/>
+          </w:tblPr>
+          <w:tblGrid>
+            <w:gridCol w:w="10196"/>
+          </w:tblGrid>
+          <w:tr>
+            <w:tc>
+              <w:tcPr>
+                <w:tcW w:w="5000" w:type="pct"/>
+              </w:tcPr>
+              <w:p>
+                <w:pPr>
+                  <w:pStyle w:val="TableCell-c"/>
+                </w:pPr>
+                <w:r>
+                  <w:rPr>
+                    <w:noProof/>
+                  </w:rPr>
+                  <w:drawing>
+                    <wp:inline distT="0" distB="0" distL="0" distR="0" wp14:anchorId="0C70B12F" wp14:editId="5A4A2061">
+                      <wp:extent cx="5514193" cy="2835910"/>
+                      <wp:effectExtent l="0" t="0" r="0" b="2540"/>
+                      <wp:docPr id="5" name="Picture 11">
+                        <a:extLst xmlns:a="http://schemas.openxmlformats.org/drawingml/2006/main">
+                          <a:ext uri="{FF2B5EF4-FFF2-40B4-BE49-F238E27FC236}">
+                            <a16:creationId xmlns:a16="http://schemas.microsoft.com/office/drawing/2014/main" id="{DC37612C-71F3-4DB1-A194-9E999FA852C9}"/>
+                          </a:ext>
+                        </a:extLst>
+                      </wp:docPr>
+                      <wp:cNvGraphicFramePr>
+                        <a:graphicFrameLocks xmlns:a="http://schemas.openxmlformats.org/drawingml/2006/main" noChangeAspect="1"/>
+                      </wp:cNvGraphicFramePr>
+                      <a:graphic xmlns:a="http://schemas.openxmlformats.org/drawingml/2006/main">
+                        <a:graphicData uri="http://schemas.openxmlformats.org/drawingml/2006/picture">
+                          <pic:pic xmlns:pic="http://schemas.openxmlformats.org/drawingml/2006/picture">
+                            <pic:nvPicPr>
+                              <pic:cNvPr id="12" name="Picture 11">
+                                <a:extLst>
+                                  <a:ext uri="{FF2B5EF4-FFF2-40B4-BE49-F238E27FC236}">
+                                    <a16:creationId xmlns:a16="http://schemas.microsoft.com/office/drawing/2014/main" id="{DC37612C-71F3-4DB1-A194-9E999FA852C9}"/>
+                                  </a:ext>
+                                </a:extLst>
+                              </pic:cNvPr>
+                              <pic:cNvPicPr>
+                                <a:picLocks noChangeAspect="1"/>
+                              </pic:cNvPicPr>
+                            </pic:nvPicPr>
+                            <pic:blipFill>
+                              <a:blip r:embed="rId23"/>
+                              <a:stretch>
+                                <a:fillRect/>
+                              </a:stretch>
+                            </pic:blipFill>
+                            <pic:spPr>
+                              <a:xfrm>
+                                <a:off x="0" y="0"/>
+                                <a:ext cx="5579613" cy="2869555"/>
+                              </a:xfrm>
+                              <a:prstGeom prst="rect">
+                                <a:avLst/>
+                              </a:prstGeom>
+                            </pic:spPr>
+                          </pic:pic>
+                        </a:graphicData>
+                      </a:graphic>
+                    </wp:inline>
+                  </w:drawing>
+                </w:r>
+              </w:p>
+            </w:tc>
+          </w:tr>
+        </w:tbl>
+        <w:p>
+          <w:pPr>
+            <w:pStyle w:val="Figuretitlenew"/>
+            <w:rPr>
+              <w:lang w:eastAsia="de-DE"/>
+            </w:rPr>
+          </w:pPr>
+          <w:r>
+            <w:t xml:space="preserve">Figure </w:t>
+          </w:r>
+          <w:fldSimple w:instr=" SEQ Figure \* ARABIC ">
+            <w:r>
+              <w:rPr>
+                <w:noProof/>
+              </w:rPr>
+              <w:t>1</w:t>
+            </w:r>
+          </w:fldSimple>
+          <w:r>
+            <w:tab/>
+            <w:t>Hello World + Blinky Algorithm Flow</w:t>
+          </w:r>
+        </w:p>
+      </w:sdtContent>
+    </w:sdt>
+    <w:p>
+      <w:pPr>
         <w:spacing w:before="160" w:after="160"/>
-        <w:ind w:left="2138"/>
-        <w:rPr>
-          <w:lang w:eastAsia="de-DE"/>
-        </w:rPr>
-      </w:pPr>
-    </w:p>
-    <w:p>
-      <w:pPr>
-        <w:pStyle w:val="ListParagraph"/>
-        <w:spacing w:before="160" w:after="160"/>
-        <w:ind w:left="2138"/>
-        <w:rPr>
-          <w:lang w:eastAsia="de-DE"/>
-        </w:rPr>
-      </w:pPr>
-    </w:p>
-    <w:p>
-      <w:pPr>
-        <w:pStyle w:val="ListParagraph"/>
-        <w:spacing w:before="160" w:after="160"/>
-        <w:ind w:left="2138"/>
-        <w:rPr>
-          <w:lang w:eastAsia="de-DE"/>
-        </w:rPr>
-      </w:pPr>
-    </w:p>
-    <w:p>
-      <w:pPr>
-        <w:pStyle w:val="ListParagraph"/>
-        <w:spacing w:before="160" w:after="160"/>
-        <w:ind w:left="2138"/>
-        <w:rPr>
-          <w:lang w:eastAsia="de-DE"/>
-        </w:rPr>
-      </w:pPr>
-    </w:p>
-    <w:p>
-      <w:pPr>
-        <w:pStyle w:val="ListParagraph"/>
-        <w:spacing w:before="160" w:after="160"/>
-        <w:ind w:left="2138"/>
-        <w:rPr>
-          <w:lang w:eastAsia="de-DE"/>
-        </w:rPr>
-      </w:pPr>
-    </w:p>
-    <w:p>
-      <w:pPr>
-        <w:pStyle w:val="ListParagraph"/>
-        <w:spacing w:before="160" w:after="160"/>
-        <w:ind w:left="2138"/>
-        <w:rPr>
-          <w:lang w:eastAsia="de-DE"/>
-        </w:rPr>
-      </w:pPr>
-    </w:p>
-    <w:p>
-      <w:pPr>
-        <w:pStyle w:val="ListParagraph"/>
-        <w:spacing w:before="160" w:after="160"/>
-        <w:ind w:left="2138"/>
-        <w:rPr>
-          <w:lang w:eastAsia="de-DE"/>
-        </w:rPr>
-      </w:pPr>
-    </w:p>
-    <w:p>
-      <w:pPr>
-        <w:pStyle w:val="ListParagraph"/>
-        <w:spacing w:before="160" w:after="160"/>
-        <w:ind w:left="2138"/>
-        <w:rPr>
-          <w:lang w:eastAsia="de-DE"/>
-        </w:rPr>
-      </w:pPr>
-    </w:p>
-    <w:p>
-      <w:pPr>
-        <w:pStyle w:val="ListParagraph"/>
-        <w:spacing w:before="160" w:after="160"/>
-        <w:ind w:left="2138"/>
-        <w:rPr>
-          <w:lang w:eastAsia="de-DE"/>
-        </w:rPr>
-      </w:pPr>
-    </w:p>
-    <w:p>
-      <w:pPr>
-        <w:pStyle w:val="ListParagraph"/>
-        <w:spacing w:before="160" w:after="160"/>
-        <w:ind w:left="2138"/>
-        <w:rPr>
-          <w:lang w:eastAsia="de-DE"/>
-        </w:rPr>
-      </w:pPr>
-      <w:r>
-        <w:rPr>
-          <w:lang w:eastAsia="de-DE"/>
-        </w:rPr>
-        <w:t>.</w:t>
-      </w:r>
-    </w:p>
-    <w:p>
-      <w:pPr>
-        <w:pStyle w:val="ListParagraph"/>
-        <w:spacing w:before="160" w:after="160"/>
-        <w:ind w:left="2138"/>
-        <w:rPr>
-          <w:lang w:eastAsia="de-DE"/>
-        </w:rPr>
-      </w:pPr>
-    </w:p>
-    <w:p>
-      <w:pPr>
-        <w:pStyle w:val="ListParagraph"/>
-        <w:spacing w:before="160" w:after="160"/>
-        <w:ind w:left="2138"/>
-        <w:rPr>
-          <w:lang w:eastAsia="de-DE"/>
-        </w:rPr>
-      </w:pPr>
-    </w:p>
-    <w:p>
-      <w:pPr>
-        <w:pStyle w:val="ListParagraph"/>
-        <w:spacing w:before="160" w:after="160"/>
-        <w:ind w:left="2138"/>
-        <w:rPr>
-          <w:lang w:eastAsia="de-DE"/>
-        </w:rPr>
-      </w:pPr>
-    </w:p>
-    <w:p>
-      <w:pPr>
-        <w:pStyle w:val="ListParagraph"/>
-        <w:spacing w:before="160" w:after="160"/>
-        <w:ind w:left="2138"/>
-        <w:rPr>
-          <w:lang w:eastAsia="de-DE"/>
-        </w:rPr>
-      </w:pPr>
-    </w:p>
-    <w:p>
-      <w:pPr>
-        <w:spacing w:before="160" w:after="160"/>
         <w:rPr>
           <w:lang w:eastAsia="de-DE"/>
         </w:rPr>
@@ -3457,7 +3358,6 @@
         <w:rPr>
           <w:b w:val="0"/>
         </w:rPr>
-        <w:lastRenderedPageBreak/>
         <w:t>Flowchart</w:t>
       </w:r>
       <w:bookmarkEnd w:id="24"/>
@@ -3507,9 +3407,9 @@
             <o:lock v:ext="edit" aspectratio="t"/>
           </v:shapetype>
           <v:shape id="_x0000_i1025" type="#_x0000_t75" style="width:475.7pt;height:588.05pt" o:ole="">
-            <v:imagedata r:id="rId23" o:title=""/>
+            <v:imagedata r:id="rId24" o:title=""/>
           </v:shape>
-          <o:OLEObject Type="Embed" ProgID="Visio.Drawing.15" ShapeID="_x0000_i1025" DrawAspect="Content" ObjectID="_1823335872" r:id="rId24"/>
+          <o:OLEObject Type="Embed" ProgID="Visio.Drawing.15" ShapeID="_x0000_i1025" DrawAspect="Content" ObjectID="_1823347316" r:id="rId25"/>
         </w:object>
       </w:r>
     </w:p>
@@ -3537,7 +3437,6 @@
         <w:ind w:left="1418"/>
       </w:pPr>
       <w:r>
-        <w:lastRenderedPageBreak/>
         <w:t>Below flow chart explains the flow of CM</w:t>
       </w:r>
       <w:r>
@@ -3556,9 +3455,9 @@
       <w:r>
         <w:object w:dxaOrig="4404" w:dyaOrig="4296" w14:anchorId="54967411">
           <v:shape id="_x0000_i1026" type="#_x0000_t75" style="width:116.95pt;height:114.05pt" o:ole="">
-            <v:imagedata r:id="rId25" o:title=""/>
+            <v:imagedata r:id="rId26" o:title=""/>
           </v:shape>
-          <o:OLEObject Type="Embed" ProgID="Visio.Drawing.15" ShapeID="_x0000_i1026" DrawAspect="Content" ObjectID="_1823335873" r:id="rId26"/>
+          <o:OLEObject Type="Embed" ProgID="Visio.Drawing.15" ShapeID="_x0000_i1026" DrawAspect="Content" ObjectID="_1823347317" r:id="rId27"/>
         </w:object>
       </w:r>
     </w:p>
@@ -3703,52 +3602,6 @@
         <w:ind w:left="1418"/>
         <w:jc w:val="center"/>
       </w:pPr>
-      <w:r>
-        <w:rPr>
-          <w:noProof/>
-        </w:rPr>
-        <w:drawing>
-          <wp:inline distT="0" distB="0" distL="0" distR="0" wp14:anchorId="2AEF9C86" wp14:editId="2BBD3517">
-            <wp:extent cx="5661036" cy="2504941"/>
-            <wp:effectExtent l="0" t="0" r="0" b="0"/>
-            <wp:docPr id="1" name="Picture 1"/>
-            <wp:cNvGraphicFramePr>
-              <a:graphicFrameLocks xmlns:a="http://schemas.openxmlformats.org/drawingml/2006/main" noChangeAspect="1"/>
-            </wp:cNvGraphicFramePr>
-            <a:graphic xmlns:a="http://schemas.openxmlformats.org/drawingml/2006/main">
-              <a:graphicData uri="http://schemas.openxmlformats.org/drawingml/2006/picture">
-                <pic:pic xmlns:pic="http://schemas.openxmlformats.org/drawingml/2006/picture">
-                  <pic:nvPicPr>
-                    <pic:cNvPr id="1" name=""/>
-                    <pic:cNvPicPr/>
-                  </pic:nvPicPr>
-                  <pic:blipFill>
-                    <a:blip r:embed="rId27">
-                      <a:extLst>
-                        <a:ext uri="{28A0092B-C50C-407E-A947-70E740481C1C}">
-                          <a14:useLocalDpi xmlns:a14="http://schemas.microsoft.com/office/drawing/2010/main" val="0"/>
-                        </a:ext>
-                      </a:extLst>
-                    </a:blip>
-                    <a:stretch>
-                      <a:fillRect/>
-                    </a:stretch>
-                  </pic:blipFill>
-                  <pic:spPr>
-                    <a:xfrm>
-                      <a:off x="0" y="0"/>
-                      <a:ext cx="5661036" cy="2504941"/>
-                    </a:xfrm>
-                    <a:prstGeom prst="rect">
-                      <a:avLst/>
-                    </a:prstGeom>
-                  </pic:spPr>
-                </pic:pic>
-              </a:graphicData>
-            </a:graphic>
-          </wp:inline>
-        </w:drawing>
-      </w:r>
     </w:p>
     <w:p>
       <w:pPr>
@@ -3756,12 +3609,132 @@
       </w:pPr>
       <w:bookmarkStart w:id="26" w:name="_Hlk190961414"/>
     </w:p>
-    <w:bookmarkEnd w:id="26"/>
-    <w:p>
-      <w:pPr>
-        <w:pStyle w:val="Body"/>
-      </w:pPr>
-    </w:p>
+    <w:bookmarkEnd w:id="26" w:displacedByCustomXml="next"/>
+    <w:sdt>
+      <w:sdtPr>
+        <w:alias w:val="mioTextBlock"/>
+        <w:tag w:val="50720dae-b0d4-4194-b190-edb8d80cd456"/>
+        <w:id w:val="200978687"/>
+        <w:placeholder>
+          <w:docPart w:val="DefaultPlaceholder_-1854013440"/>
+        </w:placeholder>
+        <w15:appearance w15:val="hidden"/>
+      </w:sdtPr>
+      <w:sdtEndPr>
+        <w:rPr>
+          <w:b/>
+          <w:lang w:eastAsia="en-US"/>
+        </w:rPr>
+      </w:sdtEndPr>
+      <w:sdtContent>
+        <w:tbl>
+          <w:tblPr>
+            <w:tblStyle w:val="InfineonPicture"/>
+            <w:tblW w:w="5000" w:type="pct"/>
+            <w:tblCellMar>
+              <w:left w:w="0" w:type="dxa"/>
+              <w:right w:w="0" w:type="dxa"/>
+            </w:tblCellMar>
+            <w:tblLook w:val="05E0" w:firstRow="1" w:lastRow="1" w:firstColumn="1" w:lastColumn="1" w:noHBand="0" w:noVBand="1"/>
+          </w:tblPr>
+          <w:tblGrid>
+            <w:gridCol w:w="10196"/>
+          </w:tblGrid>
+          <w:tr>
+            <w:tc>
+              <w:tcPr>
+                <w:tcW w:w="5000" w:type="pct"/>
+              </w:tcPr>
+              <w:p>
+                <w:pPr>
+                  <w:pStyle w:val="TableCell-c"/>
+                </w:pPr>
+                <w:r>
+                  <w:rPr>
+                    <w:noProof/>
+                  </w:rPr>
+                  <w:drawing>
+                    <wp:inline distT="0" distB="0" distL="0" distR="0" wp14:anchorId="7BBF76A6" wp14:editId="7B37C9D1">
+                      <wp:extent cx="5661036" cy="2504941"/>
+                      <wp:effectExtent l="0" t="0" r="0" b="0"/>
+                      <wp:docPr id="1" name="Picture 1"/>
+                      <wp:cNvGraphicFramePr>
+                        <a:graphicFrameLocks xmlns:a="http://schemas.openxmlformats.org/drawingml/2006/main" noChangeAspect="1"/>
+                      </wp:cNvGraphicFramePr>
+                      <a:graphic xmlns:a="http://schemas.openxmlformats.org/drawingml/2006/main">
+                        <a:graphicData uri="http://schemas.openxmlformats.org/drawingml/2006/picture">
+                          <pic:pic xmlns:pic="http://schemas.openxmlformats.org/drawingml/2006/picture">
+                            <pic:nvPicPr>
+                              <pic:cNvPr id="1" name=""/>
+                              <pic:cNvPicPr/>
+                            </pic:nvPicPr>
+                            <pic:blipFill>
+                              <a:blip r:embed="rId28">
+                                <a:extLst>
+                                  <a:ext uri="{28A0092B-C50C-407E-A947-70E740481C1C}">
+                                    <a14:useLocalDpi xmlns:a14="http://schemas.microsoft.com/office/drawing/2010/main" val="0"/>
+                                  </a:ext>
+                                </a:extLst>
+                              </a:blip>
+                              <a:stretch>
+                                <a:fillRect/>
+                              </a:stretch>
+                            </pic:blipFill>
+                            <pic:spPr>
+                              <a:xfrm>
+                                <a:off x="0" y="0"/>
+                                <a:ext cx="5661036" cy="2504941"/>
+                              </a:xfrm>
+                              <a:prstGeom prst="rect">
+                                <a:avLst/>
+                              </a:prstGeom>
+                            </pic:spPr>
+                          </pic:pic>
+                        </a:graphicData>
+                      </a:graphic>
+                    </wp:inline>
+                  </w:drawing>
+                </w:r>
+              </w:p>
+            </w:tc>
+          </w:tr>
+        </w:tbl>
+        <w:p>
+          <w:pPr>
+            <w:pStyle w:val="Figuretitlenew"/>
+          </w:pPr>
+          <w:r>
+            <w:t xml:space="preserve">Figure </w:t>
+          </w:r>
+          <w:r>
+            <w:fldChar w:fldCharType="begin"/>
+          </w:r>
+          <w:r>
+            <w:instrText xml:space="preserve"> SEQ Figure \* ARABIC </w:instrText>
+          </w:r>
+          <w:r>
+            <w:fldChar w:fldCharType="separate"/>
+          </w:r>
+          <w:r>
+            <w:rPr>
+              <w:noProof/>
+            </w:rPr>
+            <w:t>2</w:t>
+          </w:r>
+          <w:r>
+            <w:fldChar w:fldCharType="end"/>
+          </w:r>
+          <w:r>
+            <w:tab/>
+          </w:r>
+          <w:r>
+            <w:t>Hardware Diagram for UART and LED Routing on PSOC Edge E84 EVK</w:t>
+          </w:r>
+        </w:p>
+        <w:bookmarkStart w:id="27" w:name="_GoBack" w:displacedByCustomXml="next"/>
+        <w:bookmarkEnd w:id="27" w:displacedByCustomXml="next"/>
+      </w:sdtContent>
+    </w:sdt>
     <w:p>
       <w:pPr>
         <w:keepNext/>
@@ -3783,7 +3756,7 @@
           <w:lang w:eastAsia="de-DE"/>
         </w:rPr>
       </w:pPr>
-      <w:bookmarkStart w:id="27" w:name="_Toc192780021"/>
+      <w:bookmarkStart w:id="28" w:name="_Toc192780021"/>
       <w:r>
         <w:rPr>
           <w:b/>
@@ -3794,7 +3767,7 @@
         </w:rPr>
         <w:t>Project Creation</w:t>
       </w:r>
-      <w:bookmarkEnd w:id="27"/>
+      <w:bookmarkEnd w:id="28"/>
       <w:r>
         <w:rPr>
           <w:b/>
@@ -3905,7 +3878,7 @@
                     </pic:cNvPicPr>
                   </pic:nvPicPr>
                   <pic:blipFill>
-                    <a:blip r:embed="rId28">
+                    <a:blip r:embed="rId29">
                       <a:extLst>
                         <a:ext uri="{28A0092B-C50C-407E-A947-70E740481C1C}">
                           <a14:useLocalDpi xmlns:a14="http://schemas.microsoft.com/office/drawing/2010/main" val="0"/>
@@ -4012,7 +3985,7 @@
                     </pic:cNvPicPr>
                   </pic:nvPicPr>
                   <pic:blipFill>
-                    <a:blip r:embed="rId29">
+                    <a:blip r:embed="rId30">
                       <a:extLst>
                         <a:ext uri="{28A0092B-C50C-407E-A947-70E740481C1C}">
                           <a14:useLocalDpi xmlns:a14="http://schemas.microsoft.com/office/drawing/2010/main" val="0"/>
@@ -4140,7 +4113,7 @@
                     <pic:cNvPicPr/>
                   </pic:nvPicPr>
                   <pic:blipFill>
-                    <a:blip r:embed="rId30" cstate="print">
+                    <a:blip r:embed="rId31" cstate="print">
                       <a:extLst>
                         <a:ext uri="{28A0092B-C50C-407E-A947-70E740481C1C}">
                           <a14:useLocalDpi xmlns:a14="http://schemas.microsoft.com/office/drawing/2010/main" val="0"/>
@@ -4292,7 +4265,7 @@
                     </pic:cNvPicPr>
                   </pic:nvPicPr>
                   <pic:blipFill>
-                    <a:blip r:embed="rId31" cstate="print">
+                    <a:blip r:embed="rId32" cstate="print">
                       <a:extLst>
                         <a:ext uri="{28A0092B-C50C-407E-A947-70E740481C1C}">
                           <a14:useLocalDpi xmlns:a14="http://schemas.microsoft.com/office/drawing/2010/main" val="0"/>
@@ -4566,7 +4539,7 @@
                     </pic:cNvPicPr>
                   </pic:nvPicPr>
                   <pic:blipFill>
-                    <a:blip r:embed="rId32" cstate="print">
+                    <a:blip r:embed="rId33" cstate="print">
                       <a:extLst>
                         <a:ext uri="{28A0092B-C50C-407E-A947-70E740481C1C}">
                           <a14:useLocalDpi xmlns:a14="http://schemas.microsoft.com/office/drawing/2010/main" val="0"/>
@@ -4763,7 +4736,7 @@
                     </pic:cNvPicPr>
                   </pic:nvPicPr>
                   <pic:blipFill>
-                    <a:blip r:embed="rId33" cstate="print">
+                    <a:blip r:embed="rId34" cstate="print">
                       <a:extLst>
                         <a:ext uri="{28A0092B-C50C-407E-A947-70E740481C1C}">
                           <a14:useLocalDpi xmlns:a14="http://schemas.microsoft.com/office/drawing/2010/main" val="0"/>
@@ -4895,7 +4868,7 @@
                     </pic:cNvPicPr>
                   </pic:nvPicPr>
                   <pic:blipFill>
-                    <a:blip r:embed="rId34" cstate="print">
+                    <a:blip r:embed="rId35" cstate="print">
                       <a:extLst>
                         <a:ext uri="{28A0092B-C50C-407E-A947-70E740481C1C}">
                           <a14:useLocalDpi xmlns:a14="http://schemas.microsoft.com/office/drawing/2010/main" val="0"/>
@@ -4996,7 +4969,7 @@
                     <pic:cNvPicPr/>
                   </pic:nvPicPr>
                   <pic:blipFill>
-                    <a:blip r:embed="rId35">
+                    <a:blip r:embed="rId36">
                       <a:extLst>
                         <a:ext uri="{28A0092B-C50C-407E-A947-70E740481C1C}">
                           <a14:useLocalDpi xmlns:a14="http://schemas.microsoft.com/office/drawing/2010/main" val="0"/>
@@ -5244,7 +5217,7 @@
                     </pic:cNvPicPr>
                   </pic:nvPicPr>
                   <pic:blipFill>
-                    <a:blip r:embed="rId36">
+                    <a:blip r:embed="rId37">
                       <a:extLst>
                         <a:ext uri="{28A0092B-C50C-407E-A947-70E740481C1C}">
                           <a14:useLocalDpi xmlns:a14="http://schemas.microsoft.com/office/drawing/2010/main" val="0"/>
@@ -5576,7 +5549,7 @@
                     </pic:cNvPicPr>
                   </pic:nvPicPr>
                   <pic:blipFill>
-                    <a:blip r:embed="rId37" cstate="print">
+                    <a:blip r:embed="rId38" cstate="print">
                       <a:extLst>
                         <a:ext uri="{28A0092B-C50C-407E-A947-70E740481C1C}">
                           <a14:useLocalDpi xmlns:a14="http://schemas.microsoft.com/office/drawing/2010/main" val="0"/>
@@ -5763,7 +5736,7 @@
                     </pic:cNvPicPr>
                   </pic:nvPicPr>
                   <pic:blipFill>
-                    <a:blip r:embed="rId38">
+                    <a:blip r:embed="rId39">
                       <a:extLst>
                         <a:ext uri="{28A0092B-C50C-407E-A947-70E740481C1C}">
                           <a14:useLocalDpi xmlns:a14="http://schemas.microsoft.com/office/drawing/2010/main" val="0"/>
@@ -5856,7 +5829,6 @@
           <w:lang w:eastAsia="de-DE"/>
         </w:rPr>
       </w:pPr>
-      <w:bookmarkStart w:id="28" w:name="_GoBack"/>
       <w:r>
         <w:rPr>
           <w:noProof/>
@@ -5880,7 +5852,7 @@
                     </pic:cNvPicPr>
                   </pic:nvPicPr>
                   <pic:blipFill>
-                    <a:blip r:embed="rId39" cstate="print">
+                    <a:blip r:embed="rId40" cstate="print">
                       <a:extLst>
                         <a:ext uri="{28A0092B-C50C-407E-A947-70E740481C1C}">
                           <a14:useLocalDpi xmlns:a14="http://schemas.microsoft.com/office/drawing/2010/main" val="0"/>
@@ -5912,7 +5884,6 @@
           </wp:inline>
         </w:drawing>
       </w:r>
-      <w:bookmarkEnd w:id="28"/>
     </w:p>
     <w:p>
       <w:pPr>
@@ -5943,7 +5914,19 @@
         <w:rPr>
           <w:lang w:eastAsia="de-DE"/>
         </w:rPr>
-        <w:t>Manger</w:t>
+        <w:t>Man</w:t>
+      </w:r>
+      <w:r>
+        <w:rPr>
+          <w:lang w:eastAsia="de-DE"/>
+        </w:rPr>
+        <w:t>a</w:t>
+      </w:r>
+      <w:r>
+        <w:rPr>
+          <w:lang w:eastAsia="de-DE"/>
+        </w:rPr>
+        <w:t>ger</w:t>
       </w:r>
       <w:r>
         <w:rPr>
@@ -5962,6 +5945,39 @@
           <w:lang w:eastAsia="de-DE"/>
         </w:rPr>
         <w:t>project.</w:t>
+      </w:r>
+      <w:r>
+        <w:rPr>
+          <w:lang w:eastAsia="de-DE"/>
+        </w:rPr>
+        <w:t xml:space="preserve"> </w:t>
+      </w:r>
+      <w:r>
+        <w:rPr>
+          <w:b/>
+          <w:lang w:eastAsia="de-DE"/>
+        </w:rPr>
+        <w:t>Close</w:t>
+      </w:r>
+      <w:r>
+        <w:rPr>
+          <w:lang w:eastAsia="de-DE"/>
+        </w:rPr>
+        <w:t xml:space="preserve"> the Library Manager after the </w:t>
+      </w:r>
+      <w:proofErr w:type="spellStart"/>
+      <w:r>
+        <w:rPr>
+          <w:lang w:eastAsia="de-DE"/>
+        </w:rPr>
+        <w:t>udpates</w:t>
+      </w:r>
+      <w:proofErr w:type="spellEnd"/>
+      <w:r>
+        <w:rPr>
+          <w:lang w:eastAsia="de-DE"/>
+        </w:rPr>
+        <w:t xml:space="preserve"> have completed.</w:t>
       </w:r>
     </w:p>
     <w:p>
@@ -5990,7 +6006,6 @@
         <w:rPr>
           <w:lang w:eastAsia="de-DE"/>
         </w:rPr>
-        <w:lastRenderedPageBreak/>
         <w:t xml:space="preserve">Now </w:t>
       </w:r>
       <w:r>
@@ -6013,7 +6028,12 @@
       </w:r>
       <w:r>
         <w:rPr>
-          <w:b/>
+          <w:lang w:eastAsia="de-DE"/>
+        </w:rPr>
+        <w:t xml:space="preserve">the </w:t>
+      </w:r>
+      <w:r>
+        <w:rPr>
           <w:bCs/>
           <w:lang w:eastAsia="de-DE"/>
         </w:rPr>
@@ -6021,7 +6041,6 @@
       </w:r>
       <w:r>
         <w:rPr>
-          <w:b/>
           <w:bCs/>
           <w:lang w:eastAsia="de-DE"/>
         </w:rPr>
@@ -6126,9 +6145,9 @@
           <w:lang w:eastAsia="de-DE"/>
         </w:rPr>
         <w:drawing>
-          <wp:inline distT="0" distB="0" distL="0" distR="0" wp14:anchorId="0669D229" wp14:editId="4FCE571E">
-            <wp:extent cx="2451223" cy="2204559"/>
-            <wp:effectExtent l="19050" t="19050" r="25400" b="24765"/>
+          <wp:inline distT="0" distB="0" distL="0" distR="0" wp14:anchorId="0669D229" wp14:editId="76FB76A9">
+            <wp:extent cx="2192625" cy="2682406"/>
+            <wp:effectExtent l="19050" t="19050" r="17780" b="22860"/>
             <wp:docPr id="76" name="Picture 76"/>
             <wp:cNvGraphicFramePr>
               <a:graphicFrameLocks xmlns:a="http://schemas.openxmlformats.org/drawingml/2006/main" noChangeAspect="1"/>
@@ -6143,7 +6162,7 @@
                     </pic:cNvPicPr>
                   </pic:nvPicPr>
                   <pic:blipFill>
-                    <a:blip r:embed="rId40" cstate="print">
+                    <a:blip r:embed="rId41">
                       <a:extLst>
                         <a:ext uri="{28A0092B-C50C-407E-A947-70E740481C1C}">
                           <a14:useLocalDpi xmlns:a14="http://schemas.microsoft.com/office/drawing/2010/main" val="0"/>
@@ -6157,7 +6176,7 @@
                   <pic:spPr bwMode="auto">
                     <a:xfrm>
                       <a:off x="0" y="0"/>
-                      <a:ext cx="2451223" cy="2204559"/>
+                      <a:ext cx="2200994" cy="2692645"/>
                     </a:xfrm>
                     <a:prstGeom prst="rect">
                       <a:avLst/>
@@ -6231,7 +6250,7 @@
       <w:pPr>
         <w:pStyle w:val="ListParagraph"/>
         <w:spacing w:before="160" w:after="160"/>
-        <w:ind w:left="1778"/>
+        <w:ind w:left="1418"/>
         <w:jc w:val="center"/>
         <w:rPr>
           <w:lang w:eastAsia="de-DE"/>
@@ -6243,10 +6262,10 @@
           <w:lang w:eastAsia="de-DE"/>
         </w:rPr>
         <w:drawing>
-          <wp:inline distT="0" distB="0" distL="0" distR="0" wp14:anchorId="79ED9FF5" wp14:editId="2C1E69E0">
-            <wp:extent cx="5524500" cy="3210988"/>
-            <wp:effectExtent l="0" t="0" r="0" b="8890"/>
-            <wp:docPr id="2007675758" name="Picture 17" descr="A screenshot of a computer&#10;&#10;Description automatically generated"/>
+          <wp:inline distT="0" distB="0" distL="0" distR="0" wp14:anchorId="79ED9FF5" wp14:editId="48E675B4">
+            <wp:extent cx="5153411" cy="3394058"/>
+            <wp:effectExtent l="0" t="0" r="0" b="0"/>
+            <wp:docPr id="2007675758" name="Picture 17"/>
             <wp:cNvGraphicFramePr>
               <a:graphicFrameLocks xmlns:a="http://schemas.openxmlformats.org/drawingml/2006/main" noChangeAspect="1"/>
             </wp:cNvGraphicFramePr>
@@ -6258,7 +6277,7 @@
                     <pic:cNvPicPr/>
                   </pic:nvPicPr>
                   <pic:blipFill>
-                    <a:blip r:embed="rId41" cstate="print">
+                    <a:blip r:embed="rId42" cstate="print">
                       <a:extLst>
                         <a:ext uri="{28A0092B-C50C-407E-A947-70E740481C1C}">
                           <a14:useLocalDpi xmlns:a14="http://schemas.microsoft.com/office/drawing/2010/main" val="0"/>
@@ -6272,7 +6291,7 @@
                   <pic:spPr>
                     <a:xfrm>
                       <a:off x="0" y="0"/>
-                      <a:ext cx="5546773" cy="3223934"/>
+                      <a:ext cx="5185451" cy="3415160"/>
                     </a:xfrm>
                     <a:prstGeom prst="rect">
                       <a:avLst/>
@@ -6346,7 +6365,7 @@
       <w:pPr>
         <w:pStyle w:val="ListParagraph"/>
         <w:spacing w:before="160" w:after="160"/>
-        <w:ind w:left="1778"/>
+        <w:ind w:left="709"/>
         <w:jc w:val="center"/>
       </w:pPr>
       <w:r>
@@ -6355,8 +6374,8 @@
         </w:rPr>
         <w:lastRenderedPageBreak/>
         <w:drawing>
-          <wp:inline distT="0" distB="0" distL="0" distR="0" wp14:anchorId="25D07132" wp14:editId="48935531">
-            <wp:extent cx="3505200" cy="3338286"/>
+          <wp:inline distT="0" distB="0" distL="0" distR="0" wp14:anchorId="25D07132" wp14:editId="0410B644">
+            <wp:extent cx="3261869" cy="3354926"/>
             <wp:effectExtent l="0" t="0" r="0" b="0"/>
             <wp:docPr id="2007675773" name="Picture 2007675773"/>
             <wp:cNvGraphicFramePr>
@@ -6372,14 +6391,13 @@
                     </pic:cNvPicPr>
                   </pic:nvPicPr>
                   <pic:blipFill>
-                    <a:blip r:embed="rId42">
+                    <a:blip r:embed="rId43">
                       <a:extLst>
                         <a:ext uri="{28A0092B-C50C-407E-A947-70E740481C1C}">
                           <a14:useLocalDpi xmlns:a14="http://schemas.microsoft.com/office/drawing/2010/main" val="0"/>
                         </a:ext>
                       </a:extLst>
                     </a:blip>
-                    <a:srcRect/>
                     <a:stretch>
                       <a:fillRect/>
                     </a:stretch>
@@ -6387,7 +6405,7 @@
                   <pic:spPr bwMode="auto">
                     <a:xfrm>
                       <a:off x="0" y="0"/>
-                      <a:ext cx="3522672" cy="3354926"/>
+                      <a:ext cx="3261869" cy="3354926"/>
                     </a:xfrm>
                     <a:prstGeom prst="rect">
                       <a:avLst/>
@@ -6443,210 +6461,6 @@
             <wp:extent cx="2855895" cy="3367331"/>
             <wp:effectExtent l="0" t="0" r="1905" b="5080"/>
             <wp:docPr id="77" name="Picture 77"/>
-            <wp:cNvGraphicFramePr>
-              <a:graphicFrameLocks xmlns:a="http://schemas.openxmlformats.org/drawingml/2006/main" noChangeAspect="1"/>
-            </wp:cNvGraphicFramePr>
-            <a:graphic xmlns:a="http://schemas.openxmlformats.org/drawingml/2006/main">
-              <a:graphicData uri="http://schemas.openxmlformats.org/drawingml/2006/picture">
-                <pic:pic xmlns:pic="http://schemas.openxmlformats.org/drawingml/2006/picture">
-                  <pic:nvPicPr>
-                    <pic:cNvPr id="1" name=""/>
-                    <pic:cNvPicPr/>
-                  </pic:nvPicPr>
-                  <pic:blipFill>
-                    <a:blip r:embed="rId43"/>
-                    <a:stretch>
-                      <a:fillRect/>
-                    </a:stretch>
-                  </pic:blipFill>
-                  <pic:spPr>
-                    <a:xfrm>
-                      <a:off x="0" y="0"/>
-                      <a:ext cx="2870644" cy="3384721"/>
-                    </a:xfrm>
-                    <a:prstGeom prst="rect">
-                      <a:avLst/>
-                    </a:prstGeom>
-                  </pic:spPr>
-                </pic:pic>
-              </a:graphicData>
-            </a:graphic>
-          </wp:inline>
-        </w:drawing>
-      </w:r>
-    </w:p>
-    <w:p>
-      <w:pPr>
-        <w:pStyle w:val="ListParagraph"/>
-        <w:spacing w:before="160" w:after="160"/>
-        <w:ind w:left="1778"/>
-        <w:rPr>
-          <w:lang w:eastAsia="de-DE"/>
-        </w:rPr>
-      </w:pPr>
-    </w:p>
-    <w:p>
-      <w:pPr>
-        <w:pStyle w:val="ListParagraph"/>
-        <w:spacing w:before="160" w:after="160"/>
-        <w:ind w:left="1778"/>
-      </w:pPr>
-    </w:p>
-    <w:p>
-      <w:pPr>
-        <w:pStyle w:val="ListParagraph"/>
-        <w:spacing w:before="160" w:after="160"/>
-        <w:ind w:left="1778"/>
-        <w:rPr>
-          <w:lang w:eastAsia="de-DE"/>
-        </w:rPr>
-      </w:pPr>
-    </w:p>
-    <w:p>
-      <w:pPr>
-        <w:pStyle w:val="ListParagraph"/>
-        <w:spacing w:before="160" w:after="160"/>
-        <w:ind w:left="1778"/>
-        <w:rPr>
-          <w:lang w:eastAsia="de-DE"/>
-        </w:rPr>
-      </w:pPr>
-    </w:p>
-    <w:p>
-      <w:pPr>
-        <w:pStyle w:val="ListParagraph"/>
-        <w:spacing w:before="160" w:after="160"/>
-        <w:ind w:left="1778"/>
-        <w:rPr>
-          <w:lang w:eastAsia="de-DE"/>
-        </w:rPr>
-      </w:pPr>
-    </w:p>
-    <w:p>
-      <w:pPr>
-        <w:pStyle w:val="ListParagraph"/>
-        <w:spacing w:before="160" w:after="160"/>
-        <w:ind w:left="1778"/>
-        <w:rPr>
-          <w:lang w:eastAsia="de-DE"/>
-        </w:rPr>
-      </w:pPr>
-    </w:p>
-    <w:p>
-      <w:pPr>
-        <w:spacing w:before="160" w:after="160"/>
-        <w:rPr>
-          <w:lang w:eastAsia="de-DE"/>
-        </w:rPr>
-      </w:pPr>
-    </w:p>
-    <w:p>
-      <w:pPr>
-        <w:pStyle w:val="ListParagraph"/>
-        <w:numPr>
-          <w:ilvl w:val="0"/>
-          <w:numId w:val="31"/>
-        </w:numPr>
-        <w:spacing w:before="160" w:after="160"/>
-        <w:rPr>
-          <w:lang w:eastAsia="de-DE"/>
-        </w:rPr>
-      </w:pPr>
-      <w:r>
-        <w:rPr>
-          <w:lang w:eastAsia="de-DE"/>
-        </w:rPr>
-        <w:lastRenderedPageBreak/>
-        <w:t xml:space="preserve">For example, </w:t>
-      </w:r>
-      <w:r>
-        <w:rPr>
-          <w:lang w:eastAsia="de-DE"/>
-        </w:rPr>
-        <w:t>in below figure we</w:t>
-      </w:r>
-      <w:r>
-        <w:rPr>
-          <w:lang w:eastAsia="de-DE"/>
-        </w:rPr>
-        <w:t xml:space="preserve"> have renamed the </w:t>
-      </w:r>
-      <w:r>
-        <w:rPr>
-          <w:b/>
-          <w:lang w:eastAsia="de-DE"/>
-        </w:rPr>
-        <w:t xml:space="preserve">Port 16 Pin 7 </w:t>
-      </w:r>
-      <w:r>
-        <w:rPr>
-          <w:lang w:eastAsia="de-DE"/>
-        </w:rPr>
-        <w:t>as</w:t>
-      </w:r>
-      <w:r>
-        <w:rPr>
-          <w:b/>
-          <w:lang w:eastAsia="de-DE"/>
-        </w:rPr>
-        <w:t xml:space="preserve"> </w:t>
-      </w:r>
-      <w:r>
-        <w:rPr>
-          <w:b/>
-          <w:bCs/>
-          <w:lang w:eastAsia="de-DE"/>
-        </w:rPr>
-        <w:t>TRAINING_LED</w:t>
-      </w:r>
-      <w:r>
-        <w:rPr>
-          <w:lang w:eastAsia="de-DE"/>
-        </w:rPr>
-        <w:t xml:space="preserve">. </w:t>
-      </w:r>
-      <w:r>
-        <w:rPr>
-          <w:lang w:eastAsia="de-DE"/>
-        </w:rPr>
-        <w:t>We will be using this LED in our application.</w:t>
-      </w:r>
-      <w:r>
-        <w:rPr>
-          <w:lang w:eastAsia="de-DE"/>
-        </w:rPr>
-        <w:t xml:space="preserve"> Go to File&gt; Save or alternatively hit Ctrl+S to save the change.</w:t>
-      </w:r>
-    </w:p>
-    <w:p>
-      <w:pPr>
-        <w:pStyle w:val="ListParagraph"/>
-        <w:spacing w:before="160" w:after="160"/>
-        <w:ind w:left="1778"/>
-        <w:rPr>
-          <w:lang w:eastAsia="de-DE"/>
-        </w:rPr>
-      </w:pPr>
-    </w:p>
-    <w:p>
-      <w:pPr>
-        <w:pStyle w:val="ListParagraph"/>
-        <w:spacing w:before="160" w:after="160"/>
-        <w:ind w:left="1778"/>
-        <w:jc w:val="center"/>
-        <w:rPr>
-          <w:lang w:eastAsia="de-DE"/>
-        </w:rPr>
-      </w:pPr>
-      <w:r>
-        <w:rPr>
-          <w:noProof/>
-        </w:rPr>
-        <w:drawing>
-          <wp:inline distT="0" distB="0" distL="0" distR="0" wp14:anchorId="7BE3E1D5" wp14:editId="705BA8A7">
-            <wp:extent cx="3816927" cy="3949540"/>
-            <wp:effectExtent l="0" t="0" r="0" b="0"/>
-            <wp:docPr id="78" name="Picture 78"/>
             <wp:cNvGraphicFramePr>
               <a:graphicFrameLocks xmlns:a="http://schemas.openxmlformats.org/drawingml/2006/main" noChangeAspect="1"/>
             </wp:cNvGraphicFramePr>
@@ -6666,6 +6480,210 @@
                   <pic:spPr>
                     <a:xfrm>
                       <a:off x="0" y="0"/>
+                      <a:ext cx="2870644" cy="3384721"/>
+                    </a:xfrm>
+                    <a:prstGeom prst="rect">
+                      <a:avLst/>
+                    </a:prstGeom>
+                  </pic:spPr>
+                </pic:pic>
+              </a:graphicData>
+            </a:graphic>
+          </wp:inline>
+        </w:drawing>
+      </w:r>
+    </w:p>
+    <w:p>
+      <w:pPr>
+        <w:pStyle w:val="ListParagraph"/>
+        <w:spacing w:before="160" w:after="160"/>
+        <w:ind w:left="1778"/>
+        <w:rPr>
+          <w:lang w:eastAsia="de-DE"/>
+        </w:rPr>
+      </w:pPr>
+    </w:p>
+    <w:p>
+      <w:pPr>
+        <w:pStyle w:val="ListParagraph"/>
+        <w:spacing w:before="160" w:after="160"/>
+        <w:ind w:left="1778"/>
+      </w:pPr>
+    </w:p>
+    <w:p>
+      <w:pPr>
+        <w:pStyle w:val="ListParagraph"/>
+        <w:spacing w:before="160" w:after="160"/>
+        <w:ind w:left="1778"/>
+        <w:rPr>
+          <w:lang w:eastAsia="de-DE"/>
+        </w:rPr>
+      </w:pPr>
+    </w:p>
+    <w:p>
+      <w:pPr>
+        <w:pStyle w:val="ListParagraph"/>
+        <w:spacing w:before="160" w:after="160"/>
+        <w:ind w:left="1778"/>
+        <w:rPr>
+          <w:lang w:eastAsia="de-DE"/>
+        </w:rPr>
+      </w:pPr>
+    </w:p>
+    <w:p>
+      <w:pPr>
+        <w:pStyle w:val="ListParagraph"/>
+        <w:spacing w:before="160" w:after="160"/>
+        <w:ind w:left="1778"/>
+        <w:rPr>
+          <w:lang w:eastAsia="de-DE"/>
+        </w:rPr>
+      </w:pPr>
+    </w:p>
+    <w:p>
+      <w:pPr>
+        <w:pStyle w:val="ListParagraph"/>
+        <w:spacing w:before="160" w:after="160"/>
+        <w:ind w:left="1778"/>
+        <w:rPr>
+          <w:lang w:eastAsia="de-DE"/>
+        </w:rPr>
+      </w:pPr>
+    </w:p>
+    <w:p>
+      <w:pPr>
+        <w:spacing w:before="160" w:after="160"/>
+        <w:rPr>
+          <w:lang w:eastAsia="de-DE"/>
+        </w:rPr>
+      </w:pPr>
+    </w:p>
+    <w:p>
+      <w:pPr>
+        <w:pStyle w:val="ListParagraph"/>
+        <w:numPr>
+          <w:ilvl w:val="0"/>
+          <w:numId w:val="31"/>
+        </w:numPr>
+        <w:spacing w:before="160" w:after="160"/>
+        <w:rPr>
+          <w:lang w:eastAsia="de-DE"/>
+        </w:rPr>
+      </w:pPr>
+      <w:r>
+        <w:rPr>
+          <w:lang w:eastAsia="de-DE"/>
+        </w:rPr>
+        <w:lastRenderedPageBreak/>
+        <w:t xml:space="preserve">For example, </w:t>
+      </w:r>
+      <w:r>
+        <w:rPr>
+          <w:lang w:eastAsia="de-DE"/>
+        </w:rPr>
+        <w:t>in below figure we</w:t>
+      </w:r>
+      <w:r>
+        <w:rPr>
+          <w:lang w:eastAsia="de-DE"/>
+        </w:rPr>
+        <w:t xml:space="preserve"> have renamed the </w:t>
+      </w:r>
+      <w:r>
+        <w:rPr>
+          <w:b/>
+          <w:lang w:eastAsia="de-DE"/>
+        </w:rPr>
+        <w:t xml:space="preserve">Port 16 Pin 7 </w:t>
+      </w:r>
+      <w:r>
+        <w:rPr>
+          <w:lang w:eastAsia="de-DE"/>
+        </w:rPr>
+        <w:t>as</w:t>
+      </w:r>
+      <w:r>
+        <w:rPr>
+          <w:b/>
+          <w:lang w:eastAsia="de-DE"/>
+        </w:rPr>
+        <w:t xml:space="preserve"> </w:t>
+      </w:r>
+      <w:r>
+        <w:rPr>
+          <w:b/>
+          <w:bCs/>
+          <w:lang w:eastAsia="de-DE"/>
+        </w:rPr>
+        <w:t>TRAINING_LED</w:t>
+      </w:r>
+      <w:r>
+        <w:rPr>
+          <w:lang w:eastAsia="de-DE"/>
+        </w:rPr>
+        <w:t xml:space="preserve">. </w:t>
+      </w:r>
+      <w:r>
+        <w:rPr>
+          <w:lang w:eastAsia="de-DE"/>
+        </w:rPr>
+        <w:t>We will be using this LED in our application.</w:t>
+      </w:r>
+      <w:r>
+        <w:rPr>
+          <w:lang w:eastAsia="de-DE"/>
+        </w:rPr>
+        <w:t xml:space="preserve"> Go to File&gt; Save or alternatively hit Ctrl+S to save the change.</w:t>
+      </w:r>
+    </w:p>
+    <w:p>
+      <w:pPr>
+        <w:pStyle w:val="ListParagraph"/>
+        <w:spacing w:before="160" w:after="160"/>
+        <w:ind w:left="1778"/>
+        <w:rPr>
+          <w:lang w:eastAsia="de-DE"/>
+        </w:rPr>
+      </w:pPr>
+    </w:p>
+    <w:p>
+      <w:pPr>
+        <w:pStyle w:val="ListParagraph"/>
+        <w:spacing w:before="160" w:after="160"/>
+        <w:ind w:left="1778"/>
+        <w:jc w:val="center"/>
+        <w:rPr>
+          <w:lang w:eastAsia="de-DE"/>
+        </w:rPr>
+      </w:pPr>
+      <w:r>
+        <w:rPr>
+          <w:noProof/>
+        </w:rPr>
+        <w:drawing>
+          <wp:inline distT="0" distB="0" distL="0" distR="0" wp14:anchorId="7BE3E1D5" wp14:editId="705BA8A7">
+            <wp:extent cx="3816927" cy="3949540"/>
+            <wp:effectExtent l="0" t="0" r="0" b="0"/>
+            <wp:docPr id="78" name="Picture 78"/>
+            <wp:cNvGraphicFramePr>
+              <a:graphicFrameLocks xmlns:a="http://schemas.openxmlformats.org/drawingml/2006/main" noChangeAspect="1"/>
+            </wp:cNvGraphicFramePr>
+            <a:graphic xmlns:a="http://schemas.openxmlformats.org/drawingml/2006/main">
+              <a:graphicData uri="http://schemas.openxmlformats.org/drawingml/2006/picture">
+                <pic:pic xmlns:pic="http://schemas.openxmlformats.org/drawingml/2006/picture">
+                  <pic:nvPicPr>
+                    <pic:cNvPr id="1" name=""/>
+                    <pic:cNvPicPr/>
+                  </pic:nvPicPr>
+                  <pic:blipFill>
+                    <a:blip r:embed="rId45"/>
+                    <a:stretch>
+                      <a:fillRect/>
+                    </a:stretch>
+                  </pic:blipFill>
+                  <pic:spPr>
+                    <a:xfrm>
+                      <a:off x="0" y="0"/>
                       <a:ext cx="3864939" cy="3999220"/>
                     </a:xfrm>
                     <a:prstGeom prst="rect">
@@ -6796,7 +6814,7 @@
                     </pic:cNvPicPr>
                   </pic:nvPicPr>
                   <pic:blipFill>
-                    <a:blip r:embed="rId45">
+                    <a:blip r:embed="rId46">
                       <a:extLst>
                         <a:ext uri="{28A0092B-C50C-407E-A947-70E740481C1C}">
                           <a14:useLocalDpi xmlns:a14="http://schemas.microsoft.com/office/drawing/2010/main" val="0"/>
@@ -6870,7 +6888,7 @@
                     </pic:cNvPicPr>
                   </pic:nvPicPr>
                   <pic:blipFill>
-                    <a:blip r:embed="rId46">
+                    <a:blip r:embed="rId47">
                       <a:extLst>
                         <a:ext uri="{28A0092B-C50C-407E-A947-70E740481C1C}">
                           <a14:useLocalDpi xmlns:a14="http://schemas.microsoft.com/office/drawing/2010/main" val="0"/>
@@ -7056,7 +7074,7 @@
                     <pic:cNvPicPr/>
                   </pic:nvPicPr>
                   <pic:blipFill>
-                    <a:blip r:embed="rId47"/>
+                    <a:blip r:embed="rId48"/>
                     <a:stretch>
                       <a:fillRect/>
                     </a:stretch>
@@ -7517,7 +7535,7 @@
                     <pic:cNvPicPr/>
                   </pic:nvPicPr>
                   <pic:blipFill>
-                    <a:blip r:embed="rId48">
+                    <a:blip r:embed="rId49">
                       <a:extLst>
                         <a:ext uri="{28A0092B-C50C-407E-A947-70E740481C1C}">
                           <a14:useLocalDpi xmlns:a14="http://schemas.microsoft.com/office/drawing/2010/main" val="0"/>
@@ -7666,7 +7684,7 @@
                     </pic:cNvPicPr>
                   </pic:nvPicPr>
                   <pic:blipFill>
-                    <a:blip r:embed="rId49" cstate="print">
+                    <a:blip r:embed="rId50" cstate="print">
                       <a:extLst>
                         <a:ext uri="{28A0092B-C50C-407E-A947-70E740481C1C}">
                           <a14:useLocalDpi xmlns:a14="http://schemas.microsoft.com/office/drawing/2010/main" val="0"/>
@@ -7732,7 +7750,7 @@
                     </pic:cNvPicPr>
                   </pic:nvPicPr>
                   <pic:blipFill>
-                    <a:blip r:embed="rId50" cstate="print">
+                    <a:blip r:embed="rId51" cstate="print">
                       <a:extLst>
                         <a:ext uri="{28A0092B-C50C-407E-A947-70E740481C1C}">
                           <a14:useLocalDpi xmlns:a14="http://schemas.microsoft.com/office/drawing/2010/main" val="0"/>
@@ -8361,7 +8379,7 @@
         </w:rPr>
         <w:t xml:space="preserve"> will be available in HAL documentation </w:t>
       </w:r>
-      <w:hyperlink r:id="rId51" w:history="1">
+      <w:hyperlink r:id="rId52" w:history="1">
         <w:r>
           <w:rPr>
             <w:rStyle w:val="Hyperlink"/>
@@ -8463,7 +8481,7 @@
                     <pic:cNvPicPr/>
                   </pic:nvPicPr>
                   <pic:blipFill>
-                    <a:blip r:embed="rId52"/>
+                    <a:blip r:embed="rId53"/>
                     <a:stretch>
                       <a:fillRect/>
                     </a:stretch>
@@ -14527,7 +14545,7 @@
                     <pic:cNvPicPr/>
                   </pic:nvPicPr>
                   <pic:blipFill>
-                    <a:blip r:embed="rId53">
+                    <a:blip r:embed="rId54">
                       <a:extLst>
                         <a:ext uri="{28A0092B-C50C-407E-A947-70E740481C1C}">
                           <a14:useLocalDpi xmlns:a14="http://schemas.microsoft.com/office/drawing/2010/main" val="0"/>
@@ -14660,7 +14678,7 @@
                     <pic:cNvPicPr/>
                   </pic:nvPicPr>
                   <pic:blipFill>
-                    <a:blip r:embed="rId54">
+                    <a:blip r:embed="rId55">
                       <a:extLst>
                         <a:ext uri="{28A0092B-C50C-407E-A947-70E740481C1C}">
                           <a14:useLocalDpi xmlns:a14="http://schemas.microsoft.com/office/drawing/2010/main" val="0"/>
@@ -14769,7 +14787,7 @@
                     <pic:cNvPicPr/>
                   </pic:nvPicPr>
                   <pic:blipFill>
-                    <a:blip r:embed="rId55"/>
+                    <a:blip r:embed="rId56"/>
                     <a:stretch>
                       <a:fillRect/>
                     </a:stretch>
@@ -15129,7 +15147,7 @@
                     <pic:cNvPicPr/>
                   </pic:nvPicPr>
                   <pic:blipFill>
-                    <a:blip r:embed="rId56"/>
+                    <a:blip r:embed="rId57"/>
                     <a:stretch>
                       <a:fillRect/>
                     </a:stretch>
@@ -15211,7 +15229,7 @@
                     <pic:cNvPicPr/>
                   </pic:nvPicPr>
                   <pic:blipFill>
-                    <a:blip r:embed="rId57">
+                    <a:blip r:embed="rId58">
                       <a:extLst>
                         <a:ext uri="{28A0092B-C50C-407E-A947-70E740481C1C}">
                           <a14:useLocalDpi xmlns:a14="http://schemas.microsoft.com/office/drawing/2010/main" val="0"/>
@@ -15281,7 +15299,7 @@
                     </pic:cNvPicPr>
                   </pic:nvPicPr>
                   <pic:blipFill>
-                    <a:blip r:embed="rId58">
+                    <a:blip r:embed="rId59">
                       <a:extLst>
                         <a:ext uri="{28A0092B-C50C-407E-A947-70E740481C1C}">
                           <a14:useLocalDpi xmlns:a14="http://schemas.microsoft.com/office/drawing/2010/main" val="0"/>
@@ -15353,7 +15371,7 @@
                     <pic:cNvPicPr/>
                   </pic:nvPicPr>
                   <pic:blipFill>
-                    <a:blip r:embed="rId59"/>
+                    <a:blip r:embed="rId60"/>
                     <a:stretch>
                       <a:fillRect/>
                     </a:stretch>
@@ -15537,7 +15555,7 @@
                     </pic:cNvPicPr>
                   </pic:nvPicPr>
                   <pic:blipFill>
-                    <a:blip r:embed="rId60">
+                    <a:blip r:embed="rId61">
                       <a:extLst>
                         <a:ext uri="{28A0092B-C50C-407E-A947-70E740481C1C}">
                           <a14:useLocalDpi xmlns:a14="http://schemas.microsoft.com/office/drawing/2010/main" val="0"/>
@@ -15649,7 +15667,7 @@
                     </pic:cNvPicPr>
                   </pic:nvPicPr>
                   <pic:blipFill>
-                    <a:blip r:embed="rId61" cstate="print">
+                    <a:blip r:embed="rId62" cstate="print">
                       <a:extLst>
                         <a:ext uri="{28A0092B-C50C-407E-A947-70E740481C1C}">
                           <a14:useLocalDpi xmlns:a14="http://schemas.microsoft.com/office/drawing/2010/main" val="0"/>
@@ -15891,7 +15909,7 @@
                     </pic:cNvPicPr>
                   </pic:nvPicPr>
                   <pic:blipFill>
-                    <a:blip r:embed="rId62" cstate="print">
+                    <a:blip r:embed="rId63" cstate="print">
                       <a:extLst>
                         <a:ext uri="{28A0092B-C50C-407E-A947-70E740481C1C}">
                           <a14:useLocalDpi xmlns:a14="http://schemas.microsoft.com/office/drawing/2010/main" val="0"/>
@@ -15980,7 +15998,7 @@
                     </pic:cNvPicPr>
                   </pic:nvPicPr>
                   <pic:blipFill>
-                    <a:blip r:embed="rId63">
+                    <a:blip r:embed="rId64">
                       <a:extLst>
                         <a:ext uri="{28A0092B-C50C-407E-A947-70E740481C1C}">
                           <a14:useLocalDpi xmlns:a14="http://schemas.microsoft.com/office/drawing/2010/main" val="0"/>
@@ -16107,7 +16125,7 @@
                     </pic:cNvPicPr>
                   </pic:nvPicPr>
                   <pic:blipFill>
-                    <a:blip r:embed="rId64">
+                    <a:blip r:embed="rId65">
                       <a:extLst>
                         <a:ext uri="{28A0092B-C50C-407E-A947-70E740481C1C}">
                           <a14:useLocalDpi xmlns:a14="http://schemas.microsoft.com/office/drawing/2010/main" val="0"/>
@@ -16280,7 +16298,7 @@
                     </pic:cNvPicPr>
                   </pic:nvPicPr>
                   <pic:blipFill>
-                    <a:blip r:embed="rId65">
+                    <a:blip r:embed="rId66">
                       <a:extLst>
                         <a:ext uri="{28A0092B-C50C-407E-A947-70E740481C1C}">
                           <a14:useLocalDpi xmlns:a14="http://schemas.microsoft.com/office/drawing/2010/main" val="0"/>
@@ -16471,7 +16489,7 @@
                     </pic:cNvPicPr>
                   </pic:nvPicPr>
                   <pic:blipFill>
-                    <a:blip r:embed="rId66">
+                    <a:blip r:embed="rId67">
                       <a:extLst>
                         <a:ext uri="{28A0092B-C50C-407E-A947-70E740481C1C}">
                           <a14:useLocalDpi xmlns:a14="http://schemas.microsoft.com/office/drawing/2010/main" val="0"/>
@@ -16587,7 +16605,7 @@
                     </pic:cNvPicPr>
                   </pic:nvPicPr>
                   <pic:blipFill>
-                    <a:blip r:embed="rId67" cstate="print">
+                    <a:blip r:embed="rId68" cstate="print">
                       <a:extLst>
                         <a:ext uri="{28A0092B-C50C-407E-A947-70E740481C1C}">
                           <a14:useLocalDpi xmlns:a14="http://schemas.microsoft.com/office/drawing/2010/main" val="0"/>
@@ -17010,7 +17028,7 @@
                     </pic:cNvPicPr>
                   </pic:nvPicPr>
                   <pic:blipFill>
-                    <a:blip r:embed="rId68">
+                    <a:blip r:embed="rId69">
                       <a:extLst>
                         <a:ext uri="{28A0092B-C50C-407E-A947-70E740481C1C}">
                           <a14:useLocalDpi xmlns:a14="http://schemas.microsoft.com/office/drawing/2010/main" val="0"/>
@@ -17158,7 +17176,7 @@
                     </pic:cNvPicPr>
                   </pic:nvPicPr>
                   <pic:blipFill>
-                    <a:blip r:embed="rId69">
+                    <a:blip r:embed="rId70">
                       <a:extLst>
                         <a:ext uri="{28A0092B-C50C-407E-A947-70E740481C1C}">
                           <a14:useLocalDpi xmlns:a14="http://schemas.microsoft.com/office/drawing/2010/main" val="0"/>
@@ -17275,7 +17293,7 @@
                     <pic:cNvPicPr/>
                   </pic:nvPicPr>
                   <pic:blipFill>
-                    <a:blip r:embed="rId70"/>
+                    <a:blip r:embed="rId71"/>
                     <a:stretch>
                       <a:fillRect/>
                     </a:stretch>
@@ -17399,7 +17417,7 @@
                     </pic:cNvPicPr>
                   </pic:nvPicPr>
                   <pic:blipFill>
-                    <a:blip r:embed="rId71">
+                    <a:blip r:embed="rId72">
                       <a:extLst>
                         <a:ext uri="{28A0092B-C50C-407E-A947-70E740481C1C}">
                           <a14:useLocalDpi xmlns:a14="http://schemas.microsoft.com/office/drawing/2010/main" val="0"/>
@@ -17524,7 +17542,7 @@
                     <pic:cNvPicPr/>
                   </pic:nvPicPr>
                   <pic:blipFill>
-                    <a:blip r:embed="rId70"/>
+                    <a:blip r:embed="rId71"/>
                     <a:stretch>
                       <a:fillRect/>
                     </a:stretch>
@@ -17632,7 +17650,7 @@
                     </pic:cNvPicPr>
                   </pic:nvPicPr>
                   <pic:blipFill>
-                    <a:blip r:embed="rId72">
+                    <a:blip r:embed="rId73">
                       <a:extLst>
                         <a:ext uri="{28A0092B-C50C-407E-A947-70E740481C1C}">
                           <a14:useLocalDpi xmlns:a14="http://schemas.microsoft.com/office/drawing/2010/main" val="0"/>
@@ -26010,7 +26028,7 @@
                     </pic:cNvPicPr>
                   </pic:nvPicPr>
                   <pic:blipFill>
-                    <a:blip r:embed="rId73">
+                    <a:blip r:embed="rId74">
                       <a:extLst>
                         <a:ext uri="{28A0092B-C50C-407E-A947-70E740481C1C}">
                           <a14:useLocalDpi xmlns:a14="http://schemas.microsoft.com/office/drawing/2010/main" val="0"/>
@@ -32888,7 +32906,7 @@
                     </pic:cNvPicPr>
                   </pic:nvPicPr>
                   <pic:blipFill>
-                    <a:blip r:embed="rId74">
+                    <a:blip r:embed="rId75">
                       <a:extLst>
                         <a:ext uri="{28A0092B-C50C-407E-A947-70E740481C1C}">
                           <a14:useLocalDpi xmlns:a14="http://schemas.microsoft.com/office/drawing/2010/main" val="0"/>
@@ -33043,7 +33061,7 @@
                     </pic:cNvPicPr>
                   </pic:nvPicPr>
                   <pic:blipFill>
-                    <a:blip r:embed="rId75">
+                    <a:blip r:embed="rId76">
                       <a:extLst>
                         <a:ext uri="{28A0092B-C50C-407E-A947-70E740481C1C}">
                           <a14:useLocalDpi xmlns:a14="http://schemas.microsoft.com/office/drawing/2010/main" val="0"/>
@@ -33233,7 +33251,7 @@
                     <pic:cNvPicPr/>
                   </pic:nvPicPr>
                   <pic:blipFill>
-                    <a:blip r:embed="rId76">
+                    <a:blip r:embed="rId77">
                       <a:extLst>
                         <a:ext uri="{28A0092B-C50C-407E-A947-70E740481C1C}">
                           <a14:useLocalDpi xmlns:a14="http://schemas.microsoft.com/office/drawing/2010/main" val="0"/>
@@ -33399,7 +33417,7 @@
           <w:lang w:eastAsia="de-DE"/>
         </w:rPr>
       </w:pPr>
-      <w:hyperlink r:id="rId77" w:history="1">
+      <w:hyperlink r:id="rId78" w:history="1">
         <w:r>
           <w:rPr>
             <w:rStyle w:val="Hyperlink"/>
@@ -33447,7 +33465,7 @@
           <w:b w:val="0"/>
         </w:rPr>
         <w:sectPr>
-          <w:headerReference w:type="default" r:id="rId78"/>
+          <w:headerReference w:type="default" r:id="rId79"/>
           <w:footnotePr>
             <w:numRestart w:val="eachPage"/>
           </w:footnotePr>
@@ -33472,9 +33490,9 @@
       <w:pPr>
         <w:pStyle w:val="Body"/>
         <w:sectPr>
-          <w:headerReference w:type="even" r:id="rId79"/>
-          <w:headerReference w:type="default" r:id="rId80"/>
-          <w:footerReference w:type="default" r:id="rId81"/>
+          <w:headerReference w:type="even" r:id="rId80"/>
+          <w:headerReference w:type="default" r:id="rId81"/>
+          <w:footerReference w:type="default" r:id="rId82"/>
           <w:footnotePr>
             <w:numRestart w:val="eachPage"/>
           </w:footnotePr>
@@ -33497,9 +33515,9 @@
     </w:p>
     <w:p/>
     <w:sectPr>
-      <w:headerReference w:type="even" r:id="rId82"/>
-      <w:headerReference w:type="default" r:id="rId83"/>
-      <w:footerReference w:type="default" r:id="rId84"/>
+      <w:headerReference w:type="even" r:id="rId83"/>
+      <w:headerReference w:type="default" r:id="rId84"/>
+      <w:footerReference w:type="default" r:id="rId85"/>
       <w:footnotePr>
         <w:numRestart w:val="eachPage"/>
       </w:footnotePr>
@@ -34411,7 +34429,7 @@
         <v:shape id="_x0000_s2052" type="#_x0000_t75" style="position:absolute;margin-left:-45.75pt;margin-top:62.5pt;width:602.45pt;height:287.2pt;z-index:-251642880;mso-position-horizontal-relative:text;mso-position-vertical-relative:text">
           <v:imagedata r:id="rId1" o:title=""/>
         </v:shape>
-        <o:OLEObject Type="Embed" ProgID="Visio.Drawing.15" ShapeID="_x0000_s2052" DrawAspect="Content" ObjectID="_1823335874" r:id="rId2"/>
+        <o:OLEObject Type="Embed" ProgID="Visio.Drawing.15" ShapeID="_x0000_s2052" DrawAspect="Content" ObjectID="_1823347318" r:id="rId2"/>
       </w:object>
     </w:r>
     <w:r>
@@ -35744,7 +35762,7 @@
         <v:shape id="_x0000_s2051" type="#_x0000_t75" style="position:absolute;margin-left:-45.75pt;margin-top:62.5pt;width:602.45pt;height:287.2pt;z-index:-251643904;mso-position-horizontal-relative:text;mso-position-vertical-relative:text">
           <v:imagedata r:id="rId1" o:title=""/>
         </v:shape>
-        <o:OLEObject Type="Embed" ProgID="Visio.Drawing.15" ShapeID="_x0000_s2051" DrawAspect="Content" ObjectID="_1823335875" r:id="rId2"/>
+        <o:OLEObject Type="Embed" ProgID="Visio.Drawing.15" ShapeID="_x0000_s2051" DrawAspect="Content" ObjectID="_1823347319" r:id="rId2"/>
       </w:object>
     </w:r>
     <w:r>
@@ -44618,6 +44636,7 @@
   <w:style w:type="paragraph" w:customStyle="1" w:styleId="TableCell-c">
     <w:name w:val="TableCell-c"/>
     <w:basedOn w:val="TableCell"/>
+    <w:qFormat/>
     <w:rsid w:val="00773EBD"/>
     <w:pPr>
       <w:jc w:val="center"/>
@@ -46365,7 +46384,689 @@
       <w:lang w:eastAsia="de-DE"/>
     </w:rPr>
   </w:style>
+  <w:style w:type="character" w:styleId="PlaceholderText">
+    <w:name w:val="Placeholder Text"/>
+    <w:basedOn w:val="DefaultParagraphFont"/>
+    <w:uiPriority w:val="99"/>
+    <w:semiHidden/>
+    <w:rsid w:val="00326731"/>
+    <w:rPr>
+      <w:color w:val="808080"/>
+    </w:rPr>
+  </w:style>
+  <w:style w:type="paragraph" w:customStyle="1" w:styleId="Figuretitlenew">
+    <w:name w:val="Figure_title_new"/>
+    <w:basedOn w:val="Normal"/>
+    <w:autoRedefine/>
+    <w:rsid w:val="00326731"/>
+    <w:pPr>
+      <w:tabs>
+        <w:tab w:val="left" w:pos="1134"/>
+      </w:tabs>
+      <w:spacing w:before="40" w:after="360" w:line="276" w:lineRule="auto"/>
+      <w:ind w:left="1134" w:hanging="1134"/>
+    </w:pPr>
+    <w:rPr>
+      <w:b/>
+    </w:rPr>
+  </w:style>
 </w:styles>
+</file>
+
+<file path=word/glossary/document.xml><?xml version="1.0" encoding="utf-8"?>
+<w:glossaryDocument xmlns:wpc="http://schemas.microsoft.com/office/word/2010/wordprocessingCanvas" xmlns:cx="http://schemas.microsoft.com/office/drawing/2014/chartex" xmlns:cx1="http://schemas.microsoft.com/office/drawing/2015/9/8/chartex" xmlns:cx2="http://schemas.microsoft.com/office/drawing/2015/10/21/chartex" xmlns:cx3="http://schemas.microsoft.com/office/drawing/2016/5/9/chartex" xmlns:cx4="http://schemas.microsoft.com/office/drawing/2016/5/10/chartex" xmlns:cx5="http://schemas.microsoft.com/office/drawing/2016/5/11/chartex" xmlns:cx6="http://schemas.microsoft.com/office/drawing/2016/5/12/chartex" xmlns:cx7="http://schemas.microsoft.com/office/drawing/2016/5/13/chartex" xmlns:cx8="http://schemas.microsoft.com/office/drawing/2016/5/14/chartex" xmlns:mc="http://schemas.openxmlformats.org/markup-compatibility/2006" xmlns:aink="http://schemas.microsoft.com/office/drawing/2016/ink" xmlns:am3d="http://schemas.microsoft.com/office/drawing/2017/model3d" xmlns:o="urn:schemas-microsoft-com:office:office" xmlns:r="http://schemas.openxmlformats.org/officeDocument/2006/relationships" xmlns:m="http://schemas.openxmlformats.org/officeDocument/2006/math" xmlns:v="urn:schemas-microsoft-com:vml" xmlns:wp14="http://schemas.microsoft.com/office/word/2010/wordprocessingDrawing" xmlns:wp="http://schemas.openxmlformats.org/drawingml/2006/wordprocessingDrawing" xmlns:w10="urn:schemas-microsoft-com:office:word" xmlns:w="http://schemas.openxmlformats.org/wordprocessingml/2006/main" xmlns:w14="http://schemas.microsoft.com/office/word/2010/wordml" xmlns:w15="http://schemas.microsoft.com/office/word/2012/wordml" xmlns:w16cid="http://schemas.microsoft.com/office/word/2016/wordml/cid" xmlns:w16se="http://schemas.microsoft.com/office/word/2015/wordml/symex" xmlns:wpg="http://schemas.microsoft.com/office/word/2010/wordprocessingGroup" xmlns:wpi="http://schemas.microsoft.com/office/word/2010/wordprocessingInk" xmlns:wne="http://schemas.microsoft.com/office/word/2006/wordml" xmlns:wps="http://schemas.microsoft.com/office/word/2010/wordprocessingShape" mc:Ignorable="w14 w15 w16se w16cid wp14">
+  <w:docParts>
+    <w:docPart>
+      <w:docPartPr>
+        <w:name w:val="DefaultPlaceholder_-1854013440"/>
+        <w:category>
+          <w:name w:val="General"/>
+          <w:gallery w:val="placeholder"/>
+        </w:category>
+        <w:types>
+          <w:type w:val="bbPlcHdr"/>
+        </w:types>
+        <w:behaviors>
+          <w:behavior w:val="content"/>
+        </w:behaviors>
+        <w:guid w:val="{DF6392FF-3815-4157-A2CC-A36F3C013C5C}"/>
+      </w:docPartPr>
+      <w:docPartBody>
+        <w:p>
+          <w:r>
+            <w:rPr>
+              <w:rStyle w:val="PlaceholderText"/>
+            </w:rPr>
+            <w:t>Click or tap here to enter text.</w:t>
+          </w:r>
+        </w:p>
+      </w:docPartBody>
+    </w:docPart>
+  </w:docParts>
+</w:glossaryDocument>
+</file>
+
+<file path=word/glossary/fontTable.xml><?xml version="1.0" encoding="utf-8"?>
+<w:fonts xmlns:mc="http://schemas.openxmlformats.org/markup-compatibility/2006" xmlns:r="http://schemas.openxmlformats.org/officeDocument/2006/relationships" xmlns:w="http://schemas.openxmlformats.org/wordprocessingml/2006/main" xmlns:w14="http://schemas.microsoft.com/office/word/2010/wordml" xmlns:w15="http://schemas.microsoft.com/office/word/2012/wordml" xmlns:w16cid="http://schemas.microsoft.com/office/word/2016/wordml/cid" xmlns:w16se="http://schemas.microsoft.com/office/word/2015/wordml/symex" mc:Ignorable="w14 w15 w16se w16cid">
+  <w:font w:name="Source Sans Pro">
+    <w:panose1 w:val="020B0503030403020204"/>
+    <w:charset w:val="00"/>
+    <w:family w:val="swiss"/>
+    <w:pitch w:val="variable"/>
+    <w:sig w:usb0="600002F7" w:usb1="02000001" w:usb2="00000000" w:usb3="00000000" w:csb0="0000019F" w:csb1="00000000"/>
+  </w:font>
+  <w:font w:name="Times New Roman">
+    <w:panose1 w:val="02020603050405020304"/>
+    <w:charset w:val="00"/>
+    <w:family w:val="roman"/>
+    <w:pitch w:val="variable"/>
+    <w:sig w:usb0="E0002EFF" w:usb1="C000785B" w:usb2="00000009" w:usb3="00000000" w:csb0="000001FF" w:csb1="00000000"/>
+  </w:font>
+  <w:font w:name="Arial">
+    <w:panose1 w:val="020B0604020202020204"/>
+    <w:charset w:val="00"/>
+    <w:family w:val="swiss"/>
+    <w:pitch w:val="variable"/>
+    <w:sig w:usb0="E0002EFF" w:usb1="C000785B" w:usb2="00000009" w:usb3="00000000" w:csb0="000001FF" w:csb1="00000000"/>
+  </w:font>
+  <w:font w:name="Courier New">
+    <w:panose1 w:val="02070309020205020404"/>
+    <w:charset w:val="00"/>
+    <w:family w:val="modern"/>
+    <w:pitch w:val="fixed"/>
+    <w:sig w:usb0="E0002EFF" w:usb1="C0007843" w:usb2="00000009" w:usb3="00000000" w:csb0="000001FF" w:csb1="00000000"/>
+  </w:font>
+  <w:font w:name="Wingdings">
+    <w:panose1 w:val="05000000000000000000"/>
+    <w:charset w:val="02"/>
+    <w:family w:val="auto"/>
+    <w:pitch w:val="variable"/>
+    <w:sig w:usb0="00000000" w:usb1="10000000" w:usb2="00000000" w:usb3="00000000" w:csb0="80000000" w:csb1="00000000"/>
+  </w:font>
+  <w:font w:name="Symbol">
+    <w:panose1 w:val="05050102010706020507"/>
+    <w:charset w:val="02"/>
+    <w:family w:val="roman"/>
+    <w:pitch w:val="variable"/>
+    <w:sig w:usb0="00000000" w:usb1="10000000" w:usb2="00000000" w:usb3="00000000" w:csb0="80000000" w:csb1="00000000"/>
+  </w:font>
+  <w:font w:name="Courier">
+    <w:altName w:val="Courier New"/>
+    <w:panose1 w:val="02070409020205020404"/>
+    <w:charset w:val="00"/>
+    <w:family w:val="modern"/>
+    <w:notTrueType/>
+    <w:pitch w:val="fixed"/>
+    <w:sig w:usb0="00000003" w:usb1="00000000" w:usb2="00000000" w:usb3="00000000" w:csb0="00000001" w:csb1="00000000"/>
+  </w:font>
+  <w:font w:name="ZapfDingbats">
+    <w:panose1 w:val="00000000000000000000"/>
+    <w:charset w:val="00"/>
+    <w:family w:val="decorative"/>
+    <w:notTrueType/>
+    <w:pitch w:val="variable"/>
+    <w:sig w:usb0="00000003" w:usb1="00000000" w:usb2="00000000" w:usb3="00000000" w:csb0="00000001" w:csb1="00000000"/>
+  </w:font>
+  <w:font w:name="Tahoma">
+    <w:panose1 w:val="020B0604030504040204"/>
+    <w:charset w:val="00"/>
+    <w:family w:val="swiss"/>
+    <w:pitch w:val="variable"/>
+    <w:sig w:usb0="E1002EFF" w:usb1="C000605B" w:usb2="00000029" w:usb3="00000000" w:csb0="000101FF" w:csb1="00000000"/>
+  </w:font>
+  <w:font w:name="SimSun">
+    <w:altName w:val="宋体"/>
+    <w:panose1 w:val="02010600030101010101"/>
+    <w:charset w:val="86"/>
+    <w:family w:val="auto"/>
+    <w:pitch w:val="variable"/>
+    <w:sig w:usb0="00000203" w:usb1="288F0000" w:usb2="00000016" w:usb3="00000000" w:csb0="00040001" w:csb1="00000000"/>
+  </w:font>
+  <w:font w:name="Cambria">
+    <w:panose1 w:val="02040503050406030204"/>
+    <w:charset w:val="00"/>
+    <w:family w:val="roman"/>
+    <w:pitch w:val="variable"/>
+    <w:sig w:usb0="E00006FF" w:usb1="420024FF" w:usb2="02000000" w:usb3="00000000" w:csb0="0000019F" w:csb1="00000000"/>
+  </w:font>
+  <w:font w:name="MS Mincho">
+    <w:altName w:val="ＭＳ 明朝"/>
+    <w:panose1 w:val="02020609040205080304"/>
+    <w:charset w:val="80"/>
+    <w:family w:val="modern"/>
+    <w:pitch w:val="fixed"/>
+    <w:sig w:usb0="E00002FF" w:usb1="6AC7FDFB" w:usb2="08000012" w:usb3="00000000" w:csb0="0002009F" w:csb1="00000000"/>
+  </w:font>
+  <w:font w:name="Source Sans Pro Semibold">
+    <w:panose1 w:val="020B0603030403020204"/>
+    <w:charset w:val="00"/>
+    <w:family w:val="swiss"/>
+    <w:pitch w:val="variable"/>
+    <w:sig w:usb0="600002F7" w:usb1="02000001" w:usb2="00000000" w:usb3="00000000" w:csb0="0000019F" w:csb1="00000000"/>
+  </w:font>
+  <w:font w:name="Calibri">
+    <w:panose1 w:val="020F0502020204030204"/>
+    <w:charset w:val="00"/>
+    <w:family w:val="swiss"/>
+    <w:pitch w:val="variable"/>
+    <w:sig w:usb0="E4002EFF" w:usb1="C200247B" w:usb2="00000009" w:usb3="00000000" w:csb0="000001FF" w:csb1="00000000"/>
+  </w:font>
+  <w:font w:name="Segoe UI">
+    <w:panose1 w:val="020B0502040204020203"/>
+    <w:charset w:val="00"/>
+    <w:family w:val="swiss"/>
+    <w:pitch w:val="variable"/>
+    <w:sig w:usb0="E4002EFF" w:usb1="C000E47F" w:usb2="00000009" w:usb3="00000000" w:csb0="000001FF" w:csb1="00000000"/>
+  </w:font>
+  <w:font w:name="Consolas">
+    <w:panose1 w:val="020B0609020204030204"/>
+    <w:charset w:val="00"/>
+    <w:family w:val="modern"/>
+    <w:pitch w:val="fixed"/>
+    <w:sig w:usb0="E00006FF" w:usb1="0000FCFF" w:usb2="00000001" w:usb3="00000000" w:csb0="0000019F" w:csb1="00000000"/>
+  </w:font>
+  <w:font w:name="SourceSansPro">
+    <w:altName w:val="Calibri"/>
+    <w:panose1 w:val="00000000000000000000"/>
+    <w:charset w:val="00"/>
+    <w:family w:val="auto"/>
+    <w:notTrueType/>
+    <w:pitch w:val="default"/>
+    <w:sig w:usb0="00000003" w:usb1="00000000" w:usb2="00000000" w:usb3="00000000" w:csb0="00000001" w:csb1="00000000"/>
+  </w:font>
+  <w:font w:name="Calibri Light">
+    <w:panose1 w:val="020F0302020204030204"/>
+    <w:charset w:val="00"/>
+    <w:family w:val="swiss"/>
+    <w:pitch w:val="variable"/>
+    <w:sig w:usb0="E4002EFF" w:usb1="C200247B" w:usb2="00000009" w:usb3="00000000" w:csb0="000001FF" w:csb1="00000000"/>
+  </w:font>
+</w:fonts>
+</file>
+
+<file path=word/glossary/settings.xml><?xml version="1.0" encoding="utf-8"?>
+<w:settings xmlns:mc="http://schemas.openxmlformats.org/markup-compatibility/2006" xmlns:o="urn:schemas-microsoft-com:office:office" xmlns:r="http://schemas.openxmlformats.org/officeDocument/2006/relationships" xmlns:m="http://schemas.openxmlformats.org/officeDocument/2006/math" xmlns:v="urn:schemas-microsoft-com:vml" xmlns:w10="urn:schemas-microsoft-com:office:word" xmlns:w="http://schemas.openxmlformats.org/wordprocessingml/2006/main" xmlns:w14="http://schemas.microsoft.com/office/word/2010/wordml" xmlns:w15="http://schemas.microsoft.com/office/word/2012/wordml" xmlns:w16cid="http://schemas.microsoft.com/office/word/2016/wordml/cid" xmlns:w16se="http://schemas.microsoft.com/office/word/2015/wordml/symex" xmlns:sl="http://schemas.openxmlformats.org/schemaLibrary/2006/main" mc:Ignorable="w14 w15 w16se w16cid">
+  <w:view w:val="normal"/>
+  <w:defaultTabStop w:val="720"/>
+  <w:characterSpacingControl w:val="doNotCompress"/>
+  <w:compat>
+    <w:useFELayout/>
+    <w:compatSetting w:name="compatibilityMode" w:uri="http://schemas.microsoft.com/office/word" w:val="15"/>
+    <w:compatSetting w:name="overrideTableStyleFontSizeAndJustification" w:uri="http://schemas.microsoft.com/office/word" w:val="1"/>
+    <w:compatSetting w:name="enableOpenTypeFeatures" w:uri="http://schemas.microsoft.com/office/word" w:val="1"/>
+    <w:compatSetting w:name="doNotFlipMirrorIndents" w:uri="http://schemas.microsoft.com/office/word" w:val="1"/>
+    <w:compatSetting w:name="differentiateMultirowTableHeaders" w:uri="http://schemas.microsoft.com/office/word" w:val="1"/>
+    <w:compatSetting w:name="useWord2013TrackBottomHyphenation" w:uri="http://schemas.microsoft.com/office/word" w:val="0"/>
+  </w:compat>
+  <w:rsids>
+    <w:rsidRoot w:val="00EC48F7"/>
+    <w:rsid w:val="00C92151"/>
+    <w:rsid w:val="00EC48F7"/>
+  </w:rsids>
+  <m:mathPr>
+    <m:mathFont m:val="Cambria Math"/>
+    <m:brkBin m:val="before"/>
+    <m:brkBinSub m:val="--"/>
+    <m:smallFrac m:val="0"/>
+    <m:dispDef/>
+    <m:lMargin m:val="0"/>
+    <m:rMargin m:val="0"/>
+    <m:defJc m:val="centerGroup"/>
+    <m:wrapIndent m:val="1440"/>
+    <m:intLim m:val="subSup"/>
+    <m:naryLim m:val="undOvr"/>
+  </m:mathPr>
+  <w:themeFontLang w:val="en-US"/>
+  <w:clrSchemeMapping w:bg1="light1" w:t1="dark1" w:bg2="light2" w:t2="dark2" w:accent1="accent1" w:accent2="accent2" w:accent3="accent3" w:accent4="accent4" w:accent5="accent5" w:accent6="accent6" w:hyperlink="hyperlink" w:followedHyperlink="followedHyperlink"/>
+  <w:decimalSymbol w:val="."/>
+  <w:listSeparator w:val=","/>
+  <w15:chartTrackingRefBased/>
+</w:settings>
+</file>
+
+<file path=word/glossary/styles.xml><?xml version="1.0" encoding="utf-8"?>
+<w:styles xmlns:mc="http://schemas.openxmlformats.org/markup-compatibility/2006" xmlns:r="http://schemas.openxmlformats.org/officeDocument/2006/relationships" xmlns:w="http://schemas.openxmlformats.org/wordprocessingml/2006/main" xmlns:w14="http://schemas.microsoft.com/office/word/2010/wordml" xmlns:w15="http://schemas.microsoft.com/office/word/2012/wordml" xmlns:w16cid="http://schemas.microsoft.com/office/word/2016/wordml/cid" xmlns:w16se="http://schemas.microsoft.com/office/word/2015/wordml/symex" mc:Ignorable="w14 w15 w16se w16cid">
+  <w:docDefaults>
+    <w:rPrDefault>
+      <w:rPr>
+        <w:rFonts w:asciiTheme="minorHAnsi" w:eastAsiaTheme="minorEastAsia" w:hAnsiTheme="minorHAnsi" w:cstheme="minorBidi"/>
+        <w:sz w:val="22"/>
+        <w:szCs w:val="22"/>
+        <w:lang w:val="en-US" w:eastAsia="en-US" w:bidi="ar-SA"/>
+      </w:rPr>
+    </w:rPrDefault>
+    <w:pPrDefault>
+      <w:pPr>
+        <w:spacing w:after="160" w:line="259" w:lineRule="auto"/>
+      </w:pPr>
+    </w:pPrDefault>
+  </w:docDefaults>
+  <w:latentStyles w:defLockedState="0" w:defUIPriority="99" w:defSemiHidden="0" w:defUnhideWhenUsed="0" w:defQFormat="0" w:count="375">
+    <w:lsdException w:name="Normal" w:uiPriority="0" w:qFormat="1"/>
+    <w:lsdException w:name="heading 1" w:uiPriority="9" w:qFormat="1"/>
+    <w:lsdException w:name="heading 2" w:semiHidden="1" w:uiPriority="9" w:unhideWhenUsed="1" w:qFormat="1"/>
+    <w:lsdException w:name="heading 3" w:semiHidden="1" w:uiPriority="9" w:unhideWhenUsed="1" w:qFormat="1"/>
+    <w:lsdException w:name="heading 4" w:semiHidden="1" w:uiPriority="9" w:unhideWhenUsed="1" w:qFormat="1"/>
+    <w:lsdException w:name="heading 5" w:semiHidden="1" w:uiPriority="9" w:unhideWhenUsed="1" w:qFormat="1"/>
+    <w:lsdException w:name="heading 6" w:semiHidden="1" w:uiPriority="9" w:unhideWhenUsed="1" w:qFormat="1"/>
+    <w:lsdException w:name="heading 7" w:semiHidden="1" w:uiPriority="9" w:unhideWhenUsed="1" w:qFormat="1"/>
+    <w:lsdException w:name="heading 8" w:semiHidden="1" w:uiPriority="9" w:unhideWhenUsed="1" w:qFormat="1"/>
+    <w:lsdException w:name="heading 9" w:semiHidden="1" w:uiPriority="9" w:unhideWhenUsed="1" w:qFormat="1"/>
+    <w:lsdException w:name="index 1" w:semiHidden="1" w:unhideWhenUsed="1"/>
+    <w:lsdException w:name="index 2" w:semiHidden="1" w:unhideWhenUsed="1"/>
+    <w:lsdException w:name="index 3" w:semiHidden="1" w:unhideWhenUsed="1"/>
+    <w:lsdException w:name="index 4" w:semiHidden="1" w:unhideWhenUsed="1"/>
+    <w:lsdException w:name="index 5" w:semiHidden="1" w:unhideWhenUsed="1"/>
+    <w:lsdException w:name="index 6" w:semiHidden="1" w:unhideWhenUsed="1"/>
+    <w:lsdException w:name="index 7" w:semiHidden="1" w:unhideWhenUsed="1"/>
+    <w:lsdException w:name="index 8" w:semiHidden="1" w:unhideWhenUsed="1"/>
+    <w:lsdException w:name="index 9" w:semiHidden="1" w:unhideWhenUsed="1"/>
+    <w:lsdException w:name="toc 1" w:semiHidden="1" w:uiPriority="39" w:unhideWhenUsed="1"/>
+    <w:lsdException w:name="toc 2" w:semiHidden="1" w:uiPriority="39" w:unhideWhenUsed="1"/>
+    <w:lsdException w:name="toc 3" w:semiHidden="1" w:uiPriority="39" w:unhideWhenUsed="1"/>
+    <w:lsdException w:name="toc 4" w:semiHidden="1" w:uiPriority="39" w:unhideWhenUsed="1"/>
+    <w:lsdException w:name="toc 5" w:semiHidden="1" w:uiPriority="39" w:unhideWhenUsed="1"/>
+    <w:lsdException w:name="toc 6" w:semiHidden="1" w:uiPriority="39" w:unhideWhenUsed="1"/>
+    <w:lsdException w:name="toc 7" w:semiHidden="1" w:uiPriority="39" w:unhideWhenUsed="1"/>
+    <w:lsdException w:name="toc 8" w:semiHidden="1" w:uiPriority="39" w:unhideWhenUsed="1"/>
+    <w:lsdException w:name="toc 9" w:semiHidden="1" w:uiPriority="39" w:unhideWhenUsed="1"/>
+    <w:lsdException w:name="Normal Indent" w:semiHidden="1" w:unhideWhenUsed="1"/>
+    <w:lsdException w:name="footnote text" w:semiHidden="1" w:unhideWhenUsed="1"/>
+    <w:lsdException w:name="annotation text" w:semiHidden="1" w:unhideWhenUsed="1"/>
+    <w:lsdException w:name="header" w:semiHidden="1" w:unhideWhenUsed="1"/>
+    <w:lsdException w:name="footer" w:semiHidden="1" w:unhideWhenUsed="1"/>
+    <w:lsdException w:name="index heading" w:semiHidden="1" w:unhideWhenUsed="1"/>
+    <w:lsdException w:name="caption" w:semiHidden="1" w:uiPriority="35" w:unhideWhenUsed="1" w:qFormat="1"/>
+    <w:lsdException w:name="table of figures" w:semiHidden="1" w:unhideWhenUsed="1"/>
+    <w:lsdException w:name="envelope address" w:semiHidden="1" w:unhideWhenUsed="1"/>
+    <w:lsdException w:name="envelope return" w:semiHidden="1" w:unhideWhenUsed="1"/>
+    <w:lsdException w:name="footnote reference" w:semiHidden="1" w:unhideWhenUsed="1"/>
+    <w:lsdException w:name="annotation reference" w:semiHidden="1" w:unhideWhenUsed="1"/>
+    <w:lsdException w:name="line number" w:semiHidden="1" w:unhideWhenUsed="1"/>
+    <w:lsdException w:name="page number" w:semiHidden="1" w:unhideWhenUsed="1"/>
+    <w:lsdException w:name="endnote reference" w:semiHidden="1" w:unhideWhenUsed="1"/>
+    <w:lsdException w:name="endnote text" w:semiHidden="1" w:unhideWhenUsed="1"/>
+    <w:lsdException w:name="table of authorities" w:semiHidden="1" w:unhideWhenUsed="1"/>
+    <w:lsdException w:name="macro" w:semiHidden="1" w:unhideWhenUsed="1"/>
+    <w:lsdException w:name="toa heading" w:semiHidden="1" w:unhideWhenUsed="1"/>
+    <w:lsdException w:name="List" w:semiHidden="1" w:unhideWhenUsed="1"/>
+    <w:lsdException w:name="List Bullet" w:semiHidden="1" w:unhideWhenUsed="1"/>
+    <w:lsdException w:name="List Number" w:semiHidden="1" w:unhideWhenUsed="1"/>
+    <w:lsdException w:name="List 2" w:semiHidden="1" w:unhideWhenUsed="1"/>
+    <w:lsdException w:name="List 3" w:semiHidden="1" w:unhideWhenUsed="1"/>
+    <w:lsdException w:name="List 4" w:semiHidden="1" w:unhideWhenUsed="1"/>
+    <w:lsdException w:name="List 5" w:semiHidden="1" w:unhideWhenUsed="1"/>
+    <w:lsdException w:name="List Bullet 2" w:semiHidden="1" w:unhideWhenUsed="1"/>
+    <w:lsdException w:name="List Bullet 3" w:semiHidden="1" w:unhideWhenUsed="1"/>
+    <w:lsdException w:name="List Bullet 4" w:semiHidden="1" w:unhideWhenUsed="1"/>
+    <w:lsdException w:name="List Bullet 5" w:semiHidden="1" w:unhideWhenUsed="1"/>
+    <w:lsdException w:name="List Number 2" w:semiHidden="1" w:unhideWhenUsed="1"/>
+    <w:lsdException w:name="List Number 3" w:semiHidden="1" w:unhideWhenUsed="1"/>
+    <w:lsdException w:name="List Number 4" w:semiHidden="1" w:unhideWhenUsed="1"/>
+    <w:lsdException w:name="List Number 5" w:semiHidden="1" w:unhideWhenUsed="1"/>
+    <w:lsdException w:name="Title" w:uiPriority="10" w:qFormat="1"/>
+    <w:lsdException w:name="Closing" w:semiHidden="1" w:unhideWhenUsed="1"/>
+    <w:lsdException w:name="Signature" w:semiHidden="1" w:unhideWhenUsed="1"/>
+    <w:lsdException w:name="Default Paragraph Font" w:semiHidden="1" w:uiPriority="1" w:unhideWhenUsed="1"/>
+    <w:lsdException w:name="Body Text" w:semiHidden="1" w:unhideWhenUsed="1"/>
+    <w:lsdException w:name="Body Text Indent" w:semiHidden="1" w:unhideWhenUsed="1"/>
+    <w:lsdException w:name="List Continue" w:semiHidden="1" w:unhideWhenUsed="1"/>
+    <w:lsdException w:name="List Continue 2" w:semiHidden="1" w:unhideWhenUsed="1"/>
+    <w:lsdException w:name="List Continue 3" w:semiHidden="1" w:unhideWhenUsed="1"/>
+    <w:lsdException w:name="List Continue 4" w:semiHidden="1" w:unhideWhenUsed="1"/>
+    <w:lsdException w:name="List Continue 5" w:semiHidden="1" w:unhideWhenUsed="1"/>
+    <w:lsdException w:name="Message Header" w:semiHidden="1" w:unhideWhenUsed="1"/>
+    <w:lsdException w:name="Subtitle" w:uiPriority="11" w:qFormat="1"/>
+    <w:lsdException w:name="Salutation" w:semiHidden="1" w:unhideWhenUsed="1"/>
+    <w:lsdException w:name="Date" w:semiHidden="1" w:unhideWhenUsed="1"/>
+    <w:lsdException w:name="Body Text First Indent" w:semiHidden="1" w:unhideWhenUsed="1"/>
+    <w:lsdException w:name="Body Text First Indent 2" w:semiHidden="1" w:unhideWhenUsed="1"/>
+    <w:lsdException w:name="Note Heading" w:semiHidden="1" w:unhideWhenUsed="1"/>
+    <w:lsdException w:name="Body Text 2" w:semiHidden="1" w:unhideWhenUsed="1"/>
+    <w:lsdException w:name="Body Text 3" w:semiHidden="1" w:unhideWhenUsed="1"/>
+    <w:lsdException w:name="Body Text Indent 2" w:semiHidden="1" w:unhideWhenUsed="1"/>
+    <w:lsdException w:name="Body Text Indent 3" w:semiHidden="1" w:unhideWhenUsed="1"/>
+    <w:lsdException w:name="Block Text" w:semiHidden="1" w:unhideWhenUsed="1"/>
+    <w:lsdException w:name="Hyperlink" w:semiHidden="1" w:unhideWhenUsed="1"/>
+    <w:lsdException w:name="FollowedHyperlink" w:semiHidden="1" w:unhideWhenUsed="1"/>
+    <w:lsdException w:name="Strong" w:uiPriority="22" w:qFormat="1"/>
+    <w:lsdException w:name="Emphasis" w:uiPriority="20" w:qFormat="1"/>
+    <w:lsdException w:name="Document Map" w:semiHidden="1" w:unhideWhenUsed="1"/>
+    <w:lsdException w:name="Plain Text" w:semiHidden="1" w:unhideWhenUsed="1"/>
+    <w:lsdException w:name="E-mail Signature" w:semiHidden="1" w:unhideWhenUsed="1"/>
+    <w:lsdException w:name="HTML Top of Form" w:semiHidden="1" w:unhideWhenUsed="1"/>
+    <w:lsdException w:name="HTML Bottom of Form" w:semiHidden="1" w:unhideWhenUsed="1"/>
+    <w:lsdException w:name="Normal (Web)" w:semiHidden="1" w:unhideWhenUsed="1"/>
+    <w:lsdException w:name="HTML Acronym" w:semiHidden="1" w:unhideWhenUsed="1"/>
+    <w:lsdException w:name="HTML Address" w:semiHidden="1" w:unhideWhenUsed="1"/>
+    <w:lsdException w:name="HTML Cite" w:semiHidden="1" w:unhideWhenUsed="1"/>
+    <w:lsdException w:name="HTML Code" w:semiHidden="1" w:unhideWhenUsed="1"/>
+    <w:lsdException w:name="HTML Definition" w:semiHidden="1" w:unhideWhenUsed="1"/>
+    <w:lsdException w:name="HTML Keyboard" w:semiHidden="1" w:unhideWhenUsed="1"/>
+    <w:lsdException w:name="HTML Preformatted" w:semiHidden="1" w:unhideWhenUsed="1"/>
+    <w:lsdException w:name="HTML Sample" w:semiHidden="1" w:unhideWhenUsed="1"/>
+    <w:lsdException w:name="HTML Typewriter" w:semiHidden="1" w:unhideWhenUsed="1"/>
+    <w:lsdException w:name="HTML Variable" w:semiHidden="1" w:unhideWhenUsed="1"/>
+    <w:lsdException w:name="Normal Table" w:semiHidden="1" w:unhideWhenUsed="1"/>
+    <w:lsdException w:name="annotation subject" w:semiHidden="1" w:unhideWhenUsed="1"/>
+    <w:lsdException w:name="No List" w:semiHidden="1" w:unhideWhenUsed="1"/>
+    <w:lsdException w:name="Outline List 1" w:semiHidden="1" w:unhideWhenUsed="1"/>
+    <w:lsdException w:name="Outline List 2" w:semiHidden="1" w:unhideWhenUsed="1"/>
+    <w:lsdException w:name="Outline List 3" w:semiHidden="1" w:unhideWhenUsed="1"/>
+    <w:lsdException w:name="Table Simple 1" w:semiHidden="1" w:unhideWhenUsed="1"/>
+    <w:lsdException w:name="Table Simple 2" w:semiHidden="1" w:unhideWhenUsed="1"/>
+    <w:lsdException w:name="Table Simple 3" w:semiHidden="1" w:unhideWhenUsed="1"/>
+    <w:lsdException w:name="Table Classic 1" w:semiHidden="1" w:unhideWhenUsed="1"/>
+    <w:lsdException w:name="Table Classic 2" w:semiHidden="1" w:unhideWhenUsed="1"/>
+    <w:lsdException w:name="Table Classic 3" w:semiHidden="1" w:unhideWhenUsed="1"/>
+    <w:lsdException w:name="Table Classic 4" w:semiHidden="1" w:unhideWhenUsed="1"/>
+    <w:lsdException w:name="Table Colorful 1" w:semiHidden="1" w:unhideWhenUsed="1"/>
+    <w:lsdException w:name="Table Colorful 2" w:semiHidden="1" w:unhideWhenUsed="1"/>
+    <w:lsdException w:name="Table Colorful 3" w:semiHidden="1" w:unhideWhenUsed="1"/>
+    <w:lsdException w:name="Table Columns 1" w:semiHidden="1" w:unhideWhenUsed="1"/>
+    <w:lsdException w:name="Table Columns 2" w:semiHidden="1" w:unhideWhenUsed="1"/>
+    <w:lsdException w:name="Table Columns 3" w:semiHidden="1" w:unhideWhenUsed="1"/>
+    <w:lsdException w:name="Table Columns 4" w:semiHidden="1" w:unhideWhenUsed="1"/>
+    <w:lsdException w:name="Table Columns 5" w:semiHidden="1" w:unhideWhenUsed="1"/>
+    <w:lsdException w:name="Table Grid 1" w:semiHidden="1" w:unhideWhenUsed="1"/>
+    <w:lsdException w:name="Table Grid 2" w:semiHidden="1" w:unhideWhenUsed="1"/>
+    <w:lsdException w:name="Table Grid 3" w:semiHidden="1" w:unhideWhenUsed="1"/>
+    <w:lsdException w:name="Table Grid 4" w:semiHidden="1" w:unhideWhenUsed="1"/>
+    <w:lsdException w:name="Table Grid 5" w:semiHidden="1" w:unhideWhenUsed="1"/>
+    <w:lsdException w:name="Table Grid 6" w:semiHidden="1" w:unhideWhenUsed="1"/>
+    <w:lsdException w:name="Table Grid 7" w:semiHidden="1" w:unhideWhenUsed="1"/>
+    <w:lsdException w:name="Table Grid 8" w:semiHidden="1" w:unhideWhenUsed="1"/>
+    <w:lsdException w:name="Table List 1" w:semiHidden="1" w:unhideWhenUsed="1"/>
+    <w:lsdException w:name="Table List 2" w:semiHidden="1" w:unhideWhenUsed="1"/>
+    <w:lsdException w:name="Table List 3" w:semiHidden="1" w:unhideWhenUsed="1"/>
+    <w:lsdException w:name="Table List 4" w:semiHidden="1" w:unhideWhenUsed="1"/>
+    <w:lsdException w:name="Table List 5" w:semiHidden="1" w:unhideWhenUsed="1"/>
+    <w:lsdException w:name="Table List 6" w:semiHidden="1" w:unhideWhenUsed="1"/>
+    <w:lsdException w:name="Table List 7" w:semiHidden="1" w:unhideWhenUsed="1"/>
+    <w:lsdException w:name="Table List 8" w:semiHidden="1" w:unhideWhenUsed="1"/>
+    <w:lsdException w:name="Table 3D effects 1" w:semiHidden="1" w:unhideWhenUsed="1"/>
+    <w:lsdException w:name="Table 3D effects 2" w:semiHidden="1" w:unhideWhenUsed="1"/>
+    <w:lsdException w:name="Table 3D effects 3" w:semiHidden="1" w:unhideWhenUsed="1"/>
+    <w:lsdException w:name="Table Contemporary" w:semiHidden="1" w:unhideWhenUsed="1"/>
+    <w:lsdException w:name="Table Elegant" w:semiHidden="1" w:unhideWhenUsed="1"/>
+    <w:lsdException w:name="Table Professional" w:semiHidden="1" w:unhideWhenUsed="1"/>
+    <w:lsdException w:name="Table Subtle 1" w:semiHidden="1" w:unhideWhenUsed="1"/>
+    <w:lsdException w:name="Table Subtle 2" w:semiHidden="1" w:unhideWhenUsed="1"/>
+    <w:lsdException w:name="Table Web 1" w:semiHidden="1" w:unhideWhenUsed="1"/>
+    <w:lsdException w:name="Table Web 2" w:semiHidden="1" w:unhideWhenUsed="1"/>
+    <w:lsdException w:name="Table Web 3" w:semiHidden="1" w:unhideWhenUsed="1"/>
+    <w:lsdException w:name="Balloon Text" w:semiHidden="1" w:unhideWhenUsed="1"/>
+    <w:lsdException w:name="Table Grid" w:uiPriority="39"/>
+    <w:lsdException w:name="Table Theme" w:semiHidden="1" w:unhideWhenUsed="1"/>
+    <w:lsdException w:name="Placeholder Text" w:semiHidden="1"/>
+    <w:lsdException w:name="No Spacing" w:uiPriority="1" w:qFormat="1"/>
+    <w:lsdException w:name="Light Shading" w:uiPriority="60"/>
+    <w:lsdException w:name="Light List" w:uiPriority="61"/>
+    <w:lsdException w:name="Light Grid" w:uiPriority="62"/>
+    <w:lsdException w:name="Medium Shading 1" w:uiPriority="63"/>
+    <w:lsdException w:name="Medium Shading 2" w:uiPriority="64"/>
+    <w:lsdException w:name="Medium List 1" w:uiPriority="65"/>
+    <w:lsdException w:name="Medium List 2" w:uiPriority="66"/>
+    <w:lsdException w:name="Medium Grid 1" w:uiPriority="67"/>
+    <w:lsdException w:name="Medium Grid 2" w:uiPriority="68"/>
+    <w:lsdException w:name="Medium Grid 3" w:uiPriority="69"/>
+    <w:lsdException w:name="Dark List" w:uiPriority="70"/>
+    <w:lsdException w:name="Colorful Shading" w:uiPriority="71"/>
+    <w:lsdException w:name="Colorful List" w:uiPriority="72"/>
+    <w:lsdException w:name="Colorful Grid" w:uiPriority="73"/>
+    <w:lsdException w:name="Light Shading Accent 1" w:uiPriority="60"/>
+    <w:lsdException w:name="Light List Accent 1" w:uiPriority="61"/>
+    <w:lsdException w:name="Light Grid Accent 1" w:uiPriority="62"/>
+    <w:lsdException w:name="Medium Shading 1 Accent 1" w:uiPriority="63"/>
+    <w:lsdException w:name="Medium Shading 2 Accent 1" w:uiPriority="64"/>
+    <w:lsdException w:name="Medium List 1 Accent 1" w:uiPriority="65"/>
+    <w:lsdException w:name="Revision" w:semiHidden="1"/>
+    <w:lsdException w:name="List Paragraph" w:uiPriority="34" w:qFormat="1"/>
+    <w:lsdException w:name="Quote" w:uiPriority="29" w:qFormat="1"/>
+    <w:lsdException w:name="Intense Quote" w:uiPriority="30" w:qFormat="1"/>
+    <w:lsdException w:name="Medium List 2 Accent 1" w:uiPriority="66"/>
+    <w:lsdException w:name="Medium Grid 1 Accent 1" w:uiPriority="67"/>
+    <w:lsdException w:name="Medium Grid 2 Accent 1" w:uiPriority="68"/>
+    <w:lsdException w:name="Medium Grid 3 Accent 1" w:uiPriority="69"/>
+    <w:lsdException w:name="Dark List Accent 1" w:uiPriority="70"/>
+    <w:lsdException w:name="Colorful Shading Accent 1" w:uiPriority="71"/>
+    <w:lsdException w:name="Colorful List Accent 1" w:uiPriority="72"/>
+    <w:lsdException w:name="Colorful Grid Accent 1" w:uiPriority="73"/>
+    <w:lsdException w:name="Light Shading Accent 2" w:uiPriority="60"/>
+    <w:lsdException w:name="Light List Accent 2" w:uiPriority="61"/>
+    <w:lsdException w:name="Light Grid Accent 2" w:uiPriority="62"/>
+    <w:lsdException w:name="Medium Shading 1 Accent 2" w:uiPriority="63"/>
+    <w:lsdException w:name="Medium Shading 2 Accent 2" w:uiPriority="64"/>
+    <w:lsdException w:name="Medium List 1 Accent 2" w:uiPriority="65"/>
+    <w:lsdException w:name="Medium List 2 Accent 2" w:uiPriority="66"/>
+    <w:lsdException w:name="Medium Grid 1 Accent 2" w:uiPriority="67"/>
+    <w:lsdException w:name="Medium Grid 2 Accent 2" w:uiPriority="68"/>
+    <w:lsdException w:name="Medium Grid 3 Accent 2" w:uiPriority="69"/>
+    <w:lsdException w:name="Dark List Accent 2" w:uiPriority="70"/>
+    <w:lsdException w:name="Colorful Shading Accent 2" w:uiPriority="71"/>
+    <w:lsdException w:name="Colorful List Accent 2" w:uiPriority="72"/>
+    <w:lsdException w:name="Colorful Grid Accent 2" w:uiPriority="73"/>
+    <w:lsdException w:name="Light Shading Accent 3" w:uiPriority="60"/>
+    <w:lsdException w:name="Light List Accent 3" w:uiPriority="61"/>
+    <w:lsdException w:name="Light Grid Accent 3" w:uiPriority="62"/>
+    <w:lsdException w:name="Medium Shading 1 Accent 3" w:uiPriority="63"/>
+    <w:lsdException w:name="Medium Shading 2 Accent 3" w:uiPriority="64"/>
+    <w:lsdException w:name="Medium List 1 Accent 3" w:uiPriority="65"/>
+    <w:lsdException w:name="Medium List 2 Accent 3" w:uiPriority="66"/>
+    <w:lsdException w:name="Medium Grid 1 Accent 3" w:uiPriority="67"/>
+    <w:lsdException w:name="Medium Grid 2 Accent 3" w:uiPriority="68"/>
+    <w:lsdException w:name="Medium Grid 3 Accent 3" w:uiPriority="69"/>
+    <w:lsdException w:name="Dark List Accent 3" w:uiPriority="70"/>
+    <w:lsdException w:name="Colorful Shading Accent 3" w:uiPriority="71"/>
+    <w:lsdException w:name="Colorful List Accent 3" w:uiPriority="72"/>
+    <w:lsdException w:name="Colorful Grid Accent 3" w:uiPriority="73"/>
+    <w:lsdException w:name="Light Shading Accent 4" w:uiPriority="60"/>
+    <w:lsdException w:name="Light List Accent 4" w:uiPriority="61"/>
+    <w:lsdException w:name="Light Grid Accent 4" w:uiPriority="62"/>
+    <w:lsdException w:name="Medium Shading 1 Accent 4" w:uiPriority="63"/>
+    <w:lsdException w:name="Medium Shading 2 Accent 4" w:uiPriority="64"/>
+    <w:lsdException w:name="Medium List 1 Accent 4" w:uiPriority="65"/>
+    <w:lsdException w:name="Medium List 2 Accent 4" w:uiPriority="66"/>
+    <w:lsdException w:name="Medium Grid 1 Accent 4" w:uiPriority="67"/>
+    <w:lsdException w:name="Medium Grid 2 Accent 4" w:uiPriority="68"/>
+    <w:lsdException w:name="Medium Grid 3 Accent 4" w:uiPriority="69"/>
+    <w:lsdException w:name="Dark List Accent 4" w:uiPriority="70"/>
+    <w:lsdException w:name="Colorful Shading Accent 4" w:uiPriority="71"/>
+    <w:lsdException w:name="Colorful List Accent 4" w:uiPriority="72"/>
+    <w:lsdException w:name="Colorful Grid Accent 4" w:uiPriority="73"/>
+    <w:lsdException w:name="Light Shading Accent 5" w:uiPriority="60"/>
+    <w:lsdException w:name="Light List Accent 5" w:uiPriority="61"/>
+    <w:lsdException w:name="Light Grid Accent 5" w:uiPriority="62"/>
+    <w:lsdException w:name="Medium Shading 1 Accent 5" w:uiPriority="63"/>
+    <w:lsdException w:name="Medium Shading 2 Accent 5" w:uiPriority="64"/>
+    <w:lsdException w:name="Medium List 1 Accent 5" w:uiPriority="65"/>
+    <w:lsdException w:name="Medium List 2 Accent 5" w:uiPriority="66"/>
+    <w:lsdException w:name="Medium Grid 1 Accent 5" w:uiPriority="67"/>
+    <w:lsdException w:name="Medium Grid 2 Accent 5" w:uiPriority="68"/>
+    <w:lsdException w:name="Medium Grid 3 Accent 5" w:uiPriority="69"/>
+    <w:lsdException w:name="Dark List Accent 5" w:uiPriority="70"/>
+    <w:lsdException w:name="Colorful Shading Accent 5" w:uiPriority="71"/>
+    <w:lsdException w:name="Colorful List Accent 5" w:uiPriority="72"/>
+    <w:lsdException w:name="Colorful Grid Accent 5" w:uiPriority="73"/>
+    <w:lsdException w:name="Light Shading Accent 6" w:uiPriority="60"/>
+    <w:lsdException w:name="Light List Accent 6" w:uiPriority="61"/>
+    <w:lsdException w:name="Light Grid Accent 6" w:uiPriority="62"/>
+    <w:lsdException w:name="Medium Shading 1 Accent 6" w:uiPriority="63"/>
+    <w:lsdException w:name="Medium Shading 2 Accent 6" w:uiPriority="64"/>
+    <w:lsdException w:name="Medium List 1 Accent 6" w:uiPriority="65"/>
+    <w:lsdException w:name="Medium List 2 Accent 6" w:uiPriority="66"/>
+    <w:lsdException w:name="Medium Grid 1 Accent 6" w:uiPriority="67"/>
+    <w:lsdException w:name="Medium Grid 2 Accent 6" w:uiPriority="68"/>
+    <w:lsdException w:name="Medium Grid 3 Accent 6" w:uiPriority="69"/>
+    <w:lsdException w:name="Dark List Accent 6" w:uiPriority="70"/>
+    <w:lsdException w:name="Colorful Shading Accent 6" w:uiPriority="71"/>
+    <w:lsdException w:name="Colorful List Accent 6" w:uiPriority="72"/>
+    <w:lsdException w:name="Colorful Grid Accent 6" w:uiPriority="73"/>
+    <w:lsdException w:name="Subtle Emphasis" w:uiPriority="19" w:qFormat="1"/>
+    <w:lsdException w:name="Intense Emphasis" w:uiPriority="21" w:qFormat="1"/>
+    <w:lsdException w:name="Subtle Reference" w:uiPriority="31" w:qFormat="1"/>
+    <w:lsdException w:name="Intense Reference" w:uiPriority="32" w:qFormat="1"/>
+    <w:lsdException w:name="Book Title" w:uiPriority="33" w:qFormat="1"/>
+    <w:lsdException w:name="Bibliography" w:semiHidden="1" w:uiPriority="37" w:unhideWhenUsed="1"/>
+    <w:lsdException w:name="TOC Heading" w:semiHidden="1" w:uiPriority="39" w:unhideWhenUsed="1" w:qFormat="1"/>
+    <w:lsdException w:name="Plain Table 1" w:uiPriority="41"/>
+    <w:lsdException w:name="Plain Table 2" w:uiPriority="42"/>
+    <w:lsdException w:name="Plain Table 3" w:uiPriority="43"/>
+    <w:lsdException w:name="Plain Table 4" w:uiPriority="44"/>
+    <w:lsdException w:name="Plain Table 5" w:uiPriority="45"/>
+    <w:lsdException w:name="Grid Table Light" w:uiPriority="40"/>
+    <w:lsdException w:name="Grid Table 1 Light" w:uiPriority="46"/>
+    <w:lsdException w:name="Grid Table 2" w:uiPriority="47"/>
+    <w:lsdException w:name="Grid Table 3" w:uiPriority="48"/>
+    <w:lsdException w:name="Grid Table 4" w:uiPriority="49"/>
+    <w:lsdException w:name="Grid Table 5 Dark" w:uiPriority="50"/>
+    <w:lsdException w:name="Grid Table 6 Colorful" w:uiPriority="51"/>
+    <w:lsdException w:name="Grid Table 7 Colorful" w:uiPriority="52"/>
+    <w:lsdException w:name="Grid Table 1 Light Accent 1" w:uiPriority="46"/>
+    <w:lsdException w:name="Grid Table 2 Accent 1" w:uiPriority="47"/>
+    <w:lsdException w:name="Grid Table 3 Accent 1" w:uiPriority="48"/>
+    <w:lsdException w:name="Grid Table 4 Accent 1" w:uiPriority="49"/>
+    <w:lsdException w:name="Grid Table 5 Dark Accent 1" w:uiPriority="50"/>
+    <w:lsdException w:name="Grid Table 6 Colorful Accent 1" w:uiPriority="51"/>
+    <w:lsdException w:name="Grid Table 7 Colorful Accent 1" w:uiPriority="52"/>
+    <w:lsdException w:name="Grid Table 1 Light Accent 2" w:uiPriority="46"/>
+    <w:lsdException w:name="Grid Table 2 Accent 2" w:uiPriority="47"/>
+    <w:lsdException w:name="Grid Table 3 Accent 2" w:uiPriority="48"/>
+    <w:lsdException w:name="Grid Table 4 Accent 2" w:uiPriority="49"/>
+    <w:lsdException w:name="Grid Table 5 Dark Accent 2" w:uiPriority="50"/>
+    <w:lsdException w:name="Grid Table 6 Colorful Accent 2" w:uiPriority="51"/>
+    <w:lsdException w:name="Grid Table 7 Colorful Accent 2" w:uiPriority="52"/>
+    <w:lsdException w:name="Grid Table 1 Light Accent 3" w:uiPriority="46"/>
+    <w:lsdException w:name="Grid Table 2 Accent 3" w:uiPriority="47"/>
+    <w:lsdException w:name="Grid Table 3 Accent 3" w:uiPriority="48"/>
+    <w:lsdException w:name="Grid Table 4 Accent 3" w:uiPriority="49"/>
+    <w:lsdException w:name="Grid Table 5 Dark Accent 3" w:uiPriority="50"/>
+    <w:lsdException w:name="Grid Table 6 Colorful Accent 3" w:uiPriority="51"/>
+    <w:lsdException w:name="Grid Table 7 Colorful Accent 3" w:uiPriority="52"/>
+    <w:lsdException w:name="Grid Table 1 Light Accent 4" w:uiPriority="46"/>
+    <w:lsdException w:name="Grid Table 2 Accent 4" w:uiPriority="47"/>
+    <w:lsdException w:name="Grid Table 3 Accent 4" w:uiPriority="48"/>
+    <w:lsdException w:name="Grid Table 4 Accent 4" w:uiPriority="49"/>
+    <w:lsdException w:name="Grid Table 5 Dark Accent 4" w:uiPriority="50"/>
+    <w:lsdException w:name="Grid Table 6 Colorful Accent 4" w:uiPriority="51"/>
+    <w:lsdException w:name="Grid Table 7 Colorful Accent 4" w:uiPriority="52"/>
+    <w:lsdException w:name="Grid Table 1 Light Accent 5" w:uiPriority="46"/>
+    <w:lsdException w:name="Grid Table 2 Accent 5" w:uiPriority="47"/>
+    <w:lsdException w:name="Grid Table 3 Accent 5" w:uiPriority="48"/>
+    <w:lsdException w:name="Grid Table 4 Accent 5" w:uiPriority="49"/>
+    <w:lsdException w:name="Grid Table 5 Dark Accent 5" w:uiPriority="50"/>
+    <w:lsdException w:name="Grid Table 6 Colorful Accent 5" w:uiPriority="51"/>
+    <w:lsdException w:name="Grid Table 7 Colorful Accent 5" w:uiPriority="52"/>
+    <w:lsdException w:name="Grid Table 1 Light Accent 6" w:uiPriority="46"/>
+    <w:lsdException w:name="Grid Table 2 Accent 6" w:uiPriority="47"/>
+    <w:lsdException w:name="Grid Table 3 Accent 6" w:uiPriority="48"/>
+    <w:lsdException w:name="Grid Table 4 Accent 6" w:uiPriority="49"/>
+    <w:lsdException w:name="Grid Table 5 Dark Accent 6" w:uiPriority="50"/>
+    <w:lsdException w:name="Grid Table 6 Colorful Accent 6" w:uiPriority="51"/>
+    <w:lsdException w:name="Grid Table 7 Colorful Accent 6" w:uiPriority="52"/>
+    <w:lsdException w:name="List Table 1 Light" w:uiPriority="46"/>
+    <w:lsdException w:name="List Table 2" w:uiPriority="47"/>
+    <w:lsdException w:name="List Table 3" w:uiPriority="48"/>
+    <w:lsdException w:name="List Table 4" w:uiPriority="49"/>
+    <w:lsdException w:name="List Table 5 Dark" w:uiPriority="50"/>
+    <w:lsdException w:name="List Table 6 Colorful" w:uiPriority="51"/>
+    <w:lsdException w:name="List Table 7 Colorful" w:uiPriority="52"/>
+    <w:lsdException w:name="List Table 1 Light Accent 1" w:uiPriority="46"/>
+    <w:lsdException w:name="List Table 2 Accent 1" w:uiPriority="47"/>
+    <w:lsdException w:name="List Table 3 Accent 1" w:uiPriority="48"/>
+    <w:lsdException w:name="List Table 4 Accent 1" w:uiPriority="49"/>
+    <w:lsdException w:name="List Table 5 Dark Accent 1" w:uiPriority="50"/>
+    <w:lsdException w:name="List Table 6 Colorful Accent 1" w:uiPriority="51"/>
+    <w:lsdException w:name="List Table 7 Colorful Accent 1" w:uiPriority="52"/>
+    <w:lsdException w:name="List Table 1 Light Accent 2" w:uiPriority="46"/>
+    <w:lsdException w:name="List Table 2 Accent 2" w:uiPriority="47"/>
+    <w:lsdException w:name="List Table 3 Accent 2" w:uiPriority="48"/>
+    <w:lsdException w:name="List Table 4 Accent 2" w:uiPriority="49"/>
+    <w:lsdException w:name="List Table 5 Dark Accent 2" w:uiPriority="50"/>
+    <w:lsdException w:name="List Table 6 Colorful Accent 2" w:uiPriority="51"/>
+    <w:lsdException w:name="List Table 7 Colorful Accent 2" w:uiPriority="52"/>
+    <w:lsdException w:name="List Table 1 Light Accent 3" w:uiPriority="46"/>
+    <w:lsdException w:name="List Table 2 Accent 3" w:uiPriority="47"/>
+    <w:lsdException w:name="List Table 3 Accent 3" w:uiPriority="48"/>
+    <w:lsdException w:name="List Table 4 Accent 3" w:uiPriority="49"/>
+    <w:lsdException w:name="List Table 5 Dark Accent 3" w:uiPriority="50"/>
+    <w:lsdException w:name="List Table 6 Colorful Accent 3" w:uiPriority="51"/>
+    <w:lsdException w:name="List Table 7 Colorful Accent 3" w:uiPriority="52"/>
+    <w:lsdException w:name="List Table 1 Light Accent 4" w:uiPriority="46"/>
+    <w:lsdException w:name="List Table 2 Accent 4" w:uiPriority="47"/>
+    <w:lsdException w:name="List Table 3 Accent 4" w:uiPriority="48"/>
+    <w:lsdException w:name="List Table 4 Accent 4" w:uiPriority="49"/>
+    <w:lsdException w:name="List Table 5 Dark Accent 4" w:uiPriority="50"/>
+    <w:lsdException w:name="List Table 6 Colorful Accent 4" w:uiPriority="51"/>
+    <w:lsdException w:name="List Table 7 Colorful Accent 4" w:uiPriority="52"/>
+    <w:lsdException w:name="List Table 1 Light Accent 5" w:uiPriority="46"/>
+    <w:lsdException w:name="List Table 2 Accent 5" w:uiPriority="47"/>
+    <w:lsdException w:name="List Table 3 Accent 5" w:uiPriority="48"/>
+    <w:lsdException w:name="List Table 4 Accent 5" w:uiPriority="49"/>
+    <w:lsdException w:name="List Table 5 Dark Accent 5" w:uiPriority="50"/>
+    <w:lsdException w:name="List Table 6 Colorful Accent 5" w:uiPriority="51"/>
+    <w:lsdException w:name="List Table 7 Colorful Accent 5" w:uiPriority="52"/>
+    <w:lsdException w:name="List Table 1 Light Accent 6" w:uiPriority="46"/>
+    <w:lsdException w:name="List Table 2 Accent 6" w:uiPriority="47"/>
+    <w:lsdException w:name="List Table 3 Accent 6" w:uiPriority="48"/>
+    <w:lsdException w:name="List Table 4 Accent 6" w:uiPriority="49"/>
+    <w:lsdException w:name="List Table 5 Dark Accent 6" w:uiPriority="50"/>
+    <w:lsdException w:name="List Table 6 Colorful Accent 6" w:uiPriority="51"/>
+    <w:lsdException w:name="List Table 7 Colorful Accent 6" w:uiPriority="52"/>
+    <w:lsdException w:name="Mention" w:semiHidden="1" w:unhideWhenUsed="1"/>
+    <w:lsdException w:name="Smart Hyperlink" w:semiHidden="1" w:unhideWhenUsed="1"/>
+    <w:lsdException w:name="Hashtag" w:semiHidden="1" w:unhideWhenUsed="1"/>
+    <w:lsdException w:name="Unresolved Mention" w:semiHidden="1" w:unhideWhenUsed="1"/>
+  </w:latentStyles>
+  <w:style w:type="paragraph" w:default="1" w:styleId="Normal">
+    <w:name w:val="Normal"/>
+    <w:qFormat/>
+  </w:style>
+  <w:style w:type="character" w:default="1" w:styleId="DefaultParagraphFont">
+    <w:name w:val="Default Paragraph Font"/>
+    <w:uiPriority w:val="1"/>
+    <w:semiHidden/>
+    <w:unhideWhenUsed/>
+  </w:style>
+  <w:style w:type="table" w:default="1" w:styleId="TableNormal">
+    <w:name w:val="Normal Table"/>
+    <w:uiPriority w:val="99"/>
+    <w:semiHidden/>
+    <w:unhideWhenUsed/>
+    <w:tblPr>
+      <w:tblInd w:w="0" w:type="dxa"/>
+      <w:tblCellMar>
+        <w:top w:w="0" w:type="dxa"/>
+        <w:left w:w="108" w:type="dxa"/>
+        <w:bottom w:w="0" w:type="dxa"/>
+        <w:right w:w="108" w:type="dxa"/>
+      </w:tblCellMar>
+    </w:tblPr>
+  </w:style>
+  <w:style w:type="numbering" w:default="1" w:styleId="NoList">
+    <w:name w:val="No List"/>
+    <w:uiPriority w:val="99"/>
+    <w:semiHidden/>
+    <w:unhideWhenUsed/>
+  </w:style>
+  <w:style w:type="character" w:styleId="PlaceholderText">
+    <w:name w:val="Placeholder Text"/>
+    <w:basedOn w:val="DefaultParagraphFont"/>
+    <w:uiPriority w:val="99"/>
+    <w:semiHidden/>
+    <w:rsid w:val="00EC48F7"/>
+    <w:rPr>
+      <w:color w:val="808080"/>
+    </w:rPr>
+  </w:style>
+</w:styles>
+</file>
+
+<file path=word/glossary/webSettings.xml><?xml version="1.0" encoding="utf-8"?>
+<w:webSettings xmlns:mc="http://schemas.openxmlformats.org/markup-compatibility/2006" xmlns:r="http://schemas.openxmlformats.org/officeDocument/2006/relationships" xmlns:w="http://schemas.openxmlformats.org/wordprocessingml/2006/main" xmlns:w14="http://schemas.microsoft.com/office/word/2010/wordml" xmlns:w15="http://schemas.microsoft.com/office/word/2012/wordml" xmlns:w16cid="http://schemas.microsoft.com/office/word/2016/wordml/cid" xmlns:w16se="http://schemas.microsoft.com/office/word/2015/wordml/symex" mc:Ignorable="w14 w15 w16se w16cid">
+  <w:optimizeForBrowser/>
+  <w:allowPNG/>
+</w:webSettings>
 </file>
 
 <file path=word/theme/theme1.xml><?xml version="1.0" encoding="utf-8"?>
@@ -46809,6 +47510,31 @@
 </file>
 
 <file path=customXml/item4.xml><?xml version="1.0" encoding="utf-8"?>
+<DocsTemplateContainer xmlns="http://www.made-in-office.com/empower/docs/template/v1">
+  <DocsTextTemplateDictionary/>
+  <DocsImageTemplateDictionary/>
+  <ImageElements/>
+  <TextBlockElements>
+    <TextBlockMetadata>
+      <ElementId>1a622969-9435-42df-b756-4af60deadd4b</ElementId>
+      <ContentTag>YzCqVxr4CkGOIjtz8kQsF1txdvNf0IhJnc8A53W8JnY=</ContentTag>
+      <TimestampUtc>2023-08-07T12:57:01.087Z</TimestampUtc>
+      <TextBlockMetadataId>81c2738b-584a-4fa9-a420-fa91ec5ce67e</TextBlockMetadataId>
+    </TextBlockMetadata>
+    <TextBlockMetadata>
+      <ElementId>1a622969-9435-42df-b756-4af60deadd4b</ElementId>
+      <ContentTag>YzCqVxr4CkGOIjtz8kQsF1txdvNf0IhJnc8A53W8JnY=</ContentTag>
+      <TimestampUtc>2023-08-07T12:57:01.087Z</TimestampUtc>
+      <TextBlockMetadataId>50720dae-b0d4-4194-b190-edb8d80cd456</TextBlockMetadataId>
+    </TextBlockMetadata>
+  </TextBlockElements>
+  <PlaceholderHiddenState>
+    <HideablePlaceholderGuids/>
+  </PlaceholderHiddenState>
+</DocsTemplateContainer>
+</file>
+
+<file path=customXml/item5.xml><?xml version="1.0" encoding="utf-8"?>
 <b:Sources xmlns:b="http://schemas.openxmlformats.org/officeDocument/2006/bibliography" xmlns="http://schemas.openxmlformats.org/officeDocument/2006/bibliography" SelectedStyle="\APA.XSL" StyleName="APA"/>
 </file>
 
@@ -46848,7 +47574,15 @@
 </file>
 
 <file path=customXml/itemProps4.xml><?xml version="1.0" encoding="utf-8"?>
-<ds:datastoreItem xmlns:ds="http://schemas.openxmlformats.org/officeDocument/2006/customXml" ds:itemID="{AD023844-6BDA-4C0A-99BA-91900E9E6831}">
+<ds:datastoreItem xmlns:ds="http://schemas.openxmlformats.org/officeDocument/2006/customXml" ds:itemID="{B00B0D19-42EE-444B-AC65-8BFEBA8F6F93}">
+  <ds:schemaRefs>
+    <ds:schemaRef ds:uri="http://www.made-in-office.com/empower/docs/template/v1"/>
+  </ds:schemaRefs>
+</ds:datastoreItem>
+</file>
+
+<file path=customXml/itemProps5.xml><?xml version="1.0" encoding="utf-8"?>
+<ds:datastoreItem xmlns:ds="http://schemas.openxmlformats.org/officeDocument/2006/customXml" ds:itemID="{E748F454-96DA-4530-9ABF-FE825D7393C3}">
   <ds:schemaRefs>
     <ds:schemaRef ds:uri="http://schemas.openxmlformats.org/officeDocument/2006/bibliography"/>
   </ds:schemaRefs>

</xml_diff>

<commit_message>
Adding figure frames for initial flow charts and hardward setup for Hello World Lab
</commit_message>
<xml_diff>
--- a/.internal/Manual/Intro to PSOC Edge E84 - Part 2 (E2)/PSoC Edge E84 Introductory E2 Training Manual -WIP_10_21_2025.docx
+++ b/.internal/Manual/Intro to PSOC Edge E84 - Part 2 (E2)/PSoC Edge E84 Introductory E2 Training Manual -WIP_10_21_2025.docx
@@ -3385,34 +3385,114 @@
         <w:pStyle w:val="Body"/>
         <w:ind w:left="1418"/>
       </w:pPr>
-      <w:r>
-        <w:object w:dxaOrig="15204" w:dyaOrig="18816" w14:anchorId="1C21B7D7">
-          <v:shapetype id="_x0000_t75" coordsize="21600,21600" o:spt="75" o:preferrelative="t" path="m@4@5l@4@11@9@11@9@5xe" filled="f" stroked="f">
-            <v:stroke joinstyle="miter"/>
-            <v:formulas>
-              <v:f eqn="if lineDrawn pixelLineWidth 0"/>
-              <v:f eqn="sum @0 1 0"/>
-              <v:f eqn="sum 0 0 @1"/>
-              <v:f eqn="prod @2 1 2"/>
-              <v:f eqn="prod @3 21600 pixelWidth"/>
-              <v:f eqn="prod @3 21600 pixelHeight"/>
-              <v:f eqn="sum @0 0 1"/>
-              <v:f eqn="prod @6 1 2"/>
-              <v:f eqn="prod @7 21600 pixelWidth"/>
-              <v:f eqn="sum @8 21600 0"/>
-              <v:f eqn="prod @7 21600 pixelHeight"/>
-              <v:f eqn="sum @10 21600 0"/>
-            </v:formulas>
-            <v:path o:extrusionok="f" gradientshapeok="t" o:connecttype="rect"/>
-            <o:lock v:ext="edit" aspectratio="t"/>
-          </v:shapetype>
-          <v:shape id="_x0000_i1025" type="#_x0000_t75" style="width:475.7pt;height:588.05pt" o:ole="">
-            <v:imagedata r:id="rId24" o:title=""/>
-          </v:shape>
-          <o:OLEObject Type="Embed" ProgID="Visio.Drawing.15" ShapeID="_x0000_i1025" DrawAspect="Content" ObjectID="_1823347316" r:id="rId25"/>
-        </w:object>
-      </w:r>
-    </w:p>
+    </w:p>
+    <w:sdt>
+      <w:sdtPr>
+        <w:alias w:val="mioTextBlock"/>
+        <w:tag w:val="6799000e-da23-48ac-b090-8c624221224a"/>
+        <w:id w:val="-1217652705"/>
+        <w:placeholder>
+          <w:docPart w:val="DefaultPlaceholder_-1854013440"/>
+        </w:placeholder>
+        <w15:appearance w15:val="hidden"/>
+      </w:sdtPr>
+      <w:sdtEndPr>
+        <w:rPr>
+          <w:b/>
+          <w:lang w:eastAsia="en-US"/>
+        </w:rPr>
+      </w:sdtEndPr>
+      <w:sdtContent>
+        <w:tbl>
+          <w:tblPr>
+            <w:tblStyle w:val="InfineonPicture"/>
+            <w:tblW w:w="5000" w:type="pct"/>
+            <w:tblCellMar>
+              <w:left w:w="0" w:type="dxa"/>
+              <w:right w:w="0" w:type="dxa"/>
+            </w:tblCellMar>
+            <w:tblLook w:val="05E0" w:firstRow="1" w:lastRow="1" w:firstColumn="1" w:lastColumn="1" w:noHBand="0" w:noVBand="1"/>
+          </w:tblPr>
+          <w:tblGrid>
+            <w:gridCol w:w="10196"/>
+          </w:tblGrid>
+          <w:tr>
+            <w:tc>
+              <w:tcPr>
+                <w:tcW w:w="5000" w:type="pct"/>
+              </w:tcPr>
+              <w:p>
+                <w:pPr>
+                  <w:pStyle w:val="TableCell-c"/>
+                </w:pPr>
+                <w:r>
+                  <w:object w:dxaOrig="15204" w:dyaOrig="18816" w14:anchorId="737D8556">
+                    <v:shapetype id="_x0000_t75" coordsize="21600,21600" o:spt="75" o:preferrelative="t" path="m@4@5l@4@11@9@11@9@5xe" filled="f" stroked="f">
+                      <v:stroke joinstyle="miter"/>
+                      <v:formulas>
+                        <v:f eqn="if lineDrawn pixelLineWidth 0"/>
+                        <v:f eqn="sum @0 1 0"/>
+                        <v:f eqn="sum 0 0 @1"/>
+                        <v:f eqn="prod @2 1 2"/>
+                        <v:f eqn="prod @3 21600 pixelWidth"/>
+                        <v:f eqn="prod @3 21600 pixelHeight"/>
+                        <v:f eqn="sum @0 0 1"/>
+                        <v:f eqn="prod @6 1 2"/>
+                        <v:f eqn="prod @7 21600 pixelWidth"/>
+                        <v:f eqn="sum @8 21600 0"/>
+                        <v:f eqn="prod @7 21600 pixelHeight"/>
+                        <v:f eqn="sum @10 21600 0"/>
+                      </v:formulas>
+                      <v:path o:extrusionok="f" gradientshapeok="t" o:connecttype="rect"/>
+                      <o:lock v:ext="edit" aspectratio="t"/>
+                    </v:shapetype>
+                    <v:shape id="_x0000_i1030" type="#_x0000_t75" style="width:475.7pt;height:588.05pt" o:ole="">
+                      <v:imagedata r:id="rId24" o:title=""/>
+                    </v:shape>
+                    <o:OLEObject Type="Embed" ProgID="Visio.Drawing.15" ShapeID="_x0000_i1030" DrawAspect="Content" ObjectID="_1823347492" r:id="rId25"/>
+                  </w:object>
+                </w:r>
+              </w:p>
+            </w:tc>
+          </w:tr>
+        </w:tbl>
+        <w:p>
+          <w:pPr>
+            <w:pStyle w:val="Figuretitlenew"/>
+          </w:pPr>
+          <w:r>
+            <w:t xml:space="preserve">Figure </w:t>
+          </w:r>
+          <w:r>
+            <w:fldChar w:fldCharType="begin"/>
+          </w:r>
+          <w:r>
+            <w:instrText xml:space="preserve"> SEQ Figure \* ARABIC </w:instrText>
+          </w:r>
+          <w:r>
+            <w:fldChar w:fldCharType="separate"/>
+          </w:r>
+          <w:r>
+            <w:rPr>
+              <w:noProof/>
+            </w:rPr>
+            <w:t>2</w:t>
+          </w:r>
+          <w:r>
+            <w:fldChar w:fldCharType="end"/>
+          </w:r>
+          <w:r>
+            <w:tab/>
+          </w:r>
+          <w:r>
+            <w:rPr>
+              <w:highlight w:val="yellow"/>
+            </w:rPr>
+            <w:t>Example figure</w:t>
+          </w:r>
+        </w:p>
+      </w:sdtContent>
+    </w:sdt>
     <w:p>
       <w:pPr>
         <w:pStyle w:val="Body"/>
@@ -3428,39 +3508,112 @@
     <w:p>
       <w:pPr>
         <w:pStyle w:val="Body"/>
-        <w:ind w:left="1418"/>
-      </w:pPr>
+      </w:pPr>
+      <w:r>
+        <w:t>Below flow chart explains the flow of CM</w:t>
+      </w:r>
+      <w:r>
+        <w:t>55</w:t>
+      </w:r>
+      <w:r>
+        <w:t xml:space="preserve"> project </w:t>
+      </w:r>
     </w:p>
     <w:p>
       <w:pPr>
         <w:pStyle w:val="Body"/>
         <w:ind w:left="1418"/>
-      </w:pPr>
-      <w:r>
-        <w:t>Below flow chart explains the flow of CM</w:t>
-      </w:r>
-      <w:r>
-        <w:t>55</w:t>
-      </w:r>
-      <w:r>
-        <w:t xml:space="preserve"> project </w:t>
-      </w:r>
-    </w:p>
-    <w:p>
-      <w:pPr>
-        <w:pStyle w:val="Body"/>
-        <w:ind w:left="1418"/>
         <w:jc w:val="center"/>
       </w:pPr>
-      <w:r>
-        <w:object w:dxaOrig="4404" w:dyaOrig="4296" w14:anchorId="54967411">
-          <v:shape id="_x0000_i1026" type="#_x0000_t75" style="width:116.95pt;height:114.05pt" o:ole="">
-            <v:imagedata r:id="rId26" o:title=""/>
-          </v:shape>
-          <o:OLEObject Type="Embed" ProgID="Visio.Drawing.15" ShapeID="_x0000_i1026" DrawAspect="Content" ObjectID="_1823347317" r:id="rId27"/>
-        </w:object>
-      </w:r>
-    </w:p>
+    </w:p>
+    <w:sdt>
+      <w:sdtPr>
+        <w:alias w:val="mioTextBlock"/>
+        <w:tag w:val="bedb578b-42f2-45fc-b27e-18676a586330"/>
+        <w:id w:val="-710574639"/>
+        <w:placeholder>
+          <w:docPart w:val="DefaultPlaceholder_-1854013440"/>
+        </w:placeholder>
+        <w15:appearance w15:val="hidden"/>
+      </w:sdtPr>
+      <w:sdtEndPr>
+        <w:rPr>
+          <w:b/>
+          <w:lang w:eastAsia="en-US"/>
+        </w:rPr>
+      </w:sdtEndPr>
+      <w:sdtContent>
+        <w:tbl>
+          <w:tblPr>
+            <w:tblStyle w:val="InfineonPicture"/>
+            <w:tblW w:w="5000" w:type="pct"/>
+            <w:tblCellMar>
+              <w:left w:w="0" w:type="dxa"/>
+              <w:right w:w="0" w:type="dxa"/>
+            </w:tblCellMar>
+            <w:tblLook w:val="05E0" w:firstRow="1" w:lastRow="1" w:firstColumn="1" w:lastColumn="1" w:noHBand="0" w:noVBand="1"/>
+          </w:tblPr>
+          <w:tblGrid>
+            <w:gridCol w:w="10196"/>
+          </w:tblGrid>
+          <w:tr>
+            <w:tc>
+              <w:tcPr>
+                <w:tcW w:w="5000" w:type="pct"/>
+              </w:tcPr>
+              <w:p>
+                <w:pPr>
+                  <w:pStyle w:val="TableCell-c"/>
+                </w:pPr>
+                <w:r>
+                  <w:object w:dxaOrig="4404" w:dyaOrig="4296" w14:anchorId="7A224DF9">
+                    <v:shape id="_x0000_i1034" type="#_x0000_t75" style="width:116.95pt;height:114.05pt" o:ole="">
+                      <v:imagedata r:id="rId26" o:title=""/>
+                    </v:shape>
+                    <o:OLEObject Type="Embed" ProgID="Visio.Drawing.15" ShapeID="_x0000_i1034" DrawAspect="Content" ObjectID="_1823347493" r:id="rId27"/>
+                  </w:object>
+                </w:r>
+              </w:p>
+            </w:tc>
+          </w:tr>
+        </w:tbl>
+        <w:p>
+          <w:pPr>
+            <w:pStyle w:val="Figuretitlenew"/>
+          </w:pPr>
+          <w:r>
+            <w:t xml:space="preserve">Figure </w:t>
+          </w:r>
+          <w:r>
+            <w:fldChar w:fldCharType="begin"/>
+          </w:r>
+          <w:r>
+            <w:instrText xml:space="preserve"> SEQ Figure \* ARABIC </w:instrText>
+          </w:r>
+          <w:r>
+            <w:fldChar w:fldCharType="separate"/>
+          </w:r>
+          <w:r>
+            <w:rPr>
+              <w:noProof/>
+            </w:rPr>
+            <w:t>3</w:t>
+          </w:r>
+          <w:r>
+            <w:fldChar w:fldCharType="end"/>
+          </w:r>
+          <w:r>
+            <w:tab/>
+          </w:r>
+          <w:r>
+            <w:rPr>
+              <w:highlight w:val="yellow"/>
+            </w:rPr>
+            <w:t>Example figure</w:t>
+          </w:r>
+        </w:p>
+      </w:sdtContent>
+    </w:sdt>
     <w:p>
       <w:pPr>
         <w:pStyle w:val="Body"/>
@@ -3707,22 +3860,7 @@
             <w:t xml:space="preserve">Figure </w:t>
           </w:r>
           <w:r>
-            <w:fldChar w:fldCharType="begin"/>
-          </w:r>
-          <w:r>
-            <w:instrText xml:space="preserve"> SEQ Figure \* ARABIC </w:instrText>
-          </w:r>
-          <w:r>
-            <w:fldChar w:fldCharType="separate"/>
-          </w:r>
-          <w:r>
-            <w:rPr>
-              <w:noProof/>
-            </w:rPr>
-            <w:t>2</w:t>
-          </w:r>
-          <w:r>
-            <w:fldChar w:fldCharType="end"/>
+            <w:t>4</w:t>
           </w:r>
           <w:r>
             <w:tab/>
@@ -3730,6 +3868,11 @@
           <w:r>
             <w:t>Hardware Diagram for UART and LED Routing on PSOC Edge E84 EVK</w:t>
           </w:r>
+        </w:p>
+        <w:p>
+          <w:pPr>
+            <w:pStyle w:val="Figuretitlenew"/>
+          </w:pPr>
         </w:p>
         <w:bookmarkStart w:id="27" w:name="_GoBack" w:displacedByCustomXml="next"/>
         <w:bookmarkEnd w:id="27" w:displacedByCustomXml="next"/>
@@ -3815,6 +3958,7 @@
         <w:ind w:left="1778"/>
       </w:pPr>
       <w:r>
+        <w:lastRenderedPageBreak/>
         <w:t xml:space="preserve">Note: if you have not installed </w:t>
       </w:r>
       <w:r>
@@ -3859,7 +4003,6 @@
         <w:rPr>
           <w:noProof/>
         </w:rPr>
-        <w:lastRenderedPageBreak/>
         <w:drawing>
           <wp:inline distT="0" distB="0" distL="0" distR="0" wp14:anchorId="161B641C" wp14:editId="42FDE3F9">
             <wp:extent cx="3784454" cy="3540296"/>
@@ -34429,7 +34572,7 @@
         <v:shape id="_x0000_s2052" type="#_x0000_t75" style="position:absolute;margin-left:-45.75pt;margin-top:62.5pt;width:602.45pt;height:287.2pt;z-index:-251642880;mso-position-horizontal-relative:text;mso-position-vertical-relative:text">
           <v:imagedata r:id="rId1" o:title=""/>
         </v:shape>
-        <o:OLEObject Type="Embed" ProgID="Visio.Drawing.15" ShapeID="_x0000_s2052" DrawAspect="Content" ObjectID="_1823347318" r:id="rId2"/>
+        <o:OLEObject Type="Embed" ProgID="Visio.Drawing.15" ShapeID="_x0000_s2052" DrawAspect="Content" ObjectID="_1823347494" r:id="rId2"/>
       </w:object>
     </w:r>
     <w:r>
@@ -35762,7 +35905,7 @@
         <v:shape id="_x0000_s2051" type="#_x0000_t75" style="position:absolute;margin-left:-45.75pt;margin-top:62.5pt;width:602.45pt;height:287.2pt;z-index:-251643904;mso-position-horizontal-relative:text;mso-position-vertical-relative:text">
           <v:imagedata r:id="rId1" o:title=""/>
         </v:shape>
-        <o:OLEObject Type="Embed" ProgID="Visio.Drawing.15" ShapeID="_x0000_s2051" DrawAspect="Content" ObjectID="_1823347319" r:id="rId2"/>
+        <o:OLEObject Type="Embed" ProgID="Visio.Drawing.15" ShapeID="_x0000_s2051" DrawAspect="Content" ObjectID="_1823347495" r:id="rId2"/>
       </w:object>
     </w:r>
     <w:r>
@@ -46600,7 +46743,7 @@
   </w:compat>
   <w:rsids>
     <w:rsidRoot w:val="00EC48F7"/>
-    <w:rsid w:val="00C92151"/>
+    <w:rsid w:val="00146734"/>
     <w:rsid w:val="00EC48F7"/>
   </w:rsids>
   <m:mathPr>
@@ -47527,6 +47670,18 @@
       <TimestampUtc>2023-08-07T12:57:01.087Z</TimestampUtc>
       <TextBlockMetadataId>50720dae-b0d4-4194-b190-edb8d80cd456</TextBlockMetadataId>
     </TextBlockMetadata>
+    <TextBlockMetadata>
+      <ElementId>1a622969-9435-42df-b756-4af60deadd4b</ElementId>
+      <ContentTag>YzCqVxr4CkGOIjtz8kQsF1txdvNf0IhJnc8A53W8JnY=</ContentTag>
+      <TimestampUtc>2023-08-07T12:57:01.087Z</TimestampUtc>
+      <TextBlockMetadataId>6799000e-da23-48ac-b090-8c624221224a</TextBlockMetadataId>
+    </TextBlockMetadata>
+    <TextBlockMetadata>
+      <ElementId>1a622969-9435-42df-b756-4af60deadd4b</ElementId>
+      <ContentTag>YzCqVxr4CkGOIjtz8kQsF1txdvNf0IhJnc8A53W8JnY=</ContentTag>
+      <TimestampUtc>2023-08-07T12:57:01.087Z</TimestampUtc>
+      <TextBlockMetadataId>bedb578b-42f2-45fc-b27e-18676a586330</TextBlockMetadataId>
+    </TextBlockMetadata>
   </TextBlockElements>
   <PlaceholderHiddenState>
     <HideablePlaceholderGuids/>
@@ -47574,7 +47729,7 @@
 </file>
 
 <file path=customXml/itemProps4.xml><?xml version="1.0" encoding="utf-8"?>
-<ds:datastoreItem xmlns:ds="http://schemas.openxmlformats.org/officeDocument/2006/customXml" ds:itemID="{B00B0D19-42EE-444B-AC65-8BFEBA8F6F93}">
+<ds:datastoreItem xmlns:ds="http://schemas.openxmlformats.org/officeDocument/2006/customXml" ds:itemID="{C80D8924-D2A0-410B-B77E-39EB9AC1144E}">
   <ds:schemaRefs>
     <ds:schemaRef ds:uri="http://www.made-in-office.com/empower/docs/template/v1"/>
   </ds:schemaRefs>
@@ -47582,7 +47737,7 @@
 </file>
 
 <file path=customXml/itemProps5.xml><?xml version="1.0" encoding="utf-8"?>
-<ds:datastoreItem xmlns:ds="http://schemas.openxmlformats.org/officeDocument/2006/customXml" ds:itemID="{E748F454-96DA-4530-9ABF-FE825D7393C3}">
+<ds:datastoreItem xmlns:ds="http://schemas.openxmlformats.org/officeDocument/2006/customXml" ds:itemID="{265CD169-6292-471A-811E-6EAE9B4C3970}">
   <ds:schemaRefs>
     <ds:schemaRef ds:uri="http://schemas.openxmlformats.org/officeDocument/2006/bibliography"/>
   </ds:schemaRefs>

</xml_diff>

<commit_message>
Adding figure frame for figures 4 thru 18
</commit_message>
<xml_diff>
--- a/.internal/Manual/Intro to PSOC Edge E84 - Part 2 (E2)/PSoC Edge E84 Introductory E2 Training Manual -WIP_10_21_2025.docx
+++ b/.internal/Manual/Intro to PSOC Edge E84 - Part 2 (E2)/PSoC Edge E84 Introductory E2 Training Manual -WIP_10_21_2025.docx
@@ -3449,7 +3449,7 @@
                     <v:shape id="_x0000_i1030" type="#_x0000_t75" style="width:475.7pt;height:588.05pt" o:ole="">
                       <v:imagedata r:id="rId24" o:title=""/>
                     </v:shape>
-                    <o:OLEObject Type="Embed" ProgID="Visio.Drawing.15" ShapeID="_x0000_i1030" DrawAspect="Content" ObjectID="_1823347492" r:id="rId25"/>
+                    <o:OLEObject Type="Embed" ProgID="Visio.Drawing.15" ShapeID="_x0000_i1030" DrawAspect="Content" ObjectID="_1823347879" r:id="rId25"/>
                   </w:object>
                 </w:r>
               </w:p>
@@ -3570,7 +3570,7 @@
                     <v:shape id="_x0000_i1034" type="#_x0000_t75" style="width:116.95pt;height:114.05pt" o:ole="">
                       <v:imagedata r:id="rId26" o:title=""/>
                     </v:shape>
-                    <o:OLEObject Type="Embed" ProgID="Visio.Drawing.15" ShapeID="_x0000_i1034" DrawAspect="Content" ObjectID="_1823347493" r:id="rId27"/>
+                    <o:OLEObject Type="Embed" ProgID="Visio.Drawing.15" ShapeID="_x0000_i1034" DrawAspect="Content" ObjectID="_1823347880" r:id="rId27"/>
                   </w:object>
                 </w:r>
               </w:p>
@@ -3874,8 +3874,6 @@
             <w:pStyle w:val="Figuretitlenew"/>
           </w:pPr>
         </w:p>
-        <w:bookmarkStart w:id="27" w:name="_GoBack" w:displacedByCustomXml="next"/>
-        <w:bookmarkEnd w:id="27" w:displacedByCustomXml="next"/>
       </w:sdtContent>
     </w:sdt>
     <w:p>
@@ -3899,7 +3897,7 @@
           <w:lang w:eastAsia="de-DE"/>
         </w:rPr>
       </w:pPr>
-      <w:bookmarkStart w:id="28" w:name="_Toc192780021"/>
+      <w:bookmarkStart w:id="27" w:name="_Toc192780021"/>
       <w:r>
         <w:rPr>
           <w:b/>
@@ -3910,7 +3908,7 @@
         </w:rPr>
         <w:t>Project Creation</w:t>
       </w:r>
-      <w:bookmarkEnd w:id="28"/>
+      <w:bookmarkEnd w:id="27"/>
       <w:r>
         <w:rPr>
           <w:b/>
@@ -3999,58 +3997,6 @@
         <w:ind w:left="1418"/>
         <w:jc w:val="center"/>
       </w:pPr>
-      <w:r>
-        <w:rPr>
-          <w:noProof/>
-        </w:rPr>
-        <w:drawing>
-          <wp:inline distT="0" distB="0" distL="0" distR="0" wp14:anchorId="161B641C" wp14:editId="42FDE3F9">
-            <wp:extent cx="3784454" cy="3540296"/>
-            <wp:effectExtent l="0" t="0" r="6985" b="3175"/>
-            <wp:docPr id="7" name="Picture 7"/>
-            <wp:cNvGraphicFramePr>
-              <a:graphicFrameLocks xmlns:a="http://schemas.openxmlformats.org/drawingml/2006/main" noChangeAspect="1"/>
-            </wp:cNvGraphicFramePr>
-            <a:graphic xmlns:a="http://schemas.openxmlformats.org/drawingml/2006/main">
-              <a:graphicData uri="http://schemas.openxmlformats.org/drawingml/2006/picture">
-                <pic:pic xmlns:pic="http://schemas.openxmlformats.org/drawingml/2006/picture">
-                  <pic:nvPicPr>
-                    <pic:cNvPr id="0" name="Picture 5"/>
-                    <pic:cNvPicPr>
-                      <a:picLocks noChangeAspect="1" noChangeArrowheads="1"/>
-                    </pic:cNvPicPr>
-                  </pic:nvPicPr>
-                  <pic:blipFill>
-                    <a:blip r:embed="rId29">
-                      <a:extLst>
-                        <a:ext uri="{28A0092B-C50C-407E-A947-70E740481C1C}">
-                          <a14:useLocalDpi xmlns:a14="http://schemas.microsoft.com/office/drawing/2010/main" val="0"/>
-                        </a:ext>
-                      </a:extLst>
-                    </a:blip>
-                    <a:stretch>
-                      <a:fillRect/>
-                    </a:stretch>
-                  </pic:blipFill>
-                  <pic:spPr bwMode="auto">
-                    <a:xfrm>
-                      <a:off x="0" y="0"/>
-                      <a:ext cx="3792462" cy="3547787"/>
-                    </a:xfrm>
-                    <a:prstGeom prst="rect">
-                      <a:avLst/>
-                    </a:prstGeom>
-                    <a:noFill/>
-                    <a:ln>
-                      <a:noFill/>
-                    </a:ln>
-                  </pic:spPr>
-                </pic:pic>
-              </a:graphicData>
-            </a:graphic>
-          </wp:inline>
-        </w:drawing>
-      </w:r>
     </w:p>
     <w:p>
       <w:pPr>
@@ -4058,12 +4004,138 @@
         <w:jc w:val="center"/>
       </w:pPr>
     </w:p>
-    <w:p>
-      <w:pPr>
-        <w:pStyle w:val="Body"/>
-        <w:jc w:val="center"/>
-      </w:pPr>
-    </w:p>
+    <w:sdt>
+      <w:sdtPr>
+        <w:alias w:val="mioTextBlock"/>
+        <w:tag w:val="e5ee1bf7-537b-46e7-8a4e-b9b5b3e3775a"/>
+        <w:id w:val="-1581593322"/>
+        <w:placeholder>
+          <w:docPart w:val="DefaultPlaceholder_-1854013440"/>
+        </w:placeholder>
+        <w15:appearance w15:val="hidden"/>
+      </w:sdtPr>
+      <w:sdtEndPr>
+        <w:rPr>
+          <w:b/>
+          <w:lang w:eastAsia="en-US"/>
+        </w:rPr>
+      </w:sdtEndPr>
+      <w:sdtContent>
+        <w:tbl>
+          <w:tblPr>
+            <w:tblStyle w:val="InfineonPicture"/>
+            <w:tblW w:w="5000" w:type="pct"/>
+            <w:tblCellMar>
+              <w:left w:w="0" w:type="dxa"/>
+              <w:right w:w="0" w:type="dxa"/>
+            </w:tblCellMar>
+            <w:tblLook w:val="05E0" w:firstRow="1" w:lastRow="1" w:firstColumn="1" w:lastColumn="1" w:noHBand="0" w:noVBand="1"/>
+          </w:tblPr>
+          <w:tblGrid>
+            <w:gridCol w:w="10196"/>
+          </w:tblGrid>
+          <w:tr>
+            <w:tc>
+              <w:tcPr>
+                <w:tcW w:w="5000" w:type="pct"/>
+              </w:tcPr>
+              <w:p>
+                <w:pPr>
+                  <w:pStyle w:val="TableCell-c"/>
+                </w:pPr>
+                <w:r>
+                  <w:rPr>
+                    <w:noProof/>
+                  </w:rPr>
+                  <w:drawing>
+                    <wp:inline distT="0" distB="0" distL="0" distR="0" wp14:anchorId="4FDE3037" wp14:editId="19ECA0A0">
+                      <wp:extent cx="3784454" cy="3540296"/>
+                      <wp:effectExtent l="0" t="0" r="6985" b="3175"/>
+                      <wp:docPr id="7" name="Picture 7"/>
+                      <wp:cNvGraphicFramePr>
+                        <a:graphicFrameLocks xmlns:a="http://schemas.openxmlformats.org/drawingml/2006/main" noChangeAspect="1"/>
+                      </wp:cNvGraphicFramePr>
+                      <a:graphic xmlns:a="http://schemas.openxmlformats.org/drawingml/2006/main">
+                        <a:graphicData uri="http://schemas.openxmlformats.org/drawingml/2006/picture">
+                          <pic:pic xmlns:pic="http://schemas.openxmlformats.org/drawingml/2006/picture">
+                            <pic:nvPicPr>
+                              <pic:cNvPr id="0" name="Picture 5"/>
+                              <pic:cNvPicPr>
+                                <a:picLocks noChangeAspect="1" noChangeArrowheads="1"/>
+                              </pic:cNvPicPr>
+                            </pic:nvPicPr>
+                            <pic:blipFill>
+                              <a:blip r:embed="rId29">
+                                <a:extLst>
+                                  <a:ext uri="{28A0092B-C50C-407E-A947-70E740481C1C}">
+                                    <a14:useLocalDpi xmlns:a14="http://schemas.microsoft.com/office/drawing/2010/main" val="0"/>
+                                  </a:ext>
+                                </a:extLst>
+                              </a:blip>
+                              <a:stretch>
+                                <a:fillRect/>
+                              </a:stretch>
+                            </pic:blipFill>
+                            <pic:spPr bwMode="auto">
+                              <a:xfrm>
+                                <a:off x="0" y="0"/>
+                                <a:ext cx="3792462" cy="3547787"/>
+                              </a:xfrm>
+                              <a:prstGeom prst="rect">
+                                <a:avLst/>
+                              </a:prstGeom>
+                              <a:noFill/>
+                              <a:ln>
+                                <a:noFill/>
+                              </a:ln>
+                            </pic:spPr>
+                          </pic:pic>
+                        </a:graphicData>
+                      </a:graphic>
+                    </wp:inline>
+                  </w:drawing>
+                </w:r>
+              </w:p>
+            </w:tc>
+          </w:tr>
+        </w:tbl>
+        <w:p>
+          <w:pPr>
+            <w:pStyle w:val="Figuretitlenew"/>
+          </w:pPr>
+          <w:r>
+            <w:t xml:space="preserve">Figure </w:t>
+          </w:r>
+          <w:r>
+            <w:fldChar w:fldCharType="begin"/>
+          </w:r>
+          <w:r>
+            <w:instrText xml:space="preserve"> SEQ Figure \* ARABIC </w:instrText>
+          </w:r>
+          <w:r>
+            <w:fldChar w:fldCharType="separate"/>
+          </w:r>
+          <w:r>
+            <w:rPr>
+              <w:noProof/>
+            </w:rPr>
+            <w:t>4</w:t>
+          </w:r>
+          <w:r>
+            <w:fldChar w:fldCharType="end"/>
+          </w:r>
+          <w:r>
+            <w:tab/>
+          </w:r>
+          <w:r>
+            <w:rPr>
+              <w:highlight w:val="yellow"/>
+            </w:rPr>
+            <w:t>Example figure</w:t>
+          </w:r>
+        </w:p>
+      </w:sdtContent>
+    </w:sdt>
     <w:p>
       <w:pPr>
         <w:pStyle w:val="Body"/>
@@ -4106,59 +4178,139 @@
         <w:ind w:left="709"/>
         <w:jc w:val="center"/>
       </w:pPr>
-      <w:r>
-        <w:rPr>
-          <w:noProof/>
-        </w:rPr>
-        <w:drawing>
-          <wp:inline distT="0" distB="0" distL="0" distR="0" wp14:anchorId="2279E888" wp14:editId="57B80E08">
-            <wp:extent cx="3649677" cy="1515168"/>
-            <wp:effectExtent l="0" t="0" r="8255" b="8890"/>
-            <wp:docPr id="30" name="Picture 30"/>
-            <wp:cNvGraphicFramePr>
-              <a:graphicFrameLocks xmlns:a="http://schemas.openxmlformats.org/drawingml/2006/main" noChangeAspect="1"/>
-            </wp:cNvGraphicFramePr>
-            <a:graphic xmlns:a="http://schemas.openxmlformats.org/drawingml/2006/main">
-              <a:graphicData uri="http://schemas.openxmlformats.org/drawingml/2006/picture">
-                <pic:pic xmlns:pic="http://schemas.openxmlformats.org/drawingml/2006/picture">
-                  <pic:nvPicPr>
-                    <pic:cNvPr id="0" name="Picture 9"/>
-                    <pic:cNvPicPr>
-                      <a:picLocks noChangeAspect="1" noChangeArrowheads="1"/>
-                    </pic:cNvPicPr>
-                  </pic:nvPicPr>
-                  <pic:blipFill>
-                    <a:blip r:embed="rId30">
-                      <a:extLst>
-                        <a:ext uri="{28A0092B-C50C-407E-A947-70E740481C1C}">
-                          <a14:useLocalDpi xmlns:a14="http://schemas.microsoft.com/office/drawing/2010/main" val="0"/>
-                        </a:ext>
-                      </a:extLst>
-                    </a:blip>
-                    <a:stretch>
-                      <a:fillRect/>
-                    </a:stretch>
-                  </pic:blipFill>
-                  <pic:spPr bwMode="auto">
-                    <a:xfrm>
-                      <a:off x="0" y="0"/>
-                      <a:ext cx="3649677" cy="1515168"/>
-                    </a:xfrm>
-                    <a:prstGeom prst="rect">
-                      <a:avLst/>
-                    </a:prstGeom>
-                    <a:noFill/>
-                    <a:ln>
-                      <a:noFill/>
-                    </a:ln>
-                  </pic:spPr>
-                </pic:pic>
-              </a:graphicData>
-            </a:graphic>
-          </wp:inline>
-        </w:drawing>
-      </w:r>
-    </w:p>
+    </w:p>
+    <w:sdt>
+      <w:sdtPr>
+        <w:alias w:val="mioTextBlock"/>
+        <w:tag w:val="2d7494db-d234-41cb-beb0-3663d9595a42"/>
+        <w:id w:val="-941986779"/>
+        <w:placeholder>
+          <w:docPart w:val="DefaultPlaceholder_-1854013440"/>
+        </w:placeholder>
+        <w15:appearance w15:val="hidden"/>
+      </w:sdtPr>
+      <w:sdtEndPr>
+        <w:rPr>
+          <w:b/>
+          <w:lang w:eastAsia="en-US"/>
+        </w:rPr>
+      </w:sdtEndPr>
+      <w:sdtContent>
+        <w:tbl>
+          <w:tblPr>
+            <w:tblStyle w:val="InfineonPicture"/>
+            <w:tblW w:w="5000" w:type="pct"/>
+            <w:tblCellMar>
+              <w:left w:w="0" w:type="dxa"/>
+              <w:right w:w="0" w:type="dxa"/>
+            </w:tblCellMar>
+            <w:tblLook w:val="05E0" w:firstRow="1" w:lastRow="1" w:firstColumn="1" w:lastColumn="1" w:noHBand="0" w:noVBand="1"/>
+          </w:tblPr>
+          <w:tblGrid>
+            <w:gridCol w:w="10196"/>
+          </w:tblGrid>
+          <w:tr>
+            <w:tc>
+              <w:tcPr>
+                <w:tcW w:w="5000" w:type="pct"/>
+              </w:tcPr>
+              <w:p>
+                <w:pPr>
+                  <w:pStyle w:val="TableCell-c"/>
+                </w:pPr>
+                <w:r>
+                  <w:rPr>
+                    <w:noProof/>
+                  </w:rPr>
+                  <w:drawing>
+                    <wp:inline distT="0" distB="0" distL="0" distR="0" wp14:anchorId="6CFDE583" wp14:editId="635AD38A">
+                      <wp:extent cx="3649677" cy="1515168"/>
+                      <wp:effectExtent l="0" t="0" r="8255" b="8890"/>
+                      <wp:docPr id="30" name="Picture 30"/>
+                      <wp:cNvGraphicFramePr>
+                        <a:graphicFrameLocks xmlns:a="http://schemas.openxmlformats.org/drawingml/2006/main" noChangeAspect="1"/>
+                      </wp:cNvGraphicFramePr>
+                      <a:graphic xmlns:a="http://schemas.openxmlformats.org/drawingml/2006/main">
+                        <a:graphicData uri="http://schemas.openxmlformats.org/drawingml/2006/picture">
+                          <pic:pic xmlns:pic="http://schemas.openxmlformats.org/drawingml/2006/picture">
+                            <pic:nvPicPr>
+                              <pic:cNvPr id="0" name="Picture 9"/>
+                              <pic:cNvPicPr>
+                                <a:picLocks noChangeAspect="1" noChangeArrowheads="1"/>
+                              </pic:cNvPicPr>
+                            </pic:nvPicPr>
+                            <pic:blipFill>
+                              <a:blip r:embed="rId30">
+                                <a:extLst>
+                                  <a:ext uri="{28A0092B-C50C-407E-A947-70E740481C1C}">
+                                    <a14:useLocalDpi xmlns:a14="http://schemas.microsoft.com/office/drawing/2010/main" val="0"/>
+                                  </a:ext>
+                                </a:extLst>
+                              </a:blip>
+                              <a:stretch>
+                                <a:fillRect/>
+                              </a:stretch>
+                            </pic:blipFill>
+                            <pic:spPr bwMode="auto">
+                              <a:xfrm>
+                                <a:off x="0" y="0"/>
+                                <a:ext cx="3649677" cy="1515168"/>
+                              </a:xfrm>
+                              <a:prstGeom prst="rect">
+                                <a:avLst/>
+                              </a:prstGeom>
+                              <a:noFill/>
+                              <a:ln>
+                                <a:noFill/>
+                              </a:ln>
+                            </pic:spPr>
+                          </pic:pic>
+                        </a:graphicData>
+                      </a:graphic>
+                    </wp:inline>
+                  </w:drawing>
+                </w:r>
+              </w:p>
+            </w:tc>
+          </w:tr>
+        </w:tbl>
+        <w:p>
+          <w:pPr>
+            <w:pStyle w:val="Figuretitlenew"/>
+          </w:pPr>
+          <w:r>
+            <w:t xml:space="preserve">Figure </w:t>
+          </w:r>
+          <w:r>
+            <w:fldChar w:fldCharType="begin"/>
+          </w:r>
+          <w:r>
+            <w:instrText xml:space="preserve"> SEQ Figure \* ARABIC </w:instrText>
+          </w:r>
+          <w:r>
+            <w:fldChar w:fldCharType="separate"/>
+          </w:r>
+          <w:r>
+            <w:rPr>
+              <w:noProof/>
+            </w:rPr>
+            <w:t>5</w:t>
+          </w:r>
+          <w:r>
+            <w:fldChar w:fldCharType="end"/>
+          </w:r>
+          <w:r>
+            <w:tab/>
+          </w:r>
+          <w:r>
+            <w:rPr>
+              <w:highlight w:val="yellow"/>
+            </w:rPr>
+            <w:t>Example figure</w:t>
+          </w:r>
+        </w:p>
+      </w:sdtContent>
+    </w:sdt>
     <w:p>
       <w:pPr>
         <w:pStyle w:val="ListParagraph"/>
@@ -4235,65 +4387,135 @@
           <w:lang w:eastAsia="de-DE"/>
         </w:rPr>
       </w:pPr>
-      <w:r>
-        <w:rPr>
-          <w:noProof/>
-        </w:rPr>
-        <w:lastRenderedPageBreak/>
-        <w:drawing>
-          <wp:inline distT="0" distB="0" distL="0" distR="0" wp14:anchorId="0AC2496A" wp14:editId="5AC8BEA6">
-            <wp:extent cx="4939507" cy="2381435"/>
-            <wp:effectExtent l="0" t="0" r="0" b="0"/>
-            <wp:docPr id="29" name="Picture 29"/>
-            <wp:cNvGraphicFramePr>
-              <a:graphicFrameLocks xmlns:a="http://schemas.openxmlformats.org/drawingml/2006/main" noChangeAspect="1"/>
-            </wp:cNvGraphicFramePr>
-            <a:graphic xmlns:a="http://schemas.openxmlformats.org/drawingml/2006/main">
-              <a:graphicData uri="http://schemas.openxmlformats.org/drawingml/2006/picture">
-                <pic:pic xmlns:pic="http://schemas.openxmlformats.org/drawingml/2006/picture">
-                  <pic:nvPicPr>
-                    <pic:cNvPr id="1" name=""/>
-                    <pic:cNvPicPr/>
-                  </pic:nvPicPr>
-                  <pic:blipFill>
-                    <a:blip r:embed="rId31" cstate="print">
-                      <a:extLst>
-                        <a:ext uri="{28A0092B-C50C-407E-A947-70E740481C1C}">
-                          <a14:useLocalDpi xmlns:a14="http://schemas.microsoft.com/office/drawing/2010/main" val="0"/>
-                        </a:ext>
-                      </a:extLst>
-                    </a:blip>
-                    <a:stretch>
-                      <a:fillRect/>
-                    </a:stretch>
-                  </pic:blipFill>
-                  <pic:spPr>
-                    <a:xfrm>
-                      <a:off x="0" y="0"/>
-                      <a:ext cx="4939507" cy="2381435"/>
-                    </a:xfrm>
-                    <a:prstGeom prst="rect">
-                      <a:avLst/>
-                    </a:prstGeom>
-                  </pic:spPr>
-                </pic:pic>
-              </a:graphicData>
-            </a:graphic>
-          </wp:inline>
-        </w:drawing>
-      </w:r>
-    </w:p>
-    <w:p>
-      <w:pPr>
-        <w:pStyle w:val="ListParagraph"/>
-        <w:spacing w:before="160" w:after="160"/>
-        <w:ind w:left="1418"/>
-        <w:jc w:val="center"/>
-        <w:rPr>
-          <w:lang w:eastAsia="de-DE"/>
-        </w:rPr>
-      </w:pPr>
-    </w:p>
+    </w:p>
+    <w:sdt>
+      <w:sdtPr>
+        <w:alias w:val="mioTextBlock"/>
+        <w:tag w:val="dc65463d-b88e-43ad-b59d-ffd33524f636"/>
+        <w:id w:val="1561752045"/>
+        <w:placeholder>
+          <w:docPart w:val="DefaultPlaceholder_-1854013440"/>
+        </w:placeholder>
+        <w15:appearance w15:val="hidden"/>
+      </w:sdtPr>
+      <w:sdtEndPr>
+        <w:rPr>
+          <w:b/>
+        </w:rPr>
+      </w:sdtEndPr>
+      <w:sdtContent>
+        <w:tbl>
+          <w:tblPr>
+            <w:tblStyle w:val="InfineonPicture"/>
+            <w:tblW w:w="5000" w:type="pct"/>
+            <w:tblCellMar>
+              <w:left w:w="0" w:type="dxa"/>
+              <w:right w:w="0" w:type="dxa"/>
+            </w:tblCellMar>
+            <w:tblLook w:val="05E0" w:firstRow="1" w:lastRow="1" w:firstColumn="1" w:lastColumn="1" w:noHBand="0" w:noVBand="1"/>
+          </w:tblPr>
+          <w:tblGrid>
+            <w:gridCol w:w="10196"/>
+          </w:tblGrid>
+          <w:tr>
+            <w:tc>
+              <w:tcPr>
+                <w:tcW w:w="5000" w:type="pct"/>
+              </w:tcPr>
+              <w:p>
+                <w:pPr>
+                  <w:pStyle w:val="TableCell-c"/>
+                </w:pPr>
+                <w:r>
+                  <w:rPr>
+                    <w:noProof/>
+                  </w:rPr>
+                  <w:drawing>
+                    <wp:inline distT="0" distB="0" distL="0" distR="0" wp14:anchorId="57A211EE" wp14:editId="7F96CE12">
+                      <wp:extent cx="4939507" cy="2381435"/>
+                      <wp:effectExtent l="0" t="0" r="0" b="0"/>
+                      <wp:docPr id="29" name="Picture 29"/>
+                      <wp:cNvGraphicFramePr>
+                        <a:graphicFrameLocks xmlns:a="http://schemas.openxmlformats.org/drawingml/2006/main" noChangeAspect="1"/>
+                      </wp:cNvGraphicFramePr>
+                      <a:graphic xmlns:a="http://schemas.openxmlformats.org/drawingml/2006/main">
+                        <a:graphicData uri="http://schemas.openxmlformats.org/drawingml/2006/picture">
+                          <pic:pic xmlns:pic="http://schemas.openxmlformats.org/drawingml/2006/picture">
+                            <pic:nvPicPr>
+                              <pic:cNvPr id="1" name=""/>
+                              <pic:cNvPicPr/>
+                            </pic:nvPicPr>
+                            <pic:blipFill>
+                              <a:blip r:embed="rId31" cstate="print">
+                                <a:extLst>
+                                  <a:ext uri="{28A0092B-C50C-407E-A947-70E740481C1C}">
+                                    <a14:useLocalDpi xmlns:a14="http://schemas.microsoft.com/office/drawing/2010/main" val="0"/>
+                                  </a:ext>
+                                </a:extLst>
+                              </a:blip>
+                              <a:stretch>
+                                <a:fillRect/>
+                              </a:stretch>
+                            </pic:blipFill>
+                            <pic:spPr>
+                              <a:xfrm>
+                                <a:off x="0" y="0"/>
+                                <a:ext cx="4939507" cy="2381435"/>
+                              </a:xfrm>
+                              <a:prstGeom prst="rect">
+                                <a:avLst/>
+                              </a:prstGeom>
+                            </pic:spPr>
+                          </pic:pic>
+                        </a:graphicData>
+                      </a:graphic>
+                    </wp:inline>
+                  </w:drawing>
+                </w:r>
+              </w:p>
+            </w:tc>
+          </w:tr>
+        </w:tbl>
+        <w:p>
+          <w:pPr>
+            <w:pStyle w:val="Figuretitlenew"/>
+            <w:rPr>
+              <w:lang w:eastAsia="de-DE"/>
+            </w:rPr>
+          </w:pPr>
+          <w:r>
+            <w:t xml:space="preserve">Figure </w:t>
+          </w:r>
+          <w:r>
+            <w:fldChar w:fldCharType="begin"/>
+          </w:r>
+          <w:r>
+            <w:instrText xml:space="preserve"> SEQ Figure \* ARABIC </w:instrText>
+          </w:r>
+          <w:r>
+            <w:fldChar w:fldCharType="separate"/>
+          </w:r>
+          <w:r>
+            <w:rPr>
+              <w:noProof/>
+            </w:rPr>
+            <w:t>6</w:t>
+          </w:r>
+          <w:r>
+            <w:fldChar w:fldCharType="end"/>
+          </w:r>
+          <w:r>
+            <w:tab/>
+          </w:r>
+          <w:r>
+            <w:rPr>
+              <w:highlight w:val="yellow"/>
+            </w:rPr>
+            <w:t>Example figure</w:t>
+          </w:r>
+        </w:p>
+      </w:sdtContent>
+    </w:sdt>
     <w:p>
       <w:pPr>
         <w:pStyle w:val="ListParagraph"/>
@@ -4384,61 +4606,146 @@
           <w:lang w:eastAsia="de-DE"/>
         </w:rPr>
       </w:pPr>
-      <w:r>
+    </w:p>
+    <w:sdt>
+      <w:sdtPr>
         <w:rPr>
           <w:bCs/>
-          <w:noProof/>
-          <w:lang w:eastAsia="de-DE"/>
-        </w:rPr>
-        <w:drawing>
-          <wp:inline distT="0" distB="0" distL="0" distR="0" wp14:anchorId="0A9C18D0" wp14:editId="296A48E4">
-            <wp:extent cx="3594174" cy="2987881"/>
-            <wp:effectExtent l="0" t="0" r="6350" b="3175"/>
-            <wp:docPr id="28" name="Picture 28"/>
-            <wp:cNvGraphicFramePr>
-              <a:graphicFrameLocks xmlns:a="http://schemas.openxmlformats.org/drawingml/2006/main" noChangeAspect="1"/>
-            </wp:cNvGraphicFramePr>
-            <a:graphic xmlns:a="http://schemas.openxmlformats.org/drawingml/2006/main">
-              <a:graphicData uri="http://schemas.openxmlformats.org/drawingml/2006/picture">
-                <pic:pic xmlns:pic="http://schemas.openxmlformats.org/drawingml/2006/picture">
-                  <pic:nvPicPr>
-                    <pic:cNvPr id="0" name="Picture 8"/>
-                    <pic:cNvPicPr>
-                      <a:picLocks noChangeAspect="1" noChangeArrowheads="1"/>
-                    </pic:cNvPicPr>
-                  </pic:nvPicPr>
-                  <pic:blipFill>
-                    <a:blip r:embed="rId32" cstate="print">
-                      <a:extLst>
-                        <a:ext uri="{28A0092B-C50C-407E-A947-70E740481C1C}">
-                          <a14:useLocalDpi xmlns:a14="http://schemas.microsoft.com/office/drawing/2010/main" val="0"/>
-                        </a:ext>
-                      </a:extLst>
-                    </a:blip>
-                    <a:stretch>
-                      <a:fillRect/>
-                    </a:stretch>
-                  </pic:blipFill>
-                  <pic:spPr bwMode="auto">
-                    <a:xfrm>
-                      <a:off x="0" y="0"/>
-                      <a:ext cx="3606505" cy="2998132"/>
-                    </a:xfrm>
-                    <a:prstGeom prst="rect">
-                      <a:avLst/>
-                    </a:prstGeom>
-                    <a:noFill/>
-                    <a:ln>
-                      <a:noFill/>
-                    </a:ln>
-                  </pic:spPr>
-                </pic:pic>
-              </a:graphicData>
-            </a:graphic>
-          </wp:inline>
-        </w:drawing>
-      </w:r>
-    </w:p>
+        </w:rPr>
+        <w:alias w:val="mioTextBlock"/>
+        <w:tag w:val="f28395c9-4a56-45ab-aca0-3948237a9f19"/>
+        <w:id w:val="-129091252"/>
+        <w:placeholder>
+          <w:docPart w:val="DefaultPlaceholder_-1854013440"/>
+        </w:placeholder>
+        <w15:appearance w15:val="hidden"/>
+      </w:sdtPr>
+      <w:sdtEndPr>
+        <w:rPr>
+          <w:b/>
+        </w:rPr>
+      </w:sdtEndPr>
+      <w:sdtContent>
+        <w:tbl>
+          <w:tblPr>
+            <w:tblStyle w:val="InfineonPicture"/>
+            <w:tblW w:w="5000" w:type="pct"/>
+            <w:tblCellMar>
+              <w:left w:w="0" w:type="dxa"/>
+              <w:right w:w="0" w:type="dxa"/>
+            </w:tblCellMar>
+            <w:tblLook w:val="05E0" w:firstRow="1" w:lastRow="1" w:firstColumn="1" w:lastColumn="1" w:noHBand="0" w:noVBand="1"/>
+          </w:tblPr>
+          <w:tblGrid>
+            <w:gridCol w:w="10196"/>
+          </w:tblGrid>
+          <w:tr>
+            <w:tc>
+              <w:tcPr>
+                <w:tcW w:w="5000" w:type="pct"/>
+              </w:tcPr>
+              <w:p>
+                <w:pPr>
+                  <w:pStyle w:val="TableCell-c"/>
+                </w:pPr>
+                <w:r>
+                  <w:rPr>
+                    <w:bCs/>
+                    <w:noProof/>
+                  </w:rPr>
+                  <w:drawing>
+                    <wp:inline distT="0" distB="0" distL="0" distR="0" wp14:anchorId="5664E01F" wp14:editId="76F6D74E">
+                      <wp:extent cx="3594174" cy="2987881"/>
+                      <wp:effectExtent l="0" t="0" r="6350" b="3175"/>
+                      <wp:docPr id="28" name="Picture 28"/>
+                      <wp:cNvGraphicFramePr>
+                        <a:graphicFrameLocks xmlns:a="http://schemas.openxmlformats.org/drawingml/2006/main" noChangeAspect="1"/>
+                      </wp:cNvGraphicFramePr>
+                      <a:graphic xmlns:a="http://schemas.openxmlformats.org/drawingml/2006/main">
+                        <a:graphicData uri="http://schemas.openxmlformats.org/drawingml/2006/picture">
+                          <pic:pic xmlns:pic="http://schemas.openxmlformats.org/drawingml/2006/picture">
+                            <pic:nvPicPr>
+                              <pic:cNvPr id="0" name="Picture 8"/>
+                              <pic:cNvPicPr>
+                                <a:picLocks noChangeAspect="1" noChangeArrowheads="1"/>
+                              </pic:cNvPicPr>
+                            </pic:nvPicPr>
+                            <pic:blipFill>
+                              <a:blip r:embed="rId32" cstate="print">
+                                <a:extLst>
+                                  <a:ext uri="{28A0092B-C50C-407E-A947-70E740481C1C}">
+                                    <a14:useLocalDpi xmlns:a14="http://schemas.microsoft.com/office/drawing/2010/main" val="0"/>
+                                  </a:ext>
+                                </a:extLst>
+                              </a:blip>
+                              <a:stretch>
+                                <a:fillRect/>
+                              </a:stretch>
+                            </pic:blipFill>
+                            <pic:spPr bwMode="auto">
+                              <a:xfrm>
+                                <a:off x="0" y="0"/>
+                                <a:ext cx="3606505" cy="2998132"/>
+                              </a:xfrm>
+                              <a:prstGeom prst="rect">
+                                <a:avLst/>
+                              </a:prstGeom>
+                              <a:noFill/>
+                              <a:ln>
+                                <a:noFill/>
+                              </a:ln>
+                            </pic:spPr>
+                          </pic:pic>
+                        </a:graphicData>
+                      </a:graphic>
+                    </wp:inline>
+                  </w:drawing>
+                </w:r>
+              </w:p>
+            </w:tc>
+          </w:tr>
+        </w:tbl>
+        <w:p>
+          <w:pPr>
+            <w:pStyle w:val="Figuretitlenew"/>
+            <w:rPr>
+              <w:bCs/>
+              <w:lang w:eastAsia="de-DE"/>
+            </w:rPr>
+          </w:pPr>
+          <w:r>
+            <w:t xml:space="preserve">Figure </w:t>
+          </w:r>
+          <w:r>
+            <w:fldChar w:fldCharType="begin"/>
+          </w:r>
+          <w:r>
+            <w:instrText xml:space="preserve"> SEQ Figure \* ARABIC </w:instrText>
+          </w:r>
+          <w:r>
+            <w:fldChar w:fldCharType="separate"/>
+          </w:r>
+          <w:r>
+            <w:rPr>
+              <w:noProof/>
+            </w:rPr>
+            <w:t>7</w:t>
+          </w:r>
+          <w:r>
+            <w:fldChar w:fldCharType="end"/>
+          </w:r>
+          <w:r>
+            <w:tab/>
+          </w:r>
+          <w:r>
+            <w:rPr>
+              <w:highlight w:val="yellow"/>
+            </w:rPr>
+            <w:t>Example figure</w:t>
+          </w:r>
+        </w:p>
+      </w:sdtContent>
+    </w:sdt>
     <w:p>
       <w:pPr>
         <w:pStyle w:val="ListParagraph"/>
@@ -4658,63 +4965,143 @@
           <w:lang w:eastAsia="de-DE"/>
         </w:rPr>
       </w:pPr>
-      <w:r>
-        <w:rPr>
-          <w:noProof/>
-          <w:lang w:eastAsia="de-DE"/>
-        </w:rPr>
-        <w:lastRenderedPageBreak/>
-        <w:drawing>
-          <wp:inline distT="0" distB="0" distL="0" distR="0" wp14:anchorId="3E8DA693" wp14:editId="0FEEDB8C">
-            <wp:extent cx="4731577" cy="3139616"/>
-            <wp:effectExtent l="19050" t="19050" r="12065" b="22860"/>
-            <wp:docPr id="54" name="Picture 54"/>
-            <wp:cNvGraphicFramePr>
-              <a:graphicFrameLocks xmlns:a="http://schemas.openxmlformats.org/drawingml/2006/main" noChangeAspect="1"/>
-            </wp:cNvGraphicFramePr>
-            <a:graphic xmlns:a="http://schemas.openxmlformats.org/drawingml/2006/main">
-              <a:graphicData uri="http://schemas.openxmlformats.org/drawingml/2006/picture">
-                <pic:pic xmlns:pic="http://schemas.openxmlformats.org/drawingml/2006/picture">
-                  <pic:nvPicPr>
-                    <pic:cNvPr id="54" name="Picture 54"/>
-                    <pic:cNvPicPr>
-                      <a:picLocks noChangeAspect="1" noChangeArrowheads="1"/>
-                    </pic:cNvPicPr>
-                  </pic:nvPicPr>
-                  <pic:blipFill>
-                    <a:blip r:embed="rId33" cstate="print">
-                      <a:extLst>
-                        <a:ext uri="{28A0092B-C50C-407E-A947-70E740481C1C}">
-                          <a14:useLocalDpi xmlns:a14="http://schemas.microsoft.com/office/drawing/2010/main" val="0"/>
-                        </a:ext>
-                      </a:extLst>
-                    </a:blip>
-                    <a:stretch>
-                      <a:fillRect/>
-                    </a:stretch>
-                  </pic:blipFill>
-                  <pic:spPr bwMode="auto">
-                    <a:xfrm>
-                      <a:off x="0" y="0"/>
-                      <a:ext cx="4787718" cy="3176868"/>
-                    </a:xfrm>
-                    <a:prstGeom prst="rect">
-                      <a:avLst/>
-                    </a:prstGeom>
-                    <a:noFill/>
-                    <a:ln>
-                      <a:solidFill>
-                        <a:schemeClr val="tx1"/>
-                      </a:solidFill>
-                    </a:ln>
-                  </pic:spPr>
-                </pic:pic>
-              </a:graphicData>
-            </a:graphic>
-          </wp:inline>
-        </w:drawing>
-      </w:r>
-    </w:p>
+    </w:p>
+    <w:sdt>
+      <w:sdtPr>
+        <w:alias w:val="mioTextBlock"/>
+        <w:tag w:val="931b6e5a-073e-4c21-a5d5-828c13143fcd"/>
+        <w:id w:val="1587729481"/>
+        <w:placeholder>
+          <w:docPart w:val="DefaultPlaceholder_-1854013440"/>
+        </w:placeholder>
+        <w15:appearance w15:val="hidden"/>
+      </w:sdtPr>
+      <w:sdtEndPr>
+        <w:rPr>
+          <w:b/>
+        </w:rPr>
+      </w:sdtEndPr>
+      <w:sdtContent>
+        <w:tbl>
+          <w:tblPr>
+            <w:tblStyle w:val="InfineonPicture"/>
+            <w:tblW w:w="5000" w:type="pct"/>
+            <w:tblCellMar>
+              <w:left w:w="0" w:type="dxa"/>
+              <w:right w:w="0" w:type="dxa"/>
+            </w:tblCellMar>
+            <w:tblLook w:val="05E0" w:firstRow="1" w:lastRow="1" w:firstColumn="1" w:lastColumn="1" w:noHBand="0" w:noVBand="1"/>
+          </w:tblPr>
+          <w:tblGrid>
+            <w:gridCol w:w="10196"/>
+          </w:tblGrid>
+          <w:tr>
+            <w:tc>
+              <w:tcPr>
+                <w:tcW w:w="5000" w:type="pct"/>
+              </w:tcPr>
+              <w:p>
+                <w:pPr>
+                  <w:pStyle w:val="TableCell-c"/>
+                </w:pPr>
+                <w:r>
+                  <w:rPr>
+                    <w:noProof/>
+                  </w:rPr>
+                  <w:drawing>
+                    <wp:inline distT="0" distB="0" distL="0" distR="0" wp14:anchorId="0BC26EFB" wp14:editId="3D28380C">
+                      <wp:extent cx="4731577" cy="3139616"/>
+                      <wp:effectExtent l="19050" t="19050" r="12065" b="22860"/>
+                      <wp:docPr id="54" name="Picture 54"/>
+                      <wp:cNvGraphicFramePr>
+                        <a:graphicFrameLocks xmlns:a="http://schemas.openxmlformats.org/drawingml/2006/main" noChangeAspect="1"/>
+                      </wp:cNvGraphicFramePr>
+                      <a:graphic xmlns:a="http://schemas.openxmlformats.org/drawingml/2006/main">
+                        <a:graphicData uri="http://schemas.openxmlformats.org/drawingml/2006/picture">
+                          <pic:pic xmlns:pic="http://schemas.openxmlformats.org/drawingml/2006/picture">
+                            <pic:nvPicPr>
+                              <pic:cNvPr id="54" name="Picture 54"/>
+                              <pic:cNvPicPr>
+                                <a:picLocks noChangeAspect="1" noChangeArrowheads="1"/>
+                              </pic:cNvPicPr>
+                            </pic:nvPicPr>
+                            <pic:blipFill>
+                              <a:blip r:embed="rId33" cstate="print">
+                                <a:extLst>
+                                  <a:ext uri="{28A0092B-C50C-407E-A947-70E740481C1C}">
+                                    <a14:useLocalDpi xmlns:a14="http://schemas.microsoft.com/office/drawing/2010/main" val="0"/>
+                                  </a:ext>
+                                </a:extLst>
+                              </a:blip>
+                              <a:stretch>
+                                <a:fillRect/>
+                              </a:stretch>
+                            </pic:blipFill>
+                            <pic:spPr bwMode="auto">
+                              <a:xfrm>
+                                <a:off x="0" y="0"/>
+                                <a:ext cx="4787718" cy="3176868"/>
+                              </a:xfrm>
+                              <a:prstGeom prst="rect">
+                                <a:avLst/>
+                              </a:prstGeom>
+                              <a:noFill/>
+                              <a:ln>
+                                <a:solidFill>
+                                  <a:schemeClr val="tx1"/>
+                                </a:solidFill>
+                              </a:ln>
+                            </pic:spPr>
+                          </pic:pic>
+                        </a:graphicData>
+                      </a:graphic>
+                    </wp:inline>
+                  </w:drawing>
+                </w:r>
+              </w:p>
+            </w:tc>
+          </w:tr>
+        </w:tbl>
+        <w:p>
+          <w:pPr>
+            <w:pStyle w:val="Figuretitlenew"/>
+            <w:rPr>
+              <w:lang w:eastAsia="de-DE"/>
+            </w:rPr>
+          </w:pPr>
+          <w:r>
+            <w:t xml:space="preserve">Figure </w:t>
+          </w:r>
+          <w:r>
+            <w:fldChar w:fldCharType="begin"/>
+          </w:r>
+          <w:r>
+            <w:instrText xml:space="preserve"> SEQ Figure \* ARABIC </w:instrText>
+          </w:r>
+          <w:r>
+            <w:fldChar w:fldCharType="separate"/>
+          </w:r>
+          <w:r>
+            <w:rPr>
+              <w:noProof/>
+            </w:rPr>
+            <w:t>8</w:t>
+          </w:r>
+          <w:r>
+            <w:fldChar w:fldCharType="end"/>
+          </w:r>
+          <w:r>
+            <w:tab/>
+          </w:r>
+          <w:r>
+            <w:rPr>
+              <w:highlight w:val="yellow"/>
+            </w:rPr>
+            <w:t>Example figure</w:t>
+          </w:r>
+        </w:p>
+      </w:sdtContent>
+    </w:sdt>
     <w:p>
       <w:pPr>
         <w:pStyle w:val="ListParagraph"/>
@@ -4856,73 +5243,147 @@
           <w:lang w:eastAsia="de-DE"/>
         </w:rPr>
       </w:pPr>
-      <w:r>
+    </w:p>
+    <w:sdt>
+      <w:sdtPr>
         <w:rPr>
           <w:noProof/>
-          <w:lang w:eastAsia="de-DE"/>
-        </w:rPr>
-        <w:drawing>
-          <wp:inline distT="0" distB="0" distL="0" distR="0" wp14:anchorId="4883777D" wp14:editId="585E2402">
-            <wp:extent cx="4572070" cy="2508368"/>
-            <wp:effectExtent l="19050" t="19050" r="19050" b="25400"/>
-            <wp:docPr id="55" name="Picture 55"/>
-            <wp:cNvGraphicFramePr>
-              <a:graphicFrameLocks xmlns:a="http://schemas.openxmlformats.org/drawingml/2006/main" noChangeAspect="1"/>
-            </wp:cNvGraphicFramePr>
-            <a:graphic xmlns:a="http://schemas.openxmlformats.org/drawingml/2006/main">
-              <a:graphicData uri="http://schemas.openxmlformats.org/drawingml/2006/picture">
-                <pic:pic xmlns:pic="http://schemas.openxmlformats.org/drawingml/2006/picture">
-                  <pic:nvPicPr>
-                    <pic:cNvPr id="55" name="Picture 55"/>
-                    <pic:cNvPicPr>
-                      <a:picLocks noChangeAspect="1" noChangeArrowheads="1"/>
-                    </pic:cNvPicPr>
-                  </pic:nvPicPr>
-                  <pic:blipFill>
-                    <a:blip r:embed="rId34" cstate="print">
-                      <a:extLst>
-                        <a:ext uri="{28A0092B-C50C-407E-A947-70E740481C1C}">
-                          <a14:useLocalDpi xmlns:a14="http://schemas.microsoft.com/office/drawing/2010/main" val="0"/>
-                        </a:ext>
-                      </a:extLst>
-                    </a:blip>
-                    <a:stretch>
-                      <a:fillRect/>
-                    </a:stretch>
-                  </pic:blipFill>
-                  <pic:spPr bwMode="auto">
-                    <a:xfrm>
-                      <a:off x="0" y="0"/>
-                      <a:ext cx="4572070" cy="2508368"/>
-                    </a:xfrm>
-                    <a:prstGeom prst="rect">
-                      <a:avLst/>
-                    </a:prstGeom>
-                    <a:noFill/>
-                    <a:ln>
-                      <a:solidFill>
-                        <a:schemeClr val="tx1"/>
-                      </a:solidFill>
-                    </a:ln>
-                  </pic:spPr>
-                </pic:pic>
-              </a:graphicData>
-            </a:graphic>
-          </wp:inline>
-        </w:drawing>
-      </w:r>
-    </w:p>
-    <w:p>
-      <w:pPr>
-        <w:spacing w:before="160" w:after="160"/>
-        <w:ind w:left="1418"/>
-        <w:jc w:val="center"/>
-        <w:rPr>
-          <w:noProof/>
-          <w:lang w:eastAsia="de-DE"/>
-        </w:rPr>
-      </w:pPr>
-    </w:p>
+        </w:rPr>
+        <w:alias w:val="mioTextBlock"/>
+        <w:tag w:val="3a4b84c9-b48e-49d6-8bde-fdd57f58df1d"/>
+        <w:id w:val="-28178122"/>
+        <w:placeholder>
+          <w:docPart w:val="DefaultPlaceholder_-1854013440"/>
+        </w:placeholder>
+        <w15:appearance w15:val="hidden"/>
+      </w:sdtPr>
+      <w:sdtEndPr>
+        <w:rPr>
+          <w:b/>
+        </w:rPr>
+      </w:sdtEndPr>
+      <w:sdtContent>
+        <w:tbl>
+          <w:tblPr>
+            <w:tblStyle w:val="InfineonPicture"/>
+            <w:tblW w:w="5000" w:type="pct"/>
+            <w:tblCellMar>
+              <w:left w:w="0" w:type="dxa"/>
+              <w:right w:w="0" w:type="dxa"/>
+            </w:tblCellMar>
+            <w:tblLook w:val="05E0" w:firstRow="1" w:lastRow="1" w:firstColumn="1" w:lastColumn="1" w:noHBand="0" w:noVBand="1"/>
+          </w:tblPr>
+          <w:tblGrid>
+            <w:gridCol w:w="10196"/>
+          </w:tblGrid>
+          <w:tr>
+            <w:tc>
+              <w:tcPr>
+                <w:tcW w:w="5000" w:type="pct"/>
+              </w:tcPr>
+              <w:p>
+                <w:pPr>
+                  <w:pStyle w:val="TableCell-c"/>
+                </w:pPr>
+                <w:r>
+                  <w:rPr>
+                    <w:noProof/>
+                  </w:rPr>
+                  <w:drawing>
+                    <wp:inline distT="0" distB="0" distL="0" distR="0" wp14:anchorId="71E50504" wp14:editId="79FE69E7">
+                      <wp:extent cx="4572070" cy="2508368"/>
+                      <wp:effectExtent l="19050" t="19050" r="19050" b="25400"/>
+                      <wp:docPr id="55" name="Picture 55"/>
+                      <wp:cNvGraphicFramePr>
+                        <a:graphicFrameLocks xmlns:a="http://schemas.openxmlformats.org/drawingml/2006/main" noChangeAspect="1"/>
+                      </wp:cNvGraphicFramePr>
+                      <a:graphic xmlns:a="http://schemas.openxmlformats.org/drawingml/2006/main">
+                        <a:graphicData uri="http://schemas.openxmlformats.org/drawingml/2006/picture">
+                          <pic:pic xmlns:pic="http://schemas.openxmlformats.org/drawingml/2006/picture">
+                            <pic:nvPicPr>
+                              <pic:cNvPr id="55" name="Picture 55"/>
+                              <pic:cNvPicPr>
+                                <a:picLocks noChangeAspect="1" noChangeArrowheads="1"/>
+                              </pic:cNvPicPr>
+                            </pic:nvPicPr>
+                            <pic:blipFill>
+                              <a:blip r:embed="rId34" cstate="print">
+                                <a:extLst>
+                                  <a:ext uri="{28A0092B-C50C-407E-A947-70E740481C1C}">
+                                    <a14:useLocalDpi xmlns:a14="http://schemas.microsoft.com/office/drawing/2010/main" val="0"/>
+                                  </a:ext>
+                                </a:extLst>
+                              </a:blip>
+                              <a:stretch>
+                                <a:fillRect/>
+                              </a:stretch>
+                            </pic:blipFill>
+                            <pic:spPr bwMode="auto">
+                              <a:xfrm>
+                                <a:off x="0" y="0"/>
+                                <a:ext cx="4572070" cy="2508368"/>
+                              </a:xfrm>
+                              <a:prstGeom prst="rect">
+                                <a:avLst/>
+                              </a:prstGeom>
+                              <a:noFill/>
+                              <a:ln>
+                                <a:solidFill>
+                                  <a:schemeClr val="tx1"/>
+                                </a:solidFill>
+                              </a:ln>
+                            </pic:spPr>
+                          </pic:pic>
+                        </a:graphicData>
+                      </a:graphic>
+                    </wp:inline>
+                  </w:drawing>
+                </w:r>
+              </w:p>
+            </w:tc>
+          </w:tr>
+        </w:tbl>
+        <w:p>
+          <w:pPr>
+            <w:pStyle w:val="Figuretitlenew"/>
+            <w:rPr>
+              <w:noProof/>
+              <w:lang w:eastAsia="de-DE"/>
+            </w:rPr>
+          </w:pPr>
+          <w:r>
+            <w:t xml:space="preserve">Figure </w:t>
+          </w:r>
+          <w:r>
+            <w:fldChar w:fldCharType="begin"/>
+          </w:r>
+          <w:r>
+            <w:instrText xml:space="preserve"> SEQ Figure \* ARABIC </w:instrText>
+          </w:r>
+          <w:r>
+            <w:fldChar w:fldCharType="separate"/>
+          </w:r>
+          <w:r>
+            <w:rPr>
+              <w:noProof/>
+            </w:rPr>
+            <w:t>9</w:t>
+          </w:r>
+          <w:r>
+            <w:fldChar w:fldCharType="end"/>
+          </w:r>
+          <w:r>
+            <w:tab/>
+          </w:r>
+          <w:r>
+            <w:rPr>
+              <w:highlight w:val="yellow"/>
+            </w:rPr>
+            <w:t>Example figure</w:t>
+          </w:r>
+        </w:p>
+      </w:sdtContent>
+    </w:sdt>
     <w:p>
       <w:pPr>
         <w:pStyle w:val="ListParagraph"/>
@@ -4987,74 +5448,143 @@
           <w:lang w:eastAsia="de-DE"/>
         </w:rPr>
       </w:pPr>
-      <w:r>
-        <w:rPr>
-          <w:noProof/>
-          <w:lang w:eastAsia="de-DE"/>
-        </w:rPr>
-        <w:lastRenderedPageBreak/>
-        <w:drawing>
-          <wp:inline distT="0" distB="0" distL="0" distR="0" wp14:anchorId="3141F7CF" wp14:editId="3B357284">
-            <wp:extent cx="4370958" cy="2285395"/>
-            <wp:effectExtent l="19050" t="19050" r="10795" b="19685"/>
-            <wp:docPr id="59" name="Picture 59"/>
-            <wp:cNvGraphicFramePr>
-              <a:graphicFrameLocks xmlns:a="http://schemas.openxmlformats.org/drawingml/2006/main" noChangeAspect="1"/>
-            </wp:cNvGraphicFramePr>
-            <a:graphic xmlns:a="http://schemas.openxmlformats.org/drawingml/2006/main">
-              <a:graphicData uri="http://schemas.openxmlformats.org/drawingml/2006/picture">
-                <pic:pic xmlns:pic="http://schemas.openxmlformats.org/drawingml/2006/picture">
-                  <pic:nvPicPr>
-                    <pic:cNvPr id="59" name="Picture 59"/>
-                    <pic:cNvPicPr>
-                      <a:picLocks noChangeAspect="1" noChangeArrowheads="1"/>
-                    </pic:cNvPicPr>
-                  </pic:nvPicPr>
-                  <pic:blipFill>
-                    <a:blip r:embed="rId35" cstate="print">
-                      <a:extLst>
-                        <a:ext uri="{28A0092B-C50C-407E-A947-70E740481C1C}">
-                          <a14:useLocalDpi xmlns:a14="http://schemas.microsoft.com/office/drawing/2010/main" val="0"/>
-                        </a:ext>
-                      </a:extLst>
-                    </a:blip>
-                    <a:stretch>
-                      <a:fillRect/>
-                    </a:stretch>
-                  </pic:blipFill>
-                  <pic:spPr bwMode="auto">
-                    <a:xfrm>
-                      <a:off x="0" y="0"/>
-                      <a:ext cx="4390853" cy="2295797"/>
-                    </a:xfrm>
-                    <a:prstGeom prst="rect">
-                      <a:avLst/>
-                    </a:prstGeom>
-                    <a:noFill/>
-                    <a:ln>
-                      <a:solidFill>
-                        <a:schemeClr val="tx1"/>
-                      </a:solidFill>
-                    </a:ln>
-                  </pic:spPr>
-                </pic:pic>
-              </a:graphicData>
-            </a:graphic>
-          </wp:inline>
-        </w:drawing>
-      </w:r>
-    </w:p>
-    <w:p>
-      <w:pPr>
-        <w:pStyle w:val="ListParagraph"/>
-        <w:spacing w:before="160" w:after="160"/>
-        <w:ind w:left="1778"/>
-        <w:jc w:val="center"/>
-        <w:rPr>
-          <w:lang w:eastAsia="de-DE"/>
-        </w:rPr>
-      </w:pPr>
-    </w:p>
+    </w:p>
+    <w:sdt>
+      <w:sdtPr>
+        <w:alias w:val="mioTextBlock"/>
+        <w:tag w:val="4ff7ff77-b2c0-479e-92a1-38c86c3918f0"/>
+        <w:id w:val="-1533029484"/>
+        <w:placeholder>
+          <w:docPart w:val="DefaultPlaceholder_-1854013440"/>
+        </w:placeholder>
+        <w15:appearance w15:val="hidden"/>
+      </w:sdtPr>
+      <w:sdtEndPr>
+        <w:rPr>
+          <w:b/>
+        </w:rPr>
+      </w:sdtEndPr>
+      <w:sdtContent>
+        <w:tbl>
+          <w:tblPr>
+            <w:tblStyle w:val="InfineonPicture"/>
+            <w:tblW w:w="5000" w:type="pct"/>
+            <w:tblCellMar>
+              <w:left w:w="0" w:type="dxa"/>
+              <w:right w:w="0" w:type="dxa"/>
+            </w:tblCellMar>
+            <w:tblLook w:val="05E0" w:firstRow="1" w:lastRow="1" w:firstColumn="1" w:lastColumn="1" w:noHBand="0" w:noVBand="1"/>
+          </w:tblPr>
+          <w:tblGrid>
+            <w:gridCol w:w="10196"/>
+          </w:tblGrid>
+          <w:tr>
+            <w:tc>
+              <w:tcPr>
+                <w:tcW w:w="5000" w:type="pct"/>
+              </w:tcPr>
+              <w:p>
+                <w:pPr>
+                  <w:pStyle w:val="TableCell-c"/>
+                </w:pPr>
+                <w:r>
+                  <w:rPr>
+                    <w:noProof/>
+                  </w:rPr>
+                  <w:drawing>
+                    <wp:inline distT="0" distB="0" distL="0" distR="0" wp14:anchorId="03DDE479" wp14:editId="72929B0B">
+                      <wp:extent cx="4370958" cy="2285395"/>
+                      <wp:effectExtent l="19050" t="19050" r="10795" b="19685"/>
+                      <wp:docPr id="59" name="Picture 59"/>
+                      <wp:cNvGraphicFramePr>
+                        <a:graphicFrameLocks xmlns:a="http://schemas.openxmlformats.org/drawingml/2006/main" noChangeAspect="1"/>
+                      </wp:cNvGraphicFramePr>
+                      <a:graphic xmlns:a="http://schemas.openxmlformats.org/drawingml/2006/main">
+                        <a:graphicData uri="http://schemas.openxmlformats.org/drawingml/2006/picture">
+                          <pic:pic xmlns:pic="http://schemas.openxmlformats.org/drawingml/2006/picture">
+                            <pic:nvPicPr>
+                              <pic:cNvPr id="59" name="Picture 59"/>
+                              <pic:cNvPicPr>
+                                <a:picLocks noChangeAspect="1" noChangeArrowheads="1"/>
+                              </pic:cNvPicPr>
+                            </pic:nvPicPr>
+                            <pic:blipFill>
+                              <a:blip r:embed="rId35" cstate="print">
+                                <a:extLst>
+                                  <a:ext uri="{28A0092B-C50C-407E-A947-70E740481C1C}">
+                                    <a14:useLocalDpi xmlns:a14="http://schemas.microsoft.com/office/drawing/2010/main" val="0"/>
+                                  </a:ext>
+                                </a:extLst>
+                              </a:blip>
+                              <a:stretch>
+                                <a:fillRect/>
+                              </a:stretch>
+                            </pic:blipFill>
+                            <pic:spPr bwMode="auto">
+                              <a:xfrm>
+                                <a:off x="0" y="0"/>
+                                <a:ext cx="4390853" cy="2295797"/>
+                              </a:xfrm>
+                              <a:prstGeom prst="rect">
+                                <a:avLst/>
+                              </a:prstGeom>
+                              <a:noFill/>
+                              <a:ln>
+                                <a:solidFill>
+                                  <a:schemeClr val="tx1"/>
+                                </a:solidFill>
+                              </a:ln>
+                            </pic:spPr>
+                          </pic:pic>
+                        </a:graphicData>
+                      </a:graphic>
+                    </wp:inline>
+                  </w:drawing>
+                </w:r>
+              </w:p>
+            </w:tc>
+          </w:tr>
+        </w:tbl>
+        <w:p>
+          <w:pPr>
+            <w:pStyle w:val="Figuretitlenew"/>
+            <w:rPr>
+              <w:lang w:eastAsia="de-DE"/>
+            </w:rPr>
+          </w:pPr>
+          <w:r>
+            <w:t xml:space="preserve">Figure </w:t>
+          </w:r>
+          <w:r>
+            <w:fldChar w:fldCharType="begin"/>
+          </w:r>
+          <w:r>
+            <w:instrText xml:space="preserve"> SEQ Figure \* ARABIC </w:instrText>
+          </w:r>
+          <w:r>
+            <w:fldChar w:fldCharType="separate"/>
+          </w:r>
+          <w:r>
+            <w:rPr>
+              <w:noProof/>
+            </w:rPr>
+            <w:t>10</w:t>
+          </w:r>
+          <w:r>
+            <w:fldChar w:fldCharType="end"/>
+          </w:r>
+          <w:r>
+            <w:tab/>
+          </w:r>
+          <w:r>
+            <w:rPr>
+              <w:highlight w:val="yellow"/>
+            </w:rPr>
+            <w:t>Example figure</w:t>
+          </w:r>
+        </w:p>
+      </w:sdtContent>
+    </w:sdt>
     <w:p>
       <w:pPr>
         <w:pStyle w:val="ListParagraph"/>
@@ -5092,73 +5622,145 @@
         <w:ind w:left="709"/>
         <w:jc w:val="center"/>
       </w:pPr>
-      <w:r>
-        <w:rPr>
-          <w:noProof/>
-        </w:rPr>
-        <w:drawing>
-          <wp:inline distT="0" distB="0" distL="0" distR="0" wp14:anchorId="53D41288" wp14:editId="66A1A439">
-            <wp:extent cx="1824146" cy="3885196"/>
-            <wp:effectExtent l="19050" t="19050" r="24130" b="20320"/>
-            <wp:docPr id="60" name="Picture 60"/>
-            <wp:cNvGraphicFramePr>
-              <a:graphicFrameLocks xmlns:a="http://schemas.openxmlformats.org/drawingml/2006/main" noChangeAspect="1"/>
-            </wp:cNvGraphicFramePr>
-            <a:graphic xmlns:a="http://schemas.openxmlformats.org/drawingml/2006/main">
-              <a:graphicData uri="http://schemas.openxmlformats.org/drawingml/2006/picture">
-                <pic:pic xmlns:pic="http://schemas.openxmlformats.org/drawingml/2006/picture">
-                  <pic:nvPicPr>
-                    <pic:cNvPr id="60" name="Picture 60"/>
-                    <pic:cNvPicPr/>
-                  </pic:nvPicPr>
-                  <pic:blipFill>
-                    <a:blip r:embed="rId36">
-                      <a:extLst>
-                        <a:ext uri="{28A0092B-C50C-407E-A947-70E740481C1C}">
-                          <a14:useLocalDpi xmlns:a14="http://schemas.microsoft.com/office/drawing/2010/main" val="0"/>
-                        </a:ext>
-                      </a:extLst>
-                    </a:blip>
-                    <a:stretch>
-                      <a:fillRect/>
-                    </a:stretch>
-                  </pic:blipFill>
-                  <pic:spPr bwMode="auto">
-                    <a:xfrm>
-                      <a:off x="0" y="0"/>
-                      <a:ext cx="1824146" cy="3885196"/>
-                    </a:xfrm>
-                    <a:prstGeom prst="rect">
-                      <a:avLst/>
-                    </a:prstGeom>
-                    <a:ln>
-                      <a:solidFill>
-                        <a:schemeClr val="tx1"/>
-                      </a:solidFill>
-                    </a:ln>
-                    <a:extLst>
-                      <a:ext uri="{53640926-AAD7-44D8-BBD7-CCE9431645EC}">
-                        <a14:shadowObscured xmlns:a14="http://schemas.microsoft.com/office/drawing/2010/main"/>
-                      </a:ext>
-                    </a:extLst>
-                  </pic:spPr>
-                </pic:pic>
-              </a:graphicData>
-            </a:graphic>
-          </wp:inline>
-        </w:drawing>
-      </w:r>
-    </w:p>
-    <w:p>
-      <w:pPr>
-        <w:pStyle w:val="ListParagraph"/>
-        <w:spacing w:before="160" w:after="160"/>
-        <w:ind w:left="1778"/>
-        <w:rPr>
-          <w:lang w:eastAsia="de-DE"/>
-        </w:rPr>
-      </w:pPr>
-    </w:p>
+    </w:p>
+    <w:sdt>
+      <w:sdtPr>
+        <w:alias w:val="mioTextBlock"/>
+        <w:tag w:val="5a217fb6-d41c-4253-aab3-e46a0a6cf4db"/>
+        <w:id w:val="1719478455"/>
+        <w:placeholder>
+          <w:docPart w:val="DefaultPlaceholder_-1854013440"/>
+        </w:placeholder>
+        <w15:appearance w15:val="hidden"/>
+      </w:sdtPr>
+      <w:sdtEndPr>
+        <w:rPr>
+          <w:b/>
+        </w:rPr>
+      </w:sdtEndPr>
+      <w:sdtContent>
+        <w:tbl>
+          <w:tblPr>
+            <w:tblStyle w:val="InfineonPicture"/>
+            <w:tblW w:w="5000" w:type="pct"/>
+            <w:tblCellMar>
+              <w:left w:w="0" w:type="dxa"/>
+              <w:right w:w="0" w:type="dxa"/>
+            </w:tblCellMar>
+            <w:tblLook w:val="05E0" w:firstRow="1" w:lastRow="1" w:firstColumn="1" w:lastColumn="1" w:noHBand="0" w:noVBand="1"/>
+          </w:tblPr>
+          <w:tblGrid>
+            <w:gridCol w:w="10196"/>
+          </w:tblGrid>
+          <w:tr>
+            <w:tc>
+              <w:tcPr>
+                <w:tcW w:w="5000" w:type="pct"/>
+              </w:tcPr>
+              <w:p>
+                <w:pPr>
+                  <w:pStyle w:val="TableCell-c"/>
+                </w:pPr>
+                <w:r>
+                  <w:rPr>
+                    <w:noProof/>
+                  </w:rPr>
+                  <w:drawing>
+                    <wp:inline distT="0" distB="0" distL="0" distR="0" wp14:anchorId="0B88D03C" wp14:editId="1AA94014">
+                      <wp:extent cx="1824146" cy="3885196"/>
+                      <wp:effectExtent l="19050" t="19050" r="24130" b="20320"/>
+                      <wp:docPr id="60" name="Picture 60"/>
+                      <wp:cNvGraphicFramePr>
+                        <a:graphicFrameLocks xmlns:a="http://schemas.openxmlformats.org/drawingml/2006/main" noChangeAspect="1"/>
+                      </wp:cNvGraphicFramePr>
+                      <a:graphic xmlns:a="http://schemas.openxmlformats.org/drawingml/2006/main">
+                        <a:graphicData uri="http://schemas.openxmlformats.org/drawingml/2006/picture">
+                          <pic:pic xmlns:pic="http://schemas.openxmlformats.org/drawingml/2006/picture">
+                            <pic:nvPicPr>
+                              <pic:cNvPr id="60" name="Picture 60"/>
+                              <pic:cNvPicPr/>
+                            </pic:nvPicPr>
+                            <pic:blipFill>
+                              <a:blip r:embed="rId36">
+                                <a:extLst>
+                                  <a:ext uri="{28A0092B-C50C-407E-A947-70E740481C1C}">
+                                    <a14:useLocalDpi xmlns:a14="http://schemas.microsoft.com/office/drawing/2010/main" val="0"/>
+                                  </a:ext>
+                                </a:extLst>
+                              </a:blip>
+                              <a:stretch>
+                                <a:fillRect/>
+                              </a:stretch>
+                            </pic:blipFill>
+                            <pic:spPr bwMode="auto">
+                              <a:xfrm>
+                                <a:off x="0" y="0"/>
+                                <a:ext cx="1824146" cy="3885196"/>
+                              </a:xfrm>
+                              <a:prstGeom prst="rect">
+                                <a:avLst/>
+                              </a:prstGeom>
+                              <a:ln>
+                                <a:solidFill>
+                                  <a:schemeClr val="tx1"/>
+                                </a:solidFill>
+                              </a:ln>
+                              <a:extLst>
+                                <a:ext uri="{53640926-AAD7-44D8-BBD7-CCE9431645EC}">
+                                  <a14:shadowObscured xmlns:a14="http://schemas.microsoft.com/office/drawing/2010/main"/>
+                                </a:ext>
+                              </a:extLst>
+                            </pic:spPr>
+                          </pic:pic>
+                        </a:graphicData>
+                      </a:graphic>
+                    </wp:inline>
+                  </w:drawing>
+                </w:r>
+              </w:p>
+            </w:tc>
+          </w:tr>
+        </w:tbl>
+        <w:p>
+          <w:pPr>
+            <w:pStyle w:val="Figuretitlenew"/>
+            <w:rPr>
+              <w:lang w:eastAsia="de-DE"/>
+            </w:rPr>
+          </w:pPr>
+          <w:r>
+            <w:t xml:space="preserve">Figure </w:t>
+          </w:r>
+          <w:r>
+            <w:fldChar w:fldCharType="begin"/>
+          </w:r>
+          <w:r>
+            <w:instrText xml:space="preserve"> SEQ Figure \* ARABIC </w:instrText>
+          </w:r>
+          <w:r>
+            <w:fldChar w:fldCharType="separate"/>
+          </w:r>
+          <w:r>
+            <w:rPr>
+              <w:noProof/>
+            </w:rPr>
+            <w:t>11</w:t>
+          </w:r>
+          <w:r>
+            <w:fldChar w:fldCharType="end"/>
+          </w:r>
+          <w:r>
+            <w:tab/>
+          </w:r>
+          <w:r>
+            <w:rPr>
+              <w:highlight w:val="yellow"/>
+            </w:rPr>
+            <w:t>Example figure</w:t>
+          </w:r>
+        </w:p>
+      </w:sdtContent>
+    </w:sdt>
     <w:p>
       <w:pPr>
         <w:pStyle w:val="ListParagraph"/>
@@ -5247,12 +5849,19 @@
         <w:rPr>
           <w:b/>
         </w:rPr>
-        <w:t>Project Explorer</w:t>
+        <w:t xml:space="preserve">Project </w:t>
       </w:r>
       <w:r>
         <w:rPr>
           <w:b/>
         </w:rPr>
+        <w:lastRenderedPageBreak/>
+        <w:t>Explorer</w:t>
+      </w:r>
+      <w:r>
+        <w:rPr>
+          <w:b/>
+        </w:rPr>
         <w:t xml:space="preserve"> </w:t>
       </w:r>
       <w:r>
@@ -5336,63 +5945,143 @@
           <w:lang w:eastAsia="de-DE"/>
         </w:rPr>
       </w:pPr>
-      <w:r>
-        <w:rPr>
-          <w:noProof/>
-          <w:lang w:eastAsia="de-DE"/>
-        </w:rPr>
-        <w:lastRenderedPageBreak/>
-        <w:drawing>
-          <wp:inline distT="0" distB="0" distL="0" distR="0" wp14:anchorId="5B927182" wp14:editId="37693207">
-            <wp:extent cx="1638209" cy="3683804"/>
-            <wp:effectExtent l="19050" t="19050" r="19685" b="12065"/>
-            <wp:docPr id="18" name="Picture 18"/>
-            <wp:cNvGraphicFramePr>
-              <a:graphicFrameLocks xmlns:a="http://schemas.openxmlformats.org/drawingml/2006/main" noChangeAspect="1"/>
-            </wp:cNvGraphicFramePr>
-            <a:graphic xmlns:a="http://schemas.openxmlformats.org/drawingml/2006/main">
-              <a:graphicData uri="http://schemas.openxmlformats.org/drawingml/2006/picture">
-                <pic:pic xmlns:pic="http://schemas.openxmlformats.org/drawingml/2006/picture">
-                  <pic:nvPicPr>
-                    <pic:cNvPr id="66" name="Picture 66"/>
-                    <pic:cNvPicPr>
-                      <a:picLocks noChangeAspect="1" noChangeArrowheads="1"/>
-                    </pic:cNvPicPr>
-                  </pic:nvPicPr>
-                  <pic:blipFill>
-                    <a:blip r:embed="rId37">
-                      <a:extLst>
-                        <a:ext uri="{28A0092B-C50C-407E-A947-70E740481C1C}">
-                          <a14:useLocalDpi xmlns:a14="http://schemas.microsoft.com/office/drawing/2010/main" val="0"/>
-                        </a:ext>
-                      </a:extLst>
-                    </a:blip>
-                    <a:stretch>
-                      <a:fillRect/>
-                    </a:stretch>
-                  </pic:blipFill>
-                  <pic:spPr bwMode="auto">
-                    <a:xfrm>
-                      <a:off x="0" y="0"/>
-                      <a:ext cx="1669039" cy="3753131"/>
-                    </a:xfrm>
-                    <a:prstGeom prst="rect">
-                      <a:avLst/>
-                    </a:prstGeom>
-                    <a:noFill/>
-                    <a:ln>
-                      <a:solidFill>
-                        <a:schemeClr val="tx1"/>
-                      </a:solidFill>
-                    </a:ln>
-                  </pic:spPr>
-                </pic:pic>
-              </a:graphicData>
-            </a:graphic>
-          </wp:inline>
-        </w:drawing>
-      </w:r>
-    </w:p>
+    </w:p>
+    <w:sdt>
+      <w:sdtPr>
+        <w:alias w:val="mioTextBlock"/>
+        <w:tag w:val="cc270b98-ffd7-4663-9c8a-431904c746a2"/>
+        <w:id w:val="2082950325"/>
+        <w:placeholder>
+          <w:docPart w:val="DefaultPlaceholder_-1854013440"/>
+        </w:placeholder>
+        <w15:appearance w15:val="hidden"/>
+      </w:sdtPr>
+      <w:sdtEndPr>
+        <w:rPr>
+          <w:b/>
+        </w:rPr>
+      </w:sdtEndPr>
+      <w:sdtContent>
+        <w:tbl>
+          <w:tblPr>
+            <w:tblStyle w:val="InfineonPicture"/>
+            <w:tblW w:w="5000" w:type="pct"/>
+            <w:tblCellMar>
+              <w:left w:w="0" w:type="dxa"/>
+              <w:right w:w="0" w:type="dxa"/>
+            </w:tblCellMar>
+            <w:tblLook w:val="05E0" w:firstRow="1" w:lastRow="1" w:firstColumn="1" w:lastColumn="1" w:noHBand="0" w:noVBand="1"/>
+          </w:tblPr>
+          <w:tblGrid>
+            <w:gridCol w:w="10196"/>
+          </w:tblGrid>
+          <w:tr>
+            <w:tc>
+              <w:tcPr>
+                <w:tcW w:w="5000" w:type="pct"/>
+              </w:tcPr>
+              <w:p>
+                <w:pPr>
+                  <w:pStyle w:val="TableCell-c"/>
+                </w:pPr>
+                <w:r>
+                  <w:rPr>
+                    <w:noProof/>
+                  </w:rPr>
+                  <w:drawing>
+                    <wp:inline distT="0" distB="0" distL="0" distR="0" wp14:anchorId="63AA27E3" wp14:editId="11C91765">
+                      <wp:extent cx="1638209" cy="3683804"/>
+                      <wp:effectExtent l="19050" t="19050" r="19685" b="12065"/>
+                      <wp:docPr id="18" name="Picture 18"/>
+                      <wp:cNvGraphicFramePr>
+                        <a:graphicFrameLocks xmlns:a="http://schemas.openxmlformats.org/drawingml/2006/main" noChangeAspect="1"/>
+                      </wp:cNvGraphicFramePr>
+                      <a:graphic xmlns:a="http://schemas.openxmlformats.org/drawingml/2006/main">
+                        <a:graphicData uri="http://schemas.openxmlformats.org/drawingml/2006/picture">
+                          <pic:pic xmlns:pic="http://schemas.openxmlformats.org/drawingml/2006/picture">
+                            <pic:nvPicPr>
+                              <pic:cNvPr id="66" name="Picture 66"/>
+                              <pic:cNvPicPr>
+                                <a:picLocks noChangeAspect="1" noChangeArrowheads="1"/>
+                              </pic:cNvPicPr>
+                            </pic:nvPicPr>
+                            <pic:blipFill>
+                              <a:blip r:embed="rId37">
+                                <a:extLst>
+                                  <a:ext uri="{28A0092B-C50C-407E-A947-70E740481C1C}">
+                                    <a14:useLocalDpi xmlns:a14="http://schemas.microsoft.com/office/drawing/2010/main" val="0"/>
+                                  </a:ext>
+                                </a:extLst>
+                              </a:blip>
+                              <a:stretch>
+                                <a:fillRect/>
+                              </a:stretch>
+                            </pic:blipFill>
+                            <pic:spPr bwMode="auto">
+                              <a:xfrm>
+                                <a:off x="0" y="0"/>
+                                <a:ext cx="1669039" cy="3753131"/>
+                              </a:xfrm>
+                              <a:prstGeom prst="rect">
+                                <a:avLst/>
+                              </a:prstGeom>
+                              <a:noFill/>
+                              <a:ln>
+                                <a:solidFill>
+                                  <a:schemeClr val="tx1"/>
+                                </a:solidFill>
+                              </a:ln>
+                            </pic:spPr>
+                          </pic:pic>
+                        </a:graphicData>
+                      </a:graphic>
+                    </wp:inline>
+                  </w:drawing>
+                </w:r>
+              </w:p>
+            </w:tc>
+          </w:tr>
+        </w:tbl>
+        <w:p>
+          <w:pPr>
+            <w:pStyle w:val="Figuretitlenew"/>
+            <w:rPr>
+              <w:lang w:eastAsia="de-DE"/>
+            </w:rPr>
+          </w:pPr>
+          <w:r>
+            <w:t xml:space="preserve">Figure </w:t>
+          </w:r>
+          <w:r>
+            <w:fldChar w:fldCharType="begin"/>
+          </w:r>
+          <w:r>
+            <w:instrText xml:space="preserve"> SEQ Figure \* ARABIC </w:instrText>
+          </w:r>
+          <w:r>
+            <w:fldChar w:fldCharType="separate"/>
+          </w:r>
+          <w:r>
+            <w:rPr>
+              <w:noProof/>
+            </w:rPr>
+            <w:t>12</w:t>
+          </w:r>
+          <w:r>
+            <w:fldChar w:fldCharType="end"/>
+          </w:r>
+          <w:r>
+            <w:tab/>
+          </w:r>
+          <w:r>
+            <w:rPr>
+              <w:highlight w:val="yellow"/>
+            </w:rPr>
+            <w:t>Example figure</w:t>
+          </w:r>
+        </w:p>
+      </w:sdtContent>
+    </w:sdt>
     <w:p>
       <w:pPr>
         <w:pStyle w:val="ListParagraph"/>
@@ -5669,62 +6358,143 @@
           <w:lang w:eastAsia="de-DE"/>
         </w:rPr>
       </w:pPr>
-      <w:r>
-        <w:rPr>
-          <w:noProof/>
-          <w:lang w:eastAsia="de-DE"/>
-        </w:rPr>
-        <w:drawing>
-          <wp:inline distT="0" distB="0" distL="0" distR="0" wp14:anchorId="415CBEB9" wp14:editId="61F704C6">
-            <wp:extent cx="4902397" cy="3822318"/>
-            <wp:effectExtent l="19050" t="19050" r="12700" b="26035"/>
-            <wp:docPr id="31" name="Picture 31"/>
-            <wp:cNvGraphicFramePr>
-              <a:graphicFrameLocks xmlns:a="http://schemas.openxmlformats.org/drawingml/2006/main" noChangeAspect="1"/>
-            </wp:cNvGraphicFramePr>
-            <a:graphic xmlns:a="http://schemas.openxmlformats.org/drawingml/2006/main">
-              <a:graphicData uri="http://schemas.openxmlformats.org/drawingml/2006/picture">
-                <pic:pic xmlns:pic="http://schemas.openxmlformats.org/drawingml/2006/picture">
-                  <pic:nvPicPr>
-                    <pic:cNvPr id="31" name="Picture 31"/>
-                    <pic:cNvPicPr>
-                      <a:picLocks noChangeAspect="1" noChangeArrowheads="1"/>
-                    </pic:cNvPicPr>
-                  </pic:nvPicPr>
-                  <pic:blipFill>
-                    <a:blip r:embed="rId38" cstate="print">
-                      <a:extLst>
-                        <a:ext uri="{28A0092B-C50C-407E-A947-70E740481C1C}">
-                          <a14:useLocalDpi xmlns:a14="http://schemas.microsoft.com/office/drawing/2010/main" val="0"/>
-                        </a:ext>
-                      </a:extLst>
-                    </a:blip>
-                    <a:stretch>
-                      <a:fillRect/>
-                    </a:stretch>
-                  </pic:blipFill>
-                  <pic:spPr bwMode="auto">
-                    <a:xfrm>
-                      <a:off x="0" y="0"/>
-                      <a:ext cx="4902397" cy="3822318"/>
-                    </a:xfrm>
-                    <a:prstGeom prst="rect">
-                      <a:avLst/>
-                    </a:prstGeom>
-                    <a:noFill/>
-                    <a:ln>
-                      <a:solidFill>
-                        <a:schemeClr val="tx1"/>
-                      </a:solidFill>
-                    </a:ln>
-                  </pic:spPr>
-                </pic:pic>
-              </a:graphicData>
-            </a:graphic>
-          </wp:inline>
-        </w:drawing>
-      </w:r>
-    </w:p>
+    </w:p>
+    <w:sdt>
+      <w:sdtPr>
+        <w:alias w:val="mioTextBlock"/>
+        <w:tag w:val="78df9b7c-8489-42ff-946e-b0e28db44603"/>
+        <w:id w:val="-1157841046"/>
+        <w:placeholder>
+          <w:docPart w:val="DefaultPlaceholder_-1854013440"/>
+        </w:placeholder>
+        <w15:appearance w15:val="hidden"/>
+      </w:sdtPr>
+      <w:sdtEndPr>
+        <w:rPr>
+          <w:b/>
+        </w:rPr>
+      </w:sdtEndPr>
+      <w:sdtContent>
+        <w:tbl>
+          <w:tblPr>
+            <w:tblStyle w:val="InfineonPicture"/>
+            <w:tblW w:w="5000" w:type="pct"/>
+            <w:tblCellMar>
+              <w:left w:w="0" w:type="dxa"/>
+              <w:right w:w="0" w:type="dxa"/>
+            </w:tblCellMar>
+            <w:tblLook w:val="05E0" w:firstRow="1" w:lastRow="1" w:firstColumn="1" w:lastColumn="1" w:noHBand="0" w:noVBand="1"/>
+          </w:tblPr>
+          <w:tblGrid>
+            <w:gridCol w:w="10196"/>
+          </w:tblGrid>
+          <w:tr>
+            <w:tc>
+              <w:tcPr>
+                <w:tcW w:w="5000" w:type="pct"/>
+              </w:tcPr>
+              <w:p>
+                <w:pPr>
+                  <w:pStyle w:val="TableCell-c"/>
+                </w:pPr>
+                <w:r>
+                  <w:rPr>
+                    <w:noProof/>
+                  </w:rPr>
+                  <w:drawing>
+                    <wp:inline distT="0" distB="0" distL="0" distR="0" wp14:anchorId="3805ACEE" wp14:editId="4CC7F12A">
+                      <wp:extent cx="4902397" cy="3822318"/>
+                      <wp:effectExtent l="19050" t="19050" r="12700" b="26035"/>
+                      <wp:docPr id="31" name="Picture 31"/>
+                      <wp:cNvGraphicFramePr>
+                        <a:graphicFrameLocks xmlns:a="http://schemas.openxmlformats.org/drawingml/2006/main" noChangeAspect="1"/>
+                      </wp:cNvGraphicFramePr>
+                      <a:graphic xmlns:a="http://schemas.openxmlformats.org/drawingml/2006/main">
+                        <a:graphicData uri="http://schemas.openxmlformats.org/drawingml/2006/picture">
+                          <pic:pic xmlns:pic="http://schemas.openxmlformats.org/drawingml/2006/picture">
+                            <pic:nvPicPr>
+                              <pic:cNvPr id="31" name="Picture 31"/>
+                              <pic:cNvPicPr>
+                                <a:picLocks noChangeAspect="1" noChangeArrowheads="1"/>
+                              </pic:cNvPicPr>
+                            </pic:nvPicPr>
+                            <pic:blipFill>
+                              <a:blip r:embed="rId38" cstate="print">
+                                <a:extLst>
+                                  <a:ext uri="{28A0092B-C50C-407E-A947-70E740481C1C}">
+                                    <a14:useLocalDpi xmlns:a14="http://schemas.microsoft.com/office/drawing/2010/main" val="0"/>
+                                  </a:ext>
+                                </a:extLst>
+                              </a:blip>
+                              <a:stretch>
+                                <a:fillRect/>
+                              </a:stretch>
+                            </pic:blipFill>
+                            <pic:spPr bwMode="auto">
+                              <a:xfrm>
+                                <a:off x="0" y="0"/>
+                                <a:ext cx="4902397" cy="3822318"/>
+                              </a:xfrm>
+                              <a:prstGeom prst="rect">
+                                <a:avLst/>
+                              </a:prstGeom>
+                              <a:noFill/>
+                              <a:ln>
+                                <a:solidFill>
+                                  <a:schemeClr val="tx1"/>
+                                </a:solidFill>
+                              </a:ln>
+                            </pic:spPr>
+                          </pic:pic>
+                        </a:graphicData>
+                      </a:graphic>
+                    </wp:inline>
+                  </w:drawing>
+                </w:r>
+              </w:p>
+            </w:tc>
+          </w:tr>
+        </w:tbl>
+        <w:p>
+          <w:pPr>
+            <w:pStyle w:val="Figuretitlenew"/>
+            <w:rPr>
+              <w:lang w:eastAsia="de-DE"/>
+            </w:rPr>
+          </w:pPr>
+          <w:r>
+            <w:t xml:space="preserve">Figure </w:t>
+          </w:r>
+          <w:r>
+            <w:fldChar w:fldCharType="begin"/>
+          </w:r>
+          <w:r>
+            <w:instrText xml:space="preserve"> SEQ Figure \* ARABIC </w:instrText>
+          </w:r>
+          <w:r>
+            <w:fldChar w:fldCharType="separate"/>
+          </w:r>
+          <w:r>
+            <w:rPr>
+              <w:noProof/>
+            </w:rPr>
+            <w:t>13</w:t>
+          </w:r>
+          <w:r>
+            <w:fldChar w:fldCharType="end"/>
+          </w:r>
+          <w:r>
+            <w:tab/>
+          </w:r>
+          <w:r>
+            <w:rPr>
+              <w:highlight w:val="yellow"/>
+            </w:rPr>
+            <w:t>Example figure</w:t>
+          </w:r>
+        </w:p>
+      </w:sdtContent>
+    </w:sdt>
     <w:p>
       <w:pPr>
         <w:pStyle w:val="ListParagraph"/>
@@ -5744,21 +6514,10 @@
           <w:lang w:eastAsia="de-DE"/>
         </w:rPr>
       </w:pPr>
-    </w:p>
-    <w:p>
-      <w:pPr>
-        <w:pStyle w:val="ListParagraph"/>
-        <w:spacing w:before="160" w:after="160"/>
-        <w:ind w:left="1778"/>
-        <w:rPr>
-          <w:lang w:eastAsia="de-DE"/>
-        </w:rPr>
-      </w:pPr>
-      <w:r>
-        <w:rPr>
-          <w:lang w:eastAsia="de-DE"/>
-        </w:rPr>
-        <w:lastRenderedPageBreak/>
+      <w:r>
+        <w:rPr>
+          <w:lang w:eastAsia="de-DE"/>
+        </w:rPr>
         <w:t xml:space="preserve">Now, click the </w:t>
       </w:r>
       <w:r>
@@ -5856,62 +6615,143 @@
           <w:lang w:eastAsia="de-DE"/>
         </w:rPr>
       </w:pPr>
-      <w:r>
-        <w:rPr>
-          <w:noProof/>
-          <w:lang w:eastAsia="de-DE"/>
-        </w:rPr>
-        <w:drawing>
-          <wp:inline distT="0" distB="0" distL="0" distR="0" wp14:anchorId="3DC2931F" wp14:editId="79687BA0">
-            <wp:extent cx="4900995" cy="3234260"/>
-            <wp:effectExtent l="19050" t="19050" r="13970" b="23495"/>
-            <wp:docPr id="69" name="Picture 69"/>
-            <wp:cNvGraphicFramePr>
-              <a:graphicFrameLocks xmlns:a="http://schemas.openxmlformats.org/drawingml/2006/main" noChangeAspect="1"/>
-            </wp:cNvGraphicFramePr>
-            <a:graphic xmlns:a="http://schemas.openxmlformats.org/drawingml/2006/main">
-              <a:graphicData uri="http://schemas.openxmlformats.org/drawingml/2006/picture">
-                <pic:pic xmlns:pic="http://schemas.openxmlformats.org/drawingml/2006/picture">
-                  <pic:nvPicPr>
-                    <pic:cNvPr id="69" name="Picture 69"/>
-                    <pic:cNvPicPr>
-                      <a:picLocks noChangeAspect="1" noChangeArrowheads="1"/>
-                    </pic:cNvPicPr>
-                  </pic:nvPicPr>
-                  <pic:blipFill>
-                    <a:blip r:embed="rId39">
-                      <a:extLst>
-                        <a:ext uri="{28A0092B-C50C-407E-A947-70E740481C1C}">
-                          <a14:useLocalDpi xmlns:a14="http://schemas.microsoft.com/office/drawing/2010/main" val="0"/>
-                        </a:ext>
-                      </a:extLst>
-                    </a:blip>
-                    <a:stretch>
-                      <a:fillRect/>
-                    </a:stretch>
-                  </pic:blipFill>
-                  <pic:spPr bwMode="auto">
-                    <a:xfrm>
-                      <a:off x="0" y="0"/>
-                      <a:ext cx="4900995" cy="3234260"/>
-                    </a:xfrm>
-                    <a:prstGeom prst="rect">
-                      <a:avLst/>
-                    </a:prstGeom>
-                    <a:noFill/>
-                    <a:ln>
-                      <a:solidFill>
-                        <a:schemeClr val="tx1"/>
-                      </a:solidFill>
-                    </a:ln>
-                  </pic:spPr>
-                </pic:pic>
-              </a:graphicData>
-            </a:graphic>
-          </wp:inline>
-        </w:drawing>
-      </w:r>
-    </w:p>
+    </w:p>
+    <w:sdt>
+      <w:sdtPr>
+        <w:alias w:val="mioTextBlock"/>
+        <w:tag w:val="616af388-56c5-43ce-81c1-f830f0a0d34e"/>
+        <w:id w:val="1609850989"/>
+        <w:placeholder>
+          <w:docPart w:val="DefaultPlaceholder_-1854013440"/>
+        </w:placeholder>
+        <w15:appearance w15:val="hidden"/>
+      </w:sdtPr>
+      <w:sdtEndPr>
+        <w:rPr>
+          <w:b/>
+        </w:rPr>
+      </w:sdtEndPr>
+      <w:sdtContent>
+        <w:tbl>
+          <w:tblPr>
+            <w:tblStyle w:val="InfineonPicture"/>
+            <w:tblW w:w="5000" w:type="pct"/>
+            <w:tblCellMar>
+              <w:left w:w="0" w:type="dxa"/>
+              <w:right w:w="0" w:type="dxa"/>
+            </w:tblCellMar>
+            <w:tblLook w:val="05E0" w:firstRow="1" w:lastRow="1" w:firstColumn="1" w:lastColumn="1" w:noHBand="0" w:noVBand="1"/>
+          </w:tblPr>
+          <w:tblGrid>
+            <w:gridCol w:w="10196"/>
+          </w:tblGrid>
+          <w:tr>
+            <w:tc>
+              <w:tcPr>
+                <w:tcW w:w="5000" w:type="pct"/>
+              </w:tcPr>
+              <w:p>
+                <w:pPr>
+                  <w:pStyle w:val="TableCell-c"/>
+                </w:pPr>
+                <w:r>
+                  <w:rPr>
+                    <w:noProof/>
+                  </w:rPr>
+                  <w:drawing>
+                    <wp:inline distT="0" distB="0" distL="0" distR="0" wp14:anchorId="610BE1A5" wp14:editId="1FDC55F4">
+                      <wp:extent cx="4900995" cy="3234260"/>
+                      <wp:effectExtent l="19050" t="19050" r="13970" b="23495"/>
+                      <wp:docPr id="69" name="Picture 69"/>
+                      <wp:cNvGraphicFramePr>
+                        <a:graphicFrameLocks xmlns:a="http://schemas.openxmlformats.org/drawingml/2006/main" noChangeAspect="1"/>
+                      </wp:cNvGraphicFramePr>
+                      <a:graphic xmlns:a="http://schemas.openxmlformats.org/drawingml/2006/main">
+                        <a:graphicData uri="http://schemas.openxmlformats.org/drawingml/2006/picture">
+                          <pic:pic xmlns:pic="http://schemas.openxmlformats.org/drawingml/2006/picture">
+                            <pic:nvPicPr>
+                              <pic:cNvPr id="69" name="Picture 69"/>
+                              <pic:cNvPicPr>
+                                <a:picLocks noChangeAspect="1" noChangeArrowheads="1"/>
+                              </pic:cNvPicPr>
+                            </pic:nvPicPr>
+                            <pic:blipFill>
+                              <a:blip r:embed="rId39">
+                                <a:extLst>
+                                  <a:ext uri="{28A0092B-C50C-407E-A947-70E740481C1C}">
+                                    <a14:useLocalDpi xmlns:a14="http://schemas.microsoft.com/office/drawing/2010/main" val="0"/>
+                                  </a:ext>
+                                </a:extLst>
+                              </a:blip>
+                              <a:stretch>
+                                <a:fillRect/>
+                              </a:stretch>
+                            </pic:blipFill>
+                            <pic:spPr bwMode="auto">
+                              <a:xfrm>
+                                <a:off x="0" y="0"/>
+                                <a:ext cx="4900995" cy="3234260"/>
+                              </a:xfrm>
+                              <a:prstGeom prst="rect">
+                                <a:avLst/>
+                              </a:prstGeom>
+                              <a:noFill/>
+                              <a:ln>
+                                <a:solidFill>
+                                  <a:schemeClr val="tx1"/>
+                                </a:solidFill>
+                              </a:ln>
+                            </pic:spPr>
+                          </pic:pic>
+                        </a:graphicData>
+                      </a:graphic>
+                    </wp:inline>
+                  </w:drawing>
+                </w:r>
+              </w:p>
+            </w:tc>
+          </w:tr>
+        </w:tbl>
+        <w:p>
+          <w:pPr>
+            <w:pStyle w:val="Figuretitlenew"/>
+            <w:rPr>
+              <w:lang w:eastAsia="de-DE"/>
+            </w:rPr>
+          </w:pPr>
+          <w:r>
+            <w:t xml:space="preserve">Figure </w:t>
+          </w:r>
+          <w:r>
+            <w:fldChar w:fldCharType="begin"/>
+          </w:r>
+          <w:r>
+            <w:instrText xml:space="preserve"> SEQ Figure \* ARABIC </w:instrText>
+          </w:r>
+          <w:r>
+            <w:fldChar w:fldCharType="separate"/>
+          </w:r>
+          <w:r>
+            <w:rPr>
+              <w:noProof/>
+            </w:rPr>
+            <w:t>14</w:t>
+          </w:r>
+          <w:r>
+            <w:fldChar w:fldCharType="end"/>
+          </w:r>
+          <w:r>
+            <w:tab/>
+          </w:r>
+          <w:r>
+            <w:rPr>
+              <w:highlight w:val="yellow"/>
+            </w:rPr>
+            <w:t>Example figure</w:t>
+          </w:r>
+        </w:p>
+      </w:sdtContent>
+    </w:sdt>
     <w:p>
       <w:pPr>
         <w:pStyle w:val="ListParagraph"/>
@@ -5972,72 +6812,143 @@
           <w:lang w:eastAsia="de-DE"/>
         </w:rPr>
       </w:pPr>
-      <w:r>
-        <w:rPr>
-          <w:noProof/>
-          <w:lang w:eastAsia="de-DE"/>
-        </w:rPr>
-        <w:drawing>
-          <wp:inline distT="0" distB="0" distL="0" distR="0" wp14:anchorId="483B4E71" wp14:editId="572455D5">
-            <wp:extent cx="5063556" cy="3947970"/>
-            <wp:effectExtent l="19050" t="19050" r="22860" b="14605"/>
-            <wp:docPr id="70" name="Picture 70"/>
-            <wp:cNvGraphicFramePr>
-              <a:graphicFrameLocks xmlns:a="http://schemas.openxmlformats.org/drawingml/2006/main" noChangeAspect="1"/>
-            </wp:cNvGraphicFramePr>
-            <a:graphic xmlns:a="http://schemas.openxmlformats.org/drawingml/2006/main">
-              <a:graphicData uri="http://schemas.openxmlformats.org/drawingml/2006/picture">
-                <pic:pic xmlns:pic="http://schemas.openxmlformats.org/drawingml/2006/picture">
-                  <pic:nvPicPr>
-                    <pic:cNvPr id="70" name="Picture 70"/>
-                    <pic:cNvPicPr>
-                      <a:picLocks noChangeAspect="1" noChangeArrowheads="1"/>
-                    </pic:cNvPicPr>
-                  </pic:nvPicPr>
-                  <pic:blipFill>
-                    <a:blip r:embed="rId40" cstate="print">
-                      <a:extLst>
-                        <a:ext uri="{28A0092B-C50C-407E-A947-70E740481C1C}">
-                          <a14:useLocalDpi xmlns:a14="http://schemas.microsoft.com/office/drawing/2010/main" val="0"/>
-                        </a:ext>
-                      </a:extLst>
-                    </a:blip>
-                    <a:stretch>
-                      <a:fillRect/>
-                    </a:stretch>
-                  </pic:blipFill>
-                  <pic:spPr bwMode="auto">
-                    <a:xfrm>
-                      <a:off x="0" y="0"/>
-                      <a:ext cx="5104256" cy="3979703"/>
-                    </a:xfrm>
-                    <a:prstGeom prst="rect">
-                      <a:avLst/>
-                    </a:prstGeom>
-                    <a:noFill/>
-                    <a:ln>
-                      <a:solidFill>
-                        <a:schemeClr val="tx1"/>
-                      </a:solidFill>
-                    </a:ln>
-                  </pic:spPr>
-                </pic:pic>
-              </a:graphicData>
-            </a:graphic>
-          </wp:inline>
-        </w:drawing>
-      </w:r>
-    </w:p>
-    <w:p>
-      <w:pPr>
-        <w:pStyle w:val="ListParagraph"/>
-        <w:spacing w:before="160" w:after="160"/>
-        <w:ind w:left="1778"/>
-        <w:rPr>
-          <w:lang w:eastAsia="de-DE"/>
-        </w:rPr>
-      </w:pPr>
-    </w:p>
+    </w:p>
+    <w:sdt>
+      <w:sdtPr>
+        <w:alias w:val="mioTextBlock"/>
+        <w:tag w:val="d13d753d-6118-4688-b5c0-79b391ea647d"/>
+        <w:id w:val="394627408"/>
+        <w:placeholder>
+          <w:docPart w:val="DefaultPlaceholder_-1854013440"/>
+        </w:placeholder>
+        <w15:appearance w15:val="hidden"/>
+      </w:sdtPr>
+      <w:sdtEndPr>
+        <w:rPr>
+          <w:b/>
+        </w:rPr>
+      </w:sdtEndPr>
+      <w:sdtContent>
+        <w:tbl>
+          <w:tblPr>
+            <w:tblStyle w:val="InfineonPicture"/>
+            <w:tblW w:w="5000" w:type="pct"/>
+            <w:tblCellMar>
+              <w:left w:w="0" w:type="dxa"/>
+              <w:right w:w="0" w:type="dxa"/>
+            </w:tblCellMar>
+            <w:tblLook w:val="05E0" w:firstRow="1" w:lastRow="1" w:firstColumn="1" w:lastColumn="1" w:noHBand="0" w:noVBand="1"/>
+          </w:tblPr>
+          <w:tblGrid>
+            <w:gridCol w:w="10196"/>
+          </w:tblGrid>
+          <w:tr>
+            <w:tc>
+              <w:tcPr>
+                <w:tcW w:w="5000" w:type="pct"/>
+              </w:tcPr>
+              <w:p>
+                <w:pPr>
+                  <w:pStyle w:val="TableCell-c"/>
+                </w:pPr>
+                <w:r>
+                  <w:rPr>
+                    <w:noProof/>
+                  </w:rPr>
+                  <w:drawing>
+                    <wp:inline distT="0" distB="0" distL="0" distR="0" wp14:anchorId="7A7B49B8" wp14:editId="66C8248F">
+                      <wp:extent cx="5063556" cy="3947970"/>
+                      <wp:effectExtent l="19050" t="19050" r="22860" b="14605"/>
+                      <wp:docPr id="70" name="Picture 70"/>
+                      <wp:cNvGraphicFramePr>
+                        <a:graphicFrameLocks xmlns:a="http://schemas.openxmlformats.org/drawingml/2006/main" noChangeAspect="1"/>
+                      </wp:cNvGraphicFramePr>
+                      <a:graphic xmlns:a="http://schemas.openxmlformats.org/drawingml/2006/main">
+                        <a:graphicData uri="http://schemas.openxmlformats.org/drawingml/2006/picture">
+                          <pic:pic xmlns:pic="http://schemas.openxmlformats.org/drawingml/2006/picture">
+                            <pic:nvPicPr>
+                              <pic:cNvPr id="70" name="Picture 70"/>
+                              <pic:cNvPicPr>
+                                <a:picLocks noChangeAspect="1" noChangeArrowheads="1"/>
+                              </pic:cNvPicPr>
+                            </pic:nvPicPr>
+                            <pic:blipFill>
+                              <a:blip r:embed="rId40" cstate="print">
+                                <a:extLst>
+                                  <a:ext uri="{28A0092B-C50C-407E-A947-70E740481C1C}">
+                                    <a14:useLocalDpi xmlns:a14="http://schemas.microsoft.com/office/drawing/2010/main" val="0"/>
+                                  </a:ext>
+                                </a:extLst>
+                              </a:blip>
+                              <a:stretch>
+                                <a:fillRect/>
+                              </a:stretch>
+                            </pic:blipFill>
+                            <pic:spPr bwMode="auto">
+                              <a:xfrm>
+                                <a:off x="0" y="0"/>
+                                <a:ext cx="5104256" cy="3979703"/>
+                              </a:xfrm>
+                              <a:prstGeom prst="rect">
+                                <a:avLst/>
+                              </a:prstGeom>
+                              <a:noFill/>
+                              <a:ln>
+                                <a:solidFill>
+                                  <a:schemeClr val="tx1"/>
+                                </a:solidFill>
+                              </a:ln>
+                            </pic:spPr>
+                          </pic:pic>
+                        </a:graphicData>
+                      </a:graphic>
+                    </wp:inline>
+                  </w:drawing>
+                </w:r>
+              </w:p>
+            </w:tc>
+          </w:tr>
+        </w:tbl>
+        <w:p>
+          <w:pPr>
+            <w:pStyle w:val="Figuretitlenew"/>
+            <w:rPr>
+              <w:lang w:eastAsia="de-DE"/>
+            </w:rPr>
+          </w:pPr>
+          <w:r>
+            <w:t xml:space="preserve">Figure </w:t>
+          </w:r>
+          <w:r>
+            <w:fldChar w:fldCharType="begin"/>
+          </w:r>
+          <w:r>
+            <w:instrText xml:space="preserve"> SEQ Figure \* ARABIC </w:instrText>
+          </w:r>
+          <w:r>
+            <w:fldChar w:fldCharType="separate"/>
+          </w:r>
+          <w:r>
+            <w:rPr>
+              <w:noProof/>
+            </w:rPr>
+            <w:t>15</w:t>
+          </w:r>
+          <w:r>
+            <w:fldChar w:fldCharType="end"/>
+          </w:r>
+          <w:r>
+            <w:tab/>
+          </w:r>
+          <w:r>
+            <w:rPr>
+              <w:highlight w:val="yellow"/>
+            </w:rPr>
+            <w:t>Example figure</w:t>
+          </w:r>
+        </w:p>
+      </w:sdtContent>
+    </w:sdt>
     <w:p>
       <w:pPr>
         <w:pStyle w:val="ListParagraph"/>
@@ -6282,70 +7193,143 @@
           <w:lang w:eastAsia="de-DE"/>
         </w:rPr>
       </w:pPr>
-      <w:r>
-        <w:rPr>
-          <w:noProof/>
-          <w:lang w:eastAsia="de-DE"/>
-        </w:rPr>
-        <w:drawing>
-          <wp:inline distT="0" distB="0" distL="0" distR="0" wp14:anchorId="0669D229" wp14:editId="76FB76A9">
-            <wp:extent cx="2192625" cy="2682406"/>
-            <wp:effectExtent l="19050" t="19050" r="17780" b="22860"/>
-            <wp:docPr id="76" name="Picture 76"/>
-            <wp:cNvGraphicFramePr>
-              <a:graphicFrameLocks xmlns:a="http://schemas.openxmlformats.org/drawingml/2006/main" noChangeAspect="1"/>
-            </wp:cNvGraphicFramePr>
-            <a:graphic xmlns:a="http://schemas.openxmlformats.org/drawingml/2006/main">
-              <a:graphicData uri="http://schemas.openxmlformats.org/drawingml/2006/picture">
-                <pic:pic xmlns:pic="http://schemas.openxmlformats.org/drawingml/2006/picture">
-                  <pic:nvPicPr>
-                    <pic:cNvPr id="76" name="Picture 76"/>
-                    <pic:cNvPicPr>
-                      <a:picLocks noChangeAspect="1" noChangeArrowheads="1"/>
-                    </pic:cNvPicPr>
-                  </pic:nvPicPr>
-                  <pic:blipFill>
-                    <a:blip r:embed="rId41">
-                      <a:extLst>
-                        <a:ext uri="{28A0092B-C50C-407E-A947-70E740481C1C}">
-                          <a14:useLocalDpi xmlns:a14="http://schemas.microsoft.com/office/drawing/2010/main" val="0"/>
-                        </a:ext>
-                      </a:extLst>
-                    </a:blip>
-                    <a:stretch>
-                      <a:fillRect/>
-                    </a:stretch>
-                  </pic:blipFill>
-                  <pic:spPr bwMode="auto">
-                    <a:xfrm>
-                      <a:off x="0" y="0"/>
-                      <a:ext cx="2200994" cy="2692645"/>
-                    </a:xfrm>
-                    <a:prstGeom prst="rect">
-                      <a:avLst/>
-                    </a:prstGeom>
-                    <a:noFill/>
-                    <a:ln>
-                      <a:solidFill>
-                        <a:schemeClr val="tx1"/>
-                      </a:solidFill>
-                    </a:ln>
-                  </pic:spPr>
-                </pic:pic>
-              </a:graphicData>
-            </a:graphic>
-          </wp:inline>
-        </w:drawing>
-      </w:r>
-    </w:p>
-    <w:p>
-      <w:pPr>
-        <w:spacing w:before="160" w:after="160"/>
-        <w:rPr>
-          <w:lang w:eastAsia="de-DE"/>
-        </w:rPr>
-      </w:pPr>
-    </w:p>
+    </w:p>
+    <w:sdt>
+      <w:sdtPr>
+        <w:alias w:val="mioTextBlock"/>
+        <w:tag w:val="9ce240c0-32a6-42e8-8701-c7b93c5f733b"/>
+        <w:id w:val="-995410420"/>
+        <w:placeholder>
+          <w:docPart w:val="DefaultPlaceholder_-1854013440"/>
+        </w:placeholder>
+        <w15:appearance w15:val="hidden"/>
+      </w:sdtPr>
+      <w:sdtEndPr>
+        <w:rPr>
+          <w:b/>
+        </w:rPr>
+      </w:sdtEndPr>
+      <w:sdtContent>
+        <w:tbl>
+          <w:tblPr>
+            <w:tblStyle w:val="InfineonPicture"/>
+            <w:tblW w:w="5000" w:type="pct"/>
+            <w:tblCellMar>
+              <w:left w:w="0" w:type="dxa"/>
+              <w:right w:w="0" w:type="dxa"/>
+            </w:tblCellMar>
+            <w:tblLook w:val="05E0" w:firstRow="1" w:lastRow="1" w:firstColumn="1" w:lastColumn="1" w:noHBand="0" w:noVBand="1"/>
+          </w:tblPr>
+          <w:tblGrid>
+            <w:gridCol w:w="10196"/>
+          </w:tblGrid>
+          <w:tr>
+            <w:tc>
+              <w:tcPr>
+                <w:tcW w:w="5000" w:type="pct"/>
+              </w:tcPr>
+              <w:p>
+                <w:pPr>
+                  <w:pStyle w:val="TableCell-c"/>
+                </w:pPr>
+                <w:r>
+                  <w:rPr>
+                    <w:noProof/>
+                  </w:rPr>
+                  <w:drawing>
+                    <wp:inline distT="0" distB="0" distL="0" distR="0" wp14:anchorId="17925F01" wp14:editId="655365E7">
+                      <wp:extent cx="2192625" cy="2682406"/>
+                      <wp:effectExtent l="19050" t="19050" r="17780" b="22860"/>
+                      <wp:docPr id="76" name="Picture 76"/>
+                      <wp:cNvGraphicFramePr>
+                        <a:graphicFrameLocks xmlns:a="http://schemas.openxmlformats.org/drawingml/2006/main" noChangeAspect="1"/>
+                      </wp:cNvGraphicFramePr>
+                      <a:graphic xmlns:a="http://schemas.openxmlformats.org/drawingml/2006/main">
+                        <a:graphicData uri="http://schemas.openxmlformats.org/drawingml/2006/picture">
+                          <pic:pic xmlns:pic="http://schemas.openxmlformats.org/drawingml/2006/picture">
+                            <pic:nvPicPr>
+                              <pic:cNvPr id="76" name="Picture 76"/>
+                              <pic:cNvPicPr>
+                                <a:picLocks noChangeAspect="1" noChangeArrowheads="1"/>
+                              </pic:cNvPicPr>
+                            </pic:nvPicPr>
+                            <pic:blipFill>
+                              <a:blip r:embed="rId41">
+                                <a:extLst>
+                                  <a:ext uri="{28A0092B-C50C-407E-A947-70E740481C1C}">
+                                    <a14:useLocalDpi xmlns:a14="http://schemas.microsoft.com/office/drawing/2010/main" val="0"/>
+                                  </a:ext>
+                                </a:extLst>
+                              </a:blip>
+                              <a:stretch>
+                                <a:fillRect/>
+                              </a:stretch>
+                            </pic:blipFill>
+                            <pic:spPr bwMode="auto">
+                              <a:xfrm>
+                                <a:off x="0" y="0"/>
+                                <a:ext cx="2200994" cy="2692645"/>
+                              </a:xfrm>
+                              <a:prstGeom prst="rect">
+                                <a:avLst/>
+                              </a:prstGeom>
+                              <a:noFill/>
+                              <a:ln>
+                                <a:solidFill>
+                                  <a:schemeClr val="tx1"/>
+                                </a:solidFill>
+                              </a:ln>
+                            </pic:spPr>
+                          </pic:pic>
+                        </a:graphicData>
+                      </a:graphic>
+                    </wp:inline>
+                  </w:drawing>
+                </w:r>
+              </w:p>
+            </w:tc>
+          </w:tr>
+        </w:tbl>
+        <w:p>
+          <w:pPr>
+            <w:pStyle w:val="Figuretitlenew"/>
+            <w:rPr>
+              <w:lang w:eastAsia="de-DE"/>
+            </w:rPr>
+          </w:pPr>
+          <w:r>
+            <w:t xml:space="preserve">Figure </w:t>
+          </w:r>
+          <w:r>
+            <w:fldChar w:fldCharType="begin"/>
+          </w:r>
+          <w:r>
+            <w:instrText xml:space="preserve"> SEQ Figure \* ARABIC </w:instrText>
+          </w:r>
+          <w:r>
+            <w:fldChar w:fldCharType="separate"/>
+          </w:r>
+          <w:r>
+            <w:rPr>
+              <w:noProof/>
+            </w:rPr>
+            <w:t>16</w:t>
+          </w:r>
+          <w:r>
+            <w:fldChar w:fldCharType="end"/>
+          </w:r>
+          <w:r>
+            <w:tab/>
+          </w:r>
+          <w:r>
+            <w:rPr>
+              <w:highlight w:val="yellow"/>
+            </w:rPr>
+            <w:t>Example figure</w:t>
+          </w:r>
+        </w:p>
+      </w:sdtContent>
+    </w:sdt>
     <w:p>
       <w:pPr>
         <w:pStyle w:val="ListParagraph"/>
@@ -6399,54 +7383,135 @@
           <w:lang w:eastAsia="de-DE"/>
         </w:rPr>
       </w:pPr>
-      <w:r>
-        <w:rPr>
-          <w:noProof/>
-          <w:lang w:eastAsia="de-DE"/>
-        </w:rPr>
-        <w:drawing>
-          <wp:inline distT="0" distB="0" distL="0" distR="0" wp14:anchorId="79ED9FF5" wp14:editId="48E675B4">
-            <wp:extent cx="5153411" cy="3394058"/>
-            <wp:effectExtent l="0" t="0" r="0" b="0"/>
-            <wp:docPr id="2007675758" name="Picture 17"/>
-            <wp:cNvGraphicFramePr>
-              <a:graphicFrameLocks xmlns:a="http://schemas.openxmlformats.org/drawingml/2006/main" noChangeAspect="1"/>
-            </wp:cNvGraphicFramePr>
-            <a:graphic xmlns:a="http://schemas.openxmlformats.org/drawingml/2006/main">
-              <a:graphicData uri="http://schemas.openxmlformats.org/drawingml/2006/picture">
-                <pic:pic xmlns:pic="http://schemas.openxmlformats.org/drawingml/2006/picture">
-                  <pic:nvPicPr>
-                    <pic:cNvPr id="799586420" name="Picture 17" descr="A screenshot of a computer&#10;&#10;Description automatically generated"/>
-                    <pic:cNvPicPr/>
-                  </pic:nvPicPr>
-                  <pic:blipFill>
-                    <a:blip r:embed="rId42" cstate="print">
-                      <a:extLst>
-                        <a:ext uri="{28A0092B-C50C-407E-A947-70E740481C1C}">
-                          <a14:useLocalDpi xmlns:a14="http://schemas.microsoft.com/office/drawing/2010/main" val="0"/>
-                        </a:ext>
-                      </a:extLst>
-                    </a:blip>
-                    <a:stretch>
-                      <a:fillRect/>
-                    </a:stretch>
-                  </pic:blipFill>
-                  <pic:spPr>
-                    <a:xfrm>
-                      <a:off x="0" y="0"/>
-                      <a:ext cx="5185451" cy="3415160"/>
-                    </a:xfrm>
-                    <a:prstGeom prst="rect">
-                      <a:avLst/>
-                    </a:prstGeom>
-                  </pic:spPr>
-                </pic:pic>
-              </a:graphicData>
-            </a:graphic>
-          </wp:inline>
-        </w:drawing>
-      </w:r>
-    </w:p>
+    </w:p>
+    <w:sdt>
+      <w:sdtPr>
+        <w:alias w:val="mioTextBlock"/>
+        <w:tag w:val="778c411b-7a80-4410-af32-530e2d973ad6"/>
+        <w:id w:val="17204266"/>
+        <w:placeholder>
+          <w:docPart w:val="DefaultPlaceholder_-1854013440"/>
+        </w:placeholder>
+        <w15:appearance w15:val="hidden"/>
+      </w:sdtPr>
+      <w:sdtEndPr>
+        <w:rPr>
+          <w:b/>
+        </w:rPr>
+      </w:sdtEndPr>
+      <w:sdtContent>
+        <w:tbl>
+          <w:tblPr>
+            <w:tblStyle w:val="InfineonPicture"/>
+            <w:tblW w:w="5000" w:type="pct"/>
+            <w:tblCellMar>
+              <w:left w:w="0" w:type="dxa"/>
+              <w:right w:w="0" w:type="dxa"/>
+            </w:tblCellMar>
+            <w:tblLook w:val="05E0" w:firstRow="1" w:lastRow="1" w:firstColumn="1" w:lastColumn="1" w:noHBand="0" w:noVBand="1"/>
+          </w:tblPr>
+          <w:tblGrid>
+            <w:gridCol w:w="10196"/>
+          </w:tblGrid>
+          <w:tr>
+            <w:tc>
+              <w:tcPr>
+                <w:tcW w:w="5000" w:type="pct"/>
+              </w:tcPr>
+              <w:p>
+                <w:pPr>
+                  <w:pStyle w:val="TableCell-c"/>
+                </w:pPr>
+                <w:r>
+                  <w:rPr>
+                    <w:noProof/>
+                  </w:rPr>
+                  <w:drawing>
+                    <wp:inline distT="0" distB="0" distL="0" distR="0" wp14:anchorId="2E171749" wp14:editId="46E51FBD">
+                      <wp:extent cx="5153411" cy="3394058"/>
+                      <wp:effectExtent l="0" t="0" r="0" b="0"/>
+                      <wp:docPr id="2007675758" name="Picture 17"/>
+                      <wp:cNvGraphicFramePr>
+                        <a:graphicFrameLocks xmlns:a="http://schemas.openxmlformats.org/drawingml/2006/main" noChangeAspect="1"/>
+                      </wp:cNvGraphicFramePr>
+                      <a:graphic xmlns:a="http://schemas.openxmlformats.org/drawingml/2006/main">
+                        <a:graphicData uri="http://schemas.openxmlformats.org/drawingml/2006/picture">
+                          <pic:pic xmlns:pic="http://schemas.openxmlformats.org/drawingml/2006/picture">
+                            <pic:nvPicPr>
+                              <pic:cNvPr id="799586420" name="Picture 17" descr="A screenshot of a computer&#10;&#10;Description automatically generated"/>
+                              <pic:cNvPicPr/>
+                            </pic:nvPicPr>
+                            <pic:blipFill>
+                              <a:blip r:embed="rId42" cstate="print">
+                                <a:extLst>
+                                  <a:ext uri="{28A0092B-C50C-407E-A947-70E740481C1C}">
+                                    <a14:useLocalDpi xmlns:a14="http://schemas.microsoft.com/office/drawing/2010/main" val="0"/>
+                                  </a:ext>
+                                </a:extLst>
+                              </a:blip>
+                              <a:stretch>
+                                <a:fillRect/>
+                              </a:stretch>
+                            </pic:blipFill>
+                            <pic:spPr>
+                              <a:xfrm>
+                                <a:off x="0" y="0"/>
+                                <a:ext cx="5185451" cy="3415160"/>
+                              </a:xfrm>
+                              <a:prstGeom prst="rect">
+                                <a:avLst/>
+                              </a:prstGeom>
+                            </pic:spPr>
+                          </pic:pic>
+                        </a:graphicData>
+                      </a:graphic>
+                    </wp:inline>
+                  </w:drawing>
+                </w:r>
+              </w:p>
+            </w:tc>
+          </w:tr>
+        </w:tbl>
+        <w:p>
+          <w:pPr>
+            <w:pStyle w:val="Figuretitlenew"/>
+            <w:rPr>
+              <w:lang w:eastAsia="de-DE"/>
+            </w:rPr>
+          </w:pPr>
+          <w:r>
+            <w:t xml:space="preserve">Figure </w:t>
+          </w:r>
+          <w:r>
+            <w:fldChar w:fldCharType="begin"/>
+          </w:r>
+          <w:r>
+            <w:instrText xml:space="preserve"> SEQ Figure \* ARABIC </w:instrText>
+          </w:r>
+          <w:r>
+            <w:fldChar w:fldCharType="separate"/>
+          </w:r>
+          <w:r>
+            <w:rPr>
+              <w:noProof/>
+            </w:rPr>
+            <w:t>17</w:t>
+          </w:r>
+          <w:r>
+            <w:fldChar w:fldCharType="end"/>
+          </w:r>
+          <w:r>
+            <w:tab/>
+          </w:r>
+          <w:r>
+            <w:rPr>
+              <w:highlight w:val="yellow"/>
+            </w:rPr>
+            <w:t>Example figure</w:t>
+          </w:r>
+        </w:p>
+      </w:sdtContent>
+    </w:sdt>
     <w:p>
       <w:pPr>
         <w:pStyle w:val="ListParagraph"/>
@@ -6511,60 +7576,139 @@
         <w:ind w:left="709"/>
         <w:jc w:val="center"/>
       </w:pPr>
-      <w:r>
-        <w:rPr>
-          <w:noProof/>
-        </w:rPr>
-        <w:lastRenderedPageBreak/>
-        <w:drawing>
-          <wp:inline distT="0" distB="0" distL="0" distR="0" wp14:anchorId="25D07132" wp14:editId="0410B644">
-            <wp:extent cx="3261869" cy="3354926"/>
-            <wp:effectExtent l="0" t="0" r="0" b="0"/>
-            <wp:docPr id="2007675773" name="Picture 2007675773"/>
-            <wp:cNvGraphicFramePr>
-              <a:graphicFrameLocks xmlns:a="http://schemas.openxmlformats.org/drawingml/2006/main" noChangeAspect="1"/>
-            </wp:cNvGraphicFramePr>
-            <a:graphic xmlns:a="http://schemas.openxmlformats.org/drawingml/2006/main">
-              <a:graphicData uri="http://schemas.openxmlformats.org/drawingml/2006/picture">
-                <pic:pic xmlns:pic="http://schemas.openxmlformats.org/drawingml/2006/picture">
-                  <pic:nvPicPr>
-                    <pic:cNvPr id="0" name="Picture 67"/>
-                    <pic:cNvPicPr>
-                      <a:picLocks noChangeAspect="1" noChangeArrowheads="1"/>
-                    </pic:cNvPicPr>
-                  </pic:nvPicPr>
-                  <pic:blipFill>
-                    <a:blip r:embed="rId43">
-                      <a:extLst>
-                        <a:ext uri="{28A0092B-C50C-407E-A947-70E740481C1C}">
-                          <a14:useLocalDpi xmlns:a14="http://schemas.microsoft.com/office/drawing/2010/main" val="0"/>
-                        </a:ext>
-                      </a:extLst>
-                    </a:blip>
-                    <a:stretch>
-                      <a:fillRect/>
-                    </a:stretch>
-                  </pic:blipFill>
-                  <pic:spPr bwMode="auto">
-                    <a:xfrm>
-                      <a:off x="0" y="0"/>
-                      <a:ext cx="3261869" cy="3354926"/>
-                    </a:xfrm>
-                    <a:prstGeom prst="rect">
-                      <a:avLst/>
-                    </a:prstGeom>
-                    <a:noFill/>
-                    <a:ln>
-                      <a:noFill/>
-                    </a:ln>
-                  </pic:spPr>
-                </pic:pic>
-              </a:graphicData>
-            </a:graphic>
-          </wp:inline>
-        </w:drawing>
-      </w:r>
-    </w:p>
+    </w:p>
+    <w:sdt>
+      <w:sdtPr>
+        <w:alias w:val="mioTextBlock"/>
+        <w:tag w:val="1ecea41e-16b5-4b48-a6d9-f8c3188f89a5"/>
+        <w:id w:val="-503434261"/>
+        <w:placeholder>
+          <w:docPart w:val="DefaultPlaceholder_-1854013440"/>
+        </w:placeholder>
+        <w15:appearance w15:val="hidden"/>
+      </w:sdtPr>
+      <w:sdtEndPr>
+        <w:rPr>
+          <w:b/>
+          <w:lang w:eastAsia="en-US"/>
+        </w:rPr>
+      </w:sdtEndPr>
+      <w:sdtContent>
+        <w:tbl>
+          <w:tblPr>
+            <w:tblStyle w:val="InfineonPicture"/>
+            <w:tblW w:w="5000" w:type="pct"/>
+            <w:tblCellMar>
+              <w:left w:w="0" w:type="dxa"/>
+              <w:right w:w="0" w:type="dxa"/>
+            </w:tblCellMar>
+            <w:tblLook w:val="05E0" w:firstRow="1" w:lastRow="1" w:firstColumn="1" w:lastColumn="1" w:noHBand="0" w:noVBand="1"/>
+          </w:tblPr>
+          <w:tblGrid>
+            <w:gridCol w:w="10196"/>
+          </w:tblGrid>
+          <w:tr>
+            <w:tc>
+              <w:tcPr>
+                <w:tcW w:w="5000" w:type="pct"/>
+              </w:tcPr>
+              <w:p>
+                <w:pPr>
+                  <w:pStyle w:val="TableCell-c"/>
+                </w:pPr>
+                <w:r>
+                  <w:rPr>
+                    <w:noProof/>
+                  </w:rPr>
+                  <w:drawing>
+                    <wp:inline distT="0" distB="0" distL="0" distR="0" wp14:anchorId="637AFBC2" wp14:editId="00192031">
+                      <wp:extent cx="3261869" cy="3354926"/>
+                      <wp:effectExtent l="0" t="0" r="0" b="0"/>
+                      <wp:docPr id="2007675773" name="Picture 2007675773"/>
+                      <wp:cNvGraphicFramePr>
+                        <a:graphicFrameLocks xmlns:a="http://schemas.openxmlformats.org/drawingml/2006/main" noChangeAspect="1"/>
+                      </wp:cNvGraphicFramePr>
+                      <a:graphic xmlns:a="http://schemas.openxmlformats.org/drawingml/2006/main">
+                        <a:graphicData uri="http://schemas.openxmlformats.org/drawingml/2006/picture">
+                          <pic:pic xmlns:pic="http://schemas.openxmlformats.org/drawingml/2006/picture">
+                            <pic:nvPicPr>
+                              <pic:cNvPr id="0" name="Picture 67"/>
+                              <pic:cNvPicPr>
+                                <a:picLocks noChangeAspect="1" noChangeArrowheads="1"/>
+                              </pic:cNvPicPr>
+                            </pic:nvPicPr>
+                            <pic:blipFill>
+                              <a:blip r:embed="rId43">
+                                <a:extLst>
+                                  <a:ext uri="{28A0092B-C50C-407E-A947-70E740481C1C}">
+                                    <a14:useLocalDpi xmlns:a14="http://schemas.microsoft.com/office/drawing/2010/main" val="0"/>
+                                  </a:ext>
+                                </a:extLst>
+                              </a:blip>
+                              <a:stretch>
+                                <a:fillRect/>
+                              </a:stretch>
+                            </pic:blipFill>
+                            <pic:spPr bwMode="auto">
+                              <a:xfrm>
+                                <a:off x="0" y="0"/>
+                                <a:ext cx="3261869" cy="3354926"/>
+                              </a:xfrm>
+                              <a:prstGeom prst="rect">
+                                <a:avLst/>
+                              </a:prstGeom>
+                              <a:noFill/>
+                              <a:ln>
+                                <a:noFill/>
+                              </a:ln>
+                            </pic:spPr>
+                          </pic:pic>
+                        </a:graphicData>
+                      </a:graphic>
+                    </wp:inline>
+                  </w:drawing>
+                </w:r>
+              </w:p>
+            </w:tc>
+          </w:tr>
+        </w:tbl>
+        <w:p>
+          <w:pPr>
+            <w:pStyle w:val="Figuretitlenew"/>
+          </w:pPr>
+          <w:r>
+            <w:t xml:space="preserve">Figure </w:t>
+          </w:r>
+          <w:r>
+            <w:fldChar w:fldCharType="begin"/>
+          </w:r>
+          <w:r>
+            <w:instrText xml:space="preserve"> SEQ Figure \* ARABIC </w:instrText>
+          </w:r>
+          <w:r>
+            <w:fldChar w:fldCharType="separate"/>
+          </w:r>
+          <w:r>
+            <w:rPr>
+              <w:noProof/>
+            </w:rPr>
+            <w:t>18</w:t>
+          </w:r>
+          <w:r>
+            <w:fldChar w:fldCharType="end"/>
+          </w:r>
+          <w:r>
+            <w:tab/>
+          </w:r>
+          <w:r>
+            <w:rPr>
+              <w:highlight w:val="yellow"/>
+            </w:rPr>
+            <w:t>Example figure</w:t>
+          </w:r>
+        </w:p>
+      </w:sdtContent>
+    </w:sdt>
     <w:p>
       <w:pPr>
         <w:pStyle w:val="ListParagraph"/>
@@ -6572,7 +7716,12 @@
         <w:ind w:left="1778"/>
       </w:pPr>
       <w:r>
-        <w:t>Each pin can be uniquely identified by giving them a name of your choice. These names are known as aliases and can be used in the code to refer to the pins instead of using the explicit Pin numbers.</w:t>
+        <w:t>Each pin can be uniquely i</w:t>
+      </w:r>
+      <w:bookmarkStart w:id="28" w:name="_GoBack"/>
+      <w:bookmarkEnd w:id="28"/>
+      <w:r>
+        <w:t>dentified by giving them a name of your choice. These names are known as aliases and can be used in the code to refer to the pins instead of using the explicit Pin numbers.</w:t>
       </w:r>
     </w:p>
     <w:p>
@@ -6717,7 +7866,6 @@
         <w:rPr>
           <w:lang w:eastAsia="de-DE"/>
         </w:rPr>
-        <w:lastRenderedPageBreak/>
         <w:t xml:space="preserve">For example, </w:t>
       </w:r>
       <w:r>
@@ -6939,6 +8087,7 @@
           <w:noProof/>
           <w:lang w:eastAsia="de-DE"/>
         </w:rPr>
+        <w:lastRenderedPageBreak/>
         <w:drawing>
           <wp:inline distT="0" distB="0" distL="0" distR="0" wp14:anchorId="07620DAD" wp14:editId="57B354D4">
             <wp:extent cx="4351942" cy="3532753"/>
@@ -7201,6 +8350,7 @@
         <w:rPr>
           <w:noProof/>
         </w:rPr>
+        <w:lastRenderedPageBreak/>
         <w:drawing>
           <wp:inline distT="0" distB="0" distL="0" distR="0" wp14:anchorId="67FD060E" wp14:editId="70DE2651">
             <wp:extent cx="2587244" cy="2446804"/>
@@ -7352,7 +8502,6 @@
         <w:rPr>
           <w:lang w:eastAsia="de-DE"/>
         </w:rPr>
-        <w:lastRenderedPageBreak/>
         <w:t xml:space="preserve">In the project explorer you can see two folders named </w:t>
       </w:r>
       <w:r>
@@ -7874,7 +9023,6 @@
           <w:noProof/>
           <w:lang w:eastAsia="de-DE"/>
         </w:rPr>
-        <w:lastRenderedPageBreak/>
         <w:drawing>
           <wp:inline distT="0" distB="0" distL="0" distR="0" wp14:anchorId="2E64A76D" wp14:editId="6985997E">
             <wp:extent cx="4158336" cy="2049138"/>
@@ -8608,6 +9756,7 @@
         <w:rPr>
           <w:noProof/>
         </w:rPr>
+        <w:lastRenderedPageBreak/>
         <w:drawing>
           <wp:inline distT="0" distB="0" distL="0" distR="0" wp14:anchorId="41072C33" wp14:editId="4B377319">
             <wp:extent cx="5419871" cy="2652582"/>
@@ -9593,6 +10742,7 @@
         <w:rPr>
           <w:lang w:eastAsia="de-DE"/>
         </w:rPr>
+        <w:lastRenderedPageBreak/>
         <w:t xml:space="preserve">We will utilize the Uart to get response from the user to control the </w:t>
       </w:r>
       <w:r>
@@ -11016,6 +12166,7 @@
           <w:sz w:val="18"/>
           <w:szCs w:val="18"/>
         </w:rPr>
+        <w:lastRenderedPageBreak/>
         <w:t xml:space="preserve">            /* Move cursor to previous line */</w:t>
       </w:r>
     </w:p>
@@ -11563,7 +12714,6 @@
           <w:color w:val="000000"/>
           <w:lang w:val="en-IN"/>
         </w:rPr>
-        <w:lastRenderedPageBreak/>
         <w:t>The below code creates and configures a Timer object. The timer ticks continuously and creates a periodic interrupt on every terminal count. The period is defined by the 'period' and 'compare_value' of the timer configuration structure 'led_blink_timer_cfg'. Without any changes this application is designed to produce an interrupt every 1 second.</w:t>
       </w:r>
     </w:p>
@@ -13387,7 +14537,6 @@
           <w:color w:val="000000"/>
           <w:lang w:val="en-IN"/>
         </w:rPr>
-        <w:lastRenderedPageBreak/>
         <w:t>Let’s</w:t>
       </w:r>
       <w:r>
@@ -14671,7 +15820,6 @@
         <w:rPr>
           <w:noProof/>
         </w:rPr>
-        <w:lastRenderedPageBreak/>
         <w:drawing>
           <wp:inline distT="0" distB="0" distL="0" distR="0" wp14:anchorId="5C0C3E55" wp14:editId="5CC033A5">
             <wp:extent cx="2517575" cy="3005833"/>
@@ -34572,7 +35720,7 @@
         <v:shape id="_x0000_s2052" type="#_x0000_t75" style="position:absolute;margin-left:-45.75pt;margin-top:62.5pt;width:602.45pt;height:287.2pt;z-index:-251642880;mso-position-horizontal-relative:text;mso-position-vertical-relative:text">
           <v:imagedata r:id="rId1" o:title=""/>
         </v:shape>
-        <o:OLEObject Type="Embed" ProgID="Visio.Drawing.15" ShapeID="_x0000_s2052" DrawAspect="Content" ObjectID="_1823347494" r:id="rId2"/>
+        <o:OLEObject Type="Embed" ProgID="Visio.Drawing.15" ShapeID="_x0000_s2052" DrawAspect="Content" ObjectID="_1823347881" r:id="rId2"/>
       </w:object>
     </w:r>
     <w:r>
@@ -35905,7 +37053,7 @@
         <v:shape id="_x0000_s2051" type="#_x0000_t75" style="position:absolute;margin-left:-45.75pt;margin-top:62.5pt;width:602.45pt;height:287.2pt;z-index:-251643904;mso-position-horizontal-relative:text;mso-position-vertical-relative:text">
           <v:imagedata r:id="rId1" o:title=""/>
         </v:shape>
-        <o:OLEObject Type="Embed" ProgID="Visio.Drawing.15" ShapeID="_x0000_s2051" DrawAspect="Content" ObjectID="_1823347495" r:id="rId2"/>
+        <o:OLEObject Type="Embed" ProgID="Visio.Drawing.15" ShapeID="_x0000_s2051" DrawAspect="Content" ObjectID="_1823347882" r:id="rId2"/>
       </w:object>
     </w:r>
     <w:r>
@@ -46743,7 +47891,7 @@
   </w:compat>
   <w:rsids>
     <w:rsidRoot w:val="00EC48F7"/>
-    <w:rsid w:val="00146734"/>
+    <w:rsid w:val="009B7381"/>
     <w:rsid w:val="00EC48F7"/>
   </w:rsids>
   <m:mathPr>
@@ -47682,6 +48830,96 @@
       <TimestampUtc>2023-08-07T12:57:01.087Z</TimestampUtc>
       <TextBlockMetadataId>bedb578b-42f2-45fc-b27e-18676a586330</TextBlockMetadataId>
     </TextBlockMetadata>
+    <TextBlockMetadata>
+      <ElementId>1a622969-9435-42df-b756-4af60deadd4b</ElementId>
+      <ContentTag>YzCqVxr4CkGOIjtz8kQsF1txdvNf0IhJnc8A53W8JnY=</ContentTag>
+      <TimestampUtc>2023-08-07T12:57:01.087Z</TimestampUtc>
+      <TextBlockMetadataId>e5ee1bf7-537b-46e7-8a4e-b9b5b3e3775a</TextBlockMetadataId>
+    </TextBlockMetadata>
+    <TextBlockMetadata>
+      <ElementId>1a622969-9435-42df-b756-4af60deadd4b</ElementId>
+      <ContentTag>YzCqVxr4CkGOIjtz8kQsF1txdvNf0IhJnc8A53W8JnY=</ContentTag>
+      <TimestampUtc>2023-08-07T12:57:01.087Z</TimestampUtc>
+      <TextBlockMetadataId>2d7494db-d234-41cb-beb0-3663d9595a42</TextBlockMetadataId>
+    </TextBlockMetadata>
+    <TextBlockMetadata>
+      <ElementId>1a622969-9435-42df-b756-4af60deadd4b</ElementId>
+      <ContentTag>YzCqVxr4CkGOIjtz8kQsF1txdvNf0IhJnc8A53W8JnY=</ContentTag>
+      <TimestampUtc>2023-08-07T12:57:01.087Z</TimestampUtc>
+      <TextBlockMetadataId>dc65463d-b88e-43ad-b59d-ffd33524f636</TextBlockMetadataId>
+    </TextBlockMetadata>
+    <TextBlockMetadata>
+      <ElementId>1a622969-9435-42df-b756-4af60deadd4b</ElementId>
+      <ContentTag>YzCqVxr4CkGOIjtz8kQsF1txdvNf0IhJnc8A53W8JnY=</ContentTag>
+      <TimestampUtc>2023-08-07T12:57:01.087Z</TimestampUtc>
+      <TextBlockMetadataId>f28395c9-4a56-45ab-aca0-3948237a9f19</TextBlockMetadataId>
+    </TextBlockMetadata>
+    <TextBlockMetadata>
+      <ElementId>1a622969-9435-42df-b756-4af60deadd4b</ElementId>
+      <ContentTag>YzCqVxr4CkGOIjtz8kQsF1txdvNf0IhJnc8A53W8JnY=</ContentTag>
+      <TimestampUtc>2023-08-07T12:57:01.087Z</TimestampUtc>
+      <TextBlockMetadataId>931b6e5a-073e-4c21-a5d5-828c13143fcd</TextBlockMetadataId>
+    </TextBlockMetadata>
+    <TextBlockMetadata>
+      <ElementId>1a622969-9435-42df-b756-4af60deadd4b</ElementId>
+      <ContentTag>YzCqVxr4CkGOIjtz8kQsF1txdvNf0IhJnc8A53W8JnY=</ContentTag>
+      <TimestampUtc>2023-08-07T12:57:01.087Z</TimestampUtc>
+      <TextBlockMetadataId>3a4b84c9-b48e-49d6-8bde-fdd57f58df1d</TextBlockMetadataId>
+    </TextBlockMetadata>
+    <TextBlockMetadata>
+      <ElementId>1a622969-9435-42df-b756-4af60deadd4b</ElementId>
+      <ContentTag>YzCqVxr4CkGOIjtz8kQsF1txdvNf0IhJnc8A53W8JnY=</ContentTag>
+      <TimestampUtc>2023-08-07T12:57:01.087Z</TimestampUtc>
+      <TextBlockMetadataId>4ff7ff77-b2c0-479e-92a1-38c86c3918f0</TextBlockMetadataId>
+    </TextBlockMetadata>
+    <TextBlockMetadata>
+      <ElementId>1a622969-9435-42df-b756-4af60deadd4b</ElementId>
+      <ContentTag>YzCqVxr4CkGOIjtz8kQsF1txdvNf0IhJnc8A53W8JnY=</ContentTag>
+      <TimestampUtc>2023-08-07T12:57:01.087Z</TimestampUtc>
+      <TextBlockMetadataId>5a217fb6-d41c-4253-aab3-e46a0a6cf4db</TextBlockMetadataId>
+    </TextBlockMetadata>
+    <TextBlockMetadata>
+      <ElementId>1a622969-9435-42df-b756-4af60deadd4b</ElementId>
+      <ContentTag>YzCqVxr4CkGOIjtz8kQsF1txdvNf0IhJnc8A53W8JnY=</ContentTag>
+      <TimestampUtc>2023-08-07T12:57:01.087Z</TimestampUtc>
+      <TextBlockMetadataId>cc270b98-ffd7-4663-9c8a-431904c746a2</TextBlockMetadataId>
+    </TextBlockMetadata>
+    <TextBlockMetadata>
+      <ElementId>1a622969-9435-42df-b756-4af60deadd4b</ElementId>
+      <ContentTag>YzCqVxr4CkGOIjtz8kQsF1txdvNf0IhJnc8A53W8JnY=</ContentTag>
+      <TimestampUtc>2023-08-07T12:57:01.087Z</TimestampUtc>
+      <TextBlockMetadataId>78df9b7c-8489-42ff-946e-b0e28db44603</TextBlockMetadataId>
+    </TextBlockMetadata>
+    <TextBlockMetadata>
+      <ElementId>1a622969-9435-42df-b756-4af60deadd4b</ElementId>
+      <ContentTag>YzCqVxr4CkGOIjtz8kQsF1txdvNf0IhJnc8A53W8JnY=</ContentTag>
+      <TimestampUtc>2023-08-07T12:57:01.087Z</TimestampUtc>
+      <TextBlockMetadataId>616af388-56c5-43ce-81c1-f830f0a0d34e</TextBlockMetadataId>
+    </TextBlockMetadata>
+    <TextBlockMetadata>
+      <ElementId>1a622969-9435-42df-b756-4af60deadd4b</ElementId>
+      <ContentTag>YzCqVxr4CkGOIjtz8kQsF1txdvNf0IhJnc8A53W8JnY=</ContentTag>
+      <TimestampUtc>2023-08-07T12:57:01.087Z</TimestampUtc>
+      <TextBlockMetadataId>d13d753d-6118-4688-b5c0-79b391ea647d</TextBlockMetadataId>
+    </TextBlockMetadata>
+    <TextBlockMetadata>
+      <ElementId>1a622969-9435-42df-b756-4af60deadd4b</ElementId>
+      <ContentTag>YzCqVxr4CkGOIjtz8kQsF1txdvNf0IhJnc8A53W8JnY=</ContentTag>
+      <TimestampUtc>2023-08-07T12:57:01.087Z</TimestampUtc>
+      <TextBlockMetadataId>9ce240c0-32a6-42e8-8701-c7b93c5f733b</TextBlockMetadataId>
+    </TextBlockMetadata>
+    <TextBlockMetadata>
+      <ElementId>1a622969-9435-42df-b756-4af60deadd4b</ElementId>
+      <ContentTag>YzCqVxr4CkGOIjtz8kQsF1txdvNf0IhJnc8A53W8JnY=</ContentTag>
+      <TimestampUtc>2023-08-07T12:57:01.087Z</TimestampUtc>
+      <TextBlockMetadataId>778c411b-7a80-4410-af32-530e2d973ad6</TextBlockMetadataId>
+    </TextBlockMetadata>
+    <TextBlockMetadata>
+      <ElementId>1a622969-9435-42df-b756-4af60deadd4b</ElementId>
+      <ContentTag>YzCqVxr4CkGOIjtz8kQsF1txdvNf0IhJnc8A53W8JnY=</ContentTag>
+      <TimestampUtc>2023-08-07T12:57:01.087Z</TimestampUtc>
+      <TextBlockMetadataId>1ecea41e-16b5-4b48-a6d9-f8c3188f89a5</TextBlockMetadataId>
+    </TextBlockMetadata>
   </TextBlockElements>
   <PlaceholderHiddenState>
     <HideablePlaceholderGuids/>
@@ -47729,7 +48967,7 @@
 </file>
 
 <file path=customXml/itemProps4.xml><?xml version="1.0" encoding="utf-8"?>
-<ds:datastoreItem xmlns:ds="http://schemas.openxmlformats.org/officeDocument/2006/customXml" ds:itemID="{C80D8924-D2A0-410B-B77E-39EB9AC1144E}">
+<ds:datastoreItem xmlns:ds="http://schemas.openxmlformats.org/officeDocument/2006/customXml" ds:itemID="{C84B57E9-7935-4894-89F5-BFC50D79F715}">
   <ds:schemaRefs>
     <ds:schemaRef ds:uri="http://www.made-in-office.com/empower/docs/template/v1"/>
   </ds:schemaRefs>
@@ -47737,7 +48975,7 @@
 </file>
 
 <file path=customXml/itemProps5.xml><?xml version="1.0" encoding="utf-8"?>
-<ds:datastoreItem xmlns:ds="http://schemas.openxmlformats.org/officeDocument/2006/customXml" ds:itemID="{265CD169-6292-471A-811E-6EAE9B4C3970}">
+<ds:datastoreItem xmlns:ds="http://schemas.openxmlformats.org/officeDocument/2006/customXml" ds:itemID="{1D949632-53CF-499B-B283-35525628EAD6}">
   <ds:schemaRefs>
     <ds:schemaRef ds:uri="http://schemas.openxmlformats.org/officeDocument/2006/bibliography"/>
   </ds:schemaRefs>

</xml_diff>

<commit_message>
Adding images, updating text in GPIO pin assignments
</commit_message>
<xml_diff>
--- a/.internal/Manual/Intro to PSOC Edge E84 - Part 2 (E2)/PSoC Edge E84 Introductory E2 Training Manual -WIP_10_21_2025.docx
+++ b/.internal/Manual/Intro to PSOC Edge E84 - Part 2 (E2)/PSoC Edge E84 Introductory E2 Training Manual -WIP_10_21_2025.docx
@@ -10,6 +10,8 @@
         </w:rPr>
       </w:pPr>
       <w:bookmarkStart w:id="0" w:name="_Toc385505508"/>
+      <w:bookmarkStart w:id="1" w:name="_GoBack"/>
+      <w:bookmarkEnd w:id="1"/>
       <w:r>
         <w:rPr>
           <w:b w:val="0"/>
@@ -54,12 +56,12 @@
           <w:b w:val="0"/>
         </w:rPr>
       </w:pPr>
-      <w:bookmarkStart w:id="1" w:name="_Toc430947631"/>
-      <w:bookmarkStart w:id="2" w:name="_Toc431284129"/>
-      <w:bookmarkStart w:id="3" w:name="_Toc431374932"/>
-      <w:bookmarkStart w:id="4" w:name="_Toc431889535"/>
-      <w:bookmarkStart w:id="5" w:name="_Toc431980074"/>
-      <w:bookmarkStart w:id="6" w:name="_Toc192780010"/>
+      <w:bookmarkStart w:id="2" w:name="_Toc430947631"/>
+      <w:bookmarkStart w:id="3" w:name="_Toc431284129"/>
+      <w:bookmarkStart w:id="4" w:name="_Toc431374932"/>
+      <w:bookmarkStart w:id="5" w:name="_Toc431889535"/>
+      <w:bookmarkStart w:id="6" w:name="_Toc431980074"/>
+      <w:bookmarkStart w:id="7" w:name="_Toc192780010"/>
       <w:r>
         <w:rPr>
           <w:b w:val="0"/>
@@ -67,12 +69,12 @@
         <w:t>About this document</w:t>
       </w:r>
       <w:bookmarkEnd w:id="0"/>
-      <w:bookmarkEnd w:id="1"/>
       <w:bookmarkEnd w:id="2"/>
       <w:bookmarkEnd w:id="3"/>
       <w:bookmarkEnd w:id="4"/>
       <w:bookmarkEnd w:id="5"/>
       <w:bookmarkEnd w:id="6"/>
+      <w:bookmarkEnd w:id="7"/>
     </w:p>
     <w:p>
       <w:pPr>
@@ -169,19 +171,19 @@
           <w:b w:val="0"/>
         </w:rPr>
       </w:pPr>
-      <w:bookmarkStart w:id="7" w:name="_Toc431889536"/>
-      <w:bookmarkStart w:id="8" w:name="_Toc431980075"/>
-      <w:bookmarkStart w:id="9" w:name="_Toc192780011"/>
-      <w:bookmarkStart w:id="10" w:name="_Toc430947633"/>
+      <w:bookmarkStart w:id="8" w:name="_Toc431889536"/>
+      <w:bookmarkStart w:id="9" w:name="_Toc431980075"/>
+      <w:bookmarkStart w:id="10" w:name="_Toc192780011"/>
+      <w:bookmarkStart w:id="11" w:name="_Toc430947633"/>
       <w:r>
         <w:rPr>
           <w:b w:val="0"/>
         </w:rPr>
         <w:t>Table of contents</w:t>
       </w:r>
-      <w:bookmarkEnd w:id="7"/>
       <w:bookmarkEnd w:id="8"/>
       <w:bookmarkEnd w:id="9"/>
+      <w:bookmarkEnd w:id="10"/>
     </w:p>
     <w:sdt>
       <w:sdtPr>
@@ -1997,13 +1999,13 @@
           <w:tab w:val="num" w:pos="1762"/>
         </w:tabs>
       </w:pPr>
-      <w:bookmarkStart w:id="11" w:name="_Toc192780012"/>
-      <w:bookmarkEnd w:id="10"/>
+      <w:bookmarkStart w:id="12" w:name="_Toc192780012"/>
+      <w:bookmarkEnd w:id="11"/>
       <w:r>
         <w:lastRenderedPageBreak/>
         <w:t>Introduction</w:t>
       </w:r>
-      <w:bookmarkEnd w:id="11"/>
+      <w:bookmarkEnd w:id="12"/>
     </w:p>
     <w:p>
       <w:pPr>
@@ -2109,13 +2111,13 @@
           <w:tab w:val="num" w:pos="1762"/>
         </w:tabs>
       </w:pPr>
-      <w:bookmarkStart w:id="12" w:name="_Required_development_tools"/>
-      <w:bookmarkStart w:id="13" w:name="_Toc192780013"/>
-      <w:bookmarkEnd w:id="12"/>
+      <w:bookmarkStart w:id="13" w:name="_Required_development_tools"/>
+      <w:bookmarkStart w:id="14" w:name="_Toc192780013"/>
+      <w:bookmarkEnd w:id="13"/>
       <w:r>
         <w:t>Required development tools</w:t>
       </w:r>
-      <w:bookmarkEnd w:id="13"/>
+      <w:bookmarkEnd w:id="14"/>
     </w:p>
     <w:p>
       <w:pPr>
@@ -2615,7 +2617,7 @@
           <w:lang w:val="en-IN" w:eastAsia="en-IN"/>
         </w:rPr>
       </w:pPr>
-      <w:bookmarkStart w:id="14" w:name="_mioConsistencyCheck20"/>
+      <w:bookmarkStart w:id="15" w:name="_mioConsistencyCheck20"/>
       <w:r>
         <w:rPr>
           <w:b/>
@@ -2661,7 +2663,7 @@
         <w:t>, BOOT SW pin is BOOT.1 (P17.6)</w:t>
       </w:r>
     </w:p>
-    <w:bookmarkEnd w:id="14"/>
+    <w:bookmarkEnd w:id="15"/>
     <w:p>
       <w:pPr>
         <w:numPr>
@@ -2750,16 +2752,16 @@
           <w:tab w:val="num" w:pos="1762"/>
         </w:tabs>
       </w:pPr>
-      <w:bookmarkStart w:id="15" w:name="_Toc192780014"/>
+      <w:bookmarkStart w:id="16" w:name="_Toc192780014"/>
       <w:r>
         <w:t>Prerequisites</w:t>
       </w:r>
-      <w:bookmarkEnd w:id="15"/>
+      <w:bookmarkEnd w:id="16"/>
       <w:r>
         <w:t xml:space="preserve"> </w:t>
       </w:r>
     </w:p>
-    <w:bookmarkStart w:id="16" w:name="_mioConsistencyCheck465"/>
+    <w:bookmarkStart w:id="17" w:name="_mioConsistencyCheck465"/>
     <w:p>
       <w:pPr>
         <w:pStyle w:val="Body"/>
@@ -2810,7 +2812,7 @@
         </w:rPr>
         <w:fldChar w:fldCharType="end"/>
       </w:r>
-      <w:bookmarkEnd w:id="16"/>
+      <w:bookmarkEnd w:id="17"/>
       <w:r>
         <w:rPr>
           <w:sz w:val="24"/>
@@ -2881,7 +2883,7 @@
         </w:rPr>
         <w:t> v3.</w:t>
       </w:r>
-      <w:commentRangeStart w:id="17"/>
+      <w:commentRangeStart w:id="18"/>
       <w:r>
         <w:rPr>
           <w:rFonts w:cs="Arial"/>
@@ -2893,13 +2895,13 @@
         </w:rPr>
         <w:t>6</w:t>
       </w:r>
-      <w:commentRangeEnd w:id="17"/>
+      <w:commentRangeEnd w:id="18"/>
       <w:r>
         <w:rPr>
           <w:rStyle w:val="CommentReference"/>
           <w:lang w:eastAsia="en-US"/>
         </w:rPr>
-        <w:commentReference w:id="17"/>
+        <w:commentReference w:id="18"/>
       </w:r>
     </w:p>
     <w:p>
@@ -2913,9 +2915,9 @@
       <w:r>
         <w:t xml:space="preserve">Install a terminal emulator if you do not have one. Instructions in this document use </w:t>
       </w:r>
-      <w:commentRangeStart w:id="18"/>
       <w:commentRangeStart w:id="19"/>
       <w:commentRangeStart w:id="20"/>
+      <w:commentRangeStart w:id="21"/>
       <w:r>
         <w:fldChar w:fldCharType="begin"/>
       </w:r>
@@ -2943,29 +2945,29 @@
         </w:rPr>
         <w:fldChar w:fldCharType="end"/>
       </w:r>
-      <w:commentRangeEnd w:id="18"/>
+      <w:commentRangeEnd w:id="19"/>
       <w:r>
         <w:rPr>
           <w:rStyle w:val="CommentReference"/>
           <w:lang w:eastAsia="en-US"/>
         </w:rPr>
-        <w:commentReference w:id="18"/>
-      </w:r>
-      <w:commentRangeEnd w:id="19"/>
+        <w:commentReference w:id="19"/>
+      </w:r>
+      <w:commentRangeEnd w:id="20"/>
       <w:r>
         <w:rPr>
           <w:rStyle w:val="CommentReference"/>
           <w:lang w:eastAsia="en-US"/>
         </w:rPr>
-        <w:commentReference w:id="19"/>
-      </w:r>
-      <w:commentRangeEnd w:id="20"/>
+        <w:commentReference w:id="20"/>
+      </w:r>
+      <w:commentRangeEnd w:id="21"/>
       <w:r>
         <w:rPr>
           <w:rStyle w:val="CommentReference"/>
           <w:lang w:eastAsia="en-US"/>
         </w:rPr>
-        <w:commentReference w:id="20"/>
+        <w:commentReference w:id="21"/>
       </w:r>
       <w:r>
         <w:t>.</w:t>
@@ -3007,7 +3009,7 @@
           <w:lang w:eastAsia="de-DE"/>
         </w:rPr>
       </w:pPr>
-      <w:bookmarkStart w:id="21" w:name="_Toc192780015"/>
+      <w:bookmarkStart w:id="22" w:name="_Toc192780015"/>
       <w:r>
         <w:rPr>
           <w:b/>
@@ -3029,7 +3031,7 @@
         </w:rPr>
         <w:t>+ Blinky</w:t>
       </w:r>
-      <w:bookmarkEnd w:id="21"/>
+      <w:bookmarkEnd w:id="22"/>
       <w:r>
         <w:rPr>
           <w:b/>
@@ -3071,7 +3073,7 @@
           <w:lang w:eastAsia="de-DE"/>
         </w:rPr>
       </w:pPr>
-      <w:bookmarkStart w:id="22" w:name="_Toc192780016"/>
+      <w:bookmarkStart w:id="23" w:name="_Toc192780016"/>
       <w:r>
         <w:rPr>
           <w:b/>
@@ -3082,7 +3084,7 @@
         </w:rPr>
         <w:t>Objective</w:t>
       </w:r>
-      <w:bookmarkEnd w:id="22"/>
+      <w:bookmarkEnd w:id="23"/>
     </w:p>
     <w:p>
       <w:pPr>
@@ -3181,11 +3183,11 @@
       <w:pPr>
         <w:pStyle w:val="Heading2"/>
       </w:pPr>
-      <w:bookmarkStart w:id="23" w:name="_Toc192780017"/>
+      <w:bookmarkStart w:id="24" w:name="_Toc192780017"/>
       <w:r>
         <w:t>Description</w:t>
       </w:r>
-      <w:bookmarkEnd w:id="23"/>
+      <w:bookmarkEnd w:id="24"/>
     </w:p>
     <w:p>
       <w:pPr>
@@ -3219,6 +3221,10 @@
     </w:p>
     <w:sdt>
       <w:sdtPr>
+        <w:rPr>
+          <w:b/>
+          <w:lang w:eastAsia="en-US"/>
+        </w:rPr>
         <w:alias w:val="mioTextBlock"/>
         <w:tag w:val="81c2738b-584a-4fa9-a420-fa91ec5ce67e"/>
         <w:id w:val="-2060620793"/>
@@ -3227,11 +3233,6 @@
         </w:placeholder>
         <w15:appearance w15:val="hidden"/>
       </w:sdtPr>
-      <w:sdtEndPr>
-        <w:rPr>
-          <w:b/>
-        </w:rPr>
-      </w:sdtEndPr>
       <w:sdtContent>
         <w:tbl>
           <w:tblPr>
@@ -3353,14 +3354,14 @@
           <w:b w:val="0"/>
         </w:rPr>
       </w:pPr>
-      <w:bookmarkStart w:id="24" w:name="_Toc192780018"/>
+      <w:bookmarkStart w:id="25" w:name="_Toc192780018"/>
       <w:r>
         <w:rPr>
           <w:b w:val="0"/>
         </w:rPr>
         <w:t>Flowchart</w:t>
       </w:r>
-      <w:bookmarkEnd w:id="24"/>
+      <w:bookmarkEnd w:id="25"/>
     </w:p>
     <w:p>
       <w:pPr>
@@ -3388,6 +3389,10 @@
     </w:p>
     <w:sdt>
       <w:sdtPr>
+        <w:rPr>
+          <w:b/>
+          <w:lang w:eastAsia="en-US"/>
+        </w:rPr>
         <w:alias w:val="mioTextBlock"/>
         <w:tag w:val="6799000e-da23-48ac-b090-8c624221224a"/>
         <w:id w:val="-1217652705"/>
@@ -3396,12 +3401,6 @@
         </w:placeholder>
         <w15:appearance w15:val="hidden"/>
       </w:sdtPr>
-      <w:sdtEndPr>
-        <w:rPr>
-          <w:b/>
-          <w:lang w:eastAsia="en-US"/>
-        </w:rPr>
-      </w:sdtEndPr>
       <w:sdtContent>
         <w:tbl>
           <w:tblPr>
@@ -3446,10 +3445,10 @@
                       <v:path o:extrusionok="f" gradientshapeok="t" o:connecttype="rect"/>
                       <o:lock v:ext="edit" aspectratio="t"/>
                     </v:shapetype>
-                    <v:shape id="_x0000_i1030" type="#_x0000_t75" style="width:475.7pt;height:588.05pt" o:ole="">
+                    <v:shape id="_x0000_i1025" type="#_x0000_t75" style="width:475.7pt;height:588.05pt" o:ole="">
                       <v:imagedata r:id="rId24" o:title=""/>
                     </v:shape>
-                    <o:OLEObject Type="Embed" ProgID="Visio.Drawing.15" ShapeID="_x0000_i1030" DrawAspect="Content" ObjectID="_1823347879" r:id="rId25"/>
+                    <o:OLEObject Type="Embed" ProgID="Visio.Drawing.15" ShapeID="_x0000_i1025" DrawAspect="Content" ObjectID="_1823416847" r:id="rId25"/>
                   </w:object>
                 </w:r>
               </w:p>
@@ -3528,6 +3527,10 @@
     </w:p>
     <w:sdt>
       <w:sdtPr>
+        <w:rPr>
+          <w:b/>
+          <w:lang w:eastAsia="en-US"/>
+        </w:rPr>
         <w:alias w:val="mioTextBlock"/>
         <w:tag w:val="bedb578b-42f2-45fc-b27e-18676a586330"/>
         <w:id w:val="-710574639"/>
@@ -3536,12 +3539,6 @@
         </w:placeholder>
         <w15:appearance w15:val="hidden"/>
       </w:sdtPr>
-      <w:sdtEndPr>
-        <w:rPr>
-          <w:b/>
-          <w:lang w:eastAsia="en-US"/>
-        </w:rPr>
-      </w:sdtEndPr>
       <w:sdtContent>
         <w:tbl>
           <w:tblPr>
@@ -3567,10 +3564,10 @@
                 </w:pPr>
                 <w:r>
                   <w:object w:dxaOrig="4404" w:dyaOrig="4296" w14:anchorId="7A224DF9">
-                    <v:shape id="_x0000_i1034" type="#_x0000_t75" style="width:116.95pt;height:114.05pt" o:ole="">
+                    <v:shape id="_x0000_i1026" type="#_x0000_t75" style="width:116.95pt;height:114.05pt" o:ole="">
                       <v:imagedata r:id="rId26" o:title=""/>
                     </v:shape>
-                    <o:OLEObject Type="Embed" ProgID="Visio.Drawing.15" ShapeID="_x0000_i1034" DrawAspect="Content" ObjectID="_1823347880" r:id="rId27"/>
+                    <o:OLEObject Type="Embed" ProgID="Visio.Drawing.15" ShapeID="_x0000_i1026" DrawAspect="Content" ObjectID="_1823416848" r:id="rId27"/>
                   </w:object>
                 </w:r>
               </w:p>
@@ -3627,14 +3624,14 @@
           <w:b w:val="0"/>
         </w:rPr>
       </w:pPr>
-      <w:bookmarkStart w:id="25" w:name="_Toc192780019"/>
+      <w:bookmarkStart w:id="26" w:name="_Toc192780019"/>
       <w:r>
         <w:rPr>
           <w:b w:val="0"/>
         </w:rPr>
         <w:t>Hardware Block Diagram</w:t>
       </w:r>
-      <w:bookmarkEnd w:id="25"/>
+      <w:bookmarkEnd w:id="26"/>
       <w:r>
         <w:rPr>
           <w:b w:val="0"/>
@@ -3760,11 +3757,15 @@
       <w:pPr>
         <w:pStyle w:val="Body"/>
       </w:pPr>
-      <w:bookmarkStart w:id="26" w:name="_Hlk190961414"/>
-    </w:p>
-    <w:bookmarkEnd w:id="26" w:displacedByCustomXml="next"/>
+      <w:bookmarkStart w:id="27" w:name="_Hlk190961414"/>
+    </w:p>
+    <w:bookmarkEnd w:id="27" w:displacedByCustomXml="next"/>
     <w:sdt>
       <w:sdtPr>
+        <w:rPr>
+          <w:b/>
+          <w:lang w:eastAsia="en-US"/>
+        </w:rPr>
         <w:alias w:val="mioTextBlock"/>
         <w:tag w:val="50720dae-b0d4-4194-b190-edb8d80cd456"/>
         <w:id w:val="200978687"/>
@@ -3773,12 +3774,6 @@
         </w:placeholder>
         <w15:appearance w15:val="hidden"/>
       </w:sdtPr>
-      <w:sdtEndPr>
-        <w:rPr>
-          <w:b/>
-          <w:lang w:eastAsia="en-US"/>
-        </w:rPr>
-      </w:sdtEndPr>
       <w:sdtContent>
         <w:tbl>
           <w:tblPr>
@@ -3897,7 +3892,7 @@
           <w:lang w:eastAsia="de-DE"/>
         </w:rPr>
       </w:pPr>
-      <w:bookmarkStart w:id="27" w:name="_Toc192780021"/>
+      <w:bookmarkStart w:id="28" w:name="_Toc192780021"/>
       <w:r>
         <w:rPr>
           <w:b/>
@@ -3908,7 +3903,7 @@
         </w:rPr>
         <w:t>Project Creation</w:t>
       </w:r>
-      <w:bookmarkEnd w:id="27"/>
+      <w:bookmarkEnd w:id="28"/>
       <w:r>
         <w:rPr>
           <w:b/>
@@ -4006,6 +4001,10 @@
     </w:p>
     <w:sdt>
       <w:sdtPr>
+        <w:rPr>
+          <w:b/>
+          <w:lang w:eastAsia="en-US"/>
+        </w:rPr>
         <w:alias w:val="mioTextBlock"/>
         <w:tag w:val="e5ee1bf7-537b-46e7-8a4e-b9b5b3e3775a"/>
         <w:id w:val="-1581593322"/>
@@ -4014,12 +4013,6 @@
         </w:placeholder>
         <w15:appearance w15:val="hidden"/>
       </w:sdtPr>
-      <w:sdtEndPr>
-        <w:rPr>
-          <w:b/>
-          <w:lang w:eastAsia="en-US"/>
-        </w:rPr>
-      </w:sdtEndPr>
       <w:sdtContent>
         <w:tbl>
           <w:tblPr>
@@ -4181,6 +4174,10 @@
     </w:p>
     <w:sdt>
       <w:sdtPr>
+        <w:rPr>
+          <w:b/>
+          <w:lang w:eastAsia="en-US"/>
+        </w:rPr>
         <w:alias w:val="mioTextBlock"/>
         <w:tag w:val="2d7494db-d234-41cb-beb0-3663d9595a42"/>
         <w:id w:val="-941986779"/>
@@ -4189,12 +4186,6 @@
         </w:placeholder>
         <w15:appearance w15:val="hidden"/>
       </w:sdtPr>
-      <w:sdtEndPr>
-        <w:rPr>
-          <w:b/>
-          <w:lang w:eastAsia="en-US"/>
-        </w:rPr>
-      </w:sdtEndPr>
       <w:sdtContent>
         <w:tbl>
           <w:tblPr>
@@ -4390,6 +4381,10 @@
     </w:p>
     <w:sdt>
       <w:sdtPr>
+        <w:rPr>
+          <w:b/>
+          <w:lang w:eastAsia="en-US"/>
+        </w:rPr>
         <w:alias w:val="mioTextBlock"/>
         <w:tag w:val="dc65463d-b88e-43ad-b59d-ffd33524f636"/>
         <w:id w:val="1561752045"/>
@@ -4398,11 +4393,6 @@
         </w:placeholder>
         <w15:appearance w15:val="hidden"/>
       </w:sdtPr>
-      <w:sdtEndPr>
-        <w:rPr>
-          <w:b/>
-        </w:rPr>
-      </w:sdtEndPr>
       <w:sdtContent>
         <w:tbl>
           <w:tblPr>
@@ -4610,7 +4600,9 @@
     <w:sdt>
       <w:sdtPr>
         <w:rPr>
+          <w:b/>
           <w:bCs/>
+          <w:lang w:eastAsia="en-US"/>
         </w:rPr>
         <w:alias w:val="mioTextBlock"/>
         <w:tag w:val="f28395c9-4a56-45ab-aca0-3948237a9f19"/>
@@ -4620,11 +4612,6 @@
         </w:placeholder>
         <w15:appearance w15:val="hidden"/>
       </w:sdtPr>
-      <w:sdtEndPr>
-        <w:rPr>
-          <w:b/>
-        </w:rPr>
-      </w:sdtEndPr>
       <w:sdtContent>
         <w:tbl>
           <w:tblPr>
@@ -4968,6 +4955,10 @@
     </w:p>
     <w:sdt>
       <w:sdtPr>
+        <w:rPr>
+          <w:b/>
+          <w:lang w:eastAsia="en-US"/>
+        </w:rPr>
         <w:alias w:val="mioTextBlock"/>
         <w:tag w:val="931b6e5a-073e-4c21-a5d5-828c13143fcd"/>
         <w:id w:val="1587729481"/>
@@ -4976,11 +4967,6 @@
         </w:placeholder>
         <w15:appearance w15:val="hidden"/>
       </w:sdtPr>
-      <w:sdtEndPr>
-        <w:rPr>
-          <w:b/>
-        </w:rPr>
-      </w:sdtEndPr>
       <w:sdtContent>
         <w:tbl>
           <w:tblPr>
@@ -5247,7 +5233,9 @@
     <w:sdt>
       <w:sdtPr>
         <w:rPr>
+          <w:b/>
           <w:noProof/>
+          <w:lang w:eastAsia="en-US"/>
         </w:rPr>
         <w:alias w:val="mioTextBlock"/>
         <w:tag w:val="3a4b84c9-b48e-49d6-8bde-fdd57f58df1d"/>
@@ -5257,11 +5245,6 @@
         </w:placeholder>
         <w15:appearance w15:val="hidden"/>
       </w:sdtPr>
-      <w:sdtEndPr>
-        <w:rPr>
-          <w:b/>
-        </w:rPr>
-      </w:sdtEndPr>
       <w:sdtContent>
         <w:tbl>
           <w:tblPr>
@@ -5451,6 +5434,10 @@
     </w:p>
     <w:sdt>
       <w:sdtPr>
+        <w:rPr>
+          <w:b/>
+          <w:lang w:eastAsia="en-US"/>
+        </w:rPr>
         <w:alias w:val="mioTextBlock"/>
         <w:tag w:val="4ff7ff77-b2c0-479e-92a1-38c86c3918f0"/>
         <w:id w:val="-1533029484"/>
@@ -5459,11 +5446,6 @@
         </w:placeholder>
         <w15:appearance w15:val="hidden"/>
       </w:sdtPr>
-      <w:sdtEndPr>
-        <w:rPr>
-          <w:b/>
-        </w:rPr>
-      </w:sdtEndPr>
       <w:sdtContent>
         <w:tbl>
           <w:tblPr>
@@ -5625,6 +5607,10 @@
     </w:p>
     <w:sdt>
       <w:sdtPr>
+        <w:rPr>
+          <w:b/>
+          <w:lang w:eastAsia="en-US"/>
+        </w:rPr>
         <w:alias w:val="mioTextBlock"/>
         <w:tag w:val="5a217fb6-d41c-4253-aab3-e46a0a6cf4db"/>
         <w:id w:val="1719478455"/>
@@ -5633,11 +5619,6 @@
         </w:placeholder>
         <w15:appearance w15:val="hidden"/>
       </w:sdtPr>
-      <w:sdtEndPr>
-        <w:rPr>
-          <w:b/>
-        </w:rPr>
-      </w:sdtEndPr>
       <w:sdtContent>
         <w:tbl>
           <w:tblPr>
@@ -5948,6 +5929,10 @@
     </w:p>
     <w:sdt>
       <w:sdtPr>
+        <w:rPr>
+          <w:b/>
+          <w:lang w:eastAsia="en-US"/>
+        </w:rPr>
         <w:alias w:val="mioTextBlock"/>
         <w:tag w:val="cc270b98-ffd7-4663-9c8a-431904c746a2"/>
         <w:id w:val="2082950325"/>
@@ -5956,11 +5941,6 @@
         </w:placeholder>
         <w15:appearance w15:val="hidden"/>
       </w:sdtPr>
-      <w:sdtEndPr>
-        <w:rPr>
-          <w:b/>
-        </w:rPr>
-      </w:sdtEndPr>
       <w:sdtContent>
         <w:tbl>
           <w:tblPr>
@@ -6361,6 +6341,10 @@
     </w:p>
     <w:sdt>
       <w:sdtPr>
+        <w:rPr>
+          <w:b/>
+          <w:lang w:eastAsia="en-US"/>
+        </w:rPr>
         <w:alias w:val="mioTextBlock"/>
         <w:tag w:val="78df9b7c-8489-42ff-946e-b0e28db44603"/>
         <w:id w:val="-1157841046"/>
@@ -6369,11 +6353,6 @@
         </w:placeholder>
         <w15:appearance w15:val="hidden"/>
       </w:sdtPr>
-      <w:sdtEndPr>
-        <w:rPr>
-          <w:b/>
-        </w:rPr>
-      </w:sdtEndPr>
       <w:sdtContent>
         <w:tbl>
           <w:tblPr>
@@ -6618,6 +6597,10 @@
     </w:p>
     <w:sdt>
       <w:sdtPr>
+        <w:rPr>
+          <w:b/>
+          <w:lang w:eastAsia="en-US"/>
+        </w:rPr>
         <w:alias w:val="mioTextBlock"/>
         <w:tag w:val="616af388-56c5-43ce-81c1-f830f0a0d34e"/>
         <w:id w:val="1609850989"/>
@@ -6626,11 +6609,6 @@
         </w:placeholder>
         <w15:appearance w15:val="hidden"/>
       </w:sdtPr>
-      <w:sdtEndPr>
-        <w:rPr>
-          <w:b/>
-        </w:rPr>
-      </w:sdtEndPr>
       <w:sdtContent>
         <w:tbl>
           <w:tblPr>
@@ -6815,6 +6793,10 @@
     </w:p>
     <w:sdt>
       <w:sdtPr>
+        <w:rPr>
+          <w:b/>
+          <w:lang w:eastAsia="en-US"/>
+        </w:rPr>
         <w:alias w:val="mioTextBlock"/>
         <w:tag w:val="d13d753d-6118-4688-b5c0-79b391ea647d"/>
         <w:id w:val="394627408"/>
@@ -6823,11 +6805,6 @@
         </w:placeholder>
         <w15:appearance w15:val="hidden"/>
       </w:sdtPr>
-      <w:sdtEndPr>
-        <w:rPr>
-          <w:b/>
-        </w:rPr>
-      </w:sdtEndPr>
       <w:sdtContent>
         <w:tbl>
           <w:tblPr>
@@ -7196,6 +7173,10 @@
     </w:p>
     <w:sdt>
       <w:sdtPr>
+        <w:rPr>
+          <w:b/>
+          <w:lang w:eastAsia="en-US"/>
+        </w:rPr>
         <w:alias w:val="mioTextBlock"/>
         <w:tag w:val="9ce240c0-32a6-42e8-8701-c7b93c5f733b"/>
         <w:id w:val="-995410420"/>
@@ -7204,11 +7185,6 @@
         </w:placeholder>
         <w15:appearance w15:val="hidden"/>
       </w:sdtPr>
-      <w:sdtEndPr>
-        <w:rPr>
-          <w:b/>
-        </w:rPr>
-      </w:sdtEndPr>
       <w:sdtContent>
         <w:tbl>
           <w:tblPr>
@@ -7386,6 +7362,10 @@
     </w:p>
     <w:sdt>
       <w:sdtPr>
+        <w:rPr>
+          <w:b/>
+          <w:lang w:eastAsia="en-US"/>
+        </w:rPr>
         <w:alias w:val="mioTextBlock"/>
         <w:tag w:val="778c411b-7a80-4410-af32-530e2d973ad6"/>
         <w:id w:val="17204266"/>
@@ -7394,11 +7374,6 @@
         </w:placeholder>
         <w15:appearance w15:val="hidden"/>
       </w:sdtPr>
-      <w:sdtEndPr>
-        <w:rPr>
-          <w:b/>
-        </w:rPr>
-      </w:sdtEndPr>
       <w:sdtContent>
         <w:tbl>
           <w:tblPr>
@@ -7579,6 +7554,10 @@
     </w:p>
     <w:sdt>
       <w:sdtPr>
+        <w:rPr>
+          <w:b/>
+          <w:lang w:eastAsia="en-US"/>
+        </w:rPr>
         <w:alias w:val="mioTextBlock"/>
         <w:tag w:val="1ecea41e-16b5-4b48-a6d9-f8c3188f89a5"/>
         <w:id w:val="-503434261"/>
@@ -7587,12 +7566,6 @@
         </w:placeholder>
         <w15:appearance w15:val="hidden"/>
       </w:sdtPr>
-      <w:sdtEndPr>
-        <w:rPr>
-          <w:b/>
-          <w:lang w:eastAsia="en-US"/>
-        </w:rPr>
-      </w:sdtEndPr>
       <w:sdtContent>
         <w:tbl>
           <w:tblPr>
@@ -7716,12 +7689,7 @@
         <w:ind w:left="1778"/>
       </w:pPr>
       <w:r>
-        <w:t>Each pin can be uniquely i</w:t>
-      </w:r>
-      <w:bookmarkStart w:id="28" w:name="_GoBack"/>
-      <w:bookmarkEnd w:id="28"/>
-      <w:r>
-        <w:t>dentified by giving them a name of your choice. These names are known as aliases and can be used in the code to refer to the pins instead of using the explicit Pin numbers.</w:t>
+        <w:t>Each pin can be uniquely identified by giving them a name of your choice. These names are known as aliases and can be used in the code to refer to the pins instead of using the explicit Pin numbers.</w:t>
       </w:r>
     </w:p>
     <w:p>
@@ -7744,57 +7712,134 @@
           <w:lang w:eastAsia="de-DE"/>
         </w:rPr>
       </w:pPr>
-      <w:r>
-        <w:rPr>
-          <w:noProof/>
-        </w:rPr>
-        <w:drawing>
-          <wp:inline distT="0" distB="0" distL="0" distR="0" wp14:anchorId="57382452" wp14:editId="1FD650BB">
-            <wp:extent cx="2855895" cy="3367331"/>
-            <wp:effectExtent l="0" t="0" r="1905" b="5080"/>
-            <wp:docPr id="77" name="Picture 77"/>
-            <wp:cNvGraphicFramePr>
-              <a:graphicFrameLocks xmlns:a="http://schemas.openxmlformats.org/drawingml/2006/main" noChangeAspect="1"/>
-            </wp:cNvGraphicFramePr>
-            <a:graphic xmlns:a="http://schemas.openxmlformats.org/drawingml/2006/main">
-              <a:graphicData uri="http://schemas.openxmlformats.org/drawingml/2006/picture">
-                <pic:pic xmlns:pic="http://schemas.openxmlformats.org/drawingml/2006/picture">
-                  <pic:nvPicPr>
-                    <pic:cNvPr id="1" name=""/>
-                    <pic:cNvPicPr/>
-                  </pic:nvPicPr>
-                  <pic:blipFill>
-                    <a:blip r:embed="rId44"/>
-                    <a:stretch>
-                      <a:fillRect/>
-                    </a:stretch>
-                  </pic:blipFill>
-                  <pic:spPr>
-                    <a:xfrm>
-                      <a:off x="0" y="0"/>
-                      <a:ext cx="2870644" cy="3384721"/>
-                    </a:xfrm>
-                    <a:prstGeom prst="rect">
-                      <a:avLst/>
-                    </a:prstGeom>
-                  </pic:spPr>
-                </pic:pic>
-              </a:graphicData>
-            </a:graphic>
-          </wp:inline>
-        </w:drawing>
-      </w:r>
-    </w:p>
-    <w:p>
-      <w:pPr>
-        <w:pStyle w:val="ListParagraph"/>
-        <w:spacing w:before="160" w:after="160"/>
-        <w:ind w:left="1778"/>
-        <w:rPr>
-          <w:lang w:eastAsia="de-DE"/>
-        </w:rPr>
-      </w:pPr>
-    </w:p>
+    </w:p>
+    <w:sdt>
+      <w:sdtPr>
+        <w:rPr>
+          <w:b/>
+          <w:lang w:eastAsia="en-US"/>
+        </w:rPr>
+        <w:alias w:val="mioTextBlock"/>
+        <w:tag w:val="d9bcef1e-8f58-48f9-9b79-5dd293a8393a"/>
+        <w:id w:val="250247065"/>
+        <w:placeholder>
+          <w:docPart w:val="DefaultPlaceholder_-1854013440"/>
+        </w:placeholder>
+        <w15:appearance w15:val="hidden"/>
+      </w:sdtPr>
+      <w:sdtContent>
+        <w:tbl>
+          <w:tblPr>
+            <w:tblStyle w:val="InfineonPicture"/>
+            <w:tblW w:w="5000" w:type="pct"/>
+            <w:tblCellMar>
+              <w:left w:w="0" w:type="dxa"/>
+              <w:right w:w="0" w:type="dxa"/>
+            </w:tblCellMar>
+            <w:tblLook w:val="05E0" w:firstRow="1" w:lastRow="1" w:firstColumn="1" w:lastColumn="1" w:noHBand="0" w:noVBand="1"/>
+          </w:tblPr>
+          <w:tblGrid>
+            <w:gridCol w:w="10196"/>
+          </w:tblGrid>
+          <w:tr>
+            <w:tc>
+              <w:tcPr>
+                <w:tcW w:w="5000" w:type="pct"/>
+              </w:tcPr>
+              <w:p>
+                <w:pPr>
+                  <w:pStyle w:val="TableCell-c"/>
+                </w:pPr>
+                <w:r>
+                  <w:rPr>
+                    <w:noProof/>
+                  </w:rPr>
+                  <w:drawing>
+                    <wp:inline distT="0" distB="0" distL="0" distR="0" wp14:anchorId="7CA6897E" wp14:editId="1BF59DC4">
+                      <wp:extent cx="2847376" cy="3384721"/>
+                      <wp:effectExtent l="0" t="0" r="0" b="6350"/>
+                      <wp:docPr id="77" name="Picture 77"/>
+                      <wp:cNvGraphicFramePr>
+                        <a:graphicFrameLocks xmlns:a="http://schemas.openxmlformats.org/drawingml/2006/main" noChangeAspect="1"/>
+                      </wp:cNvGraphicFramePr>
+                      <a:graphic xmlns:a="http://schemas.openxmlformats.org/drawingml/2006/main">
+                        <a:graphicData uri="http://schemas.openxmlformats.org/drawingml/2006/picture">
+                          <pic:pic xmlns:pic="http://schemas.openxmlformats.org/drawingml/2006/picture">
+                            <pic:nvPicPr>
+                              <pic:cNvPr id="1" name=""/>
+                              <pic:cNvPicPr/>
+                            </pic:nvPicPr>
+                            <pic:blipFill>
+                              <a:blip r:embed="rId44">
+                                <a:extLst>
+                                  <a:ext uri="{28A0092B-C50C-407E-A947-70E740481C1C}">
+                                    <a14:useLocalDpi xmlns:a14="http://schemas.microsoft.com/office/drawing/2010/main" val="0"/>
+                                  </a:ext>
+                                </a:extLst>
+                              </a:blip>
+                              <a:stretch>
+                                <a:fillRect/>
+                              </a:stretch>
+                            </pic:blipFill>
+                            <pic:spPr>
+                              <a:xfrm>
+                                <a:off x="0" y="0"/>
+                                <a:ext cx="2847376" cy="3384721"/>
+                              </a:xfrm>
+                              <a:prstGeom prst="rect">
+                                <a:avLst/>
+                              </a:prstGeom>
+                            </pic:spPr>
+                          </pic:pic>
+                        </a:graphicData>
+                      </a:graphic>
+                    </wp:inline>
+                  </w:drawing>
+                </w:r>
+              </w:p>
+            </w:tc>
+          </w:tr>
+        </w:tbl>
+        <w:p>
+          <w:pPr>
+            <w:pStyle w:val="Figuretitlenew"/>
+            <w:rPr>
+              <w:lang w:eastAsia="de-DE"/>
+            </w:rPr>
+          </w:pPr>
+          <w:r>
+            <w:t xml:space="preserve">Figure </w:t>
+          </w:r>
+          <w:r>
+            <w:fldChar w:fldCharType="begin"/>
+          </w:r>
+          <w:r>
+            <w:instrText xml:space="preserve"> SEQ Figure \* ARABIC </w:instrText>
+          </w:r>
+          <w:r>
+            <w:fldChar w:fldCharType="separate"/>
+          </w:r>
+          <w:r>
+            <w:rPr>
+              <w:noProof/>
+            </w:rPr>
+            <w:t>19</w:t>
+          </w:r>
+          <w:r>
+            <w:fldChar w:fldCharType="end"/>
+          </w:r>
+          <w:r>
+            <w:tab/>
+          </w:r>
+          <w:r>
+            <w:rPr>
+              <w:highlight w:val="yellow"/>
+            </w:rPr>
+            <w:t>Example figure</w:t>
+          </w:r>
+        </w:p>
+      </w:sdtContent>
+    </w:sdt>
     <w:p>
       <w:pPr>
         <w:pStyle w:val="ListParagraph"/>
@@ -7952,9 +7997,9 @@
           <w:noProof/>
         </w:rPr>
         <w:drawing>
-          <wp:inline distT="0" distB="0" distL="0" distR="0" wp14:anchorId="7BE3E1D5" wp14:editId="705BA8A7">
-            <wp:extent cx="3816927" cy="3949540"/>
-            <wp:effectExtent l="0" t="0" r="0" b="0"/>
+          <wp:inline distT="0" distB="0" distL="0" distR="0" wp14:anchorId="7BE3E1D5" wp14:editId="5E509D6D">
+            <wp:extent cx="3409931" cy="3999220"/>
+            <wp:effectExtent l="0" t="0" r="635" b="1905"/>
             <wp:docPr id="78" name="Picture 78"/>
             <wp:cNvGraphicFramePr>
               <a:graphicFrameLocks xmlns:a="http://schemas.openxmlformats.org/drawingml/2006/main" noChangeAspect="1"/>
@@ -7967,7 +8012,13 @@
                     <pic:cNvPicPr/>
                   </pic:nvPicPr>
                   <pic:blipFill>
-                    <a:blip r:embed="rId45"/>
+                    <a:blip r:embed="rId45">
+                      <a:extLst>
+                        <a:ext uri="{28A0092B-C50C-407E-A947-70E740481C1C}">
+                          <a14:useLocalDpi xmlns:a14="http://schemas.microsoft.com/office/drawing/2010/main" val="0"/>
+                        </a:ext>
+                      </a:extLst>
+                    </a:blip>
                     <a:stretch>
                       <a:fillRect/>
                     </a:stretch>
@@ -7975,7 +8026,7 @@
                   <pic:spPr>
                     <a:xfrm>
                       <a:off x="0" y="0"/>
-                      <a:ext cx="3864939" cy="3999220"/>
+                      <a:ext cx="3409931" cy="3999220"/>
                     </a:xfrm>
                     <a:prstGeom prst="rect">
                       <a:avLst/>
@@ -8082,71 +8133,140 @@
           <w:lang w:eastAsia="de-DE"/>
         </w:rPr>
       </w:pPr>
-      <w:r>
-        <w:rPr>
-          <w:noProof/>
-          <w:lang w:eastAsia="de-DE"/>
-        </w:rPr>
-        <w:lastRenderedPageBreak/>
-        <w:drawing>
-          <wp:inline distT="0" distB="0" distL="0" distR="0" wp14:anchorId="07620DAD" wp14:editId="57B354D4">
-            <wp:extent cx="4351942" cy="3532753"/>
-            <wp:effectExtent l="0" t="0" r="0" b="0"/>
-            <wp:docPr id="2007675774" name="Picture 2007675774"/>
-            <wp:cNvGraphicFramePr>
-              <a:graphicFrameLocks xmlns:a="http://schemas.openxmlformats.org/drawingml/2006/main" noChangeAspect="1"/>
-            </wp:cNvGraphicFramePr>
-            <a:graphic xmlns:a="http://schemas.openxmlformats.org/drawingml/2006/main">
-              <a:graphicData uri="http://schemas.openxmlformats.org/drawingml/2006/picture">
-                <pic:pic xmlns:pic="http://schemas.openxmlformats.org/drawingml/2006/picture">
-                  <pic:nvPicPr>
-                    <pic:cNvPr id="0" name="Picture 68"/>
-                    <pic:cNvPicPr>
-                      <a:picLocks noChangeAspect="1" noChangeArrowheads="1"/>
-                    </pic:cNvPicPr>
-                  </pic:nvPicPr>
-                  <pic:blipFill>
-                    <a:blip r:embed="rId46">
-                      <a:extLst>
-                        <a:ext uri="{28A0092B-C50C-407E-A947-70E740481C1C}">
-                          <a14:useLocalDpi xmlns:a14="http://schemas.microsoft.com/office/drawing/2010/main" val="0"/>
-                        </a:ext>
-                      </a:extLst>
-                    </a:blip>
-                    <a:srcRect/>
-                    <a:stretch>
-                      <a:fillRect/>
-                    </a:stretch>
-                  </pic:blipFill>
-                  <pic:spPr bwMode="auto">
-                    <a:xfrm>
-                      <a:off x="0" y="0"/>
-                      <a:ext cx="4385862" cy="3560288"/>
-                    </a:xfrm>
-                    <a:prstGeom prst="rect">
-                      <a:avLst/>
-                    </a:prstGeom>
-                    <a:noFill/>
-                    <a:ln>
-                      <a:noFill/>
-                    </a:ln>
-                  </pic:spPr>
-                </pic:pic>
-              </a:graphicData>
-            </a:graphic>
-          </wp:inline>
-        </w:drawing>
-      </w:r>
-    </w:p>
-    <w:p>
-      <w:pPr>
-        <w:spacing w:before="160" w:after="160"/>
-        <w:ind w:left="1418"/>
-        <w:rPr>
-          <w:lang w:eastAsia="de-DE"/>
-        </w:rPr>
-      </w:pPr>
-    </w:p>
+    </w:p>
+    <w:sdt>
+      <w:sdtPr>
+        <w:rPr>
+          <w:b/>
+          <w:lang w:eastAsia="en-US"/>
+        </w:rPr>
+        <w:alias w:val="mioTextBlock"/>
+        <w:tag w:val="825e0e4b-a212-41ae-bd37-409527f64d4b"/>
+        <w:id w:val="639701492"/>
+        <w:placeholder>
+          <w:docPart w:val="DefaultPlaceholder_-1854013440"/>
+        </w:placeholder>
+        <w15:appearance w15:val="hidden"/>
+      </w:sdtPr>
+      <w:sdtContent>
+        <w:tbl>
+          <w:tblPr>
+            <w:tblStyle w:val="InfineonPicture"/>
+            <w:tblW w:w="5000" w:type="pct"/>
+            <w:tblCellMar>
+              <w:left w:w="0" w:type="dxa"/>
+              <w:right w:w="0" w:type="dxa"/>
+            </w:tblCellMar>
+            <w:tblLook w:val="05E0" w:firstRow="1" w:lastRow="1" w:firstColumn="1" w:lastColumn="1" w:noHBand="0" w:noVBand="1"/>
+          </w:tblPr>
+          <w:tblGrid>
+            <w:gridCol w:w="10196"/>
+          </w:tblGrid>
+          <w:tr>
+            <w:tc>
+              <w:tcPr>
+                <w:tcW w:w="5000" w:type="pct"/>
+              </w:tcPr>
+              <w:p>
+                <w:pPr>
+                  <w:pStyle w:val="TableCell-c"/>
+                </w:pPr>
+                <w:r>
+                  <w:rPr>
+                    <w:noProof/>
+                  </w:rPr>
+                  <w:drawing>
+                    <wp:inline distT="0" distB="0" distL="0" distR="0" wp14:anchorId="2495DF0E" wp14:editId="249ACFA3">
+                      <wp:extent cx="4309822" cy="3560288"/>
+                      <wp:effectExtent l="0" t="0" r="0" b="2540"/>
+                      <wp:docPr id="2007675774" name="Picture 2007675774"/>
+                      <wp:cNvGraphicFramePr>
+                        <a:graphicFrameLocks xmlns:a="http://schemas.openxmlformats.org/drawingml/2006/main" noChangeAspect="1"/>
+                      </wp:cNvGraphicFramePr>
+                      <a:graphic xmlns:a="http://schemas.openxmlformats.org/drawingml/2006/main">
+                        <a:graphicData uri="http://schemas.openxmlformats.org/drawingml/2006/picture">
+                          <pic:pic xmlns:pic="http://schemas.openxmlformats.org/drawingml/2006/picture">
+                            <pic:nvPicPr>
+                              <pic:cNvPr id="0" name="Picture 68"/>
+                              <pic:cNvPicPr>
+                                <a:picLocks noChangeAspect="1" noChangeArrowheads="1"/>
+                              </pic:cNvPicPr>
+                            </pic:nvPicPr>
+                            <pic:blipFill>
+                              <a:blip r:embed="rId46">
+                                <a:extLst>
+                                  <a:ext uri="{28A0092B-C50C-407E-A947-70E740481C1C}">
+                                    <a14:useLocalDpi xmlns:a14="http://schemas.microsoft.com/office/drawing/2010/main" val="0"/>
+                                  </a:ext>
+                                </a:extLst>
+                              </a:blip>
+                              <a:stretch>
+                                <a:fillRect/>
+                              </a:stretch>
+                            </pic:blipFill>
+                            <pic:spPr bwMode="auto">
+                              <a:xfrm>
+                                <a:off x="0" y="0"/>
+                                <a:ext cx="4309822" cy="3560288"/>
+                              </a:xfrm>
+                              <a:prstGeom prst="rect">
+                                <a:avLst/>
+                              </a:prstGeom>
+                              <a:noFill/>
+                              <a:ln>
+                                <a:noFill/>
+                              </a:ln>
+                            </pic:spPr>
+                          </pic:pic>
+                        </a:graphicData>
+                      </a:graphic>
+                    </wp:inline>
+                  </w:drawing>
+                </w:r>
+              </w:p>
+            </w:tc>
+          </w:tr>
+        </w:tbl>
+        <w:p>
+          <w:pPr>
+            <w:pStyle w:val="Figuretitlenew"/>
+            <w:rPr>
+              <w:lang w:eastAsia="de-DE"/>
+            </w:rPr>
+          </w:pPr>
+          <w:r>
+            <w:t xml:space="preserve">Figure </w:t>
+          </w:r>
+          <w:r>
+            <w:fldChar w:fldCharType="begin"/>
+          </w:r>
+          <w:r>
+            <w:instrText xml:space="preserve"> SEQ Figure \* ARABIC </w:instrText>
+          </w:r>
+          <w:r>
+            <w:fldChar w:fldCharType="separate"/>
+          </w:r>
+          <w:r>
+            <w:rPr>
+              <w:noProof/>
+            </w:rPr>
+            <w:t>20</w:t>
+          </w:r>
+          <w:r>
+            <w:fldChar w:fldCharType="end"/>
+          </w:r>
+          <w:r>
+            <w:tab/>
+          </w:r>
+          <w:r>
+            <w:rPr>
+              <w:highlight w:val="yellow"/>
+            </w:rPr>
+            <w:t>Example figure</w:t>
+          </w:r>
+        </w:p>
+      </w:sdtContent>
+    </w:sdt>
     <w:p>
       <w:pPr>
         <w:pStyle w:val="ListParagraph"/>
@@ -8157,61 +8277,140 @@
           <w:lang w:eastAsia="de-DE"/>
         </w:rPr>
       </w:pPr>
-      <w:r>
-        <w:rPr>
-          <w:noProof/>
-          <w:lang w:eastAsia="de-DE"/>
-        </w:rPr>
-        <w:drawing>
-          <wp:inline distT="0" distB="0" distL="0" distR="0" wp14:anchorId="15CA1E96" wp14:editId="0604249B">
-            <wp:extent cx="3805528" cy="2848610"/>
-            <wp:effectExtent l="0" t="0" r="5080" b="8890"/>
-            <wp:docPr id="2007675775" name="Picture 2007675775"/>
-            <wp:cNvGraphicFramePr>
-              <a:graphicFrameLocks xmlns:a="http://schemas.openxmlformats.org/drawingml/2006/main" noChangeAspect="1"/>
-            </wp:cNvGraphicFramePr>
-            <a:graphic xmlns:a="http://schemas.openxmlformats.org/drawingml/2006/main">
-              <a:graphicData uri="http://schemas.openxmlformats.org/drawingml/2006/picture">
-                <pic:pic xmlns:pic="http://schemas.openxmlformats.org/drawingml/2006/picture">
-                  <pic:nvPicPr>
-                    <pic:cNvPr id="0" name="Picture 69"/>
-                    <pic:cNvPicPr>
-                      <a:picLocks noChangeAspect="1" noChangeArrowheads="1"/>
-                    </pic:cNvPicPr>
-                  </pic:nvPicPr>
-                  <pic:blipFill>
-                    <a:blip r:embed="rId47">
-                      <a:extLst>
-                        <a:ext uri="{28A0092B-C50C-407E-A947-70E740481C1C}">
-                          <a14:useLocalDpi xmlns:a14="http://schemas.microsoft.com/office/drawing/2010/main" val="0"/>
-                        </a:ext>
-                      </a:extLst>
-                    </a:blip>
-                    <a:srcRect/>
-                    <a:stretch>
-                      <a:fillRect/>
-                    </a:stretch>
-                  </pic:blipFill>
-                  <pic:spPr bwMode="auto">
-                    <a:xfrm>
-                      <a:off x="0" y="0"/>
-                      <a:ext cx="3817745" cy="2857755"/>
-                    </a:xfrm>
-                    <a:prstGeom prst="rect">
-                      <a:avLst/>
-                    </a:prstGeom>
-                    <a:noFill/>
-                    <a:ln>
-                      <a:noFill/>
-                    </a:ln>
-                  </pic:spPr>
-                </pic:pic>
-              </a:graphicData>
-            </a:graphic>
-          </wp:inline>
-        </w:drawing>
-      </w:r>
-    </w:p>
+    </w:p>
+    <w:sdt>
+      <w:sdtPr>
+        <w:rPr>
+          <w:b/>
+          <w:lang w:eastAsia="en-US"/>
+        </w:rPr>
+        <w:alias w:val="mioTextBlock"/>
+        <w:tag w:val="ab29df2f-d348-4afc-a259-248f87879999"/>
+        <w:id w:val="1337034858"/>
+        <w:placeholder>
+          <w:docPart w:val="DefaultPlaceholder_-1854013440"/>
+        </w:placeholder>
+        <w15:appearance w15:val="hidden"/>
+      </w:sdtPr>
+      <w:sdtContent>
+        <w:tbl>
+          <w:tblPr>
+            <w:tblStyle w:val="InfineonPicture"/>
+            <w:tblW w:w="5000" w:type="pct"/>
+            <w:tblCellMar>
+              <w:left w:w="0" w:type="dxa"/>
+              <w:right w:w="0" w:type="dxa"/>
+            </w:tblCellMar>
+            <w:tblLook w:val="05E0" w:firstRow="1" w:lastRow="1" w:firstColumn="1" w:lastColumn="1" w:noHBand="0" w:noVBand="1"/>
+          </w:tblPr>
+          <w:tblGrid>
+            <w:gridCol w:w="10196"/>
+          </w:tblGrid>
+          <w:tr>
+            <w:tc>
+              <w:tcPr>
+                <w:tcW w:w="5000" w:type="pct"/>
+              </w:tcPr>
+              <w:p>
+                <w:pPr>
+                  <w:pStyle w:val="TableCell-c"/>
+                </w:pPr>
+                <w:r>
+                  <w:rPr>
+                    <w:noProof/>
+                  </w:rPr>
+                  <w:drawing>
+                    <wp:inline distT="0" distB="0" distL="0" distR="0" wp14:anchorId="30902E70" wp14:editId="265249EB">
+                      <wp:extent cx="3070904" cy="3650432"/>
+                      <wp:effectExtent l="0" t="0" r="0" b="7620"/>
+                      <wp:docPr id="2007675775" name="Picture 2007675775"/>
+                      <wp:cNvGraphicFramePr>
+                        <a:graphicFrameLocks xmlns:a="http://schemas.openxmlformats.org/drawingml/2006/main" noChangeAspect="1"/>
+                      </wp:cNvGraphicFramePr>
+                      <a:graphic xmlns:a="http://schemas.openxmlformats.org/drawingml/2006/main">
+                        <a:graphicData uri="http://schemas.openxmlformats.org/drawingml/2006/picture">
+                          <pic:pic xmlns:pic="http://schemas.openxmlformats.org/drawingml/2006/picture">
+                            <pic:nvPicPr>
+                              <pic:cNvPr id="0" name="Picture 69"/>
+                              <pic:cNvPicPr>
+                                <a:picLocks noChangeAspect="1" noChangeArrowheads="1"/>
+                              </pic:cNvPicPr>
+                            </pic:nvPicPr>
+                            <pic:blipFill>
+                              <a:blip r:embed="rId47">
+                                <a:extLst>
+                                  <a:ext uri="{28A0092B-C50C-407E-A947-70E740481C1C}">
+                                    <a14:useLocalDpi xmlns:a14="http://schemas.microsoft.com/office/drawing/2010/main" val="0"/>
+                                  </a:ext>
+                                </a:extLst>
+                              </a:blip>
+                              <a:stretch>
+                                <a:fillRect/>
+                              </a:stretch>
+                            </pic:blipFill>
+                            <pic:spPr bwMode="auto">
+                              <a:xfrm>
+                                <a:off x="0" y="0"/>
+                                <a:ext cx="3098257" cy="3682947"/>
+                              </a:xfrm>
+                              <a:prstGeom prst="rect">
+                                <a:avLst/>
+                              </a:prstGeom>
+                              <a:noFill/>
+                              <a:ln>
+                                <a:noFill/>
+                              </a:ln>
+                            </pic:spPr>
+                          </pic:pic>
+                        </a:graphicData>
+                      </a:graphic>
+                    </wp:inline>
+                  </w:drawing>
+                </w:r>
+              </w:p>
+            </w:tc>
+          </w:tr>
+        </w:tbl>
+        <w:p>
+          <w:pPr>
+            <w:pStyle w:val="Figuretitlenew"/>
+            <w:rPr>
+              <w:lang w:eastAsia="de-DE"/>
+            </w:rPr>
+          </w:pPr>
+          <w:r>
+            <w:t xml:space="preserve">Figure </w:t>
+          </w:r>
+          <w:r>
+            <w:fldChar w:fldCharType="begin"/>
+          </w:r>
+          <w:r>
+            <w:instrText xml:space="preserve"> SEQ Figure \* ARABIC </w:instrText>
+          </w:r>
+          <w:r>
+            <w:fldChar w:fldCharType="separate"/>
+          </w:r>
+          <w:r>
+            <w:rPr>
+              <w:noProof/>
+            </w:rPr>
+            <w:t>21</w:t>
+          </w:r>
+          <w:r>
+            <w:fldChar w:fldCharType="end"/>
+          </w:r>
+          <w:r>
+            <w:tab/>
+          </w:r>
+          <w:r>
+            <w:rPr>
+              <w:highlight w:val="yellow"/>
+            </w:rPr>
+            <w:t>Example figure</w:t>
+          </w:r>
+        </w:p>
+      </w:sdtContent>
+    </w:sdt>
     <w:p>
       <w:pPr>
         <w:pStyle w:val="ListParagraph"/>
@@ -8235,6 +8434,7 @@
         <w:rPr>
           <w:lang w:eastAsia="de-DE"/>
         </w:rPr>
+        <w:lastRenderedPageBreak/>
         <w:t>Remember these names “</w:t>
       </w:r>
       <w:r>
@@ -8261,8 +8461,30 @@
         <w:rPr>
           <w:lang w:eastAsia="de-DE"/>
         </w:rPr>
-        <w:t xml:space="preserve">”, we will be using these during application development </w:t>
-      </w:r>
+        <w:t xml:space="preserve">”, we will be using these during application </w:t>
+      </w:r>
+      <w:proofErr w:type="gramStart"/>
+      <w:r>
+        <w:rPr>
+          <w:lang w:eastAsia="de-DE"/>
+        </w:rPr>
+        <w:t xml:space="preserve">development </w:t>
+      </w:r>
+      <w:r>
+        <w:rPr>
+          <w:lang w:eastAsia="de-DE"/>
+        </w:rPr>
+        <w:t>.</w:t>
+      </w:r>
+      <w:proofErr w:type="gramEnd"/>
+    </w:p>
+    <w:p>
+      <w:pPr>
+        <w:spacing w:before="160" w:after="160"/>
+        <w:rPr>
+          <w:lang w:eastAsia="de-DE"/>
+        </w:rPr>
+      </w:pPr>
     </w:p>
     <w:p>
       <w:pPr>
@@ -8290,14 +8512,90 @@
         <w:rPr>
           <w:lang w:eastAsia="de-DE"/>
         </w:rPr>
-        <w:t xml:space="preserve">Changes made on the configurator reflects once you save and close the configurator. </w:t>
-      </w:r>
-      <w:r>
-        <w:rPr>
-          <w:lang w:eastAsia="de-DE"/>
-        </w:rPr>
-        <w:t xml:space="preserve">If you open the </w:t>
-      </w:r>
+        <w:t xml:space="preserve">Select File &gt; Save to save our changes, and then </w:t>
+      </w:r>
+      <w:r>
+        <w:rPr>
+          <w:lang w:eastAsia="de-DE"/>
+        </w:rPr>
+        <w:t xml:space="preserve">click on the Window x </w:t>
+      </w:r>
+      <w:r>
+        <w:rPr>
+          <w:lang w:eastAsia="de-DE"/>
+        </w:rPr>
+        <w:t>Close to quit the configurator.</w:t>
+      </w:r>
+    </w:p>
+    <w:p>
+      <w:pPr>
+        <w:spacing w:before="160" w:after="160"/>
+        <w:rPr>
+          <w:lang w:eastAsia="de-DE"/>
+        </w:rPr>
+      </w:pPr>
+    </w:p>
+    <w:p>
+      <w:pPr>
+        <w:pStyle w:val="ListParagraph"/>
+        <w:numPr>
+          <w:ilvl w:val="0"/>
+          <w:numId w:val="31"/>
+        </w:numPr>
+        <w:spacing w:before="160" w:after="160"/>
+        <w:rPr>
+          <w:lang w:eastAsia="de-DE"/>
+        </w:rPr>
+      </w:pPr>
+      <w:r>
+        <w:rPr>
+          <w:lang w:eastAsia="de-DE"/>
+        </w:rPr>
+        <w:t>The c</w:t>
+      </w:r>
+      <w:r>
+        <w:rPr>
+          <w:lang w:eastAsia="de-DE"/>
+        </w:rPr>
+        <w:t xml:space="preserve">hanges made </w:t>
+      </w:r>
+      <w:r>
+        <w:rPr>
+          <w:lang w:eastAsia="de-DE"/>
+        </w:rPr>
+        <w:t>i</w:t>
+      </w:r>
+      <w:r>
+        <w:rPr>
+          <w:lang w:eastAsia="de-DE"/>
+        </w:rPr>
+        <w:t xml:space="preserve">n the </w:t>
+      </w:r>
+      <w:r>
+        <w:rPr>
+          <w:lang w:eastAsia="de-DE"/>
+        </w:rPr>
+        <w:t>Device C</w:t>
+      </w:r>
+      <w:r>
+        <w:rPr>
+          <w:lang w:eastAsia="de-DE"/>
+        </w:rPr>
+        <w:t xml:space="preserve">onfigurator </w:t>
+      </w:r>
+      <w:r>
+        <w:rPr>
+          <w:lang w:eastAsia="de-DE"/>
+        </w:rPr>
+        <w:t>can be see i</w:t>
+      </w:r>
+      <w:r>
+        <w:rPr>
+          <w:lang w:eastAsia="de-DE"/>
+        </w:rPr>
+        <w:t xml:space="preserve">f you open the </w:t>
+      </w:r>
+      <w:proofErr w:type="spellStart"/>
       <w:r>
         <w:rPr>
           <w:b/>
@@ -8306,6 +8604,7 @@
         </w:rPr>
         <w:t>cycfg_pins.h</w:t>
       </w:r>
+      <w:proofErr w:type="spellEnd"/>
       <w:r>
         <w:rPr>
           <w:b/>
@@ -8317,13 +8616,55 @@
         <w:rPr>
           <w:lang w:eastAsia="de-DE"/>
         </w:rPr>
-        <w:t>file, you can see the pin definitions and aliases. And the change we have made has been reflected in the file</w:t>
+        <w:t>file</w:t>
+      </w:r>
+      <w:r>
+        <w:rPr>
+          <w:lang w:eastAsia="de-DE"/>
+        </w:rPr>
+        <w:t>.</w:t>
+      </w:r>
+      <w:r>
+        <w:rPr>
+          <w:lang w:eastAsia="de-DE"/>
+        </w:rPr>
+        <w:t xml:space="preserve"> </w:t>
+      </w:r>
+      <w:r>
+        <w:rPr>
+          <w:lang w:eastAsia="de-DE"/>
+        </w:rPr>
+        <w:t>Y</w:t>
+      </w:r>
+      <w:r>
+        <w:rPr>
+          <w:lang w:eastAsia="de-DE"/>
+        </w:rPr>
+        <w:t>ou can see the pin definitions and aliases. And the change we have made has been reflected</w:t>
+      </w:r>
+      <w:r>
+        <w:rPr>
+          <w:lang w:eastAsia="de-DE"/>
+        </w:rPr>
+        <w:t xml:space="preserve"> in</w:t>
+      </w:r>
+      <w:r>
+        <w:rPr>
+          <w:lang w:eastAsia="de-DE"/>
+        </w:rPr>
+        <w:t xml:space="preserve"> the file</w:t>
       </w:r>
       <w:r>
         <w:rPr>
           <w:lang w:eastAsia="de-DE"/>
         </w:rPr>
         <w:t xml:space="preserve"> as shown below</w:t>
+      </w:r>
+      <w:r>
+        <w:rPr>
+          <w:lang w:eastAsia="de-DE"/>
+        </w:rPr>
+        <w:t>.</w:t>
       </w:r>
     </w:p>
     <w:p>
@@ -8350,7 +8691,6 @@
         <w:rPr>
           <w:noProof/>
         </w:rPr>
-        <w:lastRenderedPageBreak/>
         <w:drawing>
           <wp:inline distT="0" distB="0" distL="0" distR="0" wp14:anchorId="67FD060E" wp14:editId="70DE2651">
             <wp:extent cx="2587244" cy="2446804"/>
@@ -8811,6 +9151,7 @@
           <w:noProof/>
           <w:lang w:eastAsia="de-DE"/>
         </w:rPr>
+        <w:lastRenderedPageBreak/>
         <w:drawing>
           <wp:inline distT="0" distB="0" distL="0" distR="0" wp14:anchorId="6A2FBD1E" wp14:editId="447714FE">
             <wp:extent cx="2506453" cy="2476011"/>
@@ -9313,6 +9654,7 @@
           <w:color w:val="000000"/>
           <w:lang w:val="en-IN"/>
         </w:rPr>
+        <w:lastRenderedPageBreak/>
         <w:t>&lt;code snippet&gt;</w:t>
       </w:r>
     </w:p>
@@ -9756,7 +10098,6 @@
         <w:rPr>
           <w:noProof/>
         </w:rPr>
-        <w:lastRenderedPageBreak/>
         <w:drawing>
           <wp:inline distT="0" distB="0" distL="0" distR="0" wp14:anchorId="41072C33" wp14:editId="4B377319">
             <wp:extent cx="5419871" cy="2652582"/>
@@ -10742,7 +11083,6 @@
         <w:rPr>
           <w:lang w:eastAsia="de-DE"/>
         </w:rPr>
-        <w:lastRenderedPageBreak/>
         <w:t xml:space="preserve">We will utilize the Uart to get response from the user to control the </w:t>
       </w:r>
       <w:r>
@@ -11553,6 +11893,7 @@
           <w:sz w:val="18"/>
           <w:szCs w:val="18"/>
         </w:rPr>
+        <w:lastRenderedPageBreak/>
         <w:t xml:space="preserve">    /* Check if 'Enter' key was pressed */</w:t>
       </w:r>
     </w:p>
@@ -12166,7 +12507,6 @@
           <w:sz w:val="18"/>
           <w:szCs w:val="18"/>
         </w:rPr>
-        <w:lastRenderedPageBreak/>
         <w:t xml:space="preserve">            /* Move cursor to previous line */</w:t>
       </w:r>
     </w:p>
@@ -15216,6 +15556,7 @@
           <w:b/>
           <w:lang w:eastAsia="de-DE"/>
         </w:rPr>
+        <w:lastRenderedPageBreak/>
         <w:t>&lt;code snippet&gt;</w:t>
       </w:r>
     </w:p>
@@ -15953,6 +16294,7 @@
         <w:rPr>
           <w:noProof/>
         </w:rPr>
+        <w:lastRenderedPageBreak/>
         <w:drawing>
           <wp:inline distT="0" distB="0" distL="0" distR="0" wp14:anchorId="7F87441B" wp14:editId="034CB90C">
             <wp:extent cx="2373755" cy="2863883"/>
@@ -16061,7 +16403,6 @@
         <w:rPr>
           <w:noProof/>
         </w:rPr>
-        <w:lastRenderedPageBreak/>
         <w:drawing>
           <wp:inline distT="0" distB="0" distL="0" distR="0" wp14:anchorId="58B9EC1A" wp14:editId="6FA38C71">
             <wp:extent cx="5607946" cy="2598469"/>
@@ -34825,7 +35166,7 @@
 
 <file path=word/comments.xml><?xml version="1.0" encoding="utf-8"?>
 <w:comments xmlns:wpc="http://schemas.microsoft.com/office/word/2010/wordprocessingCanvas" xmlns:cx="http://schemas.microsoft.com/office/drawing/2014/chartex" xmlns:cx1="http://schemas.microsoft.com/office/drawing/2015/9/8/chartex" xmlns:cx2="http://schemas.microsoft.com/office/drawing/2015/10/21/chartex" xmlns:cx3="http://schemas.microsoft.com/office/drawing/2016/5/9/chartex" xmlns:cx4="http://schemas.microsoft.com/office/drawing/2016/5/10/chartex" xmlns:cx5="http://schemas.microsoft.com/office/drawing/2016/5/11/chartex" xmlns:cx6="http://schemas.microsoft.com/office/drawing/2016/5/12/chartex" xmlns:cx7="http://schemas.microsoft.com/office/drawing/2016/5/13/chartex" xmlns:cx8="http://schemas.microsoft.com/office/drawing/2016/5/14/chartex" xmlns:mc="http://schemas.openxmlformats.org/markup-compatibility/2006" xmlns:aink="http://schemas.microsoft.com/office/drawing/2016/ink" xmlns:am3d="http://schemas.microsoft.com/office/drawing/2017/model3d" xmlns:o="urn:schemas-microsoft-com:office:office" xmlns:r="http://schemas.openxmlformats.org/officeDocument/2006/relationships" xmlns:m="http://schemas.openxmlformats.org/officeDocument/2006/math" xmlns:v="urn:schemas-microsoft-com:vml" xmlns:wp14="http://schemas.microsoft.com/office/word/2010/wordprocessingDrawing" xmlns:wp="http://schemas.openxmlformats.org/drawingml/2006/wordprocessingDrawing" xmlns:w10="urn:schemas-microsoft-com:office:word" xmlns:w="http://schemas.openxmlformats.org/wordprocessingml/2006/main" xmlns:w14="http://schemas.microsoft.com/office/word/2010/wordml" xmlns:w15="http://schemas.microsoft.com/office/word/2012/wordml" xmlns:w16cid="http://schemas.microsoft.com/office/word/2016/wordml/cid" xmlns:w16se="http://schemas.microsoft.com/office/word/2015/wordml/symex" xmlns:wpg="http://schemas.microsoft.com/office/word/2010/wordprocessingGroup" xmlns:wpi="http://schemas.microsoft.com/office/word/2010/wordprocessingInk" xmlns:wne="http://schemas.microsoft.com/office/word/2006/wordml" xmlns:wps="http://schemas.microsoft.com/office/word/2010/wordprocessingShape" mc:Ignorable="w14 w15 w16se w16cid wp14">
-  <w:comment w:id="17" w:author="Phillips Craig (CSS ICW MCU APP CES)" w:date="2025-10-22T08:27:00Z" w:initials="PC(IMAC">
+  <w:comment w:id="18" w:author="Phillips Craig (CSS ICW MCU APP CES)" w:date="2025-10-22T08:27:00Z" w:initials="PC(IMAC">
     <w:p>
       <w:pPr>
         <w:pStyle w:val="CommentText"/>
@@ -34841,7 +35182,7 @@
       </w:r>
     </w:p>
   </w:comment>
-  <w:comment w:id="18" w:author="Phillips Craig (CSS ICW MCU APP CES)" w:date="2025-10-22T08:28:00Z" w:initials="PC(IMAC">
+  <w:comment w:id="19" w:author="Phillips Craig (CSS ICW MCU APP CES)" w:date="2025-10-22T08:28:00Z" w:initials="PC(IMAC">
     <w:p>
       <w:pPr>
         <w:pStyle w:val="CommentText"/>
@@ -34854,26 +35195,26 @@
       </w:r>
       <w:r>
         <w:t>Tera Term instruction link is dead</w:t>
-      </w:r>
-    </w:p>
-  </w:comment>
-  <w:comment w:id="19" w:author="Phillips Craig (CSS ICW MCU APP CES)" w:date="2025-10-22T08:41:00Z" w:initials="PC(IMAC">
-    <w:p>
-      <w:pPr>
-        <w:pStyle w:val="CommentText"/>
-      </w:pPr>
-      <w:r>
-        <w:rPr>
-          <w:rStyle w:val="CommentReference"/>
-        </w:rPr>
-        <w:annotationRef/>
-      </w:r>
-      <w:r>
-        <w:t>Also listed as unwanted on the IFX App Store, maybe we want to switch to PuTTY?</w:t>
       </w:r>
     </w:p>
   </w:comment>
   <w:comment w:id="20" w:author="Phillips Craig (CSS ICW MCU APP CES)" w:date="2025-10-22T08:41:00Z" w:initials="PC(IMAC">
+    <w:p>
+      <w:pPr>
+        <w:pStyle w:val="CommentText"/>
+      </w:pPr>
+      <w:r>
+        <w:rPr>
+          <w:rStyle w:val="CommentReference"/>
+        </w:rPr>
+        <w:annotationRef/>
+      </w:r>
+      <w:r>
+        <w:t>Also listed as unwanted on the IFX App Store, maybe we want to switch to PuTTY?</w:t>
+      </w:r>
+    </w:p>
+  </w:comment>
+  <w:comment w:id="21" w:author="Phillips Craig (CSS ICW MCU APP CES)" w:date="2025-10-22T08:41:00Z" w:initials="PC(IMAC">
     <w:p>
       <w:pPr>
         <w:pStyle w:val="CommentText"/>
@@ -35720,7 +36061,7 @@
         <v:shape id="_x0000_s2052" type="#_x0000_t75" style="position:absolute;margin-left:-45.75pt;margin-top:62.5pt;width:602.45pt;height:287.2pt;z-index:-251642880;mso-position-horizontal-relative:text;mso-position-vertical-relative:text">
           <v:imagedata r:id="rId1" o:title=""/>
         </v:shape>
-        <o:OLEObject Type="Embed" ProgID="Visio.Drawing.15" ShapeID="_x0000_s2052" DrawAspect="Content" ObjectID="_1823347881" r:id="rId2"/>
+        <o:OLEObject Type="Embed" ProgID="Visio.Drawing.15" ShapeID="_x0000_s2052" DrawAspect="Content" ObjectID="_1823416849" r:id="rId2"/>
       </w:object>
     </w:r>
     <w:r>
@@ -37053,7 +37394,7 @@
         <v:shape id="_x0000_s2051" type="#_x0000_t75" style="position:absolute;margin-left:-45.75pt;margin-top:62.5pt;width:602.45pt;height:287.2pt;z-index:-251643904;mso-position-horizontal-relative:text;mso-position-vertical-relative:text">
           <v:imagedata r:id="rId1" o:title=""/>
         </v:shape>
-        <o:OLEObject Type="Embed" ProgID="Visio.Drawing.15" ShapeID="_x0000_s2051" DrawAspect="Content" ObjectID="_1823347882" r:id="rId2"/>
+        <o:OLEObject Type="Embed" ProgID="Visio.Drawing.15" ShapeID="_x0000_s2051" DrawAspect="Content" ObjectID="_1823416850" r:id="rId2"/>
       </w:object>
     </w:r>
     <w:r>
@@ -37422,7 +37763,11 @@
         </mc:Choice>
         <mc:Fallback>
           <w:pict>
-            <v:shape w14:anchorId="28316247" id="_x0000_s1042" type="#_x0000_t202" style="position:absolute;margin-left:40pt;margin-top:575.65pt;width:511.45pt;height:249pt;z-index:251643904;visibility:visible;mso-wrap-style:square;mso-width-percent:0;mso-height-percent:0;mso-wrap-distance-left:9pt;mso-wrap-distance-top:0;mso-wrap-distance-right:9pt;mso-wrap-distance-bottom:0;mso-position-horizontal:absolute;mso-position-horizontal-relative:page;mso-position-vertical:absolute;mso-position-vertical-relative:page;mso-width-percent:0;mso-height-percent:0;mso-width-relative:page;mso-height-relative:page;v-text-anchor:top" o:gfxdata="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" filled="f" stroked="f" strokeweight="0">
+            <v:shapetype w14:anchorId="28316247" id="_x0000_t202" coordsize="21600,21600" o:spt="202" path="m,l,21600r21600,l21600,xe">
+              <v:stroke joinstyle="miter"/>
+              <v:path gradientshapeok="t" o:connecttype="rect"/>
+            </v:shapetype>
+            <v:shape id="_x0000_s1042" type="#_x0000_t202" style="position:absolute;margin-left:40pt;margin-top:575.65pt;width:511.45pt;height:249pt;z-index:251643904;visibility:visible;mso-wrap-style:square;mso-width-percent:0;mso-height-percent:0;mso-wrap-distance-left:9pt;mso-wrap-distance-top:0;mso-wrap-distance-right:9pt;mso-wrap-distance-bottom:0;mso-position-horizontal:absolute;mso-position-horizontal-relative:page;mso-position-vertical:absolute;mso-position-vertical-relative:page;mso-width-percent:0;mso-height-percent:0;mso-width-relative:page;mso-height-relative:page;v-text-anchor:top" o:gfxdata="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" filled="f" stroked="f" strokeweight="0">
               <v:textbox inset="0,0,0,0">
                 <w:txbxContent>
                   <w:tbl>
@@ -47891,7 +48236,8 @@
   </w:compat>
   <w:rsids>
     <w:rsidRoot w:val="00EC48F7"/>
-    <w:rsid w:val="009B7381"/>
+    <w:rsid w:val="001857A4"/>
+    <w:rsid w:val="00E12A08"/>
     <w:rsid w:val="00EC48F7"/>
   </w:rsids>
   <m:mathPr>
@@ -48646,12 +48992,166 @@
 </file>
 
 <file path=customXml/item1.xml><?xml version="1.0" encoding="utf-8"?>
+<?mso-contentType ?>
+<FormTemplates xmlns="http://schemas.microsoft.com/sharepoint/v3/contenttype/forms">
+  <Display>DocumentLibraryForm</Display>
+  <Edit>DocumentLibraryForm</Edit>
+  <New>DocumentLibraryForm</New>
+</FormTemplates>
+</file>
+
+<file path=customXml/item2.xml><?xml version="1.0" encoding="utf-8"?>
 <p:properties xmlns:p="http://schemas.microsoft.com/office/2006/metadata/properties" xmlns:xsi="http://www.w3.org/2001/XMLSchema-instance" xmlns:pc="http://schemas.microsoft.com/office/infopath/2007/PartnerControls">
   <documentManagement/>
 </p:properties>
 </file>
 
-<file path=customXml/item2.xml><?xml version="1.0" encoding="utf-8"?>
+<file path=customXml/item3.xml><?xml version="1.0" encoding="utf-8"?>
+<DocsTemplateContainer xmlns="http://www.made-in-office.com/empower/docs/template/v1">
+  <DocsTextTemplateDictionary/>
+  <DocsImageTemplateDictionary/>
+  <ImageElements/>
+  <TextBlockElements>
+    <TextBlockMetadata>
+      <ElementId>1a622969-9435-42df-b756-4af60deadd4b</ElementId>
+      <ContentTag>YzCqVxr4CkGOIjtz8kQsF1txdvNf0IhJnc8A53W8JnY=</ContentTag>
+      <TimestampUtc>2023-08-07T12:57:01.087Z</TimestampUtc>
+      <TextBlockMetadataId>81c2738b-584a-4fa9-a420-fa91ec5ce67e</TextBlockMetadataId>
+    </TextBlockMetadata>
+    <TextBlockMetadata>
+      <ElementId>1a622969-9435-42df-b756-4af60deadd4b</ElementId>
+      <ContentTag>YzCqVxr4CkGOIjtz8kQsF1txdvNf0IhJnc8A53W8JnY=</ContentTag>
+      <TimestampUtc>2023-08-07T12:57:01.087Z</TimestampUtc>
+      <TextBlockMetadataId>50720dae-b0d4-4194-b190-edb8d80cd456</TextBlockMetadataId>
+    </TextBlockMetadata>
+    <TextBlockMetadata>
+      <ElementId>1a622969-9435-42df-b756-4af60deadd4b</ElementId>
+      <ContentTag>YzCqVxr4CkGOIjtz8kQsF1txdvNf0IhJnc8A53W8JnY=</ContentTag>
+      <TimestampUtc>2023-08-07T12:57:01.087Z</TimestampUtc>
+      <TextBlockMetadataId>6799000e-da23-48ac-b090-8c624221224a</TextBlockMetadataId>
+    </TextBlockMetadata>
+    <TextBlockMetadata>
+      <ElementId>1a622969-9435-42df-b756-4af60deadd4b</ElementId>
+      <ContentTag>YzCqVxr4CkGOIjtz8kQsF1txdvNf0IhJnc8A53W8JnY=</ContentTag>
+      <TimestampUtc>2023-08-07T12:57:01.087Z</TimestampUtc>
+      <TextBlockMetadataId>bedb578b-42f2-45fc-b27e-18676a586330</TextBlockMetadataId>
+    </TextBlockMetadata>
+    <TextBlockMetadata>
+      <ElementId>1a622969-9435-42df-b756-4af60deadd4b</ElementId>
+      <ContentTag>YzCqVxr4CkGOIjtz8kQsF1txdvNf0IhJnc8A53W8JnY=</ContentTag>
+      <TimestampUtc>2023-08-07T12:57:01.087Z</TimestampUtc>
+      <TextBlockMetadataId>e5ee1bf7-537b-46e7-8a4e-b9b5b3e3775a</TextBlockMetadataId>
+    </TextBlockMetadata>
+    <TextBlockMetadata>
+      <ElementId>1a622969-9435-42df-b756-4af60deadd4b</ElementId>
+      <ContentTag>YzCqVxr4CkGOIjtz8kQsF1txdvNf0IhJnc8A53W8JnY=</ContentTag>
+      <TimestampUtc>2023-08-07T12:57:01.087Z</TimestampUtc>
+      <TextBlockMetadataId>2d7494db-d234-41cb-beb0-3663d9595a42</TextBlockMetadataId>
+    </TextBlockMetadata>
+    <TextBlockMetadata>
+      <ElementId>1a622969-9435-42df-b756-4af60deadd4b</ElementId>
+      <ContentTag>YzCqVxr4CkGOIjtz8kQsF1txdvNf0IhJnc8A53W8JnY=</ContentTag>
+      <TimestampUtc>2023-08-07T12:57:01.087Z</TimestampUtc>
+      <TextBlockMetadataId>dc65463d-b88e-43ad-b59d-ffd33524f636</TextBlockMetadataId>
+    </TextBlockMetadata>
+    <TextBlockMetadata>
+      <ElementId>1a622969-9435-42df-b756-4af60deadd4b</ElementId>
+      <ContentTag>YzCqVxr4CkGOIjtz8kQsF1txdvNf0IhJnc8A53W8JnY=</ContentTag>
+      <TimestampUtc>2023-08-07T12:57:01.087Z</TimestampUtc>
+      <TextBlockMetadataId>f28395c9-4a56-45ab-aca0-3948237a9f19</TextBlockMetadataId>
+    </TextBlockMetadata>
+    <TextBlockMetadata>
+      <ElementId>1a622969-9435-42df-b756-4af60deadd4b</ElementId>
+      <ContentTag>YzCqVxr4CkGOIjtz8kQsF1txdvNf0IhJnc8A53W8JnY=</ContentTag>
+      <TimestampUtc>2023-08-07T12:57:01.087Z</TimestampUtc>
+      <TextBlockMetadataId>931b6e5a-073e-4c21-a5d5-828c13143fcd</TextBlockMetadataId>
+    </TextBlockMetadata>
+    <TextBlockMetadata>
+      <ElementId>1a622969-9435-42df-b756-4af60deadd4b</ElementId>
+      <ContentTag>YzCqVxr4CkGOIjtz8kQsF1txdvNf0IhJnc8A53W8JnY=</ContentTag>
+      <TimestampUtc>2023-08-07T12:57:01.087Z</TimestampUtc>
+      <TextBlockMetadataId>3a4b84c9-b48e-49d6-8bde-fdd57f58df1d</TextBlockMetadataId>
+    </TextBlockMetadata>
+    <TextBlockMetadata>
+      <ElementId>1a622969-9435-42df-b756-4af60deadd4b</ElementId>
+      <ContentTag>YzCqVxr4CkGOIjtz8kQsF1txdvNf0IhJnc8A53W8JnY=</ContentTag>
+      <TimestampUtc>2023-08-07T12:57:01.087Z</TimestampUtc>
+      <TextBlockMetadataId>4ff7ff77-b2c0-479e-92a1-38c86c3918f0</TextBlockMetadataId>
+    </TextBlockMetadata>
+    <TextBlockMetadata>
+      <ElementId>1a622969-9435-42df-b756-4af60deadd4b</ElementId>
+      <ContentTag>YzCqVxr4CkGOIjtz8kQsF1txdvNf0IhJnc8A53W8JnY=</ContentTag>
+      <TimestampUtc>2023-08-07T12:57:01.087Z</TimestampUtc>
+      <TextBlockMetadataId>5a217fb6-d41c-4253-aab3-e46a0a6cf4db</TextBlockMetadataId>
+    </TextBlockMetadata>
+    <TextBlockMetadata>
+      <ElementId>1a622969-9435-42df-b756-4af60deadd4b</ElementId>
+      <ContentTag>YzCqVxr4CkGOIjtz8kQsF1txdvNf0IhJnc8A53W8JnY=</ContentTag>
+      <TimestampUtc>2023-08-07T12:57:01.087Z</TimestampUtc>
+      <TextBlockMetadataId>cc270b98-ffd7-4663-9c8a-431904c746a2</TextBlockMetadataId>
+    </TextBlockMetadata>
+    <TextBlockMetadata>
+      <ElementId>1a622969-9435-42df-b756-4af60deadd4b</ElementId>
+      <ContentTag>YzCqVxr4CkGOIjtz8kQsF1txdvNf0IhJnc8A53W8JnY=</ContentTag>
+      <TimestampUtc>2023-08-07T12:57:01.087Z</TimestampUtc>
+      <TextBlockMetadataId>78df9b7c-8489-42ff-946e-b0e28db44603</TextBlockMetadataId>
+    </TextBlockMetadata>
+    <TextBlockMetadata>
+      <ElementId>1a622969-9435-42df-b756-4af60deadd4b</ElementId>
+      <ContentTag>YzCqVxr4CkGOIjtz8kQsF1txdvNf0IhJnc8A53W8JnY=</ContentTag>
+      <TimestampUtc>2023-08-07T12:57:01.087Z</TimestampUtc>
+      <TextBlockMetadataId>616af388-56c5-43ce-81c1-f830f0a0d34e</TextBlockMetadataId>
+    </TextBlockMetadata>
+    <TextBlockMetadata>
+      <ElementId>1a622969-9435-42df-b756-4af60deadd4b</ElementId>
+      <ContentTag>YzCqVxr4CkGOIjtz8kQsF1txdvNf0IhJnc8A53W8JnY=</ContentTag>
+      <TimestampUtc>2023-08-07T12:57:01.087Z</TimestampUtc>
+      <TextBlockMetadataId>d13d753d-6118-4688-b5c0-79b391ea647d</TextBlockMetadataId>
+    </TextBlockMetadata>
+    <TextBlockMetadata>
+      <ElementId>1a622969-9435-42df-b756-4af60deadd4b</ElementId>
+      <ContentTag>YzCqVxr4CkGOIjtz8kQsF1txdvNf0IhJnc8A53W8JnY=</ContentTag>
+      <TimestampUtc>2023-08-07T12:57:01.087Z</TimestampUtc>
+      <TextBlockMetadataId>9ce240c0-32a6-42e8-8701-c7b93c5f733b</TextBlockMetadataId>
+    </TextBlockMetadata>
+    <TextBlockMetadata>
+      <ElementId>1a622969-9435-42df-b756-4af60deadd4b</ElementId>
+      <ContentTag>YzCqVxr4CkGOIjtz8kQsF1txdvNf0IhJnc8A53W8JnY=</ContentTag>
+      <TimestampUtc>2023-08-07T12:57:01.087Z</TimestampUtc>
+      <TextBlockMetadataId>778c411b-7a80-4410-af32-530e2d973ad6</TextBlockMetadataId>
+    </TextBlockMetadata>
+    <TextBlockMetadata>
+      <ElementId>1a622969-9435-42df-b756-4af60deadd4b</ElementId>
+      <ContentTag>YzCqVxr4CkGOIjtz8kQsF1txdvNf0IhJnc8A53W8JnY=</ContentTag>
+      <TimestampUtc>2023-08-07T12:57:01.087Z</TimestampUtc>
+      <TextBlockMetadataId>1ecea41e-16b5-4b48-a6d9-f8c3188f89a5</TextBlockMetadataId>
+    </TextBlockMetadata>
+    <TextBlockMetadata>
+      <ElementId>1a622969-9435-42df-b756-4af60deadd4b</ElementId>
+      <ContentTag>YzCqVxr4CkGOIjtz8kQsF1txdvNf0IhJnc8A53W8JnY=</ContentTag>
+      <TimestampUtc>2023-08-07T12:57:01.087Z</TimestampUtc>
+      <TextBlockMetadataId>d9bcef1e-8f58-48f9-9b79-5dd293a8393a</TextBlockMetadataId>
+    </TextBlockMetadata>
+    <TextBlockMetadata>
+      <ElementId>1a622969-9435-42df-b756-4af60deadd4b</ElementId>
+      <ContentTag>YzCqVxr4CkGOIjtz8kQsF1txdvNf0IhJnc8A53W8JnY=</ContentTag>
+      <TimestampUtc>2023-08-07T12:57:01.087Z</TimestampUtc>
+      <TextBlockMetadataId>825e0e4b-a212-41ae-bd37-409527f64d4b</TextBlockMetadataId>
+    </TextBlockMetadata>
+    <TextBlockMetadata>
+      <ElementId>1a622969-9435-42df-b756-4af60deadd4b</ElementId>
+      <ContentTag>YzCqVxr4CkGOIjtz8kQsF1txdvNf0IhJnc8A53W8JnY=</ContentTag>
+      <TimestampUtc>2023-08-07T12:57:01.087Z</TimestampUtc>
+      <TextBlockMetadataId>ab29df2f-d348-4afc-a259-248f87879999</TextBlockMetadataId>
+    </TextBlockMetadata>
+  </TextBlockElements>
+  <PlaceholderHiddenState>
+    <HideablePlaceholderGuids/>
+  </PlaceholderHiddenState>
+</DocsTemplateContainer>
+</file>
+
+<file path=customXml/item4.xml><?xml version="1.0" encoding="utf-8"?>
 <ct:contentTypeSchema xmlns:ct="http://schemas.microsoft.com/office/2006/metadata/contentType" xmlns:ma="http://schemas.microsoft.com/office/2006/metadata/properties/metaAttributes" ct:_="" ma:_="" ma:contentTypeName="Document" ma:contentTypeID="0x01010030347378EA1C7B40B791B4A9FAEBC72E" ma:contentTypeVersion="1" ma:contentTypeDescription="Create a new document." ma:contentTypeScope="" ma:versionID="dac419b5e4b08ef6434e405bf3dae512">
   <xsd:schema xmlns:xsd="http://www.w3.org/2001/XMLSchema" xmlns:xs="http://www.w3.org/2001/XMLSchema" xmlns:p="http://schemas.microsoft.com/office/2006/metadata/properties" xmlns:ns2="0ff2502a-f5fc-4900-8b9d-01d591984867" targetNamespace="http://schemas.microsoft.com/office/2006/metadata/properties" ma:root="true" ma:fieldsID="8df1d2d8bf6da93316c8b7386a9c82fd" ns2:_="">
     <xsd:import namespace="0ff2502a-f5fc-4900-8b9d-01d591984867"/>
@@ -48791,147 +49291,19 @@
 </ct:contentTypeSchema>
 </file>
 
-<file path=customXml/item3.xml><?xml version="1.0" encoding="utf-8"?>
-<?mso-contentType ?>
-<FormTemplates xmlns="http://schemas.microsoft.com/sharepoint/v3/contenttype/forms">
-  <Display>DocumentLibraryForm</Display>
-  <Edit>DocumentLibraryForm</Edit>
-  <New>DocumentLibraryForm</New>
-</FormTemplates>
-</file>
-
-<file path=customXml/item4.xml><?xml version="1.0" encoding="utf-8"?>
-<DocsTemplateContainer xmlns="http://www.made-in-office.com/empower/docs/template/v1">
-  <DocsTextTemplateDictionary/>
-  <DocsImageTemplateDictionary/>
-  <ImageElements/>
-  <TextBlockElements>
-    <TextBlockMetadata>
-      <ElementId>1a622969-9435-42df-b756-4af60deadd4b</ElementId>
-      <ContentTag>YzCqVxr4CkGOIjtz8kQsF1txdvNf0IhJnc8A53W8JnY=</ContentTag>
-      <TimestampUtc>2023-08-07T12:57:01.087Z</TimestampUtc>
-      <TextBlockMetadataId>81c2738b-584a-4fa9-a420-fa91ec5ce67e</TextBlockMetadataId>
-    </TextBlockMetadata>
-    <TextBlockMetadata>
-      <ElementId>1a622969-9435-42df-b756-4af60deadd4b</ElementId>
-      <ContentTag>YzCqVxr4CkGOIjtz8kQsF1txdvNf0IhJnc8A53W8JnY=</ContentTag>
-      <TimestampUtc>2023-08-07T12:57:01.087Z</TimestampUtc>
-      <TextBlockMetadataId>50720dae-b0d4-4194-b190-edb8d80cd456</TextBlockMetadataId>
-    </TextBlockMetadata>
-    <TextBlockMetadata>
-      <ElementId>1a622969-9435-42df-b756-4af60deadd4b</ElementId>
-      <ContentTag>YzCqVxr4CkGOIjtz8kQsF1txdvNf0IhJnc8A53W8JnY=</ContentTag>
-      <TimestampUtc>2023-08-07T12:57:01.087Z</TimestampUtc>
-      <TextBlockMetadataId>6799000e-da23-48ac-b090-8c624221224a</TextBlockMetadataId>
-    </TextBlockMetadata>
-    <TextBlockMetadata>
-      <ElementId>1a622969-9435-42df-b756-4af60deadd4b</ElementId>
-      <ContentTag>YzCqVxr4CkGOIjtz8kQsF1txdvNf0IhJnc8A53W8JnY=</ContentTag>
-      <TimestampUtc>2023-08-07T12:57:01.087Z</TimestampUtc>
-      <TextBlockMetadataId>bedb578b-42f2-45fc-b27e-18676a586330</TextBlockMetadataId>
-    </TextBlockMetadata>
-    <TextBlockMetadata>
-      <ElementId>1a622969-9435-42df-b756-4af60deadd4b</ElementId>
-      <ContentTag>YzCqVxr4CkGOIjtz8kQsF1txdvNf0IhJnc8A53W8JnY=</ContentTag>
-      <TimestampUtc>2023-08-07T12:57:01.087Z</TimestampUtc>
-      <TextBlockMetadataId>e5ee1bf7-537b-46e7-8a4e-b9b5b3e3775a</TextBlockMetadataId>
-    </TextBlockMetadata>
-    <TextBlockMetadata>
-      <ElementId>1a622969-9435-42df-b756-4af60deadd4b</ElementId>
-      <ContentTag>YzCqVxr4CkGOIjtz8kQsF1txdvNf0IhJnc8A53W8JnY=</ContentTag>
-      <TimestampUtc>2023-08-07T12:57:01.087Z</TimestampUtc>
-      <TextBlockMetadataId>2d7494db-d234-41cb-beb0-3663d9595a42</TextBlockMetadataId>
-    </TextBlockMetadata>
-    <TextBlockMetadata>
-      <ElementId>1a622969-9435-42df-b756-4af60deadd4b</ElementId>
-      <ContentTag>YzCqVxr4CkGOIjtz8kQsF1txdvNf0IhJnc8A53W8JnY=</ContentTag>
-      <TimestampUtc>2023-08-07T12:57:01.087Z</TimestampUtc>
-      <TextBlockMetadataId>dc65463d-b88e-43ad-b59d-ffd33524f636</TextBlockMetadataId>
-    </TextBlockMetadata>
-    <TextBlockMetadata>
-      <ElementId>1a622969-9435-42df-b756-4af60deadd4b</ElementId>
-      <ContentTag>YzCqVxr4CkGOIjtz8kQsF1txdvNf0IhJnc8A53W8JnY=</ContentTag>
-      <TimestampUtc>2023-08-07T12:57:01.087Z</TimestampUtc>
-      <TextBlockMetadataId>f28395c9-4a56-45ab-aca0-3948237a9f19</TextBlockMetadataId>
-    </TextBlockMetadata>
-    <TextBlockMetadata>
-      <ElementId>1a622969-9435-42df-b756-4af60deadd4b</ElementId>
-      <ContentTag>YzCqVxr4CkGOIjtz8kQsF1txdvNf0IhJnc8A53W8JnY=</ContentTag>
-      <TimestampUtc>2023-08-07T12:57:01.087Z</TimestampUtc>
-      <TextBlockMetadataId>931b6e5a-073e-4c21-a5d5-828c13143fcd</TextBlockMetadataId>
-    </TextBlockMetadata>
-    <TextBlockMetadata>
-      <ElementId>1a622969-9435-42df-b756-4af60deadd4b</ElementId>
-      <ContentTag>YzCqVxr4CkGOIjtz8kQsF1txdvNf0IhJnc8A53W8JnY=</ContentTag>
-      <TimestampUtc>2023-08-07T12:57:01.087Z</TimestampUtc>
-      <TextBlockMetadataId>3a4b84c9-b48e-49d6-8bde-fdd57f58df1d</TextBlockMetadataId>
-    </TextBlockMetadata>
-    <TextBlockMetadata>
-      <ElementId>1a622969-9435-42df-b756-4af60deadd4b</ElementId>
-      <ContentTag>YzCqVxr4CkGOIjtz8kQsF1txdvNf0IhJnc8A53W8JnY=</ContentTag>
-      <TimestampUtc>2023-08-07T12:57:01.087Z</TimestampUtc>
-      <TextBlockMetadataId>4ff7ff77-b2c0-479e-92a1-38c86c3918f0</TextBlockMetadataId>
-    </TextBlockMetadata>
-    <TextBlockMetadata>
-      <ElementId>1a622969-9435-42df-b756-4af60deadd4b</ElementId>
-      <ContentTag>YzCqVxr4CkGOIjtz8kQsF1txdvNf0IhJnc8A53W8JnY=</ContentTag>
-      <TimestampUtc>2023-08-07T12:57:01.087Z</TimestampUtc>
-      <TextBlockMetadataId>5a217fb6-d41c-4253-aab3-e46a0a6cf4db</TextBlockMetadataId>
-    </TextBlockMetadata>
-    <TextBlockMetadata>
-      <ElementId>1a622969-9435-42df-b756-4af60deadd4b</ElementId>
-      <ContentTag>YzCqVxr4CkGOIjtz8kQsF1txdvNf0IhJnc8A53W8JnY=</ContentTag>
-      <TimestampUtc>2023-08-07T12:57:01.087Z</TimestampUtc>
-      <TextBlockMetadataId>cc270b98-ffd7-4663-9c8a-431904c746a2</TextBlockMetadataId>
-    </TextBlockMetadata>
-    <TextBlockMetadata>
-      <ElementId>1a622969-9435-42df-b756-4af60deadd4b</ElementId>
-      <ContentTag>YzCqVxr4CkGOIjtz8kQsF1txdvNf0IhJnc8A53W8JnY=</ContentTag>
-      <TimestampUtc>2023-08-07T12:57:01.087Z</TimestampUtc>
-      <TextBlockMetadataId>78df9b7c-8489-42ff-946e-b0e28db44603</TextBlockMetadataId>
-    </TextBlockMetadata>
-    <TextBlockMetadata>
-      <ElementId>1a622969-9435-42df-b756-4af60deadd4b</ElementId>
-      <ContentTag>YzCqVxr4CkGOIjtz8kQsF1txdvNf0IhJnc8A53W8JnY=</ContentTag>
-      <TimestampUtc>2023-08-07T12:57:01.087Z</TimestampUtc>
-      <TextBlockMetadataId>616af388-56c5-43ce-81c1-f830f0a0d34e</TextBlockMetadataId>
-    </TextBlockMetadata>
-    <TextBlockMetadata>
-      <ElementId>1a622969-9435-42df-b756-4af60deadd4b</ElementId>
-      <ContentTag>YzCqVxr4CkGOIjtz8kQsF1txdvNf0IhJnc8A53W8JnY=</ContentTag>
-      <TimestampUtc>2023-08-07T12:57:01.087Z</TimestampUtc>
-      <TextBlockMetadataId>d13d753d-6118-4688-b5c0-79b391ea647d</TextBlockMetadataId>
-    </TextBlockMetadata>
-    <TextBlockMetadata>
-      <ElementId>1a622969-9435-42df-b756-4af60deadd4b</ElementId>
-      <ContentTag>YzCqVxr4CkGOIjtz8kQsF1txdvNf0IhJnc8A53W8JnY=</ContentTag>
-      <TimestampUtc>2023-08-07T12:57:01.087Z</TimestampUtc>
-      <TextBlockMetadataId>9ce240c0-32a6-42e8-8701-c7b93c5f733b</TextBlockMetadataId>
-    </TextBlockMetadata>
-    <TextBlockMetadata>
-      <ElementId>1a622969-9435-42df-b756-4af60deadd4b</ElementId>
-      <ContentTag>YzCqVxr4CkGOIjtz8kQsF1txdvNf0IhJnc8A53W8JnY=</ContentTag>
-      <TimestampUtc>2023-08-07T12:57:01.087Z</TimestampUtc>
-      <TextBlockMetadataId>778c411b-7a80-4410-af32-530e2d973ad6</TextBlockMetadataId>
-    </TextBlockMetadata>
-    <TextBlockMetadata>
-      <ElementId>1a622969-9435-42df-b756-4af60deadd4b</ElementId>
-      <ContentTag>YzCqVxr4CkGOIjtz8kQsF1txdvNf0IhJnc8A53W8JnY=</ContentTag>
-      <TimestampUtc>2023-08-07T12:57:01.087Z</TimestampUtc>
-      <TextBlockMetadataId>1ecea41e-16b5-4b48-a6d9-f8c3188f89a5</TextBlockMetadataId>
-    </TextBlockMetadata>
-  </TextBlockElements>
-  <PlaceholderHiddenState>
-    <HideablePlaceholderGuids/>
-  </PlaceholderHiddenState>
-</DocsTemplateContainer>
-</file>
-
 <file path=customXml/item5.xml><?xml version="1.0" encoding="utf-8"?>
 <b:Sources xmlns:b="http://schemas.openxmlformats.org/officeDocument/2006/bibliography" xmlns="http://schemas.openxmlformats.org/officeDocument/2006/bibliography" SelectedStyle="\APA.XSL" StyleName="APA"/>
 </file>
 
 <file path=customXml/itemProps1.xml><?xml version="1.0" encoding="utf-8"?>
+<ds:datastoreItem xmlns:ds="http://schemas.openxmlformats.org/officeDocument/2006/customXml" ds:itemID="{A6A899CE-B708-4D9D-B4A9-81256E8EE869}">
+  <ds:schemaRefs>
+    <ds:schemaRef ds:uri="http://schemas.microsoft.com/sharepoint/v3/contenttype/forms"/>
+  </ds:schemaRefs>
+</ds:datastoreItem>
+</file>
+
+<file path=customXml/itemProps2.xml><?xml version="1.0" encoding="utf-8"?>
 <ds:datastoreItem xmlns:ds="http://schemas.openxmlformats.org/officeDocument/2006/customXml" ds:itemID="{2D743F90-B02F-45D5-9835-EA3B57C055FC}">
   <ds:schemaRefs>
     <ds:schemaRef ds:uri="http://schemas.microsoft.com/office/2006/metadata/properties"/>
@@ -48940,7 +49312,15 @@
 </ds:datastoreItem>
 </file>
 
-<file path=customXml/itemProps2.xml><?xml version="1.0" encoding="utf-8"?>
+<file path=customXml/itemProps3.xml><?xml version="1.0" encoding="utf-8"?>
+<ds:datastoreItem xmlns:ds="http://schemas.openxmlformats.org/officeDocument/2006/customXml" ds:itemID="{F96E3769-7231-44E3-8B58-26BF0D2D9E0D}">
+  <ds:schemaRefs>
+    <ds:schemaRef ds:uri="http://www.made-in-office.com/empower/docs/template/v1"/>
+  </ds:schemaRefs>
+</ds:datastoreItem>
+</file>
+
+<file path=customXml/itemProps4.xml><?xml version="1.0" encoding="utf-8"?>
 <ds:datastoreItem xmlns:ds="http://schemas.openxmlformats.org/officeDocument/2006/customXml" ds:itemID="{348D6D5F-AF49-4DAF-BEBA-00EA06977ED2}">
   <ds:schemaRefs>
     <ds:schemaRef ds:uri="http://schemas.microsoft.com/office/2006/metadata/contentType"/>
@@ -48958,24 +49338,8 @@
 </ds:datastoreItem>
 </file>
 
-<file path=customXml/itemProps3.xml><?xml version="1.0" encoding="utf-8"?>
-<ds:datastoreItem xmlns:ds="http://schemas.openxmlformats.org/officeDocument/2006/customXml" ds:itemID="{A6A899CE-B708-4D9D-B4A9-81256E8EE869}">
-  <ds:schemaRefs>
-    <ds:schemaRef ds:uri="http://schemas.microsoft.com/sharepoint/v3/contenttype/forms"/>
-  </ds:schemaRefs>
-</ds:datastoreItem>
-</file>
-
-<file path=customXml/itemProps4.xml><?xml version="1.0" encoding="utf-8"?>
-<ds:datastoreItem xmlns:ds="http://schemas.openxmlformats.org/officeDocument/2006/customXml" ds:itemID="{C84B57E9-7935-4894-89F5-BFC50D79F715}">
-  <ds:schemaRefs>
-    <ds:schemaRef ds:uri="http://www.made-in-office.com/empower/docs/template/v1"/>
-  </ds:schemaRefs>
-</ds:datastoreItem>
-</file>
-
 <file path=customXml/itemProps5.xml><?xml version="1.0" encoding="utf-8"?>
-<ds:datastoreItem xmlns:ds="http://schemas.openxmlformats.org/officeDocument/2006/customXml" ds:itemID="{1D949632-53CF-499B-B283-35525628EAD6}">
+<ds:datastoreItem xmlns:ds="http://schemas.openxmlformats.org/officeDocument/2006/customXml" ds:itemID="{80E15AD8-D253-41CD-B876-D4DF8A615961}">
   <ds:schemaRefs>
     <ds:schemaRef ds:uri="http://schemas.openxmlformats.org/officeDocument/2006/bibliography"/>
   </ds:schemaRefs>

</xml_diff>

<commit_message>
adding training led alias and Generated Source folder location
</commit_message>
<xml_diff>
--- a/.internal/Manual/Intro to PSOC Edge E84 - Part 2 (E2)/PSoC Edge E84 Introductory E2 Training Manual -WIP_10_21_2025.docx
+++ b/.internal/Manual/Intro to PSOC Edge E84 - Part 2 (E2)/PSoC Edge E84 Introductory E2 Training Manual -WIP_10_21_2025.docx
@@ -10,71 +10,69 @@
         </w:rPr>
       </w:pPr>
       <w:bookmarkStart w:id="0" w:name="_Toc385505508"/>
-      <w:bookmarkStart w:id="1" w:name="_GoBack"/>
+      <w:r>
+        <w:rPr>
+          <w:b w:val="0"/>
+        </w:rPr>
+        <w:t>Training</w:t>
+      </w:r>
+      <w:r>
+        <w:rPr>
+          <w:b w:val="0"/>
+        </w:rPr>
+        <w:t xml:space="preserve"> Manual for getting started with PS</w:t>
+      </w:r>
+      <w:r>
+        <w:rPr>
+          <w:b w:val="0"/>
+        </w:rPr>
+        <w:t>O</w:t>
+      </w:r>
+      <w:r>
+        <w:rPr>
+          <w:b w:val="0"/>
+        </w:rPr>
+        <w:t xml:space="preserve">C™ Edge E84 MCU applications </w:t>
+      </w:r>
+      <w:r>
+        <w:rPr>
+          <w:b w:val="0"/>
+        </w:rPr>
+        <w:t xml:space="preserve">using </w:t>
+      </w:r>
+      <w:r>
+        <w:rPr>
+          <w:b w:val="0"/>
+        </w:rPr>
+        <w:t>Modus Toolbox™ software</w:t>
+      </w:r>
+    </w:p>
+    <w:p>
+      <w:pPr>
+        <w:pStyle w:val="HeadingPreface"/>
+        <w:rPr>
+          <w:b w:val="0"/>
+        </w:rPr>
+      </w:pPr>
+      <w:bookmarkStart w:id="1" w:name="_Toc430947631"/>
+      <w:bookmarkStart w:id="2" w:name="_Toc431284129"/>
+      <w:bookmarkStart w:id="3" w:name="_Toc431374932"/>
+      <w:bookmarkStart w:id="4" w:name="_Toc431889535"/>
+      <w:bookmarkStart w:id="5" w:name="_Toc431980074"/>
+      <w:bookmarkStart w:id="6" w:name="_Toc192780010"/>
+      <w:r>
+        <w:rPr>
+          <w:b w:val="0"/>
+        </w:rPr>
+        <w:t>About this document</w:t>
+      </w:r>
+      <w:bookmarkEnd w:id="0"/>
       <w:bookmarkEnd w:id="1"/>
-      <w:r>
-        <w:rPr>
-          <w:b w:val="0"/>
-        </w:rPr>
-        <w:t>Training</w:t>
-      </w:r>
-      <w:r>
-        <w:rPr>
-          <w:b w:val="0"/>
-        </w:rPr>
-        <w:t xml:space="preserve"> Manual for getting started with PS</w:t>
-      </w:r>
-      <w:r>
-        <w:rPr>
-          <w:b w:val="0"/>
-        </w:rPr>
-        <w:t>O</w:t>
-      </w:r>
-      <w:r>
-        <w:rPr>
-          <w:b w:val="0"/>
-        </w:rPr>
-        <w:t xml:space="preserve">C™ Edge E84 MCU applications </w:t>
-      </w:r>
-      <w:r>
-        <w:rPr>
-          <w:b w:val="0"/>
-        </w:rPr>
-        <w:t xml:space="preserve">using </w:t>
-      </w:r>
-      <w:r>
-        <w:rPr>
-          <w:b w:val="0"/>
-        </w:rPr>
-        <w:t>Modus Toolbox™ software</w:t>
-      </w:r>
-    </w:p>
-    <w:p>
-      <w:pPr>
-        <w:pStyle w:val="HeadingPreface"/>
-        <w:rPr>
-          <w:b w:val="0"/>
-        </w:rPr>
-      </w:pPr>
-      <w:bookmarkStart w:id="2" w:name="_Toc430947631"/>
-      <w:bookmarkStart w:id="3" w:name="_Toc431284129"/>
-      <w:bookmarkStart w:id="4" w:name="_Toc431374932"/>
-      <w:bookmarkStart w:id="5" w:name="_Toc431889535"/>
-      <w:bookmarkStart w:id="6" w:name="_Toc431980074"/>
-      <w:bookmarkStart w:id="7" w:name="_Toc192780010"/>
-      <w:r>
-        <w:rPr>
-          <w:b w:val="0"/>
-        </w:rPr>
-        <w:t>About this document</w:t>
-      </w:r>
-      <w:bookmarkEnd w:id="0"/>
       <w:bookmarkEnd w:id="2"/>
       <w:bookmarkEnd w:id="3"/>
       <w:bookmarkEnd w:id="4"/>
       <w:bookmarkEnd w:id="5"/>
       <w:bookmarkEnd w:id="6"/>
-      <w:bookmarkEnd w:id="7"/>
     </w:p>
     <w:p>
       <w:pPr>
@@ -171,19 +169,19 @@
           <w:b w:val="0"/>
         </w:rPr>
       </w:pPr>
-      <w:bookmarkStart w:id="8" w:name="_Toc431889536"/>
-      <w:bookmarkStart w:id="9" w:name="_Toc431980075"/>
-      <w:bookmarkStart w:id="10" w:name="_Toc192780011"/>
-      <w:bookmarkStart w:id="11" w:name="_Toc430947633"/>
+      <w:bookmarkStart w:id="7" w:name="_Toc431889536"/>
+      <w:bookmarkStart w:id="8" w:name="_Toc431980075"/>
+      <w:bookmarkStart w:id="9" w:name="_Toc192780011"/>
+      <w:bookmarkStart w:id="10" w:name="_Toc430947633"/>
       <w:r>
         <w:rPr>
           <w:b w:val="0"/>
         </w:rPr>
         <w:t>Table of contents</w:t>
       </w:r>
+      <w:bookmarkEnd w:id="7"/>
       <w:bookmarkEnd w:id="8"/>
       <w:bookmarkEnd w:id="9"/>
-      <w:bookmarkEnd w:id="10"/>
     </w:p>
     <w:sdt>
       <w:sdtPr>
@@ -1999,13 +1997,13 @@
           <w:tab w:val="num" w:pos="1762"/>
         </w:tabs>
       </w:pPr>
-      <w:bookmarkStart w:id="12" w:name="_Toc192780012"/>
-      <w:bookmarkEnd w:id="11"/>
+      <w:bookmarkStart w:id="11" w:name="_Toc192780012"/>
+      <w:bookmarkEnd w:id="10"/>
       <w:r>
         <w:lastRenderedPageBreak/>
         <w:t>Introduction</w:t>
       </w:r>
-      <w:bookmarkEnd w:id="12"/>
+      <w:bookmarkEnd w:id="11"/>
     </w:p>
     <w:p>
       <w:pPr>
@@ -2111,13 +2109,13 @@
           <w:tab w:val="num" w:pos="1762"/>
         </w:tabs>
       </w:pPr>
-      <w:bookmarkStart w:id="13" w:name="_Required_development_tools"/>
-      <w:bookmarkStart w:id="14" w:name="_Toc192780013"/>
+      <w:bookmarkStart w:id="12" w:name="_Required_development_tools"/>
+      <w:bookmarkStart w:id="13" w:name="_Toc192780013"/>
+      <w:bookmarkEnd w:id="12"/>
+      <w:r>
+        <w:t>Required development tools</w:t>
+      </w:r>
       <w:bookmarkEnd w:id="13"/>
-      <w:r>
-        <w:t>Required development tools</w:t>
-      </w:r>
-      <w:bookmarkEnd w:id="14"/>
     </w:p>
     <w:p>
       <w:pPr>
@@ -2617,7 +2615,7 @@
           <w:lang w:val="en-IN" w:eastAsia="en-IN"/>
         </w:rPr>
       </w:pPr>
-      <w:bookmarkStart w:id="15" w:name="_mioConsistencyCheck20"/>
+      <w:bookmarkStart w:id="14" w:name="_mioConsistencyCheck20"/>
       <w:r>
         <w:rPr>
           <w:b/>
@@ -2663,7 +2661,7 @@
         <w:t>, BOOT SW pin is BOOT.1 (P17.6)</w:t>
       </w:r>
     </w:p>
-    <w:bookmarkEnd w:id="15"/>
+    <w:bookmarkEnd w:id="14"/>
     <w:p>
       <w:pPr>
         <w:numPr>
@@ -2752,16 +2750,16 @@
           <w:tab w:val="num" w:pos="1762"/>
         </w:tabs>
       </w:pPr>
-      <w:bookmarkStart w:id="16" w:name="_Toc192780014"/>
+      <w:bookmarkStart w:id="15" w:name="_Toc192780014"/>
       <w:r>
         <w:t>Prerequisites</w:t>
       </w:r>
-      <w:bookmarkEnd w:id="16"/>
+      <w:bookmarkEnd w:id="15"/>
       <w:r>
         <w:t xml:space="preserve"> </w:t>
       </w:r>
     </w:p>
-    <w:bookmarkStart w:id="17" w:name="_mioConsistencyCheck465"/>
+    <w:bookmarkStart w:id="16" w:name="_mioConsistencyCheck465"/>
     <w:p>
       <w:pPr>
         <w:pStyle w:val="Body"/>
@@ -2812,7 +2810,7 @@
         </w:rPr>
         <w:fldChar w:fldCharType="end"/>
       </w:r>
-      <w:bookmarkEnd w:id="17"/>
+      <w:bookmarkEnd w:id="16"/>
       <w:r>
         <w:rPr>
           <w:sz w:val="24"/>
@@ -2883,7 +2881,7 @@
         </w:rPr>
         <w:t> v3.</w:t>
       </w:r>
-      <w:commentRangeStart w:id="18"/>
+      <w:commentRangeStart w:id="17"/>
       <w:r>
         <w:rPr>
           <w:rFonts w:cs="Arial"/>
@@ -2895,13 +2893,13 @@
         </w:rPr>
         <w:t>6</w:t>
       </w:r>
-      <w:commentRangeEnd w:id="18"/>
+      <w:commentRangeEnd w:id="17"/>
       <w:r>
         <w:rPr>
           <w:rStyle w:val="CommentReference"/>
           <w:lang w:eastAsia="en-US"/>
         </w:rPr>
-        <w:commentReference w:id="18"/>
+        <w:commentReference w:id="17"/>
       </w:r>
     </w:p>
     <w:p>
@@ -2915,9 +2913,9 @@
       <w:r>
         <w:t xml:space="preserve">Install a terminal emulator if you do not have one. Instructions in this document use </w:t>
       </w:r>
+      <w:commentRangeStart w:id="18"/>
       <w:commentRangeStart w:id="19"/>
       <w:commentRangeStart w:id="20"/>
-      <w:commentRangeStart w:id="21"/>
       <w:r>
         <w:fldChar w:fldCharType="begin"/>
       </w:r>
@@ -2945,29 +2943,29 @@
         </w:rPr>
         <w:fldChar w:fldCharType="end"/>
       </w:r>
-      <w:commentRangeEnd w:id="19"/>
+      <w:commentRangeEnd w:id="18"/>
       <w:r>
         <w:rPr>
           <w:rStyle w:val="CommentReference"/>
           <w:lang w:eastAsia="en-US"/>
         </w:rPr>
-        <w:commentReference w:id="19"/>
-      </w:r>
-      <w:commentRangeEnd w:id="20"/>
+        <w:commentReference w:id="18"/>
+      </w:r>
+      <w:commentRangeEnd w:id="19"/>
       <w:r>
         <w:rPr>
           <w:rStyle w:val="CommentReference"/>
           <w:lang w:eastAsia="en-US"/>
         </w:rPr>
-        <w:commentReference w:id="20"/>
-      </w:r>
-      <w:commentRangeEnd w:id="21"/>
+        <w:commentReference w:id="19"/>
+      </w:r>
+      <w:commentRangeEnd w:id="20"/>
       <w:r>
         <w:rPr>
           <w:rStyle w:val="CommentReference"/>
           <w:lang w:eastAsia="en-US"/>
         </w:rPr>
-        <w:commentReference w:id="21"/>
+        <w:commentReference w:id="20"/>
       </w:r>
       <w:r>
         <w:t>.</w:t>
@@ -3009,7 +3007,7 @@
           <w:lang w:eastAsia="de-DE"/>
         </w:rPr>
       </w:pPr>
-      <w:bookmarkStart w:id="22" w:name="_Toc192780015"/>
+      <w:bookmarkStart w:id="21" w:name="_Toc192780015"/>
       <w:r>
         <w:rPr>
           <w:b/>
@@ -3031,7 +3029,7 @@
         </w:rPr>
         <w:t>+ Blinky</w:t>
       </w:r>
-      <w:bookmarkEnd w:id="22"/>
+      <w:bookmarkEnd w:id="21"/>
       <w:r>
         <w:rPr>
           <w:b/>
@@ -3073,7 +3071,7 @@
           <w:lang w:eastAsia="de-DE"/>
         </w:rPr>
       </w:pPr>
-      <w:bookmarkStart w:id="23" w:name="_Toc192780016"/>
+      <w:bookmarkStart w:id="22" w:name="_Toc192780016"/>
       <w:r>
         <w:rPr>
           <w:b/>
@@ -3084,7 +3082,7 @@
         </w:rPr>
         <w:t>Objective</w:t>
       </w:r>
-      <w:bookmarkEnd w:id="23"/>
+      <w:bookmarkEnd w:id="22"/>
     </w:p>
     <w:p>
       <w:pPr>
@@ -3183,11 +3181,11 @@
       <w:pPr>
         <w:pStyle w:val="Heading2"/>
       </w:pPr>
-      <w:bookmarkStart w:id="24" w:name="_Toc192780017"/>
+      <w:bookmarkStart w:id="23" w:name="_Toc192780017"/>
       <w:r>
         <w:t>Description</w:t>
       </w:r>
-      <w:bookmarkEnd w:id="24"/>
+      <w:bookmarkEnd w:id="23"/>
     </w:p>
     <w:p>
       <w:pPr>
@@ -3354,14 +3352,14 @@
           <w:b w:val="0"/>
         </w:rPr>
       </w:pPr>
-      <w:bookmarkStart w:id="25" w:name="_Toc192780018"/>
+      <w:bookmarkStart w:id="24" w:name="_Toc192780018"/>
       <w:r>
         <w:rPr>
           <w:b w:val="0"/>
         </w:rPr>
         <w:t>Flowchart</w:t>
       </w:r>
-      <w:bookmarkEnd w:id="25"/>
+      <w:bookmarkEnd w:id="24"/>
     </w:p>
     <w:p>
       <w:pPr>
@@ -3448,7 +3446,7 @@
                     <v:shape id="_x0000_i1025" type="#_x0000_t75" style="width:475.7pt;height:588.05pt" o:ole="">
                       <v:imagedata r:id="rId24" o:title=""/>
                     </v:shape>
-                    <o:OLEObject Type="Embed" ProgID="Visio.Drawing.15" ShapeID="_x0000_i1025" DrawAspect="Content" ObjectID="_1823416847" r:id="rId25"/>
+                    <o:OLEObject Type="Embed" ProgID="Visio.Drawing.15" ShapeID="_x0000_i1025" DrawAspect="Content" ObjectID="_1823418823" r:id="rId25"/>
                   </w:object>
                 </w:r>
               </w:p>
@@ -3567,7 +3565,7 @@
                     <v:shape id="_x0000_i1026" type="#_x0000_t75" style="width:116.95pt;height:114.05pt" o:ole="">
                       <v:imagedata r:id="rId26" o:title=""/>
                     </v:shape>
-                    <o:OLEObject Type="Embed" ProgID="Visio.Drawing.15" ShapeID="_x0000_i1026" DrawAspect="Content" ObjectID="_1823416848" r:id="rId27"/>
+                    <o:OLEObject Type="Embed" ProgID="Visio.Drawing.15" ShapeID="_x0000_i1026" DrawAspect="Content" ObjectID="_1823418824" r:id="rId27"/>
                   </w:object>
                 </w:r>
               </w:p>
@@ -3624,14 +3622,14 @@
           <w:b w:val="0"/>
         </w:rPr>
       </w:pPr>
-      <w:bookmarkStart w:id="26" w:name="_Toc192780019"/>
+      <w:bookmarkStart w:id="25" w:name="_Toc192780019"/>
       <w:r>
         <w:rPr>
           <w:b w:val="0"/>
         </w:rPr>
         <w:t>Hardware Block Diagram</w:t>
       </w:r>
-      <w:bookmarkEnd w:id="26"/>
+      <w:bookmarkEnd w:id="25"/>
       <w:r>
         <w:rPr>
           <w:b w:val="0"/>
@@ -3757,9 +3755,9 @@
       <w:pPr>
         <w:pStyle w:val="Body"/>
       </w:pPr>
-      <w:bookmarkStart w:id="27" w:name="_Hlk190961414"/>
-    </w:p>
-    <w:bookmarkEnd w:id="27" w:displacedByCustomXml="next"/>
+      <w:bookmarkStart w:id="26" w:name="_Hlk190961414"/>
+    </w:p>
+    <w:bookmarkEnd w:id="26" w:displacedByCustomXml="next"/>
     <w:sdt>
       <w:sdtPr>
         <w:rPr>
@@ -3892,7 +3890,7 @@
           <w:lang w:eastAsia="de-DE"/>
         </w:rPr>
       </w:pPr>
-      <w:bookmarkStart w:id="28" w:name="_Toc192780021"/>
+      <w:bookmarkStart w:id="27" w:name="_Toc192780021"/>
       <w:r>
         <w:rPr>
           <w:b/>
@@ -3903,7 +3901,7 @@
         </w:rPr>
         <w:t>Project Creation</w:t>
       </w:r>
-      <w:bookmarkEnd w:id="28"/>
+      <w:bookmarkEnd w:id="27"/>
       <w:r>
         <w:rPr>
           <w:b/>
@@ -8634,13 +8632,55 @@
         <w:rPr>
           <w:lang w:eastAsia="de-DE"/>
         </w:rPr>
-        <w:t>Y</w:t>
-      </w:r>
-      <w:r>
-        <w:rPr>
-          <w:lang w:eastAsia="de-DE"/>
-        </w:rPr>
-        <w:t>ou can see the pin definitions and aliases. And the change we have made has been reflected</w:t>
+        <w:t xml:space="preserve">The </w:t>
+      </w:r>
+      <w:proofErr w:type="spellStart"/>
+      <w:r>
+        <w:rPr>
+          <w:lang w:eastAsia="de-DE"/>
+        </w:rPr>
+        <w:t>cycfg_pins.h</w:t>
+      </w:r>
+      <w:proofErr w:type="spellEnd"/>
+      <w:r>
+        <w:rPr>
+          <w:lang w:eastAsia="de-DE"/>
+        </w:rPr>
+        <w:t xml:space="preserve"> file, along with all source files that get generated by the Device Configurator can be found </w:t>
+      </w:r>
+      <w:proofErr w:type="spellStart"/>
+      <w:r>
+        <w:rPr>
+          <w:lang w:eastAsia="de-DE"/>
+        </w:rPr>
+        <w:t>GenerateSouce</w:t>
+      </w:r>
+      <w:proofErr w:type="spellEnd"/>
+      <w:r>
+        <w:rPr>
+          <w:lang w:eastAsia="de-DE"/>
+        </w:rPr>
+        <w:t xml:space="preserve"> folder under with the application’s </w:t>
+      </w:r>
+      <w:proofErr w:type="spellStart"/>
+      <w:r>
+        <w:rPr>
+          <w:lang w:eastAsia="de-DE"/>
+        </w:rPr>
+        <w:t>bsps</w:t>
+      </w:r>
+      <w:proofErr w:type="spellEnd"/>
+      <w:r>
+        <w:rPr>
+          <w:lang w:eastAsia="de-DE"/>
+        </w:rPr>
+        <w:t xml:space="preserve"> folder tree. Figure shows the update.</w:t>
+      </w:r>
+      <w:r>
+        <w:rPr>
+          <w:lang w:eastAsia="de-DE"/>
+        </w:rPr>
+        <w:t xml:space="preserve"> can see the pin definitions and aliases. And the change we have made has been reflected</w:t>
       </w:r>
       <w:r>
         <w:rPr>
@@ -8677,77 +8717,300 @@
         </w:rPr>
       </w:pPr>
     </w:p>
+    <w:sdt>
+      <w:sdtPr>
+        <w:alias w:val="mioTextBlock"/>
+        <w:tag w:val="a66b21ad-0144-491d-8113-427d4f6ce595"/>
+        <w:id w:val="1180855555"/>
+        <w:placeholder>
+          <w:docPart w:val="DefaultPlaceholder_-1854013440"/>
+        </w:placeholder>
+        <w15:appearance w15:val="hidden"/>
+      </w:sdtPr>
+      <w:sdtEndPr>
+        <w:rPr>
+          <w:b/>
+        </w:rPr>
+      </w:sdtEndPr>
+      <w:sdtContent>
+        <w:tbl>
+          <w:tblPr>
+            <w:tblStyle w:val="InfineonPicture"/>
+            <w:tblW w:w="5000" w:type="pct"/>
+            <w:tblCellMar>
+              <w:left w:w="0" w:type="dxa"/>
+              <w:right w:w="0" w:type="dxa"/>
+            </w:tblCellMar>
+            <w:tblLook w:val="05E0" w:firstRow="1" w:lastRow="1" w:firstColumn="1" w:lastColumn="1" w:noHBand="0" w:noVBand="1"/>
+          </w:tblPr>
+          <w:tblGrid>
+            <w:gridCol w:w="10196"/>
+          </w:tblGrid>
+          <w:tr>
+            <w:tc>
+              <w:tcPr>
+                <w:tcW w:w="5000" w:type="pct"/>
+              </w:tcPr>
+              <w:p>
+                <w:pPr>
+                  <w:pStyle w:val="TableCell-c"/>
+                </w:pPr>
+                <w:r>
+                  <w:rPr>
+                    <w:noProof/>
+                  </w:rPr>
+                  <w:drawing>
+                    <wp:inline distT="0" distB="0" distL="0" distR="0" wp14:anchorId="466095AD" wp14:editId="28A7B37E">
+                      <wp:extent cx="2135362" cy="3539376"/>
+                      <wp:effectExtent l="0" t="0" r="0" b="4445"/>
+                      <wp:docPr id="24" name="Picture 24"/>
+                      <wp:cNvGraphicFramePr>
+                        <a:graphicFrameLocks xmlns:a="http://schemas.openxmlformats.org/drawingml/2006/main" noChangeAspect="1"/>
+                      </wp:cNvGraphicFramePr>
+                      <a:graphic xmlns:a="http://schemas.openxmlformats.org/drawingml/2006/main">
+                        <a:graphicData uri="http://schemas.openxmlformats.org/drawingml/2006/picture">
+                          <pic:pic xmlns:pic="http://schemas.openxmlformats.org/drawingml/2006/picture">
+                            <pic:nvPicPr>
+                              <pic:cNvPr id="0" name="Picture 1" descr="Drawing_Placeholder"/>
+                              <pic:cNvPicPr>
+                                <a:picLocks noChangeAspect="1" noChangeArrowheads="1"/>
+                              </pic:cNvPicPr>
+                            </pic:nvPicPr>
+                            <pic:blipFill>
+                              <a:blip r:embed="rId48">
+                                <a:extLst>
+                                  <a:ext uri="{28A0092B-C50C-407E-A947-70E740481C1C}">
+                                    <a14:useLocalDpi xmlns:a14="http://schemas.microsoft.com/office/drawing/2010/main" val="0"/>
+                                  </a:ext>
+                                </a:extLst>
+                              </a:blip>
+                              <a:stretch>
+                                <a:fillRect/>
+                              </a:stretch>
+                            </pic:blipFill>
+                            <pic:spPr bwMode="auto">
+                              <a:xfrm>
+                                <a:off x="0" y="0"/>
+                                <a:ext cx="2149902" cy="3563477"/>
+                              </a:xfrm>
+                              <a:prstGeom prst="rect">
+                                <a:avLst/>
+                              </a:prstGeom>
+                              <a:noFill/>
+                              <a:ln>
+                                <a:noFill/>
+                              </a:ln>
+                            </pic:spPr>
+                          </pic:pic>
+                        </a:graphicData>
+                      </a:graphic>
+                    </wp:inline>
+                  </w:drawing>
+                </w:r>
+              </w:p>
+            </w:tc>
+          </w:tr>
+        </w:tbl>
+        <w:p>
+          <w:pPr>
+            <w:pStyle w:val="Figuretitlenew"/>
+            <w:rPr>
+              <w:lang w:eastAsia="de-DE"/>
+            </w:rPr>
+          </w:pPr>
+          <w:r>
+            <w:t xml:space="preserve">Figure </w:t>
+          </w:r>
+          <w:r>
+            <w:fldChar w:fldCharType="begin"/>
+          </w:r>
+          <w:r>
+            <w:instrText xml:space="preserve"> SEQ Figure \* ARABIC </w:instrText>
+          </w:r>
+          <w:r>
+            <w:fldChar w:fldCharType="separate"/>
+          </w:r>
+          <w:r>
+            <w:rPr>
+              <w:noProof/>
+            </w:rPr>
+            <w:t>22</w:t>
+          </w:r>
+          <w:r>
+            <w:fldChar w:fldCharType="end"/>
+          </w:r>
+          <w:r>
+            <w:tab/>
+          </w:r>
+          <w:r>
+            <w:t xml:space="preserve">Device Configurator </w:t>
+          </w:r>
+          <w:proofErr w:type="spellStart"/>
+          <w:r>
+            <w:rPr>
+              <w:i/>
+            </w:rPr>
+            <w:t>GeneratedSource</w:t>
+          </w:r>
+          <w:proofErr w:type="spellEnd"/>
+          <w:r>
+            <w:t xml:space="preserve"> folder location with </w:t>
+          </w:r>
+          <w:proofErr w:type="spellStart"/>
+          <w:r>
+            <w:t>cycfg_pins.h</w:t>
+          </w:r>
+          <w:proofErr w:type="spellEnd"/>
+        </w:p>
+        <w:bookmarkStart w:id="28" w:name="_GoBack" w:displacedByCustomXml="next"/>
+        <w:bookmarkEnd w:id="28" w:displacedByCustomXml="next"/>
+      </w:sdtContent>
+    </w:sdt>
     <w:p>
       <w:pPr>
         <w:pStyle w:val="ListParagraph"/>
         <w:spacing w:before="160" w:after="160"/>
         <w:ind w:left="1778"/>
-        <w:jc w:val="center"/>
-        <w:rPr>
-          <w:lang w:eastAsia="de-DE"/>
-        </w:rPr>
-      </w:pPr>
-      <w:r>
-        <w:rPr>
-          <w:noProof/>
-        </w:rPr>
-        <w:drawing>
-          <wp:inline distT="0" distB="0" distL="0" distR="0" wp14:anchorId="67FD060E" wp14:editId="70DE2651">
-            <wp:extent cx="2587244" cy="2446804"/>
-            <wp:effectExtent l="0" t="0" r="3810" b="0"/>
-            <wp:docPr id="79" name="Picture 79"/>
-            <wp:cNvGraphicFramePr>
-              <a:graphicFrameLocks xmlns:a="http://schemas.openxmlformats.org/drawingml/2006/main" noChangeAspect="1"/>
-            </wp:cNvGraphicFramePr>
-            <a:graphic xmlns:a="http://schemas.openxmlformats.org/drawingml/2006/main">
-              <a:graphicData uri="http://schemas.openxmlformats.org/drawingml/2006/picture">
-                <pic:pic xmlns:pic="http://schemas.openxmlformats.org/drawingml/2006/picture">
-                  <pic:nvPicPr>
-                    <pic:cNvPr id="1" name=""/>
-                    <pic:cNvPicPr/>
-                  </pic:nvPicPr>
-                  <pic:blipFill>
-                    <a:blip r:embed="rId48"/>
-                    <a:stretch>
-                      <a:fillRect/>
-                    </a:stretch>
-                  </pic:blipFill>
-                  <pic:spPr>
-                    <a:xfrm>
-                      <a:off x="0" y="0"/>
-                      <a:ext cx="2611689" cy="2469922"/>
-                    </a:xfrm>
-                    <a:prstGeom prst="rect">
-                      <a:avLst/>
-                    </a:prstGeom>
-                  </pic:spPr>
-                </pic:pic>
-              </a:graphicData>
-            </a:graphic>
-          </wp:inline>
-        </w:drawing>
-      </w:r>
-    </w:p>
-    <w:p>
-      <w:pPr>
-        <w:pStyle w:val="ListParagraph"/>
-        <w:spacing w:before="160" w:after="160"/>
-        <w:ind w:left="1778"/>
-        <w:rPr>
-          <w:lang w:eastAsia="de-DE"/>
-        </w:rPr>
-      </w:pPr>
-    </w:p>
-    <w:p>
-      <w:pPr>
-        <w:pStyle w:val="ListParagraph"/>
-        <w:spacing w:before="160" w:after="160"/>
-        <w:ind w:left="1778"/>
-        <w:rPr>
-          <w:lang w:eastAsia="de-DE"/>
-        </w:rPr>
-      </w:pPr>
-    </w:p>
+        <w:rPr>
+          <w:lang w:eastAsia="de-DE"/>
+        </w:rPr>
+      </w:pPr>
+    </w:p>
+    <w:sdt>
+      <w:sdtPr>
+        <w:alias w:val="mioTextBlock"/>
+        <w:tag w:val="ecb1fa45-7d29-42fa-802c-9eb01844da74"/>
+        <w:id w:val="213548026"/>
+        <w:placeholder>
+          <w:docPart w:val="DefaultPlaceholder_-1854013440"/>
+        </w:placeholder>
+        <w15:appearance w15:val="hidden"/>
+      </w:sdtPr>
+      <w:sdtEndPr>
+        <w:rPr>
+          <w:b/>
+        </w:rPr>
+      </w:sdtEndPr>
+      <w:sdtContent>
+        <w:tbl>
+          <w:tblPr>
+            <w:tblStyle w:val="InfineonPicture"/>
+            <w:tblW w:w="5000" w:type="pct"/>
+            <w:tblCellMar>
+              <w:left w:w="0" w:type="dxa"/>
+              <w:right w:w="0" w:type="dxa"/>
+            </w:tblCellMar>
+            <w:tblLook w:val="05E0" w:firstRow="1" w:lastRow="1" w:firstColumn="1" w:lastColumn="1" w:noHBand="0" w:noVBand="1"/>
+          </w:tblPr>
+          <w:tblGrid>
+            <w:gridCol w:w="10196"/>
+          </w:tblGrid>
+          <w:tr>
+            <w:tc>
+              <w:tcPr>
+                <w:tcW w:w="5000" w:type="pct"/>
+              </w:tcPr>
+              <w:p>
+                <w:pPr>
+                  <w:pStyle w:val="TableCell-c"/>
+                </w:pPr>
+                <w:r>
+                  <w:rPr>
+                    <w:noProof/>
+                  </w:rPr>
+                  <w:drawing>
+                    <wp:inline distT="0" distB="0" distL="0" distR="0" wp14:anchorId="3906919A" wp14:editId="4C0C8C79">
+                      <wp:extent cx="4717377" cy="3076190"/>
+                      <wp:effectExtent l="0" t="0" r="7620" b="0"/>
+                      <wp:docPr id="79" name="Picture 79"/>
+                      <wp:cNvGraphicFramePr>
+                        <a:graphicFrameLocks xmlns:a="http://schemas.openxmlformats.org/drawingml/2006/main" noChangeAspect="1"/>
+                      </wp:cNvGraphicFramePr>
+                      <a:graphic xmlns:a="http://schemas.openxmlformats.org/drawingml/2006/main">
+                        <a:graphicData uri="http://schemas.openxmlformats.org/drawingml/2006/picture">
+                          <pic:pic xmlns:pic="http://schemas.openxmlformats.org/drawingml/2006/picture">
+                            <pic:nvPicPr>
+                              <pic:cNvPr id="1" name=""/>
+                              <pic:cNvPicPr/>
+                            </pic:nvPicPr>
+                            <pic:blipFill>
+                              <a:blip r:embed="rId49" cstate="print">
+                                <a:extLst>
+                                  <a:ext uri="{28A0092B-C50C-407E-A947-70E740481C1C}">
+                                    <a14:useLocalDpi xmlns:a14="http://schemas.microsoft.com/office/drawing/2010/main" val="0"/>
+                                  </a:ext>
+                                </a:extLst>
+                              </a:blip>
+                              <a:stretch>
+                                <a:fillRect/>
+                              </a:stretch>
+                            </pic:blipFill>
+                            <pic:spPr>
+                              <a:xfrm>
+                                <a:off x="0" y="0"/>
+                                <a:ext cx="4728170" cy="3083228"/>
+                              </a:xfrm>
+                              <a:prstGeom prst="rect">
+                                <a:avLst/>
+                              </a:prstGeom>
+                            </pic:spPr>
+                          </pic:pic>
+                        </a:graphicData>
+                      </a:graphic>
+                    </wp:inline>
+                  </w:drawing>
+                </w:r>
+              </w:p>
+            </w:tc>
+          </w:tr>
+        </w:tbl>
+        <w:p>
+          <w:pPr>
+            <w:pStyle w:val="Figuretitlenew"/>
+            <w:rPr>
+              <w:lang w:eastAsia="de-DE"/>
+            </w:rPr>
+          </w:pPr>
+          <w:r>
+            <w:t xml:space="preserve">Figure </w:t>
+          </w:r>
+          <w:r>
+            <w:fldChar w:fldCharType="begin"/>
+          </w:r>
+          <w:r>
+            <w:instrText xml:space="preserve"> SEQ Figure \* ARABIC </w:instrText>
+          </w:r>
+          <w:r>
+            <w:fldChar w:fldCharType="separate"/>
+          </w:r>
+          <w:r>
+            <w:rPr>
+              <w:noProof/>
+            </w:rPr>
+            <w:t>22</w:t>
+          </w:r>
+          <w:r>
+            <w:fldChar w:fldCharType="end"/>
+          </w:r>
+          <w:r>
+            <w:tab/>
+          </w:r>
+          <w:proofErr w:type="spellStart"/>
+          <w:r>
+            <w:t>Training_LED</w:t>
+          </w:r>
+          <w:proofErr w:type="spellEnd"/>
+          <w:r>
+            <w:t xml:space="preserve"> Alias in </w:t>
+          </w:r>
+          <w:proofErr w:type="spellStart"/>
+          <w:r>
+            <w:t>cycfg_pins.h</w:t>
+          </w:r>
+          <w:proofErr w:type="spellEnd"/>
+        </w:p>
+      </w:sdtContent>
+    </w:sdt>
     <w:p>
       <w:pPr>
         <w:pStyle w:val="ListParagraph"/>
@@ -9168,7 +9431,7 @@
                     <pic:cNvPicPr/>
                   </pic:nvPicPr>
                   <pic:blipFill>
-                    <a:blip r:embed="rId49">
+                    <a:blip r:embed="rId50">
                       <a:extLst>
                         <a:ext uri="{28A0092B-C50C-407E-A947-70E740481C1C}">
                           <a14:useLocalDpi xmlns:a14="http://schemas.microsoft.com/office/drawing/2010/main" val="0"/>
@@ -9317,7 +9580,7 @@
                     </pic:cNvPicPr>
                   </pic:nvPicPr>
                   <pic:blipFill>
-                    <a:blip r:embed="rId50" cstate="print">
+                    <a:blip r:embed="rId51" cstate="print">
                       <a:extLst>
                         <a:ext uri="{28A0092B-C50C-407E-A947-70E740481C1C}">
                           <a14:useLocalDpi xmlns:a14="http://schemas.microsoft.com/office/drawing/2010/main" val="0"/>
@@ -9382,7 +9645,7 @@
                     </pic:cNvPicPr>
                   </pic:nvPicPr>
                   <pic:blipFill>
-                    <a:blip r:embed="rId51" cstate="print">
+                    <a:blip r:embed="rId52" cstate="print">
                       <a:extLst>
                         <a:ext uri="{28A0092B-C50C-407E-A947-70E740481C1C}">
                           <a14:useLocalDpi xmlns:a14="http://schemas.microsoft.com/office/drawing/2010/main" val="0"/>
@@ -10012,7 +10275,7 @@
         </w:rPr>
         <w:t xml:space="preserve"> will be available in HAL documentation </w:t>
       </w:r>
-      <w:hyperlink r:id="rId52" w:history="1">
+      <w:hyperlink r:id="rId53" w:history="1">
         <w:r>
           <w:rPr>
             <w:rStyle w:val="Hyperlink"/>
@@ -10114,7 +10377,7 @@
                     <pic:cNvPicPr/>
                   </pic:nvPicPr>
                   <pic:blipFill>
-                    <a:blip r:embed="rId53"/>
+                    <a:blip r:embed="rId54"/>
                     <a:stretch>
                       <a:fillRect/>
                     </a:stretch>
@@ -16177,7 +16440,7 @@
                     <pic:cNvPicPr/>
                   </pic:nvPicPr>
                   <pic:blipFill>
-                    <a:blip r:embed="rId54">
+                    <a:blip r:embed="rId55">
                       <a:extLst>
                         <a:ext uri="{28A0092B-C50C-407E-A947-70E740481C1C}">
                           <a14:useLocalDpi xmlns:a14="http://schemas.microsoft.com/office/drawing/2010/main" val="0"/>
@@ -16311,7 +16574,7 @@
                     <pic:cNvPicPr/>
                   </pic:nvPicPr>
                   <pic:blipFill>
-                    <a:blip r:embed="rId55">
+                    <a:blip r:embed="rId56">
                       <a:extLst>
                         <a:ext uri="{28A0092B-C50C-407E-A947-70E740481C1C}">
                           <a14:useLocalDpi xmlns:a14="http://schemas.microsoft.com/office/drawing/2010/main" val="0"/>
@@ -16419,7 +16682,7 @@
                     <pic:cNvPicPr/>
                   </pic:nvPicPr>
                   <pic:blipFill>
-                    <a:blip r:embed="rId56"/>
+                    <a:blip r:embed="rId57"/>
                     <a:stretch>
                       <a:fillRect/>
                     </a:stretch>
@@ -16779,7 +17042,7 @@
                     <pic:cNvPicPr/>
                   </pic:nvPicPr>
                   <pic:blipFill>
-                    <a:blip r:embed="rId57"/>
+                    <a:blip r:embed="rId58"/>
                     <a:stretch>
                       <a:fillRect/>
                     </a:stretch>
@@ -16861,7 +17124,7 @@
                     <pic:cNvPicPr/>
                   </pic:nvPicPr>
                   <pic:blipFill>
-                    <a:blip r:embed="rId58">
+                    <a:blip r:embed="rId59">
                       <a:extLst>
                         <a:ext uri="{28A0092B-C50C-407E-A947-70E740481C1C}">
                           <a14:useLocalDpi xmlns:a14="http://schemas.microsoft.com/office/drawing/2010/main" val="0"/>
@@ -16931,7 +17194,7 @@
                     </pic:cNvPicPr>
                   </pic:nvPicPr>
                   <pic:blipFill>
-                    <a:blip r:embed="rId59">
+                    <a:blip r:embed="rId60">
                       <a:extLst>
                         <a:ext uri="{28A0092B-C50C-407E-A947-70E740481C1C}">
                           <a14:useLocalDpi xmlns:a14="http://schemas.microsoft.com/office/drawing/2010/main" val="0"/>
@@ -17003,7 +17266,7 @@
                     <pic:cNvPicPr/>
                   </pic:nvPicPr>
                   <pic:blipFill>
-                    <a:blip r:embed="rId60"/>
+                    <a:blip r:embed="rId61"/>
                     <a:stretch>
                       <a:fillRect/>
                     </a:stretch>
@@ -17187,7 +17450,7 @@
                     </pic:cNvPicPr>
                   </pic:nvPicPr>
                   <pic:blipFill>
-                    <a:blip r:embed="rId61">
+                    <a:blip r:embed="rId62">
                       <a:extLst>
                         <a:ext uri="{28A0092B-C50C-407E-A947-70E740481C1C}">
                           <a14:useLocalDpi xmlns:a14="http://schemas.microsoft.com/office/drawing/2010/main" val="0"/>
@@ -17299,7 +17562,7 @@
                     </pic:cNvPicPr>
                   </pic:nvPicPr>
                   <pic:blipFill>
-                    <a:blip r:embed="rId62" cstate="print">
+                    <a:blip r:embed="rId63" cstate="print">
                       <a:extLst>
                         <a:ext uri="{28A0092B-C50C-407E-A947-70E740481C1C}">
                           <a14:useLocalDpi xmlns:a14="http://schemas.microsoft.com/office/drawing/2010/main" val="0"/>
@@ -17541,7 +17804,7 @@
                     </pic:cNvPicPr>
                   </pic:nvPicPr>
                   <pic:blipFill>
-                    <a:blip r:embed="rId63" cstate="print">
+                    <a:blip r:embed="rId64" cstate="print">
                       <a:extLst>
                         <a:ext uri="{28A0092B-C50C-407E-A947-70E740481C1C}">
                           <a14:useLocalDpi xmlns:a14="http://schemas.microsoft.com/office/drawing/2010/main" val="0"/>
@@ -17630,7 +17893,7 @@
                     </pic:cNvPicPr>
                   </pic:nvPicPr>
                   <pic:blipFill>
-                    <a:blip r:embed="rId64">
+                    <a:blip r:embed="rId65">
                       <a:extLst>
                         <a:ext uri="{28A0092B-C50C-407E-A947-70E740481C1C}">
                           <a14:useLocalDpi xmlns:a14="http://schemas.microsoft.com/office/drawing/2010/main" val="0"/>
@@ -17757,7 +18020,7 @@
                     </pic:cNvPicPr>
                   </pic:nvPicPr>
                   <pic:blipFill>
-                    <a:blip r:embed="rId65">
+                    <a:blip r:embed="rId66">
                       <a:extLst>
                         <a:ext uri="{28A0092B-C50C-407E-A947-70E740481C1C}">
                           <a14:useLocalDpi xmlns:a14="http://schemas.microsoft.com/office/drawing/2010/main" val="0"/>
@@ -17930,7 +18193,7 @@
                     </pic:cNvPicPr>
                   </pic:nvPicPr>
                   <pic:blipFill>
-                    <a:blip r:embed="rId66">
+                    <a:blip r:embed="rId67">
                       <a:extLst>
                         <a:ext uri="{28A0092B-C50C-407E-A947-70E740481C1C}">
                           <a14:useLocalDpi xmlns:a14="http://schemas.microsoft.com/office/drawing/2010/main" val="0"/>
@@ -18121,7 +18384,7 @@
                     </pic:cNvPicPr>
                   </pic:nvPicPr>
                   <pic:blipFill>
-                    <a:blip r:embed="rId67">
+                    <a:blip r:embed="rId68">
                       <a:extLst>
                         <a:ext uri="{28A0092B-C50C-407E-A947-70E740481C1C}">
                           <a14:useLocalDpi xmlns:a14="http://schemas.microsoft.com/office/drawing/2010/main" val="0"/>
@@ -18237,7 +18500,7 @@
                     </pic:cNvPicPr>
                   </pic:nvPicPr>
                   <pic:blipFill>
-                    <a:blip r:embed="rId68" cstate="print">
+                    <a:blip r:embed="rId69" cstate="print">
                       <a:extLst>
                         <a:ext uri="{28A0092B-C50C-407E-A947-70E740481C1C}">
                           <a14:useLocalDpi xmlns:a14="http://schemas.microsoft.com/office/drawing/2010/main" val="0"/>
@@ -18660,7 +18923,7 @@
                     </pic:cNvPicPr>
                   </pic:nvPicPr>
                   <pic:blipFill>
-                    <a:blip r:embed="rId69">
+                    <a:blip r:embed="rId70">
                       <a:extLst>
                         <a:ext uri="{28A0092B-C50C-407E-A947-70E740481C1C}">
                           <a14:useLocalDpi xmlns:a14="http://schemas.microsoft.com/office/drawing/2010/main" val="0"/>
@@ -18808,7 +19071,7 @@
                     </pic:cNvPicPr>
                   </pic:nvPicPr>
                   <pic:blipFill>
-                    <a:blip r:embed="rId70">
+                    <a:blip r:embed="rId71">
                       <a:extLst>
                         <a:ext uri="{28A0092B-C50C-407E-A947-70E740481C1C}">
                           <a14:useLocalDpi xmlns:a14="http://schemas.microsoft.com/office/drawing/2010/main" val="0"/>
@@ -18925,7 +19188,7 @@
                     <pic:cNvPicPr/>
                   </pic:nvPicPr>
                   <pic:blipFill>
-                    <a:blip r:embed="rId71"/>
+                    <a:blip r:embed="rId72"/>
                     <a:stretch>
                       <a:fillRect/>
                     </a:stretch>
@@ -19049,7 +19312,7 @@
                     </pic:cNvPicPr>
                   </pic:nvPicPr>
                   <pic:blipFill>
-                    <a:blip r:embed="rId72">
+                    <a:blip r:embed="rId73">
                       <a:extLst>
                         <a:ext uri="{28A0092B-C50C-407E-A947-70E740481C1C}">
                           <a14:useLocalDpi xmlns:a14="http://schemas.microsoft.com/office/drawing/2010/main" val="0"/>
@@ -19174,7 +19437,7 @@
                     <pic:cNvPicPr/>
                   </pic:nvPicPr>
                   <pic:blipFill>
-                    <a:blip r:embed="rId71"/>
+                    <a:blip r:embed="rId72"/>
                     <a:stretch>
                       <a:fillRect/>
                     </a:stretch>
@@ -19282,7 +19545,7 @@
                     </pic:cNvPicPr>
                   </pic:nvPicPr>
                   <pic:blipFill>
-                    <a:blip r:embed="rId73">
+                    <a:blip r:embed="rId74">
                       <a:extLst>
                         <a:ext uri="{28A0092B-C50C-407E-A947-70E740481C1C}">
                           <a14:useLocalDpi xmlns:a14="http://schemas.microsoft.com/office/drawing/2010/main" val="0"/>
@@ -27660,7 +27923,7 @@
                     </pic:cNvPicPr>
                   </pic:nvPicPr>
                   <pic:blipFill>
-                    <a:blip r:embed="rId74">
+                    <a:blip r:embed="rId75">
                       <a:extLst>
                         <a:ext uri="{28A0092B-C50C-407E-A947-70E740481C1C}">
                           <a14:useLocalDpi xmlns:a14="http://schemas.microsoft.com/office/drawing/2010/main" val="0"/>
@@ -34538,7 +34801,7 @@
                     </pic:cNvPicPr>
                   </pic:nvPicPr>
                   <pic:blipFill>
-                    <a:blip r:embed="rId75">
+                    <a:blip r:embed="rId76">
                       <a:extLst>
                         <a:ext uri="{28A0092B-C50C-407E-A947-70E740481C1C}">
                           <a14:useLocalDpi xmlns:a14="http://schemas.microsoft.com/office/drawing/2010/main" val="0"/>
@@ -34693,7 +34956,7 @@
                     </pic:cNvPicPr>
                   </pic:nvPicPr>
                   <pic:blipFill>
-                    <a:blip r:embed="rId76">
+                    <a:blip r:embed="rId77">
                       <a:extLst>
                         <a:ext uri="{28A0092B-C50C-407E-A947-70E740481C1C}">
                           <a14:useLocalDpi xmlns:a14="http://schemas.microsoft.com/office/drawing/2010/main" val="0"/>
@@ -34883,7 +35146,7 @@
                     <pic:cNvPicPr/>
                   </pic:nvPicPr>
                   <pic:blipFill>
-                    <a:blip r:embed="rId77">
+                    <a:blip r:embed="rId78">
                       <a:extLst>
                         <a:ext uri="{28A0092B-C50C-407E-A947-70E740481C1C}">
                           <a14:useLocalDpi xmlns:a14="http://schemas.microsoft.com/office/drawing/2010/main" val="0"/>
@@ -35049,7 +35312,7 @@
           <w:lang w:eastAsia="de-DE"/>
         </w:rPr>
       </w:pPr>
-      <w:hyperlink r:id="rId78" w:history="1">
+      <w:hyperlink r:id="rId79" w:history="1">
         <w:r>
           <w:rPr>
             <w:rStyle w:val="Hyperlink"/>
@@ -35097,7 +35360,7 @@
           <w:b w:val="0"/>
         </w:rPr>
         <w:sectPr>
-          <w:headerReference w:type="default" r:id="rId79"/>
+          <w:headerReference w:type="default" r:id="rId80"/>
           <w:footnotePr>
             <w:numRestart w:val="eachPage"/>
           </w:footnotePr>
@@ -35122,9 +35385,9 @@
       <w:pPr>
         <w:pStyle w:val="Body"/>
         <w:sectPr>
-          <w:headerReference w:type="even" r:id="rId80"/>
-          <w:headerReference w:type="default" r:id="rId81"/>
-          <w:footerReference w:type="default" r:id="rId82"/>
+          <w:headerReference w:type="even" r:id="rId81"/>
+          <w:headerReference w:type="default" r:id="rId82"/>
+          <w:footerReference w:type="default" r:id="rId83"/>
           <w:footnotePr>
             <w:numRestart w:val="eachPage"/>
           </w:footnotePr>
@@ -35147,9 +35410,9 @@
     </w:p>
     <w:p/>
     <w:sectPr>
-      <w:headerReference w:type="even" r:id="rId83"/>
-      <w:headerReference w:type="default" r:id="rId84"/>
-      <w:footerReference w:type="default" r:id="rId85"/>
+      <w:headerReference w:type="even" r:id="rId84"/>
+      <w:headerReference w:type="default" r:id="rId85"/>
+      <w:footerReference w:type="default" r:id="rId86"/>
       <w:footnotePr>
         <w:numRestart w:val="eachPage"/>
       </w:footnotePr>
@@ -35166,7 +35429,7 @@
 
 <file path=word/comments.xml><?xml version="1.0" encoding="utf-8"?>
 <w:comments xmlns:wpc="http://schemas.microsoft.com/office/word/2010/wordprocessingCanvas" xmlns:cx="http://schemas.microsoft.com/office/drawing/2014/chartex" xmlns:cx1="http://schemas.microsoft.com/office/drawing/2015/9/8/chartex" xmlns:cx2="http://schemas.microsoft.com/office/drawing/2015/10/21/chartex" xmlns:cx3="http://schemas.microsoft.com/office/drawing/2016/5/9/chartex" xmlns:cx4="http://schemas.microsoft.com/office/drawing/2016/5/10/chartex" xmlns:cx5="http://schemas.microsoft.com/office/drawing/2016/5/11/chartex" xmlns:cx6="http://schemas.microsoft.com/office/drawing/2016/5/12/chartex" xmlns:cx7="http://schemas.microsoft.com/office/drawing/2016/5/13/chartex" xmlns:cx8="http://schemas.microsoft.com/office/drawing/2016/5/14/chartex" xmlns:mc="http://schemas.openxmlformats.org/markup-compatibility/2006" xmlns:aink="http://schemas.microsoft.com/office/drawing/2016/ink" xmlns:am3d="http://schemas.microsoft.com/office/drawing/2017/model3d" xmlns:o="urn:schemas-microsoft-com:office:office" xmlns:r="http://schemas.openxmlformats.org/officeDocument/2006/relationships" xmlns:m="http://schemas.openxmlformats.org/officeDocument/2006/math" xmlns:v="urn:schemas-microsoft-com:vml" xmlns:wp14="http://schemas.microsoft.com/office/word/2010/wordprocessingDrawing" xmlns:wp="http://schemas.openxmlformats.org/drawingml/2006/wordprocessingDrawing" xmlns:w10="urn:schemas-microsoft-com:office:word" xmlns:w="http://schemas.openxmlformats.org/wordprocessingml/2006/main" xmlns:w14="http://schemas.microsoft.com/office/word/2010/wordml" xmlns:w15="http://schemas.microsoft.com/office/word/2012/wordml" xmlns:w16cid="http://schemas.microsoft.com/office/word/2016/wordml/cid" xmlns:w16se="http://schemas.microsoft.com/office/word/2015/wordml/symex" xmlns:wpg="http://schemas.microsoft.com/office/word/2010/wordprocessingGroup" xmlns:wpi="http://schemas.microsoft.com/office/word/2010/wordprocessingInk" xmlns:wne="http://schemas.microsoft.com/office/word/2006/wordml" xmlns:wps="http://schemas.microsoft.com/office/word/2010/wordprocessingShape" mc:Ignorable="w14 w15 w16se w16cid wp14">
-  <w:comment w:id="18" w:author="Phillips Craig (CSS ICW MCU APP CES)" w:date="2025-10-22T08:27:00Z" w:initials="PC(IMAC">
+  <w:comment w:id="17" w:author="Phillips Craig (CSS ICW MCU APP CES)" w:date="2025-10-22T08:27:00Z" w:initials="PC(IMAC">
     <w:p>
       <w:pPr>
         <w:pStyle w:val="CommentText"/>
@@ -35182,7 +35445,7 @@
       </w:r>
     </w:p>
   </w:comment>
-  <w:comment w:id="19" w:author="Phillips Craig (CSS ICW MCU APP CES)" w:date="2025-10-22T08:28:00Z" w:initials="PC(IMAC">
+  <w:comment w:id="18" w:author="Phillips Craig (CSS ICW MCU APP CES)" w:date="2025-10-22T08:28:00Z" w:initials="PC(IMAC">
     <w:p>
       <w:pPr>
         <w:pStyle w:val="CommentText"/>
@@ -35195,26 +35458,26 @@
       </w:r>
       <w:r>
         <w:t>Tera Term instruction link is dead</w:t>
+      </w:r>
+    </w:p>
+  </w:comment>
+  <w:comment w:id="19" w:author="Phillips Craig (CSS ICW MCU APP CES)" w:date="2025-10-22T08:41:00Z" w:initials="PC(IMAC">
+    <w:p>
+      <w:pPr>
+        <w:pStyle w:val="CommentText"/>
+      </w:pPr>
+      <w:r>
+        <w:rPr>
+          <w:rStyle w:val="CommentReference"/>
+        </w:rPr>
+        <w:annotationRef/>
+      </w:r>
+      <w:r>
+        <w:t>Also listed as unwanted on the IFX App Store, maybe we want to switch to PuTTY?</w:t>
       </w:r>
     </w:p>
   </w:comment>
   <w:comment w:id="20" w:author="Phillips Craig (CSS ICW MCU APP CES)" w:date="2025-10-22T08:41:00Z" w:initials="PC(IMAC">
-    <w:p>
-      <w:pPr>
-        <w:pStyle w:val="CommentText"/>
-      </w:pPr>
-      <w:r>
-        <w:rPr>
-          <w:rStyle w:val="CommentReference"/>
-        </w:rPr>
-        <w:annotationRef/>
-      </w:r>
-      <w:r>
-        <w:t>Also listed as unwanted on the IFX App Store, maybe we want to switch to PuTTY?</w:t>
-      </w:r>
-    </w:p>
-  </w:comment>
-  <w:comment w:id="21" w:author="Phillips Craig (CSS ICW MCU APP CES)" w:date="2025-10-22T08:41:00Z" w:initials="PC(IMAC">
     <w:p>
       <w:pPr>
         <w:pStyle w:val="CommentText"/>
@@ -36061,7 +36324,7 @@
         <v:shape id="_x0000_s2052" type="#_x0000_t75" style="position:absolute;margin-left:-45.75pt;margin-top:62.5pt;width:602.45pt;height:287.2pt;z-index:-251642880;mso-position-horizontal-relative:text;mso-position-vertical-relative:text">
           <v:imagedata r:id="rId1" o:title=""/>
         </v:shape>
-        <o:OLEObject Type="Embed" ProgID="Visio.Drawing.15" ShapeID="_x0000_s2052" DrawAspect="Content" ObjectID="_1823416849" r:id="rId2"/>
+        <o:OLEObject Type="Embed" ProgID="Visio.Drawing.15" ShapeID="_x0000_s2052" DrawAspect="Content" ObjectID="_1823418825" r:id="rId2"/>
       </w:object>
     </w:r>
     <w:r>
@@ -37394,7 +37657,7 @@
         <v:shape id="_x0000_s2051" type="#_x0000_t75" style="position:absolute;margin-left:-45.75pt;margin-top:62.5pt;width:602.45pt;height:287.2pt;z-index:-251643904;mso-position-horizontal-relative:text;mso-position-vertical-relative:text">
           <v:imagedata r:id="rId1" o:title=""/>
         </v:shape>
-        <o:OLEObject Type="Embed" ProgID="Visio.Drawing.15" ShapeID="_x0000_s2051" DrawAspect="Content" ObjectID="_1823416850" r:id="rId2"/>
+        <o:OLEObject Type="Embed" ProgID="Visio.Drawing.15" ShapeID="_x0000_s2051" DrawAspect="Content" ObjectID="_1823418826" r:id="rId2"/>
       </w:object>
     </w:r>
     <w:r>
@@ -37763,11 +38026,7 @@
         </mc:Choice>
         <mc:Fallback>
           <w:pict>
-            <v:shapetype w14:anchorId="28316247" id="_x0000_t202" coordsize="21600,21600" o:spt="202" path="m,l,21600r21600,l21600,xe">
-              <v:stroke joinstyle="miter"/>
-              <v:path gradientshapeok="t" o:connecttype="rect"/>
-            </v:shapetype>
-            <v:shape id="_x0000_s1042" type="#_x0000_t202" style="position:absolute;margin-left:40pt;margin-top:575.65pt;width:511.45pt;height:249pt;z-index:251643904;visibility:visible;mso-wrap-style:square;mso-width-percent:0;mso-height-percent:0;mso-wrap-distance-left:9pt;mso-wrap-distance-top:0;mso-wrap-distance-right:9pt;mso-wrap-distance-bottom:0;mso-position-horizontal:absolute;mso-position-horizontal-relative:page;mso-position-vertical:absolute;mso-position-vertical-relative:page;mso-width-percent:0;mso-height-percent:0;mso-width-relative:page;mso-height-relative:page;v-text-anchor:top" o:gfxdata="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" filled="f" stroked="f" strokeweight="0">
+            <v:shape w14:anchorId="28316247" id="_x0000_s1042" type="#_x0000_t202" style="position:absolute;margin-left:40pt;margin-top:575.65pt;width:511.45pt;height:249pt;z-index:251643904;visibility:visible;mso-wrap-style:square;mso-width-percent:0;mso-height-percent:0;mso-wrap-distance-left:9pt;mso-wrap-distance-top:0;mso-wrap-distance-right:9pt;mso-wrap-distance-bottom:0;mso-position-horizontal:absolute;mso-position-horizontal-relative:page;mso-position-vertical:absolute;mso-position-vertical-relative:page;mso-width-percent:0;mso-height-percent:0;mso-width-relative:page;mso-height-relative:page;v-text-anchor:top" o:gfxdata="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" filled="f" stroked="f" strokeweight="0">
               <v:textbox inset="0,0,0,0">
                 <w:txbxContent>
                   <w:tbl>
@@ -48215,7 +48474,7 @@
     <w:charset w:val="00"/>
     <w:family w:val="swiss"/>
     <w:pitch w:val="variable"/>
-    <w:sig w:usb0="E4002EFF" w:usb1="C200247B" w:usb2="00000009" w:usb3="00000000" w:csb0="000001FF" w:csb1="00000000"/>
+    <w:sig w:usb0="E4002EFF" w:usb1="C000247B" w:usb2="00000009" w:usb3="00000000" w:csb0="000001FF" w:csb1="00000000"/>
   </w:font>
 </w:fonts>
 </file>
@@ -49007,151 +49266,6 @@
 </file>
 
 <file path=customXml/item3.xml><?xml version="1.0" encoding="utf-8"?>
-<DocsTemplateContainer xmlns="http://www.made-in-office.com/empower/docs/template/v1">
-  <DocsTextTemplateDictionary/>
-  <DocsImageTemplateDictionary/>
-  <ImageElements/>
-  <TextBlockElements>
-    <TextBlockMetadata>
-      <ElementId>1a622969-9435-42df-b756-4af60deadd4b</ElementId>
-      <ContentTag>YzCqVxr4CkGOIjtz8kQsF1txdvNf0IhJnc8A53W8JnY=</ContentTag>
-      <TimestampUtc>2023-08-07T12:57:01.087Z</TimestampUtc>
-      <TextBlockMetadataId>81c2738b-584a-4fa9-a420-fa91ec5ce67e</TextBlockMetadataId>
-    </TextBlockMetadata>
-    <TextBlockMetadata>
-      <ElementId>1a622969-9435-42df-b756-4af60deadd4b</ElementId>
-      <ContentTag>YzCqVxr4CkGOIjtz8kQsF1txdvNf0IhJnc8A53W8JnY=</ContentTag>
-      <TimestampUtc>2023-08-07T12:57:01.087Z</TimestampUtc>
-      <TextBlockMetadataId>50720dae-b0d4-4194-b190-edb8d80cd456</TextBlockMetadataId>
-    </TextBlockMetadata>
-    <TextBlockMetadata>
-      <ElementId>1a622969-9435-42df-b756-4af60deadd4b</ElementId>
-      <ContentTag>YzCqVxr4CkGOIjtz8kQsF1txdvNf0IhJnc8A53W8JnY=</ContentTag>
-      <TimestampUtc>2023-08-07T12:57:01.087Z</TimestampUtc>
-      <TextBlockMetadataId>6799000e-da23-48ac-b090-8c624221224a</TextBlockMetadataId>
-    </TextBlockMetadata>
-    <TextBlockMetadata>
-      <ElementId>1a622969-9435-42df-b756-4af60deadd4b</ElementId>
-      <ContentTag>YzCqVxr4CkGOIjtz8kQsF1txdvNf0IhJnc8A53W8JnY=</ContentTag>
-      <TimestampUtc>2023-08-07T12:57:01.087Z</TimestampUtc>
-      <TextBlockMetadataId>bedb578b-42f2-45fc-b27e-18676a586330</TextBlockMetadataId>
-    </TextBlockMetadata>
-    <TextBlockMetadata>
-      <ElementId>1a622969-9435-42df-b756-4af60deadd4b</ElementId>
-      <ContentTag>YzCqVxr4CkGOIjtz8kQsF1txdvNf0IhJnc8A53W8JnY=</ContentTag>
-      <TimestampUtc>2023-08-07T12:57:01.087Z</TimestampUtc>
-      <TextBlockMetadataId>e5ee1bf7-537b-46e7-8a4e-b9b5b3e3775a</TextBlockMetadataId>
-    </TextBlockMetadata>
-    <TextBlockMetadata>
-      <ElementId>1a622969-9435-42df-b756-4af60deadd4b</ElementId>
-      <ContentTag>YzCqVxr4CkGOIjtz8kQsF1txdvNf0IhJnc8A53W8JnY=</ContentTag>
-      <TimestampUtc>2023-08-07T12:57:01.087Z</TimestampUtc>
-      <TextBlockMetadataId>2d7494db-d234-41cb-beb0-3663d9595a42</TextBlockMetadataId>
-    </TextBlockMetadata>
-    <TextBlockMetadata>
-      <ElementId>1a622969-9435-42df-b756-4af60deadd4b</ElementId>
-      <ContentTag>YzCqVxr4CkGOIjtz8kQsF1txdvNf0IhJnc8A53W8JnY=</ContentTag>
-      <TimestampUtc>2023-08-07T12:57:01.087Z</TimestampUtc>
-      <TextBlockMetadataId>dc65463d-b88e-43ad-b59d-ffd33524f636</TextBlockMetadataId>
-    </TextBlockMetadata>
-    <TextBlockMetadata>
-      <ElementId>1a622969-9435-42df-b756-4af60deadd4b</ElementId>
-      <ContentTag>YzCqVxr4CkGOIjtz8kQsF1txdvNf0IhJnc8A53W8JnY=</ContentTag>
-      <TimestampUtc>2023-08-07T12:57:01.087Z</TimestampUtc>
-      <TextBlockMetadataId>f28395c9-4a56-45ab-aca0-3948237a9f19</TextBlockMetadataId>
-    </TextBlockMetadata>
-    <TextBlockMetadata>
-      <ElementId>1a622969-9435-42df-b756-4af60deadd4b</ElementId>
-      <ContentTag>YzCqVxr4CkGOIjtz8kQsF1txdvNf0IhJnc8A53W8JnY=</ContentTag>
-      <TimestampUtc>2023-08-07T12:57:01.087Z</TimestampUtc>
-      <TextBlockMetadataId>931b6e5a-073e-4c21-a5d5-828c13143fcd</TextBlockMetadataId>
-    </TextBlockMetadata>
-    <TextBlockMetadata>
-      <ElementId>1a622969-9435-42df-b756-4af60deadd4b</ElementId>
-      <ContentTag>YzCqVxr4CkGOIjtz8kQsF1txdvNf0IhJnc8A53W8JnY=</ContentTag>
-      <TimestampUtc>2023-08-07T12:57:01.087Z</TimestampUtc>
-      <TextBlockMetadataId>3a4b84c9-b48e-49d6-8bde-fdd57f58df1d</TextBlockMetadataId>
-    </TextBlockMetadata>
-    <TextBlockMetadata>
-      <ElementId>1a622969-9435-42df-b756-4af60deadd4b</ElementId>
-      <ContentTag>YzCqVxr4CkGOIjtz8kQsF1txdvNf0IhJnc8A53W8JnY=</ContentTag>
-      <TimestampUtc>2023-08-07T12:57:01.087Z</TimestampUtc>
-      <TextBlockMetadataId>4ff7ff77-b2c0-479e-92a1-38c86c3918f0</TextBlockMetadataId>
-    </TextBlockMetadata>
-    <TextBlockMetadata>
-      <ElementId>1a622969-9435-42df-b756-4af60deadd4b</ElementId>
-      <ContentTag>YzCqVxr4CkGOIjtz8kQsF1txdvNf0IhJnc8A53W8JnY=</ContentTag>
-      <TimestampUtc>2023-08-07T12:57:01.087Z</TimestampUtc>
-      <TextBlockMetadataId>5a217fb6-d41c-4253-aab3-e46a0a6cf4db</TextBlockMetadataId>
-    </TextBlockMetadata>
-    <TextBlockMetadata>
-      <ElementId>1a622969-9435-42df-b756-4af60deadd4b</ElementId>
-      <ContentTag>YzCqVxr4CkGOIjtz8kQsF1txdvNf0IhJnc8A53W8JnY=</ContentTag>
-      <TimestampUtc>2023-08-07T12:57:01.087Z</TimestampUtc>
-      <TextBlockMetadataId>cc270b98-ffd7-4663-9c8a-431904c746a2</TextBlockMetadataId>
-    </TextBlockMetadata>
-    <TextBlockMetadata>
-      <ElementId>1a622969-9435-42df-b756-4af60deadd4b</ElementId>
-      <ContentTag>YzCqVxr4CkGOIjtz8kQsF1txdvNf0IhJnc8A53W8JnY=</ContentTag>
-      <TimestampUtc>2023-08-07T12:57:01.087Z</TimestampUtc>
-      <TextBlockMetadataId>78df9b7c-8489-42ff-946e-b0e28db44603</TextBlockMetadataId>
-    </TextBlockMetadata>
-    <TextBlockMetadata>
-      <ElementId>1a622969-9435-42df-b756-4af60deadd4b</ElementId>
-      <ContentTag>YzCqVxr4CkGOIjtz8kQsF1txdvNf0IhJnc8A53W8JnY=</ContentTag>
-      <TimestampUtc>2023-08-07T12:57:01.087Z</TimestampUtc>
-      <TextBlockMetadataId>616af388-56c5-43ce-81c1-f830f0a0d34e</TextBlockMetadataId>
-    </TextBlockMetadata>
-    <TextBlockMetadata>
-      <ElementId>1a622969-9435-42df-b756-4af60deadd4b</ElementId>
-      <ContentTag>YzCqVxr4CkGOIjtz8kQsF1txdvNf0IhJnc8A53W8JnY=</ContentTag>
-      <TimestampUtc>2023-08-07T12:57:01.087Z</TimestampUtc>
-      <TextBlockMetadataId>d13d753d-6118-4688-b5c0-79b391ea647d</TextBlockMetadataId>
-    </TextBlockMetadata>
-    <TextBlockMetadata>
-      <ElementId>1a622969-9435-42df-b756-4af60deadd4b</ElementId>
-      <ContentTag>YzCqVxr4CkGOIjtz8kQsF1txdvNf0IhJnc8A53W8JnY=</ContentTag>
-      <TimestampUtc>2023-08-07T12:57:01.087Z</TimestampUtc>
-      <TextBlockMetadataId>9ce240c0-32a6-42e8-8701-c7b93c5f733b</TextBlockMetadataId>
-    </TextBlockMetadata>
-    <TextBlockMetadata>
-      <ElementId>1a622969-9435-42df-b756-4af60deadd4b</ElementId>
-      <ContentTag>YzCqVxr4CkGOIjtz8kQsF1txdvNf0IhJnc8A53W8JnY=</ContentTag>
-      <TimestampUtc>2023-08-07T12:57:01.087Z</TimestampUtc>
-      <TextBlockMetadataId>778c411b-7a80-4410-af32-530e2d973ad6</TextBlockMetadataId>
-    </TextBlockMetadata>
-    <TextBlockMetadata>
-      <ElementId>1a622969-9435-42df-b756-4af60deadd4b</ElementId>
-      <ContentTag>YzCqVxr4CkGOIjtz8kQsF1txdvNf0IhJnc8A53W8JnY=</ContentTag>
-      <TimestampUtc>2023-08-07T12:57:01.087Z</TimestampUtc>
-      <TextBlockMetadataId>1ecea41e-16b5-4b48-a6d9-f8c3188f89a5</TextBlockMetadataId>
-    </TextBlockMetadata>
-    <TextBlockMetadata>
-      <ElementId>1a622969-9435-42df-b756-4af60deadd4b</ElementId>
-      <ContentTag>YzCqVxr4CkGOIjtz8kQsF1txdvNf0IhJnc8A53W8JnY=</ContentTag>
-      <TimestampUtc>2023-08-07T12:57:01.087Z</TimestampUtc>
-      <TextBlockMetadataId>d9bcef1e-8f58-48f9-9b79-5dd293a8393a</TextBlockMetadataId>
-    </TextBlockMetadata>
-    <TextBlockMetadata>
-      <ElementId>1a622969-9435-42df-b756-4af60deadd4b</ElementId>
-      <ContentTag>YzCqVxr4CkGOIjtz8kQsF1txdvNf0IhJnc8A53W8JnY=</ContentTag>
-      <TimestampUtc>2023-08-07T12:57:01.087Z</TimestampUtc>
-      <TextBlockMetadataId>825e0e4b-a212-41ae-bd37-409527f64d4b</TextBlockMetadataId>
-    </TextBlockMetadata>
-    <TextBlockMetadata>
-      <ElementId>1a622969-9435-42df-b756-4af60deadd4b</ElementId>
-      <ContentTag>YzCqVxr4CkGOIjtz8kQsF1txdvNf0IhJnc8A53W8JnY=</ContentTag>
-      <TimestampUtc>2023-08-07T12:57:01.087Z</TimestampUtc>
-      <TextBlockMetadataId>ab29df2f-d348-4afc-a259-248f87879999</TextBlockMetadataId>
-    </TextBlockMetadata>
-  </TextBlockElements>
-  <PlaceholderHiddenState>
-    <HideablePlaceholderGuids/>
-  </PlaceholderHiddenState>
-</DocsTemplateContainer>
-</file>
-
-<file path=customXml/item4.xml><?xml version="1.0" encoding="utf-8"?>
 <ct:contentTypeSchema xmlns:ct="http://schemas.microsoft.com/office/2006/metadata/contentType" xmlns:ma="http://schemas.microsoft.com/office/2006/metadata/properties/metaAttributes" ct:_="" ma:_="" ma:contentTypeName="Document" ma:contentTypeID="0x01010030347378EA1C7B40B791B4A9FAEBC72E" ma:contentTypeVersion="1" ma:contentTypeDescription="Create a new document." ma:contentTypeScope="" ma:versionID="dac419b5e4b08ef6434e405bf3dae512">
   <xsd:schema xmlns:xsd="http://www.w3.org/2001/XMLSchema" xmlns:xs="http://www.w3.org/2001/XMLSchema" xmlns:p="http://schemas.microsoft.com/office/2006/metadata/properties" xmlns:ns2="0ff2502a-f5fc-4900-8b9d-01d591984867" targetNamespace="http://schemas.microsoft.com/office/2006/metadata/properties" ma:root="true" ma:fieldsID="8df1d2d8bf6da93316c8b7386a9c82fd" ns2:_="">
     <xsd:import namespace="0ff2502a-f5fc-4900-8b9d-01d591984867"/>
@@ -49291,6 +49405,163 @@
 </ct:contentTypeSchema>
 </file>
 
+<file path=customXml/item4.xml><?xml version="1.0" encoding="utf-8"?>
+<DocsTemplateContainer xmlns="http://www.made-in-office.com/empower/docs/template/v1">
+  <DocsTextTemplateDictionary/>
+  <DocsImageTemplateDictionary/>
+  <ImageElements/>
+  <TextBlockElements>
+    <TextBlockMetadata>
+      <ElementId>1a622969-9435-42df-b756-4af60deadd4b</ElementId>
+      <ContentTag>YzCqVxr4CkGOIjtz8kQsF1txdvNf0IhJnc8A53W8JnY=</ContentTag>
+      <TimestampUtc>2023-08-07T12:57:01.087Z</TimestampUtc>
+      <TextBlockMetadataId>81c2738b-584a-4fa9-a420-fa91ec5ce67e</TextBlockMetadataId>
+    </TextBlockMetadata>
+    <TextBlockMetadata>
+      <ElementId>1a622969-9435-42df-b756-4af60deadd4b</ElementId>
+      <ContentTag>YzCqVxr4CkGOIjtz8kQsF1txdvNf0IhJnc8A53W8JnY=</ContentTag>
+      <TimestampUtc>2023-08-07T12:57:01.087Z</TimestampUtc>
+      <TextBlockMetadataId>50720dae-b0d4-4194-b190-edb8d80cd456</TextBlockMetadataId>
+    </TextBlockMetadata>
+    <TextBlockMetadata>
+      <ElementId>1a622969-9435-42df-b756-4af60deadd4b</ElementId>
+      <ContentTag>YzCqVxr4CkGOIjtz8kQsF1txdvNf0IhJnc8A53W8JnY=</ContentTag>
+      <TimestampUtc>2023-08-07T12:57:01.087Z</TimestampUtc>
+      <TextBlockMetadataId>6799000e-da23-48ac-b090-8c624221224a</TextBlockMetadataId>
+    </TextBlockMetadata>
+    <TextBlockMetadata>
+      <ElementId>1a622969-9435-42df-b756-4af60deadd4b</ElementId>
+      <ContentTag>YzCqVxr4CkGOIjtz8kQsF1txdvNf0IhJnc8A53W8JnY=</ContentTag>
+      <TimestampUtc>2023-08-07T12:57:01.087Z</TimestampUtc>
+      <TextBlockMetadataId>bedb578b-42f2-45fc-b27e-18676a586330</TextBlockMetadataId>
+    </TextBlockMetadata>
+    <TextBlockMetadata>
+      <ElementId>1a622969-9435-42df-b756-4af60deadd4b</ElementId>
+      <ContentTag>YzCqVxr4CkGOIjtz8kQsF1txdvNf0IhJnc8A53W8JnY=</ContentTag>
+      <TimestampUtc>2023-08-07T12:57:01.087Z</TimestampUtc>
+      <TextBlockMetadataId>e5ee1bf7-537b-46e7-8a4e-b9b5b3e3775a</TextBlockMetadataId>
+    </TextBlockMetadata>
+    <TextBlockMetadata>
+      <ElementId>1a622969-9435-42df-b756-4af60deadd4b</ElementId>
+      <ContentTag>YzCqVxr4CkGOIjtz8kQsF1txdvNf0IhJnc8A53W8JnY=</ContentTag>
+      <TimestampUtc>2023-08-07T12:57:01.087Z</TimestampUtc>
+      <TextBlockMetadataId>2d7494db-d234-41cb-beb0-3663d9595a42</TextBlockMetadataId>
+    </TextBlockMetadata>
+    <TextBlockMetadata>
+      <ElementId>1a622969-9435-42df-b756-4af60deadd4b</ElementId>
+      <ContentTag>YzCqVxr4CkGOIjtz8kQsF1txdvNf0IhJnc8A53W8JnY=</ContentTag>
+      <TimestampUtc>2023-08-07T12:57:01.087Z</TimestampUtc>
+      <TextBlockMetadataId>dc65463d-b88e-43ad-b59d-ffd33524f636</TextBlockMetadataId>
+    </TextBlockMetadata>
+    <TextBlockMetadata>
+      <ElementId>1a622969-9435-42df-b756-4af60deadd4b</ElementId>
+      <ContentTag>YzCqVxr4CkGOIjtz8kQsF1txdvNf0IhJnc8A53W8JnY=</ContentTag>
+      <TimestampUtc>2023-08-07T12:57:01.087Z</TimestampUtc>
+      <TextBlockMetadataId>f28395c9-4a56-45ab-aca0-3948237a9f19</TextBlockMetadataId>
+    </TextBlockMetadata>
+    <TextBlockMetadata>
+      <ElementId>1a622969-9435-42df-b756-4af60deadd4b</ElementId>
+      <ContentTag>YzCqVxr4CkGOIjtz8kQsF1txdvNf0IhJnc8A53W8JnY=</ContentTag>
+      <TimestampUtc>2023-08-07T12:57:01.087Z</TimestampUtc>
+      <TextBlockMetadataId>931b6e5a-073e-4c21-a5d5-828c13143fcd</TextBlockMetadataId>
+    </TextBlockMetadata>
+    <TextBlockMetadata>
+      <ElementId>1a622969-9435-42df-b756-4af60deadd4b</ElementId>
+      <ContentTag>YzCqVxr4CkGOIjtz8kQsF1txdvNf0IhJnc8A53W8JnY=</ContentTag>
+      <TimestampUtc>2023-08-07T12:57:01.087Z</TimestampUtc>
+      <TextBlockMetadataId>3a4b84c9-b48e-49d6-8bde-fdd57f58df1d</TextBlockMetadataId>
+    </TextBlockMetadata>
+    <TextBlockMetadata>
+      <ElementId>1a622969-9435-42df-b756-4af60deadd4b</ElementId>
+      <ContentTag>YzCqVxr4CkGOIjtz8kQsF1txdvNf0IhJnc8A53W8JnY=</ContentTag>
+      <TimestampUtc>2023-08-07T12:57:01.087Z</TimestampUtc>
+      <TextBlockMetadataId>4ff7ff77-b2c0-479e-92a1-38c86c3918f0</TextBlockMetadataId>
+    </TextBlockMetadata>
+    <TextBlockMetadata>
+      <ElementId>1a622969-9435-42df-b756-4af60deadd4b</ElementId>
+      <ContentTag>YzCqVxr4CkGOIjtz8kQsF1txdvNf0IhJnc8A53W8JnY=</ContentTag>
+      <TimestampUtc>2023-08-07T12:57:01.087Z</TimestampUtc>
+      <TextBlockMetadataId>5a217fb6-d41c-4253-aab3-e46a0a6cf4db</TextBlockMetadataId>
+    </TextBlockMetadata>
+    <TextBlockMetadata>
+      <ElementId>1a622969-9435-42df-b756-4af60deadd4b</ElementId>
+      <ContentTag>YzCqVxr4CkGOIjtz8kQsF1txdvNf0IhJnc8A53W8JnY=</ContentTag>
+      <TimestampUtc>2023-08-07T12:57:01.087Z</TimestampUtc>
+      <TextBlockMetadataId>cc270b98-ffd7-4663-9c8a-431904c746a2</TextBlockMetadataId>
+    </TextBlockMetadata>
+    <TextBlockMetadata>
+      <ElementId>1a622969-9435-42df-b756-4af60deadd4b</ElementId>
+      <ContentTag>YzCqVxr4CkGOIjtz8kQsF1txdvNf0IhJnc8A53W8JnY=</ContentTag>
+      <TimestampUtc>2023-08-07T12:57:01.087Z</TimestampUtc>
+      <TextBlockMetadataId>78df9b7c-8489-42ff-946e-b0e28db44603</TextBlockMetadataId>
+    </TextBlockMetadata>
+    <TextBlockMetadata>
+      <ElementId>1a622969-9435-42df-b756-4af60deadd4b</ElementId>
+      <ContentTag>YzCqVxr4CkGOIjtz8kQsF1txdvNf0IhJnc8A53W8JnY=</ContentTag>
+      <TimestampUtc>2023-08-07T12:57:01.087Z</TimestampUtc>
+      <TextBlockMetadataId>616af388-56c5-43ce-81c1-f830f0a0d34e</TextBlockMetadataId>
+    </TextBlockMetadata>
+    <TextBlockMetadata>
+      <ElementId>1a622969-9435-42df-b756-4af60deadd4b</ElementId>
+      <ContentTag>YzCqVxr4CkGOIjtz8kQsF1txdvNf0IhJnc8A53W8JnY=</ContentTag>
+      <TimestampUtc>2023-08-07T12:57:01.087Z</TimestampUtc>
+      <TextBlockMetadataId>d13d753d-6118-4688-b5c0-79b391ea647d</TextBlockMetadataId>
+    </TextBlockMetadata>
+    <TextBlockMetadata>
+      <ElementId>1a622969-9435-42df-b756-4af60deadd4b</ElementId>
+      <ContentTag>YzCqVxr4CkGOIjtz8kQsF1txdvNf0IhJnc8A53W8JnY=</ContentTag>
+      <TimestampUtc>2023-08-07T12:57:01.087Z</TimestampUtc>
+      <TextBlockMetadataId>9ce240c0-32a6-42e8-8701-c7b93c5f733b</TextBlockMetadataId>
+    </TextBlockMetadata>
+    <TextBlockMetadata>
+      <ElementId>1a622969-9435-42df-b756-4af60deadd4b</ElementId>
+      <ContentTag>YzCqVxr4CkGOIjtz8kQsF1txdvNf0IhJnc8A53W8JnY=</ContentTag>
+      <TimestampUtc>2023-08-07T12:57:01.087Z</TimestampUtc>
+      <TextBlockMetadataId>778c411b-7a80-4410-af32-530e2d973ad6</TextBlockMetadataId>
+    </TextBlockMetadata>
+    <TextBlockMetadata>
+      <ElementId>1a622969-9435-42df-b756-4af60deadd4b</ElementId>
+      <ContentTag>YzCqVxr4CkGOIjtz8kQsF1txdvNf0IhJnc8A53W8JnY=</ContentTag>
+      <TimestampUtc>2023-08-07T12:57:01.087Z</TimestampUtc>
+      <TextBlockMetadataId>1ecea41e-16b5-4b48-a6d9-f8c3188f89a5</TextBlockMetadataId>
+    </TextBlockMetadata>
+    <TextBlockMetadata>
+      <ElementId>1a622969-9435-42df-b756-4af60deadd4b</ElementId>
+      <ContentTag>YzCqVxr4CkGOIjtz8kQsF1txdvNf0IhJnc8A53W8JnY=</ContentTag>
+      <TimestampUtc>2023-08-07T12:57:01.087Z</TimestampUtc>
+      <TextBlockMetadataId>d9bcef1e-8f58-48f9-9b79-5dd293a8393a</TextBlockMetadataId>
+    </TextBlockMetadata>
+    <TextBlockMetadata>
+      <ElementId>1a622969-9435-42df-b756-4af60deadd4b</ElementId>
+      <ContentTag>YzCqVxr4CkGOIjtz8kQsF1txdvNf0IhJnc8A53W8JnY=</ContentTag>
+      <TimestampUtc>2023-08-07T12:57:01.087Z</TimestampUtc>
+      <TextBlockMetadataId>825e0e4b-a212-41ae-bd37-409527f64d4b</TextBlockMetadataId>
+    </TextBlockMetadata>
+    <TextBlockMetadata>
+      <ElementId>1a622969-9435-42df-b756-4af60deadd4b</ElementId>
+      <ContentTag>YzCqVxr4CkGOIjtz8kQsF1txdvNf0IhJnc8A53W8JnY=</ContentTag>
+      <TimestampUtc>2023-08-07T12:57:01.087Z</TimestampUtc>
+      <TextBlockMetadataId>ab29df2f-d348-4afc-a259-248f87879999</TextBlockMetadataId>
+    </TextBlockMetadata>
+    <TextBlockMetadata>
+      <ElementId>1a622969-9435-42df-b756-4af60deadd4b</ElementId>
+      <ContentTag>YzCqVxr4CkGOIjtz8kQsF1txdvNf0IhJnc8A53W8JnY=</ContentTag>
+      <TimestampUtc>2023-08-07T12:57:01.087Z</TimestampUtc>
+      <TextBlockMetadataId>ecb1fa45-7d29-42fa-802c-9eb01844da74</TextBlockMetadataId>
+    </TextBlockMetadata>
+    <TextBlockMetadata>
+      <ElementId>1a622969-9435-42df-b756-4af60deadd4b</ElementId>
+      <ContentTag>YzCqVxr4CkGOIjtz8kQsF1txdvNf0IhJnc8A53W8JnY=</ContentTag>
+      <TimestampUtc>2023-08-07T12:57:01.087Z</TimestampUtc>
+      <TextBlockMetadataId>a66b21ad-0144-491d-8113-427d4f6ce595</TextBlockMetadataId>
+    </TextBlockMetadata>
+  </TextBlockElements>
+  <PlaceholderHiddenState>
+    <HideablePlaceholderGuids/>
+  </PlaceholderHiddenState>
+</DocsTemplateContainer>
+</file>
+
 <file path=customXml/item5.xml><?xml version="1.0" encoding="utf-8"?>
 <b:Sources xmlns:b="http://schemas.openxmlformats.org/officeDocument/2006/bibliography" xmlns="http://schemas.openxmlformats.org/officeDocument/2006/bibliography" SelectedStyle="\APA.XSL" StyleName="APA"/>
 </file>
@@ -49313,14 +49584,6 @@
 </file>
 
 <file path=customXml/itemProps3.xml><?xml version="1.0" encoding="utf-8"?>
-<ds:datastoreItem xmlns:ds="http://schemas.openxmlformats.org/officeDocument/2006/customXml" ds:itemID="{F96E3769-7231-44E3-8B58-26BF0D2D9E0D}">
-  <ds:schemaRefs>
-    <ds:schemaRef ds:uri="http://www.made-in-office.com/empower/docs/template/v1"/>
-  </ds:schemaRefs>
-</ds:datastoreItem>
-</file>
-
-<file path=customXml/itemProps4.xml><?xml version="1.0" encoding="utf-8"?>
 <ds:datastoreItem xmlns:ds="http://schemas.openxmlformats.org/officeDocument/2006/customXml" ds:itemID="{348D6D5F-AF49-4DAF-BEBA-00EA06977ED2}">
   <ds:schemaRefs>
     <ds:schemaRef ds:uri="http://schemas.microsoft.com/office/2006/metadata/contentType"/>
@@ -49338,8 +49601,16 @@
 </ds:datastoreItem>
 </file>
 
+<file path=customXml/itemProps4.xml><?xml version="1.0" encoding="utf-8"?>
+<ds:datastoreItem xmlns:ds="http://schemas.openxmlformats.org/officeDocument/2006/customXml" ds:itemID="{BFAA2C29-9636-4EEC-BF95-A49A2D6AC154}">
+  <ds:schemaRefs>
+    <ds:schemaRef ds:uri="http://www.made-in-office.com/empower/docs/template/v1"/>
+  </ds:schemaRefs>
+</ds:datastoreItem>
+</file>
+
 <file path=customXml/itemProps5.xml><?xml version="1.0" encoding="utf-8"?>
-<ds:datastoreItem xmlns:ds="http://schemas.openxmlformats.org/officeDocument/2006/customXml" ds:itemID="{80E15AD8-D253-41CD-B876-D4DF8A615961}">
+<ds:datastoreItem xmlns:ds="http://schemas.openxmlformats.org/officeDocument/2006/customXml" ds:itemID="{4D7D7B99-6E06-40EC-BE1C-A9DCDD49012C}">
   <ds:schemaRefs>
     <ds:schemaRef ds:uri="http://schemas.openxmlformats.org/officeDocument/2006/bibliography"/>
   </ds:schemaRefs>

</xml_diff>

<commit_message>
cleaning up some of the text for the device configurator section
</commit_message>
<xml_diff>
--- a/.internal/Manual/Intro to PSOC Edge E84 - Part 2 (E2)/PSoC Edge E84 Introductory E2 Training Manual -WIP_10_21_2025.docx
+++ b/.internal/Manual/Intro to PSOC Edge E84 - Part 2 (E2)/PSoC Edge E84 Introductory E2 Training Manual -WIP_10_21_2025.docx
@@ -59,7 +59,7 @@
       <w:bookmarkStart w:id="3" w:name="_Toc431374932"/>
       <w:bookmarkStart w:id="4" w:name="_Toc431889535"/>
       <w:bookmarkStart w:id="5" w:name="_Toc431980074"/>
-      <w:bookmarkStart w:id="6" w:name="_Toc192780010"/>
+      <w:bookmarkStart w:id="6" w:name="_Toc212806533"/>
       <w:r>
         <w:rPr>
           <w:b w:val="0"/>
@@ -171,8 +171,8 @@
       </w:pPr>
       <w:bookmarkStart w:id="7" w:name="_Toc431889536"/>
       <w:bookmarkStart w:id="8" w:name="_Toc431980075"/>
-      <w:bookmarkStart w:id="9" w:name="_Toc192780011"/>
-      <w:bookmarkStart w:id="10" w:name="_Toc430947633"/>
+      <w:bookmarkStart w:id="9" w:name="_Toc430947633"/>
+      <w:bookmarkStart w:id="10" w:name="_Toc212806534"/>
       <w:r>
         <w:rPr>
           <w:b w:val="0"/>
@@ -181,7 +181,7 @@
       </w:r>
       <w:bookmarkEnd w:id="7"/>
       <w:bookmarkEnd w:id="8"/>
-      <w:bookmarkEnd w:id="9"/>
+      <w:bookmarkEnd w:id="10"/>
     </w:p>
     <w:sdt>
       <w:sdtPr>
@@ -226,10 +226,6 @@
             <w:rPr>
               <w:rFonts w:asciiTheme="minorHAnsi" w:eastAsiaTheme="minorEastAsia" w:hAnsiTheme="minorHAnsi" w:cstheme="minorBidi"/>
               <w:b w:val="0"/>
-              <w:kern w:val="2"/>
-              <w:sz w:val="24"/>
-              <w:szCs w:val="24"/>
-              <w14:ligatures w14:val="standardContextual"/>
             </w:rPr>
           </w:pPr>
           <w:r>
@@ -241,7 +237,7 @@
           <w:r>
             <w:fldChar w:fldCharType="separate"/>
           </w:r>
-          <w:hyperlink w:anchor="_Toc192780010" w:history="1">
+          <w:hyperlink w:anchor="_Toc212806533" w:history="1">
             <w:r>
               <w:rPr>
                 <w:rStyle w:val="Hyperlink"/>
@@ -264,7 +260,7 @@
               <w:rPr>
                 <w:webHidden/>
               </w:rPr>
-              <w:instrText xml:space="preserve"> PAGEREF _Toc192780010 \h </w:instrText>
+              <w:instrText xml:space="preserve"> PAGEREF _Toc212806533 \h </w:instrText>
             </w:r>
             <w:r>
               <w:rPr>
@@ -297,13 +293,9 @@
             <w:rPr>
               <w:rFonts w:asciiTheme="minorHAnsi" w:eastAsiaTheme="minorEastAsia" w:hAnsiTheme="minorHAnsi" w:cstheme="minorBidi"/>
               <w:b w:val="0"/>
-              <w:kern w:val="2"/>
-              <w:sz w:val="24"/>
-              <w:szCs w:val="24"/>
-              <w14:ligatures w14:val="standardContextual"/>
             </w:rPr>
           </w:pPr>
-          <w:hyperlink w:anchor="_Toc192780011" w:history="1">
+          <w:hyperlink w:anchor="_Toc212806534" w:history="1">
             <w:r>
               <w:rPr>
                 <w:rStyle w:val="Hyperlink"/>
@@ -326,7 +318,7 @@
               <w:rPr>
                 <w:webHidden/>
               </w:rPr>
-              <w:instrText xml:space="preserve"> PAGEREF _Toc192780011 \h </w:instrText>
+              <w:instrText xml:space="preserve"> PAGEREF _Toc212806534 \h </w:instrText>
             </w:r>
             <w:r>
               <w:rPr>
@@ -359,13 +351,9 @@
             <w:rPr>
               <w:rFonts w:asciiTheme="minorHAnsi" w:eastAsiaTheme="minorEastAsia" w:hAnsiTheme="minorHAnsi" w:cstheme="minorBidi"/>
               <w:b w:val="0"/>
-              <w:kern w:val="2"/>
-              <w:sz w:val="24"/>
-              <w:szCs w:val="24"/>
-              <w14:ligatures w14:val="standardContextual"/>
             </w:rPr>
           </w:pPr>
-          <w:hyperlink w:anchor="_Toc192780012" w:history="1">
+          <w:hyperlink w:anchor="_Toc212806535" w:history="1">
             <w:r>
               <w:rPr>
                 <w:rStyle w:val="Hyperlink"/>
@@ -376,10 +364,6 @@
               <w:rPr>
                 <w:rFonts w:asciiTheme="minorHAnsi" w:eastAsiaTheme="minorEastAsia" w:hAnsiTheme="minorHAnsi" w:cstheme="minorBidi"/>
                 <w:b w:val="0"/>
-                <w:kern w:val="2"/>
-                <w:sz w:val="24"/>
-                <w:szCs w:val="24"/>
-                <w14:ligatures w14:val="standardContextual"/>
               </w:rPr>
               <w:tab/>
             </w:r>
@@ -405,7 +389,7 @@
               <w:rPr>
                 <w:webHidden/>
               </w:rPr>
-              <w:instrText xml:space="preserve"> PAGEREF _Toc192780012 \h </w:instrText>
+              <w:instrText xml:space="preserve"> PAGEREF _Toc212806535 \h </w:instrText>
             </w:r>
             <w:r>
               <w:rPr>
@@ -438,13 +422,9 @@
             <w:rPr>
               <w:rFonts w:asciiTheme="minorHAnsi" w:eastAsiaTheme="minorEastAsia" w:hAnsiTheme="minorHAnsi" w:cstheme="minorBidi"/>
               <w:b w:val="0"/>
-              <w:kern w:val="2"/>
-              <w:sz w:val="24"/>
-              <w:szCs w:val="24"/>
-              <w14:ligatures w14:val="standardContextual"/>
             </w:rPr>
           </w:pPr>
-          <w:hyperlink w:anchor="_Toc192780013" w:history="1">
+          <w:hyperlink w:anchor="_Toc212806536" w:history="1">
             <w:r>
               <w:rPr>
                 <w:rStyle w:val="Hyperlink"/>
@@ -455,10 +435,6 @@
               <w:rPr>
                 <w:rFonts w:asciiTheme="minorHAnsi" w:eastAsiaTheme="minorEastAsia" w:hAnsiTheme="minorHAnsi" w:cstheme="minorBidi"/>
                 <w:b w:val="0"/>
-                <w:kern w:val="2"/>
-                <w:sz w:val="24"/>
-                <w:szCs w:val="24"/>
-                <w14:ligatures w14:val="standardContextual"/>
               </w:rPr>
               <w:tab/>
             </w:r>
@@ -484,7 +460,7 @@
               <w:rPr>
                 <w:webHidden/>
               </w:rPr>
-              <w:instrText xml:space="preserve"> PAGEREF _Toc192780013 \h </w:instrText>
+              <w:instrText xml:space="preserve"> PAGEREF _Toc212806536 \h </w:instrText>
             </w:r>
             <w:r>
               <w:rPr>
@@ -517,13 +493,9 @@
             <w:rPr>
               <w:rFonts w:asciiTheme="minorHAnsi" w:eastAsiaTheme="minorEastAsia" w:hAnsiTheme="minorHAnsi" w:cstheme="minorBidi"/>
               <w:b w:val="0"/>
-              <w:kern w:val="2"/>
-              <w:sz w:val="24"/>
-              <w:szCs w:val="24"/>
-              <w14:ligatures w14:val="standardContextual"/>
             </w:rPr>
           </w:pPr>
-          <w:hyperlink w:anchor="_Toc192780014" w:history="1">
+          <w:hyperlink w:anchor="_Toc212806537" w:history="1">
             <w:r>
               <w:rPr>
                 <w:rStyle w:val="Hyperlink"/>
@@ -534,10 +506,6 @@
               <w:rPr>
                 <w:rFonts w:asciiTheme="minorHAnsi" w:eastAsiaTheme="minorEastAsia" w:hAnsiTheme="minorHAnsi" w:cstheme="minorBidi"/>
                 <w:b w:val="0"/>
-                <w:kern w:val="2"/>
-                <w:sz w:val="24"/>
-                <w:szCs w:val="24"/>
-                <w14:ligatures w14:val="standardContextual"/>
               </w:rPr>
               <w:tab/>
             </w:r>
@@ -563,7 +531,7 @@
               <w:rPr>
                 <w:webHidden/>
               </w:rPr>
-              <w:instrText xml:space="preserve"> PAGEREF _Toc192780014 \h </w:instrText>
+              <w:instrText xml:space="preserve"> PAGEREF _Toc212806537 \h </w:instrText>
             </w:r>
             <w:r>
               <w:rPr>
@@ -596,13 +564,9 @@
             <w:rPr>
               <w:rFonts w:asciiTheme="minorHAnsi" w:eastAsiaTheme="minorEastAsia" w:hAnsiTheme="minorHAnsi" w:cstheme="minorBidi"/>
               <w:b w:val="0"/>
-              <w:kern w:val="2"/>
-              <w:sz w:val="24"/>
-              <w:szCs w:val="24"/>
-              <w14:ligatures w14:val="standardContextual"/>
             </w:rPr>
           </w:pPr>
-          <w:hyperlink w:anchor="_Toc192780015" w:history="1">
+          <w:hyperlink w:anchor="_Toc212806538" w:history="1">
             <w:r>
               <w:rPr>
                 <w:rStyle w:val="Hyperlink"/>
@@ -616,10 +580,6 @@
               <w:rPr>
                 <w:rFonts w:asciiTheme="minorHAnsi" w:eastAsiaTheme="minorEastAsia" w:hAnsiTheme="minorHAnsi" w:cstheme="minorBidi"/>
                 <w:b w:val="0"/>
-                <w:kern w:val="2"/>
-                <w:sz w:val="24"/>
-                <w:szCs w:val="24"/>
-                <w14:ligatures w14:val="standardContextual"/>
               </w:rPr>
               <w:tab/>
             </w:r>
@@ -630,7 +590,7 @@
                 <w:kern w:val="28"/>
                 <w:lang w:eastAsia="de-DE"/>
               </w:rPr>
-              <w:t>Code Example 1: Hello world + Blinky using HAL</w:t>
+              <w:t>Code Example 1: Hello world + Blinky</w:t>
             </w:r>
             <w:r>
               <w:rPr>
@@ -648,7 +608,7 @@
               <w:rPr>
                 <w:webHidden/>
               </w:rPr>
-              <w:instrText xml:space="preserve"> PAGEREF _Toc192780015 \h </w:instrText>
+              <w:instrText xml:space="preserve"> PAGEREF _Toc212806538 \h </w:instrText>
             </w:r>
             <w:r>
               <w:rPr>
@@ -665,7 +625,7 @@
               <w:rPr>
                 <w:webHidden/>
               </w:rPr>
-              <w:t>4</w:t>
+              <w:t>3</w:t>
             </w:r>
             <w:r>
               <w:rPr>
@@ -680,13 +640,9 @@
             <w:pStyle w:val="TOC2"/>
             <w:rPr>
               <w:rFonts w:asciiTheme="minorHAnsi" w:eastAsiaTheme="minorEastAsia" w:hAnsiTheme="minorHAnsi" w:cstheme="minorBidi"/>
-              <w:kern w:val="2"/>
-              <w:sz w:val="24"/>
-              <w:szCs w:val="24"/>
-              <w14:ligatures w14:val="standardContextual"/>
             </w:rPr>
           </w:pPr>
-          <w:hyperlink w:anchor="_Toc192780016" w:history="1">
+          <w:hyperlink w:anchor="_Toc212806539" w:history="1">
             <w:r>
               <w:rPr>
                 <w:rStyle w:val="Hyperlink"/>
@@ -700,10 +656,6 @@
             <w:r>
               <w:rPr>
                 <w:rFonts w:asciiTheme="minorHAnsi" w:eastAsiaTheme="minorEastAsia" w:hAnsiTheme="minorHAnsi" w:cstheme="minorBidi"/>
-                <w:kern w:val="2"/>
-                <w:sz w:val="24"/>
-                <w:szCs w:val="24"/>
-                <w14:ligatures w14:val="standardContextual"/>
               </w:rPr>
               <w:tab/>
             </w:r>
@@ -733,7 +685,7 @@
               <w:rPr>
                 <w:webHidden/>
               </w:rPr>
-              <w:instrText xml:space="preserve"> PAGEREF _Toc192780016 \h </w:instrText>
+              <w:instrText xml:space="preserve"> PAGEREF _Toc212806539 \h </w:instrText>
             </w:r>
             <w:r>
               <w:rPr>
@@ -750,7 +702,7 @@
               <w:rPr>
                 <w:webHidden/>
               </w:rPr>
-              <w:t>4</w:t>
+              <w:t>3</w:t>
             </w:r>
             <w:r>
               <w:rPr>
@@ -765,13 +717,9 @@
             <w:pStyle w:val="TOC2"/>
             <w:rPr>
               <w:rFonts w:asciiTheme="minorHAnsi" w:eastAsiaTheme="minorEastAsia" w:hAnsiTheme="minorHAnsi" w:cstheme="minorBidi"/>
-              <w:kern w:val="2"/>
-              <w:sz w:val="24"/>
-              <w:szCs w:val="24"/>
-              <w14:ligatures w14:val="standardContextual"/>
             </w:rPr>
           </w:pPr>
-          <w:hyperlink w:anchor="_Toc192780017" w:history="1">
+          <w:hyperlink w:anchor="_Toc212806540" w:history="1">
             <w:r>
               <w:rPr>
                 <w:rStyle w:val="Hyperlink"/>
@@ -781,10 +729,6 @@
             <w:r>
               <w:rPr>
                 <w:rFonts w:asciiTheme="minorHAnsi" w:eastAsiaTheme="minorEastAsia" w:hAnsiTheme="minorHAnsi" w:cstheme="minorBidi"/>
-                <w:kern w:val="2"/>
-                <w:sz w:val="24"/>
-                <w:szCs w:val="24"/>
-                <w14:ligatures w14:val="standardContextual"/>
               </w:rPr>
               <w:tab/>
             </w:r>
@@ -810,7 +754,7 @@
               <w:rPr>
                 <w:webHidden/>
               </w:rPr>
-              <w:instrText xml:space="preserve"> PAGEREF _Toc192780017 \h </w:instrText>
+              <w:instrText xml:space="preserve"> PAGEREF _Toc212806540 \h </w:instrText>
             </w:r>
             <w:r>
               <w:rPr>
@@ -827,7 +771,7 @@
               <w:rPr>
                 <w:webHidden/>
               </w:rPr>
-              <w:t>4</w:t>
+              <w:t>3</w:t>
             </w:r>
             <w:r>
               <w:rPr>
@@ -842,13 +786,9 @@
             <w:pStyle w:val="TOC2"/>
             <w:rPr>
               <w:rFonts w:asciiTheme="minorHAnsi" w:eastAsiaTheme="minorEastAsia" w:hAnsiTheme="minorHAnsi" w:cstheme="minorBidi"/>
-              <w:kern w:val="2"/>
-              <w:sz w:val="24"/>
-              <w:szCs w:val="24"/>
-              <w14:ligatures w14:val="standardContextual"/>
             </w:rPr>
           </w:pPr>
-          <w:hyperlink w:anchor="_Toc192780018" w:history="1">
+          <w:hyperlink w:anchor="_Toc212806541" w:history="1">
             <w:r>
               <w:rPr>
                 <w:rStyle w:val="Hyperlink"/>
@@ -858,10 +798,6 @@
             <w:r>
               <w:rPr>
                 <w:rFonts w:asciiTheme="minorHAnsi" w:eastAsiaTheme="minorEastAsia" w:hAnsiTheme="minorHAnsi" w:cstheme="minorBidi"/>
-                <w:kern w:val="2"/>
-                <w:sz w:val="24"/>
-                <w:szCs w:val="24"/>
-                <w14:ligatures w14:val="standardContextual"/>
               </w:rPr>
               <w:tab/>
             </w:r>
@@ -887,7 +823,76 @@
               <w:rPr>
                 <w:webHidden/>
               </w:rPr>
-              <w:instrText xml:space="preserve"> PAGEREF _Toc192780018 \h </w:instrText>
+              <w:instrText xml:space="preserve"> PAGEREF _Toc212806541 \h </w:instrText>
+            </w:r>
+            <w:r>
+              <w:rPr>
+                <w:webHidden/>
+              </w:rPr>
+            </w:r>
+            <w:r>
+              <w:rPr>
+                <w:webHidden/>
+              </w:rPr>
+              <w:fldChar w:fldCharType="separate"/>
+            </w:r>
+            <w:r>
+              <w:rPr>
+                <w:webHidden/>
+              </w:rPr>
+              <w:t>3</w:t>
+            </w:r>
+            <w:r>
+              <w:rPr>
+                <w:webHidden/>
+              </w:rPr>
+              <w:fldChar w:fldCharType="end"/>
+            </w:r>
+          </w:hyperlink>
+        </w:p>
+        <w:p>
+          <w:pPr>
+            <w:pStyle w:val="TOC2"/>
+            <w:rPr>
+              <w:rFonts w:asciiTheme="minorHAnsi" w:eastAsiaTheme="minorEastAsia" w:hAnsiTheme="minorHAnsi" w:cstheme="minorBidi"/>
+            </w:rPr>
+          </w:pPr>
+          <w:hyperlink w:anchor="_Toc212806542" w:history="1">
+            <w:r>
+              <w:rPr>
+                <w:rStyle w:val="Hyperlink"/>
+              </w:rPr>
+              <w:t>4.4</w:t>
+            </w:r>
+            <w:r>
+              <w:rPr>
+                <w:rFonts w:asciiTheme="minorHAnsi" w:eastAsiaTheme="minorEastAsia" w:hAnsiTheme="minorHAnsi" w:cstheme="minorBidi"/>
+              </w:rPr>
+              <w:tab/>
+            </w:r>
+            <w:r>
+              <w:rPr>
+                <w:rStyle w:val="Hyperlink"/>
+              </w:rPr>
+              <w:t>Hardware Block Diagram and Setup</w:t>
+            </w:r>
+            <w:r>
+              <w:rPr>
+                <w:webHidden/>
+              </w:rPr>
+              <w:tab/>
+            </w:r>
+            <w:r>
+              <w:rPr>
+                <w:webHidden/>
+              </w:rPr>
+              <w:fldChar w:fldCharType="begin"/>
+            </w:r>
+            <w:r>
+              <w:rPr>
+                <w:webHidden/>
+              </w:rPr>
+              <w:instrText xml:space="preserve"> PAGEREF _Toc212806542 \h </w:instrText>
             </w:r>
             <w:r>
               <w:rPr>
@@ -919,90 +924,9 @@
             <w:pStyle w:val="TOC2"/>
             <w:rPr>
               <w:rFonts w:asciiTheme="minorHAnsi" w:eastAsiaTheme="minorEastAsia" w:hAnsiTheme="minorHAnsi" w:cstheme="minorBidi"/>
-              <w:kern w:val="2"/>
-              <w:sz w:val="24"/>
-              <w:szCs w:val="24"/>
-              <w14:ligatures w14:val="standardContextual"/>
             </w:rPr>
           </w:pPr>
-          <w:hyperlink w:anchor="_Toc192780019" w:history="1">
-            <w:r>
-              <w:rPr>
-                <w:rStyle w:val="Hyperlink"/>
-              </w:rPr>
-              <w:t>4.4</w:t>
-            </w:r>
-            <w:r>
-              <w:rPr>
-                <w:rFonts w:asciiTheme="minorHAnsi" w:eastAsiaTheme="minorEastAsia" w:hAnsiTheme="minorHAnsi" w:cstheme="minorBidi"/>
-                <w:kern w:val="2"/>
-                <w:sz w:val="24"/>
-                <w:szCs w:val="24"/>
-                <w14:ligatures w14:val="standardContextual"/>
-              </w:rPr>
-              <w:tab/>
-            </w:r>
-            <w:r>
-              <w:rPr>
-                <w:rStyle w:val="Hyperlink"/>
-              </w:rPr>
-              <w:t>Hardware Block Diagram</w:t>
-            </w:r>
-            <w:r>
-              <w:rPr>
-                <w:webHidden/>
-              </w:rPr>
-              <w:tab/>
-            </w:r>
-            <w:r>
-              <w:rPr>
-                <w:webHidden/>
-              </w:rPr>
-              <w:fldChar w:fldCharType="begin"/>
-            </w:r>
-            <w:r>
-              <w:rPr>
-                <w:webHidden/>
-              </w:rPr>
-              <w:instrText xml:space="preserve"> PAGEREF _Toc192780019 \h </w:instrText>
-            </w:r>
-            <w:r>
-              <w:rPr>
-                <w:webHidden/>
-              </w:rPr>
-            </w:r>
-            <w:r>
-              <w:rPr>
-                <w:webHidden/>
-              </w:rPr>
-              <w:fldChar w:fldCharType="separate"/>
-            </w:r>
-            <w:r>
-              <w:rPr>
-                <w:webHidden/>
-              </w:rPr>
-              <w:t>6</w:t>
-            </w:r>
-            <w:r>
-              <w:rPr>
-                <w:webHidden/>
-              </w:rPr>
-              <w:fldChar w:fldCharType="end"/>
-            </w:r>
-          </w:hyperlink>
-        </w:p>
-        <w:p>
-          <w:pPr>
-            <w:pStyle w:val="TOC2"/>
-            <w:rPr>
-              <w:rFonts w:asciiTheme="minorHAnsi" w:eastAsiaTheme="minorEastAsia" w:hAnsiTheme="minorHAnsi" w:cstheme="minorBidi"/>
-              <w:kern w:val="2"/>
-              <w:sz w:val="24"/>
-              <w:szCs w:val="24"/>
-              <w14:ligatures w14:val="standardContextual"/>
-            </w:rPr>
-          </w:pPr>
-          <w:hyperlink w:anchor="_Toc192780020" w:history="1">
+          <w:hyperlink w:anchor="_Toc212806543" w:history="1">
             <w:r>
               <w:rPr>
                 <w:rStyle w:val="Hyperlink"/>
@@ -1016,94 +940,6 @@
             <w:r>
               <w:rPr>
                 <w:rFonts w:asciiTheme="minorHAnsi" w:eastAsiaTheme="minorEastAsia" w:hAnsiTheme="minorHAnsi" w:cstheme="minorBidi"/>
-                <w:kern w:val="2"/>
-                <w:sz w:val="24"/>
-                <w:szCs w:val="24"/>
-                <w14:ligatures w14:val="standardContextual"/>
-              </w:rPr>
-              <w:tab/>
-            </w:r>
-            <w:r>
-              <w:rPr>
-                <w:rStyle w:val="Hyperlink"/>
-                <w:snapToGrid w:val="0"/>
-                <w:kern w:val="28"/>
-                <w:lang w:eastAsia="de-DE"/>
-              </w:rPr>
-              <w:t>Hardware Setup</w:t>
-            </w:r>
-            <w:r>
-              <w:rPr>
-                <w:webHidden/>
-              </w:rPr>
-              <w:tab/>
-            </w:r>
-            <w:r>
-              <w:rPr>
-                <w:webHidden/>
-              </w:rPr>
-              <w:fldChar w:fldCharType="begin"/>
-            </w:r>
-            <w:r>
-              <w:rPr>
-                <w:webHidden/>
-              </w:rPr>
-              <w:instrText xml:space="preserve"> PAGEREF _Toc192780020 \h </w:instrText>
-            </w:r>
-            <w:r>
-              <w:rPr>
-                <w:webHidden/>
-              </w:rPr>
-            </w:r>
-            <w:r>
-              <w:rPr>
-                <w:webHidden/>
-              </w:rPr>
-              <w:fldChar w:fldCharType="separate"/>
-            </w:r>
-            <w:r>
-              <w:rPr>
-                <w:webHidden/>
-              </w:rPr>
-              <w:t>7</w:t>
-            </w:r>
-            <w:r>
-              <w:rPr>
-                <w:webHidden/>
-              </w:rPr>
-              <w:fldChar w:fldCharType="end"/>
-            </w:r>
-          </w:hyperlink>
-        </w:p>
-        <w:p>
-          <w:pPr>
-            <w:pStyle w:val="TOC2"/>
-            <w:rPr>
-              <w:rFonts w:asciiTheme="minorHAnsi" w:eastAsiaTheme="minorEastAsia" w:hAnsiTheme="minorHAnsi" w:cstheme="minorBidi"/>
-              <w:kern w:val="2"/>
-              <w:sz w:val="24"/>
-              <w:szCs w:val="24"/>
-              <w14:ligatures w14:val="standardContextual"/>
-            </w:rPr>
-          </w:pPr>
-          <w:hyperlink w:anchor="_Toc192780021" w:history="1">
-            <w:r>
-              <w:rPr>
-                <w:rStyle w:val="Hyperlink"/>
-                <w:b/>
-                <w:snapToGrid w:val="0"/>
-                <w:kern w:val="28"/>
-                <w:lang w:eastAsia="de-DE"/>
-              </w:rPr>
-              <w:t>4.6</w:t>
-            </w:r>
-            <w:r>
-              <w:rPr>
-                <w:rFonts w:asciiTheme="minorHAnsi" w:eastAsiaTheme="minorEastAsia" w:hAnsiTheme="minorHAnsi" w:cstheme="minorBidi"/>
-                <w:kern w:val="2"/>
-                <w:sz w:val="24"/>
-                <w:szCs w:val="24"/>
-                <w14:ligatures w14:val="standardContextual"/>
               </w:rPr>
               <w:tab/>
             </w:r>
@@ -1133,7 +969,7 @@
               <w:rPr>
                 <w:webHidden/>
               </w:rPr>
-              <w:instrText xml:space="preserve"> PAGEREF _Toc192780021 \h </w:instrText>
+              <w:instrText xml:space="preserve"> PAGEREF _Toc212806543 \h </w:instrText>
             </w:r>
             <w:r>
               <w:rPr>
@@ -1150,7 +986,7 @@
               <w:rPr>
                 <w:webHidden/>
               </w:rPr>
-              <w:t>7</w:t>
+              <w:t>5</w:t>
             </w:r>
             <w:r>
               <w:rPr>
@@ -1165,13 +1001,9 @@
             <w:pStyle w:val="TOC2"/>
             <w:rPr>
               <w:rFonts w:asciiTheme="minorHAnsi" w:eastAsiaTheme="minorEastAsia" w:hAnsiTheme="minorHAnsi" w:cstheme="minorBidi"/>
-              <w:kern w:val="2"/>
-              <w:sz w:val="24"/>
-              <w:szCs w:val="24"/>
-              <w14:ligatures w14:val="standardContextual"/>
             </w:rPr>
           </w:pPr>
-          <w:hyperlink w:anchor="_Toc192780022" w:history="1">
+          <w:hyperlink w:anchor="_Toc212806544" w:history="1">
             <w:r>
               <w:rPr>
                 <w:rStyle w:val="Hyperlink"/>
@@ -1180,15 +1012,11 @@
                 <w:kern w:val="28"/>
                 <w:lang w:eastAsia="de-DE"/>
               </w:rPr>
-              <w:t>4.7</w:t>
+              <w:t>4.6</w:t>
             </w:r>
             <w:r>
               <w:rPr>
                 <w:rFonts w:asciiTheme="minorHAnsi" w:eastAsiaTheme="minorEastAsia" w:hAnsiTheme="minorHAnsi" w:cstheme="minorBidi"/>
-                <w:kern w:val="2"/>
-                <w:sz w:val="24"/>
-                <w:szCs w:val="24"/>
-                <w14:ligatures w14:val="standardContextual"/>
               </w:rPr>
               <w:tab/>
             </w:r>
@@ -1218,7 +1046,7 @@
               <w:rPr>
                 <w:webHidden/>
               </w:rPr>
-              <w:instrText xml:space="preserve"> PAGEREF _Toc192780022 \h </w:instrText>
+              <w:instrText xml:space="preserve"> PAGEREF _Toc212806544 \h </w:instrText>
             </w:r>
             <w:r>
               <w:rPr>
@@ -1235,7 +1063,7 @@
               <w:rPr>
                 <w:webHidden/>
               </w:rPr>
-              <w:t>24</w:t>
+              <w:t>25</w:t>
             </w:r>
             <w:r>
               <w:rPr>
@@ -1251,13 +1079,9 @@
             <w:rPr>
               <w:rFonts w:asciiTheme="minorHAnsi" w:eastAsiaTheme="minorEastAsia" w:hAnsiTheme="minorHAnsi" w:cstheme="minorBidi"/>
               <w:b w:val="0"/>
-              <w:kern w:val="2"/>
-              <w:sz w:val="24"/>
-              <w:szCs w:val="24"/>
-              <w14:ligatures w14:val="standardContextual"/>
             </w:rPr>
           </w:pPr>
-          <w:hyperlink w:anchor="_Toc192780023" w:history="1">
+          <w:hyperlink w:anchor="_Toc212806545" w:history="1">
             <w:r>
               <w:rPr>
                 <w:rStyle w:val="Hyperlink"/>
@@ -1271,10 +1095,6 @@
               <w:rPr>
                 <w:rFonts w:asciiTheme="minorHAnsi" w:eastAsiaTheme="minorEastAsia" w:hAnsiTheme="minorHAnsi" w:cstheme="minorBidi"/>
                 <w:b w:val="0"/>
-                <w:kern w:val="2"/>
-                <w:sz w:val="24"/>
-                <w:szCs w:val="24"/>
-                <w14:ligatures w14:val="standardContextual"/>
               </w:rPr>
               <w:tab/>
             </w:r>
@@ -1303,238 +1123,7 @@
               <w:rPr>
                 <w:webHidden/>
               </w:rPr>
-              <w:instrText xml:space="preserve"> PAGEREF _Toc192780023 \h </w:instrText>
-            </w:r>
-            <w:r>
-              <w:rPr>
-                <w:webHidden/>
-              </w:rPr>
-            </w:r>
-            <w:r>
-              <w:rPr>
-                <w:webHidden/>
-              </w:rPr>
-              <w:fldChar w:fldCharType="separate"/>
-            </w:r>
-            <w:r>
-              <w:rPr>
-                <w:webHidden/>
-              </w:rPr>
-              <w:t>25</w:t>
-            </w:r>
-            <w:r>
-              <w:rPr>
-                <w:webHidden/>
-              </w:rPr>
-              <w:fldChar w:fldCharType="end"/>
-            </w:r>
-          </w:hyperlink>
-        </w:p>
-        <w:p>
-          <w:pPr>
-            <w:pStyle w:val="TOC2"/>
-            <w:rPr>
-              <w:rFonts w:asciiTheme="minorHAnsi" w:eastAsiaTheme="minorEastAsia" w:hAnsiTheme="minorHAnsi" w:cstheme="minorBidi"/>
-              <w:kern w:val="2"/>
-              <w:sz w:val="24"/>
-              <w:szCs w:val="24"/>
-              <w14:ligatures w14:val="standardContextual"/>
-            </w:rPr>
-          </w:pPr>
-          <w:hyperlink w:anchor="_Toc192780024" w:history="1">
-            <w:r>
-              <w:rPr>
-                <w:rStyle w:val="Hyperlink"/>
-              </w:rPr>
-              <w:t>5.1</w:t>
-            </w:r>
-            <w:r>
-              <w:rPr>
-                <w:rFonts w:asciiTheme="minorHAnsi" w:eastAsiaTheme="minorEastAsia" w:hAnsiTheme="minorHAnsi" w:cstheme="minorBidi"/>
-                <w:kern w:val="2"/>
-                <w:sz w:val="24"/>
-                <w:szCs w:val="24"/>
-                <w14:ligatures w14:val="standardContextual"/>
-              </w:rPr>
-              <w:tab/>
-            </w:r>
-            <w:r>
-              <w:rPr>
-                <w:rStyle w:val="Hyperlink"/>
-              </w:rPr>
-              <w:t>Objective</w:t>
-            </w:r>
-            <w:r>
-              <w:rPr>
-                <w:webHidden/>
-              </w:rPr>
-              <w:tab/>
-            </w:r>
-            <w:r>
-              <w:rPr>
-                <w:webHidden/>
-              </w:rPr>
-              <w:fldChar w:fldCharType="begin"/>
-            </w:r>
-            <w:r>
-              <w:rPr>
-                <w:webHidden/>
-              </w:rPr>
-              <w:instrText xml:space="preserve"> PAGEREF _Toc192780024 \h </w:instrText>
-            </w:r>
-            <w:r>
-              <w:rPr>
-                <w:webHidden/>
-              </w:rPr>
-            </w:r>
-            <w:r>
-              <w:rPr>
-                <w:webHidden/>
-              </w:rPr>
-              <w:fldChar w:fldCharType="separate"/>
-            </w:r>
-            <w:r>
-              <w:rPr>
-                <w:webHidden/>
-              </w:rPr>
-              <w:t>25</w:t>
-            </w:r>
-            <w:r>
-              <w:rPr>
-                <w:webHidden/>
-              </w:rPr>
-              <w:fldChar w:fldCharType="end"/>
-            </w:r>
-          </w:hyperlink>
-        </w:p>
-        <w:p>
-          <w:pPr>
-            <w:pStyle w:val="TOC2"/>
-            <w:rPr>
-              <w:rFonts w:asciiTheme="minorHAnsi" w:eastAsiaTheme="minorEastAsia" w:hAnsiTheme="minorHAnsi" w:cstheme="minorBidi"/>
-              <w:kern w:val="2"/>
-              <w:sz w:val="24"/>
-              <w:szCs w:val="24"/>
-              <w14:ligatures w14:val="standardContextual"/>
-            </w:rPr>
-          </w:pPr>
-          <w:hyperlink w:anchor="_Toc192780025" w:history="1">
-            <w:r>
-              <w:rPr>
-                <w:rStyle w:val="Hyperlink"/>
-              </w:rPr>
-              <w:t>5.2</w:t>
-            </w:r>
-            <w:r>
-              <w:rPr>
-                <w:rFonts w:asciiTheme="minorHAnsi" w:eastAsiaTheme="minorEastAsia" w:hAnsiTheme="minorHAnsi" w:cstheme="minorBidi"/>
-                <w:kern w:val="2"/>
-                <w:sz w:val="24"/>
-                <w:szCs w:val="24"/>
-                <w14:ligatures w14:val="standardContextual"/>
-              </w:rPr>
-              <w:tab/>
-            </w:r>
-            <w:r>
-              <w:rPr>
-                <w:rStyle w:val="Hyperlink"/>
-              </w:rPr>
-              <w:t>Description</w:t>
-            </w:r>
-            <w:r>
-              <w:rPr>
-                <w:webHidden/>
-              </w:rPr>
-              <w:tab/>
-            </w:r>
-            <w:r>
-              <w:rPr>
-                <w:webHidden/>
-              </w:rPr>
-              <w:fldChar w:fldCharType="begin"/>
-            </w:r>
-            <w:r>
-              <w:rPr>
-                <w:webHidden/>
-              </w:rPr>
-              <w:instrText xml:space="preserve"> PAGEREF _Toc192780025 \h </w:instrText>
-            </w:r>
-            <w:r>
-              <w:rPr>
-                <w:webHidden/>
-              </w:rPr>
-            </w:r>
-            <w:r>
-              <w:rPr>
-                <w:webHidden/>
-              </w:rPr>
-              <w:fldChar w:fldCharType="separate"/>
-            </w:r>
-            <w:r>
-              <w:rPr>
-                <w:webHidden/>
-              </w:rPr>
-              <w:t>25</w:t>
-            </w:r>
-            <w:r>
-              <w:rPr>
-                <w:webHidden/>
-              </w:rPr>
-              <w:fldChar w:fldCharType="end"/>
-            </w:r>
-          </w:hyperlink>
-        </w:p>
-        <w:p>
-          <w:pPr>
-            <w:pStyle w:val="TOC2"/>
-            <w:rPr>
-              <w:rFonts w:asciiTheme="minorHAnsi" w:eastAsiaTheme="minorEastAsia" w:hAnsiTheme="minorHAnsi" w:cstheme="minorBidi"/>
-              <w:kern w:val="2"/>
-              <w:sz w:val="24"/>
-              <w:szCs w:val="24"/>
-              <w14:ligatures w14:val="standardContextual"/>
-            </w:rPr>
-          </w:pPr>
-          <w:hyperlink w:anchor="_Toc192780026" w:history="1">
-            <w:r>
-              <w:rPr>
-                <w:rStyle w:val="Hyperlink"/>
-              </w:rPr>
-              <w:t>5.3</w:t>
-            </w:r>
-            <w:r>
-              <w:rPr>
-                <w:rFonts w:asciiTheme="minorHAnsi" w:eastAsiaTheme="minorEastAsia" w:hAnsiTheme="minorHAnsi" w:cstheme="minorBidi"/>
-                <w:kern w:val="2"/>
-                <w:sz w:val="24"/>
-                <w:szCs w:val="24"/>
-                <w14:ligatures w14:val="standardContextual"/>
-              </w:rPr>
-              <w:tab/>
-            </w:r>
-            <w:r>
-              <w:rPr>
-                <w:rStyle w:val="Hyperlink"/>
-              </w:rPr>
-              <w:t>Flowchart</w:t>
-            </w:r>
-            <w:r>
-              <w:rPr>
-                <w:webHidden/>
-              </w:rPr>
-              <w:tab/>
-            </w:r>
-            <w:r>
-              <w:rPr>
-                <w:webHidden/>
-              </w:rPr>
-              <w:fldChar w:fldCharType="begin"/>
-            </w:r>
-            <w:r>
-              <w:rPr>
-                <w:webHidden/>
-              </w:rPr>
-              <w:instrText xml:space="preserve"> PAGEREF _Toc192780026 \h </w:instrText>
+              <w:instrText xml:space="preserve"> PAGEREF _Toc212806545 \h </w:instrText>
             </w:r>
             <w:r>
               <w:rPr>
@@ -1566,26 +1155,18 @@
             <w:pStyle w:val="TOC2"/>
             <w:rPr>
               <w:rFonts w:asciiTheme="minorHAnsi" w:eastAsiaTheme="minorEastAsia" w:hAnsiTheme="minorHAnsi" w:cstheme="minorBidi"/>
-              <w:kern w:val="2"/>
-              <w:sz w:val="24"/>
-              <w:szCs w:val="24"/>
-              <w14:ligatures w14:val="standardContextual"/>
             </w:rPr>
           </w:pPr>
-          <w:hyperlink w:anchor="_Toc192780027" w:history="1">
+          <w:hyperlink w:anchor="_Toc212806546" w:history="1">
             <w:r>
               <w:rPr>
                 <w:rStyle w:val="Hyperlink"/>
               </w:rPr>
-              <w:t>5.4</w:t>
+              <w:t>5.1</w:t>
             </w:r>
             <w:r>
               <w:rPr>
                 <w:rFonts w:asciiTheme="minorHAnsi" w:eastAsiaTheme="minorEastAsia" w:hAnsiTheme="minorHAnsi" w:cstheme="minorBidi"/>
-                <w:kern w:val="2"/>
-                <w:sz w:val="24"/>
-                <w:szCs w:val="24"/>
-                <w14:ligatures w14:val="standardContextual"/>
               </w:rPr>
               <w:tab/>
             </w:r>
@@ -1593,7 +1174,7 @@
               <w:rPr>
                 <w:rStyle w:val="Hyperlink"/>
               </w:rPr>
-              <w:t>Hardware Block Diagram</w:t>
+              <w:t>Objective</w:t>
             </w:r>
             <w:r>
               <w:rPr>
@@ -1611,7 +1192,145 @@
               <w:rPr>
                 <w:webHidden/>
               </w:rPr>
-              <w:instrText xml:space="preserve"> PAGEREF _Toc192780027 \h </w:instrText>
+              <w:instrText xml:space="preserve"> PAGEREF _Toc212806546 \h </w:instrText>
+            </w:r>
+            <w:r>
+              <w:rPr>
+                <w:webHidden/>
+              </w:rPr>
+            </w:r>
+            <w:r>
+              <w:rPr>
+                <w:webHidden/>
+              </w:rPr>
+              <w:fldChar w:fldCharType="separate"/>
+            </w:r>
+            <w:r>
+              <w:rPr>
+                <w:webHidden/>
+              </w:rPr>
+              <w:t>26</w:t>
+            </w:r>
+            <w:r>
+              <w:rPr>
+                <w:webHidden/>
+              </w:rPr>
+              <w:fldChar w:fldCharType="end"/>
+            </w:r>
+          </w:hyperlink>
+        </w:p>
+        <w:p>
+          <w:pPr>
+            <w:pStyle w:val="TOC2"/>
+            <w:rPr>
+              <w:rFonts w:asciiTheme="minorHAnsi" w:eastAsiaTheme="minorEastAsia" w:hAnsiTheme="minorHAnsi" w:cstheme="minorBidi"/>
+            </w:rPr>
+          </w:pPr>
+          <w:hyperlink w:anchor="_Toc212806547" w:history="1">
+            <w:r>
+              <w:rPr>
+                <w:rStyle w:val="Hyperlink"/>
+              </w:rPr>
+              <w:t>5.2</w:t>
+            </w:r>
+            <w:r>
+              <w:rPr>
+                <w:rFonts w:asciiTheme="minorHAnsi" w:eastAsiaTheme="minorEastAsia" w:hAnsiTheme="minorHAnsi" w:cstheme="minorBidi"/>
+              </w:rPr>
+              <w:tab/>
+            </w:r>
+            <w:r>
+              <w:rPr>
+                <w:rStyle w:val="Hyperlink"/>
+              </w:rPr>
+              <w:t>Description</w:t>
+            </w:r>
+            <w:r>
+              <w:rPr>
+                <w:webHidden/>
+              </w:rPr>
+              <w:tab/>
+            </w:r>
+            <w:r>
+              <w:rPr>
+                <w:webHidden/>
+              </w:rPr>
+              <w:fldChar w:fldCharType="begin"/>
+            </w:r>
+            <w:r>
+              <w:rPr>
+                <w:webHidden/>
+              </w:rPr>
+              <w:instrText xml:space="preserve"> PAGEREF _Toc212806547 \h </w:instrText>
+            </w:r>
+            <w:r>
+              <w:rPr>
+                <w:webHidden/>
+              </w:rPr>
+            </w:r>
+            <w:r>
+              <w:rPr>
+                <w:webHidden/>
+              </w:rPr>
+              <w:fldChar w:fldCharType="separate"/>
+            </w:r>
+            <w:r>
+              <w:rPr>
+                <w:webHidden/>
+              </w:rPr>
+              <w:t>26</w:t>
+            </w:r>
+            <w:r>
+              <w:rPr>
+                <w:webHidden/>
+              </w:rPr>
+              <w:fldChar w:fldCharType="end"/>
+            </w:r>
+          </w:hyperlink>
+        </w:p>
+        <w:p>
+          <w:pPr>
+            <w:pStyle w:val="TOC2"/>
+            <w:rPr>
+              <w:rFonts w:asciiTheme="minorHAnsi" w:eastAsiaTheme="minorEastAsia" w:hAnsiTheme="minorHAnsi" w:cstheme="minorBidi"/>
+            </w:rPr>
+          </w:pPr>
+          <w:hyperlink w:anchor="_Toc212806548" w:history="1">
+            <w:r>
+              <w:rPr>
+                <w:rStyle w:val="Hyperlink"/>
+              </w:rPr>
+              <w:t>5.3</w:t>
+            </w:r>
+            <w:r>
+              <w:rPr>
+                <w:rFonts w:asciiTheme="minorHAnsi" w:eastAsiaTheme="minorEastAsia" w:hAnsiTheme="minorHAnsi" w:cstheme="minorBidi"/>
+              </w:rPr>
+              <w:tab/>
+            </w:r>
+            <w:r>
+              <w:rPr>
+                <w:rStyle w:val="Hyperlink"/>
+              </w:rPr>
+              <w:t>Flowchart</w:t>
+            </w:r>
+            <w:r>
+              <w:rPr>
+                <w:webHidden/>
+              </w:rPr>
+              <w:tab/>
+            </w:r>
+            <w:r>
+              <w:rPr>
+                <w:webHidden/>
+              </w:rPr>
+              <w:fldChar w:fldCharType="begin"/>
+            </w:r>
+            <w:r>
+              <w:rPr>
+                <w:webHidden/>
+              </w:rPr>
+              <w:instrText xml:space="preserve"> PAGEREF _Toc212806548 \h </w:instrText>
             </w:r>
             <w:r>
               <w:rPr>
@@ -1643,26 +1362,18 @@
             <w:pStyle w:val="TOC2"/>
             <w:rPr>
               <w:rFonts w:asciiTheme="minorHAnsi" w:eastAsiaTheme="minorEastAsia" w:hAnsiTheme="minorHAnsi" w:cstheme="minorBidi"/>
-              <w:kern w:val="2"/>
-              <w:sz w:val="24"/>
-              <w:szCs w:val="24"/>
-              <w14:ligatures w14:val="standardContextual"/>
             </w:rPr>
           </w:pPr>
-          <w:hyperlink w:anchor="_Toc192780028" w:history="1">
+          <w:hyperlink w:anchor="_Toc212806549" w:history="1">
             <w:r>
               <w:rPr>
                 <w:rStyle w:val="Hyperlink"/>
               </w:rPr>
-              <w:t>5.5</w:t>
+              <w:t>5.4</w:t>
             </w:r>
             <w:r>
               <w:rPr>
                 <w:rFonts w:asciiTheme="minorHAnsi" w:eastAsiaTheme="minorEastAsia" w:hAnsiTheme="minorHAnsi" w:cstheme="minorBidi"/>
-                <w:kern w:val="2"/>
-                <w:sz w:val="24"/>
-                <w:szCs w:val="24"/>
-                <w14:ligatures w14:val="standardContextual"/>
               </w:rPr>
               <w:tab/>
             </w:r>
@@ -1670,7 +1381,7 @@
               <w:rPr>
                 <w:rStyle w:val="Hyperlink"/>
               </w:rPr>
-              <w:t>Hardware Setup</w:t>
+              <w:t>Hardware Block Diagram</w:t>
             </w:r>
             <w:r>
               <w:rPr>
@@ -1688,84 +1399,7 @@
               <w:rPr>
                 <w:webHidden/>
               </w:rPr>
-              <w:instrText xml:space="preserve"> PAGEREF _Toc192780028 \h </w:instrText>
-            </w:r>
-            <w:r>
-              <w:rPr>
-                <w:webHidden/>
-              </w:rPr>
-            </w:r>
-            <w:r>
-              <w:rPr>
-                <w:webHidden/>
-              </w:rPr>
-              <w:fldChar w:fldCharType="separate"/>
-            </w:r>
-            <w:r>
-              <w:rPr>
-                <w:webHidden/>
-              </w:rPr>
-              <w:t>27</w:t>
-            </w:r>
-            <w:r>
-              <w:rPr>
-                <w:webHidden/>
-              </w:rPr>
-              <w:fldChar w:fldCharType="end"/>
-            </w:r>
-          </w:hyperlink>
-        </w:p>
-        <w:p>
-          <w:pPr>
-            <w:pStyle w:val="TOC2"/>
-            <w:rPr>
-              <w:rFonts w:asciiTheme="minorHAnsi" w:eastAsiaTheme="minorEastAsia" w:hAnsiTheme="minorHAnsi" w:cstheme="minorBidi"/>
-              <w:kern w:val="2"/>
-              <w:sz w:val="24"/>
-              <w:szCs w:val="24"/>
-              <w14:ligatures w14:val="standardContextual"/>
-            </w:rPr>
-          </w:pPr>
-          <w:hyperlink w:anchor="_Toc192780029" w:history="1">
-            <w:r>
-              <w:rPr>
-                <w:rStyle w:val="Hyperlink"/>
-              </w:rPr>
-              <w:t>5.6</w:t>
-            </w:r>
-            <w:r>
-              <w:rPr>
-                <w:rFonts w:asciiTheme="minorHAnsi" w:eastAsiaTheme="minorEastAsia" w:hAnsiTheme="minorHAnsi" w:cstheme="minorBidi"/>
-                <w:kern w:val="2"/>
-                <w:sz w:val="24"/>
-                <w:szCs w:val="24"/>
-                <w14:ligatures w14:val="standardContextual"/>
-              </w:rPr>
-              <w:tab/>
-            </w:r>
-            <w:r>
-              <w:rPr>
-                <w:rStyle w:val="Hyperlink"/>
-              </w:rPr>
-              <w:t>Project Creation</w:t>
-            </w:r>
-            <w:r>
-              <w:rPr>
-                <w:webHidden/>
-              </w:rPr>
-              <w:tab/>
-            </w:r>
-            <w:r>
-              <w:rPr>
-                <w:webHidden/>
-              </w:rPr>
-              <w:fldChar w:fldCharType="begin"/>
-            </w:r>
-            <w:r>
-              <w:rPr>
-                <w:webHidden/>
-              </w:rPr>
-              <w:instrText xml:space="preserve"> PAGEREF _Toc192780029 \h </w:instrText>
+              <w:instrText xml:space="preserve"> PAGEREF _Toc212806549 \h </w:instrText>
             </w:r>
             <w:r>
               <w:rPr>
@@ -1797,13 +1431,147 @@
             <w:pStyle w:val="TOC2"/>
             <w:rPr>
               <w:rFonts w:asciiTheme="minorHAnsi" w:eastAsiaTheme="minorEastAsia" w:hAnsiTheme="minorHAnsi" w:cstheme="minorBidi"/>
-              <w:kern w:val="2"/>
-              <w:sz w:val="24"/>
-              <w:szCs w:val="24"/>
-              <w14:ligatures w14:val="standardContextual"/>
             </w:rPr>
           </w:pPr>
-          <w:hyperlink w:anchor="_Toc192780030" w:history="1">
+          <w:hyperlink w:anchor="_Toc212806550" w:history="1">
+            <w:r>
+              <w:rPr>
+                <w:rStyle w:val="Hyperlink"/>
+              </w:rPr>
+              <w:t>5.5</w:t>
+            </w:r>
+            <w:r>
+              <w:rPr>
+                <w:rFonts w:asciiTheme="minorHAnsi" w:eastAsiaTheme="minorEastAsia" w:hAnsiTheme="minorHAnsi" w:cstheme="minorBidi"/>
+              </w:rPr>
+              <w:tab/>
+            </w:r>
+            <w:r>
+              <w:rPr>
+                <w:rStyle w:val="Hyperlink"/>
+              </w:rPr>
+              <w:t>Hardware Setup</w:t>
+            </w:r>
+            <w:r>
+              <w:rPr>
+                <w:webHidden/>
+              </w:rPr>
+              <w:tab/>
+            </w:r>
+            <w:r>
+              <w:rPr>
+                <w:webHidden/>
+              </w:rPr>
+              <w:fldChar w:fldCharType="begin"/>
+            </w:r>
+            <w:r>
+              <w:rPr>
+                <w:webHidden/>
+              </w:rPr>
+              <w:instrText xml:space="preserve"> PAGEREF _Toc212806550 \h </w:instrText>
+            </w:r>
+            <w:r>
+              <w:rPr>
+                <w:webHidden/>
+              </w:rPr>
+            </w:r>
+            <w:r>
+              <w:rPr>
+                <w:webHidden/>
+              </w:rPr>
+              <w:fldChar w:fldCharType="separate"/>
+            </w:r>
+            <w:r>
+              <w:rPr>
+                <w:webHidden/>
+              </w:rPr>
+              <w:t>28</w:t>
+            </w:r>
+            <w:r>
+              <w:rPr>
+                <w:webHidden/>
+              </w:rPr>
+              <w:fldChar w:fldCharType="end"/>
+            </w:r>
+          </w:hyperlink>
+        </w:p>
+        <w:p>
+          <w:pPr>
+            <w:pStyle w:val="TOC2"/>
+            <w:rPr>
+              <w:rFonts w:asciiTheme="minorHAnsi" w:eastAsiaTheme="minorEastAsia" w:hAnsiTheme="minorHAnsi" w:cstheme="minorBidi"/>
+            </w:rPr>
+          </w:pPr>
+          <w:hyperlink w:anchor="_Toc212806551" w:history="1">
+            <w:r>
+              <w:rPr>
+                <w:rStyle w:val="Hyperlink"/>
+              </w:rPr>
+              <w:t>5.6</w:t>
+            </w:r>
+            <w:r>
+              <w:rPr>
+                <w:rFonts w:asciiTheme="minorHAnsi" w:eastAsiaTheme="minorEastAsia" w:hAnsiTheme="minorHAnsi" w:cstheme="minorBidi"/>
+              </w:rPr>
+              <w:tab/>
+            </w:r>
+            <w:r>
+              <w:rPr>
+                <w:rStyle w:val="Hyperlink"/>
+              </w:rPr>
+              <w:t>Project Creation</w:t>
+            </w:r>
+            <w:r>
+              <w:rPr>
+                <w:webHidden/>
+              </w:rPr>
+              <w:tab/>
+            </w:r>
+            <w:r>
+              <w:rPr>
+                <w:webHidden/>
+              </w:rPr>
+              <w:fldChar w:fldCharType="begin"/>
+            </w:r>
+            <w:r>
+              <w:rPr>
+                <w:webHidden/>
+              </w:rPr>
+              <w:instrText xml:space="preserve"> PAGEREF _Toc212806551 \h </w:instrText>
+            </w:r>
+            <w:r>
+              <w:rPr>
+                <w:webHidden/>
+              </w:rPr>
+            </w:r>
+            <w:r>
+              <w:rPr>
+                <w:webHidden/>
+              </w:rPr>
+              <w:fldChar w:fldCharType="separate"/>
+            </w:r>
+            <w:r>
+              <w:rPr>
+                <w:webHidden/>
+              </w:rPr>
+              <w:t>29</w:t>
+            </w:r>
+            <w:r>
+              <w:rPr>
+                <w:webHidden/>
+              </w:rPr>
+              <w:fldChar w:fldCharType="end"/>
+            </w:r>
+          </w:hyperlink>
+        </w:p>
+        <w:p>
+          <w:pPr>
+            <w:pStyle w:val="TOC2"/>
+            <w:rPr>
+              <w:rFonts w:asciiTheme="minorHAnsi" w:eastAsiaTheme="minorEastAsia" w:hAnsiTheme="minorHAnsi" w:cstheme="minorBidi"/>
+            </w:rPr>
+          </w:pPr>
+          <w:hyperlink w:anchor="_Toc212806552" w:history="1">
             <w:r>
               <w:rPr>
                 <w:rStyle w:val="Hyperlink"/>
@@ -1817,10 +1585,6 @@
             <w:r>
               <w:rPr>
                 <w:rFonts w:asciiTheme="minorHAnsi" w:eastAsiaTheme="minorEastAsia" w:hAnsiTheme="minorHAnsi" w:cstheme="minorBidi"/>
-                <w:kern w:val="2"/>
-                <w:sz w:val="24"/>
-                <w:szCs w:val="24"/>
-                <w14:ligatures w14:val="standardContextual"/>
               </w:rPr>
               <w:tab/>
             </w:r>
@@ -1850,86 +1614,7 @@
               <w:rPr>
                 <w:webHidden/>
               </w:rPr>
-              <w:instrText xml:space="preserve"> PAGEREF _Toc192780030 \h </w:instrText>
-            </w:r>
-            <w:r>
-              <w:rPr>
-                <w:webHidden/>
-              </w:rPr>
-            </w:r>
-            <w:r>
-              <w:rPr>
-                <w:webHidden/>
-              </w:rPr>
-              <w:fldChar w:fldCharType="separate"/>
-            </w:r>
-            <w:r>
-              <w:rPr>
-                <w:webHidden/>
-              </w:rPr>
-              <w:t>47</w:t>
-            </w:r>
-            <w:r>
-              <w:rPr>
-                <w:webHidden/>
-              </w:rPr>
-              <w:fldChar w:fldCharType="end"/>
-            </w:r>
-          </w:hyperlink>
-        </w:p>
-        <w:p>
-          <w:pPr>
-            <w:pStyle w:val="TOC1"/>
-            <w:rPr>
-              <w:rFonts w:asciiTheme="minorHAnsi" w:eastAsiaTheme="minorEastAsia" w:hAnsiTheme="minorHAnsi" w:cstheme="minorBidi"/>
-              <w:b w:val="0"/>
-              <w:kern w:val="2"/>
-              <w:sz w:val="24"/>
-              <w:szCs w:val="24"/>
-              <w14:ligatures w14:val="standardContextual"/>
-            </w:rPr>
-          </w:pPr>
-          <w:hyperlink w:anchor="_Toc192780031" w:history="1">
-            <w:r>
-              <w:rPr>
-                <w:rStyle w:val="Hyperlink"/>
-              </w:rPr>
-              <w:t>6</w:t>
-            </w:r>
-            <w:r>
-              <w:rPr>
-                <w:rFonts w:asciiTheme="minorHAnsi" w:eastAsiaTheme="minorEastAsia" w:hAnsiTheme="minorHAnsi" w:cstheme="minorBidi"/>
-                <w:b w:val="0"/>
-                <w:kern w:val="2"/>
-                <w:sz w:val="24"/>
-                <w:szCs w:val="24"/>
-                <w14:ligatures w14:val="standardContextual"/>
-              </w:rPr>
-              <w:tab/>
-            </w:r>
-            <w:r>
-              <w:rPr>
-                <w:rStyle w:val="Hyperlink"/>
-              </w:rPr>
-              <w:t>References</w:t>
-            </w:r>
-            <w:r>
-              <w:rPr>
-                <w:webHidden/>
-              </w:rPr>
-              <w:tab/>
-            </w:r>
-            <w:r>
-              <w:rPr>
-                <w:webHidden/>
-              </w:rPr>
-              <w:fldChar w:fldCharType="begin"/>
-            </w:r>
-            <w:r>
-              <w:rPr>
-                <w:webHidden/>
-              </w:rPr>
-              <w:instrText xml:space="preserve"> PAGEREF _Toc192780031 \h </w:instrText>
+              <w:instrText xml:space="preserve"> PAGEREF _Toc212806552 \h </w:instrText>
             </w:r>
             <w:r>
               <w:rPr>
@@ -1957,6 +1642,77 @@
           </w:hyperlink>
         </w:p>
         <w:p>
+          <w:pPr>
+            <w:pStyle w:val="TOC1"/>
+            <w:rPr>
+              <w:rFonts w:asciiTheme="minorHAnsi" w:eastAsiaTheme="minorEastAsia" w:hAnsiTheme="minorHAnsi" w:cstheme="minorBidi"/>
+              <w:b w:val="0"/>
+            </w:rPr>
+          </w:pPr>
+          <w:hyperlink w:anchor="_Toc212806553" w:history="1">
+            <w:r>
+              <w:rPr>
+                <w:rStyle w:val="Hyperlink"/>
+              </w:rPr>
+              <w:t>6</w:t>
+            </w:r>
+            <w:r>
+              <w:rPr>
+                <w:rFonts w:asciiTheme="minorHAnsi" w:eastAsiaTheme="minorEastAsia" w:hAnsiTheme="minorHAnsi" w:cstheme="minorBidi"/>
+                <w:b w:val="0"/>
+              </w:rPr>
+              <w:tab/>
+            </w:r>
+            <w:r>
+              <w:rPr>
+                <w:rStyle w:val="Hyperlink"/>
+              </w:rPr>
+              <w:t>References</w:t>
+            </w:r>
+            <w:r>
+              <w:rPr>
+                <w:webHidden/>
+              </w:rPr>
+              <w:tab/>
+            </w:r>
+            <w:r>
+              <w:rPr>
+                <w:webHidden/>
+              </w:rPr>
+              <w:fldChar w:fldCharType="begin"/>
+            </w:r>
+            <w:r>
+              <w:rPr>
+                <w:webHidden/>
+              </w:rPr>
+              <w:instrText xml:space="preserve"> PAGEREF _Toc212806553 \h </w:instrText>
+            </w:r>
+            <w:r>
+              <w:rPr>
+                <w:webHidden/>
+              </w:rPr>
+            </w:r>
+            <w:r>
+              <w:rPr>
+                <w:webHidden/>
+              </w:rPr>
+              <w:fldChar w:fldCharType="separate"/>
+            </w:r>
+            <w:r>
+              <w:rPr>
+                <w:webHidden/>
+              </w:rPr>
+              <w:t>49</w:t>
+            </w:r>
+            <w:r>
+              <w:rPr>
+                <w:webHidden/>
+              </w:rPr>
+              <w:fldChar w:fldCharType="end"/>
+            </w:r>
+          </w:hyperlink>
+        </w:p>
+        <w:p>
           <w:r>
             <w:rPr>
               <w:b/>
@@ -1997,8 +1753,8 @@
           <w:tab w:val="num" w:pos="1762"/>
         </w:tabs>
       </w:pPr>
-      <w:bookmarkStart w:id="11" w:name="_Toc192780012"/>
-      <w:bookmarkEnd w:id="10"/>
+      <w:bookmarkStart w:id="11" w:name="_Toc212806535"/>
+      <w:bookmarkEnd w:id="9"/>
       <w:r>
         <w:lastRenderedPageBreak/>
         <w:t>Introduction</w:t>
@@ -2110,7 +1866,7 @@
         </w:tabs>
       </w:pPr>
       <w:bookmarkStart w:id="12" w:name="_Required_development_tools"/>
-      <w:bookmarkStart w:id="13" w:name="_Toc192780013"/>
+      <w:bookmarkStart w:id="13" w:name="_Toc212806536"/>
       <w:bookmarkEnd w:id="12"/>
       <w:r>
         <w:t>Required development tools</w:t>
@@ -2750,7 +2506,7 @@
           <w:tab w:val="num" w:pos="1762"/>
         </w:tabs>
       </w:pPr>
-      <w:bookmarkStart w:id="15" w:name="_Toc192780014"/>
+      <w:bookmarkStart w:id="15" w:name="_Toc212806537"/>
       <w:r>
         <w:t>Prerequisites</w:t>
       </w:r>
@@ -2787,6 +2543,12 @@
           <w:szCs w:val="24"/>
         </w:rPr>
         <w:instrText>HYPERLINK "https://infineon-academy.csod.com/LMS/LoDetails/DetailsLo.aspx?loid=e11a8a78-7fa0-44fe-8c2b-dde1ef4f6e79"</w:instrText>
+      </w:r>
+      <w:r>
+        <w:rPr>
+          <w:sz w:val="24"/>
+          <w:szCs w:val="24"/>
+        </w:rPr>
       </w:r>
       <w:r>
         <w:rPr>
@@ -3007,7 +2769,7 @@
           <w:lang w:eastAsia="de-DE"/>
         </w:rPr>
       </w:pPr>
-      <w:bookmarkStart w:id="21" w:name="_Toc192780015"/>
+      <w:bookmarkStart w:id="21" w:name="_Toc212806538"/>
       <w:r>
         <w:rPr>
           <w:b/>
@@ -3071,7 +2833,7 @@
           <w:lang w:eastAsia="de-DE"/>
         </w:rPr>
       </w:pPr>
-      <w:bookmarkStart w:id="22" w:name="_Toc192780016"/>
+      <w:bookmarkStart w:id="22" w:name="_Toc212806539"/>
       <w:r>
         <w:rPr>
           <w:b/>
@@ -3181,7 +2943,7 @@
       <w:pPr>
         <w:pStyle w:val="Heading2"/>
       </w:pPr>
-      <w:bookmarkStart w:id="23" w:name="_Toc192780017"/>
+      <w:bookmarkStart w:id="23" w:name="_Toc212806540"/>
       <w:r>
         <w:t>Description</w:t>
       </w:r>
@@ -3352,7 +3114,7 @@
           <w:b w:val="0"/>
         </w:rPr>
       </w:pPr>
-      <w:bookmarkStart w:id="24" w:name="_Toc192780018"/>
+      <w:bookmarkStart w:id="24" w:name="_Toc212806541"/>
       <w:r>
         <w:rPr>
           <w:b w:val="0"/>
@@ -3446,7 +3208,7 @@
                     <v:shape id="_x0000_i1025" type="#_x0000_t75" style="width:475.7pt;height:588.05pt" o:ole="">
                       <v:imagedata r:id="rId24" o:title=""/>
                     </v:shape>
-                    <o:OLEObject Type="Embed" ProgID="Visio.Drawing.15" ShapeID="_x0000_i1025" DrawAspect="Content" ObjectID="_1823418823" r:id="rId25"/>
+                    <o:OLEObject Type="Embed" ProgID="Visio.Drawing.15" ShapeID="_x0000_i1025" DrawAspect="Content" ObjectID="_1823420084" r:id="rId25"/>
                   </w:object>
                 </w:r>
               </w:p>
@@ -3565,7 +3327,7 @@
                     <v:shape id="_x0000_i1026" type="#_x0000_t75" style="width:116.95pt;height:114.05pt" o:ole="">
                       <v:imagedata r:id="rId26" o:title=""/>
                     </v:shape>
-                    <o:OLEObject Type="Embed" ProgID="Visio.Drawing.15" ShapeID="_x0000_i1026" DrawAspect="Content" ObjectID="_1823418824" r:id="rId27"/>
+                    <o:OLEObject Type="Embed" ProgID="Visio.Drawing.15" ShapeID="_x0000_i1026" DrawAspect="Content" ObjectID="_1823420085" r:id="rId27"/>
                   </w:object>
                 </w:r>
               </w:p>
@@ -3622,20 +3384,20 @@
           <w:b w:val="0"/>
         </w:rPr>
       </w:pPr>
-      <w:bookmarkStart w:id="25" w:name="_Toc192780019"/>
+      <w:bookmarkStart w:id="25" w:name="_Toc212806542"/>
       <w:r>
         <w:rPr>
           <w:b w:val="0"/>
         </w:rPr>
         <w:t>Hardware Block Diagram</w:t>
       </w:r>
+      <w:r>
+        <w:rPr>
+          <w:b w:val="0"/>
+        </w:rPr>
+        <w:t xml:space="preserve"> and Setup</w:t>
+      </w:r>
       <w:bookmarkEnd w:id="25"/>
-      <w:r>
-        <w:rPr>
-          <w:b w:val="0"/>
-        </w:rPr>
-        <w:t xml:space="preserve"> and Setup</w:t>
-      </w:r>
     </w:p>
     <w:p>
       <w:pPr>
@@ -3890,7 +3652,7 @@
           <w:lang w:eastAsia="de-DE"/>
         </w:rPr>
       </w:pPr>
-      <w:bookmarkStart w:id="27" w:name="_Toc192780021"/>
+      <w:bookmarkStart w:id="27" w:name="_Toc212806543"/>
       <w:r>
         <w:rPr>
           <w:b/>
@@ -6113,13 +5875,33 @@
         <w:rPr>
           <w:lang w:eastAsia="de-DE"/>
         </w:rPr>
-        <w:t xml:space="preserve"> Project in the </w:t>
-      </w:r>
-      <w:r>
-        <w:rPr>
-          <w:lang w:eastAsia="de-DE"/>
-        </w:rPr>
-        <w:t xml:space="preserve">mtb </w:t>
+        <w:t xml:space="preserve"> </w:t>
+      </w:r>
+      <w:r>
+        <w:rPr>
+          <w:lang w:eastAsia="de-DE"/>
+        </w:rPr>
+        <w:t>p</w:t>
+      </w:r>
+      <w:r>
+        <w:rPr>
+          <w:lang w:eastAsia="de-DE"/>
+        </w:rPr>
+        <w:t xml:space="preserve">roject in the </w:t>
+      </w:r>
+      <w:proofErr w:type="spellStart"/>
+      <w:r>
+        <w:rPr>
+          <w:lang w:eastAsia="de-DE"/>
+        </w:rPr>
+        <w:t>mtb</w:t>
+      </w:r>
+      <w:proofErr w:type="spellEnd"/>
+      <w:r>
+        <w:rPr>
+          <w:lang w:eastAsia="de-DE"/>
+        </w:rPr>
+        <w:t xml:space="preserve"> </w:t>
       </w:r>
       <w:r>
         <w:rPr>
@@ -7915,13 +7697,66 @@
         <w:rPr>
           <w:lang w:eastAsia="de-DE"/>
         </w:rPr>
-        <w:t>in below figure we</w:t>
-      </w:r>
-      <w:r>
-        <w:rPr>
-          <w:lang w:eastAsia="de-DE"/>
-        </w:rPr>
-        <w:t xml:space="preserve"> have renamed the </w:t>
+        <w:t xml:space="preserve">in </w:t>
+      </w:r>
+      <w:r>
+        <w:rPr>
+          <w:lang w:eastAsia="de-DE"/>
+        </w:rPr>
+        <w:fldChar w:fldCharType="begin"/>
+      </w:r>
+      <w:r>
+        <w:rPr>
+          <w:lang w:eastAsia="de-DE"/>
+        </w:rPr>
+        <w:instrText xml:space="preserve"> REF _Ref212806488 \h </w:instrText>
+      </w:r>
+      <w:r>
+        <w:rPr>
+          <w:lang w:eastAsia="de-DE"/>
+        </w:rPr>
+      </w:r>
+      <w:r>
+        <w:rPr>
+          <w:lang w:eastAsia="de-DE"/>
+        </w:rPr>
+        <w:fldChar w:fldCharType="separate"/>
+      </w:r>
+      <w:r>
+        <w:t xml:space="preserve">Figure </w:t>
+      </w:r>
+      <w:r>
+        <w:rPr>
+          <w:noProof/>
+        </w:rPr>
+        <w:t>20</w:t>
+      </w:r>
+      <w:r>
+        <w:t>. Device Configurator - Pins – Creating Alias for USER_LED1</w:t>
+      </w:r>
+      <w:r>
+        <w:rPr>
+          <w:lang w:eastAsia="de-DE"/>
+        </w:rPr>
+        <w:fldChar w:fldCharType="end"/>
+      </w:r>
+      <w:r>
+        <w:rPr>
+          <w:lang w:eastAsia="de-DE"/>
+        </w:rPr>
+        <w:t xml:space="preserve"> </w:t>
+      </w:r>
+      <w:r>
+        <w:rPr>
+          <w:lang w:eastAsia="de-DE"/>
+        </w:rPr>
+        <w:t>we</w:t>
+      </w:r>
+      <w:r>
+        <w:rPr>
+          <w:lang w:eastAsia="de-DE"/>
+        </w:rPr>
+        <w:t xml:space="preserve"> have renamed </w:t>
       </w:r>
       <w:r>
         <w:rPr>
@@ -7967,7 +7802,52 @@
         <w:rPr>
           <w:lang w:eastAsia="de-DE"/>
         </w:rPr>
-        <w:t xml:space="preserve"> Go to File&gt; Save or alternatively hit Ctrl+S to save the change.</w:t>
+        <w:t xml:space="preserve"> Go to </w:t>
+      </w:r>
+      <w:r>
+        <w:rPr>
+          <w:b/>
+          <w:lang w:eastAsia="de-DE"/>
+        </w:rPr>
+        <w:t>File</w:t>
+      </w:r>
+      <w:r>
+        <w:rPr>
+          <w:lang w:eastAsia="de-DE"/>
+        </w:rPr>
+        <w:t xml:space="preserve"> </w:t>
+      </w:r>
+      <w:r>
+        <w:rPr>
+          <w:lang w:eastAsia="de-DE"/>
+        </w:rPr>
+        <w:t xml:space="preserve">&gt; </w:t>
+      </w:r>
+      <w:r>
+        <w:rPr>
+          <w:b/>
+          <w:lang w:eastAsia="de-DE"/>
+        </w:rPr>
+        <w:t>Save</w:t>
+      </w:r>
+      <w:r>
+        <w:rPr>
+          <w:lang w:eastAsia="de-DE"/>
+        </w:rPr>
+        <w:t xml:space="preserve"> or alternatively hit </w:t>
+      </w:r>
+      <w:r>
+        <w:rPr>
+          <w:b/>
+          <w:lang w:eastAsia="de-DE"/>
+        </w:rPr>
+        <w:t>Ctrl+S</w:t>
+      </w:r>
+      <w:r>
+        <w:rPr>
+          <w:lang w:eastAsia="de-DE"/>
+        </w:rPr>
+        <w:t xml:space="preserve"> to save the change.</w:t>
       </w:r>
     </w:p>
     <w:p>
@@ -7990,53 +7870,131 @@
           <w:lang w:eastAsia="de-DE"/>
         </w:rPr>
       </w:pPr>
-      <w:r>
-        <w:rPr>
-          <w:noProof/>
-        </w:rPr>
-        <w:drawing>
-          <wp:inline distT="0" distB="0" distL="0" distR="0" wp14:anchorId="7BE3E1D5" wp14:editId="5E509D6D">
-            <wp:extent cx="3409931" cy="3999220"/>
-            <wp:effectExtent l="0" t="0" r="635" b="1905"/>
-            <wp:docPr id="78" name="Picture 78"/>
-            <wp:cNvGraphicFramePr>
-              <a:graphicFrameLocks xmlns:a="http://schemas.openxmlformats.org/drawingml/2006/main" noChangeAspect="1"/>
-            </wp:cNvGraphicFramePr>
-            <a:graphic xmlns:a="http://schemas.openxmlformats.org/drawingml/2006/main">
-              <a:graphicData uri="http://schemas.openxmlformats.org/drawingml/2006/picture">
-                <pic:pic xmlns:pic="http://schemas.openxmlformats.org/drawingml/2006/picture">
-                  <pic:nvPicPr>
-                    <pic:cNvPr id="1" name=""/>
-                    <pic:cNvPicPr/>
-                  </pic:nvPicPr>
-                  <pic:blipFill>
-                    <a:blip r:embed="rId45">
-                      <a:extLst>
-                        <a:ext uri="{28A0092B-C50C-407E-A947-70E740481C1C}">
-                          <a14:useLocalDpi xmlns:a14="http://schemas.microsoft.com/office/drawing/2010/main" val="0"/>
-                        </a:ext>
-                      </a:extLst>
-                    </a:blip>
-                    <a:stretch>
-                      <a:fillRect/>
-                    </a:stretch>
-                  </pic:blipFill>
-                  <pic:spPr>
-                    <a:xfrm>
-                      <a:off x="0" y="0"/>
-                      <a:ext cx="3409931" cy="3999220"/>
-                    </a:xfrm>
-                    <a:prstGeom prst="rect">
-                      <a:avLst/>
-                    </a:prstGeom>
-                  </pic:spPr>
-                </pic:pic>
-              </a:graphicData>
-            </a:graphic>
-          </wp:inline>
-        </w:drawing>
-      </w:r>
-    </w:p>
+    </w:p>
+    <w:sdt>
+      <w:sdtPr>
+        <w:alias w:val="mioTextBlock"/>
+        <w:tag w:val="ae651eb4-bf90-4c60-b3d9-7af05d89c4fa"/>
+        <w:id w:val="1786006272"/>
+        <w:placeholder>
+          <w:docPart w:val="DefaultPlaceholder_-1854013440"/>
+        </w:placeholder>
+        <w15:appearance w15:val="hidden"/>
+      </w:sdtPr>
+      <w:sdtEndPr>
+        <w:rPr>
+          <w:b/>
+        </w:rPr>
+      </w:sdtEndPr>
+      <w:sdtContent>
+        <w:tbl>
+          <w:tblPr>
+            <w:tblStyle w:val="InfineonPicture"/>
+            <w:tblW w:w="5000" w:type="pct"/>
+            <w:tblCellMar>
+              <w:left w:w="0" w:type="dxa"/>
+              <w:right w:w="0" w:type="dxa"/>
+            </w:tblCellMar>
+            <w:tblLook w:val="05E0" w:firstRow="1" w:lastRow="1" w:firstColumn="1" w:lastColumn="1" w:noHBand="0" w:noVBand="1"/>
+          </w:tblPr>
+          <w:tblGrid>
+            <w:gridCol w:w="10196"/>
+          </w:tblGrid>
+          <w:tr>
+            <w:tc>
+              <w:tcPr>
+                <w:tcW w:w="5000" w:type="pct"/>
+              </w:tcPr>
+              <w:p>
+                <w:pPr>
+                  <w:pStyle w:val="TableCell-c"/>
+                </w:pPr>
+                <w:r>
+                  <w:rPr>
+                    <w:noProof/>
+                  </w:rPr>
+                  <w:drawing>
+                    <wp:inline distT="0" distB="0" distL="0" distR="0" wp14:anchorId="25B073A6" wp14:editId="7D51620C">
+                      <wp:extent cx="3409931" cy="3999220"/>
+                      <wp:effectExtent l="0" t="0" r="635" b="1905"/>
+                      <wp:docPr id="78" name="Picture 78"/>
+                      <wp:cNvGraphicFramePr>
+                        <a:graphicFrameLocks xmlns:a="http://schemas.openxmlformats.org/drawingml/2006/main" noChangeAspect="1"/>
+                      </wp:cNvGraphicFramePr>
+                      <a:graphic xmlns:a="http://schemas.openxmlformats.org/drawingml/2006/main">
+                        <a:graphicData uri="http://schemas.openxmlformats.org/drawingml/2006/picture">
+                          <pic:pic xmlns:pic="http://schemas.openxmlformats.org/drawingml/2006/picture">
+                            <pic:nvPicPr>
+                              <pic:cNvPr id="1" name=""/>
+                              <pic:cNvPicPr/>
+                            </pic:nvPicPr>
+                            <pic:blipFill>
+                              <a:blip r:embed="rId45">
+                                <a:extLst>
+                                  <a:ext uri="{28A0092B-C50C-407E-A947-70E740481C1C}">
+                                    <a14:useLocalDpi xmlns:a14="http://schemas.microsoft.com/office/drawing/2010/main" val="0"/>
+                                  </a:ext>
+                                </a:extLst>
+                              </a:blip>
+                              <a:stretch>
+                                <a:fillRect/>
+                              </a:stretch>
+                            </pic:blipFill>
+                            <pic:spPr>
+                              <a:xfrm>
+                                <a:off x="0" y="0"/>
+                                <a:ext cx="3409931" cy="3999220"/>
+                              </a:xfrm>
+                              <a:prstGeom prst="rect">
+                                <a:avLst/>
+                              </a:prstGeom>
+                            </pic:spPr>
+                          </pic:pic>
+                        </a:graphicData>
+                      </a:graphic>
+                    </wp:inline>
+                  </w:drawing>
+                </w:r>
+              </w:p>
+            </w:tc>
+          </w:tr>
+        </w:tbl>
+        <w:p>
+          <w:pPr>
+            <w:pStyle w:val="Figuretitlenew"/>
+            <w:rPr>
+              <w:lang w:eastAsia="de-DE"/>
+            </w:rPr>
+          </w:pPr>
+          <w:bookmarkStart w:id="28" w:name="_Ref212806488"/>
+          <w:r>
+            <w:t xml:space="preserve">Figure </w:t>
+          </w:r>
+          <w:r>
+            <w:fldChar w:fldCharType="begin"/>
+          </w:r>
+          <w:r>
+            <w:instrText xml:space="preserve"> SEQ Figure \* ARABIC </w:instrText>
+          </w:r>
+          <w:r>
+            <w:fldChar w:fldCharType="separate"/>
+          </w:r>
+          <w:r>
+            <w:rPr>
+              <w:noProof/>
+            </w:rPr>
+            <w:t>20</w:t>
+          </w:r>
+          <w:r>
+            <w:fldChar w:fldCharType="end"/>
+          </w:r>
+          <w:r>
+            <w:t>. Device Configurator - Pins – Creating Alias for USER_LED1</w:t>
+          </w:r>
+        </w:p>
+      </w:sdtContent>
+    </w:sdt>
+    <w:bookmarkEnd w:id="28" w:displacedByCustomXml="prev"/>
     <w:p>
       <w:pPr>
         <w:spacing w:before="160" w:after="160"/>
@@ -8067,7 +8025,45 @@
         <w:rPr>
           <w:lang w:eastAsia="de-DE"/>
         </w:rPr>
-        <w:t xml:space="preserve"> the UART pins required for the Hello world code example.</w:t>
+        <w:t xml:space="preserve"> the UART pins required for </w:t>
+      </w:r>
+      <w:r>
+        <w:rPr>
+          <w:lang w:eastAsia="de-DE"/>
+        </w:rPr>
+        <w:t xml:space="preserve">our </w:t>
+      </w:r>
+      <w:proofErr w:type="spellStart"/>
+      <w:r>
+        <w:rPr>
+          <w:lang w:eastAsia="de-DE"/>
+        </w:rPr>
+        <w:t>PSOC_Edge_</w:t>
+      </w:r>
+      <w:r>
+        <w:rPr>
+          <w:lang w:eastAsia="de-DE"/>
+        </w:rPr>
+        <w:t>Hello</w:t>
+      </w:r>
+      <w:r>
+        <w:rPr>
+          <w:lang w:eastAsia="de-DE"/>
+        </w:rPr>
+        <w:t>_W</w:t>
+      </w:r>
+      <w:r>
+        <w:rPr>
+          <w:lang w:eastAsia="de-DE"/>
+        </w:rPr>
+        <w:t>orld</w:t>
+      </w:r>
+      <w:proofErr w:type="spellEnd"/>
+      <w:r>
+        <w:rPr>
+          <w:lang w:eastAsia="de-DE"/>
+        </w:rPr>
+        <w:t xml:space="preserve"> code example.</w:t>
       </w:r>
       <w:r>
         <w:rPr>
@@ -8080,7 +8076,35 @@
           <w:b/>
           <w:lang w:eastAsia="de-DE"/>
         </w:rPr>
-        <w:t>PORT 6.5</w:t>
+        <w:t>P</w:t>
+      </w:r>
+      <w:r>
+        <w:rPr>
+          <w:b/>
+          <w:lang w:eastAsia="de-DE"/>
+        </w:rPr>
+        <w:t>ort</w:t>
+      </w:r>
+      <w:r>
+        <w:rPr>
+          <w:b/>
+          <w:lang w:eastAsia="de-DE"/>
+        </w:rPr>
+        <w:t xml:space="preserve"> 6</w:t>
+      </w:r>
+      <w:r>
+        <w:rPr>
+          <w:b/>
+          <w:lang w:eastAsia="de-DE"/>
+        </w:rPr>
+        <w:t xml:space="preserve"> Pin </w:t>
+      </w:r>
+      <w:r>
+        <w:rPr>
+          <w:b/>
+          <w:lang w:eastAsia="de-DE"/>
+        </w:rPr>
+        <w:t>5</w:t>
       </w:r>
       <w:r>
         <w:rPr>
@@ -8106,7 +8130,21 @@
           <w:b/>
           <w:lang w:eastAsia="de-DE"/>
         </w:rPr>
-        <w:t>Port 6.7</w:t>
+        <w:t>Port 6</w:t>
+      </w:r>
+      <w:r>
+        <w:rPr>
+          <w:b/>
+          <w:lang w:eastAsia="de-DE"/>
+        </w:rPr>
+        <w:t xml:space="preserve"> Pin </w:t>
+      </w:r>
+      <w:r>
+        <w:rPr>
+          <w:b/>
+          <w:lang w:eastAsia="de-DE"/>
+        </w:rPr>
+        <w:t>7</w:t>
       </w:r>
       <w:r>
         <w:rPr>
@@ -8120,6 +8158,12 @@
           <w:lang w:eastAsia="de-DE"/>
         </w:rPr>
         <w:t>UART_TX</w:t>
+      </w:r>
+      <w:r>
+        <w:rPr>
+          <w:lang w:eastAsia="de-DE"/>
+        </w:rPr>
+        <w:t>.</w:t>
       </w:r>
     </w:p>
     <w:p>
@@ -8248,7 +8292,7 @@
             <w:rPr>
               <w:noProof/>
             </w:rPr>
-            <w:t>20</w:t>
+            <w:t>21</w:t>
           </w:r>
           <w:r>
             <w:fldChar w:fldCharType="end"/>
@@ -8392,7 +8436,7 @@
             <w:rPr>
               <w:noProof/>
             </w:rPr>
-            <w:t>21</w:t>
+            <w:t>22</w:t>
           </w:r>
           <w:r>
             <w:fldChar w:fldCharType="end"/>
@@ -8459,7 +8503,19 @@
         <w:rPr>
           <w:lang w:eastAsia="de-DE"/>
         </w:rPr>
-        <w:t xml:space="preserve">”, we will be using these during application </w:t>
+        <w:t>”,</w:t>
+      </w:r>
+      <w:r>
+        <w:rPr>
+          <w:lang w:eastAsia="de-DE"/>
+        </w:rPr>
+        <w:t xml:space="preserve"> as</w:t>
+      </w:r>
+      <w:r>
+        <w:rPr>
+          <w:lang w:eastAsia="de-DE"/>
+        </w:rPr>
+        <w:t xml:space="preserve"> we will be using these during application </w:t>
       </w:r>
       <w:proofErr w:type="gramStart"/>
       <w:r>
@@ -8510,19 +8566,60 @@
         <w:rPr>
           <w:lang w:eastAsia="de-DE"/>
         </w:rPr>
-        <w:t xml:space="preserve">Select File &gt; Save to save our changes, and then </w:t>
-      </w:r>
-      <w:r>
-        <w:rPr>
-          <w:lang w:eastAsia="de-DE"/>
-        </w:rPr>
-        <w:t xml:space="preserve">click on the Window x </w:t>
-      </w:r>
-      <w:r>
-        <w:rPr>
-          <w:lang w:eastAsia="de-DE"/>
-        </w:rPr>
-        <w:t>Close to quit the configurator.</w:t>
+        <w:t xml:space="preserve">Select </w:t>
+      </w:r>
+      <w:r>
+        <w:rPr>
+          <w:b/>
+          <w:lang w:eastAsia="de-DE"/>
+        </w:rPr>
+        <w:t>File</w:t>
+      </w:r>
+      <w:r>
+        <w:rPr>
+          <w:lang w:eastAsia="de-DE"/>
+        </w:rPr>
+        <w:t xml:space="preserve"> &gt; </w:t>
+      </w:r>
+      <w:r>
+        <w:rPr>
+          <w:b/>
+          <w:lang w:eastAsia="de-DE"/>
+        </w:rPr>
+        <w:t>Save</w:t>
+      </w:r>
+      <w:r>
+        <w:rPr>
+          <w:lang w:eastAsia="de-DE"/>
+        </w:rPr>
+        <w:t xml:space="preserve"> to save our changes, and then </w:t>
+      </w:r>
+      <w:r>
+        <w:rPr>
+          <w:b/>
+          <w:lang w:eastAsia="de-DE"/>
+        </w:rPr>
+        <w:t>Close</w:t>
+      </w:r>
+      <w:r>
+        <w:rPr>
+          <w:lang w:eastAsia="de-DE"/>
+        </w:rPr>
+        <w:t xml:space="preserve"> the window</w:t>
+      </w:r>
+      <w:r>
+        <w:rPr>
+          <w:lang w:eastAsia="de-DE"/>
+        </w:rPr>
+        <w:t xml:space="preserve"> t</w:t>
+      </w:r>
+      <w:bookmarkStart w:id="29" w:name="_GoBack"/>
+      <w:bookmarkEnd w:id="29"/>
+      <w:r>
+        <w:rPr>
+          <w:lang w:eastAsia="de-DE"/>
+        </w:rPr>
+        <w:t>o quit the configurator.</w:t>
       </w:r>
     </w:p>
     <w:p>
@@ -8834,7 +8931,7 @@
             <w:rPr>
               <w:noProof/>
             </w:rPr>
-            <w:t>22</w:t>
+            <w:t>23</w:t>
           </w:r>
           <w:r>
             <w:fldChar w:fldCharType="end"/>
@@ -8843,7 +8940,13 @@
             <w:tab/>
           </w:r>
           <w:r>
-            <w:t xml:space="preserve">Device Configurator </w:t>
+            <w:t>Device Configurator</w:t>
+          </w:r>
+          <w:r>
+            <w:t xml:space="preserve"> -</w:t>
+          </w:r>
+          <w:r>
+            <w:t xml:space="preserve"> </w:t>
           </w:r>
           <w:proofErr w:type="spellStart"/>
           <w:r>
@@ -8862,8 +8965,6 @@
           </w:r>
           <w:proofErr w:type="spellEnd"/>
         </w:p>
-        <w:bookmarkStart w:id="28" w:name="_GoBack" w:displacedByCustomXml="next"/>
-        <w:bookmarkEnd w:id="28" w:displacedByCustomXml="next"/>
       </w:sdtContent>
     </w:sdt>
     <w:p>
@@ -8987,7 +9088,7 @@
             <w:rPr>
               <w:noProof/>
             </w:rPr>
-            <w:t>22</w:t>
+            <w:t>24</w:t>
           </w:r>
           <w:r>
             <w:fldChar w:fldCharType="end"/>
@@ -12079,7 +12180,7 @@
           <w:szCs w:val="18"/>
         </w:rPr>
       </w:pPr>
-      <w:bookmarkStart w:id="29" w:name="_Hlk192779201"/>
+      <w:bookmarkStart w:id="30" w:name="_Hlk192779201"/>
       <w:r>
         <w:rPr>
           <w:rFonts w:ascii="Courier New" w:hAnsi="Courier New" w:cs="Courier New"/>
@@ -12089,7 +12190,7 @@
         <w:t>/* Main loop */</w:t>
       </w:r>
     </w:p>
-    <w:bookmarkEnd w:id="29"/>
+    <w:bookmarkEnd w:id="30"/>
     <w:p>
       <w:pPr>
         <w:autoSpaceDE w:val="0"/>
@@ -16724,7 +16825,7 @@
           <w:lang w:eastAsia="de-DE"/>
         </w:rPr>
       </w:pPr>
-      <w:bookmarkStart w:id="30" w:name="_Toc192780022"/>
+      <w:bookmarkStart w:id="31" w:name="_Toc212806544"/>
       <w:r>
         <w:rPr>
           <w:b/>
@@ -16735,7 +16836,7 @@
         </w:rPr>
         <w:t>Conclusion</w:t>
       </w:r>
-      <w:bookmarkEnd w:id="30"/>
+      <w:bookmarkEnd w:id="31"/>
       <w:r>
         <w:rPr>
           <w:b/>
@@ -16839,7 +16940,7 @@
           <w:lang w:eastAsia="de-DE"/>
         </w:rPr>
       </w:pPr>
-      <w:bookmarkStart w:id="31" w:name="_Toc192780023"/>
+      <w:bookmarkStart w:id="32" w:name="_Toc212806545"/>
       <w:r>
         <w:rPr>
           <w:b/>
@@ -16851,7 +16952,7 @@
         <w:lastRenderedPageBreak/>
         <w:t>Code Example 2: IPC queues using HAL</w:t>
       </w:r>
-      <w:bookmarkEnd w:id="31"/>
+      <w:bookmarkEnd w:id="32"/>
     </w:p>
     <w:p>
       <w:pPr>
@@ -16865,11 +16966,11 @@
       <w:r>
         <w:t xml:space="preserve"> </w:t>
       </w:r>
-      <w:bookmarkStart w:id="32" w:name="_Toc192780024"/>
+      <w:bookmarkStart w:id="33" w:name="_Toc212806546"/>
       <w:r>
         <w:t>Objective</w:t>
       </w:r>
-      <w:bookmarkEnd w:id="32"/>
+      <w:bookmarkEnd w:id="33"/>
     </w:p>
     <w:p>
       <w:pPr>
@@ -16884,11 +16985,11 @@
       <w:pPr>
         <w:pStyle w:val="Heading2"/>
       </w:pPr>
-      <w:bookmarkStart w:id="33" w:name="_Toc192780025"/>
+      <w:bookmarkStart w:id="34" w:name="_Toc212806547"/>
       <w:r>
         <w:t>Description</w:t>
       </w:r>
-      <w:bookmarkEnd w:id="33"/>
+      <w:bookmarkEnd w:id="34"/>
     </w:p>
     <w:p>
       <w:pPr>
@@ -17085,11 +17186,11 @@
       <w:pPr>
         <w:pStyle w:val="Heading2"/>
       </w:pPr>
-      <w:bookmarkStart w:id="34" w:name="_Toc192780026"/>
+      <w:bookmarkStart w:id="35" w:name="_Toc212806548"/>
       <w:r>
         <w:t>Flowchart</w:t>
       </w:r>
-      <w:bookmarkEnd w:id="34"/>
+      <w:bookmarkEnd w:id="35"/>
     </w:p>
     <w:p>
       <w:pPr>
@@ -17160,12 +17261,12 @@
       <w:pPr>
         <w:pStyle w:val="Heading2"/>
       </w:pPr>
-      <w:bookmarkStart w:id="35" w:name="_Toc192780027"/>
+      <w:bookmarkStart w:id="36" w:name="_Toc212806549"/>
       <w:r>
         <w:lastRenderedPageBreak/>
         <w:t>Hardware Block Diagram</w:t>
       </w:r>
-      <w:bookmarkEnd w:id="35"/>
+      <w:bookmarkEnd w:id="36"/>
     </w:p>
     <w:p>
       <w:pPr>
@@ -17230,11 +17331,11 @@
       <w:pPr>
         <w:pStyle w:val="Heading2"/>
       </w:pPr>
-      <w:bookmarkStart w:id="36" w:name="_Toc192780028"/>
+      <w:bookmarkStart w:id="37" w:name="_Toc212806550"/>
       <w:r>
         <w:t>Hardware Setup</w:t>
       </w:r>
-      <w:bookmarkEnd w:id="36"/>
+      <w:bookmarkEnd w:id="37"/>
     </w:p>
     <w:p>
       <w:pPr>
@@ -17316,12 +17417,12 @@
       <w:pPr>
         <w:pStyle w:val="Heading2"/>
       </w:pPr>
-      <w:bookmarkStart w:id="37" w:name="_Toc192780029"/>
+      <w:bookmarkStart w:id="38" w:name="_Toc212806551"/>
       <w:r>
         <w:lastRenderedPageBreak/>
         <w:t>Project Creation</w:t>
       </w:r>
-      <w:bookmarkEnd w:id="37"/>
+      <w:bookmarkEnd w:id="38"/>
       <w:r>
         <w:t xml:space="preserve"> </w:t>
       </w:r>
@@ -18809,7 +18910,7 @@
           <w:noProof/>
         </w:rPr>
       </w:pPr>
-      <w:bookmarkStart w:id="38" w:name="_Hlk147320247"/>
+      <w:bookmarkStart w:id="39" w:name="_Hlk147320247"/>
       <w:r>
         <w:rPr>
           <w:b w:val="0"/>
@@ -19589,8 +19690,8 @@
           <w:bCs/>
         </w:rPr>
       </w:pPr>
-      <w:bookmarkStart w:id="39" w:name="_Hlk147320439"/>
-      <w:bookmarkEnd w:id="38"/>
+      <w:bookmarkStart w:id="40" w:name="_Hlk147320439"/>
+      <w:bookmarkEnd w:id="39"/>
       <w:r>
         <w:rPr>
           <w:b w:val="0"/>
@@ -20206,11 +20307,11 @@
       <w:r>
         <w:t xml:space="preserve"> </w:t>
       </w:r>
-      <w:bookmarkStart w:id="40" w:name="_Hlk147313194"/>
+      <w:bookmarkStart w:id="41" w:name="_Hlk147313194"/>
       <w:r>
         <w:t xml:space="preserve">&lt;code snippet&gt; </w:t>
       </w:r>
-      <w:bookmarkEnd w:id="40"/>
+      <w:bookmarkEnd w:id="41"/>
       <w:r>
         <w:rPr>
           <w:b w:val="0"/>
@@ -20228,7 +20329,7 @@
         </w:rPr>
         <w:t xml:space="preserve"> file</w:t>
       </w:r>
-      <w:bookmarkEnd w:id="39"/>
+      <w:bookmarkEnd w:id="40"/>
       <w:r>
         <w:rPr>
           <w:b w:val="0"/>
@@ -21524,7 +21625,7 @@
           <w:lang w:val="en-IN"/>
         </w:rPr>
       </w:pPr>
-      <w:bookmarkStart w:id="41" w:name="_Hlk147320910"/>
+      <w:bookmarkStart w:id="42" w:name="_Hlk147320910"/>
       <w:r>
         <w:rPr>
           <w:lang w:val="en-IN"/>
@@ -21532,7 +21633,7 @@
         <w:t>The below code is the variables required for the communication between the cores:</w:t>
       </w:r>
     </w:p>
-    <w:bookmarkEnd w:id="41"/>
+    <w:bookmarkEnd w:id="42"/>
     <w:p>
       <w:pPr>
         <w:autoSpaceDE w:val="0"/>
@@ -35194,7 +35295,7 @@
           <w:lang w:eastAsia="de-DE"/>
         </w:rPr>
       </w:pPr>
-      <w:bookmarkStart w:id="42" w:name="_Toc192780030"/>
+      <w:bookmarkStart w:id="43" w:name="_Toc212806552"/>
       <w:r>
         <w:rPr>
           <w:b/>
@@ -35205,7 +35306,7 @@
         </w:rPr>
         <w:t>Conclusion</w:t>
       </w:r>
-      <w:bookmarkEnd w:id="42"/>
+      <w:bookmarkEnd w:id="43"/>
       <w:r>
         <w:rPr>
           <w:b/>
@@ -35245,12 +35346,12 @@
       <w:pPr>
         <w:pStyle w:val="Heading1"/>
       </w:pPr>
-      <w:bookmarkStart w:id="43" w:name="_Toc192780031"/>
+      <w:bookmarkStart w:id="44" w:name="_Toc212806553"/>
       <w:r>
         <w:lastRenderedPageBreak/>
         <w:t>References</w:t>
       </w:r>
-      <w:bookmarkEnd w:id="43"/>
+      <w:bookmarkEnd w:id="44"/>
       <w:r>
         <w:t xml:space="preserve"> </w:t>
       </w:r>
@@ -36324,7 +36425,7 @@
         <v:shape id="_x0000_s2052" type="#_x0000_t75" style="position:absolute;margin-left:-45.75pt;margin-top:62.5pt;width:602.45pt;height:287.2pt;z-index:-251642880;mso-position-horizontal-relative:text;mso-position-vertical-relative:text">
           <v:imagedata r:id="rId1" o:title=""/>
         </v:shape>
-        <o:OLEObject Type="Embed" ProgID="Visio.Drawing.15" ShapeID="_x0000_s2052" DrawAspect="Content" ObjectID="_1823418825" r:id="rId2"/>
+        <o:OLEObject Type="Embed" ProgID="Visio.Drawing.15" ShapeID="_x0000_s2052" DrawAspect="Content" ObjectID="_1823420086" r:id="rId2"/>
       </w:object>
     </w:r>
     <w:r>
@@ -37657,7 +37758,7 @@
         <v:shape id="_x0000_s2051" type="#_x0000_t75" style="position:absolute;margin-left:-45.75pt;margin-top:62.5pt;width:602.45pt;height:287.2pt;z-index:-251643904;mso-position-horizontal-relative:text;mso-position-vertical-relative:text">
           <v:imagedata r:id="rId1" o:title=""/>
         </v:shape>
-        <o:OLEObject Type="Embed" ProgID="Visio.Drawing.15" ShapeID="_x0000_s2051" DrawAspect="Content" ObjectID="_1823418826" r:id="rId2"/>
+        <o:OLEObject Type="Embed" ProgID="Visio.Drawing.15" ShapeID="_x0000_s2051" DrawAspect="Content" ObjectID="_1823420087" r:id="rId2"/>
       </w:object>
     </w:r>
     <w:r>
@@ -37865,8 +37966,8 @@
                                 <w:r>
                                   <w:t>IMPORTANT NOTICE</w:t>
                                 </w:r>
-                                <w:bookmarkStart w:id="44" w:name="ImportantNotice"/>
-                                <w:bookmarkEnd w:id="44"/>
+                                <w:bookmarkStart w:id="45" w:name="ImportantNotice"/>
+                                <w:bookmarkEnd w:id="45"/>
                               </w:p>
                               <w:p>
                                 <w:pPr>
@@ -38172,8 +38273,8 @@
                           <w:r>
                             <w:t>IMPORTANT NOTICE</w:t>
                           </w:r>
-                          <w:bookmarkStart w:id="45" w:name="ImportantNotice"/>
-                          <w:bookmarkEnd w:id="45"/>
+                          <w:bookmarkStart w:id="46" w:name="ImportantNotice"/>
+                          <w:bookmarkEnd w:id="46"/>
                         </w:p>
                         <w:p>
                           <w:pPr>
@@ -49555,6 +49656,12 @@
       <TimestampUtc>2023-08-07T12:57:01.087Z</TimestampUtc>
       <TextBlockMetadataId>a66b21ad-0144-491d-8113-427d4f6ce595</TextBlockMetadataId>
     </TextBlockMetadata>
+    <TextBlockMetadata>
+      <ElementId>1a622969-9435-42df-b756-4af60deadd4b</ElementId>
+      <ContentTag>YzCqVxr4CkGOIjtz8kQsF1txdvNf0IhJnc8A53W8JnY=</ContentTag>
+      <TimestampUtc>2023-08-07T12:57:01.087Z</TimestampUtc>
+      <TextBlockMetadataId>ae651eb4-bf90-4c60-b3d9-7af05d89c4fa</TextBlockMetadataId>
+    </TextBlockMetadata>
   </TextBlockElements>
   <PlaceholderHiddenState>
     <HideablePlaceholderGuids/>
@@ -49602,7 +49709,7 @@
 </file>
 
 <file path=customXml/itemProps4.xml><?xml version="1.0" encoding="utf-8"?>
-<ds:datastoreItem xmlns:ds="http://schemas.openxmlformats.org/officeDocument/2006/customXml" ds:itemID="{BFAA2C29-9636-4EEC-BF95-A49A2D6AC154}">
+<ds:datastoreItem xmlns:ds="http://schemas.openxmlformats.org/officeDocument/2006/customXml" ds:itemID="{C6A105FA-8225-4E08-B80C-D37EDC461D90}">
   <ds:schemaRefs>
     <ds:schemaRef ds:uri="http://www.made-in-office.com/empower/docs/template/v1"/>
   </ds:schemaRefs>
@@ -49610,7 +49717,7 @@
 </file>
 
 <file path=customXml/itemProps5.xml><?xml version="1.0" encoding="utf-8"?>
-<ds:datastoreItem xmlns:ds="http://schemas.openxmlformats.org/officeDocument/2006/customXml" ds:itemID="{4D7D7B99-6E06-40EC-BE1C-A9DCDD49012C}">
+<ds:datastoreItem xmlns:ds="http://schemas.openxmlformats.org/officeDocument/2006/customXml" ds:itemID="{E9AB83EA-4857-49E2-B025-CE86037B4256}">
   <ds:schemaRefs>
     <ds:schemaRef ds:uri="http://schemas.openxmlformats.org/officeDocument/2006/bibliography"/>
   </ds:schemaRefs>

</xml_diff>

<commit_message>
updating formating and spacing through step 16
</commit_message>
<xml_diff>
--- a/.internal/Manual/Intro to PSOC Edge E84 - Part 2 (E2)/PSoC Edge E84 Introductory E2 Training Manual -WIP_10_21_2025.docx
+++ b/.internal/Manual/Intro to PSOC Edge E84 - Part 2 (E2)/PSoC Edge E84 Introductory E2 Training Manual -WIP_10_21_2025.docx
@@ -59,10 +59,6 @@
     <w:p>
       <w:pPr>
         <w:pStyle w:val="HeadingPreface"/>
-        <w:rPr>
-          <w:rFonts w:ascii="Source Sans 3" w:hAnsi="Source Sans 3"/>
-          <w:b w:val="0"/>
-        </w:rPr>
       </w:pPr>
       <w:bookmarkStart w:id="3" w:name="_Toc430947631"/>
       <w:bookmarkStart w:id="4" w:name="_Toc431284129"/>
@@ -71,11 +67,10 @@
       <w:bookmarkStart w:id="7" w:name="_Toc431980074"/>
       <w:bookmarkStart w:id="8" w:name="_Toc212806533"/>
       <w:r>
-        <w:rPr>
-          <w:rFonts w:ascii="Source Sans 3" w:hAnsi="Source Sans 3"/>
-          <w:b w:val="0"/>
-        </w:rPr>
-        <w:t>About this document</w:t>
+        <w:t xml:space="preserve">About this </w:t>
+      </w:r>
+      <w:r>
+        <w:t>document</w:t>
       </w:r>
       <w:bookmarkEnd w:id="0"/>
       <w:bookmarkEnd w:id="3"/>
@@ -199,10 +194,6 @@
     <w:p>
       <w:pPr>
         <w:pStyle w:val="HeadingPreface"/>
-        <w:rPr>
-          <w:rFonts w:ascii="Source Sans 3" w:hAnsi="Source Sans 3"/>
-          <w:b w:val="0"/>
-        </w:rPr>
       </w:pPr>
       <w:bookmarkStart w:id="23" w:name="_Toc431889536"/>
       <w:bookmarkStart w:id="24" w:name="_Toc431980075"/>
@@ -210,11 +201,10 @@
       <w:bookmarkStart w:id="26" w:name="_mioConsistencyCheck416"/>
       <w:bookmarkStart w:id="27" w:name="_Toc430947633"/>
       <w:r>
-        <w:rPr>
-          <w:rFonts w:ascii="Source Sans 3" w:hAnsi="Source Sans 3"/>
-          <w:b w:val="0"/>
-        </w:rPr>
-        <w:t>Table of contents</w:t>
+        <w:t xml:space="preserve">Table of </w:t>
+      </w:r>
+      <w:r>
+        <w:t>contents</w:t>
       </w:r>
       <w:bookmarkEnd w:id="23"/>
       <w:bookmarkEnd w:id="24"/>
@@ -3985,8 +3975,6 @@
       <w:bookmarkStart w:id="93" w:name="_Toc212806538"/>
       <w:bookmarkStart w:id="94" w:name="_mioConsistencyCheck407"/>
       <w:bookmarkStart w:id="95" w:name="_mioConsistencyCheck112"/>
-      <w:bookmarkStart w:id="96" w:name="_GoBack"/>
-      <w:bookmarkEnd w:id="96"/>
       <w:r>
         <w:lastRenderedPageBreak/>
         <w:t xml:space="preserve">Code Example 1: Hello world </w:t>
@@ -4010,39 +3998,13 @@
     </w:p>
     <w:p>
       <w:pPr>
-        <w:keepNext/>
-        <w:numPr>
-          <w:ilvl w:val="1"/>
-          <w:numId w:val="1"/>
-        </w:numPr>
-        <w:tabs>
-          <w:tab w:val="left" w:pos="1418"/>
-        </w:tabs>
-        <w:spacing w:before="240" w:after="120"/>
-        <w:ind w:left="1418" w:hanging="1418"/>
-        <w:outlineLvl w:val="1"/>
-        <w:rPr>
-          <w:rFonts w:ascii="Source Sans 3" w:hAnsi="Source Sans 3"/>
-          <w:b/>
-          <w:snapToGrid w:val="0"/>
-          <w:kern w:val="28"/>
-          <w:sz w:val="28"/>
-          <w:lang w:eastAsia="de-DE"/>
-        </w:rPr>
-      </w:pPr>
-      <w:bookmarkStart w:id="97" w:name="_Toc212806539"/>
-      <w:r>
-        <w:rPr>
-          <w:rFonts w:ascii="Source Sans 3" w:hAnsi="Source Sans 3"/>
-          <w:b/>
-          <w:snapToGrid w:val="0"/>
-          <w:kern w:val="28"/>
-          <w:sz w:val="28"/>
-          <w:lang w:eastAsia="de-DE"/>
-        </w:rPr>
+        <w:pStyle w:val="Heading2"/>
+      </w:pPr>
+      <w:bookmarkStart w:id="96" w:name="_Toc212806539"/>
+      <w:r>
         <w:t>Objective</w:t>
       </w:r>
-      <w:bookmarkEnd w:id="97"/>
+      <w:bookmarkEnd w:id="96"/>
     </w:p>
     <w:bookmarkEnd w:id="94"/>
     <w:bookmarkEnd w:id="95"/>
@@ -4137,18 +4099,12 @@
     <w:p>
       <w:pPr>
         <w:pStyle w:val="Heading2"/>
-        <w:rPr>
-          <w:rFonts w:ascii="Source Sans 3" w:hAnsi="Source Sans 3"/>
-        </w:rPr>
-      </w:pPr>
-      <w:bookmarkStart w:id="98" w:name="_Toc212806540"/>
-      <w:r>
-        <w:rPr>
-          <w:rFonts w:ascii="Source Sans 3" w:hAnsi="Source Sans 3"/>
-        </w:rPr>
+      </w:pPr>
+      <w:bookmarkStart w:id="97" w:name="_Toc212806540"/>
+      <w:r>
         <w:t>Description</w:t>
       </w:r>
-      <w:bookmarkEnd w:id="98"/>
+      <w:bookmarkEnd w:id="97"/>
     </w:p>
     <w:p>
       <w:pPr>
@@ -4296,8 +4252,8 @@
               <w:lang w:eastAsia="de-DE"/>
             </w:rPr>
           </w:pPr>
-          <w:bookmarkStart w:id="99" w:name="_mioConsistencyCheck383"/>
-          <w:bookmarkStart w:id="100" w:name="_mioConsistencyCheck39"/>
+          <w:bookmarkStart w:id="98" w:name="_mioConsistencyCheck383"/>
+          <w:bookmarkStart w:id="99" w:name="_mioConsistencyCheck39"/>
           <w:r>
             <w:rPr>
               <w:rFonts w:ascii="Source Sans 3" w:hAnsi="Source Sans 3"/>
@@ -4346,8 +4302,8 @@
         </w:p>
       </w:sdtContent>
     </w:sdt>
+    <w:bookmarkEnd w:id="98"/>
     <w:bookmarkEnd w:id="99"/>
-    <w:bookmarkEnd w:id="100"/>
     <w:p>
       <w:pPr>
         <w:spacing w:before="160" w:after="160"/>
@@ -4365,9 +4321,9 @@
           <w:b w:val="0"/>
         </w:rPr>
       </w:pPr>
-      <w:bookmarkStart w:id="101" w:name="_Toc212806541"/>
-      <w:bookmarkStart w:id="102" w:name="_mioConsistencyCheck408"/>
-      <w:bookmarkStart w:id="103" w:name="_mioConsistencyCheck113"/>
+      <w:bookmarkStart w:id="100" w:name="_Toc212806541"/>
+      <w:bookmarkStart w:id="101" w:name="_mioConsistencyCheck408"/>
+      <w:bookmarkStart w:id="102" w:name="_mioConsistencyCheck113"/>
       <w:r>
         <w:rPr>
           <w:rFonts w:ascii="Source Sans 3" w:hAnsi="Source Sans 3"/>
@@ -4375,10 +4331,10 @@
         </w:rPr>
         <w:t>Flowchart</w:t>
       </w:r>
-      <w:bookmarkEnd w:id="101"/>
-    </w:p>
+      <w:bookmarkEnd w:id="100"/>
+    </w:p>
+    <w:bookmarkEnd w:id="101"/>
     <w:bookmarkEnd w:id="102"/>
-    <w:bookmarkEnd w:id="103"/>
     <w:p>
       <w:pPr>
         <w:pStyle w:val="Body"/>
@@ -4482,10 +4438,10 @@
                       <v:path o:extrusionok="f" gradientshapeok="t" o:connecttype="rect"/>
                       <o:lock v:ext="edit" aspectratio="t"/>
                     </v:shapetype>
-                    <v:shape id="_x0000_i1025" type="#_x0000_t75" style="width:476pt;height:588pt" o:ole="">
+                    <v:shape id="_x0000_i1025" type="#_x0000_t75" style="width:475.95pt;height:588.15pt" o:ole="">
                       <v:imagedata r:id="rId21" o:title=""/>
                     </v:shape>
-                    <o:OLEObject Type="Embed" ProgID="Visio.Drawing.15" ShapeID="_x0000_i1025" DrawAspect="Content" ObjectID="_1823432838" r:id="rId22"/>
+                    <o:OLEObject Type="Embed" ProgID="Visio.Drawing.15" ShapeID="_x0000_i1025" DrawAspect="Content" ObjectID="_1823623339" r:id="rId22"/>
                   </w:object>
                 </w:r>
               </w:p>
@@ -4499,8 +4455,8 @@
               <w:rFonts w:ascii="Source Sans 3" w:hAnsi="Source Sans 3"/>
             </w:rPr>
           </w:pPr>
-          <w:bookmarkStart w:id="104" w:name="_mioConsistencyCheck384"/>
-          <w:bookmarkStart w:id="105" w:name="_mioConsistencyCheck40"/>
+          <w:bookmarkStart w:id="103" w:name="_mioConsistencyCheck384"/>
+          <w:bookmarkStart w:id="104" w:name="_mioConsistencyCheck40"/>
           <w:r>
             <w:rPr>
               <w:rFonts w:ascii="Source Sans 3" w:hAnsi="Source Sans 3"/>
@@ -4544,7 +4500,7 @@
             </w:rPr>
             <w:tab/>
           </w:r>
-          <w:bookmarkStart w:id="106" w:name="_mioConsistencyCheck267"/>
+          <w:bookmarkStart w:id="105" w:name="_mioConsistencyCheck267"/>
           <w:r>
             <w:rPr>
               <w:rFonts w:ascii="Source Sans 3" w:hAnsi="Source Sans 3"/>
@@ -4554,9 +4510,9 @@
         </w:p>
       </w:sdtContent>
     </w:sdt>
+    <w:bookmarkEnd w:id="103"/>
     <w:bookmarkEnd w:id="104"/>
     <w:bookmarkEnd w:id="105"/>
-    <w:bookmarkEnd w:id="106"/>
     <w:p>
       <w:pPr>
         <w:pStyle w:val="Body"/>
@@ -4652,10 +4608,10 @@
                 </w:pPr>
                 <w:r>
                   <w:object w:dxaOrig="4404" w:dyaOrig="4296" w14:anchorId="7A224DF9">
-                    <v:shape id="_x0000_i1026" type="#_x0000_t75" style="width:117pt;height:114pt" o:ole="">
+                    <v:shape id="_x0000_i1026" type="#_x0000_t75" style="width:116.9pt;height:114.1pt" o:ole="">
                       <v:imagedata r:id="rId23" o:title=""/>
                     </v:shape>
-                    <o:OLEObject Type="Embed" ProgID="Visio.Drawing.15" ShapeID="_x0000_i1026" DrawAspect="Content" ObjectID="_1823432839" r:id="rId24"/>
+                    <o:OLEObject Type="Embed" ProgID="Visio.Drawing.15" ShapeID="_x0000_i1026" DrawAspect="Content" ObjectID="_1823623340" r:id="rId24"/>
                   </w:object>
                 </w:r>
               </w:p>
@@ -4669,8 +4625,8 @@
               <w:rFonts w:ascii="Source Sans 3" w:hAnsi="Source Sans 3"/>
             </w:rPr>
           </w:pPr>
-          <w:bookmarkStart w:id="107" w:name="_mioConsistencyCheck385"/>
-          <w:bookmarkStart w:id="108" w:name="_mioConsistencyCheck41"/>
+          <w:bookmarkStart w:id="106" w:name="_mioConsistencyCheck385"/>
+          <w:bookmarkStart w:id="107" w:name="_mioConsistencyCheck41"/>
           <w:r>
             <w:rPr>
               <w:rFonts w:ascii="Source Sans 3" w:hAnsi="Source Sans 3"/>
@@ -4714,7 +4670,7 @@
             </w:rPr>
             <w:tab/>
           </w:r>
-          <w:bookmarkStart w:id="109" w:name="_mioConsistencyCheck268"/>
+          <w:bookmarkStart w:id="108" w:name="_mioConsistencyCheck268"/>
           <w:r>
             <w:rPr>
               <w:rFonts w:ascii="Source Sans 3" w:hAnsi="Source Sans 3"/>
@@ -4724,9 +4680,9 @@
         </w:p>
       </w:sdtContent>
     </w:sdt>
+    <w:bookmarkEnd w:id="106"/>
     <w:bookmarkEnd w:id="107"/>
     <w:bookmarkEnd w:id="108"/>
-    <w:bookmarkEnd w:id="109"/>
     <w:p>
       <w:pPr>
         <w:pStyle w:val="Body"/>
@@ -4744,9 +4700,9 @@
           <w:b w:val="0"/>
         </w:rPr>
       </w:pPr>
-      <w:bookmarkStart w:id="110" w:name="_Toc212806542"/>
-      <w:bookmarkStart w:id="111" w:name="_mioConsistencyCheck409"/>
-      <w:bookmarkStart w:id="112" w:name="_mioConsistencyCheck114"/>
+      <w:bookmarkStart w:id="109" w:name="_Toc212806542"/>
+      <w:bookmarkStart w:id="110" w:name="_mioConsistencyCheck409"/>
+      <w:bookmarkStart w:id="111" w:name="_mioConsistencyCheck114"/>
       <w:r>
         <w:rPr>
           <w:rFonts w:ascii="Source Sans 3" w:hAnsi="Source Sans 3"/>
@@ -4761,10 +4717,10 @@
         </w:rPr>
         <w:t xml:space="preserve"> and Setup</w:t>
       </w:r>
-      <w:bookmarkEnd w:id="110"/>
-    </w:p>
+      <w:bookmarkEnd w:id="109"/>
+    </w:p>
+    <w:bookmarkEnd w:id="110"/>
     <w:bookmarkEnd w:id="111"/>
-    <w:bookmarkEnd w:id="112"/>
     <w:p>
       <w:pPr>
         <w:pStyle w:val="Body"/>
@@ -4933,9 +4889,9 @@
       <w:pPr>
         <w:pStyle w:val="Body"/>
       </w:pPr>
-      <w:bookmarkStart w:id="113" w:name="_Hlk190961414"/>
-    </w:p>
-    <w:bookmarkEnd w:id="113" w:displacedByCustomXml="next"/>
+      <w:bookmarkStart w:id="112" w:name="_Hlk190961414"/>
+    </w:p>
+    <w:bookmarkEnd w:id="112" w:displacedByCustomXml="next"/>
     <w:sdt>
       <w:sdtPr>
         <w:rPr>
@@ -5054,16 +5010,16 @@
             <w:tab/>
             <w:t xml:space="preserve">Hardware Diagram for UART and LED Routing on </w:t>
           </w:r>
-          <w:bookmarkStart w:id="114" w:name="_mioConsistencyCheck287"/>
-          <w:bookmarkStart w:id="115" w:name="_mioConsistencyCheck68"/>
+          <w:bookmarkStart w:id="113" w:name="_mioConsistencyCheck287"/>
+          <w:bookmarkStart w:id="114" w:name="_mioConsistencyCheck68"/>
           <w:r>
             <w:rPr>
               <w:rFonts w:ascii="Source Sans 3" w:hAnsi="Source Sans 3"/>
             </w:rPr>
             <w:t>PSOC</w:t>
           </w:r>
+          <w:bookmarkEnd w:id="113"/>
           <w:bookmarkEnd w:id="114"/>
-          <w:bookmarkEnd w:id="115"/>
           <w:r>
             <w:rPr>
               <w:rFonts w:ascii="Source Sans 3" w:hAnsi="Source Sans 3"/>
@@ -5102,9 +5058,9 @@
           <w:lang w:eastAsia="de-DE"/>
         </w:rPr>
       </w:pPr>
-      <w:bookmarkStart w:id="116" w:name="_Toc212806543"/>
-      <w:bookmarkStart w:id="117" w:name="_mioConsistencyCheck410"/>
-      <w:bookmarkStart w:id="118" w:name="_mioConsistencyCheck115"/>
+      <w:bookmarkStart w:id="115" w:name="_Toc212806543"/>
+      <w:bookmarkStart w:id="116" w:name="_mioConsistencyCheck410"/>
+      <w:bookmarkStart w:id="117" w:name="_mioConsistencyCheck115"/>
       <w:r>
         <w:rPr>
           <w:rFonts w:ascii="Source Sans 3" w:hAnsi="Source Sans 3"/>
@@ -5117,7 +5073,7 @@
         <w:lastRenderedPageBreak/>
         <w:t>Project Creation</w:t>
       </w:r>
-      <w:bookmarkEnd w:id="116"/>
+      <w:bookmarkEnd w:id="115"/>
       <w:r>
         <w:rPr>
           <w:b/>
@@ -5129,8 +5085,8 @@
         <w:t xml:space="preserve"> </w:t>
       </w:r>
     </w:p>
+    <w:bookmarkEnd w:id="116"/>
     <w:bookmarkEnd w:id="117"/>
-    <w:bookmarkEnd w:id="118"/>
     <w:p>
       <w:pPr>
         <w:pStyle w:val="Body"/>
@@ -5178,7 +5134,7 @@
     <w:p>
       <w:pPr>
         <w:pStyle w:val="Body"/>
-        <w:ind w:left="1778"/>
+        <w:ind w:left="1069"/>
         <w:rPr>
           <w:rFonts w:ascii="Source Sans 3" w:hAnsi="Source Sans 3"/>
         </w:rPr>
@@ -5202,8 +5158,8 @@
         </w:rPr>
         <w:t xml:space="preserve">, Refer </w:t>
       </w:r>
-      <w:bookmarkStart w:id="119" w:name="_mioConsistencyCheck166"/>
-      <w:bookmarkStart w:id="120" w:name="_mioConsistencyCheck42"/>
+      <w:bookmarkStart w:id="118" w:name="_mioConsistencyCheck166"/>
+      <w:bookmarkStart w:id="119" w:name="_mioConsistencyCheck42"/>
       <w:r>
         <w:fldChar w:fldCharType="begin"/>
       </w:r>
@@ -5237,8 +5193,8 @@
         </w:rPr>
         <w:fldChar w:fldCharType="end"/>
       </w:r>
+      <w:bookmarkEnd w:id="118"/>
       <w:bookmarkEnd w:id="119"/>
-      <w:bookmarkEnd w:id="120"/>
       <w:r>
         <w:rPr>
           <w:rFonts w:ascii="Source Sans 3" w:hAnsi="Source Sans 3"/>
@@ -5250,8 +5206,8 @@
       <w:pPr>
         <w:pStyle w:val="Body"/>
       </w:pPr>
-      <w:bookmarkStart w:id="121" w:name="_mioConsistencyCheck294"/>
-      <w:bookmarkStart w:id="122" w:name="_mioConsistencyCheck74"/>
+      <w:bookmarkStart w:id="120" w:name="_mioConsistencyCheck294"/>
+      <w:bookmarkStart w:id="121" w:name="_mioConsistencyCheck74"/>
     </w:p>
     <w:p>
       <w:pPr>
@@ -5319,9 +5275,9 @@
                     <w:noProof/>
                   </w:rPr>
                   <w:drawing>
-                    <wp:inline distT="0" distB="0" distL="0" distR="0" wp14:anchorId="4FDE3037" wp14:editId="19ECA0A0">
-                      <wp:extent cx="3784454" cy="3540296"/>
-                      <wp:effectExtent l="0" t="0" r="6985" b="3175"/>
+                    <wp:inline distT="0" distB="0" distL="0" distR="0" wp14:anchorId="4FDE3037" wp14:editId="3387EBF3">
+                      <wp:extent cx="3792462" cy="3536480"/>
+                      <wp:effectExtent l="0" t="0" r="0" b="6985"/>
                       <wp:docPr id="7" name="Picture 7"/>
                       <wp:cNvGraphicFramePr>
                         <a:graphicFrameLocks xmlns:a="http://schemas.openxmlformats.org/drawingml/2006/main" noChangeAspect="1"/>
@@ -5336,7 +5292,7 @@
                               </pic:cNvPicPr>
                             </pic:nvPicPr>
                             <pic:blipFill>
-                              <a:blip r:embed="rId26">
+                              <a:blip r:embed="rId26" cstate="print">
                                 <a:extLst>
                                   <a:ext uri="{28A0092B-C50C-407E-A947-70E740481C1C}">
                                     <a14:useLocalDpi xmlns:a14="http://schemas.microsoft.com/office/drawing/2010/main" val="0"/>
@@ -5350,7 +5306,7 @@
                             <pic:spPr bwMode="auto">
                               <a:xfrm>
                                 <a:off x="0" y="0"/>
-                                <a:ext cx="3792462" cy="3547787"/>
+                                <a:ext cx="3792462" cy="3536480"/>
                               </a:xfrm>
                               <a:prstGeom prst="rect">
                                 <a:avLst/>
@@ -5377,10 +5333,10 @@
               <w:rFonts w:ascii="Source Sans 3" w:hAnsi="Source Sans 3"/>
             </w:rPr>
           </w:pPr>
-          <w:bookmarkStart w:id="123" w:name="_mioConsistencyCheck386"/>
-          <w:bookmarkStart w:id="124" w:name="_mioConsistencyCheck43"/>
+          <w:bookmarkStart w:id="122" w:name="_mioConsistencyCheck386"/>
+          <w:bookmarkStart w:id="123" w:name="_mioConsistencyCheck43"/>
+          <w:bookmarkEnd w:id="120"/>
           <w:bookmarkEnd w:id="121"/>
-          <w:bookmarkEnd w:id="122"/>
           <w:r>
             <w:rPr>
               <w:rFonts w:ascii="Source Sans 3" w:hAnsi="Source Sans 3"/>
@@ -5424,7 +5380,7 @@
             </w:rPr>
             <w:tab/>
           </w:r>
-          <w:bookmarkStart w:id="125" w:name="_mioConsistencyCheck269"/>
+          <w:bookmarkStart w:id="124" w:name="_mioConsistencyCheck269"/>
           <w:r>
             <w:rPr>
               <w:rFonts w:ascii="Source Sans 3" w:hAnsi="Source Sans 3"/>
@@ -5434,9 +5390,9 @@
         </w:p>
       </w:sdtContent>
     </w:sdt>
+    <w:bookmarkEnd w:id="122"/>
     <w:bookmarkEnd w:id="123"/>
     <w:bookmarkEnd w:id="124"/>
-    <w:bookmarkEnd w:id="125"/>
     <w:p>
       <w:pPr>
         <w:pStyle w:val="Body"/>
@@ -5606,8 +5562,8 @@
               <w:rFonts w:ascii="Source Sans 3" w:hAnsi="Source Sans 3"/>
             </w:rPr>
           </w:pPr>
-          <w:bookmarkStart w:id="126" w:name="_mioConsistencyCheck387"/>
-          <w:bookmarkStart w:id="127" w:name="_mioConsistencyCheck44"/>
+          <w:bookmarkStart w:id="125" w:name="_mioConsistencyCheck387"/>
+          <w:bookmarkStart w:id="126" w:name="_mioConsistencyCheck44"/>
           <w:r>
             <w:rPr>
               <w:rFonts w:ascii="Source Sans 3" w:hAnsi="Source Sans 3"/>
@@ -5651,7 +5607,7 @@
             </w:rPr>
             <w:tab/>
           </w:r>
-          <w:bookmarkStart w:id="128" w:name="_mioConsistencyCheck270"/>
+          <w:bookmarkStart w:id="127" w:name="_mioConsistencyCheck270"/>
           <w:r>
             <w:rPr>
               <w:rFonts w:ascii="Source Sans 3" w:hAnsi="Source Sans 3"/>
@@ -5661,9 +5617,9 @@
         </w:p>
       </w:sdtContent>
     </w:sdt>
+    <w:bookmarkEnd w:id="125"/>
     <w:bookmarkEnd w:id="126"/>
     <w:bookmarkEnd w:id="127"/>
-    <w:bookmarkEnd w:id="128"/>
     <w:p>
       <w:pPr>
         <w:pStyle w:val="ListParagraph"/>
@@ -5802,8 +5758,8 @@
                     <w:noProof/>
                   </w:rPr>
                   <w:drawing>
-                    <wp:inline distT="0" distB="0" distL="0" distR="0" wp14:anchorId="57A211EE" wp14:editId="7F96CE12">
-                      <wp:extent cx="4939507" cy="2381435"/>
+                    <wp:inline distT="0" distB="0" distL="0" distR="0" wp14:anchorId="57A211EE" wp14:editId="3E390EAB">
+                      <wp:extent cx="6651351" cy="3206750"/>
                       <wp:effectExtent l="0" t="0" r="0" b="0"/>
                       <wp:docPr id="29" name="Picture 29"/>
                       <wp:cNvGraphicFramePr>
@@ -5831,7 +5787,7 @@
                             <pic:spPr>
                               <a:xfrm>
                                 <a:off x="0" y="0"/>
-                                <a:ext cx="4939507" cy="2381435"/>
+                                <a:ext cx="6679650" cy="3220393"/>
                               </a:xfrm>
                               <a:prstGeom prst="rect">
                                 <a:avLst/>
@@ -5855,8 +5811,8 @@
               <w:lang w:eastAsia="de-DE"/>
             </w:rPr>
           </w:pPr>
-          <w:bookmarkStart w:id="129" w:name="_mioConsistencyCheck388"/>
-          <w:bookmarkStart w:id="130" w:name="_mioConsistencyCheck45"/>
+          <w:bookmarkStart w:id="128" w:name="_mioConsistencyCheck388"/>
+          <w:bookmarkStart w:id="129" w:name="_mioConsistencyCheck45"/>
           <w:r>
             <w:rPr>
               <w:rFonts w:ascii="Source Sans 3" w:hAnsi="Source Sans 3"/>
@@ -5900,7 +5856,7 @@
             </w:rPr>
             <w:tab/>
           </w:r>
-          <w:bookmarkStart w:id="131" w:name="_mioConsistencyCheck271"/>
+          <w:bookmarkStart w:id="130" w:name="_mioConsistencyCheck271"/>
           <w:r>
             <w:rPr>
               <w:rFonts w:ascii="Source Sans 3" w:hAnsi="Source Sans 3"/>
@@ -5910,9 +5866,9 @@
         </w:p>
       </w:sdtContent>
     </w:sdt>
+    <w:bookmarkEnd w:id="128"/>
     <w:bookmarkEnd w:id="129"/>
     <w:bookmarkEnd w:id="130"/>
-    <w:bookmarkEnd w:id="131"/>
     <w:p>
       <w:pPr>
         <w:pStyle w:val="ListParagraph"/>
@@ -6069,9 +6025,9 @@
                     <w:noProof/>
                   </w:rPr>
                   <w:drawing>
-                    <wp:inline distT="0" distB="0" distL="0" distR="0" wp14:anchorId="5664E01F" wp14:editId="76F6D74E">
-                      <wp:extent cx="3594174" cy="2987881"/>
-                      <wp:effectExtent l="0" t="0" r="6350" b="3175"/>
+                    <wp:inline distT="0" distB="0" distL="0" distR="0" wp14:anchorId="5664E01F" wp14:editId="58D7564C">
+                      <wp:extent cx="5048250" cy="4196672"/>
+                      <wp:effectExtent l="0" t="0" r="0" b="0"/>
                       <wp:docPr id="28" name="Picture 28"/>
                       <wp:cNvGraphicFramePr>
                         <a:graphicFrameLocks xmlns:a="http://schemas.openxmlformats.org/drawingml/2006/main" noChangeAspect="1"/>
@@ -6100,7 +6056,7 @@
                             <pic:spPr bwMode="auto">
                               <a:xfrm>
                                 <a:off x="0" y="0"/>
-                                <a:ext cx="3606505" cy="2998132"/>
+                                <a:ext cx="5089708" cy="4231137"/>
                               </a:xfrm>
                               <a:prstGeom prst="rect">
                                 <a:avLst/>
@@ -6129,12 +6085,13 @@
               <w:lang w:eastAsia="de-DE"/>
             </w:rPr>
           </w:pPr>
-          <w:bookmarkStart w:id="132" w:name="_mioConsistencyCheck389"/>
-          <w:bookmarkStart w:id="133" w:name="_mioConsistencyCheck46"/>
+          <w:bookmarkStart w:id="131" w:name="_mioConsistencyCheck389"/>
+          <w:bookmarkStart w:id="132" w:name="_mioConsistencyCheck46"/>
           <w:r>
             <w:rPr>
               <w:rFonts w:ascii="Source Sans 3" w:hAnsi="Source Sans 3"/>
             </w:rPr>
+            <w:lastRenderedPageBreak/>
             <w:t xml:space="preserve">Figure </w:t>
           </w:r>
           <w:r>
@@ -6174,7 +6131,7 @@
             </w:rPr>
             <w:tab/>
           </w:r>
-          <w:bookmarkStart w:id="134" w:name="_mioConsistencyCheck272"/>
+          <w:bookmarkStart w:id="133" w:name="_mioConsistencyCheck272"/>
           <w:r>
             <w:rPr>
               <w:rFonts w:ascii="Source Sans 3" w:hAnsi="Source Sans 3"/>
@@ -6184,9 +6141,9 @@
         </w:p>
       </w:sdtContent>
     </w:sdt>
+    <w:bookmarkEnd w:id="131"/>
     <w:bookmarkEnd w:id="132"/>
     <w:bookmarkEnd w:id="133"/>
-    <w:bookmarkEnd w:id="134"/>
     <w:p>
       <w:pPr>
         <w:pStyle w:val="ListParagraph"/>
@@ -6307,7 +6264,6 @@
           <w:rFonts w:ascii="Source Sans 3" w:hAnsi="Source Sans 3"/>
           <w:lang w:eastAsia="de-DE"/>
         </w:rPr>
-        <w:lastRenderedPageBreak/>
         <w:t xml:space="preserve">Once </w:t>
       </w:r>
       <w:r>
@@ -6499,9 +6455,9 @@
                     <w:noProof/>
                   </w:rPr>
                   <w:drawing>
-                    <wp:inline distT="0" distB="0" distL="0" distR="0" wp14:anchorId="0BC26EFB" wp14:editId="3D28380C">
-                      <wp:extent cx="4731577" cy="3139616"/>
-                      <wp:effectExtent l="19050" t="19050" r="12065" b="22860"/>
+                    <wp:inline distT="0" distB="0" distL="0" distR="0" wp14:anchorId="0BC26EFB" wp14:editId="7DCB7C1E">
+                      <wp:extent cx="6507468" cy="4318000"/>
+                      <wp:effectExtent l="19050" t="19050" r="27305" b="25400"/>
                       <wp:docPr id="54" name="Picture 54"/>
                       <wp:cNvGraphicFramePr>
                         <a:graphicFrameLocks xmlns:a="http://schemas.openxmlformats.org/drawingml/2006/main" noChangeAspect="1"/>
@@ -6530,7 +6486,7 @@
                             <pic:spPr bwMode="auto">
                               <a:xfrm>
                                 <a:off x="0" y="0"/>
-                                <a:ext cx="4787718" cy="3176868"/>
+                                <a:ext cx="6617508" cy="4391016"/>
                               </a:xfrm>
                               <a:prstGeom prst="rect">
                                 <a:avLst/>
@@ -6560,8 +6516,8 @@
               <w:lang w:eastAsia="de-DE"/>
             </w:rPr>
           </w:pPr>
-          <w:bookmarkStart w:id="135" w:name="_mioConsistencyCheck390"/>
-          <w:bookmarkStart w:id="136" w:name="_mioConsistencyCheck47"/>
+          <w:bookmarkStart w:id="134" w:name="_mioConsistencyCheck390"/>
+          <w:bookmarkStart w:id="135" w:name="_mioConsistencyCheck47"/>
           <w:r>
             <w:rPr>
               <w:rFonts w:ascii="Source Sans 3" w:hAnsi="Source Sans 3"/>
@@ -6605,7 +6561,7 @@
             </w:rPr>
             <w:tab/>
           </w:r>
-          <w:bookmarkStart w:id="137" w:name="_mioConsistencyCheck273"/>
+          <w:bookmarkStart w:id="136" w:name="_mioConsistencyCheck273"/>
           <w:r>
             <w:rPr>
               <w:rFonts w:ascii="Source Sans 3" w:hAnsi="Source Sans 3"/>
@@ -6615,9 +6571,9 @@
         </w:p>
       </w:sdtContent>
     </w:sdt>
+    <w:bookmarkEnd w:id="134"/>
     <w:bookmarkEnd w:id="135"/>
     <w:bookmarkEnd w:id="136"/>
-    <w:bookmarkEnd w:id="137"/>
     <w:p>
       <w:pPr>
         <w:pStyle w:val="ListParagraph"/>
@@ -6638,8 +6594,8 @@
         </w:rPr>
         <w:t xml:space="preserve">Clicking Next will take you to the next menu of the Project Creator which will ask you to select an Application. Select the </w:t>
       </w:r>
-      <w:bookmarkStart w:id="138" w:name="_mioConsistencyCheck288"/>
-      <w:bookmarkStart w:id="139" w:name="_mioConsistencyCheck69"/>
+      <w:bookmarkStart w:id="137" w:name="_mioConsistencyCheck288"/>
+      <w:bookmarkStart w:id="138" w:name="_mioConsistencyCheck69"/>
       <w:r>
         <w:rPr>
           <w:rFonts w:ascii="Source Sans 3" w:hAnsi="Source Sans 3"/>
@@ -6667,8 +6623,8 @@
         </w:rPr>
         <w:t>C</w:t>
       </w:r>
+      <w:bookmarkEnd w:id="137"/>
       <w:bookmarkEnd w:id="138"/>
-      <w:bookmarkEnd w:id="139"/>
       <w:r>
         <w:rPr>
           <w:rFonts w:ascii="Source Sans 3" w:hAnsi="Source Sans 3"/>
@@ -6844,9 +6800,9 @@
                     <w:noProof/>
                   </w:rPr>
                   <w:drawing>
-                    <wp:inline distT="0" distB="0" distL="0" distR="0" wp14:anchorId="71E50504" wp14:editId="79FE69E7">
-                      <wp:extent cx="4572070" cy="2508368"/>
-                      <wp:effectExtent l="19050" t="19050" r="19050" b="25400"/>
+                    <wp:inline distT="0" distB="0" distL="0" distR="0" wp14:anchorId="71E50504" wp14:editId="03036DA2">
+                      <wp:extent cx="6238557" cy="3422650"/>
+                      <wp:effectExtent l="19050" t="19050" r="10160" b="25400"/>
                       <wp:docPr id="55" name="Picture 55"/>
                       <wp:cNvGraphicFramePr>
                         <a:graphicFrameLocks xmlns:a="http://schemas.openxmlformats.org/drawingml/2006/main" noChangeAspect="1"/>
@@ -6875,7 +6831,7 @@
                             <pic:spPr bwMode="auto">
                               <a:xfrm>
                                 <a:off x="0" y="0"/>
-                                <a:ext cx="4572070" cy="2508368"/>
+                                <a:ext cx="6267551" cy="3438557"/>
                               </a:xfrm>
                               <a:prstGeom prst="rect">
                                 <a:avLst/>
@@ -6906,8 +6862,8 @@
               <w:lang w:eastAsia="de-DE"/>
             </w:rPr>
           </w:pPr>
-          <w:bookmarkStart w:id="140" w:name="_mioConsistencyCheck391"/>
-          <w:bookmarkStart w:id="141" w:name="_mioConsistencyCheck48"/>
+          <w:bookmarkStart w:id="139" w:name="_mioConsistencyCheck391"/>
+          <w:bookmarkStart w:id="140" w:name="_mioConsistencyCheck48"/>
           <w:r>
             <w:rPr>
               <w:rFonts w:ascii="Source Sans 3" w:hAnsi="Source Sans 3"/>
@@ -6951,7 +6907,7 @@
             </w:rPr>
             <w:tab/>
           </w:r>
-          <w:bookmarkStart w:id="142" w:name="_mioConsistencyCheck274"/>
+          <w:bookmarkStart w:id="141" w:name="_mioConsistencyCheck274"/>
           <w:r>
             <w:rPr>
               <w:rFonts w:ascii="Source Sans 3" w:hAnsi="Source Sans 3"/>
@@ -6961,9 +6917,9 @@
         </w:p>
       </w:sdtContent>
     </w:sdt>
+    <w:bookmarkEnd w:id="139"/>
     <w:bookmarkEnd w:id="140"/>
     <w:bookmarkEnd w:id="141"/>
-    <w:bookmarkEnd w:id="142"/>
     <w:p>
       <w:pPr>
         <w:pStyle w:val="ListParagraph"/>
@@ -6982,7 +6938,6 @@
           <w:rFonts w:ascii="Source Sans 3" w:hAnsi="Source Sans 3"/>
           <w:lang w:eastAsia="de-DE"/>
         </w:rPr>
-        <w:lastRenderedPageBreak/>
         <w:t xml:space="preserve">When you click </w:t>
       </w:r>
       <w:r>
@@ -7150,8 +7105,8 @@
               <w:lang w:eastAsia="de-DE"/>
             </w:rPr>
           </w:pPr>
-          <w:bookmarkStart w:id="143" w:name="_mioConsistencyCheck392"/>
-          <w:bookmarkStart w:id="144" w:name="_mioConsistencyCheck49"/>
+          <w:bookmarkStart w:id="142" w:name="_mioConsistencyCheck392"/>
+          <w:bookmarkStart w:id="143" w:name="_mioConsistencyCheck49"/>
           <w:r>
             <w:rPr>
               <w:rFonts w:ascii="Source Sans 3" w:hAnsi="Source Sans 3"/>
@@ -7195,7 +7150,7 @@
             </w:rPr>
             <w:tab/>
           </w:r>
-          <w:bookmarkStart w:id="145" w:name="_mioConsistencyCheck275"/>
+          <w:bookmarkStart w:id="144" w:name="_mioConsistencyCheck275"/>
           <w:r>
             <w:rPr>
               <w:rFonts w:ascii="Source Sans 3" w:hAnsi="Source Sans 3"/>
@@ -7205,9 +7160,9 @@
         </w:p>
       </w:sdtContent>
     </w:sdt>
+    <w:bookmarkEnd w:id="142"/>
     <w:bookmarkEnd w:id="143"/>
     <w:bookmarkEnd w:id="144"/>
-    <w:bookmarkEnd w:id="145"/>
     <w:p>
       <w:pPr>
         <w:pStyle w:val="ListParagraph"/>
@@ -7368,8 +7323,8 @@
               <w:lang w:eastAsia="de-DE"/>
             </w:rPr>
           </w:pPr>
-          <w:bookmarkStart w:id="146" w:name="_mioConsistencyCheck393"/>
-          <w:bookmarkStart w:id="147" w:name="_mioConsistencyCheck50"/>
+          <w:bookmarkStart w:id="145" w:name="_mioConsistencyCheck393"/>
+          <w:bookmarkStart w:id="146" w:name="_mioConsistencyCheck50"/>
           <w:r>
             <w:rPr>
               <w:rFonts w:ascii="Source Sans 3" w:hAnsi="Source Sans 3"/>
@@ -7413,7 +7368,7 @@
             </w:rPr>
             <w:tab/>
           </w:r>
-          <w:bookmarkStart w:id="148" w:name="_mioConsistencyCheck276"/>
+          <w:bookmarkStart w:id="147" w:name="_mioConsistencyCheck276"/>
           <w:r>
             <w:rPr>
               <w:rFonts w:ascii="Source Sans 3" w:hAnsi="Source Sans 3"/>
@@ -7423,14 +7378,14 @@
         </w:p>
       </w:sdtContent>
     </w:sdt>
+    <w:bookmarkEnd w:id="145"/>
     <w:bookmarkEnd w:id="146"/>
     <w:bookmarkEnd w:id="147"/>
-    <w:bookmarkEnd w:id="148"/>
     <w:p>
       <w:pPr>
         <w:pStyle w:val="ListParagraph"/>
         <w:spacing w:before="160" w:after="160"/>
-        <w:ind w:left="1767"/>
+        <w:ind w:left="709"/>
         <w:rPr>
           <w:rFonts w:ascii="Source Sans 3" w:hAnsi="Source Sans 3"/>
         </w:rPr>
@@ -7518,7 +7473,6 @@
         <w:rPr>
           <w:rFonts w:ascii="Source Sans 3" w:hAnsi="Source Sans 3"/>
         </w:rPr>
-        <w:lastRenderedPageBreak/>
         <w:br/>
         <w:t xml:space="preserve">The </w:t>
       </w:r>
@@ -7813,8 +7767,8 @@
               <w:lang w:eastAsia="de-DE"/>
             </w:rPr>
           </w:pPr>
-          <w:bookmarkStart w:id="149" w:name="_mioConsistencyCheck394"/>
-          <w:bookmarkStart w:id="150" w:name="_mioConsistencyCheck51"/>
+          <w:bookmarkStart w:id="148" w:name="_mioConsistencyCheck394"/>
+          <w:bookmarkStart w:id="149" w:name="_mioConsistencyCheck51"/>
           <w:r>
             <w:rPr>
               <w:rFonts w:ascii="Source Sans 3" w:hAnsi="Source Sans 3"/>
@@ -7858,7 +7812,7 @@
             </w:rPr>
             <w:tab/>
           </w:r>
-          <w:bookmarkStart w:id="151" w:name="_mioConsistencyCheck277"/>
+          <w:bookmarkStart w:id="150" w:name="_mioConsistencyCheck277"/>
           <w:r>
             <w:rPr>
               <w:rFonts w:ascii="Source Sans 3" w:hAnsi="Source Sans 3"/>
@@ -7868,9 +7822,9 @@
         </w:p>
       </w:sdtContent>
     </w:sdt>
+    <w:bookmarkEnd w:id="148"/>
     <w:bookmarkEnd w:id="149"/>
     <w:bookmarkEnd w:id="150"/>
-    <w:bookmarkEnd w:id="151"/>
     <w:p>
       <w:pPr>
         <w:pStyle w:val="ListParagraph"/>
@@ -8323,8 +8277,8 @@
               <w:lang w:eastAsia="de-DE"/>
             </w:rPr>
           </w:pPr>
-          <w:bookmarkStart w:id="152" w:name="_mioConsistencyCheck395"/>
-          <w:bookmarkStart w:id="153" w:name="_mioConsistencyCheck52"/>
+          <w:bookmarkStart w:id="151" w:name="_mioConsistencyCheck395"/>
+          <w:bookmarkStart w:id="152" w:name="_mioConsistencyCheck52"/>
           <w:r>
             <w:rPr>
               <w:rFonts w:ascii="Source Sans 3" w:hAnsi="Source Sans 3"/>
@@ -8368,7 +8322,7 @@
             </w:rPr>
             <w:tab/>
           </w:r>
-          <w:bookmarkStart w:id="154" w:name="_mioConsistencyCheck278"/>
+          <w:bookmarkStart w:id="153" w:name="_mioConsistencyCheck278"/>
           <w:r>
             <w:rPr>
               <w:rFonts w:ascii="Source Sans 3" w:hAnsi="Source Sans 3"/>
@@ -8378,9 +8332,9 @@
         </w:p>
       </w:sdtContent>
     </w:sdt>
+    <w:bookmarkEnd w:id="151"/>
     <w:bookmarkEnd w:id="152"/>
     <w:bookmarkEnd w:id="153"/>
-    <w:bookmarkEnd w:id="154"/>
     <w:p>
       <w:pPr>
         <w:pStyle w:val="ListParagraph"/>
@@ -8396,7 +8350,7 @@
       <w:pPr>
         <w:pStyle w:val="ListParagraph"/>
         <w:spacing w:before="160" w:after="160"/>
-        <w:ind w:left="1778"/>
+        <w:ind w:left="709"/>
         <w:rPr>
           <w:rFonts w:ascii="Source Sans 3" w:hAnsi="Source Sans 3"/>
           <w:lang w:eastAsia="de-DE"/>
@@ -8630,8 +8584,8 @@
               <w:lang w:eastAsia="de-DE"/>
             </w:rPr>
           </w:pPr>
-          <w:bookmarkStart w:id="155" w:name="_mioConsistencyCheck396"/>
-          <w:bookmarkStart w:id="156" w:name="_mioConsistencyCheck53"/>
+          <w:bookmarkStart w:id="154" w:name="_mioConsistencyCheck396"/>
+          <w:bookmarkStart w:id="155" w:name="_mioConsistencyCheck53"/>
           <w:r>
             <w:rPr>
               <w:rFonts w:ascii="Source Sans 3" w:hAnsi="Source Sans 3"/>
@@ -8675,7 +8629,7 @@
             </w:rPr>
             <w:tab/>
           </w:r>
-          <w:bookmarkStart w:id="157" w:name="_mioConsistencyCheck279"/>
+          <w:bookmarkStart w:id="156" w:name="_mioConsistencyCheck279"/>
           <w:r>
             <w:rPr>
               <w:rFonts w:ascii="Source Sans 3" w:hAnsi="Source Sans 3"/>
@@ -8685,9 +8639,9 @@
         </w:p>
       </w:sdtContent>
     </w:sdt>
+    <w:bookmarkEnd w:id="154"/>
     <w:bookmarkEnd w:id="155"/>
     <w:bookmarkEnd w:id="156"/>
-    <w:bookmarkEnd w:id="157"/>
     <w:p>
       <w:pPr>
         <w:pStyle w:val="ListParagraph"/>
@@ -8703,7 +8657,7 @@
       <w:pPr>
         <w:pStyle w:val="ListParagraph"/>
         <w:spacing w:before="160" w:after="160"/>
-        <w:ind w:left="1778"/>
+        <w:ind w:left="709"/>
         <w:rPr>
           <w:rFonts w:ascii="Source Sans 3" w:hAnsi="Source Sans 3"/>
           <w:lang w:eastAsia="de-DE"/>
@@ -8807,9 +8761,9 @@
                     <w:noProof/>
                   </w:rPr>
                   <w:drawing>
-                    <wp:inline distT="0" distB="0" distL="0" distR="0" wp14:anchorId="7A7B49B8" wp14:editId="66C8248F">
-                      <wp:extent cx="5063556" cy="3947970"/>
-                      <wp:effectExtent l="19050" t="19050" r="22860" b="14605"/>
+                    <wp:inline distT="0" distB="0" distL="0" distR="0" wp14:anchorId="7A7B49B8" wp14:editId="291CA730">
+                      <wp:extent cx="6470650" cy="5045057"/>
+                      <wp:effectExtent l="19050" t="19050" r="25400" b="22860"/>
                       <wp:docPr id="70" name="Picture 70"/>
                       <wp:cNvGraphicFramePr>
                         <a:graphicFrameLocks xmlns:a="http://schemas.openxmlformats.org/drawingml/2006/main" noChangeAspect="1"/>
@@ -8838,7 +8792,7 @@
                             <pic:spPr bwMode="auto">
                               <a:xfrm>
                                 <a:off x="0" y="0"/>
-                                <a:ext cx="5104256" cy="3979703"/>
+                                <a:ext cx="6542683" cy="5101220"/>
                               </a:xfrm>
                               <a:prstGeom prst="rect">
                                 <a:avLst/>
@@ -8868,8 +8822,8 @@
               <w:lang w:eastAsia="de-DE"/>
             </w:rPr>
           </w:pPr>
-          <w:bookmarkStart w:id="158" w:name="_mioConsistencyCheck397"/>
-          <w:bookmarkStart w:id="159" w:name="_mioConsistencyCheck54"/>
+          <w:bookmarkStart w:id="157" w:name="_mioConsistencyCheck397"/>
+          <w:bookmarkStart w:id="158" w:name="_mioConsistencyCheck54"/>
           <w:r>
             <w:rPr>
               <w:rFonts w:ascii="Source Sans 3" w:hAnsi="Source Sans 3"/>
@@ -8913,7 +8867,7 @@
             </w:rPr>
             <w:tab/>
           </w:r>
-          <w:bookmarkStart w:id="160" w:name="_mioConsistencyCheck280"/>
+          <w:bookmarkStart w:id="159" w:name="_mioConsistencyCheck280"/>
           <w:r>
             <w:rPr>
               <w:rFonts w:ascii="Source Sans 3" w:hAnsi="Source Sans 3"/>
@@ -8923,14 +8877,14 @@
         </w:p>
       </w:sdtContent>
     </w:sdt>
+    <w:bookmarkEnd w:id="157"/>
     <w:bookmarkEnd w:id="158"/>
     <w:bookmarkEnd w:id="159"/>
-    <w:bookmarkEnd w:id="160"/>
     <w:p>
       <w:pPr>
         <w:pStyle w:val="ListParagraph"/>
         <w:spacing w:before="160" w:after="160"/>
-        <w:ind w:left="1778"/>
+        <w:ind w:left="1069"/>
         <w:rPr>
           <w:rFonts w:ascii="Source Sans 3" w:hAnsi="Source Sans 3"/>
           <w:lang w:eastAsia="de-DE"/>
@@ -9104,7 +9058,7 @@
       <w:pPr>
         <w:pStyle w:val="ListParagraph"/>
         <w:spacing w:before="160" w:after="160"/>
-        <w:ind w:left="1778"/>
+        <w:ind w:left="1069"/>
         <w:rPr>
           <w:rFonts w:ascii="Source Sans 3" w:hAnsi="Source Sans 3"/>
           <w:lang w:eastAsia="de-DE"/>
@@ -9171,7 +9125,7 @@
       <w:pPr>
         <w:pStyle w:val="ListParagraph"/>
         <w:spacing w:before="160" w:after="160"/>
-        <w:ind w:left="1778"/>
+        <w:ind w:left="1069"/>
         <w:rPr>
           <w:rFonts w:ascii="Source Sans 3" w:hAnsi="Source Sans 3"/>
         </w:rPr>
@@ -9322,8 +9276,8 @@
               <w:lang w:eastAsia="de-DE"/>
             </w:rPr>
           </w:pPr>
-          <w:bookmarkStart w:id="161" w:name="_mioConsistencyCheck398"/>
-          <w:bookmarkStart w:id="162" w:name="_mioConsistencyCheck55"/>
+          <w:bookmarkStart w:id="160" w:name="_mioConsistencyCheck398"/>
+          <w:bookmarkStart w:id="161" w:name="_mioConsistencyCheck55"/>
           <w:r>
             <w:rPr>
               <w:rFonts w:ascii="Source Sans 3" w:hAnsi="Source Sans 3"/>
@@ -9367,7 +9321,7 @@
             </w:rPr>
             <w:tab/>
           </w:r>
-          <w:bookmarkStart w:id="163" w:name="_mioConsistencyCheck281"/>
+          <w:bookmarkStart w:id="162" w:name="_mioConsistencyCheck281"/>
           <w:r>
             <w:rPr>
               <w:rFonts w:ascii="Source Sans 3" w:hAnsi="Source Sans 3"/>
@@ -9377,9 +9331,9 @@
         </w:p>
       </w:sdtContent>
     </w:sdt>
+    <w:bookmarkEnd w:id="160"/>
     <w:bookmarkEnd w:id="161"/>
     <w:bookmarkEnd w:id="162"/>
-    <w:bookmarkEnd w:id="163"/>
     <w:p>
       <w:pPr>
         <w:pStyle w:val="ListParagraph"/>
@@ -9544,8 +9498,8 @@
               <w:lang w:eastAsia="de-DE"/>
             </w:rPr>
           </w:pPr>
-          <w:bookmarkStart w:id="164" w:name="_mioConsistencyCheck399"/>
-          <w:bookmarkStart w:id="165" w:name="_mioConsistencyCheck56"/>
+          <w:bookmarkStart w:id="163" w:name="_mioConsistencyCheck399"/>
+          <w:bookmarkStart w:id="164" w:name="_mioConsistencyCheck56"/>
           <w:r>
             <w:rPr>
               <w:rFonts w:ascii="Source Sans 3" w:hAnsi="Source Sans 3"/>
@@ -9589,7 +9543,7 @@
             </w:rPr>
             <w:tab/>
           </w:r>
-          <w:bookmarkStart w:id="166" w:name="_mioConsistencyCheck282"/>
+          <w:bookmarkStart w:id="165" w:name="_mioConsistencyCheck282"/>
           <w:r>
             <w:rPr>
               <w:rFonts w:ascii="Source Sans 3" w:hAnsi="Source Sans 3"/>
@@ -9599,9 +9553,9 @@
         </w:p>
       </w:sdtContent>
     </w:sdt>
+    <w:bookmarkEnd w:id="163"/>
     <w:bookmarkEnd w:id="164"/>
     <w:bookmarkEnd w:id="165"/>
-    <w:bookmarkEnd w:id="166"/>
     <w:p>
       <w:pPr>
         <w:pStyle w:val="ListParagraph"/>
@@ -9788,8 +9742,8 @@
               <w:rFonts w:ascii="Source Sans 3" w:hAnsi="Source Sans 3"/>
             </w:rPr>
           </w:pPr>
-          <w:bookmarkStart w:id="167" w:name="_mioConsistencyCheck400"/>
-          <w:bookmarkStart w:id="168" w:name="_mioConsistencyCheck57"/>
+          <w:bookmarkStart w:id="166" w:name="_mioConsistencyCheck400"/>
+          <w:bookmarkStart w:id="167" w:name="_mioConsistencyCheck57"/>
           <w:r>
             <w:rPr>
               <w:rFonts w:ascii="Source Sans 3" w:hAnsi="Source Sans 3"/>
@@ -9833,7 +9787,7 @@
             </w:rPr>
             <w:tab/>
           </w:r>
-          <w:bookmarkStart w:id="169" w:name="_mioConsistencyCheck283"/>
+          <w:bookmarkStart w:id="168" w:name="_mioConsistencyCheck283"/>
           <w:r>
             <w:rPr>
               <w:rFonts w:ascii="Source Sans 3" w:hAnsi="Source Sans 3"/>
@@ -9843,14 +9797,14 @@
         </w:p>
       </w:sdtContent>
     </w:sdt>
+    <w:bookmarkEnd w:id="166"/>
     <w:bookmarkEnd w:id="167"/>
     <w:bookmarkEnd w:id="168"/>
-    <w:bookmarkEnd w:id="169"/>
     <w:p>
       <w:pPr>
         <w:pStyle w:val="ListParagraph"/>
         <w:spacing w:before="160" w:after="160"/>
-        <w:ind w:left="1778"/>
+        <w:ind w:left="709"/>
         <w:rPr>
           <w:rFonts w:ascii="Source Sans 3" w:hAnsi="Source Sans 3"/>
         </w:rPr>
@@ -9989,8 +9943,8 @@
               <w:lang w:eastAsia="de-DE"/>
             </w:rPr>
           </w:pPr>
-          <w:bookmarkStart w:id="170" w:name="_mioConsistencyCheck401"/>
-          <w:bookmarkStart w:id="171" w:name="_mioConsistencyCheck58"/>
+          <w:bookmarkStart w:id="169" w:name="_mioConsistencyCheck401"/>
+          <w:bookmarkStart w:id="170" w:name="_mioConsistencyCheck58"/>
           <w:r>
             <w:rPr>
               <w:rFonts w:ascii="Source Sans 3" w:hAnsi="Source Sans 3"/>
@@ -10034,7 +9988,7 @@
             </w:rPr>
             <w:tab/>
           </w:r>
-          <w:bookmarkStart w:id="172" w:name="_mioConsistencyCheck284"/>
+          <w:bookmarkStart w:id="171" w:name="_mioConsistencyCheck284"/>
           <w:r>
             <w:rPr>
               <w:rFonts w:ascii="Source Sans 3" w:hAnsi="Source Sans 3"/>
@@ -10050,11 +10004,11 @@
         <w:spacing w:before="160" w:after="160"/>
         <w:ind w:left="1778"/>
       </w:pPr>
-      <w:bookmarkStart w:id="173" w:name="_mioConsistencyCheck295"/>
-      <w:bookmarkStart w:id="174" w:name="_mioConsistencyCheck75"/>
+      <w:bookmarkStart w:id="172" w:name="_mioConsistencyCheck295"/>
+      <w:bookmarkStart w:id="173" w:name="_mioConsistencyCheck75"/>
+      <w:bookmarkEnd w:id="169"/>
       <w:bookmarkEnd w:id="170"/>
       <w:bookmarkEnd w:id="171"/>
-      <w:bookmarkEnd w:id="172"/>
     </w:p>
     <w:p>
       <w:pPr>
@@ -10104,8 +10058,8 @@
         </w:rPr>
       </w:pPr>
     </w:p>
+    <w:bookmarkEnd w:id="172"/>
     <w:bookmarkEnd w:id="173"/>
-    <w:bookmarkEnd w:id="174"/>
     <w:p>
       <w:pPr>
         <w:pStyle w:val="ListParagraph"/>
@@ -10438,9 +10392,9 @@
               <w:lang w:eastAsia="de-DE"/>
             </w:rPr>
           </w:pPr>
-          <w:bookmarkStart w:id="175" w:name="_mioConsistencyCheck402"/>
-          <w:bookmarkStart w:id="176" w:name="_mioConsistencyCheck59"/>
-          <w:bookmarkStart w:id="177" w:name="_Ref212806488"/>
+          <w:bookmarkStart w:id="174" w:name="_mioConsistencyCheck402"/>
+          <w:bookmarkStart w:id="175" w:name="_mioConsistencyCheck59"/>
+          <w:bookmarkStart w:id="176" w:name="_Ref212806488"/>
           <w:r>
             <w:rPr>
               <w:rFonts w:ascii="Source Sans 3" w:hAnsi="Source Sans 3"/>
@@ -10487,13 +10441,13 @@
         </w:p>
       </w:sdtContent>
     </w:sdt>
-    <w:bookmarkEnd w:id="177" w:displacedByCustomXml="prev"/>
+    <w:bookmarkEnd w:id="176" w:displacedByCustomXml="prev"/>
+    <w:bookmarkEnd w:id="174"/>
     <w:bookmarkEnd w:id="175"/>
-    <w:bookmarkEnd w:id="176"/>
     <w:p>
       <w:pPr>
         <w:spacing w:before="160" w:after="160"/>
-        <w:ind w:left="1418"/>
+        <w:ind w:left="709"/>
         <w:rPr>
           <w:rFonts w:ascii="Source Sans 3" w:hAnsi="Source Sans 3"/>
           <w:lang w:eastAsia="de-DE"/>
@@ -10809,8 +10763,8 @@
               <w:lang w:eastAsia="de-DE"/>
             </w:rPr>
           </w:pPr>
-          <w:bookmarkStart w:id="178" w:name="_mioConsistencyCheck403"/>
-          <w:bookmarkStart w:id="179" w:name="_mioConsistencyCheck60"/>
+          <w:bookmarkStart w:id="177" w:name="_mioConsistencyCheck403"/>
+          <w:bookmarkStart w:id="178" w:name="_mioConsistencyCheck60"/>
           <w:r>
             <w:rPr>
               <w:rFonts w:ascii="Source Sans 3" w:hAnsi="Source Sans 3"/>
@@ -10854,7 +10808,7 @@
             </w:rPr>
             <w:tab/>
           </w:r>
-          <w:bookmarkStart w:id="180" w:name="_mioConsistencyCheck285"/>
+          <w:bookmarkStart w:id="179" w:name="_mioConsistencyCheck285"/>
           <w:r>
             <w:rPr>
               <w:rFonts w:ascii="Source Sans 3" w:hAnsi="Source Sans 3"/>
@@ -10864,9 +10818,9 @@
         </w:p>
       </w:sdtContent>
     </w:sdt>
+    <w:bookmarkEnd w:id="177"/>
     <w:bookmarkEnd w:id="178"/>
     <w:bookmarkEnd w:id="179"/>
-    <w:bookmarkEnd w:id="180"/>
     <w:p>
       <w:pPr>
         <w:pStyle w:val="ListParagraph"/>
@@ -10990,8 +10944,8 @@
               <w:lang w:eastAsia="de-DE"/>
             </w:rPr>
           </w:pPr>
-          <w:bookmarkStart w:id="181" w:name="_mioConsistencyCheck404"/>
-          <w:bookmarkStart w:id="182" w:name="_mioConsistencyCheck61"/>
+          <w:bookmarkStart w:id="180" w:name="_mioConsistencyCheck404"/>
+          <w:bookmarkStart w:id="181" w:name="_mioConsistencyCheck61"/>
           <w:r>
             <w:rPr>
               <w:rFonts w:ascii="Source Sans 3" w:hAnsi="Source Sans 3"/>
@@ -11035,7 +10989,7 @@
             </w:rPr>
             <w:tab/>
           </w:r>
-          <w:bookmarkStart w:id="183" w:name="_mioConsistencyCheck286"/>
+          <w:bookmarkStart w:id="182" w:name="_mioConsistencyCheck286"/>
           <w:r>
             <w:rPr>
               <w:rFonts w:ascii="Source Sans 3" w:hAnsi="Source Sans 3"/>
@@ -11045,9 +10999,9 @@
         </w:p>
       </w:sdtContent>
     </w:sdt>
+    <w:bookmarkEnd w:id="180"/>
     <w:bookmarkEnd w:id="181"/>
     <w:bookmarkEnd w:id="182"/>
-    <w:bookmarkEnd w:id="183"/>
     <w:p>
       <w:pPr>
         <w:pStyle w:val="ListParagraph"/>
@@ -11063,7 +11017,7 @@
       <w:pPr>
         <w:pStyle w:val="ListParagraph"/>
         <w:spacing w:before="160" w:after="160"/>
-        <w:ind w:left="1778"/>
+        <w:ind w:left="1069"/>
         <w:rPr>
           <w:lang w:eastAsia="de-DE"/>
         </w:rPr>
@@ -11464,7 +11418,6 @@
         </w:placeholder>
         <w15:appearance w15:val="hidden"/>
       </w:sdtPr>
-      <w:sdtEndPr/>
       <w:sdtContent>
         <w:tbl>
           <w:tblPr>
@@ -11551,8 +11504,8 @@
               <w:lang w:eastAsia="de-DE"/>
             </w:rPr>
           </w:pPr>
-          <w:bookmarkStart w:id="184" w:name="_mioConsistencyCheck405"/>
-          <w:bookmarkStart w:id="185" w:name="_mioConsistencyCheck62"/>
+          <w:bookmarkStart w:id="183" w:name="_mioConsistencyCheck405"/>
+          <w:bookmarkStart w:id="184" w:name="_mioConsistencyCheck62"/>
           <w:r>
             <w:rPr>
               <w:rFonts w:ascii="Source Sans 3" w:hAnsi="Source Sans 3"/>
@@ -11637,10 +11590,10 @@
           </w:r>
           <w:proofErr w:type="spellEnd"/>
         </w:p>
-        <w:bookmarkEnd w:id="185" w:displacedByCustomXml="next"/>
+        <w:bookmarkEnd w:id="184" w:displacedByCustomXml="next"/>
       </w:sdtContent>
     </w:sdt>
-    <w:bookmarkEnd w:id="184"/>
+    <w:bookmarkEnd w:id="183"/>
     <w:p>
       <w:pPr>
         <w:pStyle w:val="ListParagraph"/>
@@ -11669,7 +11622,6 @@
         </w:placeholder>
         <w15:appearance w15:val="hidden"/>
       </w:sdtPr>
-      <w:sdtEndPr/>
       <w:sdtContent>
         <w:tbl>
           <w:tblPr>
@@ -11750,8 +11702,8 @@
               <w:lang w:eastAsia="de-DE"/>
             </w:rPr>
           </w:pPr>
-          <w:bookmarkStart w:id="186" w:name="_mioConsistencyCheck406"/>
-          <w:bookmarkStart w:id="187" w:name="_mioConsistencyCheck63"/>
+          <w:bookmarkStart w:id="185" w:name="_mioConsistencyCheck406"/>
+          <w:bookmarkStart w:id="186" w:name="_mioConsistencyCheck63"/>
           <w:r>
             <w:rPr>
               <w:rFonts w:ascii="Source Sans 3" w:hAnsi="Source Sans 3"/>
@@ -11818,10 +11770,10 @@
           </w:r>
           <w:proofErr w:type="spellEnd"/>
         </w:p>
-        <w:bookmarkEnd w:id="187" w:displacedByCustomXml="next"/>
+        <w:bookmarkEnd w:id="186" w:displacedByCustomXml="next"/>
       </w:sdtContent>
     </w:sdt>
-    <w:bookmarkEnd w:id="186"/>
+    <w:bookmarkEnd w:id="185"/>
     <w:p>
       <w:pPr>
         <w:spacing w:before="160" w:after="160"/>
@@ -11946,14 +11898,81 @@
           <w:rFonts w:ascii="Source Sans 3" w:hAnsi="Source Sans 3"/>
           <w:lang w:eastAsia="de-DE"/>
         </w:rPr>
-        <w:t xml:space="preserve"> (These Template main.c file has required </w:t>
-      </w:r>
-      <w:r>
-        <w:rPr>
-          <w:rFonts w:ascii="Source Sans 3" w:hAnsi="Source Sans 3"/>
-          <w:lang w:eastAsia="de-DE"/>
-        </w:rPr>
-        <w:t>Macros</w:t>
+        <w:t xml:space="preserve"> (These </w:t>
+      </w:r>
+      <w:r>
+        <w:rPr>
+          <w:rFonts w:ascii="Source Sans 3" w:hAnsi="Source Sans 3"/>
+          <w:lang w:eastAsia="de-DE"/>
+        </w:rPr>
+        <w:t>t</w:t>
+      </w:r>
+      <w:r>
+        <w:rPr>
+          <w:rFonts w:ascii="Source Sans 3" w:hAnsi="Source Sans 3"/>
+          <w:lang w:eastAsia="de-DE"/>
+        </w:rPr>
+        <w:t xml:space="preserve">emplate </w:t>
+      </w:r>
+      <w:proofErr w:type="spellStart"/>
+      <w:r>
+        <w:rPr>
+          <w:rFonts w:ascii="Source Sans 3" w:hAnsi="Source Sans 3"/>
+          <w:lang w:eastAsia="de-DE"/>
+        </w:rPr>
+        <w:t>main.c</w:t>
+      </w:r>
+      <w:proofErr w:type="spellEnd"/>
+      <w:r>
+        <w:rPr>
+          <w:rFonts w:ascii="Source Sans 3" w:hAnsi="Source Sans 3"/>
+          <w:lang w:eastAsia="de-DE"/>
+        </w:rPr>
+        <w:t xml:space="preserve"> file</w:t>
+      </w:r>
+      <w:r>
+        <w:rPr>
+          <w:rFonts w:ascii="Source Sans 3" w:hAnsi="Source Sans 3"/>
+          <w:lang w:eastAsia="de-DE"/>
+        </w:rPr>
+        <w:t>s</w:t>
+      </w:r>
+      <w:r>
+        <w:rPr>
+          <w:rFonts w:ascii="Source Sans 3" w:hAnsi="Source Sans 3"/>
+          <w:lang w:eastAsia="de-DE"/>
+        </w:rPr>
+        <w:t xml:space="preserve"> ha</w:t>
+      </w:r>
+      <w:r>
+        <w:rPr>
+          <w:rFonts w:ascii="Source Sans 3" w:hAnsi="Source Sans 3"/>
+          <w:lang w:eastAsia="de-DE"/>
+        </w:rPr>
+        <w:t>ve</w:t>
+      </w:r>
+      <w:r>
+        <w:rPr>
+          <w:rFonts w:ascii="Source Sans 3" w:hAnsi="Source Sans 3"/>
+          <w:lang w:eastAsia="de-DE"/>
+        </w:rPr>
+        <w:t xml:space="preserve"> required </w:t>
+      </w:r>
+      <w:r>
+        <w:rPr>
+          <w:rFonts w:ascii="Source Sans 3" w:hAnsi="Source Sans 3"/>
+          <w:lang w:eastAsia="de-DE"/>
+        </w:rPr>
+        <w:t>m</w:t>
+      </w:r>
+      <w:bookmarkStart w:id="187" w:name="_GoBack"/>
+      <w:bookmarkEnd w:id="187"/>
+      <w:r>
+        <w:rPr>
+          <w:rFonts w:ascii="Source Sans 3" w:hAnsi="Source Sans 3"/>
+          <w:lang w:eastAsia="de-DE"/>
+        </w:rPr>
+        <w:t>acros</w:t>
       </w:r>
       <w:r>
         <w:rPr>
@@ -41113,7 +41132,7 @@
       </mc:AlternateContent>
     </w:r>
     <w:r>
-      <w:object w:dxaOrig="1440" w:dyaOrig="1440" w14:anchorId="400CF152">
+      <w:object w:dxaOrig="0" w:dyaOrig="0" w14:anchorId="400CF152">
         <v:shapetype id="_x0000_t75" coordsize="21600,21600" o:spt="75" o:preferrelative="t" path="m@4@5l@4@11@9@11@9@5xe" filled="f" stroked="f">
           <v:stroke joinstyle="miter"/>
           <v:formulas>
@@ -41136,7 +41155,7 @@
         <v:shape id="_x0000_s2052" type="#_x0000_t75" style="position:absolute;margin-left:-45.75pt;margin-top:62.5pt;width:602.45pt;height:287.2pt;z-index:-251642880;mso-position-horizontal-relative:text;mso-position-vertical-relative:text">
           <v:imagedata r:id="rId1" o:title=""/>
         </v:shape>
-        <o:OLEObject Type="Embed" ProgID="Visio.Drawing.15" ShapeID="_x0000_s2052" DrawAspect="Content" ObjectID="_1823432840" r:id="rId2"/>
+        <o:OLEObject Type="Embed" ProgID="Visio.Drawing.15" ShapeID="_x0000_s2052" DrawAspect="Content" ObjectID="_1823623341" r:id="rId2"/>
       </w:object>
     </w:r>
     <w:r>
@@ -42446,7 +42465,7 @@
       </mc:AlternateContent>
     </w:r>
     <w:r>
-      <w:object w:dxaOrig="1440" w:dyaOrig="1440" w14:anchorId="7E268E63">
+      <w:object w:dxaOrig="0" w:dyaOrig="0" w14:anchorId="7E268E63">
         <v:shapetype id="_x0000_t75" coordsize="21600,21600" o:spt="75" o:preferrelative="t" path="m@4@5l@4@11@9@11@9@5xe" filled="f" stroked="f">
           <v:stroke joinstyle="miter"/>
           <v:formulas>
@@ -42469,7 +42488,7 @@
         <v:shape id="_x0000_s2051" type="#_x0000_t75" style="position:absolute;margin-left:-45.75pt;margin-top:62.5pt;width:602.45pt;height:287.2pt;z-index:-251643904;mso-position-horizontal-relative:text;mso-position-vertical-relative:text">
           <v:imagedata r:id="rId1" o:title=""/>
         </v:shape>
-        <o:OLEObject Type="Embed" ProgID="Visio.Drawing.15" ShapeID="_x0000_s2051" DrawAspect="Content" ObjectID="_1823432841" r:id="rId2"/>
+        <o:OLEObject Type="Embed" ProgID="Visio.Drawing.15" ShapeID="_x0000_s2051" DrawAspect="Content" ObjectID="_1823623342" r:id="rId2"/>
       </w:object>
     </w:r>
     <w:r>
@@ -47995,7 +48014,7 @@
       <w:lvlText w:val="%1."/>
       <w:lvlJc w:val="left"/>
       <w:pPr>
-        <w:ind w:left="1778" w:hanging="360"/>
+        <w:ind w:left="1069" w:hanging="360"/>
       </w:pPr>
       <w:rPr>
         <w:rFonts w:hint="default"/>
@@ -48007,7 +48026,7 @@
       <w:lvlText w:val="%2."/>
       <w:lvlJc w:val="left"/>
       <w:pPr>
-        <w:ind w:left="1789" w:hanging="360"/>
+        <w:ind w:left="1080" w:hanging="360"/>
       </w:pPr>
     </w:lvl>
     <w:lvl w:ilvl="2" w:tplc="4009001B" w:tentative="1">
@@ -48016,7 +48035,7 @@
       <w:lvlText w:val="%3."/>
       <w:lvlJc w:val="right"/>
       <w:pPr>
-        <w:ind w:left="2509" w:hanging="180"/>
+        <w:ind w:left="1800" w:hanging="180"/>
       </w:pPr>
     </w:lvl>
     <w:lvl w:ilvl="3" w:tplc="4009000F" w:tentative="1">
@@ -48025,7 +48044,7 @@
       <w:lvlText w:val="%4."/>
       <w:lvlJc w:val="left"/>
       <w:pPr>
-        <w:ind w:left="3229" w:hanging="360"/>
+        <w:ind w:left="2520" w:hanging="360"/>
       </w:pPr>
     </w:lvl>
     <w:lvl w:ilvl="4" w:tplc="40090019" w:tentative="1">
@@ -48034,7 +48053,7 @@
       <w:lvlText w:val="%5."/>
       <w:lvlJc w:val="left"/>
       <w:pPr>
-        <w:ind w:left="3949" w:hanging="360"/>
+        <w:ind w:left="3240" w:hanging="360"/>
       </w:pPr>
     </w:lvl>
     <w:lvl w:ilvl="5" w:tplc="4009001B" w:tentative="1">
@@ -48043,7 +48062,7 @@
       <w:lvlText w:val="%6."/>
       <w:lvlJc w:val="right"/>
       <w:pPr>
-        <w:ind w:left="4669" w:hanging="180"/>
+        <w:ind w:left="3960" w:hanging="180"/>
       </w:pPr>
     </w:lvl>
     <w:lvl w:ilvl="6" w:tplc="4009000F" w:tentative="1">
@@ -48052,7 +48071,7 @@
       <w:lvlText w:val="%7."/>
       <w:lvlJc w:val="left"/>
       <w:pPr>
-        <w:ind w:left="5389" w:hanging="360"/>
+        <w:ind w:left="4680" w:hanging="360"/>
       </w:pPr>
     </w:lvl>
     <w:lvl w:ilvl="7" w:tplc="40090019" w:tentative="1">
@@ -48061,7 +48080,7 @@
       <w:lvlText w:val="%8."/>
       <w:lvlJc w:val="left"/>
       <w:pPr>
-        <w:ind w:left="6109" w:hanging="360"/>
+        <w:ind w:left="5400" w:hanging="360"/>
       </w:pPr>
     </w:lvl>
     <w:lvl w:ilvl="8" w:tplc="4009001B" w:tentative="1">
@@ -48070,7 +48089,7 @@
       <w:lvlText w:val="%9."/>
       <w:lvlJc w:val="right"/>
       <w:pPr>
-        <w:ind w:left="6829" w:hanging="180"/>
+        <w:ind w:left="6120" w:hanging="180"/>
       </w:pPr>
     </w:lvl>
   </w:abstractNum>
@@ -48855,7 +48874,7 @@
       <w:lvlText w:val="%1."/>
       <w:lvlJc w:val="left"/>
       <w:pPr>
-        <w:ind w:left="1778" w:hanging="360"/>
+        <w:ind w:left="1069" w:hanging="360"/>
       </w:pPr>
       <w:rPr>
         <w:rFonts w:hint="default"/>
@@ -48867,7 +48886,7 @@
       <w:lvlText w:val="%2."/>
       <w:lvlJc w:val="left"/>
       <w:pPr>
-        <w:ind w:left="1440" w:hanging="360"/>
+        <w:ind w:left="731" w:hanging="360"/>
       </w:pPr>
     </w:lvl>
     <w:lvl w:ilvl="2" w:tplc="4009001B" w:tentative="1">
@@ -48876,7 +48895,7 @@
       <w:lvlText w:val="%3."/>
       <w:lvlJc w:val="right"/>
       <w:pPr>
-        <w:ind w:left="2160" w:hanging="180"/>
+        <w:ind w:left="1451" w:hanging="180"/>
       </w:pPr>
     </w:lvl>
     <w:lvl w:ilvl="3" w:tplc="4009000F" w:tentative="1">
@@ -48885,7 +48904,7 @@
       <w:lvlText w:val="%4."/>
       <w:lvlJc w:val="left"/>
       <w:pPr>
-        <w:ind w:left="2880" w:hanging="360"/>
+        <w:ind w:left="2171" w:hanging="360"/>
       </w:pPr>
     </w:lvl>
     <w:lvl w:ilvl="4" w:tplc="40090019" w:tentative="1">
@@ -48894,7 +48913,7 @@
       <w:lvlText w:val="%5."/>
       <w:lvlJc w:val="left"/>
       <w:pPr>
-        <w:ind w:left="3600" w:hanging="360"/>
+        <w:ind w:left="2891" w:hanging="360"/>
       </w:pPr>
     </w:lvl>
     <w:lvl w:ilvl="5" w:tplc="4009001B" w:tentative="1">
@@ -48903,7 +48922,7 @@
       <w:lvlText w:val="%6."/>
       <w:lvlJc w:val="right"/>
       <w:pPr>
-        <w:ind w:left="4320" w:hanging="180"/>
+        <w:ind w:left="3611" w:hanging="180"/>
       </w:pPr>
     </w:lvl>
     <w:lvl w:ilvl="6" w:tplc="4009000F" w:tentative="1">
@@ -48912,7 +48931,7 @@
       <w:lvlText w:val="%7."/>
       <w:lvlJc w:val="left"/>
       <w:pPr>
-        <w:ind w:left="5040" w:hanging="360"/>
+        <w:ind w:left="4331" w:hanging="360"/>
       </w:pPr>
     </w:lvl>
     <w:lvl w:ilvl="7" w:tplc="40090019" w:tentative="1">
@@ -48921,7 +48940,7 @@
       <w:lvlText w:val="%8."/>
       <w:lvlJc w:val="left"/>
       <w:pPr>
-        <w:ind w:left="5760" w:hanging="360"/>
+        <w:ind w:left="5051" w:hanging="360"/>
       </w:pPr>
     </w:lvl>
     <w:lvl w:ilvl="8" w:tplc="4009001B" w:tentative="1">
@@ -48930,7 +48949,7 @@
       <w:lvlText w:val="%9."/>
       <w:lvlJc w:val="right"/>
       <w:pPr>
-        <w:ind w:left="6480" w:hanging="180"/>
+        <w:ind w:left="5771" w:hanging="180"/>
       </w:pPr>
     </w:lvl>
   </w:abstractNum>
@@ -49170,7 +49189,7 @@
       <w:lvlText w:val="%1."/>
       <w:lvlJc w:val="left"/>
       <w:pPr>
-        <w:ind w:left="1778" w:hanging="360"/>
+        <w:ind w:left="1069" w:hanging="360"/>
       </w:pPr>
       <w:rPr>
         <w:rFonts w:hint="default"/>
@@ -49182,7 +49201,7 @@
       <w:lvlText w:val="%2."/>
       <w:lvlJc w:val="left"/>
       <w:pPr>
-        <w:ind w:left="2498" w:hanging="360"/>
+        <w:ind w:left="1789" w:hanging="360"/>
       </w:pPr>
     </w:lvl>
     <w:lvl w:ilvl="2" w:tplc="4009001B" w:tentative="1">
@@ -49191,7 +49210,7 @@
       <w:lvlText w:val="%3."/>
       <w:lvlJc w:val="right"/>
       <w:pPr>
-        <w:ind w:left="3218" w:hanging="180"/>
+        <w:ind w:left="2509" w:hanging="180"/>
       </w:pPr>
     </w:lvl>
     <w:lvl w:ilvl="3" w:tplc="4009000F" w:tentative="1">
@@ -49200,7 +49219,7 @@
       <w:lvlText w:val="%4."/>
       <w:lvlJc w:val="left"/>
       <w:pPr>
-        <w:ind w:left="3938" w:hanging="360"/>
+        <w:ind w:left="3229" w:hanging="360"/>
       </w:pPr>
     </w:lvl>
     <w:lvl w:ilvl="4" w:tplc="40090019" w:tentative="1">
@@ -49209,7 +49228,7 @@
       <w:lvlText w:val="%5."/>
       <w:lvlJc w:val="left"/>
       <w:pPr>
-        <w:ind w:left="4658" w:hanging="360"/>
+        <w:ind w:left="3949" w:hanging="360"/>
       </w:pPr>
     </w:lvl>
     <w:lvl w:ilvl="5" w:tplc="4009001B" w:tentative="1">
@@ -49218,7 +49237,7 @@
       <w:lvlText w:val="%6."/>
       <w:lvlJc w:val="right"/>
       <w:pPr>
-        <w:ind w:left="5378" w:hanging="180"/>
+        <w:ind w:left="4669" w:hanging="180"/>
       </w:pPr>
     </w:lvl>
     <w:lvl w:ilvl="6" w:tplc="4009000F" w:tentative="1">
@@ -49227,7 +49246,7 @@
       <w:lvlText w:val="%7."/>
       <w:lvlJc w:val="left"/>
       <w:pPr>
-        <w:ind w:left="6098" w:hanging="360"/>
+        <w:ind w:left="5389" w:hanging="360"/>
       </w:pPr>
     </w:lvl>
     <w:lvl w:ilvl="7" w:tplc="40090019" w:tentative="1">
@@ -49236,7 +49255,7 @@
       <w:lvlText w:val="%8."/>
       <w:lvlJc w:val="left"/>
       <w:pPr>
-        <w:ind w:left="6818" w:hanging="360"/>
+        <w:ind w:left="6109" w:hanging="360"/>
       </w:pPr>
     </w:lvl>
     <w:lvl w:ilvl="8" w:tplc="4009001B" w:tentative="1">
@@ -49245,7 +49264,7 @@
       <w:lvlText w:val="%9."/>
       <w:lvlJc w:val="right"/>
       <w:pPr>
-        <w:ind w:left="7538" w:hanging="180"/>
+        <w:ind w:left="6829" w:hanging="180"/>
       </w:pPr>
     </w:lvl>
   </w:abstractNum>
@@ -52861,7 +52880,7 @@
   <w:rsids>
     <w:rsidRoot w:val="00EC48F7"/>
     <w:rsid w:val="001857A4"/>
-    <w:rsid w:val="007A7345"/>
+    <w:rsid w:val="00BF47D9"/>
     <w:rsid w:val="00E12A08"/>
     <w:rsid w:val="00EC48F7"/>
   </w:rsids>
@@ -53982,7 +54001,7 @@
 </file>
 
 <file path=customXml/itemProps5.xml><?xml version="1.0" encoding="utf-8"?>
-<ds:datastoreItem xmlns:ds="http://schemas.openxmlformats.org/officeDocument/2006/customXml" ds:itemID="{BF002FA1-3A97-4E66-B952-82D7AE30191C}">
+<ds:datastoreItem xmlns:ds="http://schemas.openxmlformats.org/officeDocument/2006/customXml" ds:itemID="{21FA1997-6BEF-4834-994A-7AFF991637FB}">
   <ds:schemaRefs>
     <ds:schemaRef ds:uri="http://schemas.openxmlformats.org/officeDocument/2006/bibliography"/>
   </ds:schemaRefs>

</xml_diff>

<commit_message>
getting ready for IPC lab udpates
</commit_message>
<xml_diff>
--- a/.internal/Manual/Intro to PSOC Edge E84 - Part 2 (E2)/PSoC Edge E84 Introductory E2 Training Manual -WIP_10_21_2025.docx
+++ b/.internal/Manual/Intro to PSOC Edge E84 - Part 2 (E2)/PSoC Edge E84 Introductory E2 Training Manual -WIP_10_21_2025.docx
@@ -4441,7 +4441,7 @@
                     <v:shape id="_x0000_i1025" type="#_x0000_t75" style="width:475.95pt;height:588.15pt" o:ole="">
                       <v:imagedata r:id="rId21" o:title=""/>
                     </v:shape>
-                    <o:OLEObject Type="Embed" ProgID="Visio.Drawing.15" ShapeID="_x0000_i1025" DrawAspect="Content" ObjectID="_1823623339" r:id="rId22"/>
+                    <o:OLEObject Type="Embed" ProgID="Visio.Drawing.15" ShapeID="_x0000_i1025" DrawAspect="Content" ObjectID="_1823712199" r:id="rId22"/>
                   </w:object>
                 </w:r>
               </w:p>
@@ -4611,7 +4611,7 @@
                     <v:shape id="_x0000_i1026" type="#_x0000_t75" style="width:116.9pt;height:114.1pt" o:ole="">
                       <v:imagedata r:id="rId23" o:title=""/>
                     </v:shape>
-                    <o:OLEObject Type="Embed" ProgID="Visio.Drawing.15" ShapeID="_x0000_i1026" DrawAspect="Content" ObjectID="_1823623340" r:id="rId24"/>
+                    <o:OLEObject Type="Embed" ProgID="Visio.Drawing.15" ShapeID="_x0000_i1026" DrawAspect="Content" ObjectID="_1823712200" r:id="rId24"/>
                   </w:object>
                 </w:r>
               </w:p>
@@ -11898,7 +11898,15 @@
           <w:rFonts w:ascii="Source Sans 3" w:hAnsi="Source Sans 3"/>
           <w:lang w:eastAsia="de-DE"/>
         </w:rPr>
-        <w:t xml:space="preserve"> (These </w:t>
+        <w:t xml:space="preserve"> (</w:t>
+      </w:r>
+      <w:proofErr w:type="gramStart"/>
+      <w:r>
+        <w:rPr>
+          <w:rFonts w:ascii="Source Sans 3" w:hAnsi="Source Sans 3"/>
+          <w:lang w:eastAsia="de-DE"/>
+        </w:rPr>
+        <w:t xml:space="preserve">These </w:t>
       </w:r>
       <w:r>
         <w:rPr>
@@ -11912,7 +11920,15 @@
           <w:rFonts w:ascii="Source Sans 3" w:hAnsi="Source Sans 3"/>
           <w:lang w:eastAsia="de-DE"/>
         </w:rPr>
-        <w:t xml:space="preserve">emplate </w:t>
+        <w:t>emplate</w:t>
+      </w:r>
+      <w:proofErr w:type="gramEnd"/>
+      <w:r>
+        <w:rPr>
+          <w:rFonts w:ascii="Source Sans 3" w:hAnsi="Source Sans 3"/>
+          <w:lang w:eastAsia="de-DE"/>
+        </w:rPr>
+        <w:t xml:space="preserve"> </w:t>
       </w:r>
       <w:proofErr w:type="spellStart"/>
       <w:r>
@@ -11965,8 +11981,6 @@
         </w:rPr>
         <w:t>m</w:t>
       </w:r>
-      <w:bookmarkStart w:id="187" w:name="_GoBack"/>
-      <w:bookmarkEnd w:id="187"/>
       <w:r>
         <w:rPr>
           <w:rFonts w:ascii="Source Sans 3" w:hAnsi="Source Sans 3"/>
@@ -12202,8 +12216,8 @@
           <w:lang w:eastAsia="de-DE"/>
         </w:rPr>
       </w:pPr>
-      <w:bookmarkStart w:id="188" w:name="_mioConsistencyCheck296"/>
-      <w:bookmarkStart w:id="189" w:name="_mioConsistencyCheck76"/>
+      <w:bookmarkStart w:id="187" w:name="_mioConsistencyCheck296"/>
+      <w:bookmarkStart w:id="188" w:name="_mioConsistencyCheck76"/>
     </w:p>
     <w:p>
       <w:pPr>
@@ -12288,8 +12302,8 @@
         </w:rPr>
       </w:pPr>
     </w:p>
+    <w:bookmarkEnd w:id="187"/>
     <w:bookmarkEnd w:id="188"/>
-    <w:bookmarkEnd w:id="189"/>
     <w:p>
       <w:pPr>
         <w:pStyle w:val="ListParagraph"/>
@@ -12800,7 +12814,7 @@
           <w:lang w:val="en-IN"/>
         </w:rPr>
       </w:pPr>
-      <w:bookmarkStart w:id="190" w:name="_mioConsistencyCheck167"/>
+      <w:bookmarkStart w:id="189" w:name="_mioConsistencyCheck167"/>
       <w:r>
         <w:rPr>
           <w:rFonts w:ascii="Courier New" w:hAnsi="Courier New" w:cs="Courier New"/>
@@ -13021,7 +13035,7 @@
         <w:t xml:space="preserve">    }</w:t>
       </w:r>
     </w:p>
-    <w:bookmarkEnd w:id="190"/>
+    <w:bookmarkEnd w:id="189"/>
     <w:p>
       <w:pPr>
         <w:spacing w:before="160" w:after="160"/>
@@ -13119,8 +13133,8 @@
         </w:rPr>
         <w:t xml:space="preserve"> will be available in HAL documentation </w:t>
       </w:r>
-      <w:bookmarkStart w:id="191" w:name="_mioConsistencyCheck168"/>
-      <w:bookmarkStart w:id="192" w:name="_mioConsistencyCheck64"/>
+      <w:bookmarkStart w:id="190" w:name="_mioConsistencyCheck168"/>
+      <w:bookmarkStart w:id="191" w:name="_mioConsistencyCheck64"/>
       <w:r>
         <w:fldChar w:fldCharType="begin"/>
       </w:r>
@@ -13151,8 +13165,8 @@
         </w:rPr>
         <w:fldChar w:fldCharType="end"/>
       </w:r>
+      <w:bookmarkEnd w:id="190"/>
       <w:bookmarkEnd w:id="191"/>
-      <w:bookmarkEnd w:id="192"/>
       <w:r>
         <w:rPr>
           <w:rFonts w:ascii="Source Sans 3" w:hAnsi="Source Sans 3" w:cs="Consolas"/>
@@ -13437,7 +13451,7 @@
           <w:lang w:val="en-IN"/>
         </w:rPr>
       </w:pPr>
-      <w:bookmarkStart w:id="193" w:name="_mioConsistencyCheck169"/>
+      <w:bookmarkStart w:id="192" w:name="_mioConsistencyCheck169"/>
       <w:r>
         <w:rPr>
           <w:rFonts w:ascii="Courier New" w:hAnsi="Courier New" w:cs="Courier New"/>
@@ -13521,6 +13535,152 @@
         <w:t xml:space="preserve">        CY_RETARGET_IO_BAUDRATE);</w:t>
       </w:r>
     </w:p>
+    <w:bookmarkEnd w:id="192"/>
+    <w:p>
+      <w:pPr>
+        <w:autoSpaceDE w:val="0"/>
+        <w:autoSpaceDN w:val="0"/>
+        <w:adjustRightInd w:val="0"/>
+        <w:ind w:left="1418"/>
+        <w:rPr>
+          <w:rFonts w:ascii="Courier New" w:hAnsi="Courier New" w:cs="Courier New"/>
+          <w:color w:val="FF0000"/>
+          <w:sz w:val="18"/>
+          <w:szCs w:val="18"/>
+          <w:lang w:val="en-IN"/>
+        </w:rPr>
+      </w:pPr>
+    </w:p>
+    <w:p>
+      <w:pPr>
+        <w:autoSpaceDE w:val="0"/>
+        <w:autoSpaceDN w:val="0"/>
+        <w:adjustRightInd w:val="0"/>
+        <w:ind w:left="1418"/>
+        <w:rPr>
+          <w:rFonts w:ascii="Courier New" w:hAnsi="Courier New" w:cs="Courier New"/>
+          <w:color w:val="F97414"/>
+          <w:sz w:val="18"/>
+          <w:szCs w:val="18"/>
+          <w:lang w:val="en-IN"/>
+        </w:rPr>
+      </w:pPr>
+      <w:r>
+        <w:rPr>
+          <w:rFonts w:ascii="Courier New" w:hAnsi="Courier New" w:cs="Courier New"/>
+          <w:color w:val="FF0000"/>
+          <w:sz w:val="18"/>
+          <w:szCs w:val="18"/>
+          <w:lang w:val="en-IN"/>
+        </w:rPr>
+        <w:t xml:space="preserve">    </w:t>
+      </w:r>
+      <w:bookmarkStart w:id="193" w:name="_mioConsistencyCheck170"/>
+      <w:r>
+        <w:rPr>
+          <w:rFonts w:ascii="Courier New" w:hAnsi="Courier New" w:cs="Courier New"/>
+          <w:color w:val="F97414"/>
+          <w:sz w:val="18"/>
+          <w:szCs w:val="18"/>
+          <w:lang w:val="en-IN"/>
+        </w:rPr>
+        <w:t>/* retarget-</w:t>
+      </w:r>
+      <w:proofErr w:type="spellStart"/>
+      <w:r>
+        <w:rPr>
+          <w:rFonts w:ascii="Courier New" w:hAnsi="Courier New" w:cs="Courier New"/>
+          <w:color w:val="F97414"/>
+          <w:sz w:val="18"/>
+          <w:szCs w:val="18"/>
+          <w:lang w:val="en-IN"/>
+        </w:rPr>
+        <w:t>io</w:t>
+      </w:r>
+      <w:proofErr w:type="spellEnd"/>
+      <w:r>
+        <w:rPr>
+          <w:rFonts w:ascii="Courier New" w:hAnsi="Courier New" w:cs="Courier New"/>
+          <w:color w:val="F97414"/>
+          <w:sz w:val="18"/>
+          <w:szCs w:val="18"/>
+          <w:lang w:val="en-IN"/>
+        </w:rPr>
+        <w:t xml:space="preserve"> </w:t>
+      </w:r>
+      <w:proofErr w:type="spellStart"/>
+      <w:r>
+        <w:rPr>
+          <w:rFonts w:ascii="Courier New" w:hAnsi="Courier New" w:cs="Courier New"/>
+          <w:color w:val="F97414"/>
+          <w:sz w:val="18"/>
+          <w:szCs w:val="18"/>
+          <w:lang w:val="en-IN"/>
+        </w:rPr>
+        <w:t>init</w:t>
+      </w:r>
+      <w:proofErr w:type="spellEnd"/>
+      <w:r>
+        <w:rPr>
+          <w:rFonts w:ascii="Courier New" w:hAnsi="Courier New" w:cs="Courier New"/>
+          <w:color w:val="F97414"/>
+          <w:sz w:val="18"/>
+          <w:szCs w:val="18"/>
+          <w:lang w:val="en-IN"/>
+        </w:rPr>
+        <w:t xml:space="preserve"> failed. Stop program execution */</w:t>
+      </w:r>
+    </w:p>
+    <w:p>
+      <w:pPr>
+        <w:autoSpaceDE w:val="0"/>
+        <w:autoSpaceDN w:val="0"/>
+        <w:adjustRightInd w:val="0"/>
+        <w:ind w:left="1418"/>
+        <w:rPr>
+          <w:rFonts w:ascii="Courier New" w:hAnsi="Courier New" w:cs="Courier New"/>
+          <w:color w:val="F97414"/>
+          <w:sz w:val="18"/>
+          <w:szCs w:val="18"/>
+          <w:lang w:val="en-IN"/>
+        </w:rPr>
+      </w:pPr>
+      <w:r>
+        <w:rPr>
+          <w:rFonts w:ascii="Courier New" w:hAnsi="Courier New" w:cs="Courier New"/>
+          <w:color w:val="F97414"/>
+          <w:sz w:val="18"/>
+          <w:szCs w:val="18"/>
+          <w:lang w:val="en-IN"/>
+        </w:rPr>
+        <w:t xml:space="preserve">    if (result != CY_RSLT_SUCCESS)</w:t>
+      </w:r>
+    </w:p>
+    <w:p>
+      <w:pPr>
+        <w:autoSpaceDE w:val="0"/>
+        <w:autoSpaceDN w:val="0"/>
+        <w:adjustRightInd w:val="0"/>
+        <w:ind w:left="1418"/>
+        <w:rPr>
+          <w:rFonts w:ascii="Courier New" w:hAnsi="Courier New" w:cs="Courier New"/>
+          <w:color w:val="F97414"/>
+          <w:sz w:val="18"/>
+          <w:szCs w:val="18"/>
+          <w:lang w:val="en-IN"/>
+        </w:rPr>
+      </w:pPr>
+      <w:r>
+        <w:rPr>
+          <w:rFonts w:ascii="Courier New" w:hAnsi="Courier New" w:cs="Courier New"/>
+          <w:color w:val="F97414"/>
+          <w:sz w:val="18"/>
+          <w:szCs w:val="18"/>
+          <w:lang w:val="en-IN"/>
+        </w:rPr>
+        <w:t xml:space="preserve">    {</w:t>
+      </w:r>
+    </w:p>
     <w:bookmarkEnd w:id="193"/>
     <w:p>
       <w:pPr>
@@ -13530,39 +13690,50 @@
         <w:ind w:left="1418"/>
         <w:rPr>
           <w:rFonts w:ascii="Courier New" w:hAnsi="Courier New" w:cs="Courier New"/>
+          <w:color w:val="F97414"/>
+          <w:sz w:val="18"/>
+          <w:szCs w:val="18"/>
+          <w:lang w:val="en-IN"/>
+        </w:rPr>
+      </w:pPr>
+      <w:r>
+        <w:rPr>
+          <w:rFonts w:ascii="Courier New" w:hAnsi="Courier New" w:cs="Courier New"/>
           <w:color w:val="FF0000"/>
           <w:sz w:val="18"/>
           <w:szCs w:val="18"/>
           <w:lang w:val="en-IN"/>
         </w:rPr>
-      </w:pPr>
-    </w:p>
-    <w:p>
-      <w:pPr>
-        <w:autoSpaceDE w:val="0"/>
-        <w:autoSpaceDN w:val="0"/>
-        <w:adjustRightInd w:val="0"/>
-        <w:ind w:left="1418"/>
-        <w:rPr>
-          <w:rFonts w:ascii="Courier New" w:hAnsi="Courier New" w:cs="Courier New"/>
-          <w:color w:val="F97414"/>
+        <w:t xml:space="preserve">    </w:t>
+      </w:r>
+      <w:r>
+        <w:rPr>
+          <w:rFonts w:ascii="Courier New" w:hAnsi="Courier New" w:cs="Courier New"/>
+          <w:color w:val="FF0000"/>
           <w:sz w:val="18"/>
           <w:szCs w:val="18"/>
           <w:lang w:val="en-IN"/>
         </w:rPr>
-      </w:pPr>
-      <w:r>
-        <w:rPr>
-          <w:rFonts w:ascii="Courier New" w:hAnsi="Courier New" w:cs="Courier New"/>
-          <w:color w:val="FF0000"/>
+        <w:t xml:space="preserve">    </w:t>
+      </w:r>
+      <w:bookmarkStart w:id="194" w:name="_mioConsistencyCheck171"/>
+      <w:r>
+        <w:rPr>
+          <w:rFonts w:ascii="Courier New" w:hAnsi="Courier New" w:cs="Courier New"/>
+          <w:color w:val="F97414"/>
           <w:sz w:val="18"/>
           <w:szCs w:val="18"/>
           <w:lang w:val="en-IN"/>
         </w:rPr>
-        <w:t xml:space="preserve">    </w:t>
-      </w:r>
-      <w:bookmarkStart w:id="194" w:name="_mioConsistencyCheck170"/>
-      <w:r>
+        <w:t>CY_ASSERT(0);</w:t>
+      </w:r>
+    </w:p>
+    <w:p>
+      <w:pPr>
+        <w:autoSpaceDE w:val="0"/>
+        <w:autoSpaceDN w:val="0"/>
+        <w:adjustRightInd w:val="0"/>
+        <w:ind w:left="1418"/>
         <w:rPr>
           <w:rFonts w:ascii="Courier New" w:hAnsi="Courier New" w:cs="Courier New"/>
           <w:color w:val="F97414"/>
@@ -13570,9 +13741,7 @@
           <w:szCs w:val="18"/>
           <w:lang w:val="en-IN"/>
         </w:rPr>
-        <w:t>/* retarget-</w:t>
-      </w:r>
-      <w:proofErr w:type="spellStart"/>
+      </w:pPr>
       <w:r>
         <w:rPr>
           <w:rFonts w:ascii="Courier New" w:hAnsi="Courier New" w:cs="Courier New"/>
@@ -13581,165 +13750,10 @@
           <w:szCs w:val="18"/>
           <w:lang w:val="en-IN"/>
         </w:rPr>
-        <w:t>io</w:t>
-      </w:r>
-      <w:proofErr w:type="spellEnd"/>
-      <w:r>
-        <w:rPr>
-          <w:rFonts w:ascii="Courier New" w:hAnsi="Courier New" w:cs="Courier New"/>
-          <w:color w:val="F97414"/>
-          <w:sz w:val="18"/>
-          <w:szCs w:val="18"/>
-          <w:lang w:val="en-IN"/>
-        </w:rPr>
-        <w:t xml:space="preserve"> </w:t>
-      </w:r>
-      <w:proofErr w:type="spellStart"/>
-      <w:r>
-        <w:rPr>
-          <w:rFonts w:ascii="Courier New" w:hAnsi="Courier New" w:cs="Courier New"/>
-          <w:color w:val="F97414"/>
-          <w:sz w:val="18"/>
-          <w:szCs w:val="18"/>
-          <w:lang w:val="en-IN"/>
-        </w:rPr>
-        <w:t>init</w:t>
-      </w:r>
-      <w:proofErr w:type="spellEnd"/>
-      <w:r>
-        <w:rPr>
-          <w:rFonts w:ascii="Courier New" w:hAnsi="Courier New" w:cs="Courier New"/>
-          <w:color w:val="F97414"/>
-          <w:sz w:val="18"/>
-          <w:szCs w:val="18"/>
-          <w:lang w:val="en-IN"/>
-        </w:rPr>
-        <w:t xml:space="preserve"> failed. Stop program execution */</w:t>
-      </w:r>
-    </w:p>
-    <w:p>
-      <w:pPr>
-        <w:autoSpaceDE w:val="0"/>
-        <w:autoSpaceDN w:val="0"/>
-        <w:adjustRightInd w:val="0"/>
-        <w:ind w:left="1418"/>
-        <w:rPr>
-          <w:rFonts w:ascii="Courier New" w:hAnsi="Courier New" w:cs="Courier New"/>
-          <w:color w:val="F97414"/>
-          <w:sz w:val="18"/>
-          <w:szCs w:val="18"/>
-          <w:lang w:val="en-IN"/>
-        </w:rPr>
-      </w:pPr>
-      <w:r>
-        <w:rPr>
-          <w:rFonts w:ascii="Courier New" w:hAnsi="Courier New" w:cs="Courier New"/>
-          <w:color w:val="F97414"/>
-          <w:sz w:val="18"/>
-          <w:szCs w:val="18"/>
-          <w:lang w:val="en-IN"/>
-        </w:rPr>
-        <w:t xml:space="preserve">    if (result != CY_RSLT_SUCCESS)</w:t>
-      </w:r>
-    </w:p>
-    <w:p>
-      <w:pPr>
-        <w:autoSpaceDE w:val="0"/>
-        <w:autoSpaceDN w:val="0"/>
-        <w:adjustRightInd w:val="0"/>
-        <w:ind w:left="1418"/>
-        <w:rPr>
-          <w:rFonts w:ascii="Courier New" w:hAnsi="Courier New" w:cs="Courier New"/>
-          <w:color w:val="F97414"/>
-          <w:sz w:val="18"/>
-          <w:szCs w:val="18"/>
-          <w:lang w:val="en-IN"/>
-        </w:rPr>
-      </w:pPr>
-      <w:r>
-        <w:rPr>
-          <w:rFonts w:ascii="Courier New" w:hAnsi="Courier New" w:cs="Courier New"/>
-          <w:color w:val="F97414"/>
-          <w:sz w:val="18"/>
-          <w:szCs w:val="18"/>
-          <w:lang w:val="en-IN"/>
-        </w:rPr>
-        <w:t xml:space="preserve">    {</w:t>
+        <w:t xml:space="preserve">    }</w:t>
       </w:r>
     </w:p>
     <w:bookmarkEnd w:id="194"/>
-    <w:p>
-      <w:pPr>
-        <w:autoSpaceDE w:val="0"/>
-        <w:autoSpaceDN w:val="0"/>
-        <w:adjustRightInd w:val="0"/>
-        <w:ind w:left="1418"/>
-        <w:rPr>
-          <w:rFonts w:ascii="Courier New" w:hAnsi="Courier New" w:cs="Courier New"/>
-          <w:color w:val="F97414"/>
-          <w:sz w:val="18"/>
-          <w:szCs w:val="18"/>
-          <w:lang w:val="en-IN"/>
-        </w:rPr>
-      </w:pPr>
-      <w:r>
-        <w:rPr>
-          <w:rFonts w:ascii="Courier New" w:hAnsi="Courier New" w:cs="Courier New"/>
-          <w:color w:val="FF0000"/>
-          <w:sz w:val="18"/>
-          <w:szCs w:val="18"/>
-          <w:lang w:val="en-IN"/>
-        </w:rPr>
-        <w:t xml:space="preserve">    </w:t>
-      </w:r>
-      <w:r>
-        <w:rPr>
-          <w:rFonts w:ascii="Courier New" w:hAnsi="Courier New" w:cs="Courier New"/>
-          <w:color w:val="FF0000"/>
-          <w:sz w:val="18"/>
-          <w:szCs w:val="18"/>
-          <w:lang w:val="en-IN"/>
-        </w:rPr>
-        <w:t xml:space="preserve">    </w:t>
-      </w:r>
-      <w:bookmarkStart w:id="195" w:name="_mioConsistencyCheck171"/>
-      <w:r>
-        <w:rPr>
-          <w:rFonts w:ascii="Courier New" w:hAnsi="Courier New" w:cs="Courier New"/>
-          <w:color w:val="F97414"/>
-          <w:sz w:val="18"/>
-          <w:szCs w:val="18"/>
-          <w:lang w:val="en-IN"/>
-        </w:rPr>
-        <w:t>CY_ASSERT(0);</w:t>
-      </w:r>
-    </w:p>
-    <w:p>
-      <w:pPr>
-        <w:autoSpaceDE w:val="0"/>
-        <w:autoSpaceDN w:val="0"/>
-        <w:adjustRightInd w:val="0"/>
-        <w:ind w:left="1418"/>
-        <w:rPr>
-          <w:rFonts w:ascii="Courier New" w:hAnsi="Courier New" w:cs="Courier New"/>
-          <w:color w:val="F97414"/>
-          <w:sz w:val="18"/>
-          <w:szCs w:val="18"/>
-          <w:lang w:val="en-IN"/>
-        </w:rPr>
-      </w:pPr>
-      <w:r>
-        <w:rPr>
-          <w:rFonts w:ascii="Courier New" w:hAnsi="Courier New" w:cs="Courier New"/>
-          <w:color w:val="F97414"/>
-          <w:sz w:val="18"/>
-          <w:szCs w:val="18"/>
-          <w:lang w:val="en-IN"/>
-        </w:rPr>
-        <w:t xml:space="preserve">    }</w:t>
-      </w:r>
-    </w:p>
-    <w:bookmarkEnd w:id="195"/>
     <w:p>
       <w:pPr>
         <w:spacing w:before="160" w:after="160"/>
@@ -13884,7 +13898,7 @@
           <w:szCs w:val="18"/>
         </w:rPr>
       </w:pPr>
-      <w:bookmarkStart w:id="196" w:name="_mioConsistencyCheck172"/>
+      <w:bookmarkStart w:id="195" w:name="_mioConsistencyCheck172"/>
       <w:r>
         <w:rPr>
           <w:rFonts w:ascii="Courier New" w:hAnsi="Courier New" w:cs="Courier New"/>
@@ -13954,8 +13968,8 @@
         </w:rPr>
         <w:t>"</w:t>
       </w:r>
-      <w:bookmarkStart w:id="197" w:name="_mioConsistencyCheck289"/>
-      <w:bookmarkStart w:id="198" w:name="_mioConsistencyCheck70"/>
+      <w:bookmarkStart w:id="196" w:name="_mioConsistencyCheck289"/>
+      <w:bookmarkStart w:id="197" w:name="_mioConsistencyCheck70"/>
       <w:r>
         <w:rPr>
           <w:rFonts w:ascii="Courier New" w:hAnsi="Courier New" w:cs="Courier New"/>
@@ -13965,8 +13979,8 @@
         </w:rPr>
         <w:t>PSOC</w:t>
       </w:r>
+      <w:bookmarkEnd w:id="196"/>
       <w:bookmarkEnd w:id="197"/>
-      <w:bookmarkEnd w:id="198"/>
       <w:r>
         <w:rPr>
           <w:rFonts w:ascii="Courier New" w:hAnsi="Courier New" w:cs="Courier New"/>
@@ -14195,7 +14209,7 @@
         <w:t>-Software\r\n\n");</w:t>
       </w:r>
     </w:p>
-    <w:bookmarkEnd w:id="196"/>
+    <w:bookmarkEnd w:id="195"/>
     <w:p>
       <w:pPr>
         <w:spacing w:before="160" w:after="160"/>
@@ -14388,7 +14402,7 @@
           <w:szCs w:val="18"/>
         </w:rPr>
       </w:pPr>
-      <w:bookmarkStart w:id="199" w:name="_mioConsistencyCheck173"/>
+      <w:bookmarkStart w:id="198" w:name="_mioConsistencyCheck173"/>
       <w:proofErr w:type="spellStart"/>
       <w:r>
         <w:rPr>
@@ -14470,7 +14484,7 @@
         <w:t xml:space="preserve">   "resume blinking the user LED \r\n\r\n");</w:t>
       </w:r>
     </w:p>
-    <w:bookmarkEnd w:id="199"/>
+    <w:bookmarkEnd w:id="198"/>
     <w:p>
       <w:pPr>
         <w:spacing w:before="160" w:after="160"/>
@@ -14605,7 +14619,7 @@
           <w:szCs w:val="18"/>
         </w:rPr>
       </w:pPr>
-      <w:bookmarkStart w:id="200" w:name="_mioConsistencyCheck174"/>
+      <w:bookmarkStart w:id="199" w:name="_mioConsistencyCheck174"/>
       <w:r>
         <w:rPr>
           <w:rFonts w:ascii="Courier New" w:hAnsi="Courier New" w:cs="Courier New"/>
@@ -14616,7 +14630,7 @@
         <w:t>Cy_SysEnableCM55(CY_CORTEX_M55_APPL_ADDR, CM55_BOOT_WAIT_TIME_USEC);</w:t>
       </w:r>
     </w:p>
-    <w:bookmarkEnd w:id="200"/>
+    <w:bookmarkEnd w:id="199"/>
     <w:p>
       <w:pPr>
         <w:pStyle w:val="ListParagraph"/>
@@ -15099,7 +15113,7 @@
           <w:szCs w:val="18"/>
         </w:rPr>
       </w:pPr>
-      <w:bookmarkStart w:id="201" w:name="_Hlk192779201"/>
+      <w:bookmarkStart w:id="200" w:name="_Hlk192779201"/>
       <w:r>
         <w:rPr>
           <w:rFonts w:ascii="Courier New" w:hAnsi="Courier New" w:cs="Courier New"/>
@@ -15122,7 +15136,393 @@
           <w:szCs w:val="18"/>
         </w:rPr>
       </w:pPr>
-      <w:bookmarkStart w:id="202" w:name="_mioConsistencyCheck175"/>
+      <w:bookmarkStart w:id="201" w:name="_mioConsistencyCheck175"/>
+      <w:bookmarkEnd w:id="200"/>
+      <w:r>
+        <w:rPr>
+          <w:rFonts w:ascii="Courier New" w:hAnsi="Courier New" w:cs="Courier New"/>
+          <w:color w:val="F97414"/>
+          <w:sz w:val="18"/>
+          <w:szCs w:val="18"/>
+        </w:rPr>
+        <w:t>for (;;)</w:t>
+      </w:r>
+    </w:p>
+    <w:p>
+      <w:pPr>
+        <w:autoSpaceDE w:val="0"/>
+        <w:autoSpaceDN w:val="0"/>
+        <w:adjustRightInd w:val="0"/>
+        <w:ind w:left="1418"/>
+        <w:rPr>
+          <w:rFonts w:ascii="Courier New" w:hAnsi="Courier New" w:cs="Courier New"/>
+          <w:color w:val="F97414"/>
+          <w:sz w:val="18"/>
+          <w:szCs w:val="18"/>
+        </w:rPr>
+      </w:pPr>
+      <w:r>
+        <w:rPr>
+          <w:rFonts w:ascii="Courier New" w:hAnsi="Courier New" w:cs="Courier New"/>
+          <w:color w:val="F97414"/>
+          <w:sz w:val="18"/>
+          <w:szCs w:val="18"/>
+        </w:rPr>
+        <w:t>{</w:t>
+      </w:r>
+    </w:p>
+    <w:p>
+      <w:pPr>
+        <w:autoSpaceDE w:val="0"/>
+        <w:autoSpaceDN w:val="0"/>
+        <w:adjustRightInd w:val="0"/>
+        <w:ind w:left="1418"/>
+        <w:rPr>
+          <w:rFonts w:ascii="Courier New" w:hAnsi="Courier New" w:cs="Courier New"/>
+          <w:color w:val="F97414"/>
+          <w:sz w:val="18"/>
+          <w:szCs w:val="18"/>
+        </w:rPr>
+      </w:pPr>
+      <w:r>
+        <w:rPr>
+          <w:rFonts w:ascii="Courier New" w:hAnsi="Courier New" w:cs="Courier New"/>
+          <w:color w:val="F97414"/>
+          <w:sz w:val="18"/>
+          <w:szCs w:val="18"/>
+        </w:rPr>
+        <w:t xml:space="preserve">    /* Check if 'Enter' key was pressed */</w:t>
+      </w:r>
+    </w:p>
+    <w:p>
+      <w:pPr>
+        <w:autoSpaceDE w:val="0"/>
+        <w:autoSpaceDN w:val="0"/>
+        <w:adjustRightInd w:val="0"/>
+        <w:ind w:left="1418"/>
+        <w:rPr>
+          <w:rFonts w:ascii="Courier New" w:hAnsi="Courier New" w:cs="Courier New"/>
+          <w:color w:val="F97414"/>
+          <w:sz w:val="18"/>
+          <w:szCs w:val="18"/>
+        </w:rPr>
+      </w:pPr>
+      <w:r>
+        <w:rPr>
+          <w:rFonts w:ascii="Courier New" w:hAnsi="Courier New" w:cs="Courier New"/>
+          <w:color w:val="F97414"/>
+          <w:sz w:val="18"/>
+          <w:szCs w:val="18"/>
+        </w:rPr>
+        <w:t xml:space="preserve">    if (</w:t>
+      </w:r>
+      <w:proofErr w:type="spellStart"/>
+      <w:r>
+        <w:rPr>
+          <w:rFonts w:ascii="Courier New" w:hAnsi="Courier New" w:cs="Courier New"/>
+          <w:color w:val="F97414"/>
+          <w:sz w:val="18"/>
+          <w:szCs w:val="18"/>
+        </w:rPr>
+        <w:t>cyhal_uart_getc</w:t>
+      </w:r>
+      <w:proofErr w:type="spellEnd"/>
+      <w:r>
+        <w:rPr>
+          <w:rFonts w:ascii="Courier New" w:hAnsi="Courier New" w:cs="Courier New"/>
+          <w:color w:val="F97414"/>
+          <w:sz w:val="18"/>
+          <w:szCs w:val="18"/>
+        </w:rPr>
+        <w:t>(&amp;</w:t>
+      </w:r>
+      <w:proofErr w:type="spellStart"/>
+      <w:r>
+        <w:rPr>
+          <w:rFonts w:ascii="Courier New" w:hAnsi="Courier New" w:cs="Courier New"/>
+          <w:color w:val="F97414"/>
+          <w:sz w:val="18"/>
+          <w:szCs w:val="18"/>
+        </w:rPr>
+        <w:t>cy_retarget_io_uart_obj</w:t>
+      </w:r>
+      <w:proofErr w:type="spellEnd"/>
+      <w:r>
+        <w:rPr>
+          <w:rFonts w:ascii="Courier New" w:hAnsi="Courier New" w:cs="Courier New"/>
+          <w:color w:val="F97414"/>
+          <w:sz w:val="18"/>
+          <w:szCs w:val="18"/>
+        </w:rPr>
+        <w:t>, &amp;</w:t>
+      </w:r>
+      <w:proofErr w:type="spellStart"/>
+      <w:r>
+        <w:rPr>
+          <w:rFonts w:ascii="Courier New" w:hAnsi="Courier New" w:cs="Courier New"/>
+          <w:color w:val="F97414"/>
+          <w:sz w:val="18"/>
+          <w:szCs w:val="18"/>
+        </w:rPr>
+        <w:t>uart_read_value</w:t>
+      </w:r>
+      <w:proofErr w:type="spellEnd"/>
+      <w:r>
+        <w:rPr>
+          <w:rFonts w:ascii="Courier New" w:hAnsi="Courier New" w:cs="Courier New"/>
+          <w:color w:val="F97414"/>
+          <w:sz w:val="18"/>
+          <w:szCs w:val="18"/>
+        </w:rPr>
+        <w:t>, 1)</w:t>
+      </w:r>
+    </w:p>
+    <w:p>
+      <w:pPr>
+        <w:autoSpaceDE w:val="0"/>
+        <w:autoSpaceDN w:val="0"/>
+        <w:adjustRightInd w:val="0"/>
+        <w:ind w:left="1418"/>
+        <w:rPr>
+          <w:rFonts w:ascii="Courier New" w:hAnsi="Courier New" w:cs="Courier New"/>
+          <w:color w:val="F97414"/>
+          <w:sz w:val="18"/>
+          <w:szCs w:val="18"/>
+        </w:rPr>
+      </w:pPr>
+      <w:r>
+        <w:rPr>
+          <w:rFonts w:ascii="Courier New" w:hAnsi="Courier New" w:cs="Courier New"/>
+          <w:color w:val="F97414"/>
+          <w:sz w:val="18"/>
+          <w:szCs w:val="18"/>
+        </w:rPr>
+        <w:t xml:space="preserve">         == CY_RSLT_SUCCESS)</w:t>
+      </w:r>
+    </w:p>
+    <w:p>
+      <w:pPr>
+        <w:autoSpaceDE w:val="0"/>
+        <w:autoSpaceDN w:val="0"/>
+        <w:adjustRightInd w:val="0"/>
+        <w:ind w:left="1418"/>
+        <w:rPr>
+          <w:rFonts w:ascii="Courier New" w:hAnsi="Courier New" w:cs="Courier New"/>
+          <w:color w:val="F97414"/>
+          <w:sz w:val="18"/>
+          <w:szCs w:val="18"/>
+        </w:rPr>
+      </w:pPr>
+      <w:r>
+        <w:rPr>
+          <w:rFonts w:ascii="Courier New" w:hAnsi="Courier New" w:cs="Courier New"/>
+          <w:color w:val="F97414"/>
+          <w:sz w:val="18"/>
+          <w:szCs w:val="18"/>
+        </w:rPr>
+        <w:t xml:space="preserve">    {</w:t>
+      </w:r>
+    </w:p>
+    <w:p>
+      <w:pPr>
+        <w:autoSpaceDE w:val="0"/>
+        <w:autoSpaceDN w:val="0"/>
+        <w:adjustRightInd w:val="0"/>
+        <w:ind w:left="1418"/>
+        <w:rPr>
+          <w:rFonts w:ascii="Courier New" w:hAnsi="Courier New" w:cs="Courier New"/>
+          <w:color w:val="F97414"/>
+          <w:sz w:val="18"/>
+          <w:szCs w:val="18"/>
+        </w:rPr>
+      </w:pPr>
+      <w:r>
+        <w:rPr>
+          <w:rFonts w:ascii="Courier New" w:hAnsi="Courier New" w:cs="Courier New"/>
+          <w:color w:val="F97414"/>
+          <w:sz w:val="18"/>
+          <w:szCs w:val="18"/>
+        </w:rPr>
+        <w:t xml:space="preserve">        if (</w:t>
+      </w:r>
+      <w:proofErr w:type="spellStart"/>
+      <w:r>
+        <w:rPr>
+          <w:rFonts w:ascii="Courier New" w:hAnsi="Courier New" w:cs="Courier New"/>
+          <w:color w:val="F97414"/>
+          <w:sz w:val="18"/>
+          <w:szCs w:val="18"/>
+        </w:rPr>
+        <w:t>uart_read_value</w:t>
+      </w:r>
+      <w:proofErr w:type="spellEnd"/>
+      <w:r>
+        <w:rPr>
+          <w:rFonts w:ascii="Courier New" w:hAnsi="Courier New" w:cs="Courier New"/>
+          <w:color w:val="F97414"/>
+          <w:sz w:val="18"/>
+          <w:szCs w:val="18"/>
+        </w:rPr>
+        <w:t xml:space="preserve"> == '\r')</w:t>
+      </w:r>
+    </w:p>
+    <w:p>
+      <w:pPr>
+        <w:autoSpaceDE w:val="0"/>
+        <w:autoSpaceDN w:val="0"/>
+        <w:adjustRightInd w:val="0"/>
+        <w:ind w:left="1418"/>
+        <w:rPr>
+          <w:rFonts w:ascii="Courier New" w:hAnsi="Courier New" w:cs="Courier New"/>
+          <w:color w:val="F97414"/>
+          <w:sz w:val="18"/>
+          <w:szCs w:val="18"/>
+        </w:rPr>
+      </w:pPr>
+      <w:r>
+        <w:rPr>
+          <w:rFonts w:ascii="Courier New" w:hAnsi="Courier New" w:cs="Courier New"/>
+          <w:color w:val="F97414"/>
+          <w:sz w:val="18"/>
+          <w:szCs w:val="18"/>
+        </w:rPr>
+        <w:t xml:space="preserve">        {</w:t>
+      </w:r>
+    </w:p>
+    <w:p>
+      <w:pPr>
+        <w:autoSpaceDE w:val="0"/>
+        <w:autoSpaceDN w:val="0"/>
+        <w:adjustRightInd w:val="0"/>
+        <w:ind w:left="1418"/>
+        <w:rPr>
+          <w:rFonts w:ascii="Courier New" w:hAnsi="Courier New" w:cs="Courier New"/>
+          <w:color w:val="F97414"/>
+          <w:sz w:val="18"/>
+          <w:szCs w:val="18"/>
+        </w:rPr>
+      </w:pPr>
+      <w:r>
+        <w:rPr>
+          <w:rFonts w:ascii="Courier New" w:hAnsi="Courier New" w:cs="Courier New"/>
+          <w:color w:val="F97414"/>
+          <w:sz w:val="18"/>
+          <w:szCs w:val="18"/>
+        </w:rPr>
+        <w:t xml:space="preserve"> </w:t>
+      </w:r>
+      <w:r>
+        <w:rPr>
+          <w:rFonts w:ascii="Courier New" w:hAnsi="Courier New" w:cs="Courier New"/>
+          <w:color w:val="F97414"/>
+          <w:sz w:val="18"/>
+          <w:szCs w:val="18"/>
+        </w:rPr>
+        <w:tab/>
+      </w:r>
+      <w:r>
+        <w:rPr>
+          <w:rFonts w:ascii="Courier New" w:hAnsi="Courier New" w:cs="Courier New"/>
+          <w:color w:val="F97414"/>
+          <w:sz w:val="18"/>
+          <w:szCs w:val="18"/>
+        </w:rPr>
+        <w:tab/>
+      </w:r>
+      <w:r>
+        <w:rPr>
+          <w:rFonts w:ascii="Courier New" w:hAnsi="Courier New" w:cs="Courier New"/>
+          <w:color w:val="F97414"/>
+          <w:sz w:val="18"/>
+          <w:szCs w:val="18"/>
+        </w:rPr>
+        <w:t>/* Pause LED blinking by stopping the timer */</w:t>
+      </w:r>
+    </w:p>
+    <w:p>
+      <w:pPr>
+        <w:autoSpaceDE w:val="0"/>
+        <w:autoSpaceDN w:val="0"/>
+        <w:adjustRightInd w:val="0"/>
+        <w:ind w:left="1418"/>
+        <w:rPr>
+          <w:rFonts w:ascii="Courier New" w:hAnsi="Courier New" w:cs="Courier New"/>
+          <w:color w:val="F97414"/>
+          <w:sz w:val="18"/>
+          <w:szCs w:val="18"/>
+        </w:rPr>
+      </w:pPr>
+      <w:r>
+        <w:rPr>
+          <w:rFonts w:ascii="Courier New" w:hAnsi="Courier New" w:cs="Courier New"/>
+          <w:color w:val="F97414"/>
+          <w:sz w:val="18"/>
+          <w:szCs w:val="18"/>
+        </w:rPr>
+        <w:t xml:space="preserve"> </w:t>
+      </w:r>
+      <w:r>
+        <w:rPr>
+          <w:rFonts w:ascii="Courier New" w:hAnsi="Courier New" w:cs="Courier New"/>
+          <w:color w:val="F97414"/>
+          <w:sz w:val="18"/>
+          <w:szCs w:val="18"/>
+        </w:rPr>
+        <w:tab/>
+      </w:r>
+      <w:r>
+        <w:rPr>
+          <w:rFonts w:ascii="Courier New" w:hAnsi="Courier New" w:cs="Courier New"/>
+          <w:color w:val="F97414"/>
+          <w:sz w:val="18"/>
+          <w:szCs w:val="18"/>
+        </w:rPr>
+        <w:tab/>
+      </w:r>
+      <w:r>
+        <w:rPr>
+          <w:rFonts w:ascii="Courier New" w:hAnsi="Courier New" w:cs="Courier New"/>
+          <w:color w:val="F97414"/>
+          <w:sz w:val="18"/>
+          <w:szCs w:val="18"/>
+        </w:rPr>
+        <w:t>if (</w:t>
+      </w:r>
+      <w:proofErr w:type="spellStart"/>
+      <w:r>
+        <w:rPr>
+          <w:rFonts w:ascii="Courier New" w:hAnsi="Courier New" w:cs="Courier New"/>
+          <w:color w:val="F97414"/>
+          <w:sz w:val="18"/>
+          <w:szCs w:val="18"/>
+        </w:rPr>
+        <w:t>led_blink_active_flag</w:t>
+      </w:r>
+      <w:proofErr w:type="spellEnd"/>
+      <w:r>
+        <w:rPr>
+          <w:rFonts w:ascii="Courier New" w:hAnsi="Courier New" w:cs="Courier New"/>
+          <w:color w:val="F97414"/>
+          <w:sz w:val="18"/>
+          <w:szCs w:val="18"/>
+        </w:rPr>
+        <w:t>)</w:t>
+      </w:r>
+    </w:p>
+    <w:p>
+      <w:pPr>
+        <w:autoSpaceDE w:val="0"/>
+        <w:autoSpaceDN w:val="0"/>
+        <w:adjustRightInd w:val="0"/>
+        <w:ind w:left="1418"/>
+        <w:rPr>
+          <w:rFonts w:ascii="Courier New" w:hAnsi="Courier New" w:cs="Courier New"/>
+          <w:color w:val="F97414"/>
+          <w:sz w:val="18"/>
+          <w:szCs w:val="18"/>
+        </w:rPr>
+      </w:pPr>
+      <w:bookmarkStart w:id="202" w:name="_mioConsistencyCheck176"/>
       <w:bookmarkEnd w:id="201"/>
       <w:r>
         <w:rPr>
@@ -15131,22 +15531,26 @@
           <w:sz w:val="18"/>
           <w:szCs w:val="18"/>
         </w:rPr>
-        <w:t>for (;;)</w:t>
-      </w:r>
-    </w:p>
-    <w:p>
-      <w:pPr>
-        <w:autoSpaceDE w:val="0"/>
-        <w:autoSpaceDN w:val="0"/>
-        <w:adjustRightInd w:val="0"/>
-        <w:ind w:left="1418"/>
-        <w:rPr>
-          <w:rFonts w:ascii="Courier New" w:hAnsi="Courier New" w:cs="Courier New"/>
-          <w:color w:val="F97414"/>
-          <w:sz w:val="18"/>
-          <w:szCs w:val="18"/>
-        </w:rPr>
-      </w:pPr>
+        <w:t xml:space="preserve"> </w:t>
+      </w:r>
+      <w:r>
+        <w:rPr>
+          <w:rFonts w:ascii="Courier New" w:hAnsi="Courier New" w:cs="Courier New"/>
+          <w:color w:val="F97414"/>
+          <w:sz w:val="18"/>
+          <w:szCs w:val="18"/>
+        </w:rPr>
+        <w:tab/>
+      </w:r>
+      <w:r>
+        <w:rPr>
+          <w:rFonts w:ascii="Courier New" w:hAnsi="Courier New" w:cs="Courier New"/>
+          <w:color w:val="F97414"/>
+          <w:sz w:val="18"/>
+          <w:szCs w:val="18"/>
+        </w:rPr>
+        <w:tab/>
+      </w:r>
       <w:r>
         <w:rPr>
           <w:rFonts w:ascii="Courier New" w:hAnsi="Courier New" w:cs="Courier New"/>
@@ -15177,30 +15581,34 @@
           <w:sz w:val="18"/>
           <w:szCs w:val="18"/>
         </w:rPr>
-        <w:t xml:space="preserve">    /* Check if 'Enter' key was pressed */</w:t>
-      </w:r>
-    </w:p>
-    <w:p>
-      <w:pPr>
-        <w:autoSpaceDE w:val="0"/>
-        <w:autoSpaceDN w:val="0"/>
-        <w:adjustRightInd w:val="0"/>
-        <w:ind w:left="1418"/>
-        <w:rPr>
-          <w:rFonts w:ascii="Courier New" w:hAnsi="Courier New" w:cs="Courier New"/>
-          <w:color w:val="F97414"/>
-          <w:sz w:val="18"/>
-          <w:szCs w:val="18"/>
-        </w:rPr>
-      </w:pPr>
-      <w:r>
-        <w:rPr>
-          <w:rFonts w:ascii="Courier New" w:hAnsi="Courier New" w:cs="Courier New"/>
-          <w:color w:val="F97414"/>
-          <w:sz w:val="18"/>
-          <w:szCs w:val="18"/>
-        </w:rPr>
-        <w:t xml:space="preserve">    if (</w:t>
+        <w:t xml:space="preserve"> </w:t>
+      </w:r>
+      <w:r>
+        <w:rPr>
+          <w:rFonts w:ascii="Courier New" w:hAnsi="Courier New" w:cs="Courier New"/>
+          <w:color w:val="F97414"/>
+          <w:sz w:val="18"/>
+          <w:szCs w:val="18"/>
+        </w:rPr>
+        <w:tab/>
+      </w:r>
+      <w:r>
+        <w:rPr>
+          <w:rFonts w:ascii="Courier New" w:hAnsi="Courier New" w:cs="Courier New"/>
+          <w:color w:val="F97414"/>
+          <w:sz w:val="18"/>
+          <w:szCs w:val="18"/>
+        </w:rPr>
+        <w:tab/>
+      </w:r>
+      <w:r>
+        <w:rPr>
+          <w:rFonts w:ascii="Courier New" w:hAnsi="Courier New" w:cs="Courier New"/>
+          <w:color w:val="F97414"/>
+          <w:sz w:val="18"/>
+          <w:szCs w:val="18"/>
+        </w:rPr>
+        <w:tab/>
       </w:r>
       <w:proofErr w:type="spellStart"/>
       <w:r>
@@ -15210,7 +15618,7 @@
           <w:sz w:val="18"/>
           <w:szCs w:val="18"/>
         </w:rPr>
-        <w:t>cyhal_uart_getc</w:t>
+        <w:t>cyhal_timer_stop</w:t>
       </w:r>
       <w:proofErr w:type="spellEnd"/>
       <w:r>
@@ -15230,7 +15638,7 @@
           <w:sz w:val="18"/>
           <w:szCs w:val="18"/>
         </w:rPr>
-        <w:t>cy_retarget_io_uart_obj</w:t>
+        <w:t>led_blink_timer</w:t>
       </w:r>
       <w:proofErr w:type="spellEnd"/>
       <w:r>
@@ -15240,301 +15648,6 @@
           <w:sz w:val="18"/>
           <w:szCs w:val="18"/>
         </w:rPr>
-        <w:t>, &amp;</w:t>
-      </w:r>
-      <w:proofErr w:type="spellStart"/>
-      <w:r>
-        <w:rPr>
-          <w:rFonts w:ascii="Courier New" w:hAnsi="Courier New" w:cs="Courier New"/>
-          <w:color w:val="F97414"/>
-          <w:sz w:val="18"/>
-          <w:szCs w:val="18"/>
-        </w:rPr>
-        <w:t>uart_read_value</w:t>
-      </w:r>
-      <w:proofErr w:type="spellEnd"/>
-      <w:r>
-        <w:rPr>
-          <w:rFonts w:ascii="Courier New" w:hAnsi="Courier New" w:cs="Courier New"/>
-          <w:color w:val="F97414"/>
-          <w:sz w:val="18"/>
-          <w:szCs w:val="18"/>
-        </w:rPr>
-        <w:t>, 1)</w:t>
-      </w:r>
-    </w:p>
-    <w:p>
-      <w:pPr>
-        <w:autoSpaceDE w:val="0"/>
-        <w:autoSpaceDN w:val="0"/>
-        <w:adjustRightInd w:val="0"/>
-        <w:ind w:left="1418"/>
-        <w:rPr>
-          <w:rFonts w:ascii="Courier New" w:hAnsi="Courier New" w:cs="Courier New"/>
-          <w:color w:val="F97414"/>
-          <w:sz w:val="18"/>
-          <w:szCs w:val="18"/>
-        </w:rPr>
-      </w:pPr>
-      <w:r>
-        <w:rPr>
-          <w:rFonts w:ascii="Courier New" w:hAnsi="Courier New" w:cs="Courier New"/>
-          <w:color w:val="F97414"/>
-          <w:sz w:val="18"/>
-          <w:szCs w:val="18"/>
-        </w:rPr>
-        <w:t xml:space="preserve">         == CY_RSLT_SUCCESS)</w:t>
-      </w:r>
-    </w:p>
-    <w:p>
-      <w:pPr>
-        <w:autoSpaceDE w:val="0"/>
-        <w:autoSpaceDN w:val="0"/>
-        <w:adjustRightInd w:val="0"/>
-        <w:ind w:left="1418"/>
-        <w:rPr>
-          <w:rFonts w:ascii="Courier New" w:hAnsi="Courier New" w:cs="Courier New"/>
-          <w:color w:val="F97414"/>
-          <w:sz w:val="18"/>
-          <w:szCs w:val="18"/>
-        </w:rPr>
-      </w:pPr>
-      <w:r>
-        <w:rPr>
-          <w:rFonts w:ascii="Courier New" w:hAnsi="Courier New" w:cs="Courier New"/>
-          <w:color w:val="F97414"/>
-          <w:sz w:val="18"/>
-          <w:szCs w:val="18"/>
-        </w:rPr>
-        <w:t xml:space="preserve">    {</w:t>
-      </w:r>
-    </w:p>
-    <w:p>
-      <w:pPr>
-        <w:autoSpaceDE w:val="0"/>
-        <w:autoSpaceDN w:val="0"/>
-        <w:adjustRightInd w:val="0"/>
-        <w:ind w:left="1418"/>
-        <w:rPr>
-          <w:rFonts w:ascii="Courier New" w:hAnsi="Courier New" w:cs="Courier New"/>
-          <w:color w:val="F97414"/>
-          <w:sz w:val="18"/>
-          <w:szCs w:val="18"/>
-        </w:rPr>
-      </w:pPr>
-      <w:r>
-        <w:rPr>
-          <w:rFonts w:ascii="Courier New" w:hAnsi="Courier New" w:cs="Courier New"/>
-          <w:color w:val="F97414"/>
-          <w:sz w:val="18"/>
-          <w:szCs w:val="18"/>
-        </w:rPr>
-        <w:t xml:space="preserve">        if (</w:t>
-      </w:r>
-      <w:proofErr w:type="spellStart"/>
-      <w:r>
-        <w:rPr>
-          <w:rFonts w:ascii="Courier New" w:hAnsi="Courier New" w:cs="Courier New"/>
-          <w:color w:val="F97414"/>
-          <w:sz w:val="18"/>
-          <w:szCs w:val="18"/>
-        </w:rPr>
-        <w:t>uart_read_value</w:t>
-      </w:r>
-      <w:proofErr w:type="spellEnd"/>
-      <w:r>
-        <w:rPr>
-          <w:rFonts w:ascii="Courier New" w:hAnsi="Courier New" w:cs="Courier New"/>
-          <w:color w:val="F97414"/>
-          <w:sz w:val="18"/>
-          <w:szCs w:val="18"/>
-        </w:rPr>
-        <w:t xml:space="preserve"> == '\r')</w:t>
-      </w:r>
-    </w:p>
-    <w:p>
-      <w:pPr>
-        <w:autoSpaceDE w:val="0"/>
-        <w:autoSpaceDN w:val="0"/>
-        <w:adjustRightInd w:val="0"/>
-        <w:ind w:left="1418"/>
-        <w:rPr>
-          <w:rFonts w:ascii="Courier New" w:hAnsi="Courier New" w:cs="Courier New"/>
-          <w:color w:val="F97414"/>
-          <w:sz w:val="18"/>
-          <w:szCs w:val="18"/>
-        </w:rPr>
-      </w:pPr>
-      <w:r>
-        <w:rPr>
-          <w:rFonts w:ascii="Courier New" w:hAnsi="Courier New" w:cs="Courier New"/>
-          <w:color w:val="F97414"/>
-          <w:sz w:val="18"/>
-          <w:szCs w:val="18"/>
-        </w:rPr>
-        <w:t xml:space="preserve">        {</w:t>
-      </w:r>
-    </w:p>
-    <w:p>
-      <w:pPr>
-        <w:autoSpaceDE w:val="0"/>
-        <w:autoSpaceDN w:val="0"/>
-        <w:adjustRightInd w:val="0"/>
-        <w:ind w:left="1418"/>
-        <w:rPr>
-          <w:rFonts w:ascii="Courier New" w:hAnsi="Courier New" w:cs="Courier New"/>
-          <w:color w:val="F97414"/>
-          <w:sz w:val="18"/>
-          <w:szCs w:val="18"/>
-        </w:rPr>
-      </w:pPr>
-      <w:r>
-        <w:rPr>
-          <w:rFonts w:ascii="Courier New" w:hAnsi="Courier New" w:cs="Courier New"/>
-          <w:color w:val="F97414"/>
-          <w:sz w:val="18"/>
-          <w:szCs w:val="18"/>
-        </w:rPr>
-        <w:t xml:space="preserve"> /* Pause LED blinking by stopping the timer */</w:t>
-      </w:r>
-    </w:p>
-    <w:p>
-      <w:pPr>
-        <w:autoSpaceDE w:val="0"/>
-        <w:autoSpaceDN w:val="0"/>
-        <w:adjustRightInd w:val="0"/>
-        <w:ind w:left="1418"/>
-        <w:rPr>
-          <w:rFonts w:ascii="Courier New" w:hAnsi="Courier New" w:cs="Courier New"/>
-          <w:color w:val="F97414"/>
-          <w:sz w:val="18"/>
-          <w:szCs w:val="18"/>
-        </w:rPr>
-      </w:pPr>
-      <w:r>
-        <w:rPr>
-          <w:rFonts w:ascii="Courier New" w:hAnsi="Courier New" w:cs="Courier New"/>
-          <w:color w:val="F97414"/>
-          <w:sz w:val="18"/>
-          <w:szCs w:val="18"/>
-        </w:rPr>
-        <w:t xml:space="preserve"> </w:t>
-      </w:r>
-      <w:r>
-        <w:rPr>
-          <w:rFonts w:ascii="Courier New" w:hAnsi="Courier New" w:cs="Courier New"/>
-          <w:color w:val="F97414"/>
-          <w:sz w:val="18"/>
-          <w:szCs w:val="18"/>
-        </w:rPr>
-        <w:t>if (</w:t>
-      </w:r>
-      <w:proofErr w:type="spellStart"/>
-      <w:r>
-        <w:rPr>
-          <w:rFonts w:ascii="Courier New" w:hAnsi="Courier New" w:cs="Courier New"/>
-          <w:color w:val="F97414"/>
-          <w:sz w:val="18"/>
-          <w:szCs w:val="18"/>
-        </w:rPr>
-        <w:t>led_blink_active_flag</w:t>
-      </w:r>
-      <w:proofErr w:type="spellEnd"/>
-      <w:r>
-        <w:rPr>
-          <w:rFonts w:ascii="Courier New" w:hAnsi="Courier New" w:cs="Courier New"/>
-          <w:color w:val="F97414"/>
-          <w:sz w:val="18"/>
-          <w:szCs w:val="18"/>
-        </w:rPr>
-        <w:t>)</w:t>
-      </w:r>
-    </w:p>
-    <w:p>
-      <w:pPr>
-        <w:autoSpaceDE w:val="0"/>
-        <w:autoSpaceDN w:val="0"/>
-        <w:adjustRightInd w:val="0"/>
-        <w:ind w:left="1418"/>
-        <w:rPr>
-          <w:rFonts w:ascii="Courier New" w:hAnsi="Courier New" w:cs="Courier New"/>
-          <w:color w:val="F97414"/>
-          <w:sz w:val="18"/>
-          <w:szCs w:val="18"/>
-        </w:rPr>
-      </w:pPr>
-      <w:bookmarkStart w:id="203" w:name="_mioConsistencyCheck176"/>
-      <w:bookmarkEnd w:id="202"/>
-      <w:r>
-        <w:rPr>
-          <w:rFonts w:ascii="Courier New" w:hAnsi="Courier New" w:cs="Courier New"/>
-          <w:color w:val="F97414"/>
-          <w:sz w:val="18"/>
-          <w:szCs w:val="18"/>
-        </w:rPr>
-        <w:t xml:space="preserve"> {</w:t>
-      </w:r>
-    </w:p>
-    <w:p>
-      <w:pPr>
-        <w:autoSpaceDE w:val="0"/>
-        <w:autoSpaceDN w:val="0"/>
-        <w:adjustRightInd w:val="0"/>
-        <w:ind w:left="1418"/>
-        <w:rPr>
-          <w:rFonts w:ascii="Courier New" w:hAnsi="Courier New" w:cs="Courier New"/>
-          <w:color w:val="F97414"/>
-          <w:sz w:val="18"/>
-          <w:szCs w:val="18"/>
-        </w:rPr>
-      </w:pPr>
-      <w:r>
-        <w:rPr>
-          <w:rFonts w:ascii="Courier New" w:hAnsi="Courier New" w:cs="Courier New"/>
-          <w:color w:val="F97414"/>
-          <w:sz w:val="18"/>
-          <w:szCs w:val="18"/>
-        </w:rPr>
-        <w:t xml:space="preserve"> </w:t>
-      </w:r>
-      <w:proofErr w:type="spellStart"/>
-      <w:r>
-        <w:rPr>
-          <w:rFonts w:ascii="Courier New" w:hAnsi="Courier New" w:cs="Courier New"/>
-          <w:color w:val="F97414"/>
-          <w:sz w:val="18"/>
-          <w:szCs w:val="18"/>
-        </w:rPr>
-        <w:t>cyhal_timer_stop</w:t>
-      </w:r>
-      <w:proofErr w:type="spellEnd"/>
-      <w:r>
-        <w:rPr>
-          <w:rFonts w:ascii="Courier New" w:hAnsi="Courier New" w:cs="Courier New"/>
-          <w:color w:val="F97414"/>
-          <w:sz w:val="18"/>
-          <w:szCs w:val="18"/>
-        </w:rPr>
-        <w:t>(&amp;</w:t>
-      </w:r>
-      <w:proofErr w:type="spellStart"/>
-      <w:r>
-        <w:rPr>
-          <w:rFonts w:ascii="Courier New" w:hAnsi="Courier New" w:cs="Courier New"/>
-          <w:color w:val="F97414"/>
-          <w:sz w:val="18"/>
-          <w:szCs w:val="18"/>
-        </w:rPr>
-        <w:t>led_blink_timer</w:t>
-      </w:r>
-      <w:proofErr w:type="spellEnd"/>
-      <w:r>
-        <w:rPr>
-          <w:rFonts w:ascii="Courier New" w:hAnsi="Courier New" w:cs="Courier New"/>
-          <w:color w:val="F97414"/>
-          <w:sz w:val="18"/>
-          <w:szCs w:val="18"/>
-        </w:rPr>
         <w:t>);</w:t>
       </w:r>
     </w:p>
@@ -15543,37 +15656,14 @@
         <w:autoSpaceDE w:val="0"/>
         <w:autoSpaceDN w:val="0"/>
         <w:adjustRightInd w:val="0"/>
-        <w:ind w:left="1418"/>
-        <w:rPr>
-          <w:rFonts w:ascii="Courier New" w:hAnsi="Courier New" w:cs="Courier New"/>
-          <w:color w:val="F97414"/>
-          <w:sz w:val="18"/>
-          <w:szCs w:val="18"/>
-        </w:rPr>
-      </w:pPr>
-    </w:p>
-    <w:p>
-      <w:pPr>
-        <w:autoSpaceDE w:val="0"/>
-        <w:autoSpaceDN w:val="0"/>
-        <w:adjustRightInd w:val="0"/>
-        <w:ind w:left="1418"/>
-        <w:rPr>
-          <w:rFonts w:ascii="Courier New" w:hAnsi="Courier New" w:cs="Courier New"/>
-          <w:color w:val="F97414"/>
-          <w:sz w:val="18"/>
-          <w:szCs w:val="18"/>
-        </w:rPr>
-      </w:pPr>
-      <w:r>
-        <w:rPr>
-          <w:rFonts w:ascii="Courier New" w:hAnsi="Courier New" w:cs="Courier New"/>
-          <w:color w:val="F97414"/>
-          <w:sz w:val="18"/>
-          <w:szCs w:val="18"/>
-        </w:rPr>
-        <w:t xml:space="preserve"> </w:t>
-      </w:r>
+        <w:ind w:left="2836" w:firstLine="709"/>
+        <w:rPr>
+          <w:rFonts w:ascii="Courier New" w:hAnsi="Courier New" w:cs="Courier New"/>
+          <w:color w:val="F97414"/>
+          <w:sz w:val="18"/>
+          <w:szCs w:val="18"/>
+        </w:rPr>
+      </w:pPr>
       <w:proofErr w:type="spellStart"/>
       <w:proofErr w:type="gramStart"/>
       <w:r>
@@ -15635,6 +15725,24 @@
           <w:sz w:val="18"/>
           <w:szCs w:val="18"/>
         </w:rPr>
+        <w:tab/>
+      </w:r>
+      <w:r>
+        <w:rPr>
+          <w:rFonts w:ascii="Courier New" w:hAnsi="Courier New" w:cs="Courier New"/>
+          <w:color w:val="F97414"/>
+          <w:sz w:val="18"/>
+          <w:szCs w:val="18"/>
+        </w:rPr>
+        <w:tab/>
+      </w:r>
+      <w:r>
+        <w:rPr>
+          <w:rFonts w:ascii="Courier New" w:hAnsi="Courier New" w:cs="Courier New"/>
+          <w:color w:val="F97414"/>
+          <w:sz w:val="18"/>
+          <w:szCs w:val="18"/>
+        </w:rPr>
         <w:t>}</w:t>
       </w:r>
     </w:p>
@@ -15658,29 +15766,6 @@
           <w:sz w:val="18"/>
           <w:szCs w:val="18"/>
         </w:rPr>
-        <w:t xml:space="preserve"> else /* Resume LED blinking by starting the timer */</w:t>
-      </w:r>
-    </w:p>
-    <w:p>
-      <w:pPr>
-        <w:autoSpaceDE w:val="0"/>
-        <w:autoSpaceDN w:val="0"/>
-        <w:adjustRightInd w:val="0"/>
-        <w:ind w:left="1418"/>
-        <w:rPr>
-          <w:rFonts w:ascii="Courier New" w:hAnsi="Courier New" w:cs="Courier New"/>
-          <w:color w:val="F97414"/>
-          <w:sz w:val="18"/>
-          <w:szCs w:val="18"/>
-        </w:rPr>
-      </w:pPr>
-      <w:r>
-        <w:rPr>
-          <w:rFonts w:ascii="Courier New" w:hAnsi="Courier New" w:cs="Courier New"/>
-          <w:color w:val="F97414"/>
-          <w:sz w:val="18"/>
-          <w:szCs w:val="18"/>
-        </w:rPr>
         <w:t xml:space="preserve"> </w:t>
       </w:r>
       <w:r>
@@ -15690,6 +15775,74 @@
           <w:sz w:val="18"/>
           <w:szCs w:val="18"/>
         </w:rPr>
+        <w:tab/>
+      </w:r>
+      <w:r>
+        <w:rPr>
+          <w:rFonts w:ascii="Courier New" w:hAnsi="Courier New" w:cs="Courier New"/>
+          <w:color w:val="F97414"/>
+          <w:sz w:val="18"/>
+          <w:szCs w:val="18"/>
+        </w:rPr>
+        <w:tab/>
+      </w:r>
+      <w:r>
+        <w:rPr>
+          <w:rFonts w:ascii="Courier New" w:hAnsi="Courier New" w:cs="Courier New"/>
+          <w:color w:val="F97414"/>
+          <w:sz w:val="18"/>
+          <w:szCs w:val="18"/>
+        </w:rPr>
+        <w:t>else /* Resume LED blinking by starting the timer */</w:t>
+      </w:r>
+    </w:p>
+    <w:p>
+      <w:pPr>
+        <w:autoSpaceDE w:val="0"/>
+        <w:autoSpaceDN w:val="0"/>
+        <w:adjustRightInd w:val="0"/>
+        <w:ind w:left="1418"/>
+        <w:rPr>
+          <w:rFonts w:ascii="Courier New" w:hAnsi="Courier New" w:cs="Courier New"/>
+          <w:color w:val="F97414"/>
+          <w:sz w:val="18"/>
+          <w:szCs w:val="18"/>
+        </w:rPr>
+      </w:pPr>
+      <w:r>
+        <w:rPr>
+          <w:rFonts w:ascii="Courier New" w:hAnsi="Courier New" w:cs="Courier New"/>
+          <w:color w:val="F97414"/>
+          <w:sz w:val="18"/>
+          <w:szCs w:val="18"/>
+        </w:rPr>
+        <w:t xml:space="preserve"> </w:t>
+      </w:r>
+      <w:r>
+        <w:rPr>
+          <w:rFonts w:ascii="Courier New" w:hAnsi="Courier New" w:cs="Courier New"/>
+          <w:color w:val="F97414"/>
+          <w:sz w:val="18"/>
+          <w:szCs w:val="18"/>
+        </w:rPr>
+        <w:tab/>
+      </w:r>
+      <w:r>
+        <w:rPr>
+          <w:rFonts w:ascii="Courier New" w:hAnsi="Courier New" w:cs="Courier New"/>
+          <w:color w:val="F97414"/>
+          <w:sz w:val="18"/>
+          <w:szCs w:val="18"/>
+        </w:rPr>
+        <w:tab/>
+      </w:r>
+      <w:r>
+        <w:rPr>
+          <w:rFonts w:ascii="Courier New" w:hAnsi="Courier New" w:cs="Courier New"/>
+          <w:color w:val="F97414"/>
+          <w:sz w:val="18"/>
+          <w:szCs w:val="18"/>
+        </w:rPr>
         <w:t>{</w:t>
       </w:r>
     </w:p>
@@ -15706,8 +15859,8 @@
           <w:szCs w:val="18"/>
         </w:rPr>
       </w:pPr>
-      <w:bookmarkStart w:id="204" w:name="_mioConsistencyCheck177"/>
-      <w:bookmarkEnd w:id="203"/>
+      <w:bookmarkStart w:id="203" w:name="_mioConsistencyCheck177"/>
+      <w:bookmarkEnd w:id="202"/>
       <w:r>
         <w:rPr>
           <w:rFonts w:ascii="Courier New" w:hAnsi="Courier New" w:cs="Courier New"/>
@@ -15717,6 +15870,24 @@
         </w:rPr>
         <w:t xml:space="preserve"> </w:t>
       </w:r>
+      <w:r>
+        <w:rPr>
+          <w:rFonts w:ascii="Courier New" w:hAnsi="Courier New" w:cs="Courier New"/>
+          <w:color w:val="F97414"/>
+          <w:sz w:val="18"/>
+          <w:szCs w:val="18"/>
+        </w:rPr>
+        <w:tab/>
+      </w:r>
+      <w:r>
+        <w:rPr>
+          <w:rFonts w:ascii="Courier New" w:hAnsi="Courier New" w:cs="Courier New"/>
+          <w:color w:val="F97414"/>
+          <w:sz w:val="18"/>
+          <w:szCs w:val="18"/>
+        </w:rPr>
+        <w:tab/>
+      </w:r>
       <w:proofErr w:type="spellStart"/>
       <w:r>
         <w:rPr>
@@ -15763,37 +15934,14 @@
         <w:autoSpaceDE w:val="0"/>
         <w:autoSpaceDN w:val="0"/>
         <w:adjustRightInd w:val="0"/>
-        <w:ind w:left="1418"/>
-        <w:rPr>
-          <w:rFonts w:ascii="Courier New" w:hAnsi="Courier New" w:cs="Courier New"/>
-          <w:color w:val="F97414"/>
-          <w:sz w:val="18"/>
-          <w:szCs w:val="18"/>
-        </w:rPr>
-      </w:pPr>
-    </w:p>
-    <w:p>
-      <w:pPr>
-        <w:autoSpaceDE w:val="0"/>
-        <w:autoSpaceDN w:val="0"/>
-        <w:adjustRightInd w:val="0"/>
-        <w:ind w:left="1418"/>
-        <w:rPr>
-          <w:rFonts w:ascii="Courier New" w:hAnsi="Courier New" w:cs="Courier New"/>
-          <w:color w:val="F97414"/>
-          <w:sz w:val="18"/>
-          <w:szCs w:val="18"/>
-        </w:rPr>
-      </w:pPr>
-      <w:r>
-        <w:rPr>
-          <w:rFonts w:ascii="Courier New" w:hAnsi="Courier New" w:cs="Courier New"/>
-          <w:color w:val="F97414"/>
-          <w:sz w:val="18"/>
-          <w:szCs w:val="18"/>
-        </w:rPr>
-        <w:t xml:space="preserve"> </w:t>
-      </w:r>
+        <w:ind w:left="2127" w:firstLine="709"/>
+        <w:rPr>
+          <w:rFonts w:ascii="Courier New" w:hAnsi="Courier New" w:cs="Courier New"/>
+          <w:color w:val="F97414"/>
+          <w:sz w:val="18"/>
+          <w:szCs w:val="18"/>
+        </w:rPr>
+      </w:pPr>
       <w:proofErr w:type="spellStart"/>
       <w:proofErr w:type="gramStart"/>
       <w:r>
@@ -15846,6 +15994,70 @@
           <w:sz w:val="18"/>
           <w:szCs w:val="18"/>
         </w:rPr>
+        <w:t xml:space="preserve"> </w:t>
+      </w:r>
+      <w:r>
+        <w:rPr>
+          <w:rFonts w:ascii="Courier New" w:hAnsi="Courier New" w:cs="Courier New"/>
+          <w:color w:val="F97414"/>
+          <w:sz w:val="18"/>
+          <w:szCs w:val="18"/>
+        </w:rPr>
+        <w:tab/>
+      </w:r>
+      <w:r>
+        <w:rPr>
+          <w:rFonts w:ascii="Courier New" w:hAnsi="Courier New" w:cs="Courier New"/>
+          <w:color w:val="F97414"/>
+          <w:sz w:val="18"/>
+          <w:szCs w:val="18"/>
+        </w:rPr>
+        <w:tab/>
+      </w:r>
+      <w:r>
+        <w:rPr>
+          <w:rFonts w:ascii="Courier New" w:hAnsi="Courier New" w:cs="Courier New"/>
+          <w:color w:val="F97414"/>
+          <w:sz w:val="18"/>
+          <w:szCs w:val="18"/>
+        </w:rPr>
+        <w:t>}</w:t>
+      </w:r>
+    </w:p>
+    <w:p>
+      <w:pPr>
+        <w:autoSpaceDE w:val="0"/>
+        <w:autoSpaceDN w:val="0"/>
+        <w:adjustRightInd w:val="0"/>
+        <w:ind w:left="1418"/>
+        <w:rPr>
+          <w:rFonts w:ascii="Courier New" w:hAnsi="Courier New" w:cs="Courier New"/>
+          <w:color w:val="F97414"/>
+          <w:sz w:val="18"/>
+          <w:szCs w:val="18"/>
+        </w:rPr>
+      </w:pPr>
+    </w:p>
+    <w:p>
+      <w:pPr>
+        <w:autoSpaceDE w:val="0"/>
+        <w:autoSpaceDN w:val="0"/>
+        <w:adjustRightInd w:val="0"/>
+        <w:ind w:left="1418"/>
+        <w:rPr>
+          <w:rFonts w:ascii="Courier New" w:hAnsi="Courier New" w:cs="Courier New"/>
+          <w:color w:val="F97414"/>
+          <w:sz w:val="18"/>
+          <w:szCs w:val="18"/>
+        </w:rPr>
+      </w:pPr>
+      <w:r>
+        <w:rPr>
+          <w:rFonts w:ascii="Courier New" w:hAnsi="Courier New" w:cs="Courier New"/>
+          <w:color w:val="F97414"/>
+          <w:sz w:val="18"/>
+          <w:szCs w:val="18"/>
+        </w:rPr>
         <w:lastRenderedPageBreak/>
         <w:t xml:space="preserve"> </w:t>
       </w:r>
@@ -15856,480 +16068,510 @@
           <w:sz w:val="18"/>
           <w:szCs w:val="18"/>
         </w:rPr>
+        <w:tab/>
+      </w:r>
+      <w:r>
+        <w:rPr>
+          <w:rFonts w:ascii="Courier New" w:hAnsi="Courier New" w:cs="Courier New"/>
+          <w:color w:val="F97414"/>
+          <w:sz w:val="18"/>
+          <w:szCs w:val="18"/>
+        </w:rPr>
+        <w:tab/>
+      </w:r>
+      <w:r>
+        <w:rPr>
+          <w:rFonts w:ascii="Courier New" w:hAnsi="Courier New" w:cs="Courier New"/>
+          <w:color w:val="F97414"/>
+          <w:sz w:val="18"/>
+          <w:szCs w:val="18"/>
+        </w:rPr>
+        <w:t>/* Move cursor to previous line */</w:t>
+      </w:r>
+    </w:p>
+    <w:p>
+      <w:pPr>
+        <w:autoSpaceDE w:val="0"/>
+        <w:autoSpaceDN w:val="0"/>
+        <w:adjustRightInd w:val="0"/>
+        <w:ind w:left="1418"/>
+        <w:rPr>
+          <w:rFonts w:ascii="Courier New" w:hAnsi="Courier New" w:cs="Courier New"/>
+          <w:color w:val="F97414"/>
+          <w:sz w:val="18"/>
+          <w:szCs w:val="18"/>
+        </w:rPr>
+      </w:pPr>
+      <w:r>
+        <w:rPr>
+          <w:rFonts w:ascii="Courier New" w:hAnsi="Courier New" w:cs="Courier New"/>
+          <w:color w:val="F97414"/>
+          <w:sz w:val="18"/>
+          <w:szCs w:val="18"/>
+        </w:rPr>
+        <w:t xml:space="preserve"> </w:t>
+      </w:r>
+      <w:r>
+        <w:rPr>
+          <w:rFonts w:ascii="Courier New" w:hAnsi="Courier New" w:cs="Courier New"/>
+          <w:color w:val="F97414"/>
+          <w:sz w:val="18"/>
+          <w:szCs w:val="18"/>
+        </w:rPr>
+        <w:tab/>
+      </w:r>
+      <w:r>
+        <w:rPr>
+          <w:rFonts w:ascii="Courier New" w:hAnsi="Courier New" w:cs="Courier New"/>
+          <w:color w:val="F97414"/>
+          <w:sz w:val="18"/>
+          <w:szCs w:val="18"/>
+        </w:rPr>
+        <w:tab/>
+      </w:r>
+      <w:proofErr w:type="spellStart"/>
+      <w:r>
+        <w:rPr>
+          <w:rFonts w:ascii="Courier New" w:hAnsi="Courier New" w:cs="Courier New"/>
+          <w:color w:val="F97414"/>
+          <w:sz w:val="18"/>
+          <w:szCs w:val="18"/>
+        </w:rPr>
+        <w:t>printf</w:t>
+      </w:r>
+      <w:proofErr w:type="spellEnd"/>
+      <w:r>
+        <w:rPr>
+          <w:rFonts w:ascii="Courier New" w:hAnsi="Courier New" w:cs="Courier New"/>
+          <w:color w:val="F97414"/>
+          <w:sz w:val="18"/>
+          <w:szCs w:val="18"/>
+        </w:rPr>
+        <w:t>("\x1b[1F");</w:t>
+      </w:r>
+    </w:p>
+    <w:p>
+      <w:pPr>
+        <w:autoSpaceDE w:val="0"/>
+        <w:autoSpaceDN w:val="0"/>
+        <w:adjustRightInd w:val="0"/>
+        <w:ind w:left="2127" w:firstLine="709"/>
+        <w:rPr>
+          <w:rFonts w:ascii="Courier New" w:hAnsi="Courier New" w:cs="Courier New"/>
+          <w:color w:val="F97414"/>
+          <w:sz w:val="18"/>
+          <w:szCs w:val="18"/>
+        </w:rPr>
+      </w:pPr>
+      <w:bookmarkStart w:id="204" w:name="_mioConsistencyCheck178"/>
+      <w:bookmarkEnd w:id="203"/>
+      <w:proofErr w:type="spellStart"/>
+      <w:r>
+        <w:rPr>
+          <w:rFonts w:ascii="Courier New" w:hAnsi="Courier New" w:cs="Courier New"/>
+          <w:color w:val="F97414"/>
+          <w:sz w:val="18"/>
+          <w:szCs w:val="18"/>
+        </w:rPr>
+        <w:t>led_blink_active_flag</w:t>
+      </w:r>
+      <w:proofErr w:type="spellEnd"/>
+      <w:r>
+        <w:rPr>
+          <w:rFonts w:ascii="Courier New" w:hAnsi="Courier New" w:cs="Courier New"/>
+          <w:color w:val="F97414"/>
+          <w:sz w:val="18"/>
+          <w:szCs w:val="18"/>
+        </w:rPr>
+        <w:t xml:space="preserve"> ^= 1;</w:t>
+      </w:r>
+    </w:p>
+    <w:p>
+      <w:pPr>
+        <w:autoSpaceDE w:val="0"/>
+        <w:autoSpaceDN w:val="0"/>
+        <w:adjustRightInd w:val="0"/>
+        <w:ind w:left="1418"/>
+        <w:rPr>
+          <w:rFonts w:ascii="Courier New" w:hAnsi="Courier New" w:cs="Courier New"/>
+          <w:color w:val="F97414"/>
+          <w:sz w:val="18"/>
+          <w:szCs w:val="18"/>
+        </w:rPr>
+      </w:pPr>
+      <w:r>
+        <w:rPr>
+          <w:rFonts w:ascii="Courier New" w:hAnsi="Courier New" w:cs="Courier New"/>
+          <w:color w:val="F97414"/>
+          <w:sz w:val="18"/>
+          <w:szCs w:val="18"/>
+        </w:rPr>
+        <w:t xml:space="preserve">        }</w:t>
+      </w:r>
+      <w:r>
+        <w:rPr>
+          <w:rFonts w:ascii="Courier New" w:hAnsi="Courier New" w:cs="Courier New"/>
+          <w:color w:val="F97414"/>
+          <w:sz w:val="18"/>
+          <w:szCs w:val="18"/>
+        </w:rPr>
+        <w:t xml:space="preserve"> //end if </w:t>
+      </w:r>
+      <w:proofErr w:type="spellStart"/>
+      <w:r>
+        <w:rPr>
+          <w:rFonts w:ascii="Courier New" w:hAnsi="Courier New" w:cs="Courier New"/>
+          <w:color w:val="F97414"/>
+          <w:sz w:val="18"/>
+          <w:szCs w:val="18"/>
+        </w:rPr>
+        <w:t>uart_read_value</w:t>
+      </w:r>
+      <w:proofErr w:type="spellEnd"/>
+    </w:p>
+    <w:p>
+      <w:pPr>
+        <w:autoSpaceDE w:val="0"/>
+        <w:autoSpaceDN w:val="0"/>
+        <w:adjustRightInd w:val="0"/>
+        <w:ind w:left="1418"/>
+        <w:rPr>
+          <w:rFonts w:ascii="Courier New" w:hAnsi="Courier New" w:cs="Courier New"/>
+          <w:color w:val="F97414"/>
+          <w:sz w:val="18"/>
+          <w:szCs w:val="18"/>
+        </w:rPr>
+      </w:pPr>
+      <w:r>
+        <w:rPr>
+          <w:rFonts w:ascii="Courier New" w:hAnsi="Courier New" w:cs="Courier New"/>
+          <w:color w:val="F97414"/>
+          <w:sz w:val="18"/>
+          <w:szCs w:val="18"/>
+        </w:rPr>
+        <w:t xml:space="preserve">    }</w:t>
+      </w:r>
+      <w:r>
+        <w:rPr>
+          <w:rFonts w:ascii="Courier New" w:hAnsi="Courier New" w:cs="Courier New"/>
+          <w:color w:val="F97414"/>
+          <w:sz w:val="18"/>
+          <w:szCs w:val="18"/>
+        </w:rPr>
+        <w:t xml:space="preserve"> //end if CY_RSLT_SUCCESS</w:t>
+      </w:r>
+    </w:p>
+    <w:p>
+      <w:pPr>
+        <w:autoSpaceDE w:val="0"/>
+        <w:autoSpaceDN w:val="0"/>
+        <w:adjustRightInd w:val="0"/>
+        <w:ind w:left="1418"/>
+        <w:rPr>
+          <w:rFonts w:ascii="Courier New" w:hAnsi="Courier New" w:cs="Courier New"/>
+          <w:color w:val="F97414"/>
+          <w:sz w:val="18"/>
+          <w:szCs w:val="18"/>
+        </w:rPr>
+      </w:pPr>
+    </w:p>
+    <w:p>
+      <w:pPr>
+        <w:autoSpaceDE w:val="0"/>
+        <w:autoSpaceDN w:val="0"/>
+        <w:adjustRightInd w:val="0"/>
+        <w:ind w:left="1418"/>
+        <w:rPr>
+          <w:rFonts w:ascii="Courier New" w:hAnsi="Courier New" w:cs="Courier New"/>
+          <w:color w:val="F97414"/>
+          <w:sz w:val="18"/>
+          <w:szCs w:val="18"/>
+        </w:rPr>
+      </w:pPr>
+      <w:r>
+        <w:rPr>
+          <w:rFonts w:ascii="Courier New" w:hAnsi="Courier New" w:cs="Courier New"/>
+          <w:color w:val="F97414"/>
+          <w:sz w:val="18"/>
+          <w:szCs w:val="18"/>
+        </w:rPr>
+        <w:t xml:space="preserve">    /* Check if timer elapsed (interrupt fired) and toggle the LED */</w:t>
+      </w:r>
+    </w:p>
+    <w:p>
+      <w:pPr>
+        <w:autoSpaceDE w:val="0"/>
+        <w:autoSpaceDN w:val="0"/>
+        <w:adjustRightInd w:val="0"/>
+        <w:ind w:left="1418"/>
+        <w:rPr>
+          <w:rFonts w:ascii="Courier New" w:hAnsi="Courier New" w:cs="Courier New"/>
+          <w:color w:val="F97414"/>
+          <w:sz w:val="18"/>
+          <w:szCs w:val="18"/>
+        </w:rPr>
+      </w:pPr>
+      <w:r>
+        <w:rPr>
+          <w:rFonts w:ascii="Courier New" w:hAnsi="Courier New" w:cs="Courier New"/>
+          <w:color w:val="F97414"/>
+          <w:sz w:val="18"/>
+          <w:szCs w:val="18"/>
+        </w:rPr>
+        <w:t xml:space="preserve">    if (</w:t>
+      </w:r>
+      <w:proofErr w:type="spellStart"/>
+      <w:r>
+        <w:rPr>
+          <w:rFonts w:ascii="Courier New" w:hAnsi="Courier New" w:cs="Courier New"/>
+          <w:color w:val="F97414"/>
+          <w:sz w:val="18"/>
+          <w:szCs w:val="18"/>
+        </w:rPr>
+        <w:t>timer_interrupt_flag</w:t>
+      </w:r>
+      <w:proofErr w:type="spellEnd"/>
+      <w:r>
+        <w:rPr>
+          <w:rFonts w:ascii="Courier New" w:hAnsi="Courier New" w:cs="Courier New"/>
+          <w:color w:val="F97414"/>
+          <w:sz w:val="18"/>
+          <w:szCs w:val="18"/>
+        </w:rPr>
+        <w:t>)</w:t>
+      </w:r>
+    </w:p>
+    <w:p>
+      <w:pPr>
+        <w:autoSpaceDE w:val="0"/>
+        <w:autoSpaceDN w:val="0"/>
+        <w:adjustRightInd w:val="0"/>
+        <w:ind w:left="1418"/>
+        <w:rPr>
+          <w:rFonts w:ascii="Courier New" w:hAnsi="Courier New" w:cs="Courier New"/>
+          <w:color w:val="F97414"/>
+          <w:sz w:val="18"/>
+          <w:szCs w:val="18"/>
+        </w:rPr>
+      </w:pPr>
+      <w:r>
+        <w:rPr>
+          <w:rFonts w:ascii="Courier New" w:hAnsi="Courier New" w:cs="Courier New"/>
+          <w:color w:val="F97414"/>
+          <w:sz w:val="18"/>
+          <w:szCs w:val="18"/>
+        </w:rPr>
+        <w:t xml:space="preserve">    {</w:t>
+      </w:r>
+    </w:p>
+    <w:p>
+      <w:pPr>
+        <w:autoSpaceDE w:val="0"/>
+        <w:autoSpaceDN w:val="0"/>
+        <w:adjustRightInd w:val="0"/>
+        <w:ind w:left="1418"/>
+        <w:rPr>
+          <w:rFonts w:ascii="Courier New" w:hAnsi="Courier New" w:cs="Courier New"/>
+          <w:color w:val="F97414"/>
+          <w:sz w:val="18"/>
+          <w:szCs w:val="18"/>
+        </w:rPr>
+      </w:pPr>
+      <w:r>
+        <w:rPr>
+          <w:rFonts w:ascii="Courier New" w:hAnsi="Courier New" w:cs="Courier New"/>
+          <w:color w:val="F97414"/>
+          <w:sz w:val="18"/>
+          <w:szCs w:val="18"/>
+        </w:rPr>
+        <w:t xml:space="preserve">        /* Clear the flag */</w:t>
+      </w:r>
+    </w:p>
+    <w:bookmarkEnd w:id="204"/>
+    <w:p>
+      <w:pPr>
+        <w:autoSpaceDE w:val="0"/>
+        <w:autoSpaceDN w:val="0"/>
+        <w:adjustRightInd w:val="0"/>
+        <w:ind w:left="1418"/>
+        <w:rPr>
+          <w:rFonts w:ascii="Courier New" w:hAnsi="Courier New" w:cs="Courier New"/>
+          <w:color w:val="F97414"/>
+          <w:sz w:val="18"/>
+          <w:szCs w:val="18"/>
+        </w:rPr>
+      </w:pPr>
+      <w:r>
+        <w:rPr>
+          <w:rFonts w:ascii="Courier New" w:hAnsi="Courier New" w:cs="Courier New"/>
+          <w:color w:val="FF0000"/>
+          <w:sz w:val="18"/>
+          <w:szCs w:val="18"/>
+        </w:rPr>
+        <w:t xml:space="preserve">        </w:t>
+      </w:r>
+      <w:bookmarkStart w:id="205" w:name="_mioConsistencyCheck179"/>
+      <w:proofErr w:type="spellStart"/>
+      <w:r>
+        <w:rPr>
+          <w:rFonts w:ascii="Courier New" w:hAnsi="Courier New" w:cs="Courier New"/>
+          <w:color w:val="F97414"/>
+          <w:sz w:val="18"/>
+          <w:szCs w:val="18"/>
+        </w:rPr>
+        <w:t>timer_interrupt_flag</w:t>
+      </w:r>
+      <w:proofErr w:type="spellEnd"/>
+      <w:r>
+        <w:rPr>
+          <w:rFonts w:ascii="Courier New" w:hAnsi="Courier New" w:cs="Courier New"/>
+          <w:color w:val="F97414"/>
+          <w:sz w:val="18"/>
+          <w:szCs w:val="18"/>
+        </w:rPr>
+        <w:t xml:space="preserve"> = false;</w:t>
+      </w:r>
+    </w:p>
+    <w:p>
+      <w:pPr>
+        <w:autoSpaceDE w:val="0"/>
+        <w:autoSpaceDN w:val="0"/>
+        <w:adjustRightInd w:val="0"/>
+        <w:ind w:left="1418"/>
+        <w:rPr>
+          <w:rFonts w:ascii="Courier New" w:hAnsi="Courier New" w:cs="Courier New"/>
+          <w:color w:val="F97414"/>
+          <w:sz w:val="18"/>
+          <w:szCs w:val="18"/>
+        </w:rPr>
+      </w:pPr>
+    </w:p>
+    <w:p>
+      <w:pPr>
+        <w:autoSpaceDE w:val="0"/>
+        <w:autoSpaceDN w:val="0"/>
+        <w:adjustRightInd w:val="0"/>
+        <w:ind w:left="1418"/>
+        <w:rPr>
+          <w:rFonts w:ascii="Courier New" w:hAnsi="Courier New" w:cs="Courier New"/>
+          <w:color w:val="F97414"/>
+          <w:sz w:val="18"/>
+          <w:szCs w:val="18"/>
+        </w:rPr>
+      </w:pPr>
+      <w:r>
+        <w:rPr>
+          <w:rFonts w:ascii="Courier New" w:hAnsi="Courier New" w:cs="Courier New"/>
+          <w:color w:val="F97414"/>
+          <w:sz w:val="18"/>
+          <w:szCs w:val="18"/>
+        </w:rPr>
+        <w:t xml:space="preserve">        /* Invert the USER LED state */</w:t>
+      </w:r>
+    </w:p>
+    <w:bookmarkEnd w:id="205"/>
+    <w:p>
+      <w:pPr>
+        <w:autoSpaceDE w:val="0"/>
+        <w:autoSpaceDN w:val="0"/>
+        <w:adjustRightInd w:val="0"/>
+        <w:ind w:left="1418"/>
+        <w:rPr>
+          <w:rFonts w:ascii="Courier New" w:hAnsi="Courier New" w:cs="Courier New"/>
+          <w:color w:val="F97414"/>
+          <w:sz w:val="18"/>
+          <w:szCs w:val="18"/>
+        </w:rPr>
+      </w:pPr>
+      <w:r>
+        <w:rPr>
+          <w:rFonts w:ascii="Courier New" w:hAnsi="Courier New" w:cs="Courier New"/>
+          <w:color w:val="FF0000"/>
+          <w:sz w:val="18"/>
+          <w:szCs w:val="18"/>
+        </w:rPr>
+        <w:t xml:space="preserve">        </w:t>
+      </w:r>
+      <w:bookmarkStart w:id="206" w:name="_mioConsistencyCheck180"/>
+      <w:proofErr w:type="spellStart"/>
+      <w:r>
+        <w:rPr>
+          <w:rFonts w:ascii="Courier New" w:hAnsi="Courier New" w:cs="Courier New"/>
+          <w:color w:val="F97414"/>
+          <w:sz w:val="18"/>
+          <w:szCs w:val="18"/>
+        </w:rPr>
+        <w:t>cyhal_gpio_toggle</w:t>
+      </w:r>
+      <w:proofErr w:type="spellEnd"/>
+      <w:r>
+        <w:rPr>
+          <w:rFonts w:ascii="Courier New" w:hAnsi="Courier New" w:cs="Courier New"/>
+          <w:color w:val="F97414"/>
+          <w:sz w:val="18"/>
+          <w:szCs w:val="18"/>
+        </w:rPr>
+        <w:t>(TRAINING_LED);</w:t>
+      </w:r>
+    </w:p>
+    <w:p>
+      <w:pPr>
+        <w:autoSpaceDE w:val="0"/>
+        <w:autoSpaceDN w:val="0"/>
+        <w:adjustRightInd w:val="0"/>
+        <w:ind w:left="1418"/>
+        <w:rPr>
+          <w:rFonts w:ascii="Courier New" w:hAnsi="Courier New" w:cs="Courier New"/>
+          <w:color w:val="F97414"/>
+          <w:sz w:val="18"/>
+          <w:szCs w:val="18"/>
+        </w:rPr>
+      </w:pPr>
+      <w:r>
+        <w:rPr>
+          <w:rFonts w:ascii="Courier New" w:hAnsi="Courier New" w:cs="Courier New"/>
+          <w:color w:val="F97414"/>
+          <w:sz w:val="18"/>
+          <w:szCs w:val="18"/>
+        </w:rPr>
+        <w:t xml:space="preserve">    }</w:t>
+      </w:r>
+    </w:p>
+    <w:p>
+      <w:pPr>
+        <w:autoSpaceDE w:val="0"/>
+        <w:autoSpaceDN w:val="0"/>
+        <w:adjustRightInd w:val="0"/>
+        <w:ind w:left="1418"/>
+        <w:rPr>
+          <w:rFonts w:ascii="Courier New" w:hAnsi="Courier New" w:cs="Courier New"/>
+          <w:color w:val="F97414"/>
+          <w:sz w:val="18"/>
+          <w:szCs w:val="18"/>
+        </w:rPr>
+      </w:pPr>
+      <w:r>
+        <w:rPr>
+          <w:rFonts w:ascii="Courier New" w:hAnsi="Courier New" w:cs="Courier New"/>
+          <w:color w:val="F97414"/>
+          <w:sz w:val="18"/>
+          <w:szCs w:val="18"/>
+        </w:rPr>
         <w:t>}</w:t>
       </w:r>
-    </w:p>
-    <w:p>
-      <w:pPr>
-        <w:autoSpaceDE w:val="0"/>
-        <w:autoSpaceDN w:val="0"/>
-        <w:adjustRightInd w:val="0"/>
-        <w:ind w:left="1418"/>
-        <w:rPr>
-          <w:rFonts w:ascii="Courier New" w:hAnsi="Courier New" w:cs="Courier New"/>
-          <w:color w:val="F97414"/>
-          <w:sz w:val="18"/>
-          <w:szCs w:val="18"/>
-        </w:rPr>
-      </w:pPr>
-    </w:p>
-    <w:p>
-      <w:pPr>
-        <w:autoSpaceDE w:val="0"/>
-        <w:autoSpaceDN w:val="0"/>
-        <w:adjustRightInd w:val="0"/>
-        <w:ind w:left="1418"/>
-        <w:rPr>
-          <w:rFonts w:ascii="Courier New" w:hAnsi="Courier New" w:cs="Courier New"/>
-          <w:color w:val="F97414"/>
-          <w:sz w:val="18"/>
-          <w:szCs w:val="18"/>
-        </w:rPr>
-      </w:pPr>
-      <w:r>
-        <w:rPr>
-          <w:rFonts w:ascii="Courier New" w:hAnsi="Courier New" w:cs="Courier New"/>
-          <w:color w:val="F97414"/>
-          <w:sz w:val="18"/>
-          <w:szCs w:val="18"/>
-        </w:rPr>
-        <w:t xml:space="preserve"> /* Move cursor to previous line */</w:t>
-      </w:r>
-    </w:p>
-    <w:p>
-      <w:pPr>
-        <w:autoSpaceDE w:val="0"/>
-        <w:autoSpaceDN w:val="0"/>
-        <w:adjustRightInd w:val="0"/>
-        <w:ind w:left="1418"/>
-        <w:rPr>
-          <w:rFonts w:ascii="Courier New" w:hAnsi="Courier New" w:cs="Courier New"/>
-          <w:color w:val="F97414"/>
-          <w:sz w:val="18"/>
-          <w:szCs w:val="18"/>
-        </w:rPr>
-      </w:pPr>
-      <w:r>
-        <w:rPr>
-          <w:rFonts w:ascii="Courier New" w:hAnsi="Courier New" w:cs="Courier New"/>
-          <w:color w:val="F97414"/>
-          <w:sz w:val="18"/>
-          <w:szCs w:val="18"/>
-        </w:rPr>
-        <w:t xml:space="preserve"> </w:t>
-      </w:r>
-      <w:proofErr w:type="spellStart"/>
-      <w:r>
-        <w:rPr>
-          <w:rFonts w:ascii="Courier New" w:hAnsi="Courier New" w:cs="Courier New"/>
-          <w:color w:val="F97414"/>
-          <w:sz w:val="18"/>
-          <w:szCs w:val="18"/>
-        </w:rPr>
-        <w:t>printf</w:t>
-      </w:r>
-      <w:proofErr w:type="spellEnd"/>
-      <w:r>
-        <w:rPr>
-          <w:rFonts w:ascii="Courier New" w:hAnsi="Courier New" w:cs="Courier New"/>
-          <w:color w:val="F97414"/>
-          <w:sz w:val="18"/>
-          <w:szCs w:val="18"/>
-        </w:rPr>
-        <w:t>("\x1b[1F");</w:t>
-      </w:r>
-    </w:p>
-    <w:bookmarkEnd w:id="204"/>
-    <w:p>
-      <w:pPr>
-        <w:autoSpaceDE w:val="0"/>
-        <w:autoSpaceDN w:val="0"/>
-        <w:adjustRightInd w:val="0"/>
-        <w:ind w:left="1418"/>
-        <w:rPr>
-          <w:rFonts w:ascii="Courier New" w:hAnsi="Courier New" w:cs="Courier New"/>
-          <w:color w:val="FF0000"/>
-          <w:sz w:val="18"/>
-          <w:szCs w:val="18"/>
-        </w:rPr>
-      </w:pPr>
-    </w:p>
-    <w:p>
-      <w:pPr>
-        <w:autoSpaceDE w:val="0"/>
-        <w:autoSpaceDN w:val="0"/>
-        <w:adjustRightInd w:val="0"/>
-        <w:ind w:left="1418"/>
-        <w:rPr>
-          <w:rFonts w:ascii="Courier New" w:hAnsi="Courier New" w:cs="Courier New"/>
-          <w:color w:val="F97414"/>
-          <w:sz w:val="18"/>
-          <w:szCs w:val="18"/>
-        </w:rPr>
-      </w:pPr>
-      <w:bookmarkStart w:id="205" w:name="_mioConsistencyCheck178"/>
-      <w:r>
-        <w:rPr>
-          <w:rFonts w:ascii="Courier New" w:hAnsi="Courier New" w:cs="Courier New"/>
-          <w:color w:val="F97414"/>
-          <w:sz w:val="18"/>
-          <w:szCs w:val="18"/>
-        </w:rPr>
-        <w:t xml:space="preserve"> </w:t>
-      </w:r>
-      <w:proofErr w:type="spellStart"/>
-      <w:r>
-        <w:rPr>
-          <w:rFonts w:ascii="Courier New" w:hAnsi="Courier New" w:cs="Courier New"/>
-          <w:color w:val="F97414"/>
-          <w:sz w:val="18"/>
-          <w:szCs w:val="18"/>
-        </w:rPr>
-        <w:t>led_blink_active_flag</w:t>
-      </w:r>
-      <w:proofErr w:type="spellEnd"/>
-      <w:r>
-        <w:rPr>
-          <w:rFonts w:ascii="Courier New" w:hAnsi="Courier New" w:cs="Courier New"/>
-          <w:color w:val="F97414"/>
-          <w:sz w:val="18"/>
-          <w:szCs w:val="18"/>
-        </w:rPr>
-        <w:t xml:space="preserve"> ^= 1;</w:t>
-      </w:r>
-    </w:p>
-    <w:p>
-      <w:pPr>
-        <w:autoSpaceDE w:val="0"/>
-        <w:autoSpaceDN w:val="0"/>
-        <w:adjustRightInd w:val="0"/>
-        <w:ind w:left="1418"/>
-        <w:rPr>
-          <w:rFonts w:ascii="Courier New" w:hAnsi="Courier New" w:cs="Courier New"/>
-          <w:color w:val="F97414"/>
-          <w:sz w:val="18"/>
-          <w:szCs w:val="18"/>
-        </w:rPr>
-      </w:pPr>
-      <w:r>
-        <w:rPr>
-          <w:rFonts w:ascii="Courier New" w:hAnsi="Courier New" w:cs="Courier New"/>
-          <w:color w:val="F97414"/>
-          <w:sz w:val="18"/>
-          <w:szCs w:val="18"/>
-        </w:rPr>
-        <w:t xml:space="preserve">        }</w:t>
-      </w:r>
-    </w:p>
-    <w:p>
-      <w:pPr>
-        <w:autoSpaceDE w:val="0"/>
-        <w:autoSpaceDN w:val="0"/>
-        <w:adjustRightInd w:val="0"/>
-        <w:ind w:left="1418"/>
-        <w:rPr>
-          <w:rFonts w:ascii="Courier New" w:hAnsi="Courier New" w:cs="Courier New"/>
-          <w:color w:val="F97414"/>
-          <w:sz w:val="18"/>
-          <w:szCs w:val="18"/>
-        </w:rPr>
-      </w:pPr>
-      <w:r>
-        <w:rPr>
-          <w:rFonts w:ascii="Courier New" w:hAnsi="Courier New" w:cs="Courier New"/>
-          <w:color w:val="F97414"/>
-          <w:sz w:val="18"/>
-          <w:szCs w:val="18"/>
-        </w:rPr>
-        <w:t xml:space="preserve">    }</w:t>
-      </w:r>
-    </w:p>
-    <w:p>
-      <w:pPr>
-        <w:autoSpaceDE w:val="0"/>
-        <w:autoSpaceDN w:val="0"/>
-        <w:adjustRightInd w:val="0"/>
-        <w:ind w:left="1418"/>
-        <w:rPr>
-          <w:rFonts w:ascii="Courier New" w:hAnsi="Courier New" w:cs="Courier New"/>
-          <w:color w:val="F97414"/>
-          <w:sz w:val="18"/>
-          <w:szCs w:val="18"/>
-        </w:rPr>
-      </w:pPr>
-      <w:r>
-        <w:rPr>
-          <w:rFonts w:ascii="Courier New" w:hAnsi="Courier New" w:cs="Courier New"/>
-          <w:color w:val="F97414"/>
-          <w:sz w:val="18"/>
-          <w:szCs w:val="18"/>
-        </w:rPr>
-        <w:t xml:space="preserve">    /* Check if timer elapsed (interrupt fired) and toggle the LED */</w:t>
-      </w:r>
-    </w:p>
-    <w:p>
-      <w:pPr>
-        <w:autoSpaceDE w:val="0"/>
-        <w:autoSpaceDN w:val="0"/>
-        <w:adjustRightInd w:val="0"/>
-        <w:ind w:left="1418"/>
-        <w:rPr>
-          <w:rFonts w:ascii="Courier New" w:hAnsi="Courier New" w:cs="Courier New"/>
-          <w:color w:val="F97414"/>
-          <w:sz w:val="18"/>
-          <w:szCs w:val="18"/>
-        </w:rPr>
-      </w:pPr>
-      <w:r>
-        <w:rPr>
-          <w:rFonts w:ascii="Courier New" w:hAnsi="Courier New" w:cs="Courier New"/>
-          <w:color w:val="F97414"/>
-          <w:sz w:val="18"/>
-          <w:szCs w:val="18"/>
-        </w:rPr>
-        <w:t xml:space="preserve">    if (</w:t>
-      </w:r>
-      <w:proofErr w:type="spellStart"/>
-      <w:r>
-        <w:rPr>
-          <w:rFonts w:ascii="Courier New" w:hAnsi="Courier New" w:cs="Courier New"/>
-          <w:color w:val="F97414"/>
-          <w:sz w:val="18"/>
-          <w:szCs w:val="18"/>
-        </w:rPr>
-        <w:t>timer_interrupt_flag</w:t>
-      </w:r>
-      <w:proofErr w:type="spellEnd"/>
-      <w:r>
-        <w:rPr>
-          <w:rFonts w:ascii="Courier New" w:hAnsi="Courier New" w:cs="Courier New"/>
-          <w:color w:val="F97414"/>
-          <w:sz w:val="18"/>
-          <w:szCs w:val="18"/>
-        </w:rPr>
-        <w:t>)</w:t>
-      </w:r>
-    </w:p>
-    <w:p>
-      <w:pPr>
-        <w:autoSpaceDE w:val="0"/>
-        <w:autoSpaceDN w:val="0"/>
-        <w:adjustRightInd w:val="0"/>
-        <w:ind w:left="1418"/>
-        <w:rPr>
-          <w:rFonts w:ascii="Courier New" w:hAnsi="Courier New" w:cs="Courier New"/>
-          <w:color w:val="F97414"/>
-          <w:sz w:val="18"/>
-          <w:szCs w:val="18"/>
-        </w:rPr>
-      </w:pPr>
-      <w:r>
-        <w:rPr>
-          <w:rFonts w:ascii="Courier New" w:hAnsi="Courier New" w:cs="Courier New"/>
-          <w:color w:val="F97414"/>
-          <w:sz w:val="18"/>
-          <w:szCs w:val="18"/>
-        </w:rPr>
-        <w:t xml:space="preserve">    {</w:t>
-      </w:r>
-    </w:p>
-    <w:p>
-      <w:pPr>
-        <w:autoSpaceDE w:val="0"/>
-        <w:autoSpaceDN w:val="0"/>
-        <w:adjustRightInd w:val="0"/>
-        <w:ind w:left="1418"/>
-        <w:rPr>
-          <w:rFonts w:ascii="Courier New" w:hAnsi="Courier New" w:cs="Courier New"/>
-          <w:color w:val="F97414"/>
-          <w:sz w:val="18"/>
-          <w:szCs w:val="18"/>
-        </w:rPr>
-      </w:pPr>
-      <w:r>
-        <w:rPr>
-          <w:rFonts w:ascii="Courier New" w:hAnsi="Courier New" w:cs="Courier New"/>
-          <w:color w:val="F97414"/>
-          <w:sz w:val="18"/>
-          <w:szCs w:val="18"/>
-        </w:rPr>
-        <w:t xml:space="preserve">        /* Clear the flag */</w:t>
-      </w:r>
-    </w:p>
-    <w:bookmarkEnd w:id="205"/>
-    <w:p>
-      <w:pPr>
-        <w:autoSpaceDE w:val="0"/>
-        <w:autoSpaceDN w:val="0"/>
-        <w:adjustRightInd w:val="0"/>
-        <w:ind w:left="1418"/>
-        <w:rPr>
-          <w:rFonts w:ascii="Courier New" w:hAnsi="Courier New" w:cs="Courier New"/>
-          <w:color w:val="F97414"/>
-          <w:sz w:val="18"/>
-          <w:szCs w:val="18"/>
-        </w:rPr>
-      </w:pPr>
-      <w:r>
-        <w:rPr>
-          <w:rFonts w:ascii="Courier New" w:hAnsi="Courier New" w:cs="Courier New"/>
-          <w:color w:val="FF0000"/>
-          <w:sz w:val="18"/>
-          <w:szCs w:val="18"/>
-        </w:rPr>
-        <w:t xml:space="preserve">        </w:t>
-      </w:r>
-      <w:bookmarkStart w:id="206" w:name="_mioConsistencyCheck179"/>
-      <w:proofErr w:type="spellStart"/>
-      <w:r>
-        <w:rPr>
-          <w:rFonts w:ascii="Courier New" w:hAnsi="Courier New" w:cs="Courier New"/>
-          <w:color w:val="F97414"/>
-          <w:sz w:val="18"/>
-          <w:szCs w:val="18"/>
-        </w:rPr>
-        <w:t>timer_interrupt_flag</w:t>
-      </w:r>
-      <w:proofErr w:type="spellEnd"/>
-      <w:r>
-        <w:rPr>
-          <w:rFonts w:ascii="Courier New" w:hAnsi="Courier New" w:cs="Courier New"/>
-          <w:color w:val="F97414"/>
-          <w:sz w:val="18"/>
-          <w:szCs w:val="18"/>
-        </w:rPr>
-        <w:t xml:space="preserve"> = false;</w:t>
-      </w:r>
-    </w:p>
-    <w:p>
-      <w:pPr>
-        <w:autoSpaceDE w:val="0"/>
-        <w:autoSpaceDN w:val="0"/>
-        <w:adjustRightInd w:val="0"/>
-        <w:ind w:left="1418"/>
-        <w:rPr>
-          <w:rFonts w:ascii="Courier New" w:hAnsi="Courier New" w:cs="Courier New"/>
-          <w:color w:val="F97414"/>
-          <w:sz w:val="18"/>
-          <w:szCs w:val="18"/>
-        </w:rPr>
-      </w:pPr>
-    </w:p>
-    <w:p>
-      <w:pPr>
-        <w:autoSpaceDE w:val="0"/>
-        <w:autoSpaceDN w:val="0"/>
-        <w:adjustRightInd w:val="0"/>
-        <w:ind w:left="1418"/>
-        <w:rPr>
-          <w:rFonts w:ascii="Courier New" w:hAnsi="Courier New" w:cs="Courier New"/>
-          <w:color w:val="F97414"/>
-          <w:sz w:val="18"/>
-          <w:szCs w:val="18"/>
-        </w:rPr>
-      </w:pPr>
-      <w:r>
-        <w:rPr>
-          <w:rFonts w:ascii="Courier New" w:hAnsi="Courier New" w:cs="Courier New"/>
-          <w:color w:val="F97414"/>
-          <w:sz w:val="18"/>
-          <w:szCs w:val="18"/>
-        </w:rPr>
-        <w:t xml:space="preserve">        /* Invert the USER LED state */</w:t>
-      </w:r>
+      <w:r>
+        <w:rPr>
+          <w:rFonts w:ascii="Courier New" w:hAnsi="Courier New" w:cs="Courier New"/>
+          <w:color w:val="F97414"/>
+          <w:sz w:val="18"/>
+          <w:szCs w:val="18"/>
+        </w:rPr>
+        <w:t xml:space="preserve"> //end forever for loop</w:t>
+      </w:r>
+      <w:bookmarkStart w:id="207" w:name="_GoBack"/>
+      <w:bookmarkEnd w:id="207"/>
     </w:p>
     <w:bookmarkEnd w:id="206"/>
-    <w:p>
-      <w:pPr>
-        <w:autoSpaceDE w:val="0"/>
-        <w:autoSpaceDN w:val="0"/>
-        <w:adjustRightInd w:val="0"/>
-        <w:ind w:left="1418"/>
-        <w:rPr>
-          <w:rFonts w:ascii="Courier New" w:hAnsi="Courier New" w:cs="Courier New"/>
-          <w:color w:val="F97414"/>
-          <w:sz w:val="18"/>
-          <w:szCs w:val="18"/>
-        </w:rPr>
-      </w:pPr>
-      <w:r>
-        <w:rPr>
-          <w:rFonts w:ascii="Courier New" w:hAnsi="Courier New" w:cs="Courier New"/>
-          <w:color w:val="FF0000"/>
-          <w:sz w:val="18"/>
-          <w:szCs w:val="18"/>
-        </w:rPr>
-        <w:t xml:space="preserve">        </w:t>
-      </w:r>
-      <w:bookmarkStart w:id="207" w:name="_mioConsistencyCheck180"/>
-      <w:proofErr w:type="spellStart"/>
-      <w:r>
-        <w:rPr>
-          <w:rFonts w:ascii="Courier New" w:hAnsi="Courier New" w:cs="Courier New"/>
-          <w:color w:val="F97414"/>
-          <w:sz w:val="18"/>
-          <w:szCs w:val="18"/>
-        </w:rPr>
-        <w:t>cyhal_gpio_toggle</w:t>
-      </w:r>
-      <w:proofErr w:type="spellEnd"/>
-      <w:r>
-        <w:rPr>
-          <w:rFonts w:ascii="Courier New" w:hAnsi="Courier New" w:cs="Courier New"/>
-          <w:color w:val="F97414"/>
-          <w:sz w:val="18"/>
-          <w:szCs w:val="18"/>
-        </w:rPr>
-        <w:t>(TRAINING_LED);</w:t>
-      </w:r>
-    </w:p>
-    <w:p>
-      <w:pPr>
-        <w:autoSpaceDE w:val="0"/>
-        <w:autoSpaceDN w:val="0"/>
-        <w:adjustRightInd w:val="0"/>
-        <w:ind w:left="1418"/>
-        <w:rPr>
-          <w:rFonts w:ascii="Courier New" w:hAnsi="Courier New" w:cs="Courier New"/>
-          <w:color w:val="F97414"/>
-          <w:sz w:val="18"/>
-          <w:szCs w:val="18"/>
-        </w:rPr>
-      </w:pPr>
-      <w:r>
-        <w:rPr>
-          <w:rFonts w:ascii="Courier New" w:hAnsi="Courier New" w:cs="Courier New"/>
-          <w:color w:val="F97414"/>
-          <w:sz w:val="18"/>
-          <w:szCs w:val="18"/>
-        </w:rPr>
-        <w:t xml:space="preserve">    }</w:t>
-      </w:r>
-    </w:p>
-    <w:p>
-      <w:pPr>
-        <w:autoSpaceDE w:val="0"/>
-        <w:autoSpaceDN w:val="0"/>
-        <w:adjustRightInd w:val="0"/>
-        <w:ind w:left="1418"/>
-        <w:rPr>
-          <w:rFonts w:ascii="Courier New" w:hAnsi="Courier New" w:cs="Courier New"/>
-          <w:color w:val="F97414"/>
-          <w:sz w:val="18"/>
-          <w:szCs w:val="18"/>
-        </w:rPr>
-      </w:pPr>
-      <w:r>
-        <w:rPr>
-          <w:rFonts w:ascii="Courier New" w:hAnsi="Courier New" w:cs="Courier New"/>
-          <w:color w:val="F97414"/>
-          <w:sz w:val="18"/>
-          <w:szCs w:val="18"/>
-        </w:rPr>
-        <w:t>}</w:t>
-      </w:r>
-    </w:p>
-    <w:bookmarkEnd w:id="207"/>
     <w:p>
       <w:pPr>
         <w:spacing w:before="160" w:after="160"/>
@@ -17636,53 +17878,53 @@
           <w:sz w:val="18"/>
           <w:szCs w:val="18"/>
         </w:rPr>
+        <w:t xml:space="preserve">    if (result != CY_RSLT_SUCCESS)</w:t>
+      </w:r>
+    </w:p>
+    <w:p>
+      <w:pPr>
+        <w:autoSpaceDE w:val="0"/>
+        <w:autoSpaceDN w:val="0"/>
+        <w:adjustRightInd w:val="0"/>
+        <w:ind w:left="1418"/>
+        <w:rPr>
+          <w:rFonts w:ascii="Courier New" w:hAnsi="Courier New" w:cs="Courier New"/>
+          <w:color w:val="F97414"/>
+          <w:sz w:val="18"/>
+          <w:szCs w:val="18"/>
+        </w:rPr>
+      </w:pPr>
+      <w:r>
+        <w:rPr>
+          <w:rFonts w:ascii="Courier New" w:hAnsi="Courier New" w:cs="Courier New"/>
+          <w:color w:val="F97414"/>
+          <w:sz w:val="18"/>
+          <w:szCs w:val="18"/>
+        </w:rPr>
+        <w:t xml:space="preserve">    {</w:t>
+      </w:r>
+    </w:p>
+    <w:p>
+      <w:pPr>
+        <w:autoSpaceDE w:val="0"/>
+        <w:autoSpaceDN w:val="0"/>
+        <w:adjustRightInd w:val="0"/>
+        <w:ind w:left="1418"/>
+        <w:rPr>
+          <w:rFonts w:ascii="Courier New" w:hAnsi="Courier New" w:cs="Courier New"/>
+          <w:color w:val="F97414"/>
+          <w:sz w:val="18"/>
+          <w:szCs w:val="18"/>
+        </w:rPr>
+      </w:pPr>
+      <w:r>
+        <w:rPr>
+          <w:rFonts w:ascii="Courier New" w:hAnsi="Courier New" w:cs="Courier New"/>
+          <w:color w:val="F97414"/>
+          <w:sz w:val="18"/>
+          <w:szCs w:val="18"/>
+        </w:rPr>
         <w:lastRenderedPageBreak/>
-        <w:t xml:space="preserve">    if (result != CY_RSLT_SUCCESS)</w:t>
-      </w:r>
-    </w:p>
-    <w:p>
-      <w:pPr>
-        <w:autoSpaceDE w:val="0"/>
-        <w:autoSpaceDN w:val="0"/>
-        <w:adjustRightInd w:val="0"/>
-        <w:ind w:left="1418"/>
-        <w:rPr>
-          <w:rFonts w:ascii="Courier New" w:hAnsi="Courier New" w:cs="Courier New"/>
-          <w:color w:val="F97414"/>
-          <w:sz w:val="18"/>
-          <w:szCs w:val="18"/>
-        </w:rPr>
-      </w:pPr>
-      <w:r>
-        <w:rPr>
-          <w:rFonts w:ascii="Courier New" w:hAnsi="Courier New" w:cs="Courier New"/>
-          <w:color w:val="F97414"/>
-          <w:sz w:val="18"/>
-          <w:szCs w:val="18"/>
-        </w:rPr>
-        <w:t xml:space="preserve">    {</w:t>
-      </w:r>
-    </w:p>
-    <w:p>
-      <w:pPr>
-        <w:autoSpaceDE w:val="0"/>
-        <w:autoSpaceDN w:val="0"/>
-        <w:adjustRightInd w:val="0"/>
-        <w:ind w:left="1418"/>
-        <w:rPr>
-          <w:rFonts w:ascii="Courier New" w:hAnsi="Courier New" w:cs="Courier New"/>
-          <w:color w:val="F97414"/>
-          <w:sz w:val="18"/>
-          <w:szCs w:val="18"/>
-        </w:rPr>
-      </w:pPr>
-      <w:r>
-        <w:rPr>
-          <w:rFonts w:ascii="Courier New" w:hAnsi="Courier New" w:cs="Courier New"/>
-          <w:color w:val="F97414"/>
-          <w:sz w:val="18"/>
-          <w:szCs w:val="18"/>
-        </w:rPr>
         <w:t xml:space="preserve">        CY_ASSERT(0);</w:t>
       </w:r>
     </w:p>
@@ -19493,7 +19735,6 @@
           <w:sz w:val="18"/>
           <w:szCs w:val="18"/>
         </w:rPr>
-        <w:lastRenderedPageBreak/>
         <w:tab/>
       </w:r>
       <w:proofErr w:type="spellStart"/>
@@ -19557,6 +19798,7 @@
           <w:b/>
           <w:lang w:eastAsia="de-DE"/>
         </w:rPr>
+        <w:lastRenderedPageBreak/>
         <w:t>&lt;code snippet&gt;</w:t>
       </w:r>
     </w:p>
@@ -41155,7 +41397,7 @@
         <v:shape id="_x0000_s2052" type="#_x0000_t75" style="position:absolute;margin-left:-45.75pt;margin-top:62.5pt;width:602.45pt;height:287.2pt;z-index:-251642880;mso-position-horizontal-relative:text;mso-position-vertical-relative:text">
           <v:imagedata r:id="rId1" o:title=""/>
         </v:shape>
-        <o:OLEObject Type="Embed" ProgID="Visio.Drawing.15" ShapeID="_x0000_s2052" DrawAspect="Content" ObjectID="_1823623341" r:id="rId2"/>
+        <o:OLEObject Type="Embed" ProgID="Visio.Drawing.15" ShapeID="_x0000_s2052" DrawAspect="Content" ObjectID="_1823712201" r:id="rId2"/>
       </w:object>
     </w:r>
     <w:r>
@@ -42488,7 +42730,7 @@
         <v:shape id="_x0000_s2051" type="#_x0000_t75" style="position:absolute;margin-left:-45.75pt;margin-top:62.5pt;width:602.45pt;height:287.2pt;z-index:-251643904;mso-position-horizontal-relative:text;mso-position-vertical-relative:text">
           <v:imagedata r:id="rId1" o:title=""/>
         </v:shape>
-        <o:OLEObject Type="Embed" ProgID="Visio.Drawing.15" ShapeID="_x0000_s2051" DrawAspect="Content" ObjectID="_1823623342" r:id="rId2"/>
+        <o:OLEObject Type="Embed" ProgID="Visio.Drawing.15" ShapeID="_x0000_s2051" DrawAspect="Content" ObjectID="_1823712202" r:id="rId2"/>
       </w:object>
     </w:r>
     <w:r>
@@ -54001,7 +54243,7 @@
 </file>
 
 <file path=customXml/itemProps5.xml><?xml version="1.0" encoding="utf-8"?>
-<ds:datastoreItem xmlns:ds="http://schemas.openxmlformats.org/officeDocument/2006/customXml" ds:itemID="{21FA1997-6BEF-4834-994A-7AFF991637FB}">
+<ds:datastoreItem xmlns:ds="http://schemas.openxmlformats.org/officeDocument/2006/customXml" ds:itemID="{1F0A0891-7AB6-4B65-86CC-CF739B6D6AA7}">
   <ds:schemaRefs>
     <ds:schemaRef ds:uri="http://schemas.openxmlformats.org/officeDocument/2006/bibliography"/>
   </ds:schemaRefs>

</xml_diff>

<commit_message>
updating figure titles and adding source code template for hello world + blinky
</commit_message>
<xml_diff>
--- a/.internal/Manual/Intro to PSOC Edge E84 - Part 2 (E2)/PSoC Edge E84 Introductory E2 Training Manual -WIP_10_21_2025.docx
+++ b/.internal/Manual/Intro to PSOC Edge E84 - Part 2 (E2)/PSoC Edge E84 Introductory E2 Training Manual -WIP_10_21_2025.docx
@@ -4418,7 +4418,7 @@
                   <w:pStyle w:val="TableCell-c"/>
                 </w:pPr>
                 <w:r>
-                  <w:object w:dxaOrig="15204" w:dyaOrig="18816" w14:anchorId="737D8556">
+                  <w:object w:dxaOrig="15211" w:dyaOrig="18811" w14:anchorId="737D8556">
                     <v:shapetype id="_x0000_t75" coordsize="21600,21600" o:spt="75" o:preferrelative="t" path="m@4@5l@4@11@9@11@9@5xe" filled="f" stroked="f">
                       <v:stroke joinstyle="miter"/>
                       <v:formulas>
@@ -4438,10 +4438,10 @@
                       <v:path o:extrusionok="f" gradientshapeok="t" o:connecttype="rect"/>
                       <o:lock v:ext="edit" aspectratio="t"/>
                     </v:shapetype>
-                    <v:shape id="_x0000_i1025" type="#_x0000_t75" style="width:475.95pt;height:588.15pt" o:ole="">
+                    <v:shape id="_x0000_i1025" type="#_x0000_t75" style="width:476pt;height:587.95pt" o:ole="">
                       <v:imagedata r:id="rId21" o:title=""/>
                     </v:shape>
-                    <o:OLEObject Type="Embed" ProgID="Visio.Drawing.15" ShapeID="_x0000_i1025" DrawAspect="Content" ObjectID="_1823712199" r:id="rId22"/>
+                    <o:OLEObject Type="Embed" ProgID="Visio.Drawing.15" ShapeID="_x0000_i1025" DrawAspect="Content" ObjectID="_1823872292" r:id="rId22"/>
                   </w:object>
                 </w:r>
               </w:p>
@@ -4505,7 +4505,7 @@
             <w:rPr>
               <w:rFonts w:ascii="Source Sans 3" w:hAnsi="Source Sans 3"/>
             </w:rPr>
-            <w:t>Example figure</w:t>
+            <w:t>CM33_ns Flow Diagram</w:t>
           </w:r>
         </w:p>
       </w:sdtContent>
@@ -4607,11 +4607,11 @@
                   <w:pStyle w:val="TableCell-c"/>
                 </w:pPr>
                 <w:r>
-                  <w:object w:dxaOrig="4404" w:dyaOrig="4296" w14:anchorId="7A224DF9">
-                    <v:shape id="_x0000_i1026" type="#_x0000_t75" style="width:116.9pt;height:114.1pt" o:ole="">
+                  <w:object w:dxaOrig="4396" w:dyaOrig="4291" w14:anchorId="7A224DF9">
+                    <v:shape id="_x0000_i1026" type="#_x0000_t75" style="width:116.45pt;height:113.95pt" o:ole="">
                       <v:imagedata r:id="rId23" o:title=""/>
                     </v:shape>
-                    <o:OLEObject Type="Embed" ProgID="Visio.Drawing.15" ShapeID="_x0000_i1026" DrawAspect="Content" ObjectID="_1823712200" r:id="rId24"/>
+                    <o:OLEObject Type="Embed" ProgID="Visio.Drawing.15" ShapeID="_x0000_i1026" DrawAspect="Content" ObjectID="_1823872293" r:id="rId24"/>
                   </w:object>
                 </w:r>
               </w:p>
@@ -4675,7 +4675,7 @@
             <w:rPr>
               <w:rFonts w:ascii="Source Sans 3" w:hAnsi="Source Sans 3"/>
             </w:rPr>
-            <w:t>Example figure</w:t>
+            <w:t>CM55 Flow Diagram</w:t>
           </w:r>
         </w:p>
       </w:sdtContent>
@@ -5385,7 +5385,21 @@
             <w:rPr>
               <w:rFonts w:ascii="Source Sans 3" w:hAnsi="Source Sans 3"/>
             </w:rPr>
-            <w:t>Example figure</w:t>
+            <w:t xml:space="preserve">Launch Eclipse for </w:t>
+          </w:r>
+          <w:proofErr w:type="spellStart"/>
+          <w:r>
+            <w:rPr>
+              <w:rFonts w:ascii="Source Sans 3" w:hAnsi="Source Sans 3"/>
+            </w:rPr>
+            <w:t>ModusToolbox</w:t>
+          </w:r>
+          <w:proofErr w:type="spellEnd"/>
+          <w:r>
+            <w:rPr>
+              <w:rFonts w:ascii="Source Sans 3" w:hAnsi="Source Sans 3"/>
+            </w:rPr>
+            <w:t>™</w:t>
           </w:r>
         </w:p>
       </w:sdtContent>
@@ -5612,7 +5626,7 @@
             <w:rPr>
               <w:rFonts w:ascii="Source Sans 3" w:hAnsi="Source Sans 3"/>
             </w:rPr>
-            <w:t>Example figure</w:t>
+            <w:t>Select workspace directory</w:t>
           </w:r>
         </w:p>
       </w:sdtContent>
@@ -5653,7 +5667,16 @@
           <w:rFonts w:ascii="Source Sans 3" w:hAnsi="Source Sans 3"/>
           <w:lang w:eastAsia="de-DE"/>
         </w:rPr>
-        <w:t xml:space="preserve"> will open a new Modus™ </w:t>
+        <w:t xml:space="preserve"> will open a new </w:t>
+      </w:r>
+      <w:bookmarkStart w:id="128" w:name="_Hlk213256837"/>
+      <w:proofErr w:type="spellStart"/>
+      <w:r>
+        <w:rPr>
+          <w:rFonts w:ascii="Source Sans 3" w:hAnsi="Source Sans 3"/>
+          <w:lang w:eastAsia="de-DE"/>
+        </w:rPr>
+        <w:t>Modus</w:t>
       </w:r>
       <w:r>
         <w:rPr>
@@ -5662,6 +5685,15 @@
         </w:rPr>
         <w:t>Toolbox</w:t>
       </w:r>
+      <w:proofErr w:type="spellEnd"/>
+      <w:r>
+        <w:rPr>
+          <w:rFonts w:ascii="Source Sans 3" w:hAnsi="Source Sans 3"/>
+          <w:lang w:eastAsia="de-DE"/>
+        </w:rPr>
+        <w:t>™</w:t>
+      </w:r>
+      <w:bookmarkEnd w:id="128"/>
       <w:r>
         <w:rPr>
           <w:rFonts w:ascii="Source Sans 3" w:hAnsi="Source Sans 3"/>
@@ -5811,8 +5843,8 @@
               <w:lang w:eastAsia="de-DE"/>
             </w:rPr>
           </w:pPr>
-          <w:bookmarkStart w:id="128" w:name="_mioConsistencyCheck388"/>
-          <w:bookmarkStart w:id="129" w:name="_mioConsistencyCheck45"/>
+          <w:bookmarkStart w:id="129" w:name="_mioConsistencyCheck388"/>
+          <w:bookmarkStart w:id="130" w:name="_mioConsistencyCheck45"/>
           <w:r>
             <w:rPr>
               <w:rFonts w:ascii="Source Sans 3" w:hAnsi="Source Sans 3"/>
@@ -5856,19 +5888,19 @@
             </w:rPr>
             <w:tab/>
           </w:r>
-          <w:bookmarkStart w:id="130" w:name="_mioConsistencyCheck271"/>
+          <w:bookmarkStart w:id="131" w:name="_mioConsistencyCheck271"/>
           <w:r>
             <w:rPr>
               <w:rFonts w:ascii="Source Sans 3" w:hAnsi="Source Sans 3"/>
             </w:rPr>
-            <w:t>Example figure</w:t>
+            <w:t>Initial View of Eclipse workspace</w:t>
           </w:r>
         </w:p>
       </w:sdtContent>
     </w:sdt>
-    <w:bookmarkEnd w:id="128"/>
     <w:bookmarkEnd w:id="129"/>
     <w:bookmarkEnd w:id="130"/>
+    <w:bookmarkEnd w:id="131"/>
     <w:p>
       <w:pPr>
         <w:pStyle w:val="ListParagraph"/>
@@ -6085,8 +6117,8 @@
               <w:lang w:eastAsia="de-DE"/>
             </w:rPr>
           </w:pPr>
-          <w:bookmarkStart w:id="131" w:name="_mioConsistencyCheck389"/>
-          <w:bookmarkStart w:id="132" w:name="_mioConsistencyCheck46"/>
+          <w:bookmarkStart w:id="132" w:name="_mioConsistencyCheck389"/>
+          <w:bookmarkStart w:id="133" w:name="_mioConsistencyCheck46"/>
           <w:r>
             <w:rPr>
               <w:rFonts w:ascii="Source Sans 3" w:hAnsi="Source Sans 3"/>
@@ -6131,19 +6163,19 @@
             </w:rPr>
             <w:tab/>
           </w:r>
-          <w:bookmarkStart w:id="133" w:name="_mioConsistencyCheck272"/>
+          <w:bookmarkStart w:id="134" w:name="_mioConsistencyCheck272"/>
           <w:r>
             <w:rPr>
               <w:rFonts w:ascii="Source Sans 3" w:hAnsi="Source Sans 3"/>
             </w:rPr>
-            <w:t>Example figure</w:t>
+            <w:t>Create a New Application from the Quick Panel Start section</w:t>
           </w:r>
         </w:p>
       </w:sdtContent>
     </w:sdt>
-    <w:bookmarkEnd w:id="131"/>
     <w:bookmarkEnd w:id="132"/>
     <w:bookmarkEnd w:id="133"/>
+    <w:bookmarkEnd w:id="134"/>
     <w:p>
       <w:pPr>
         <w:pStyle w:val="ListParagraph"/>
@@ -6516,8 +6548,8 @@
               <w:lang w:eastAsia="de-DE"/>
             </w:rPr>
           </w:pPr>
-          <w:bookmarkStart w:id="134" w:name="_mioConsistencyCheck390"/>
-          <w:bookmarkStart w:id="135" w:name="_mioConsistencyCheck47"/>
+          <w:bookmarkStart w:id="135" w:name="_mioConsistencyCheck390"/>
+          <w:bookmarkStart w:id="136" w:name="_mioConsistencyCheck47"/>
           <w:r>
             <w:rPr>
               <w:rFonts w:ascii="Source Sans 3" w:hAnsi="Source Sans 3"/>
@@ -6561,19 +6593,19 @@
             </w:rPr>
             <w:tab/>
           </w:r>
-          <w:bookmarkStart w:id="136" w:name="_mioConsistencyCheck273"/>
+          <w:bookmarkStart w:id="137" w:name="_mioConsistencyCheck273"/>
           <w:r>
             <w:rPr>
               <w:rFonts w:ascii="Source Sans 3" w:hAnsi="Source Sans 3"/>
             </w:rPr>
-            <w:t>Example figure</w:t>
+            <w:t>Choose BSP</w:t>
           </w:r>
         </w:p>
       </w:sdtContent>
     </w:sdt>
-    <w:bookmarkEnd w:id="134"/>
     <w:bookmarkEnd w:id="135"/>
     <w:bookmarkEnd w:id="136"/>
+    <w:bookmarkEnd w:id="137"/>
     <w:p>
       <w:pPr>
         <w:pStyle w:val="ListParagraph"/>
@@ -6594,8 +6626,8 @@
         </w:rPr>
         <w:t xml:space="preserve">Clicking Next will take you to the next menu of the Project Creator which will ask you to select an Application. Select the </w:t>
       </w:r>
-      <w:bookmarkStart w:id="137" w:name="_mioConsistencyCheck288"/>
-      <w:bookmarkStart w:id="138" w:name="_mioConsistencyCheck69"/>
+      <w:bookmarkStart w:id="138" w:name="_mioConsistencyCheck288"/>
+      <w:bookmarkStart w:id="139" w:name="_mioConsistencyCheck69"/>
       <w:r>
         <w:rPr>
           <w:rFonts w:ascii="Source Sans 3" w:hAnsi="Source Sans 3"/>
@@ -6623,8 +6655,8 @@
         </w:rPr>
         <w:t>C</w:t>
       </w:r>
-      <w:bookmarkEnd w:id="137"/>
       <w:bookmarkEnd w:id="138"/>
+      <w:bookmarkEnd w:id="139"/>
       <w:r>
         <w:rPr>
           <w:rFonts w:ascii="Source Sans 3" w:hAnsi="Source Sans 3"/>
@@ -6862,8 +6894,8 @@
               <w:lang w:eastAsia="de-DE"/>
             </w:rPr>
           </w:pPr>
-          <w:bookmarkStart w:id="139" w:name="_mioConsistencyCheck391"/>
-          <w:bookmarkStart w:id="140" w:name="_mioConsistencyCheck48"/>
+          <w:bookmarkStart w:id="140" w:name="_mioConsistencyCheck391"/>
+          <w:bookmarkStart w:id="141" w:name="_mioConsistencyCheck48"/>
           <w:r>
             <w:rPr>
               <w:rFonts w:ascii="Source Sans 3" w:hAnsi="Source Sans 3"/>
@@ -6907,19 +6939,19 @@
             </w:rPr>
             <w:tab/>
           </w:r>
-          <w:bookmarkStart w:id="141" w:name="_mioConsistencyCheck274"/>
+          <w:bookmarkStart w:id="142" w:name="_mioConsistencyCheck274"/>
           <w:r>
             <w:rPr>
               <w:rFonts w:ascii="Source Sans 3" w:hAnsi="Source Sans 3"/>
             </w:rPr>
-            <w:t>Example figure</w:t>
+            <w:t>Select Template Application – Getting Started – PSOC Edge Empty Application</w:t>
           </w:r>
         </w:p>
       </w:sdtContent>
     </w:sdt>
-    <w:bookmarkEnd w:id="139"/>
     <w:bookmarkEnd w:id="140"/>
     <w:bookmarkEnd w:id="141"/>
+    <w:bookmarkEnd w:id="142"/>
     <w:p>
       <w:pPr>
         <w:pStyle w:val="ListParagraph"/>
@@ -7105,8 +7137,8 @@
               <w:lang w:eastAsia="de-DE"/>
             </w:rPr>
           </w:pPr>
-          <w:bookmarkStart w:id="142" w:name="_mioConsistencyCheck392"/>
-          <w:bookmarkStart w:id="143" w:name="_mioConsistencyCheck49"/>
+          <w:bookmarkStart w:id="143" w:name="_mioConsistencyCheck392"/>
+          <w:bookmarkStart w:id="144" w:name="_mioConsistencyCheck49"/>
           <w:r>
             <w:rPr>
               <w:rFonts w:ascii="Source Sans 3" w:hAnsi="Source Sans 3"/>
@@ -7150,19 +7182,19 @@
             </w:rPr>
             <w:tab/>
           </w:r>
-          <w:bookmarkStart w:id="144" w:name="_mioConsistencyCheck275"/>
+          <w:bookmarkStart w:id="145" w:name="_mioConsistencyCheck275"/>
           <w:r>
             <w:rPr>
               <w:rFonts w:ascii="Source Sans 3" w:hAnsi="Source Sans 3"/>
             </w:rPr>
-            <w:t>Example figure</w:t>
+            <w:t xml:space="preserve"> Project Explorer View</w:t>
           </w:r>
         </w:p>
       </w:sdtContent>
     </w:sdt>
-    <w:bookmarkEnd w:id="142"/>
     <w:bookmarkEnd w:id="143"/>
     <w:bookmarkEnd w:id="144"/>
+    <w:bookmarkEnd w:id="145"/>
     <w:p>
       <w:pPr>
         <w:pStyle w:val="ListParagraph"/>
@@ -7323,8 +7355,8 @@
               <w:lang w:eastAsia="de-DE"/>
             </w:rPr>
           </w:pPr>
-          <w:bookmarkStart w:id="145" w:name="_mioConsistencyCheck393"/>
-          <w:bookmarkStart w:id="146" w:name="_mioConsistencyCheck50"/>
+          <w:bookmarkStart w:id="146" w:name="_mioConsistencyCheck393"/>
+          <w:bookmarkStart w:id="147" w:name="_mioConsistencyCheck50"/>
           <w:r>
             <w:rPr>
               <w:rFonts w:ascii="Source Sans 3" w:hAnsi="Source Sans 3"/>
@@ -7368,19 +7400,39 @@
             </w:rPr>
             <w:tab/>
           </w:r>
-          <w:bookmarkStart w:id="147" w:name="_mioConsistencyCheck276"/>
+          <w:bookmarkStart w:id="148" w:name="_mioConsistencyCheck276"/>
           <w:r>
             <w:rPr>
               <w:rFonts w:ascii="Source Sans 3" w:hAnsi="Source Sans 3"/>
             </w:rPr>
-            <w:t>Example figure</w:t>
+            <w:t>Project folders of a PSOC Edge Applications</w:t>
+          </w:r>
+          <w:r>
+            <w:rPr>
+              <w:rFonts w:ascii="Source Sans 3" w:hAnsi="Source Sans 3"/>
+            </w:rPr>
+            <w:t xml:space="preserve"> with included </w:t>
+          </w:r>
+          <w:proofErr w:type="spellStart"/>
+          <w:r>
+            <w:rPr>
+              <w:rFonts w:ascii="Source Sans 3" w:hAnsi="Source Sans 3"/>
+            </w:rPr>
+            <w:t>FreeRTOS</w:t>
+          </w:r>
+          <w:proofErr w:type="spellEnd"/>
+          <w:r>
+            <w:rPr>
+              <w:rFonts w:ascii="Source Sans 3" w:hAnsi="Source Sans 3"/>
+            </w:rPr>
+            <w:t xml:space="preserve"> libraries</w:t>
           </w:r>
         </w:p>
       </w:sdtContent>
     </w:sdt>
-    <w:bookmarkEnd w:id="145"/>
     <w:bookmarkEnd w:id="146"/>
     <w:bookmarkEnd w:id="147"/>
+    <w:bookmarkEnd w:id="148"/>
     <w:p>
       <w:pPr>
         <w:pStyle w:val="ListParagraph"/>
@@ -7767,8 +7819,8 @@
               <w:lang w:eastAsia="de-DE"/>
             </w:rPr>
           </w:pPr>
-          <w:bookmarkStart w:id="148" w:name="_mioConsistencyCheck394"/>
-          <w:bookmarkStart w:id="149" w:name="_mioConsistencyCheck51"/>
+          <w:bookmarkStart w:id="149" w:name="_mioConsistencyCheck394"/>
+          <w:bookmarkStart w:id="150" w:name="_mioConsistencyCheck51"/>
           <w:r>
             <w:rPr>
               <w:rFonts w:ascii="Source Sans 3" w:hAnsi="Source Sans 3"/>
@@ -7812,7 +7864,7 @@
             </w:rPr>
             <w:tab/>
           </w:r>
-          <w:bookmarkStart w:id="150" w:name="_mioConsistencyCheck277"/>
+          <w:bookmarkStart w:id="151" w:name="_mioConsistencyCheck277"/>
           <w:r>
             <w:rPr>
               <w:rFonts w:ascii="Source Sans 3" w:hAnsi="Source Sans 3"/>
@@ -7822,9 +7874,9 @@
         </w:p>
       </w:sdtContent>
     </w:sdt>
-    <w:bookmarkEnd w:id="148"/>
     <w:bookmarkEnd w:id="149"/>
     <w:bookmarkEnd w:id="150"/>
+    <w:bookmarkEnd w:id="151"/>
     <w:p>
       <w:pPr>
         <w:pStyle w:val="ListParagraph"/>
@@ -8277,8 +8329,8 @@
               <w:lang w:eastAsia="de-DE"/>
             </w:rPr>
           </w:pPr>
-          <w:bookmarkStart w:id="151" w:name="_mioConsistencyCheck395"/>
-          <w:bookmarkStart w:id="152" w:name="_mioConsistencyCheck52"/>
+          <w:bookmarkStart w:id="152" w:name="_mioConsistencyCheck395"/>
+          <w:bookmarkStart w:id="153" w:name="_mioConsistencyCheck52"/>
           <w:r>
             <w:rPr>
               <w:rFonts w:ascii="Source Sans 3" w:hAnsi="Source Sans 3"/>
@@ -8322,7 +8374,7 @@
             </w:rPr>
             <w:tab/>
           </w:r>
-          <w:bookmarkStart w:id="153" w:name="_mioConsistencyCheck278"/>
+          <w:bookmarkStart w:id="154" w:name="_mioConsistencyCheck278"/>
           <w:r>
             <w:rPr>
               <w:rFonts w:ascii="Source Sans 3" w:hAnsi="Source Sans 3"/>
@@ -8332,9 +8384,9 @@
         </w:p>
       </w:sdtContent>
     </w:sdt>
-    <w:bookmarkEnd w:id="151"/>
     <w:bookmarkEnd w:id="152"/>
     <w:bookmarkEnd w:id="153"/>
+    <w:bookmarkEnd w:id="154"/>
     <w:p>
       <w:pPr>
         <w:pStyle w:val="ListParagraph"/>
@@ -8584,8 +8636,8 @@
               <w:lang w:eastAsia="de-DE"/>
             </w:rPr>
           </w:pPr>
-          <w:bookmarkStart w:id="154" w:name="_mioConsistencyCheck396"/>
-          <w:bookmarkStart w:id="155" w:name="_mioConsistencyCheck53"/>
+          <w:bookmarkStart w:id="155" w:name="_mioConsistencyCheck396"/>
+          <w:bookmarkStart w:id="156" w:name="_mioConsistencyCheck53"/>
           <w:r>
             <w:rPr>
               <w:rFonts w:ascii="Source Sans 3" w:hAnsi="Source Sans 3"/>
@@ -8629,7 +8681,7 @@
             </w:rPr>
             <w:tab/>
           </w:r>
-          <w:bookmarkStart w:id="156" w:name="_mioConsistencyCheck279"/>
+          <w:bookmarkStart w:id="157" w:name="_mioConsistencyCheck279"/>
           <w:r>
             <w:rPr>
               <w:rFonts w:ascii="Source Sans 3" w:hAnsi="Source Sans 3"/>
@@ -8639,9 +8691,9 @@
         </w:p>
       </w:sdtContent>
     </w:sdt>
-    <w:bookmarkEnd w:id="154"/>
     <w:bookmarkEnd w:id="155"/>
     <w:bookmarkEnd w:id="156"/>
+    <w:bookmarkEnd w:id="157"/>
     <w:p>
       <w:pPr>
         <w:pStyle w:val="ListParagraph"/>
@@ -8822,8 +8874,8 @@
               <w:lang w:eastAsia="de-DE"/>
             </w:rPr>
           </w:pPr>
-          <w:bookmarkStart w:id="157" w:name="_mioConsistencyCheck397"/>
-          <w:bookmarkStart w:id="158" w:name="_mioConsistencyCheck54"/>
+          <w:bookmarkStart w:id="158" w:name="_mioConsistencyCheck397"/>
+          <w:bookmarkStart w:id="159" w:name="_mioConsistencyCheck54"/>
           <w:r>
             <w:rPr>
               <w:rFonts w:ascii="Source Sans 3" w:hAnsi="Source Sans 3"/>
@@ -8867,19 +8919,53 @@
             </w:rPr>
             <w:tab/>
           </w:r>
-          <w:bookmarkStart w:id="159" w:name="_mioConsistencyCheck280"/>
+          <w:bookmarkStart w:id="160" w:name="_mioConsistencyCheck280"/>
           <w:r>
             <w:rPr>
               <w:rFonts w:ascii="Source Sans 3" w:hAnsi="Source Sans 3"/>
             </w:rPr>
-            <w:t>Example figure</w:t>
+            <w:t>Library Manager</w:t>
+          </w:r>
+          <w:r>
+            <w:rPr>
+              <w:rFonts w:ascii="Source Sans 3" w:hAnsi="Source Sans 3"/>
+            </w:rPr>
+            <w:t xml:space="preserve"> – Removing </w:t>
+          </w:r>
+          <w:proofErr w:type="spellStart"/>
+          <w:r>
+            <w:rPr>
+              <w:rFonts w:ascii="Source Sans 3" w:hAnsi="Source Sans 3"/>
+            </w:rPr>
+            <w:t>freertos</w:t>
+          </w:r>
+          <w:proofErr w:type="spellEnd"/>
+          <w:r>
+            <w:rPr>
+              <w:rFonts w:ascii="Source Sans 3" w:hAnsi="Source Sans 3"/>
+            </w:rPr>
+            <w:t xml:space="preserve"> and adding retarget-</w:t>
+          </w:r>
+          <w:proofErr w:type="spellStart"/>
+          <w:r>
+            <w:rPr>
+              <w:rFonts w:ascii="Source Sans 3" w:hAnsi="Source Sans 3"/>
+            </w:rPr>
+            <w:t>io</w:t>
+          </w:r>
+          <w:proofErr w:type="spellEnd"/>
+          <w:r>
+            <w:rPr>
+              <w:rFonts w:ascii="Source Sans 3" w:hAnsi="Source Sans 3"/>
+            </w:rPr>
+            <w:t xml:space="preserve"> middleware</w:t>
           </w:r>
         </w:p>
       </w:sdtContent>
     </w:sdt>
-    <w:bookmarkEnd w:id="157"/>
     <w:bookmarkEnd w:id="158"/>
     <w:bookmarkEnd w:id="159"/>
+    <w:bookmarkEnd w:id="160"/>
     <w:p>
       <w:pPr>
         <w:pStyle w:val="ListParagraph"/>
@@ -9276,8 +9362,8 @@
               <w:lang w:eastAsia="de-DE"/>
             </w:rPr>
           </w:pPr>
-          <w:bookmarkStart w:id="160" w:name="_mioConsistencyCheck398"/>
-          <w:bookmarkStart w:id="161" w:name="_mioConsistencyCheck55"/>
+          <w:bookmarkStart w:id="161" w:name="_mioConsistencyCheck398"/>
+          <w:bookmarkStart w:id="162" w:name="_mioConsistencyCheck55"/>
           <w:r>
             <w:rPr>
               <w:rFonts w:ascii="Source Sans 3" w:hAnsi="Source Sans 3"/>
@@ -9321,19 +9407,19 @@
             </w:rPr>
             <w:tab/>
           </w:r>
-          <w:bookmarkStart w:id="162" w:name="_mioConsistencyCheck281"/>
+          <w:bookmarkStart w:id="163" w:name="_mioConsistencyCheck281"/>
           <w:r>
             <w:rPr>
               <w:rFonts w:ascii="Source Sans 3" w:hAnsi="Source Sans 3"/>
             </w:rPr>
-            <w:t>Example figure</w:t>
+            <w:t>Selecting Device Configurator from Quick Panel – BSP Configurators</w:t>
           </w:r>
         </w:p>
       </w:sdtContent>
     </w:sdt>
-    <w:bookmarkEnd w:id="160"/>
     <w:bookmarkEnd w:id="161"/>
     <w:bookmarkEnd w:id="162"/>
+    <w:bookmarkEnd w:id="163"/>
     <w:p>
       <w:pPr>
         <w:pStyle w:val="ListParagraph"/>
@@ -9498,8 +9584,8 @@
               <w:lang w:eastAsia="de-DE"/>
             </w:rPr>
           </w:pPr>
-          <w:bookmarkStart w:id="163" w:name="_mioConsistencyCheck399"/>
-          <w:bookmarkStart w:id="164" w:name="_mioConsistencyCheck56"/>
+          <w:bookmarkStart w:id="164" w:name="_mioConsistencyCheck399"/>
+          <w:bookmarkStart w:id="165" w:name="_mioConsistencyCheck56"/>
           <w:r>
             <w:rPr>
               <w:rFonts w:ascii="Source Sans 3" w:hAnsi="Source Sans 3"/>
@@ -9543,19 +9629,19 @@
             </w:rPr>
             <w:tab/>
           </w:r>
-          <w:bookmarkStart w:id="165" w:name="_mioConsistencyCheck282"/>
+          <w:bookmarkStart w:id="166" w:name="_mioConsistencyCheck282"/>
           <w:r>
             <w:rPr>
               <w:rFonts w:ascii="Source Sans 3" w:hAnsi="Source Sans 3"/>
             </w:rPr>
-            <w:t>Example figure</w:t>
+            <w:t xml:space="preserve"> Device Configurator - Pins</w:t>
           </w:r>
         </w:p>
       </w:sdtContent>
     </w:sdt>
-    <w:bookmarkEnd w:id="163"/>
     <w:bookmarkEnd w:id="164"/>
     <w:bookmarkEnd w:id="165"/>
+    <w:bookmarkEnd w:id="166"/>
     <w:p>
       <w:pPr>
         <w:pStyle w:val="ListParagraph"/>
@@ -9742,8 +9828,8 @@
               <w:rFonts w:ascii="Source Sans 3" w:hAnsi="Source Sans 3"/>
             </w:rPr>
           </w:pPr>
-          <w:bookmarkStart w:id="166" w:name="_mioConsistencyCheck400"/>
-          <w:bookmarkStart w:id="167" w:name="_mioConsistencyCheck57"/>
+          <w:bookmarkStart w:id="167" w:name="_mioConsistencyCheck400"/>
+          <w:bookmarkStart w:id="168" w:name="_mioConsistencyCheck57"/>
           <w:r>
             <w:rPr>
               <w:rFonts w:ascii="Source Sans 3" w:hAnsi="Source Sans 3"/>
@@ -9787,19 +9873,33 @@
             </w:rPr>
             <w:tab/>
           </w:r>
-          <w:bookmarkStart w:id="168" w:name="_mioConsistencyCheck283"/>
+          <w:bookmarkStart w:id="169" w:name="_mioConsistencyCheck283"/>
           <w:r>
             <w:rPr>
               <w:rFonts w:ascii="Source Sans 3" w:hAnsi="Source Sans 3"/>
             </w:rPr>
-            <w:t>Example figure</w:t>
+            <w:t xml:space="preserve"> Schematic View of PSE84 </w:t>
+          </w:r>
+          <w:proofErr w:type="spellStart"/>
+          <w:r>
+            <w:rPr>
+              <w:rFonts w:ascii="Source Sans 3" w:hAnsi="Source Sans 3"/>
+            </w:rPr>
+            <w:t>USER_LEDx</w:t>
+          </w:r>
+          <w:proofErr w:type="spellEnd"/>
+          <w:r>
+            <w:rPr>
+              <w:rFonts w:ascii="Source Sans 3" w:hAnsi="Source Sans 3"/>
+            </w:rPr>
+            <w:t xml:space="preserve"> Port connections</w:t>
           </w:r>
         </w:p>
       </w:sdtContent>
     </w:sdt>
-    <w:bookmarkEnd w:id="166"/>
     <w:bookmarkEnd w:id="167"/>
     <w:bookmarkEnd w:id="168"/>
+    <w:bookmarkEnd w:id="169"/>
     <w:p>
       <w:pPr>
         <w:pStyle w:val="ListParagraph"/>
@@ -9943,8 +10043,8 @@
               <w:lang w:eastAsia="de-DE"/>
             </w:rPr>
           </w:pPr>
-          <w:bookmarkStart w:id="169" w:name="_mioConsistencyCheck401"/>
-          <w:bookmarkStart w:id="170" w:name="_mioConsistencyCheck58"/>
+          <w:bookmarkStart w:id="170" w:name="_mioConsistencyCheck401"/>
+          <w:bookmarkStart w:id="171" w:name="_mioConsistencyCheck58"/>
           <w:r>
             <w:rPr>
               <w:rFonts w:ascii="Source Sans 3" w:hAnsi="Source Sans 3"/>
@@ -9988,12 +10088,26 @@
             </w:rPr>
             <w:tab/>
           </w:r>
-          <w:bookmarkStart w:id="171" w:name="_mioConsistencyCheck284"/>
+          <w:bookmarkStart w:id="172" w:name="_mioConsistencyCheck284"/>
           <w:r>
             <w:rPr>
               <w:rFonts w:ascii="Source Sans 3" w:hAnsi="Source Sans 3"/>
             </w:rPr>
-            <w:t>Example figure</w:t>
+            <w:t xml:space="preserve">Device Configurator – Pins – Port16 Resource – </w:t>
+          </w:r>
+          <w:proofErr w:type="spellStart"/>
+          <w:r>
+            <w:rPr>
+              <w:rFonts w:ascii="Source Sans 3" w:hAnsi="Source Sans 3"/>
+            </w:rPr>
+            <w:t>CYBSP_USER_LEDx</w:t>
+          </w:r>
+          <w:proofErr w:type="spellEnd"/>
+          <w:r>
+            <w:rPr>
+              <w:rFonts w:ascii="Source Sans 3" w:hAnsi="Source Sans 3"/>
+            </w:rPr>
+            <w:t xml:space="preserve"> Aliases</w:t>
           </w:r>
         </w:p>
       </w:sdtContent>
@@ -10004,11 +10118,11 @@
         <w:spacing w:before="160" w:after="160"/>
         <w:ind w:left="1778"/>
       </w:pPr>
-      <w:bookmarkStart w:id="172" w:name="_mioConsistencyCheck295"/>
-      <w:bookmarkStart w:id="173" w:name="_mioConsistencyCheck75"/>
-      <w:bookmarkEnd w:id="169"/>
+      <w:bookmarkStart w:id="173" w:name="_mioConsistencyCheck295"/>
+      <w:bookmarkStart w:id="174" w:name="_mioConsistencyCheck75"/>
       <w:bookmarkEnd w:id="170"/>
       <w:bookmarkEnd w:id="171"/>
+      <w:bookmarkEnd w:id="172"/>
     </w:p>
     <w:p>
       <w:pPr>
@@ -10058,8 +10172,8 @@
         </w:rPr>
       </w:pPr>
     </w:p>
-    <w:bookmarkEnd w:id="172"/>
     <w:bookmarkEnd w:id="173"/>
+    <w:bookmarkEnd w:id="174"/>
     <w:p>
       <w:pPr>
         <w:pStyle w:val="ListParagraph"/>
@@ -10392,9 +10506,9 @@
               <w:lang w:eastAsia="de-DE"/>
             </w:rPr>
           </w:pPr>
-          <w:bookmarkStart w:id="174" w:name="_mioConsistencyCheck402"/>
-          <w:bookmarkStart w:id="175" w:name="_mioConsistencyCheck59"/>
-          <w:bookmarkStart w:id="176" w:name="_Ref212806488"/>
+          <w:bookmarkStart w:id="175" w:name="_mioConsistencyCheck402"/>
+          <w:bookmarkStart w:id="176" w:name="_mioConsistencyCheck59"/>
+          <w:bookmarkStart w:id="177" w:name="_Ref212806488"/>
           <w:r>
             <w:rPr>
               <w:rFonts w:ascii="Source Sans 3" w:hAnsi="Source Sans 3"/>
@@ -10441,9 +10555,9 @@
         </w:p>
       </w:sdtContent>
     </w:sdt>
-    <w:bookmarkEnd w:id="176" w:displacedByCustomXml="prev"/>
-    <w:bookmarkEnd w:id="174"/>
+    <w:bookmarkEnd w:id="177" w:displacedByCustomXml="prev"/>
     <w:bookmarkEnd w:id="175"/>
+    <w:bookmarkEnd w:id="176"/>
     <w:p>
       <w:pPr>
         <w:spacing w:before="160" w:after="160"/>
@@ -10763,8 +10877,8 @@
               <w:lang w:eastAsia="de-DE"/>
             </w:rPr>
           </w:pPr>
-          <w:bookmarkStart w:id="177" w:name="_mioConsistencyCheck403"/>
-          <w:bookmarkStart w:id="178" w:name="_mioConsistencyCheck60"/>
+          <w:bookmarkStart w:id="178" w:name="_mioConsistencyCheck403"/>
+          <w:bookmarkStart w:id="179" w:name="_mioConsistencyCheck60"/>
           <w:r>
             <w:rPr>
               <w:rFonts w:ascii="Source Sans 3" w:hAnsi="Source Sans 3"/>
@@ -10808,7 +10922,7 @@
             </w:rPr>
             <w:tab/>
           </w:r>
-          <w:bookmarkStart w:id="179" w:name="_mioConsistencyCheck285"/>
+          <w:bookmarkStart w:id="180" w:name="_mioConsistencyCheck285"/>
           <w:r>
             <w:rPr>
               <w:rFonts w:ascii="Source Sans 3" w:hAnsi="Source Sans 3"/>
@@ -10818,9 +10932,9 @@
         </w:p>
       </w:sdtContent>
     </w:sdt>
-    <w:bookmarkEnd w:id="177"/>
     <w:bookmarkEnd w:id="178"/>
     <w:bookmarkEnd w:id="179"/>
+    <w:bookmarkEnd w:id="180"/>
     <w:p>
       <w:pPr>
         <w:pStyle w:val="ListParagraph"/>
@@ -10944,8 +11058,8 @@
               <w:lang w:eastAsia="de-DE"/>
             </w:rPr>
           </w:pPr>
-          <w:bookmarkStart w:id="180" w:name="_mioConsistencyCheck404"/>
-          <w:bookmarkStart w:id="181" w:name="_mioConsistencyCheck61"/>
+          <w:bookmarkStart w:id="181" w:name="_mioConsistencyCheck404"/>
+          <w:bookmarkStart w:id="182" w:name="_mioConsistencyCheck61"/>
           <w:r>
             <w:rPr>
               <w:rFonts w:ascii="Source Sans 3" w:hAnsi="Source Sans 3"/>
@@ -10989,7 +11103,7 @@
             </w:rPr>
             <w:tab/>
           </w:r>
-          <w:bookmarkStart w:id="182" w:name="_mioConsistencyCheck286"/>
+          <w:bookmarkStart w:id="183" w:name="_mioConsistencyCheck286"/>
           <w:r>
             <w:rPr>
               <w:rFonts w:ascii="Source Sans 3" w:hAnsi="Source Sans 3"/>
@@ -10999,9 +11113,9 @@
         </w:p>
       </w:sdtContent>
     </w:sdt>
-    <w:bookmarkEnd w:id="180"/>
     <w:bookmarkEnd w:id="181"/>
     <w:bookmarkEnd w:id="182"/>
+    <w:bookmarkEnd w:id="183"/>
     <w:p>
       <w:pPr>
         <w:pStyle w:val="ListParagraph"/>
@@ -11071,15 +11185,7 @@
           <w:rFonts w:ascii="Source Sans 3" w:hAnsi="Source Sans 3"/>
           <w:lang w:eastAsia="de-DE"/>
         </w:rPr>
-        <w:t xml:space="preserve"> we will be using these during application </w:t>
-      </w:r>
-      <w:proofErr w:type="gramStart"/>
-      <w:r>
-        <w:rPr>
-          <w:rFonts w:ascii="Source Sans 3" w:hAnsi="Source Sans 3"/>
-          <w:lang w:eastAsia="de-DE"/>
-        </w:rPr>
-        <w:t xml:space="preserve">development </w:t>
+        <w:t xml:space="preserve"> we will be using these during application development</w:t>
       </w:r>
       <w:r>
         <w:rPr>
@@ -11088,7 +11194,6 @@
         </w:rPr>
         <w:t>.</w:t>
       </w:r>
-      <w:proofErr w:type="gramEnd"/>
     </w:p>
     <w:p>
       <w:pPr>
@@ -11326,6 +11431,8 @@
       <w:r>
         <w:rPr>
           <w:rFonts w:ascii="Source Sans 3" w:hAnsi="Source Sans 3"/>
+          <w:b/>
+          <w:i/>
           <w:lang w:eastAsia="de-DE"/>
         </w:rPr>
         <w:t>GenerateSouce</w:t>
@@ -11504,8 +11611,8 @@
               <w:lang w:eastAsia="de-DE"/>
             </w:rPr>
           </w:pPr>
-          <w:bookmarkStart w:id="183" w:name="_mioConsistencyCheck405"/>
-          <w:bookmarkStart w:id="184" w:name="_mioConsistencyCheck62"/>
+          <w:bookmarkStart w:id="184" w:name="_mioConsistencyCheck405"/>
+          <w:bookmarkStart w:id="185" w:name="_mioConsistencyCheck62"/>
           <w:r>
             <w:rPr>
               <w:rFonts w:ascii="Source Sans 3" w:hAnsi="Source Sans 3"/>
@@ -11590,10 +11697,10 @@
           </w:r>
           <w:proofErr w:type="spellEnd"/>
         </w:p>
-        <w:bookmarkEnd w:id="184" w:displacedByCustomXml="next"/>
+        <w:bookmarkEnd w:id="185" w:displacedByCustomXml="next"/>
       </w:sdtContent>
     </w:sdt>
-    <w:bookmarkEnd w:id="183"/>
+    <w:bookmarkEnd w:id="184"/>
     <w:p>
       <w:pPr>
         <w:pStyle w:val="ListParagraph"/>
@@ -11702,8 +11809,8 @@
               <w:lang w:eastAsia="de-DE"/>
             </w:rPr>
           </w:pPr>
-          <w:bookmarkStart w:id="185" w:name="_mioConsistencyCheck406"/>
-          <w:bookmarkStart w:id="186" w:name="_mioConsistencyCheck63"/>
+          <w:bookmarkStart w:id="186" w:name="_mioConsistencyCheck406"/>
+          <w:bookmarkStart w:id="187" w:name="_mioConsistencyCheck63"/>
           <w:r>
             <w:rPr>
               <w:rFonts w:ascii="Source Sans 3" w:hAnsi="Source Sans 3"/>
@@ -11770,10 +11877,10 @@
           </w:r>
           <w:proofErr w:type="spellEnd"/>
         </w:p>
-        <w:bookmarkEnd w:id="186" w:displacedByCustomXml="next"/>
+        <w:bookmarkEnd w:id="187" w:displacedByCustomXml="next"/>
       </w:sdtContent>
     </w:sdt>
-    <w:bookmarkEnd w:id="185"/>
+    <w:bookmarkEnd w:id="186"/>
     <w:p>
       <w:pPr>
         <w:spacing w:before="160" w:after="160"/>
@@ -12078,16 +12185,40 @@
       <w:r>
         <w:rPr>
           <w:rFonts w:ascii="Source Sans 3" w:hAnsi="Source Sans 3"/>
-          <w:lang w:eastAsia="de-DE"/>
-        </w:rPr>
-        <w:t xml:space="preserve">main_cm33.c and </w:t>
-      </w:r>
-      <w:r>
-        <w:rPr>
-          <w:rFonts w:ascii="Source Sans 3" w:hAnsi="Source Sans 3"/>
           <w:b/>
           <w:lang w:eastAsia="de-DE"/>
         </w:rPr>
+        <w:t>main_cm33</w:t>
+      </w:r>
+      <w:r>
+        <w:rPr>
+          <w:rFonts w:ascii="Source Sans 3" w:hAnsi="Source Sans 3"/>
+          <w:b/>
+          <w:lang w:eastAsia="de-DE"/>
+        </w:rPr>
+        <w:t>_ns</w:t>
+      </w:r>
+      <w:r>
+        <w:rPr>
+          <w:rFonts w:ascii="Source Sans 3" w:hAnsi="Source Sans 3"/>
+          <w:b/>
+          <w:lang w:eastAsia="de-DE"/>
+        </w:rPr>
+        <w:t>.c</w:t>
+      </w:r>
+      <w:r>
+        <w:rPr>
+          <w:rFonts w:ascii="Source Sans 3" w:hAnsi="Source Sans 3"/>
+          <w:lang w:eastAsia="de-DE"/>
+        </w:rPr>
+        <w:t xml:space="preserve"> and </w:t>
+      </w:r>
+      <w:r>
+        <w:rPr>
+          <w:rFonts w:ascii="Source Sans 3" w:hAnsi="Source Sans 3"/>
+          <w:b/>
+          <w:lang w:eastAsia="de-DE"/>
+        </w:rPr>
         <w:t>paste</w:t>
       </w:r>
       <w:r>
@@ -12095,7 +12226,21 @@
           <w:rFonts w:ascii="Source Sans 3" w:hAnsi="Source Sans 3"/>
           <w:lang w:eastAsia="de-DE"/>
         </w:rPr>
-        <w:t xml:space="preserve"> on to PS</w:t>
+        <w:t xml:space="preserve"> </w:t>
+      </w:r>
+      <w:r>
+        <w:rPr>
+          <w:rFonts w:ascii="Source Sans 3" w:hAnsi="Source Sans 3"/>
+          <w:lang w:eastAsia="de-DE"/>
+        </w:rPr>
+        <w:t>in</w:t>
+      </w:r>
+      <w:r>
+        <w:rPr>
+          <w:rFonts w:ascii="Source Sans 3" w:hAnsi="Source Sans 3"/>
+          <w:lang w:eastAsia="de-DE"/>
+        </w:rPr>
+        <w:t>to PS</w:t>
       </w:r>
       <w:r>
         <w:rPr>
@@ -12109,7 +12254,23 @@
           <w:rFonts w:ascii="Source Sans 3" w:hAnsi="Source Sans 3"/>
           <w:lang w:eastAsia="de-DE"/>
         </w:rPr>
-        <w:t xml:space="preserve">C_Edge_Hello_World.proj_cm33_ns main.c </w:t>
+        <w:t xml:space="preserve">C_Edge_Hello_World.proj_cm33_ns </w:t>
+      </w:r>
+      <w:proofErr w:type="spellStart"/>
+      <w:r>
+        <w:rPr>
+          <w:rFonts w:ascii="Source Sans 3" w:hAnsi="Source Sans 3"/>
+          <w:lang w:eastAsia="de-DE"/>
+        </w:rPr>
+        <w:t>main.c</w:t>
+      </w:r>
+      <w:proofErr w:type="spellEnd"/>
+      <w:r>
+        <w:rPr>
+          <w:rFonts w:ascii="Source Sans 3" w:hAnsi="Source Sans 3"/>
+          <w:lang w:eastAsia="de-DE"/>
+        </w:rPr>
+        <w:t xml:space="preserve"> </w:t>
       </w:r>
     </w:p>
     <w:p>
@@ -12173,9 +12334,17 @@
       <w:r>
         <w:rPr>
           <w:rFonts w:ascii="Source Sans 3" w:hAnsi="Source Sans 3"/>
-          <w:lang w:eastAsia="de-DE"/>
-        </w:rPr>
-        <w:t xml:space="preserve">main_cm55.c and </w:t>
+          <w:b/>
+          <w:lang w:eastAsia="de-DE"/>
+        </w:rPr>
+        <w:t>main_cm55.c</w:t>
+      </w:r>
+      <w:r>
+        <w:rPr>
+          <w:rFonts w:ascii="Source Sans 3" w:hAnsi="Source Sans 3"/>
+          <w:lang w:eastAsia="de-DE"/>
+        </w:rPr>
+        <w:t xml:space="preserve"> and </w:t>
       </w:r>
       <w:r>
         <w:rPr>
@@ -12216,8 +12385,8 @@
           <w:lang w:eastAsia="de-DE"/>
         </w:rPr>
       </w:pPr>
-      <w:bookmarkStart w:id="187" w:name="_mioConsistencyCheck296"/>
-      <w:bookmarkStart w:id="188" w:name="_mioConsistencyCheck76"/>
+      <w:bookmarkStart w:id="188" w:name="_mioConsistencyCheck296"/>
+      <w:bookmarkStart w:id="189" w:name="_mioConsistencyCheck76"/>
     </w:p>
     <w:p>
       <w:pPr>
@@ -12229,81 +12398,155 @@
           <w:lang w:eastAsia="de-DE"/>
         </w:rPr>
       </w:pPr>
-      <w:r>
-        <w:rPr>
-          <w:noProof/>
-          <w:lang w:eastAsia="de-DE"/>
-        </w:rPr>
-        <w:drawing>
-          <wp:inline distT="0" distB="0" distL="0" distR="0" wp14:anchorId="6A2FBD1E" wp14:editId="447714FE">
-            <wp:extent cx="2506453" cy="2476011"/>
-            <wp:effectExtent l="19050" t="19050" r="27305" b="19685"/>
-            <wp:docPr id="2007675759" name="Picture 21"/>
-            <wp:cNvGraphicFramePr>
-              <a:graphicFrameLocks xmlns:a="http://schemas.openxmlformats.org/drawingml/2006/main" noChangeAspect="1"/>
-            </wp:cNvGraphicFramePr>
-            <a:graphic xmlns:a="http://schemas.openxmlformats.org/drawingml/2006/main">
-              <a:graphicData uri="http://schemas.openxmlformats.org/drawingml/2006/picture">
-                <pic:pic xmlns:pic="http://schemas.openxmlformats.org/drawingml/2006/picture">
-                  <pic:nvPicPr>
-                    <pic:cNvPr id="2007675759" name="Picture 21"/>
-                    <pic:cNvPicPr/>
-                  </pic:nvPicPr>
-                  <pic:blipFill>
-                    <a:blip r:embed="rId47">
-                      <a:extLst>
-                        <a:ext uri="{28A0092B-C50C-407E-A947-70E740481C1C}">
-                          <a14:useLocalDpi xmlns:a14="http://schemas.microsoft.com/office/drawing/2010/main" val="0"/>
-                        </a:ext>
-                      </a:extLst>
-                    </a:blip>
-                    <a:stretch>
-                      <a:fillRect/>
-                    </a:stretch>
-                  </pic:blipFill>
-                  <pic:spPr>
-                    <a:xfrm>
-                      <a:off x="0" y="0"/>
-                      <a:ext cx="2506453" cy="2476011"/>
-                    </a:xfrm>
-                    <a:prstGeom prst="rect">
-                      <a:avLst/>
-                    </a:prstGeom>
-                    <a:ln>
-                      <a:solidFill>
-                        <a:schemeClr val="tx1"/>
-                      </a:solidFill>
-                    </a:ln>
-                  </pic:spPr>
-                </pic:pic>
-              </a:graphicData>
-            </a:graphic>
-          </wp:inline>
-        </w:drawing>
-      </w:r>
-    </w:p>
-    <w:p>
-      <w:pPr>
-        <w:pStyle w:val="ListParagraph"/>
+    </w:p>
+    <w:p>
+      <w:pPr>
         <w:spacing w:before="160" w:after="160"/>
-        <w:ind w:left="1778"/>
-        <w:rPr>
-          <w:lang w:eastAsia="de-DE"/>
-        </w:rPr>
-      </w:pPr>
-    </w:p>
-    <w:p>
-      <w:pPr>
-        <w:pStyle w:val="ListParagraph"/>
-        <w:spacing w:before="160" w:after="160"/>
-        <w:ind w:left="1778"/>
-        <w:rPr>
-          <w:lang w:eastAsia="de-DE"/>
-        </w:rPr>
-      </w:pPr>
-    </w:p>
-    <w:bookmarkEnd w:id="187"/>
+        <w:rPr>
+          <w:lang w:eastAsia="de-DE"/>
+        </w:rPr>
+      </w:pPr>
+    </w:p>
+    <w:sdt>
+      <w:sdtPr>
+        <w:alias w:val="mioTextBlock"/>
+        <w:tag w:val="78b63267-9661-4a5d-b21f-2cfaaeca01d6"/>
+        <w:id w:val="958448461"/>
+        <w:placeholder>
+          <w:docPart w:val="DefaultPlaceholder_-1854013440"/>
+        </w:placeholder>
+        <w15:appearance w15:val="hidden"/>
+      </w:sdtPr>
+      <w:sdtEndPr>
+        <w:rPr>
+          <w:b/>
+        </w:rPr>
+      </w:sdtEndPr>
+      <w:sdtContent>
+        <w:tbl>
+          <w:tblPr>
+            <w:tblStyle w:val="InfineonPicture"/>
+            <w:tblW w:w="5000" w:type="pct"/>
+            <w:tblCellMar>
+              <w:left w:w="0" w:type="dxa"/>
+              <w:right w:w="0" w:type="dxa"/>
+            </w:tblCellMar>
+            <w:tblLook w:val="05E0" w:firstRow="1" w:lastRow="1" w:firstColumn="1" w:lastColumn="1" w:noHBand="0" w:noVBand="1"/>
+          </w:tblPr>
+          <w:tblGrid>
+            <w:gridCol w:w="10763"/>
+          </w:tblGrid>
+          <w:tr>
+            <w:tc>
+              <w:tcPr>
+                <w:tcW w:w="5000" w:type="pct"/>
+              </w:tcPr>
+              <w:p>
+                <w:pPr>
+                  <w:pStyle w:val="TableCell-c"/>
+                </w:pPr>
+                <w:r>
+                  <w:rPr>
+                    <w:noProof/>
+                  </w:rPr>
+                  <w:drawing>
+                    <wp:inline distT="0" distB="0" distL="0" distR="0" wp14:anchorId="59CAF50B" wp14:editId="5A278FBF">
+                      <wp:extent cx="2506453" cy="2476011"/>
+                      <wp:effectExtent l="19050" t="19050" r="27305" b="19685"/>
+                      <wp:docPr id="2007675759" name="Picture 21"/>
+                      <wp:cNvGraphicFramePr>
+                        <a:graphicFrameLocks xmlns:a="http://schemas.openxmlformats.org/drawingml/2006/main" noChangeAspect="1"/>
+                      </wp:cNvGraphicFramePr>
+                      <a:graphic xmlns:a="http://schemas.openxmlformats.org/drawingml/2006/main">
+                        <a:graphicData uri="http://schemas.openxmlformats.org/drawingml/2006/picture">
+                          <pic:pic xmlns:pic="http://schemas.openxmlformats.org/drawingml/2006/picture">
+                            <pic:nvPicPr>
+                              <pic:cNvPr id="2007675759" name="Picture 21"/>
+                              <pic:cNvPicPr/>
+                            </pic:nvPicPr>
+                            <pic:blipFill>
+                              <a:blip r:embed="rId47">
+                                <a:extLst>
+                                  <a:ext uri="{28A0092B-C50C-407E-A947-70E740481C1C}">
+                                    <a14:useLocalDpi xmlns:a14="http://schemas.microsoft.com/office/drawing/2010/main" val="0"/>
+                                  </a:ext>
+                                </a:extLst>
+                              </a:blip>
+                              <a:stretch>
+                                <a:fillRect/>
+                              </a:stretch>
+                            </pic:blipFill>
+                            <pic:spPr>
+                              <a:xfrm>
+                                <a:off x="0" y="0"/>
+                                <a:ext cx="2506453" cy="2476011"/>
+                              </a:xfrm>
+                              <a:prstGeom prst="rect">
+                                <a:avLst/>
+                              </a:prstGeom>
+                              <a:ln>
+                                <a:solidFill>
+                                  <a:schemeClr val="tx1"/>
+                                </a:solidFill>
+                              </a:ln>
+                            </pic:spPr>
+                          </pic:pic>
+                        </a:graphicData>
+                      </a:graphic>
+                    </wp:inline>
+                  </w:drawing>
+                </w:r>
+              </w:p>
+            </w:tc>
+          </w:tr>
+        </w:tbl>
+        <w:p>
+          <w:pPr>
+            <w:pStyle w:val="Figuretitlenew"/>
+            <w:rPr>
+              <w:lang w:eastAsia="de-DE"/>
+            </w:rPr>
+          </w:pPr>
+          <w:r>
+            <w:t xml:space="preserve">Figure </w:t>
+          </w:r>
+          <w:r>
+            <w:fldChar w:fldCharType="begin"/>
+          </w:r>
+          <w:r>
+            <w:instrText xml:space="preserve"> SEQ Figure \* ARABIC </w:instrText>
+          </w:r>
+          <w:r>
+            <w:fldChar w:fldCharType="separate"/>
+          </w:r>
+          <w:r>
+            <w:rPr>
+              <w:noProof/>
+            </w:rPr>
+            <w:t>25</w:t>
+          </w:r>
+          <w:r>
+            <w:fldChar w:fldCharType="end"/>
+          </w:r>
+          <w:r>
+            <w:tab/>
+          </w:r>
+          <w:r>
+            <w:t xml:space="preserve">cm33_ns </w:t>
+          </w:r>
+          <w:proofErr w:type="spellStart"/>
+          <w:r>
+            <w:t>main.c</w:t>
+          </w:r>
+          <w:proofErr w:type="spellEnd"/>
+          <w:r>
+            <w:t xml:space="preserve"> file location</w:t>
+          </w:r>
+        </w:p>
+      </w:sdtContent>
+    </w:sdt>
     <w:bookmarkEnd w:id="188"/>
+    <w:bookmarkEnd w:id="189"/>
     <w:p>
       <w:pPr>
         <w:pStyle w:val="ListParagraph"/>
@@ -12321,6 +12564,7 @@
           <w:rFonts w:ascii="Source Sans 3" w:hAnsi="Source Sans 3"/>
           <w:lang w:eastAsia="de-DE"/>
         </w:rPr>
+        <w:lastRenderedPageBreak/>
         <w:t>Remove “</w:t>
       </w:r>
       <w:r>
@@ -12385,62 +12629,6 @@
           <w:lang w:eastAsia="de-DE"/>
         </w:rPr>
       </w:pPr>
-      <w:r>
-        <w:rPr>
-          <w:noProof/>
-          <w:lang w:eastAsia="de-DE"/>
-        </w:rPr>
-        <w:lastRenderedPageBreak/>
-        <w:drawing>
-          <wp:inline distT="0" distB="0" distL="0" distR="0" wp14:anchorId="2F793E4C" wp14:editId="455E5ACD">
-            <wp:extent cx="4157980" cy="2095995"/>
-            <wp:effectExtent l="19050" t="19050" r="13970" b="19050"/>
-            <wp:docPr id="37" name="Picture 37"/>
-            <wp:cNvGraphicFramePr>
-              <a:graphicFrameLocks xmlns:a="http://schemas.openxmlformats.org/drawingml/2006/main" noChangeAspect="1"/>
-            </wp:cNvGraphicFramePr>
-            <a:graphic xmlns:a="http://schemas.openxmlformats.org/drawingml/2006/main">
-              <a:graphicData uri="http://schemas.openxmlformats.org/drawingml/2006/picture">
-                <pic:pic xmlns:pic="http://schemas.openxmlformats.org/drawingml/2006/picture">
-                  <pic:nvPicPr>
-                    <pic:cNvPr id="37" name="Picture 37"/>
-                    <pic:cNvPicPr>
-                      <a:picLocks noChangeAspect="1" noChangeArrowheads="1"/>
-                    </pic:cNvPicPr>
-                  </pic:nvPicPr>
-                  <pic:blipFill>
-                    <a:blip r:embed="rId48" cstate="print">
-                      <a:extLst>
-                        <a:ext uri="{28A0092B-C50C-407E-A947-70E740481C1C}">
-                          <a14:useLocalDpi xmlns:a14="http://schemas.microsoft.com/office/drawing/2010/main" val="0"/>
-                        </a:ext>
-                      </a:extLst>
-                    </a:blip>
-                    <a:stretch>
-                      <a:fillRect/>
-                    </a:stretch>
-                  </pic:blipFill>
-                  <pic:spPr bwMode="auto">
-                    <a:xfrm>
-                      <a:off x="0" y="0"/>
-                      <a:ext cx="4165441" cy="2099756"/>
-                    </a:xfrm>
-                    <a:prstGeom prst="rect">
-                      <a:avLst/>
-                    </a:prstGeom>
-                    <a:noFill/>
-                    <a:ln>
-                      <a:solidFill>
-                        <a:schemeClr val="tx1"/>
-                      </a:solidFill>
-                    </a:ln>
-                  </pic:spPr>
-                </pic:pic>
-              </a:graphicData>
-            </a:graphic>
-          </wp:inline>
-        </w:drawing>
-      </w:r>
     </w:p>
     <w:p>
       <w:pPr>
@@ -12451,62 +12639,199 @@
           <w:lang w:eastAsia="de-DE"/>
         </w:rPr>
       </w:pPr>
-      <w:r>
-        <w:rPr>
-          <w:noProof/>
-          <w:lang w:eastAsia="de-DE"/>
-        </w:rPr>
-        <w:drawing>
-          <wp:inline distT="0" distB="0" distL="0" distR="0" wp14:anchorId="2E64A76D" wp14:editId="6985997E">
-            <wp:extent cx="4158336" cy="2049138"/>
-            <wp:effectExtent l="19050" t="19050" r="13970" b="27940"/>
-            <wp:docPr id="38" name="Picture 38"/>
-            <wp:cNvGraphicFramePr>
-              <a:graphicFrameLocks xmlns:a="http://schemas.openxmlformats.org/drawingml/2006/main" noChangeAspect="1"/>
-            </wp:cNvGraphicFramePr>
-            <a:graphic xmlns:a="http://schemas.openxmlformats.org/drawingml/2006/main">
-              <a:graphicData uri="http://schemas.openxmlformats.org/drawingml/2006/picture">
-                <pic:pic xmlns:pic="http://schemas.openxmlformats.org/drawingml/2006/picture">
-                  <pic:nvPicPr>
-                    <pic:cNvPr id="38" name="Picture 38"/>
-                    <pic:cNvPicPr>
-                      <a:picLocks noChangeAspect="1" noChangeArrowheads="1"/>
-                    </pic:cNvPicPr>
-                  </pic:nvPicPr>
-                  <pic:blipFill>
-                    <a:blip r:embed="rId49" cstate="print">
-                      <a:extLst>
-                        <a:ext uri="{28A0092B-C50C-407E-A947-70E740481C1C}">
-                          <a14:useLocalDpi xmlns:a14="http://schemas.microsoft.com/office/drawing/2010/main" val="0"/>
-                        </a:ext>
-                      </a:extLst>
-                    </a:blip>
-                    <a:stretch>
-                      <a:fillRect/>
-                    </a:stretch>
-                  </pic:blipFill>
-                  <pic:spPr bwMode="auto">
-                    <a:xfrm>
-                      <a:off x="0" y="0"/>
-                      <a:ext cx="4158336" cy="2049138"/>
-                    </a:xfrm>
-                    <a:prstGeom prst="rect">
-                      <a:avLst/>
-                    </a:prstGeom>
-                    <a:noFill/>
-                    <a:ln>
-                      <a:solidFill>
-                        <a:schemeClr val="tx1"/>
-                      </a:solidFill>
-                    </a:ln>
-                  </pic:spPr>
-                </pic:pic>
-              </a:graphicData>
-            </a:graphic>
-          </wp:inline>
-        </w:drawing>
-      </w:r>
-    </w:p>
+    </w:p>
+    <w:sdt>
+      <w:sdtPr>
+        <w:alias w:val="mioTextBlock"/>
+        <w:tag w:val="0ce3f8df-95fc-4a8f-b2ee-2a9eabfdcf38"/>
+        <w:id w:val="-503672669"/>
+        <w:placeholder>
+          <w:docPart w:val="DefaultPlaceholder_-1854013440"/>
+        </w:placeholder>
+        <w15:appearance w15:val="hidden"/>
+      </w:sdtPr>
+      <w:sdtEndPr>
+        <w:rPr>
+          <w:b/>
+        </w:rPr>
+      </w:sdtEndPr>
+      <w:sdtContent>
+        <w:tbl>
+          <w:tblPr>
+            <w:tblStyle w:val="InfineonPicture"/>
+            <w:tblW w:w="5000" w:type="pct"/>
+            <w:tblCellMar>
+              <w:left w:w="0" w:type="dxa"/>
+              <w:right w:w="0" w:type="dxa"/>
+            </w:tblCellMar>
+            <w:tblLook w:val="05E0" w:firstRow="1" w:lastRow="1" w:firstColumn="1" w:lastColumn="1" w:noHBand="0" w:noVBand="1"/>
+          </w:tblPr>
+          <w:tblGrid>
+            <w:gridCol w:w="10763"/>
+          </w:tblGrid>
+          <w:tr>
+            <w:tc>
+              <w:tcPr>
+                <w:tcW w:w="5000" w:type="pct"/>
+              </w:tcPr>
+              <w:p>
+                <w:pPr>
+                  <w:pStyle w:val="TableCell-c"/>
+                </w:pPr>
+                <w:r>
+                  <w:rPr>
+                    <w:noProof/>
+                  </w:rPr>
+                  <w:drawing>
+                    <wp:inline distT="0" distB="0" distL="0" distR="0" wp14:anchorId="0E93E785" wp14:editId="55AB5F0B">
+                      <wp:extent cx="6113417" cy="3081711"/>
+                      <wp:effectExtent l="19050" t="19050" r="20955" b="23495"/>
+                      <wp:docPr id="37" name="Picture 37"/>
+                      <wp:cNvGraphicFramePr>
+                        <a:graphicFrameLocks xmlns:a="http://schemas.openxmlformats.org/drawingml/2006/main" noChangeAspect="1"/>
+                      </wp:cNvGraphicFramePr>
+                      <a:graphic xmlns:a="http://schemas.openxmlformats.org/drawingml/2006/main">
+                        <a:graphicData uri="http://schemas.openxmlformats.org/drawingml/2006/picture">
+                          <pic:pic xmlns:pic="http://schemas.openxmlformats.org/drawingml/2006/picture">
+                            <pic:nvPicPr>
+                              <pic:cNvPr id="37" name="Picture 37"/>
+                              <pic:cNvPicPr>
+                                <a:picLocks noChangeAspect="1" noChangeArrowheads="1"/>
+                              </pic:cNvPicPr>
+                            </pic:nvPicPr>
+                            <pic:blipFill>
+                              <a:blip r:embed="rId48" cstate="print">
+                                <a:extLst>
+                                  <a:ext uri="{28A0092B-C50C-407E-A947-70E740481C1C}">
+                                    <a14:useLocalDpi xmlns:a14="http://schemas.microsoft.com/office/drawing/2010/main" val="0"/>
+                                  </a:ext>
+                                </a:extLst>
+                              </a:blip>
+                              <a:stretch>
+                                <a:fillRect/>
+                              </a:stretch>
+                            </pic:blipFill>
+                            <pic:spPr bwMode="auto">
+                              <a:xfrm>
+                                <a:off x="0" y="0"/>
+                                <a:ext cx="6223701" cy="3137304"/>
+                              </a:xfrm>
+                              <a:prstGeom prst="rect">
+                                <a:avLst/>
+                              </a:prstGeom>
+                              <a:noFill/>
+                              <a:ln>
+                                <a:solidFill>
+                                  <a:schemeClr val="tx1"/>
+                                </a:solidFill>
+                              </a:ln>
+                            </pic:spPr>
+                          </pic:pic>
+                        </a:graphicData>
+                      </a:graphic>
+                    </wp:inline>
+                  </w:drawing>
+                </w:r>
+                <w:r>
+                  <w:rPr>
+                    <w:noProof/>
+                  </w:rPr>
+                  <w:drawing>
+                    <wp:inline distT="0" distB="0" distL="0" distR="0" wp14:anchorId="3E936878" wp14:editId="1A43D30F">
+                      <wp:extent cx="6107580" cy="3009683"/>
+                      <wp:effectExtent l="19050" t="19050" r="26670" b="19685"/>
+                      <wp:docPr id="38" name="Picture 38"/>
+                      <wp:cNvGraphicFramePr>
+                        <a:graphicFrameLocks xmlns:a="http://schemas.openxmlformats.org/drawingml/2006/main" noChangeAspect="1"/>
+                      </wp:cNvGraphicFramePr>
+                      <a:graphic xmlns:a="http://schemas.openxmlformats.org/drawingml/2006/main">
+                        <a:graphicData uri="http://schemas.openxmlformats.org/drawingml/2006/picture">
+                          <pic:pic xmlns:pic="http://schemas.openxmlformats.org/drawingml/2006/picture">
+                            <pic:nvPicPr>
+                              <pic:cNvPr id="38" name="Picture 38"/>
+                              <pic:cNvPicPr>
+                                <a:picLocks noChangeAspect="1" noChangeArrowheads="1"/>
+                              </pic:cNvPicPr>
+                            </pic:nvPicPr>
+                            <pic:blipFill>
+                              <a:blip r:embed="rId49" cstate="print">
+                                <a:extLst>
+                                  <a:ext uri="{28A0092B-C50C-407E-A947-70E740481C1C}">
+                                    <a14:useLocalDpi xmlns:a14="http://schemas.microsoft.com/office/drawing/2010/main" val="0"/>
+                                  </a:ext>
+                                </a:extLst>
+                              </a:blip>
+                              <a:stretch>
+                                <a:fillRect/>
+                              </a:stretch>
+                            </pic:blipFill>
+                            <pic:spPr bwMode="auto">
+                              <a:xfrm>
+                                <a:off x="0" y="0"/>
+                                <a:ext cx="6144510" cy="3027882"/>
+                              </a:xfrm>
+                              <a:prstGeom prst="rect">
+                                <a:avLst/>
+                              </a:prstGeom>
+                              <a:noFill/>
+                              <a:ln>
+                                <a:solidFill>
+                                  <a:schemeClr val="tx1"/>
+                                </a:solidFill>
+                              </a:ln>
+                            </pic:spPr>
+                          </pic:pic>
+                        </a:graphicData>
+                      </a:graphic>
+                    </wp:inline>
+                  </w:drawing>
+                </w:r>
+              </w:p>
+            </w:tc>
+          </w:tr>
+        </w:tbl>
+        <w:p>
+          <w:pPr>
+            <w:pStyle w:val="Figuretitlenew"/>
+            <w:rPr>
+              <w:lang w:eastAsia="de-DE"/>
+            </w:rPr>
+          </w:pPr>
+          <w:r>
+            <w:t xml:space="preserve">Figure </w:t>
+          </w:r>
+          <w:r>
+            <w:fldChar w:fldCharType="begin"/>
+          </w:r>
+          <w:r>
+            <w:instrText xml:space="preserve"> SEQ Figure \* ARABIC </w:instrText>
+          </w:r>
+          <w:r>
+            <w:fldChar w:fldCharType="separate"/>
+          </w:r>
+          <w:r>
+            <w:rPr>
+              <w:noProof/>
+            </w:rPr>
+            <w:t>26</w:t>
+          </w:r>
+          <w:r>
+            <w:fldChar w:fldCharType="end"/>
+          </w:r>
+          <w:r>
+            <w:tab/>
+          </w:r>
+          <w:proofErr w:type="spellStart"/>
+          <w:r>
+            <w:t>Makefile</w:t>
+          </w:r>
+          <w:proofErr w:type="spellEnd"/>
+          <w:r>
+            <w:t xml:space="preserve"> for cm33_ns and cm55 – Remove component FREERTOS AWARE</w:t>
+          </w:r>
+        </w:p>
+      </w:sdtContent>
+    </w:sdt>
     <w:p>
       <w:pPr>
         <w:pStyle w:val="ListParagraph"/>
@@ -12571,7 +12896,21 @@
           <w:rFonts w:ascii="Source Sans 3" w:hAnsi="Source Sans 3"/>
           <w:lang w:eastAsia="de-DE"/>
         </w:rPr>
-        <w:t xml:space="preserve">Let’s add the application code </w:t>
+        <w:t>l</w:t>
+      </w:r>
+      <w:r>
+        <w:rPr>
+          <w:rFonts w:ascii="Source Sans 3" w:hAnsi="Source Sans 3"/>
+          <w:lang w:eastAsia="de-DE"/>
+        </w:rPr>
+        <w:t>et’s add the application code</w:t>
+      </w:r>
+      <w:r>
+        <w:rPr>
+          <w:rFonts w:ascii="Source Sans 3" w:hAnsi="Source Sans 3"/>
+          <w:lang w:eastAsia="de-DE"/>
+        </w:rPr>
+        <w:t>.</w:t>
       </w:r>
     </w:p>
     <w:p>
@@ -12592,8 +12931,16 @@
           <w:rFonts w:ascii="Source Sans 3" w:hAnsi="Source Sans 3"/>
           <w:lang w:eastAsia="de-DE"/>
         </w:rPr>
-        <w:t xml:space="preserve">open the </w:t>
-      </w:r>
+        <w:t>O</w:t>
+      </w:r>
+      <w:r>
+        <w:rPr>
+          <w:rFonts w:ascii="Source Sans 3" w:hAnsi="Source Sans 3"/>
+          <w:lang w:eastAsia="de-DE"/>
+        </w:rPr>
+        <w:t xml:space="preserve">pen the </w:t>
+      </w:r>
+      <w:proofErr w:type="spellStart"/>
       <w:r>
         <w:rPr>
           <w:rFonts w:ascii="Source Sans 3" w:hAnsi="Source Sans 3"/>
@@ -12602,6 +12949,7 @@
         </w:rPr>
         <w:t>main.c</w:t>
       </w:r>
+      <w:proofErr w:type="spellEnd"/>
       <w:r>
         <w:rPr>
           <w:rFonts w:ascii="Source Sans 3" w:hAnsi="Source Sans 3"/>
@@ -12677,6 +13025,7 @@
           <w:rFonts w:ascii="Source Sans 3" w:hAnsi="Source Sans 3"/>
           <w:lang w:eastAsia="de-DE"/>
         </w:rPr>
+        <w:lastRenderedPageBreak/>
         <w:t>Let us</w:t>
       </w:r>
       <w:r>
@@ -12811,20 +13160,20 @@
           <w:color w:val="F97414"/>
           <w:sz w:val="18"/>
           <w:szCs w:val="18"/>
+        </w:rPr>
+      </w:pPr>
+      <w:bookmarkStart w:id="190" w:name="_mioConsistencyCheck167"/>
+      <w:r>
+        <w:rPr>
+          <w:rFonts w:ascii="Courier New" w:hAnsi="Courier New" w:cs="Courier New"/>
+          <w:color w:val="F97414"/>
+          <w:sz w:val="18"/>
+          <w:szCs w:val="18"/>
           <w:lang w:val="en-IN"/>
         </w:rPr>
-      </w:pPr>
-      <w:bookmarkStart w:id="189" w:name="_mioConsistencyCheck167"/>
-      <w:r>
-        <w:rPr>
-          <w:rFonts w:ascii="Courier New" w:hAnsi="Courier New" w:cs="Courier New"/>
-          <w:color w:val="F97414"/>
-          <w:sz w:val="18"/>
-          <w:szCs w:val="18"/>
-          <w:lang w:val="en-IN"/>
-        </w:rPr>
-        <w:t xml:space="preserve">    result = </w:t>
-      </w:r>
+        <w:t xml:space="preserve">    </w:t>
+      </w:r>
+      <w:bookmarkEnd w:id="190"/>
       <w:proofErr w:type="spellStart"/>
       <w:r>
         <w:rPr>
@@ -12832,9 +13181,18 @@
           <w:color w:val="F97414"/>
           <w:sz w:val="18"/>
           <w:szCs w:val="18"/>
-          <w:lang w:val="en-IN"/>
-        </w:rPr>
-        <w:t>cyhal_gpio_init</w:t>
+        </w:rPr>
+        <w:t>Cy_GPIO_</w:t>
+      </w:r>
+      <w:proofErr w:type="gramStart"/>
+      <w:r>
+        <w:rPr>
+          <w:rFonts w:ascii="Courier New" w:hAnsi="Courier New" w:cs="Courier New"/>
+          <w:color w:val="F97414"/>
+          <w:sz w:val="18"/>
+          <w:szCs w:val="18"/>
+        </w:rPr>
+        <w:t>SetDrivemode</w:t>
       </w:r>
       <w:proofErr w:type="spellEnd"/>
       <w:r>
@@ -12843,203 +13201,42 @@
           <w:color w:val="F97414"/>
           <w:sz w:val="18"/>
           <w:szCs w:val="18"/>
-          <w:lang w:val="en-IN"/>
-        </w:rPr>
-        <w:t>(TRAINING_LED, CYHAL_GPIO_DIR_OUTPUT,</w:t>
-      </w:r>
-    </w:p>
-    <w:p>
-      <w:pPr>
-        <w:autoSpaceDE w:val="0"/>
-        <w:autoSpaceDN w:val="0"/>
-        <w:adjustRightInd w:val="0"/>
-        <w:ind w:left="1418"/>
-        <w:rPr>
-          <w:rFonts w:ascii="Courier New" w:hAnsi="Courier New" w:cs="Courier New"/>
-          <w:color w:val="F97414"/>
-          <w:sz w:val="18"/>
-          <w:szCs w:val="18"/>
-          <w:lang w:val="en-IN"/>
-        </w:rPr>
-      </w:pPr>
-      <w:r>
-        <w:rPr>
-          <w:rFonts w:ascii="Courier New" w:hAnsi="Courier New" w:cs="Courier New"/>
-          <w:color w:val="F97414"/>
-          <w:sz w:val="18"/>
-          <w:szCs w:val="18"/>
-          <w:lang w:val="en-IN"/>
-        </w:rPr>
-        <w:t xml:space="preserve">        CYHAL_GPIO_DRIVE_STRONG, CYBSP_LED_STATE_OFF);</w:t>
-      </w:r>
-    </w:p>
-    <w:p>
-      <w:pPr>
-        <w:autoSpaceDE w:val="0"/>
-        <w:autoSpaceDN w:val="0"/>
-        <w:adjustRightInd w:val="0"/>
-        <w:ind w:left="1418"/>
-        <w:rPr>
-          <w:rFonts w:ascii="Courier New" w:hAnsi="Courier New" w:cs="Courier New"/>
-          <w:color w:val="F97414"/>
-          <w:sz w:val="18"/>
-          <w:szCs w:val="18"/>
-          <w:lang w:val="en-IN"/>
-        </w:rPr>
-      </w:pPr>
-    </w:p>
-    <w:p>
-      <w:pPr>
-        <w:autoSpaceDE w:val="0"/>
-        <w:autoSpaceDN w:val="0"/>
-        <w:adjustRightInd w:val="0"/>
-        <w:ind w:left="1418"/>
-        <w:rPr>
-          <w:rFonts w:ascii="Courier New" w:hAnsi="Courier New" w:cs="Courier New"/>
-          <w:color w:val="F97414"/>
-          <w:sz w:val="18"/>
-          <w:szCs w:val="18"/>
-          <w:lang w:val="en-IN"/>
-        </w:rPr>
-      </w:pPr>
-      <w:r>
-        <w:rPr>
-          <w:rFonts w:ascii="Courier New" w:hAnsi="Courier New" w:cs="Courier New"/>
-          <w:color w:val="F97414"/>
-          <w:sz w:val="18"/>
-          <w:szCs w:val="18"/>
-          <w:lang w:val="en-IN"/>
-        </w:rPr>
-        <w:t xml:space="preserve">    /* GPIO </w:t>
-      </w:r>
-      <w:proofErr w:type="spellStart"/>
-      <w:r>
-        <w:rPr>
-          <w:rFonts w:ascii="Courier New" w:hAnsi="Courier New" w:cs="Courier New"/>
-          <w:color w:val="F97414"/>
-          <w:sz w:val="18"/>
-          <w:szCs w:val="18"/>
-          <w:lang w:val="en-IN"/>
-        </w:rPr>
-        <w:t>init</w:t>
-      </w:r>
-      <w:proofErr w:type="spellEnd"/>
-      <w:r>
-        <w:rPr>
-          <w:rFonts w:ascii="Courier New" w:hAnsi="Courier New" w:cs="Courier New"/>
-          <w:color w:val="F97414"/>
-          <w:sz w:val="18"/>
-          <w:szCs w:val="18"/>
-          <w:lang w:val="en-IN"/>
-        </w:rPr>
-        <w:t xml:space="preserve"> failed. Stop program execution */</w:t>
-      </w:r>
-    </w:p>
-    <w:p>
-      <w:pPr>
-        <w:autoSpaceDE w:val="0"/>
-        <w:autoSpaceDN w:val="0"/>
-        <w:adjustRightInd w:val="0"/>
-        <w:ind w:left="1418"/>
-        <w:rPr>
-          <w:rFonts w:ascii="Courier New" w:hAnsi="Courier New" w:cs="Courier New"/>
-          <w:color w:val="F97414"/>
-          <w:sz w:val="18"/>
-          <w:szCs w:val="18"/>
-          <w:lang w:val="en-IN"/>
-        </w:rPr>
-      </w:pPr>
-      <w:r>
-        <w:rPr>
-          <w:rFonts w:ascii="Courier New" w:hAnsi="Courier New" w:cs="Courier New"/>
-          <w:color w:val="F97414"/>
-          <w:sz w:val="18"/>
-          <w:szCs w:val="18"/>
-          <w:lang w:val="en-IN"/>
-        </w:rPr>
-        <w:t xml:space="preserve">    if (result != CY_RSLT_SUCCESS)</w:t>
-      </w:r>
-    </w:p>
-    <w:p>
-      <w:pPr>
-        <w:autoSpaceDE w:val="0"/>
-        <w:autoSpaceDN w:val="0"/>
-        <w:adjustRightInd w:val="0"/>
-        <w:ind w:left="1418"/>
-        <w:rPr>
-          <w:rFonts w:ascii="Courier New" w:hAnsi="Courier New" w:cs="Courier New"/>
-          <w:color w:val="F97414"/>
-          <w:sz w:val="18"/>
-          <w:szCs w:val="18"/>
-          <w:lang w:val="en-IN"/>
-        </w:rPr>
-      </w:pPr>
-      <w:r>
-        <w:rPr>
-          <w:rFonts w:ascii="Courier New" w:hAnsi="Courier New" w:cs="Courier New"/>
-          <w:color w:val="F97414"/>
-          <w:sz w:val="18"/>
-          <w:szCs w:val="18"/>
-          <w:lang w:val="en-IN"/>
-        </w:rPr>
-        <w:t xml:space="preserve">    {</w:t>
-      </w:r>
-    </w:p>
-    <w:p>
-      <w:pPr>
-        <w:autoSpaceDE w:val="0"/>
-        <w:autoSpaceDN w:val="0"/>
-        <w:adjustRightInd w:val="0"/>
-        <w:ind w:left="1418"/>
-        <w:rPr>
-          <w:rFonts w:ascii="Courier New" w:hAnsi="Courier New" w:cs="Courier New"/>
-          <w:color w:val="F97414"/>
-          <w:sz w:val="18"/>
-          <w:szCs w:val="18"/>
-          <w:lang w:val="en-IN"/>
-        </w:rPr>
-      </w:pPr>
-      <w:r>
-        <w:rPr>
-          <w:rFonts w:ascii="Courier New" w:hAnsi="Courier New" w:cs="Courier New"/>
-          <w:color w:val="F97414"/>
-          <w:sz w:val="18"/>
-          <w:szCs w:val="18"/>
-          <w:lang w:val="en-IN"/>
-        </w:rPr>
-        <w:t xml:space="preserve">    CY_ASSERT(0);</w:t>
-      </w:r>
-    </w:p>
-    <w:p>
-      <w:pPr>
-        <w:autoSpaceDE w:val="0"/>
-        <w:autoSpaceDN w:val="0"/>
-        <w:adjustRightInd w:val="0"/>
-        <w:ind w:left="1418"/>
-        <w:rPr>
-          <w:rFonts w:ascii="Courier New" w:hAnsi="Courier New" w:cs="Courier New"/>
-          <w:color w:val="F97414"/>
-          <w:sz w:val="18"/>
-          <w:szCs w:val="18"/>
-          <w:lang w:val="en-IN"/>
-        </w:rPr>
-      </w:pPr>
-      <w:r>
-        <w:rPr>
-          <w:rFonts w:ascii="Courier New" w:hAnsi="Courier New" w:cs="Courier New"/>
-          <w:color w:val="F97414"/>
-          <w:sz w:val="18"/>
-          <w:szCs w:val="18"/>
-          <w:lang w:val="en-IN"/>
-        </w:rPr>
-        <w:t xml:space="preserve">    }</w:t>
-      </w:r>
-    </w:p>
-    <w:bookmarkEnd w:id="189"/>
-    <w:p>
-      <w:pPr>
-        <w:spacing w:before="160" w:after="160"/>
-        <w:ind w:left="709" w:firstLine="709"/>
+        </w:rPr>
+        <w:t>(</w:t>
+      </w:r>
+      <w:proofErr w:type="gramEnd"/>
+      <w:r>
+        <w:rPr>
+          <w:rFonts w:ascii="Courier New" w:hAnsi="Courier New" w:cs="Courier New"/>
+          <w:color w:val="F97414"/>
+          <w:sz w:val="18"/>
+          <w:szCs w:val="18"/>
+        </w:rPr>
+        <w:t>TRAINING_LED_PORT, TRAINING_LED_PIN, CY_GPIO_DM_STRONG);</w:t>
+      </w:r>
+    </w:p>
+    <w:p>
+      <w:pPr>
+        <w:autoSpaceDE w:val="0"/>
+        <w:autoSpaceDN w:val="0"/>
+        <w:adjustRightInd w:val="0"/>
+        <w:ind w:left="1418"/>
+        <w:rPr>
+          <w:rFonts w:ascii="Courier New" w:hAnsi="Courier New" w:cs="Courier New"/>
+          <w:color w:val="F97414"/>
+          <w:sz w:val="18"/>
+          <w:szCs w:val="18"/>
+        </w:rPr>
+      </w:pPr>
+      <w:bookmarkStart w:id="191" w:name="_GoBack"/>
+      <w:bookmarkEnd w:id="191"/>
+    </w:p>
+    <w:p>
+      <w:pPr>
+        <w:autoSpaceDE w:val="0"/>
+        <w:autoSpaceDN w:val="0"/>
+        <w:adjustRightInd w:val="0"/>
+        <w:ind w:left="1418"/>
         <w:rPr>
           <w:rFonts w:ascii="Courier New" w:hAnsi="Courier New" w:cs="Courier New"/>
           <w:b/>
@@ -13133,8 +13330,8 @@
         </w:rPr>
         <w:t xml:space="preserve"> will be available in HAL documentation </w:t>
       </w:r>
-      <w:bookmarkStart w:id="190" w:name="_mioConsistencyCheck168"/>
-      <w:bookmarkStart w:id="191" w:name="_mioConsistencyCheck64"/>
+      <w:bookmarkStart w:id="192" w:name="_mioConsistencyCheck168"/>
+      <w:bookmarkStart w:id="193" w:name="_mioConsistencyCheck64"/>
       <w:r>
         <w:fldChar w:fldCharType="begin"/>
       </w:r>
@@ -13165,8 +13362,8 @@
         </w:rPr>
         <w:fldChar w:fldCharType="end"/>
       </w:r>
-      <w:bookmarkEnd w:id="190"/>
-      <w:bookmarkEnd w:id="191"/>
+      <w:bookmarkEnd w:id="192"/>
+      <w:bookmarkEnd w:id="193"/>
       <w:r>
         <w:rPr>
           <w:rFonts w:ascii="Source Sans 3" w:hAnsi="Source Sans 3" w:cs="Consolas"/>
@@ -13242,7 +13439,6 @@
         <w:rPr>
           <w:noProof/>
         </w:rPr>
-        <w:lastRenderedPageBreak/>
         <w:drawing>
           <wp:inline distT="0" distB="0" distL="0" distR="0" wp14:anchorId="41072C33" wp14:editId="4B377319">
             <wp:extent cx="5419871" cy="2652582"/>
@@ -13451,7 +13647,7 @@
           <w:lang w:val="en-IN"/>
         </w:rPr>
       </w:pPr>
-      <w:bookmarkStart w:id="192" w:name="_mioConsistencyCheck169"/>
+      <w:bookmarkStart w:id="194" w:name="_mioConsistencyCheck169"/>
       <w:r>
         <w:rPr>
           <w:rFonts w:ascii="Courier New" w:hAnsi="Courier New" w:cs="Courier New"/>
@@ -13535,7 +13731,7 @@
         <w:t xml:space="preserve">        CY_RETARGET_IO_BAUDRATE);</w:t>
       </w:r>
     </w:p>
-    <w:bookmarkEnd w:id="192"/>
+    <w:bookmarkEnd w:id="194"/>
     <w:p>
       <w:pPr>
         <w:autoSpaceDE w:val="0"/>
@@ -13575,7 +13771,7 @@
         </w:rPr>
         <w:t xml:space="preserve">    </w:t>
       </w:r>
-      <w:bookmarkStart w:id="193" w:name="_mioConsistencyCheck170"/>
+      <w:bookmarkStart w:id="195" w:name="_mioConsistencyCheck170"/>
       <w:r>
         <w:rPr>
           <w:rFonts w:ascii="Courier New" w:hAnsi="Courier New" w:cs="Courier New"/>
@@ -13681,7 +13877,7 @@
         <w:t xml:space="preserve">    {</w:t>
       </w:r>
     </w:p>
-    <w:bookmarkEnd w:id="193"/>
+    <w:bookmarkEnd w:id="195"/>
     <w:p>
       <w:pPr>
         <w:autoSpaceDE w:val="0"/>
@@ -13716,7 +13912,7 @@
         </w:rPr>
         <w:t xml:space="preserve">    </w:t>
       </w:r>
-      <w:bookmarkStart w:id="194" w:name="_mioConsistencyCheck171"/>
+      <w:bookmarkStart w:id="196" w:name="_mioConsistencyCheck171"/>
       <w:r>
         <w:rPr>
           <w:rFonts w:ascii="Courier New" w:hAnsi="Courier New" w:cs="Courier New"/>
@@ -13753,7 +13949,7 @@
         <w:t xml:space="preserve">    }</w:t>
       </w:r>
     </w:p>
-    <w:bookmarkEnd w:id="194"/>
+    <w:bookmarkEnd w:id="196"/>
     <w:p>
       <w:pPr>
         <w:spacing w:before="160" w:after="160"/>
@@ -13898,7 +14094,7 @@
           <w:szCs w:val="18"/>
         </w:rPr>
       </w:pPr>
-      <w:bookmarkStart w:id="195" w:name="_mioConsistencyCheck172"/>
+      <w:bookmarkStart w:id="197" w:name="_mioConsistencyCheck172"/>
       <w:r>
         <w:rPr>
           <w:rFonts w:ascii="Courier New" w:hAnsi="Courier New" w:cs="Courier New"/>
@@ -13943,6 +14139,7 @@
           <w:sz w:val="18"/>
           <w:szCs w:val="18"/>
         </w:rPr>
+        <w:lastRenderedPageBreak/>
         <w:t>printf("****************** "</w:t>
       </w:r>
     </w:p>
@@ -13968,8 +14165,8 @@
         </w:rPr>
         <w:t>"</w:t>
       </w:r>
-      <w:bookmarkStart w:id="196" w:name="_mioConsistencyCheck289"/>
-      <w:bookmarkStart w:id="197" w:name="_mioConsistencyCheck70"/>
+      <w:bookmarkStart w:id="198" w:name="_mioConsistencyCheck289"/>
+      <w:bookmarkStart w:id="199" w:name="_mioConsistencyCheck70"/>
       <w:r>
         <w:rPr>
           <w:rFonts w:ascii="Courier New" w:hAnsi="Courier New" w:cs="Courier New"/>
@@ -13979,8 +14176,8 @@
         </w:rPr>
         <w:t>PSOC</w:t>
       </w:r>
-      <w:bookmarkEnd w:id="196"/>
-      <w:bookmarkEnd w:id="197"/>
+      <w:bookmarkEnd w:id="198"/>
+      <w:bookmarkEnd w:id="199"/>
       <w:r>
         <w:rPr>
           <w:rFonts w:ascii="Courier New" w:hAnsi="Courier New" w:cs="Courier New"/>
@@ -14209,7 +14406,7 @@
         <w:t>-Software\r\n\n");</w:t>
       </w:r>
     </w:p>
-    <w:bookmarkEnd w:id="195"/>
+    <w:bookmarkEnd w:id="197"/>
     <w:p>
       <w:pPr>
         <w:spacing w:before="160" w:after="160"/>
@@ -14325,7 +14522,6 @@
           <w:rFonts w:ascii="Source Sans 3" w:hAnsi="Source Sans 3"/>
           <w:lang w:eastAsia="de-DE"/>
         </w:rPr>
-        <w:lastRenderedPageBreak/>
         <w:t xml:space="preserve">We will utilize the Uart to get response from the user to control the </w:t>
       </w:r>
       <w:r>
@@ -14402,7 +14598,7 @@
           <w:szCs w:val="18"/>
         </w:rPr>
       </w:pPr>
-      <w:bookmarkStart w:id="198" w:name="_mioConsistencyCheck173"/>
+      <w:bookmarkStart w:id="200" w:name="_mioConsistencyCheck173"/>
       <w:proofErr w:type="spellStart"/>
       <w:r>
         <w:rPr>
@@ -14484,7 +14680,7 @@
         <w:t xml:space="preserve">   "resume blinking the user LED \r\n\r\n");</w:t>
       </w:r>
     </w:p>
-    <w:bookmarkEnd w:id="198"/>
+    <w:bookmarkEnd w:id="200"/>
     <w:p>
       <w:pPr>
         <w:spacing w:before="160" w:after="160"/>
@@ -14619,7 +14815,7 @@
           <w:szCs w:val="18"/>
         </w:rPr>
       </w:pPr>
-      <w:bookmarkStart w:id="199" w:name="_mioConsistencyCheck174"/>
+      <w:bookmarkStart w:id="201" w:name="_mioConsistencyCheck174"/>
       <w:r>
         <w:rPr>
           <w:rFonts w:ascii="Courier New" w:hAnsi="Courier New" w:cs="Courier New"/>
@@ -14630,7 +14826,7 @@
         <w:t>Cy_SysEnableCM55(CY_CORTEX_M55_APPL_ADDR, CM55_BOOT_WAIT_TIME_USEC);</w:t>
       </w:r>
     </w:p>
-    <w:bookmarkEnd w:id="199"/>
+    <w:bookmarkEnd w:id="201"/>
     <w:p>
       <w:pPr>
         <w:pStyle w:val="ListParagraph"/>
@@ -15113,7 +15309,7 @@
           <w:szCs w:val="18"/>
         </w:rPr>
       </w:pPr>
-      <w:bookmarkStart w:id="200" w:name="_Hlk192779201"/>
+      <w:bookmarkStart w:id="202" w:name="_Hlk192779201"/>
       <w:r>
         <w:rPr>
           <w:rFonts w:ascii="Courier New" w:hAnsi="Courier New" w:cs="Courier New"/>
@@ -15136,8 +15332,8 @@
           <w:szCs w:val="18"/>
         </w:rPr>
       </w:pPr>
-      <w:bookmarkStart w:id="201" w:name="_mioConsistencyCheck175"/>
-      <w:bookmarkEnd w:id="200"/>
+      <w:bookmarkStart w:id="203" w:name="_mioConsistencyCheck175"/>
+      <w:bookmarkEnd w:id="202"/>
       <w:r>
         <w:rPr>
           <w:rFonts w:ascii="Courier New" w:hAnsi="Courier New" w:cs="Courier New"/>
@@ -15168,6 +15364,7 @@
           <w:sz w:val="18"/>
           <w:szCs w:val="18"/>
         </w:rPr>
+        <w:lastRenderedPageBreak/>
         <w:t>{</w:t>
       </w:r>
     </w:p>
@@ -15522,8 +15719,8 @@
           <w:szCs w:val="18"/>
         </w:rPr>
       </w:pPr>
-      <w:bookmarkStart w:id="202" w:name="_mioConsistencyCheck176"/>
-      <w:bookmarkEnd w:id="201"/>
+      <w:bookmarkStart w:id="204" w:name="_mioConsistencyCheck176"/>
+      <w:bookmarkEnd w:id="203"/>
       <w:r>
         <w:rPr>
           <w:rFonts w:ascii="Courier New" w:hAnsi="Courier New" w:cs="Courier New"/>
@@ -15859,8 +16056,8 @@
           <w:szCs w:val="18"/>
         </w:rPr>
       </w:pPr>
-      <w:bookmarkStart w:id="203" w:name="_mioConsistencyCheck177"/>
-      <w:bookmarkEnd w:id="202"/>
+      <w:bookmarkStart w:id="205" w:name="_mioConsistencyCheck177"/>
+      <w:bookmarkEnd w:id="204"/>
       <w:r>
         <w:rPr>
           <w:rFonts w:ascii="Courier New" w:hAnsi="Courier New" w:cs="Courier New"/>
@@ -16058,7 +16255,6 @@
           <w:sz w:val="18"/>
           <w:szCs w:val="18"/>
         </w:rPr>
-        <w:lastRenderedPageBreak/>
         <w:t xml:space="preserve"> </w:t>
       </w:r>
       <w:r>
@@ -16163,8 +16359,8 @@
           <w:szCs w:val="18"/>
         </w:rPr>
       </w:pPr>
-      <w:bookmarkStart w:id="204" w:name="_mioConsistencyCheck178"/>
-      <w:bookmarkEnd w:id="203"/>
+      <w:bookmarkStart w:id="206" w:name="_mioConsistencyCheck178"/>
+      <w:bookmarkEnd w:id="205"/>
       <w:proofErr w:type="spellStart"/>
       <w:r>
         <w:rPr>
@@ -16387,7 +16583,7 @@
         <w:t xml:space="preserve">        /* Clear the flag */</w:t>
       </w:r>
     </w:p>
-    <w:bookmarkEnd w:id="204"/>
+    <w:bookmarkEnd w:id="206"/>
     <w:p>
       <w:pPr>
         <w:autoSpaceDE w:val="0"/>
@@ -16410,7 +16606,7 @@
         </w:rPr>
         <w:t xml:space="preserve">        </w:t>
       </w:r>
-      <w:bookmarkStart w:id="205" w:name="_mioConsistencyCheck179"/>
+      <w:bookmarkStart w:id="207" w:name="_mioConsistencyCheck179"/>
       <w:proofErr w:type="spellStart"/>
       <w:r>
         <w:rPr>
@@ -16469,7 +16665,7 @@
         <w:t xml:space="preserve">        /* Invert the USER LED state */</w:t>
       </w:r>
     </w:p>
-    <w:bookmarkEnd w:id="205"/>
+    <w:bookmarkEnd w:id="207"/>
     <w:p>
       <w:pPr>
         <w:autoSpaceDE w:val="0"/>
@@ -16492,7 +16688,7 @@
         </w:rPr>
         <w:t xml:space="preserve">        </w:t>
       </w:r>
-      <w:bookmarkStart w:id="206" w:name="_mioConsistencyCheck180"/>
+      <w:bookmarkStart w:id="208" w:name="_mioConsistencyCheck180"/>
       <w:proofErr w:type="spellStart"/>
       <w:r>
         <w:rPr>
@@ -16568,10 +16764,8 @@
         </w:rPr>
         <w:t xml:space="preserve"> //end forever for loop</w:t>
       </w:r>
-      <w:bookmarkStart w:id="207" w:name="_GoBack"/>
-      <w:bookmarkEnd w:id="207"/>
-    </w:p>
-    <w:bookmarkEnd w:id="206"/>
+    </w:p>
+    <w:bookmarkEnd w:id="208"/>
     <w:p>
       <w:pPr>
         <w:spacing w:before="160" w:after="160"/>
@@ -17171,7 +17365,7 @@
           <w:szCs w:val="18"/>
         </w:rPr>
       </w:pPr>
-      <w:bookmarkStart w:id="208" w:name="_mioConsistencyCheck181"/>
+      <w:bookmarkStart w:id="209" w:name="_mioConsistencyCheck181"/>
       <w:r>
         <w:rPr>
           <w:rFonts w:ascii="Courier New" w:hAnsi="Courier New" w:cs="Courier New"/>
@@ -17225,7 +17419,7 @@
         <w:t>{</w:t>
       </w:r>
     </w:p>
-    <w:bookmarkEnd w:id="208"/>
+    <w:bookmarkEnd w:id="209"/>
     <w:p>
       <w:pPr>
         <w:autoSpaceDE w:val="0"/>
@@ -17246,9 +17440,10 @@
           <w:sz w:val="18"/>
           <w:szCs w:val="18"/>
         </w:rPr>
+        <w:lastRenderedPageBreak/>
         <w:t xml:space="preserve">    </w:t>
       </w:r>
-      <w:bookmarkStart w:id="209" w:name="_mioConsistencyCheck182"/>
+      <w:bookmarkStart w:id="210" w:name="_mioConsistencyCheck182"/>
       <w:proofErr w:type="spellStart"/>
       <w:r>
         <w:rPr>
@@ -17924,7 +18119,6 @@
           <w:sz w:val="18"/>
           <w:szCs w:val="18"/>
         </w:rPr>
-        <w:lastRenderedPageBreak/>
         <w:t xml:space="preserve">        CY_ASSERT(0);</w:t>
       </w:r>
     </w:p>
@@ -18011,7 +18205,7 @@
         <w:t xml:space="preserve">       duration */</w:t>
       </w:r>
     </w:p>
-    <w:bookmarkEnd w:id="209"/>
+    <w:bookmarkEnd w:id="210"/>
     <w:p>
       <w:pPr>
         <w:autoSpaceDE w:val="0"/>
@@ -18034,7 +18228,7 @@
         </w:rPr>
         <w:t xml:space="preserve">    </w:t>
       </w:r>
-      <w:bookmarkStart w:id="210" w:name="_mioConsistencyCheck183"/>
+      <w:bookmarkStart w:id="211" w:name="_mioConsistencyCheck183"/>
       <w:proofErr w:type="spellStart"/>
       <w:r>
         <w:rPr>
@@ -18133,7 +18327,7 @@
         <w:t xml:space="preserve">    /* Set the frequency of timer's clock source */</w:t>
       </w:r>
     </w:p>
-    <w:bookmarkEnd w:id="210"/>
+    <w:bookmarkEnd w:id="211"/>
     <w:p>
       <w:pPr>
         <w:autoSpaceDE w:val="0"/>
@@ -18156,7 +18350,7 @@
         </w:rPr>
         <w:t xml:space="preserve">    </w:t>
       </w:r>
-      <w:bookmarkStart w:id="211" w:name="_mioConsistencyCheck184"/>
+      <w:bookmarkStart w:id="212" w:name="_mioConsistencyCheck184"/>
       <w:proofErr w:type="spellStart"/>
       <w:r>
         <w:rPr>
@@ -18235,7 +18429,7 @@
         <w:t xml:space="preserve">    /* Assign the ISR to execute on timer interrupt */</w:t>
       </w:r>
     </w:p>
-    <w:bookmarkEnd w:id="211"/>
+    <w:bookmarkEnd w:id="212"/>
     <w:p>
       <w:pPr>
         <w:autoSpaceDE w:val="0"/>
@@ -18258,7 +18452,7 @@
         </w:rPr>
         <w:t xml:space="preserve">    </w:t>
       </w:r>
-      <w:bookmarkStart w:id="212" w:name="_mioConsistencyCheck185"/>
+      <w:bookmarkStart w:id="213" w:name="_mioConsistencyCheck185"/>
       <w:proofErr w:type="spellStart"/>
       <w:r>
         <w:rPr>
@@ -18357,7 +18551,7 @@
         <w:t xml:space="preserve">    /* Set the event on which timer interrupt occurs and enable it */</w:t>
       </w:r>
     </w:p>
-    <w:bookmarkEnd w:id="212"/>
+    <w:bookmarkEnd w:id="213"/>
     <w:p>
       <w:pPr>
         <w:autoSpaceDE w:val="0"/>
@@ -18380,7 +18574,7 @@
         </w:rPr>
         <w:t xml:space="preserve">    </w:t>
       </w:r>
-      <w:bookmarkStart w:id="213" w:name="_mioConsistencyCheck186"/>
+      <w:bookmarkStart w:id="214" w:name="_mioConsistencyCheck186"/>
       <w:proofErr w:type="spellStart"/>
       <w:r>
         <w:rPr>
@@ -18482,7 +18676,7 @@
         <w:t xml:space="preserve">    /* Start the timer with the configured settings */</w:t>
       </w:r>
     </w:p>
-    <w:bookmarkEnd w:id="213"/>
+    <w:bookmarkEnd w:id="214"/>
     <w:p>
       <w:pPr>
         <w:autoSpaceDE w:val="0"/>
@@ -18505,7 +18699,7 @@
         </w:rPr>
         <w:t xml:space="preserve">    </w:t>
       </w:r>
-      <w:bookmarkStart w:id="214" w:name="_mioConsistencyCheck187"/>
+      <w:bookmarkStart w:id="215" w:name="_mioConsistencyCheck187"/>
       <w:proofErr w:type="spellStart"/>
       <w:r>
         <w:rPr>
@@ -18570,7 +18764,7 @@
         <w:t>}</w:t>
       </w:r>
     </w:p>
-    <w:bookmarkEnd w:id="214"/>
+    <w:bookmarkEnd w:id="215"/>
     <w:p>
       <w:pPr>
         <w:autoSpaceDE w:val="0"/>
@@ -19037,7 +19231,7 @@
           <w:szCs w:val="18"/>
         </w:rPr>
       </w:pPr>
-      <w:bookmarkStart w:id="215" w:name="_mioConsistencyCheck188"/>
+      <w:bookmarkStart w:id="216" w:name="_mioConsistencyCheck188"/>
       <w:r>
         <w:rPr>
           <w:rFonts w:ascii="Courier New" w:hAnsi="Courier New" w:cs="Courier New"/>
@@ -19234,7 +19428,7 @@
         <w:t xml:space="preserve">    /* Set the interrupt flag and process it from the main while(1) loop */</w:t>
       </w:r>
     </w:p>
-    <w:bookmarkEnd w:id="215"/>
+    <w:bookmarkEnd w:id="216"/>
     <w:p>
       <w:pPr>
         <w:autoSpaceDE w:val="0"/>
@@ -19257,7 +19451,7 @@
         </w:rPr>
         <w:t xml:space="preserve">    </w:t>
       </w:r>
-      <w:bookmarkStart w:id="216" w:name="_mioConsistencyCheck189"/>
+      <w:bookmarkStart w:id="217" w:name="_mioConsistencyCheck189"/>
       <w:proofErr w:type="spellStart"/>
       <w:r>
         <w:rPr>
@@ -19299,10 +19493,11 @@
           <w:sz w:val="18"/>
           <w:szCs w:val="18"/>
         </w:rPr>
+        <w:lastRenderedPageBreak/>
         <w:t>}</w:t>
       </w:r>
     </w:p>
-    <w:bookmarkEnd w:id="216"/>
+    <w:bookmarkEnd w:id="217"/>
     <w:p>
       <w:pPr>
         <w:pStyle w:val="ListParagraph"/>
@@ -19681,7 +19876,7 @@
           <w:szCs w:val="18"/>
         </w:rPr>
       </w:pPr>
-      <w:bookmarkStart w:id="217" w:name="_mioConsistencyCheck190"/>
+      <w:bookmarkStart w:id="218" w:name="_mioConsistencyCheck190"/>
       <w:r>
         <w:rPr>
           <w:rFonts w:ascii="Courier New" w:hAnsi="Courier New" w:cs="Courier New"/>
@@ -19781,7 +19976,7 @@
         <w:t>}</w:t>
       </w:r>
     </w:p>
-    <w:bookmarkEnd w:id="217"/>
+    <w:bookmarkEnd w:id="218"/>
     <w:p>
       <w:pPr>
         <w:pStyle w:val="ListParagraph"/>
@@ -19798,7 +19993,6 @@
           <w:b/>
           <w:lang w:eastAsia="de-DE"/>
         </w:rPr>
-        <w:lastRenderedPageBreak/>
         <w:t>&lt;code snippet&gt;</w:t>
       </w:r>
     </w:p>
@@ -20084,6 +20278,7 @@
         <w:rPr>
           <w:noProof/>
         </w:rPr>
+        <w:lastRenderedPageBreak/>
         <w:drawing>
           <wp:inline distT="0" distB="0" distL="0" distR="0" wp14:anchorId="7F87441B" wp14:editId="034CB90C">
             <wp:extent cx="2373755" cy="2863883"/>
@@ -20241,7 +20436,6 @@
           <w:rFonts w:ascii="Source Sans 3" w:hAnsi="Source Sans 3"/>
           <w:noProof/>
         </w:rPr>
-        <w:lastRenderedPageBreak/>
         <w:drawing>
           <wp:inline distT="0" distB="0" distL="0" distR="0" wp14:anchorId="58B9EC1A" wp14:editId="6FA38C71">
             <wp:extent cx="5607946" cy="2598469"/>
@@ -20300,9 +20494,9 @@
           <w:lang w:eastAsia="de-DE"/>
         </w:rPr>
       </w:pPr>
-      <w:bookmarkStart w:id="218" w:name="_Toc212806544"/>
-      <w:bookmarkStart w:id="219" w:name="_mioConsistencyCheck411"/>
-      <w:bookmarkStart w:id="220" w:name="_mioConsistencyCheck116"/>
+      <w:bookmarkStart w:id="219" w:name="_Toc212806544"/>
+      <w:bookmarkStart w:id="220" w:name="_mioConsistencyCheck411"/>
+      <w:bookmarkStart w:id="221" w:name="_mioConsistencyCheck116"/>
       <w:r>
         <w:rPr>
           <w:rFonts w:ascii="Source Sans 3" w:hAnsi="Source Sans 3"/>
@@ -20314,7 +20508,7 @@
         </w:rPr>
         <w:t>Conclusion</w:t>
       </w:r>
-      <w:bookmarkEnd w:id="218"/>
+      <w:bookmarkEnd w:id="219"/>
       <w:r>
         <w:rPr>
           <w:b/>
@@ -20326,8 +20520,8 @@
         <w:t xml:space="preserve"> </w:t>
       </w:r>
     </w:p>
-    <w:bookmarkEnd w:id="219"/>
     <w:bookmarkEnd w:id="220"/>
+    <w:bookmarkEnd w:id="221"/>
     <w:p>
       <w:pPr>
         <w:pStyle w:val="Body"/>
@@ -20461,10 +20655,10 @@
           <w:lang w:eastAsia="de-DE"/>
         </w:rPr>
       </w:pPr>
-      <w:bookmarkStart w:id="221" w:name="_Toc212806545"/>
-      <w:bookmarkStart w:id="222" w:name="_mioConsistencyCheck412"/>
-      <w:bookmarkStart w:id="223" w:name="_mioConsistencyCheck117"/>
-      <w:bookmarkStart w:id="224" w:name="_mioConsistencyCheck418"/>
+      <w:bookmarkStart w:id="222" w:name="_Toc212806545"/>
+      <w:bookmarkStart w:id="223" w:name="_mioConsistencyCheck412"/>
+      <w:bookmarkStart w:id="224" w:name="_mioConsistencyCheck117"/>
+      <w:bookmarkStart w:id="225" w:name="_mioConsistencyCheck418"/>
       <w:r>
         <w:rPr>
           <w:rFonts w:ascii="Source Sans 3" w:hAnsi="Source Sans 3"/>
@@ -20477,10 +20671,10 @@
         <w:lastRenderedPageBreak/>
         <w:t>Code Example 2: IPC queues using HAL</w:t>
       </w:r>
-      <w:bookmarkEnd w:id="221"/>
-    </w:p>
-    <w:bookmarkEnd w:id="222"/>
+      <w:bookmarkEnd w:id="222"/>
+    </w:p>
     <w:bookmarkEnd w:id="223"/>
+    <w:bookmarkEnd w:id="224"/>
     <w:p>
       <w:pPr>
         <w:pStyle w:val="Body"/>
@@ -20496,14 +20690,14 @@
       <w:r>
         <w:t xml:space="preserve"> </w:t>
       </w:r>
-      <w:bookmarkStart w:id="225" w:name="_Toc212806546"/>
+      <w:bookmarkStart w:id="226" w:name="_Toc212806546"/>
       <w:r>
         <w:rPr>
           <w:rFonts w:ascii="Source Sans 3" w:hAnsi="Source Sans 3"/>
         </w:rPr>
         <w:t>Objective</w:t>
       </w:r>
-      <w:bookmarkEnd w:id="225"/>
+      <w:bookmarkEnd w:id="226"/>
     </w:p>
     <w:p>
       <w:pPr>
@@ -20527,14 +20721,14 @@
           <w:rFonts w:ascii="Source Sans 3" w:hAnsi="Source Sans 3"/>
         </w:rPr>
       </w:pPr>
-      <w:bookmarkStart w:id="226" w:name="_Toc212806547"/>
+      <w:bookmarkStart w:id="227" w:name="_Toc212806547"/>
       <w:r>
         <w:rPr>
           <w:rFonts w:ascii="Source Sans 3" w:hAnsi="Source Sans 3"/>
         </w:rPr>
         <w:t>Description</w:t>
       </w:r>
-      <w:bookmarkEnd w:id="226"/>
+      <w:bookmarkEnd w:id="227"/>
     </w:p>
     <w:p>
       <w:pPr>
@@ -20725,8 +20919,8 @@
           </wp:inline>
         </w:drawing>
       </w:r>
-      <w:bookmarkStart w:id="227" w:name="_mioConsistencyCheck310"/>
-      <w:bookmarkStart w:id="228" w:name="_mioConsistencyCheck85"/>
+      <w:bookmarkStart w:id="228" w:name="_mioConsistencyCheck310"/>
+      <w:bookmarkStart w:id="229" w:name="_mioConsistencyCheck85"/>
     </w:p>
     <w:p>
       <w:pPr>
@@ -20750,16 +20944,16 @@
       <w:pPr>
         <w:pStyle w:val="Heading2"/>
       </w:pPr>
-      <w:bookmarkStart w:id="229" w:name="_Toc212806548"/>
-      <w:bookmarkEnd w:id="227"/>
+      <w:bookmarkStart w:id="230" w:name="_Toc212806548"/>
       <w:bookmarkEnd w:id="228"/>
+      <w:bookmarkEnd w:id="229"/>
       <w:r>
         <w:rPr>
           <w:rFonts w:ascii="Source Sans 3" w:hAnsi="Source Sans 3"/>
         </w:rPr>
         <w:t>Flowchart</w:t>
       </w:r>
-      <w:bookmarkEnd w:id="229"/>
+      <w:bookmarkEnd w:id="230"/>
     </w:p>
     <w:p>
       <w:pPr>
@@ -20830,7 +21024,7 @@
       <w:pPr>
         <w:pStyle w:val="Heading2"/>
       </w:pPr>
-      <w:bookmarkStart w:id="230" w:name="_Toc212806549"/>
+      <w:bookmarkStart w:id="231" w:name="_Toc212806549"/>
       <w:r>
         <w:rPr>
           <w:rFonts w:ascii="Source Sans 3" w:hAnsi="Source Sans 3"/>
@@ -20838,7 +21032,7 @@
         <w:lastRenderedPageBreak/>
         <w:t>Hardware Block Diagram</w:t>
       </w:r>
-      <w:bookmarkEnd w:id="230"/>
+      <w:bookmarkEnd w:id="231"/>
     </w:p>
     <w:p>
       <w:pPr>
@@ -20903,21 +21097,21 @@
       <w:pPr>
         <w:pStyle w:val="Heading2"/>
       </w:pPr>
-      <w:bookmarkStart w:id="231" w:name="_Toc212806550"/>
+      <w:bookmarkStart w:id="232" w:name="_Toc212806550"/>
       <w:r>
         <w:rPr>
           <w:rFonts w:ascii="Source Sans 3" w:hAnsi="Source Sans 3"/>
         </w:rPr>
         <w:t>Hardware Setup</w:t>
       </w:r>
-      <w:bookmarkEnd w:id="231"/>
+      <w:bookmarkEnd w:id="232"/>
     </w:p>
     <w:p>
       <w:pPr>
         <w:pStyle w:val="Body"/>
       </w:pPr>
-      <w:bookmarkStart w:id="232" w:name="_mioConsistencyCheck312"/>
-      <w:bookmarkStart w:id="233" w:name="_mioConsistencyCheck86"/>
+      <w:bookmarkStart w:id="233" w:name="_mioConsistencyCheck312"/>
+      <w:bookmarkStart w:id="234" w:name="_mioConsistencyCheck86"/>
     </w:p>
     <w:p>
       <w:pPr>
@@ -20994,9 +21188,9 @@
       <w:pPr>
         <w:pStyle w:val="Heading2"/>
       </w:pPr>
-      <w:bookmarkStart w:id="234" w:name="_Toc212806551"/>
-      <w:bookmarkEnd w:id="232"/>
+      <w:bookmarkStart w:id="235" w:name="_Toc212806551"/>
       <w:bookmarkEnd w:id="233"/>
+      <w:bookmarkEnd w:id="234"/>
       <w:r>
         <w:rPr>
           <w:rFonts w:ascii="Source Sans 3" w:hAnsi="Source Sans 3"/>
@@ -21004,7 +21198,7 @@
         <w:lastRenderedPageBreak/>
         <w:t>Project Creation</w:t>
       </w:r>
-      <w:bookmarkEnd w:id="234"/>
+      <w:bookmarkEnd w:id="235"/>
       <w:r>
         <w:t xml:space="preserve"> </w:t>
       </w:r>
@@ -21339,8 +21533,8 @@
         </w:rPr>
         <w:t xml:space="preserve">Clicking Next will take you to the next menu of the Project Creator which will ask you to select an application. Select the </w:t>
       </w:r>
-      <w:bookmarkStart w:id="235" w:name="_mioConsistencyCheck290"/>
-      <w:bookmarkStart w:id="236" w:name="_mioConsistencyCheck71"/>
+      <w:bookmarkStart w:id="236" w:name="_mioConsistencyCheck290"/>
+      <w:bookmarkStart w:id="237" w:name="_mioConsistencyCheck71"/>
       <w:r>
         <w:rPr>
           <w:rFonts w:ascii="Source Sans 3" w:hAnsi="Source Sans 3"/>
@@ -21348,8 +21542,8 @@
         </w:rPr>
         <w:t>PSOC</w:t>
       </w:r>
-      <w:bookmarkEnd w:id="235"/>
       <w:bookmarkEnd w:id="236"/>
+      <w:bookmarkEnd w:id="237"/>
       <w:r>
         <w:rPr>
           <w:rFonts w:ascii="Source Sans 3" w:hAnsi="Source Sans 3"/>
@@ -21875,8 +22069,8 @@
           <w:lang w:eastAsia="de-DE"/>
         </w:rPr>
       </w:pPr>
-      <w:bookmarkStart w:id="237" w:name="_mioConsistencyCheck315"/>
-      <w:bookmarkStart w:id="238" w:name="_mioConsistencyCheck87"/>
+      <w:bookmarkStart w:id="238" w:name="_mioConsistencyCheck315"/>
+      <w:bookmarkStart w:id="239" w:name="_mioConsistencyCheck87"/>
     </w:p>
     <w:p>
       <w:pPr>
@@ -21963,8 +22157,8 @@
         </w:rPr>
       </w:pPr>
     </w:p>
-    <w:bookmarkEnd w:id="237"/>
     <w:bookmarkEnd w:id="238"/>
+    <w:bookmarkEnd w:id="239"/>
     <w:p>
       <w:pPr>
         <w:pStyle w:val="ListParagraph"/>
@@ -22621,7 +22815,7 @@
           <w:noProof/>
         </w:rPr>
       </w:pPr>
-      <w:bookmarkStart w:id="239" w:name="_Hlk147320247"/>
+      <w:bookmarkStart w:id="240" w:name="_Hlk147320247"/>
       <w:r>
         <w:rPr>
           <w:rFonts w:ascii="Source Sans 3" w:hAnsi="Source Sans 3"/>
@@ -23516,8 +23710,8 @@
           <w:bCs/>
         </w:rPr>
       </w:pPr>
-      <w:bookmarkStart w:id="240" w:name="_Hlk147320439"/>
-      <w:bookmarkEnd w:id="239"/>
+      <w:bookmarkStart w:id="241" w:name="_Hlk147320439"/>
+      <w:bookmarkEnd w:id="240"/>
       <w:r>
         <w:rPr>
           <w:rFonts w:ascii="Source Sans 3" w:hAnsi="Source Sans 3"/>
@@ -23741,7 +23935,7 @@
           <w:szCs w:val="18"/>
         </w:rPr>
       </w:pPr>
-      <w:bookmarkStart w:id="241" w:name="_mioConsistencyCheck191"/>
+      <w:bookmarkStart w:id="242" w:name="_mioConsistencyCheck191"/>
       <w:r>
         <w:rPr>
           <w:rFonts w:ascii="Courier New" w:hAnsi="Courier New" w:cs="Courier New"/>
@@ -23772,7 +23966,7 @@
         <w:t>"</w:t>
       </w:r>
     </w:p>
-    <w:bookmarkEnd w:id="241"/>
+    <w:bookmarkEnd w:id="242"/>
     <w:p>
       <w:pPr>
         <w:autoSpaceDE w:val="0"/>
@@ -23869,7 +24063,7 @@
           <w:szCs w:val="18"/>
         </w:rPr>
       </w:pPr>
-      <w:bookmarkStart w:id="242" w:name="_mioConsistencyCheck192"/>
+      <w:bookmarkStart w:id="243" w:name="_mioConsistencyCheck192"/>
       <w:r>
         <w:rPr>
           <w:rFonts w:ascii="Courier New" w:hAnsi="Courier New" w:cs="Courier New"/>
@@ -23985,10 +24179,10 @@
           <w:szCs w:val="18"/>
         </w:rPr>
       </w:pPr>
-      <w:bookmarkStart w:id="243" w:name="_mioConsistencyCheck318"/>
-      <w:bookmarkStart w:id="244" w:name="_mioConsistencyCheck88"/>
-      <w:bookmarkEnd w:id="243"/>
+      <w:bookmarkStart w:id="244" w:name="_mioConsistencyCheck318"/>
+      <w:bookmarkStart w:id="245" w:name="_mioConsistencyCheck88"/>
       <w:bookmarkEnd w:id="244"/>
+      <w:bookmarkEnd w:id="245"/>
       <w:r>
         <w:rPr>
           <w:rFonts w:ascii="Courier New" w:hAnsi="Courier New" w:cs="Courier New"/>
@@ -24109,7 +24303,7 @@
         <w:t>#define MAX_TRNG_BIT_SIZE       (32UL)</w:t>
       </w:r>
     </w:p>
-    <w:bookmarkEnd w:id="242"/>
+    <w:bookmarkEnd w:id="243"/>
     <w:p>
       <w:pPr>
         <w:pStyle w:val="TableTitle"/>
@@ -24159,14 +24353,14 @@
         </w:rPr>
         <w:t xml:space="preserve"> </w:t>
       </w:r>
-      <w:bookmarkStart w:id="245" w:name="_Hlk147313194"/>
+      <w:bookmarkStart w:id="246" w:name="_Hlk147313194"/>
       <w:r>
         <w:rPr>
           <w:rFonts w:ascii="Source Sans 3" w:hAnsi="Source Sans 3"/>
         </w:rPr>
         <w:t xml:space="preserve">&lt;code snippet&gt; </w:t>
       </w:r>
-      <w:bookmarkEnd w:id="245"/>
+      <w:bookmarkEnd w:id="246"/>
       <w:r>
         <w:rPr>
           <w:rFonts w:ascii="Source Sans 3" w:hAnsi="Source Sans 3"/>
@@ -24189,7 +24383,7 @@
         </w:rPr>
         <w:t xml:space="preserve"> file</w:t>
       </w:r>
-      <w:bookmarkEnd w:id="240"/>
+      <w:bookmarkEnd w:id="241"/>
       <w:r>
         <w:rPr>
           <w:rFonts w:ascii="Source Sans 3" w:hAnsi="Source Sans 3"/>
@@ -24338,7 +24532,7 @@
           <w:szCs w:val="18"/>
         </w:rPr>
       </w:pPr>
-      <w:bookmarkStart w:id="246" w:name="_mioConsistencyCheck193"/>
+      <w:bookmarkStart w:id="247" w:name="_mioConsistencyCheck193"/>
       <w:r>
         <w:rPr>
           <w:rFonts w:ascii="Courier New" w:hAnsi="Courier New" w:cs="Courier New"/>
@@ -25254,7 +25448,7 @@
         <w:t xml:space="preserve"> = WDT_FLAG_RESET;</w:t>
       </w:r>
     </w:p>
-    <w:bookmarkEnd w:id="246"/>
+    <w:bookmarkEnd w:id="247"/>
     <w:p>
       <w:pPr>
         <w:autoSpaceDE w:val="0"/>
@@ -25365,7 +25559,7 @@
           <w:szCs w:val="18"/>
         </w:rPr>
       </w:pPr>
-      <w:bookmarkStart w:id="247" w:name="_mioConsistencyCheck194"/>
+      <w:bookmarkStart w:id="248" w:name="_mioConsistencyCheck194"/>
       <w:r>
         <w:rPr>
           <w:rFonts w:ascii="Courier New" w:hAnsi="Courier New" w:cs="Courier New"/>
@@ -25396,7 +25590,7 @@
         <w:t>(void);</w:t>
       </w:r>
     </w:p>
-    <w:bookmarkEnd w:id="247"/>
+    <w:bookmarkEnd w:id="248"/>
     <w:p>
       <w:pPr>
         <w:autoSpaceDE w:val="0"/>
@@ -25561,7 +25755,7 @@
           <w:lang w:val="en-IN"/>
         </w:rPr>
       </w:pPr>
-      <w:bookmarkStart w:id="248" w:name="_Hlk147320910"/>
+      <w:bookmarkStart w:id="249" w:name="_Hlk147320910"/>
       <w:r>
         <w:rPr>
           <w:rFonts w:ascii="Source Sans 3" w:hAnsi="Source Sans 3"/>
@@ -25570,7 +25764,7 @@
         <w:t>The below code is the variables required for the communication between the cores:</w:t>
       </w:r>
     </w:p>
-    <w:bookmarkEnd w:id="248"/>
+    <w:bookmarkEnd w:id="249"/>
     <w:p>
       <w:pPr>
         <w:autoSpaceDE w:val="0"/>
@@ -25792,7 +25986,7 @@
         <w:lastRenderedPageBreak/>
         <w:t xml:space="preserve">    </w:t>
       </w:r>
-      <w:bookmarkStart w:id="249" w:name="_mioConsistencyCheck195"/>
+      <w:bookmarkStart w:id="250" w:name="_mioConsistencyCheck195"/>
       <w:proofErr w:type="spellStart"/>
       <w:r>
         <w:rPr>
@@ -25834,7 +26028,7 @@
         <w:t>;</w:t>
       </w:r>
     </w:p>
-    <w:bookmarkEnd w:id="249"/>
+    <w:bookmarkEnd w:id="250"/>
     <w:p>
       <w:pPr>
         <w:autoSpaceDE w:val="0"/>
@@ -25857,7 +26051,7 @@
         </w:rPr>
         <w:t xml:space="preserve">    </w:t>
       </w:r>
-      <w:bookmarkStart w:id="250" w:name="_mioConsistencyCheck196"/>
+      <w:bookmarkStart w:id="251" w:name="_mioConsistencyCheck196"/>
       <w:proofErr w:type="spellStart"/>
       <w:r>
         <w:rPr>
@@ -25899,7 +26093,7 @@
         <w:t>;</w:t>
       </w:r>
     </w:p>
-    <w:bookmarkEnd w:id="250"/>
+    <w:bookmarkEnd w:id="251"/>
     <w:p>
       <w:pPr>
         <w:autoSpaceDE w:val="0"/>
@@ -25922,7 +26116,7 @@
         </w:rPr>
         <w:t xml:space="preserve">    </w:t>
       </w:r>
-      <w:bookmarkStart w:id="251" w:name="_mioConsistencyCheck197"/>
+      <w:bookmarkStart w:id="252" w:name="_mioConsistencyCheck197"/>
       <w:proofErr w:type="spellStart"/>
       <w:r>
         <w:rPr>
@@ -25964,7 +26158,7 @@
         <w:t>;</w:t>
       </w:r>
     </w:p>
-    <w:bookmarkEnd w:id="251"/>
+    <w:bookmarkEnd w:id="252"/>
     <w:p>
       <w:pPr>
         <w:autoSpaceDE w:val="0"/>
@@ -25988,7 +26182,7 @@
         </w:rPr>
         <w:t xml:space="preserve">    </w:t>
       </w:r>
-      <w:bookmarkStart w:id="252" w:name="_mioConsistencyCheck198"/>
+      <w:bookmarkStart w:id="253" w:name="_mioConsistencyCheck198"/>
       <w:r>
         <w:rPr>
           <w:rFonts w:ascii="Courier New" w:hAnsi="Courier New" w:cs="Courier New"/>
@@ -26025,7 +26219,7 @@
         <w:t xml:space="preserve">    cyhal_ipc_t task0_queue2;</w:t>
       </w:r>
     </w:p>
-    <w:bookmarkEnd w:id="252"/>
+    <w:bookmarkEnd w:id="253"/>
     <w:p>
       <w:pPr>
         <w:autoSpaceDE w:val="0"/>
@@ -26049,7 +26243,7 @@
         </w:rPr>
         <w:t xml:space="preserve">     </w:t>
       </w:r>
-      <w:bookmarkStart w:id="253" w:name="_mioConsistencyCheck199"/>
+      <w:bookmarkStart w:id="254" w:name="_mioConsistencyCheck199"/>
       <w:r>
         <w:rPr>
           <w:rFonts w:ascii="Courier New" w:hAnsi="Courier New" w:cs="Courier New"/>
@@ -26060,7 +26254,7 @@
         <w:t>void *queue1_pool, *queue2_pool;</w:t>
       </w:r>
     </w:p>
-    <w:bookmarkEnd w:id="253"/>
+    <w:bookmarkEnd w:id="254"/>
     <w:p>
       <w:pPr>
         <w:autoSpaceDE w:val="0"/>
@@ -26084,7 +26278,7 @@
         </w:rPr>
         <w:t xml:space="preserve">    </w:t>
       </w:r>
-      <w:bookmarkStart w:id="254" w:name="_mioConsistencyCheck200"/>
+      <w:bookmarkStart w:id="255" w:name="_mioConsistencyCheck200"/>
       <w:r>
         <w:rPr>
           <w:rFonts w:ascii="Courier New" w:hAnsi="Courier New" w:cs="Courier New"/>
@@ -26096,7 +26290,7 @@
         <w:t>cyhal_ipc_queue_t *queue1_handle, *queue2_handle;</w:t>
       </w:r>
     </w:p>
-    <w:bookmarkEnd w:id="254"/>
+    <w:bookmarkEnd w:id="255"/>
     <w:p>
       <w:pPr>
         <w:autoSpaceDE w:val="0"/>
@@ -26135,7 +26329,7 @@
         </w:rPr>
         <w:t xml:space="preserve">    </w:t>
       </w:r>
-      <w:bookmarkStart w:id="255" w:name="_mioConsistencyCheck201"/>
+      <w:bookmarkStart w:id="256" w:name="_mioConsistencyCheck201"/>
       <w:r>
         <w:rPr>
           <w:rFonts w:ascii="Courier New" w:hAnsi="Courier New" w:cs="Courier New"/>
@@ -26212,7 +26406,7 @@
         <w:t xml:space="preserve">    uint32_t task0_cmd = 0;</w:t>
       </w:r>
     </w:p>
-    <w:bookmarkEnd w:id="255"/>
+    <w:bookmarkEnd w:id="256"/>
     <w:p>
       <w:pPr>
         <w:autoSpaceDE w:val="0"/>
@@ -26428,7 +26622,7 @@
           <w:szCs w:val="18"/>
         </w:rPr>
       </w:pPr>
-      <w:bookmarkStart w:id="256" w:name="_mioConsistencyCheck202"/>
+      <w:bookmarkStart w:id="257" w:name="_mioConsistencyCheck202"/>
       <w:r>
         <w:rPr>
           <w:rFonts w:ascii="Courier New" w:hAnsi="Courier New" w:cs="Courier New"/>
@@ -26506,7 +26700,7 @@
         <w:t>(task0_msg));</w:t>
       </w:r>
     </w:p>
-    <w:bookmarkEnd w:id="256"/>
+    <w:bookmarkEnd w:id="257"/>
     <w:p>
       <w:pPr>
         <w:pStyle w:val="Body"/>
@@ -26682,7 +26876,7 @@
           <w:szCs w:val="18"/>
         </w:rPr>
       </w:pPr>
-      <w:bookmarkStart w:id="257" w:name="_mioConsistencyCheck203"/>
+      <w:bookmarkStart w:id="258" w:name="_mioConsistencyCheck203"/>
       <w:r>
         <w:rPr>
           <w:rFonts w:ascii="Courier New" w:hAnsi="Courier New" w:cs="Courier New"/>
@@ -27178,7 +27372,7 @@
         <w:t>(task0_msg);</w:t>
       </w:r>
     </w:p>
-    <w:bookmarkEnd w:id="257"/>
+    <w:bookmarkEnd w:id="258"/>
     <w:p>
       <w:pPr>
         <w:pStyle w:val="Body"/>
@@ -27355,7 +27549,7 @@
           <w:szCs w:val="18"/>
         </w:rPr>
       </w:pPr>
-      <w:bookmarkStart w:id="258" w:name="_mioConsistencyCheck204"/>
+      <w:bookmarkStart w:id="259" w:name="_mioConsistencyCheck204"/>
       <w:r>
         <w:rPr>
           <w:rFonts w:ascii="Courier New" w:hAnsi="Courier New" w:cs="Courier New"/>
@@ -27677,7 +27871,7 @@
         <w:t>(&amp;task0_queue1, CYHAL_IPC_QUEUE_WRITE, (uint8_t)IPC_QUEUE_IRQ_PRIORITY, true);</w:t>
       </w:r>
     </w:p>
-    <w:bookmarkEnd w:id="258"/>
+    <w:bookmarkEnd w:id="259"/>
     <w:p>
       <w:pPr>
         <w:pStyle w:val="NormalWeb"/>
@@ -27838,7 +28032,7 @@
           <w:szCs w:val="18"/>
         </w:rPr>
       </w:pPr>
-      <w:bookmarkStart w:id="259" w:name="_mioConsistencyCheck205"/>
+      <w:bookmarkStart w:id="260" w:name="_mioConsistencyCheck205"/>
       <w:r>
         <w:rPr>
           <w:rFonts w:ascii="Courier New" w:hAnsi="Courier New" w:cs="Courier New"/>
@@ -27849,7 +28043,7 @@
         <w:t>Cy_SysEnableCM55(CY_CM55_APP_BOOT_ADDR, CM55_BOOT_WAIT_TIME_US);</w:t>
       </w:r>
     </w:p>
-    <w:bookmarkEnd w:id="259"/>
+    <w:bookmarkEnd w:id="260"/>
     <w:p>
       <w:pPr>
         <w:pStyle w:val="Body"/>
@@ -28119,7 +28313,7 @@
           <w:szCs w:val="18"/>
         </w:rPr>
       </w:pPr>
-      <w:bookmarkStart w:id="260" w:name="_mioConsistencyCheck206"/>
+      <w:bookmarkStart w:id="261" w:name="_mioConsistencyCheck206"/>
       <w:r>
         <w:rPr>
           <w:rFonts w:ascii="Courier New" w:hAnsi="Courier New" w:cs="Courier New"/>
@@ -28154,7 +28348,7 @@
         <w:t>{</w:t>
       </w:r>
     </w:p>
-    <w:bookmarkEnd w:id="260"/>
+    <w:bookmarkEnd w:id="261"/>
     <w:p>
       <w:pPr>
         <w:autoSpaceDE w:val="0"/>
@@ -28177,7 +28371,7 @@
         </w:rPr>
         <w:t xml:space="preserve">    </w:t>
       </w:r>
-      <w:bookmarkStart w:id="261" w:name="_mioConsistencyCheck207"/>
+      <w:bookmarkStart w:id="262" w:name="_mioConsistencyCheck207"/>
       <w:proofErr w:type="spellStart"/>
       <w:r>
         <w:rPr>
@@ -28447,8 +28641,8 @@
           <w:szCs w:val="18"/>
         </w:rPr>
       </w:pPr>
-      <w:bookmarkStart w:id="262" w:name="_mioConsistencyCheck208"/>
-      <w:bookmarkEnd w:id="261"/>
+      <w:bookmarkStart w:id="263" w:name="_mioConsistencyCheck208"/>
+      <w:bookmarkEnd w:id="262"/>
       <w:r>
         <w:rPr>
           <w:rFonts w:ascii="Courier New" w:hAnsi="Courier New" w:cs="Courier New"/>
@@ -28504,8 +28698,8 @@
           <w:szCs w:val="18"/>
         </w:rPr>
       </w:pPr>
-      <w:bookmarkStart w:id="263" w:name="_mioConsistencyCheck209"/>
-      <w:bookmarkEnd w:id="262"/>
+      <w:bookmarkStart w:id="264" w:name="_mioConsistencyCheck209"/>
+      <w:bookmarkEnd w:id="263"/>
       <w:r>
         <w:rPr>
           <w:rFonts w:ascii="Courier New" w:hAnsi="Courier New" w:cs="Courier New"/>
@@ -28538,8 +28732,8 @@
           <w:szCs w:val="18"/>
         </w:rPr>
       </w:pPr>
-      <w:bookmarkStart w:id="264" w:name="_mioConsistencyCheck210"/>
-      <w:bookmarkEnd w:id="263"/>
+      <w:bookmarkStart w:id="265" w:name="_mioConsistencyCheck210"/>
+      <w:bookmarkEnd w:id="264"/>
       <w:r>
         <w:rPr>
           <w:rFonts w:ascii="Courier New" w:hAnsi="Courier New" w:cs="Courier New"/>
@@ -28594,8 +28788,8 @@
           <w:szCs w:val="18"/>
         </w:rPr>
       </w:pPr>
-      <w:bookmarkStart w:id="265" w:name="_mioConsistencyCheck211"/>
-      <w:bookmarkEnd w:id="264"/>
+      <w:bookmarkStart w:id="266" w:name="_mioConsistencyCheck211"/>
+      <w:bookmarkEnd w:id="265"/>
       <w:r>
         <w:rPr>
           <w:rFonts w:ascii="Courier New" w:hAnsi="Courier New" w:cs="Courier New"/>
@@ -28857,8 +29051,8 @@
           <w:szCs w:val="18"/>
         </w:rPr>
       </w:pPr>
-      <w:bookmarkStart w:id="266" w:name="_mioConsistencyCheck212"/>
-      <w:bookmarkEnd w:id="265"/>
+      <w:bookmarkStart w:id="267" w:name="_mioConsistencyCheck212"/>
+      <w:bookmarkEnd w:id="266"/>
       <w:r>
         <w:rPr>
           <w:rFonts w:ascii="Courier New" w:hAnsi="Courier New" w:cs="Courier New"/>
@@ -28976,8 +29170,8 @@
           <w:szCs w:val="18"/>
         </w:rPr>
       </w:pPr>
-      <w:bookmarkStart w:id="267" w:name="_mioConsistencyCheck213"/>
-      <w:bookmarkEnd w:id="266"/>
+      <w:bookmarkStart w:id="268" w:name="_mioConsistencyCheck213"/>
+      <w:bookmarkEnd w:id="267"/>
       <w:r>
         <w:rPr>
           <w:rFonts w:ascii="Courier New" w:hAnsi="Courier New" w:cs="Courier New"/>
@@ -29072,8 +29266,8 @@
           <w:szCs w:val="18"/>
         </w:rPr>
       </w:pPr>
-      <w:bookmarkStart w:id="268" w:name="_mioConsistencyCheck214"/>
-      <w:bookmarkEnd w:id="267"/>
+      <w:bookmarkStart w:id="269" w:name="_mioConsistencyCheck214"/>
+      <w:bookmarkEnd w:id="268"/>
       <w:r>
         <w:rPr>
           <w:rFonts w:ascii="Courier New" w:hAnsi="Courier New" w:cs="Courier New"/>
@@ -29315,8 +29509,8 @@
           <w:szCs w:val="18"/>
         </w:rPr>
       </w:pPr>
-      <w:bookmarkStart w:id="269" w:name="_mioConsistencyCheck215"/>
-      <w:bookmarkEnd w:id="268"/>
+      <w:bookmarkStart w:id="270" w:name="_mioConsistencyCheck215"/>
+      <w:bookmarkEnd w:id="269"/>
       <w:r>
         <w:rPr>
           <w:rFonts w:ascii="Courier New" w:hAnsi="Courier New" w:cs="Courier New"/>
@@ -29403,8 +29597,8 @@
           <w:szCs w:val="18"/>
         </w:rPr>
       </w:pPr>
-      <w:bookmarkStart w:id="270" w:name="_mioConsistencyCheck216"/>
-      <w:bookmarkEnd w:id="269"/>
+      <w:bookmarkStart w:id="271" w:name="_mioConsistencyCheck216"/>
+      <w:bookmarkEnd w:id="270"/>
       <w:r>
         <w:rPr>
           <w:rFonts w:ascii="Courier New" w:hAnsi="Courier New" w:cs="Courier New"/>
@@ -29460,8 +29654,8 @@
           <w:szCs w:val="18"/>
         </w:rPr>
       </w:pPr>
-      <w:bookmarkStart w:id="271" w:name="_mioConsistencyCheck217"/>
-      <w:bookmarkEnd w:id="270"/>
+      <w:bookmarkStart w:id="272" w:name="_mioConsistencyCheck217"/>
+      <w:bookmarkEnd w:id="271"/>
       <w:r>
         <w:rPr>
           <w:rFonts w:ascii="Courier New" w:hAnsi="Courier New" w:cs="Courier New"/>
@@ -29494,8 +29688,8 @@
           <w:szCs w:val="18"/>
         </w:rPr>
       </w:pPr>
-      <w:bookmarkStart w:id="272" w:name="_mioConsistencyCheck218"/>
-      <w:bookmarkEnd w:id="271"/>
+      <w:bookmarkStart w:id="273" w:name="_mioConsistencyCheck218"/>
+      <w:bookmarkEnd w:id="272"/>
       <w:r>
         <w:rPr>
           <w:rFonts w:ascii="Courier New" w:hAnsi="Courier New" w:cs="Courier New"/>
@@ -29559,8 +29753,8 @@
           <w:szCs w:val="18"/>
         </w:rPr>
       </w:pPr>
-      <w:bookmarkStart w:id="273" w:name="_mioConsistencyCheck219"/>
-      <w:bookmarkEnd w:id="272"/>
+      <w:bookmarkStart w:id="274" w:name="_mioConsistencyCheck219"/>
+      <w:bookmarkEnd w:id="273"/>
       <w:r>
         <w:rPr>
           <w:rFonts w:ascii="Courier New" w:hAnsi="Courier New" w:cs="Courier New"/>
@@ -29782,8 +29976,8 @@
           <w:szCs w:val="18"/>
         </w:rPr>
       </w:pPr>
-      <w:bookmarkStart w:id="274" w:name="_mioConsistencyCheck220"/>
-      <w:bookmarkEnd w:id="273"/>
+      <w:bookmarkStart w:id="275" w:name="_mioConsistencyCheck220"/>
+      <w:bookmarkEnd w:id="274"/>
       <w:r>
         <w:rPr>
           <w:rFonts w:ascii="Courier New" w:hAnsi="Courier New" w:cs="Courier New"/>
@@ -29839,8 +30033,8 @@
           <w:szCs w:val="18"/>
         </w:rPr>
       </w:pPr>
-      <w:bookmarkStart w:id="275" w:name="_mioConsistencyCheck221"/>
-      <w:bookmarkEnd w:id="274"/>
+      <w:bookmarkStart w:id="276" w:name="_mioConsistencyCheck221"/>
+      <w:bookmarkEnd w:id="275"/>
       <w:r>
         <w:rPr>
           <w:rFonts w:ascii="Courier New" w:hAnsi="Courier New" w:cs="Courier New"/>
@@ -29873,8 +30067,8 @@
           <w:szCs w:val="18"/>
         </w:rPr>
       </w:pPr>
-      <w:bookmarkStart w:id="276" w:name="_mioConsistencyCheck222"/>
-      <w:bookmarkEnd w:id="275"/>
+      <w:bookmarkStart w:id="277" w:name="_mioConsistencyCheck222"/>
+      <w:bookmarkEnd w:id="276"/>
       <w:r>
         <w:rPr>
           <w:rFonts w:ascii="Courier New" w:hAnsi="Courier New" w:cs="Courier New"/>
@@ -29907,8 +30101,8 @@
           <w:szCs w:val="18"/>
         </w:rPr>
       </w:pPr>
-      <w:bookmarkStart w:id="277" w:name="_mioConsistencyCheck223"/>
-      <w:bookmarkEnd w:id="276"/>
+      <w:bookmarkStart w:id="278" w:name="_mioConsistencyCheck223"/>
+      <w:bookmarkEnd w:id="277"/>
       <w:r>
         <w:rPr>
           <w:rFonts w:ascii="Courier New" w:hAnsi="Courier New" w:cs="Courier New"/>
@@ -29972,8 +30166,8 @@
           <w:szCs w:val="18"/>
         </w:rPr>
       </w:pPr>
-      <w:bookmarkStart w:id="278" w:name="_mioConsistencyCheck224"/>
-      <w:bookmarkEnd w:id="277"/>
+      <w:bookmarkStart w:id="279" w:name="_mioConsistencyCheck224"/>
+      <w:bookmarkEnd w:id="278"/>
       <w:r>
         <w:rPr>
           <w:rFonts w:ascii="Courier New" w:hAnsi="Courier New" w:cs="Courier New"/>
@@ -30195,8 +30389,8 @@
           <w:szCs w:val="18"/>
         </w:rPr>
       </w:pPr>
-      <w:bookmarkStart w:id="279" w:name="_mioConsistencyCheck225"/>
-      <w:bookmarkEnd w:id="278"/>
+      <w:bookmarkStart w:id="280" w:name="_mioConsistencyCheck225"/>
+      <w:bookmarkEnd w:id="279"/>
       <w:r>
         <w:rPr>
           <w:rFonts w:ascii="Courier New" w:hAnsi="Courier New" w:cs="Courier New"/>
@@ -30295,8 +30489,8 @@
           <w:szCs w:val="18"/>
         </w:rPr>
       </w:pPr>
-      <w:bookmarkStart w:id="280" w:name="_mioConsistencyCheck226"/>
-      <w:bookmarkEnd w:id="279"/>
+      <w:bookmarkStart w:id="281" w:name="_mioConsistencyCheck226"/>
+      <w:bookmarkEnd w:id="280"/>
       <w:r>
         <w:rPr>
           <w:rFonts w:ascii="Courier New" w:hAnsi="Courier New" w:cs="Courier New"/>
@@ -30329,8 +30523,8 @@
           <w:szCs w:val="18"/>
         </w:rPr>
       </w:pPr>
-      <w:bookmarkStart w:id="281" w:name="_mioConsistencyCheck227"/>
-      <w:bookmarkEnd w:id="280"/>
+      <w:bookmarkStart w:id="282" w:name="_mioConsistencyCheck227"/>
+      <w:bookmarkEnd w:id="281"/>
       <w:r>
         <w:rPr>
           <w:rFonts w:ascii="Courier New" w:hAnsi="Courier New" w:cs="Courier New"/>
@@ -30396,7 +30590,7 @@
         <w:t xml:space="preserve">        }</w:t>
       </w:r>
     </w:p>
-    <w:bookmarkEnd w:id="281"/>
+    <w:bookmarkEnd w:id="282"/>
     <w:p>
       <w:pPr>
         <w:autoSpaceDE w:val="0"/>
@@ -30434,7 +30628,7 @@
         </w:rPr>
         <w:t xml:space="preserve">    </w:t>
       </w:r>
-      <w:bookmarkStart w:id="282" w:name="_mioConsistencyCheck228"/>
+      <w:bookmarkStart w:id="283" w:name="_mioConsistencyCheck228"/>
       <w:r>
         <w:rPr>
           <w:rFonts w:ascii="Courier New" w:hAnsi="Courier New" w:cs="Courier New"/>
@@ -30468,7 +30662,7 @@
         <w:t>(&amp;task0_queue1)) */</w:t>
       </w:r>
     </w:p>
-    <w:bookmarkEnd w:id="282"/>
+    <w:bookmarkEnd w:id="283"/>
     <w:p>
       <w:pPr>
         <w:autoSpaceDE w:val="0"/>
@@ -30650,7 +30844,7 @@
           <w:szCs w:val="18"/>
         </w:rPr>
       </w:pPr>
-      <w:bookmarkStart w:id="283" w:name="_mioConsistencyCheck229"/>
+      <w:bookmarkStart w:id="284" w:name="_mioConsistencyCheck229"/>
       <w:r>
         <w:rPr>
           <w:rFonts w:ascii="Courier New" w:hAnsi="Courier New" w:cs="Courier New"/>
@@ -30727,7 +30921,7 @@
         <w:t xml:space="preserve">        /* Generate a random number */</w:t>
       </w:r>
     </w:p>
-    <w:bookmarkEnd w:id="283"/>
+    <w:bookmarkEnd w:id="284"/>
     <w:p>
       <w:pPr>
         <w:autoSpaceDE w:val="0"/>
@@ -30750,7 +30944,7 @@
         </w:rPr>
         <w:t xml:space="preserve">        </w:t>
       </w:r>
-      <w:bookmarkStart w:id="284" w:name="_mioConsistencyCheck230"/>
+      <w:bookmarkStart w:id="285" w:name="_mioConsistencyCheck230"/>
       <w:proofErr w:type="spellStart"/>
       <w:r>
         <w:rPr>
@@ -31234,7 +31428,7 @@
         <w:t xml:space="preserve">        }</w:t>
       </w:r>
     </w:p>
-    <w:bookmarkEnd w:id="284"/>
+    <w:bookmarkEnd w:id="285"/>
     <w:p>
       <w:pPr>
         <w:autoSpaceDE w:val="0"/>
@@ -31271,7 +31465,7 @@
         </w:rPr>
         <w:t xml:space="preserve">        </w:t>
       </w:r>
-      <w:bookmarkStart w:id="285" w:name="_mioConsistencyCheck231"/>
+      <w:bookmarkStart w:id="286" w:name="_mioConsistencyCheck231"/>
       <w:proofErr w:type="spellStart"/>
       <w:r>
         <w:rPr>
@@ -31348,7 +31542,7 @@
         <w:t xml:space="preserve"> */</w:t>
       </w:r>
     </w:p>
-    <w:bookmarkEnd w:id="285"/>
+    <w:bookmarkEnd w:id="286"/>
     <w:p>
       <w:pPr>
         <w:pStyle w:val="NormalWeb"/>
@@ -31686,7 +31880,7 @@
           <w:szCs w:val="18"/>
         </w:rPr>
       </w:pPr>
-      <w:bookmarkStart w:id="286" w:name="_mioConsistencyCheck232"/>
+      <w:bookmarkStart w:id="287" w:name="_mioConsistencyCheck232"/>
       <w:r>
         <w:rPr>
           <w:rFonts w:ascii="Courier New" w:hAnsi="Courier New" w:cs="Courier New"/>
@@ -31820,7 +32014,7 @@
         <w:t xml:space="preserve">    /* Get the Watchdog Interrupt Status */</w:t>
       </w:r>
     </w:p>
-    <w:bookmarkEnd w:id="286"/>
+    <w:bookmarkEnd w:id="287"/>
     <w:p>
       <w:pPr>
         <w:autoSpaceDE w:val="0"/>
@@ -31843,7 +32037,7 @@
         </w:rPr>
         <w:t xml:space="preserve">    </w:t>
       </w:r>
-      <w:bookmarkStart w:id="287" w:name="_mioConsistencyCheck233"/>
+      <w:bookmarkStart w:id="288" w:name="_mioConsistencyCheck233"/>
       <w:proofErr w:type="spellStart"/>
       <w:r>
         <w:rPr>
@@ -31988,7 +32182,7 @@
         <w:t xml:space="preserve">        /* Clear Watchdog Interrupt */</w:t>
       </w:r>
     </w:p>
-    <w:bookmarkEnd w:id="287"/>
+    <w:bookmarkEnd w:id="288"/>
     <w:p>
       <w:pPr>
         <w:autoSpaceDE w:val="0"/>
@@ -32011,7 +32205,7 @@
         </w:rPr>
         <w:t xml:space="preserve">        </w:t>
       </w:r>
-      <w:bookmarkStart w:id="288" w:name="_mioConsistencyCheck234"/>
+      <w:bookmarkStart w:id="289" w:name="_mioConsistencyCheck234"/>
       <w:proofErr w:type="spellStart"/>
       <w:r>
         <w:rPr>
@@ -32033,7 +32227,7 @@
         <w:t>(MCWDT_HW, CY_MCWDT_CTR0);</w:t>
       </w:r>
     </w:p>
-    <w:bookmarkEnd w:id="288"/>
+    <w:bookmarkEnd w:id="289"/>
     <w:p>
       <w:pPr>
         <w:autoSpaceDE w:val="0"/>
@@ -32071,7 +32265,7 @@
         </w:rPr>
         <w:t xml:space="preserve">        </w:t>
       </w:r>
-      <w:bookmarkStart w:id="289" w:name="_mioConsistencyCheck235"/>
+      <w:bookmarkStart w:id="290" w:name="_mioConsistencyCheck235"/>
       <w:r>
         <w:rPr>
           <w:rFonts w:ascii="Courier New" w:hAnsi="Courier New" w:cs="Courier New"/>
@@ -32083,7 +32277,7 @@
         <w:t>wdt_flag = WDT_FLAG_SET;</w:t>
       </w:r>
     </w:p>
-    <w:bookmarkEnd w:id="289"/>
+    <w:bookmarkEnd w:id="290"/>
     <w:p>
       <w:pPr>
         <w:autoSpaceDE w:val="0"/>
@@ -32107,7 +32301,7 @@
         </w:rPr>
         <w:t xml:space="preserve">    </w:t>
       </w:r>
-      <w:bookmarkStart w:id="290" w:name="_mioConsistencyCheck236"/>
+      <w:bookmarkStart w:id="291" w:name="_mioConsistencyCheck236"/>
       <w:r>
         <w:rPr>
           <w:rFonts w:ascii="Courier New" w:hAnsi="Courier New" w:cs="Courier New"/>
@@ -32141,7 +32335,7 @@
         <w:t>}</w:t>
       </w:r>
     </w:p>
-    <w:bookmarkEnd w:id="290"/>
+    <w:bookmarkEnd w:id="291"/>
     <w:p>
       <w:pPr>
         <w:pStyle w:val="Body"/>
@@ -32710,7 +32904,7 @@
           <w:szCs w:val="18"/>
         </w:rPr>
       </w:pPr>
-      <w:bookmarkStart w:id="291" w:name="_mioConsistencyCheck237"/>
+      <w:bookmarkStart w:id="292" w:name="_mioConsistencyCheck237"/>
       <w:r>
         <w:rPr>
           <w:rFonts w:ascii="Courier New" w:hAnsi="Courier New" w:cs="Courier New"/>
@@ -32741,7 +32935,7 @@
         <w:t>"</w:t>
       </w:r>
     </w:p>
-    <w:bookmarkEnd w:id="291"/>
+    <w:bookmarkEnd w:id="292"/>
     <w:p>
       <w:pPr>
         <w:autoSpaceDE w:val="0"/>
@@ -32838,7 +33032,7 @@
           <w:szCs w:val="18"/>
         </w:rPr>
       </w:pPr>
-      <w:bookmarkStart w:id="292" w:name="_mioConsistencyCheck238"/>
+      <w:bookmarkStart w:id="293" w:name="_mioConsistencyCheck238"/>
       <w:r>
         <w:rPr>
           <w:rFonts w:ascii="Courier New" w:hAnsi="Courier New" w:cs="Courier New"/>
@@ -32938,7 +33132,7 @@
         <w:t>#define BTN_DEBOUNCE_DELAY_MS (100U)</w:t>
       </w:r>
     </w:p>
-    <w:bookmarkEnd w:id="292"/>
+    <w:bookmarkEnd w:id="293"/>
     <w:p>
       <w:pPr>
         <w:autoSpaceDE w:val="0"/>
@@ -33035,7 +33229,7 @@
           <w:szCs w:val="18"/>
         </w:rPr>
       </w:pPr>
-      <w:bookmarkStart w:id="293" w:name="_mioConsistencyCheck239"/>
+      <w:bookmarkStart w:id="294" w:name="_mioConsistencyCheck239"/>
       <w:r>
         <w:rPr>
           <w:rFonts w:ascii="Courier New" w:hAnsi="Courier New" w:cs="Courier New"/>
@@ -33175,7 +33369,7 @@
         <w:t xml:space="preserve"> = BTN_INIT_VAL;</w:t>
       </w:r>
     </w:p>
-    <w:bookmarkEnd w:id="293"/>
+    <w:bookmarkEnd w:id="294"/>
     <w:p>
       <w:pPr>
         <w:pStyle w:val="Body"/>
@@ -33372,7 +33566,7 @@
           <w:szCs w:val="18"/>
         </w:rPr>
       </w:pPr>
-      <w:bookmarkStart w:id="294" w:name="_mioConsistencyCheck240"/>
+      <w:bookmarkStart w:id="295" w:name="_mioConsistencyCheck240"/>
       <w:r>
         <w:rPr>
           <w:rFonts w:ascii="Courier New" w:hAnsi="Courier New" w:cs="Courier New"/>
@@ -33443,7 +33637,7 @@
         <w:t xml:space="preserve"> event);</w:t>
       </w:r>
     </w:p>
-    <w:bookmarkEnd w:id="294"/>
+    <w:bookmarkEnd w:id="295"/>
     <w:p>
       <w:pPr>
         <w:autoSpaceDE w:val="0"/>
@@ -33540,7 +33734,7 @@
           <w:szCs w:val="18"/>
         </w:rPr>
       </w:pPr>
-      <w:bookmarkStart w:id="295" w:name="_mioConsistencyCheck241"/>
+      <w:bookmarkStart w:id="296" w:name="_mioConsistencyCheck241"/>
       <w:r>
         <w:rPr>
           <w:rFonts w:ascii="Courier New" w:hAnsi="Courier New" w:cs="Courier New"/>
@@ -33915,7 +34109,7 @@
         <w:t>};</w:t>
       </w:r>
     </w:p>
-    <w:bookmarkEnd w:id="295"/>
+    <w:bookmarkEnd w:id="296"/>
     <w:p>
       <w:pPr>
         <w:pStyle w:val="TableTitle"/>
@@ -34172,7 +34366,7 @@
         </w:rPr>
         <w:t xml:space="preserve">    </w:t>
       </w:r>
-      <w:bookmarkStart w:id="296" w:name="_mioConsistencyCheck242"/>
+      <w:bookmarkStart w:id="297" w:name="_mioConsistencyCheck242"/>
       <w:proofErr w:type="spellStart"/>
       <w:r>
         <w:rPr>
@@ -34194,7 +34388,7 @@
         <w:t xml:space="preserve"> result;</w:t>
       </w:r>
     </w:p>
-    <w:bookmarkEnd w:id="296"/>
+    <w:bookmarkEnd w:id="297"/>
     <w:p>
       <w:pPr>
         <w:autoSpaceDE w:val="0"/>
@@ -34218,7 +34412,7 @@
         </w:rPr>
         <w:t xml:space="preserve">    </w:t>
       </w:r>
-      <w:bookmarkStart w:id="297" w:name="_mioConsistencyCheck243"/>
+      <w:bookmarkStart w:id="298" w:name="_mioConsistencyCheck243"/>
       <w:r>
         <w:rPr>
           <w:rFonts w:ascii="Courier New" w:hAnsi="Courier New" w:cs="Courier New"/>
@@ -34255,7 +34449,7 @@
         <w:t xml:space="preserve">    cyhal_ipc_t task1_queue2;</w:t>
       </w:r>
     </w:p>
-    <w:bookmarkEnd w:id="297"/>
+    <w:bookmarkEnd w:id="298"/>
     <w:p>
       <w:pPr>
         <w:autoSpaceDE w:val="0"/>
@@ -34294,7 +34488,7 @@
         </w:rPr>
         <w:t xml:space="preserve">    </w:t>
       </w:r>
-      <w:bookmarkStart w:id="298" w:name="_mioConsistencyCheck244"/>
+      <w:bookmarkStart w:id="299" w:name="_mioConsistencyCheck244"/>
       <w:r>
         <w:rPr>
           <w:rFonts w:ascii="Courier New" w:hAnsi="Courier New" w:cs="Courier New"/>
@@ -34328,7 +34522,7 @@
         <w:t xml:space="preserve">    uint32_t task1_msg;</w:t>
       </w:r>
     </w:p>
-    <w:bookmarkEnd w:id="298"/>
+    <w:bookmarkEnd w:id="299"/>
     <w:p>
       <w:pPr>
         <w:pStyle w:val="Body"/>
@@ -34533,7 +34727,7 @@
           <w:szCs w:val="18"/>
         </w:rPr>
       </w:pPr>
-      <w:bookmarkStart w:id="299" w:name="_mioConsistencyCheck245"/>
+      <w:bookmarkStart w:id="300" w:name="_mioConsistencyCheck245"/>
       <w:r>
         <w:rPr>
           <w:rFonts w:ascii="Courier New" w:hAnsi="Courier New" w:cs="Courier New"/>
@@ -34679,7 +34873,7 @@
         <w:t xml:space="preserve">    }</w:t>
       </w:r>
     </w:p>
-    <w:bookmarkEnd w:id="299"/>
+    <w:bookmarkEnd w:id="300"/>
     <w:p>
       <w:pPr>
         <w:pStyle w:val="Body"/>
@@ -34935,7 +35129,7 @@
         </w:rPr>
         <w:t xml:space="preserve">    </w:t>
       </w:r>
-      <w:bookmarkStart w:id="300" w:name="_mioConsistencyCheck246"/>
+      <w:bookmarkStart w:id="301" w:name="_mioConsistencyCheck246"/>
       <w:r>
         <w:rPr>
           <w:rFonts w:ascii="Courier New" w:hAnsi="Courier New" w:cs="Courier New"/>
@@ -35058,7 +35252,7 @@
         <w:t xml:space="preserve">    }</w:t>
       </w:r>
     </w:p>
-    <w:bookmarkEnd w:id="300"/>
+    <w:bookmarkEnd w:id="301"/>
     <w:p>
       <w:pPr>
         <w:pStyle w:val="NormalWeb"/>
@@ -35272,7 +35466,7 @@
           <w:szCs w:val="18"/>
         </w:rPr>
       </w:pPr>
-      <w:bookmarkStart w:id="301" w:name="_mioConsistencyCheck247"/>
+      <w:bookmarkStart w:id="302" w:name="_mioConsistencyCheck247"/>
       <w:r>
         <w:rPr>
           <w:rFonts w:ascii="Courier New" w:hAnsi="Courier New" w:cs="Courier New"/>
@@ -35386,7 +35580,7 @@
         <w:t>{</w:t>
       </w:r>
     </w:p>
-    <w:bookmarkEnd w:id="301"/>
+    <w:bookmarkEnd w:id="302"/>
     <w:p>
       <w:pPr>
         <w:autoSpaceDE w:val="0"/>
@@ -35409,7 +35603,7 @@
         </w:rPr>
         <w:t xml:space="preserve">    </w:t>
       </w:r>
-      <w:bookmarkStart w:id="302" w:name="_mioConsistencyCheck248"/>
+      <w:bookmarkStart w:id="303" w:name="_mioConsistencyCheck248"/>
       <w:r>
         <w:rPr>
           <w:rFonts w:ascii="Courier New" w:hAnsi="Courier New" w:cs="Courier New"/>
@@ -35600,8 +35794,8 @@
           <w:lang w:eastAsia="en-US"/>
         </w:rPr>
       </w:pPr>
-      <w:bookmarkStart w:id="303" w:name="_mioConsistencyCheck65"/>
-      <w:bookmarkEnd w:id="302"/>
+      <w:bookmarkStart w:id="304" w:name="_mioConsistencyCheck65"/>
+      <w:bookmarkEnd w:id="303"/>
       <w:r>
         <w:rPr>
           <w:rFonts w:ascii="Courier New" w:hAnsi="Courier New" w:cs="Courier New"/>
@@ -35613,7 +35807,7 @@
         <w:t xml:space="preserve"> CYHAL_GPIO_DRIVE_STRONG, CYBSP_LED_STATE_OFF);</w:t>
       </w:r>
     </w:p>
-    <w:bookmarkEnd w:id="303"/>
+    <w:bookmarkEnd w:id="304"/>
     <w:p>
       <w:pPr>
         <w:pStyle w:val="Body"/>
@@ -35779,7 +35973,7 @@
           <w:szCs w:val="18"/>
         </w:rPr>
       </w:pPr>
-      <w:bookmarkStart w:id="304" w:name="_mioConsistencyCheck249"/>
+      <w:bookmarkStart w:id="305" w:name="_mioConsistencyCheck249"/>
       <w:proofErr w:type="spellStart"/>
       <w:r>
         <w:rPr>
@@ -36060,8 +36254,8 @@
           <w:szCs w:val="18"/>
         </w:rPr>
       </w:pPr>
-      <w:bookmarkStart w:id="305" w:name="_mioConsistencyCheck291"/>
-      <w:bookmarkStart w:id="306" w:name="_mioConsistencyCheck72"/>
+      <w:bookmarkStart w:id="306" w:name="_mioConsistencyCheck291"/>
+      <w:bookmarkStart w:id="307" w:name="_mioConsistencyCheck72"/>
       <w:r>
         <w:rPr>
           <w:rFonts w:ascii="Courier New" w:hAnsi="Courier New" w:cs="Courier New"/>
@@ -36071,8 +36265,8 @@
         </w:rPr>
         <w:t>PSOC</w:t>
       </w:r>
-      <w:bookmarkEnd w:id="305"/>
       <w:bookmarkEnd w:id="306"/>
+      <w:bookmarkEnd w:id="307"/>
       <w:r>
         <w:rPr>
           <w:rFonts w:ascii="Courier New" w:hAnsi="Courier New" w:cs="Courier New"/>
@@ -36296,7 +36490,7 @@
         <w:t xml:space="preserve"> = false;</w:t>
       </w:r>
     </w:p>
-    <w:bookmarkEnd w:id="304"/>
+    <w:bookmarkEnd w:id="305"/>
     <w:p>
       <w:pPr>
         <w:pStyle w:val="NormalWeb"/>
@@ -36345,7 +36539,7 @@
           <w:lang w:val="en-IN"/>
         </w:rPr>
       </w:pPr>
-      <w:bookmarkStart w:id="307" w:name="_mioConsistencyCheck119"/>
+      <w:bookmarkStart w:id="308" w:name="_mioConsistencyCheck119"/>
       <w:r>
         <w:rPr>
           <w:rFonts w:ascii="Source Sans 3" w:hAnsi="Source Sans 3"/>
@@ -36418,7 +36612,7 @@
         <w:t xml:space="preserve">IPC handles </w:t>
       </w:r>
     </w:p>
-    <w:bookmarkEnd w:id="307"/>
+    <w:bookmarkEnd w:id="308"/>
     <w:p>
       <w:pPr>
         <w:pStyle w:val="TableTitle"/>
@@ -36480,7 +36674,7 @@
           <w:szCs w:val="18"/>
         </w:rPr>
       </w:pPr>
-      <w:bookmarkStart w:id="308" w:name="_mioConsistencyCheck250"/>
+      <w:bookmarkStart w:id="309" w:name="_mioConsistencyCheck250"/>
       <w:r>
         <w:rPr>
           <w:rFonts w:ascii="Courier New" w:hAnsi="Courier New" w:cs="Courier New"/>
@@ -36514,7 +36708,7 @@
         <w:t>{</w:t>
       </w:r>
     </w:p>
-    <w:bookmarkEnd w:id="308"/>
+    <w:bookmarkEnd w:id="309"/>
     <w:p>
       <w:pPr>
         <w:autoSpaceDE w:val="0"/>
@@ -36551,7 +36745,7 @@
         </w:rPr>
         <w:t xml:space="preserve">    </w:t>
       </w:r>
-      <w:bookmarkStart w:id="309" w:name="_mioConsistencyCheck251"/>
+      <w:bookmarkStart w:id="310" w:name="_mioConsistencyCheck251"/>
       <w:proofErr w:type="spellStart"/>
       <w:r>
         <w:rPr>
@@ -36676,7 +36870,7 @@
         <w:t xml:space="preserve">        /* Button debounce delay */</w:t>
       </w:r>
     </w:p>
-    <w:bookmarkEnd w:id="309"/>
+    <w:bookmarkEnd w:id="310"/>
     <w:p>
       <w:pPr>
         <w:autoSpaceDE w:val="0"/>
@@ -36699,7 +36893,7 @@
         </w:rPr>
         <w:t xml:space="preserve">        </w:t>
       </w:r>
-      <w:bookmarkStart w:id="310" w:name="_mioConsistencyCheck252"/>
+      <w:bookmarkStart w:id="311" w:name="_mioConsistencyCheck252"/>
       <w:proofErr w:type="spellStart"/>
       <w:r>
         <w:rPr>
@@ -36834,8 +37028,8 @@
           <w:szCs w:val="18"/>
         </w:rPr>
       </w:pPr>
-      <w:bookmarkStart w:id="311" w:name="_mioConsistencyCheck253"/>
-      <w:bookmarkEnd w:id="310"/>
+      <w:bookmarkStart w:id="312" w:name="_mioConsistencyCheck253"/>
+      <w:bookmarkEnd w:id="311"/>
       <w:r>
         <w:rPr>
           <w:rFonts w:ascii="Courier New" w:hAnsi="Courier New" w:cs="Courier New"/>
@@ -36948,8 +37142,8 @@
           <w:szCs w:val="18"/>
         </w:rPr>
       </w:pPr>
-      <w:bookmarkStart w:id="312" w:name="_mioConsistencyCheck254"/>
-      <w:bookmarkEnd w:id="311"/>
+      <w:bookmarkStart w:id="313" w:name="_mioConsistencyCheck254"/>
+      <w:bookmarkEnd w:id="312"/>
       <w:r>
         <w:rPr>
           <w:rFonts w:ascii="Courier New" w:hAnsi="Courier New" w:cs="Courier New"/>
@@ -37003,7 +37197,7 @@
         <w:t xml:space="preserve">        }</w:t>
       </w:r>
     </w:p>
-    <w:bookmarkEnd w:id="312"/>
+    <w:bookmarkEnd w:id="313"/>
     <w:p>
       <w:pPr>
         <w:autoSpaceDE w:val="0"/>
@@ -37040,7 +37234,7 @@
         </w:rPr>
         <w:t xml:space="preserve">        </w:t>
       </w:r>
-      <w:bookmarkStart w:id="313" w:name="_mioConsistencyCheck255"/>
+      <w:bookmarkStart w:id="314" w:name="_mioConsistencyCheck255"/>
       <w:proofErr w:type="spellStart"/>
       <w:r>
         <w:rPr>
@@ -37062,7 +37256,7 @@
         <w:t xml:space="preserve"> = false;</w:t>
       </w:r>
     </w:p>
-    <w:bookmarkEnd w:id="313"/>
+    <w:bookmarkEnd w:id="314"/>
     <w:p>
       <w:pPr>
         <w:autoSpaceDE w:val="0"/>
@@ -37085,7 +37279,7 @@
         </w:rPr>
         <w:t xml:space="preserve">        </w:t>
       </w:r>
-      <w:bookmarkStart w:id="314" w:name="_mioConsistencyCheck256"/>
+      <w:bookmarkStart w:id="315" w:name="_mioConsistencyCheck256"/>
       <w:proofErr w:type="spellStart"/>
       <w:r>
         <w:rPr>
@@ -37313,7 +37507,7 @@
         <w:t xml:space="preserve">        {</w:t>
       </w:r>
     </w:p>
-    <w:bookmarkEnd w:id="314"/>
+    <w:bookmarkEnd w:id="315"/>
     <w:p>
       <w:pPr>
         <w:autoSpaceDE w:val="0"/>
@@ -37341,7 +37535,7 @@
           <w:szCs w:val="18"/>
         </w:rPr>
       </w:pPr>
-      <w:bookmarkStart w:id="315" w:name="_mioConsistencyCheck257"/>
+      <w:bookmarkStart w:id="316" w:name="_mioConsistencyCheck257"/>
       <w:r>
         <w:rPr>
           <w:rFonts w:ascii="Courier New" w:hAnsi="Courier New" w:cs="Courier New"/>
@@ -37385,8 +37579,8 @@
           <w:szCs w:val="18"/>
         </w:rPr>
       </w:pPr>
-      <w:bookmarkStart w:id="316" w:name="_mioConsistencyCheck258"/>
-      <w:bookmarkEnd w:id="315"/>
+      <w:bookmarkStart w:id="317" w:name="_mioConsistencyCheck258"/>
+      <w:bookmarkEnd w:id="316"/>
       <w:r>
         <w:rPr>
           <w:rFonts w:ascii="Courier New" w:hAnsi="Courier New" w:cs="Courier New"/>
@@ -37417,7 +37611,7 @@
         <w:t>(&amp;task1_queue2);</w:t>
       </w:r>
     </w:p>
-    <w:bookmarkEnd w:id="316"/>
+    <w:bookmarkEnd w:id="317"/>
     <w:p>
       <w:pPr>
         <w:autoSpaceDE w:val="0"/>
@@ -37459,7 +37653,7 @@
           <w:szCs w:val="18"/>
         </w:rPr>
       </w:pPr>
-      <w:bookmarkStart w:id="317" w:name="_mioConsistencyCheck259"/>
+      <w:bookmarkStart w:id="318" w:name="_mioConsistencyCheck259"/>
       <w:r>
         <w:rPr>
           <w:rFonts w:ascii="Courier New" w:hAnsi="Courier New" w:cs="Courier New"/>
@@ -37503,8 +37697,8 @@
           <w:szCs w:val="18"/>
         </w:rPr>
       </w:pPr>
-      <w:bookmarkStart w:id="318" w:name="_mioConsistencyCheck260"/>
-      <w:bookmarkEnd w:id="317"/>
+      <w:bookmarkStart w:id="319" w:name="_mioConsistencyCheck260"/>
+      <w:bookmarkEnd w:id="318"/>
       <w:r>
         <w:rPr>
           <w:rFonts w:ascii="Courier New" w:hAnsi="Courier New" w:cs="Courier New"/>
@@ -38077,8 +38271,8 @@
           <w:szCs w:val="18"/>
         </w:rPr>
       </w:pPr>
-      <w:bookmarkStart w:id="319" w:name="_mioConsistencyCheck261"/>
-      <w:bookmarkEnd w:id="318"/>
+      <w:bookmarkStart w:id="320" w:name="_mioConsistencyCheck261"/>
+      <w:bookmarkEnd w:id="319"/>
       <w:r>
         <w:rPr>
           <w:rFonts w:ascii="Courier New" w:hAnsi="Courier New" w:cs="Courier New"/>
@@ -38122,8 +38316,8 @@
           <w:szCs w:val="18"/>
         </w:rPr>
       </w:pPr>
-      <w:bookmarkStart w:id="320" w:name="_mioConsistencyCheck262"/>
-      <w:bookmarkEnd w:id="319"/>
+      <w:bookmarkStart w:id="321" w:name="_mioConsistencyCheck262"/>
+      <w:bookmarkEnd w:id="320"/>
       <w:r>
         <w:rPr>
           <w:rFonts w:ascii="Courier New" w:hAnsi="Courier New" w:cs="Courier New"/>
@@ -38836,7 +39030,7 @@
         <w:t>/* close main loop */</w:t>
       </w:r>
     </w:p>
-    <w:bookmarkEnd w:id="320"/>
+    <w:bookmarkEnd w:id="321"/>
     <w:p>
       <w:pPr>
         <w:pStyle w:val="TableTitle"/>
@@ -38871,7 +39065,7 @@
           <w:rFonts w:ascii="Source Sans 3" w:hAnsi="Source Sans 3"/>
         </w:rPr>
       </w:pPr>
-      <w:bookmarkStart w:id="321" w:name="_mioConsistencyCheck120"/>
+      <w:bookmarkStart w:id="322" w:name="_mioConsistencyCheck120"/>
       <w:r>
         <w:rPr>
           <w:rFonts w:ascii="Source Sans 3" w:hAnsi="Source Sans 3"/>
@@ -38942,7 +39136,7 @@
         <w:t>main function</w:t>
       </w:r>
     </w:p>
-    <w:bookmarkEnd w:id="321"/>
+    <w:bookmarkEnd w:id="322"/>
     <w:p>
       <w:pPr>
         <w:pStyle w:val="Body"/>
@@ -39263,7 +39457,7 @@
           <w:lang w:val="en-IN"/>
         </w:rPr>
       </w:pPr>
-      <w:bookmarkStart w:id="322" w:name="_mioConsistencyCheck263"/>
+      <w:bookmarkStart w:id="323" w:name="_mioConsistencyCheck263"/>
       <w:r>
         <w:rPr>
           <w:rFonts w:ascii="Courier New" w:hAnsi="Courier New" w:cs="Courier New"/>
@@ -39438,7 +39632,7 @@
         <w:t xml:space="preserve">    CY_UNUSED_PARAMETER(event);</w:t>
       </w:r>
     </w:p>
-    <w:bookmarkEnd w:id="322"/>
+    <w:bookmarkEnd w:id="323"/>
     <w:p>
       <w:pPr>
         <w:autoSpaceDE w:val="0"/>
@@ -39478,7 +39672,7 @@
         </w:rPr>
         <w:t xml:space="preserve">    </w:t>
       </w:r>
-      <w:bookmarkStart w:id="323" w:name="_mioConsistencyCheck264"/>
+      <w:bookmarkStart w:id="324" w:name="_mioConsistencyCheck264"/>
       <w:proofErr w:type="spellStart"/>
       <w:r>
         <w:rPr>
@@ -39527,7 +39721,7 @@
         <w:t>}</w:t>
       </w:r>
     </w:p>
-    <w:bookmarkEnd w:id="323"/>
+    <w:bookmarkEnd w:id="324"/>
     <w:p>
       <w:pPr>
         <w:pStyle w:val="Body"/>
@@ -39575,7 +39769,7 @@
           <w:lang w:val="en-IN"/>
         </w:rPr>
       </w:pPr>
-      <w:bookmarkStart w:id="324" w:name="_mioConsistencyCheck121"/>
+      <w:bookmarkStart w:id="325" w:name="_mioConsistencyCheck121"/>
       <w:r>
         <w:rPr>
           <w:rFonts w:ascii="Source Sans 3" w:hAnsi="Source Sans 3" w:cs="Consolas"/>
@@ -39861,8 +40055,8 @@
           <w:lang w:val="en-IN"/>
         </w:rPr>
       </w:pPr>
-      <w:bookmarkStart w:id="325" w:name="_mioConsistencyCheck122"/>
-      <w:bookmarkEnd w:id="324"/>
+      <w:bookmarkStart w:id="326" w:name="_mioConsistencyCheck122"/>
+      <w:bookmarkEnd w:id="325"/>
       <w:r>
         <w:rPr>
           <w:rFonts w:ascii="Source Sans 3" w:hAnsi="Source Sans 3"/>
@@ -40079,9 +40273,9 @@
           <w:lang w:eastAsia="de-DE"/>
         </w:rPr>
       </w:pPr>
-      <w:bookmarkStart w:id="326" w:name="_Toc212806552"/>
-      <w:bookmarkStart w:id="327" w:name="_mioConsistencyCheck413"/>
-      <w:bookmarkStart w:id="328" w:name="_mioConsistencyCheck118"/>
+      <w:bookmarkStart w:id="327" w:name="_Toc212806552"/>
+      <w:bookmarkStart w:id="328" w:name="_mioConsistencyCheck413"/>
+      <w:bookmarkStart w:id="329" w:name="_mioConsistencyCheck118"/>
       <w:r>
         <w:rPr>
           <w:rFonts w:ascii="Source Sans 3" w:hAnsi="Source Sans 3"/>
@@ -40094,8 +40288,8 @@
         <w:lastRenderedPageBreak/>
         <w:t>Conclusion</w:t>
       </w:r>
-      <w:bookmarkEnd w:id="325"/>
       <w:bookmarkEnd w:id="326"/>
+      <w:bookmarkEnd w:id="327"/>
       <w:r>
         <w:rPr>
           <w:b/>
@@ -40114,9 +40308,9 @@
           <w:rFonts w:ascii="Source Sans 3" w:hAnsi="Source Sans 3"/>
         </w:rPr>
       </w:pPr>
-      <w:bookmarkStart w:id="329" w:name="_mioConsistencyCheck123"/>
-      <w:bookmarkEnd w:id="327"/>
+      <w:bookmarkStart w:id="330" w:name="_mioConsistencyCheck123"/>
       <w:bookmarkEnd w:id="328"/>
+      <w:bookmarkEnd w:id="329"/>
       <w:r>
         <w:rPr>
           <w:rFonts w:ascii="Source Sans 3" w:hAnsi="Source Sans 3"/>
@@ -40136,7 +40330,7 @@
         <w:t xml:space="preserve"> E84 IPC HAL Queue application using Modus Tool Box, figured out to use IPC HAL Libraries and communication between two cores using IPC queues.</w:t>
       </w:r>
     </w:p>
-    <w:bookmarkEnd w:id="329"/>
+    <w:bookmarkEnd w:id="330"/>
     <w:p>
       <w:pPr>
         <w:pStyle w:val="Body"/>
@@ -40151,8 +40345,8 @@
       <w:pPr>
         <w:pStyle w:val="Heading1"/>
       </w:pPr>
-      <w:bookmarkStart w:id="330" w:name="_Toc212806553"/>
-      <w:bookmarkStart w:id="331" w:name="_mioConsistencyCheck124"/>
+      <w:bookmarkStart w:id="331" w:name="_Toc212806553"/>
+      <w:bookmarkStart w:id="332" w:name="_mioConsistencyCheck124"/>
       <w:r>
         <w:rPr>
           <w:rFonts w:ascii="Source Sans 3" w:hAnsi="Source Sans 3"/>
@@ -40160,8 +40354,8 @@
         <w:lastRenderedPageBreak/>
         <w:t>References</w:t>
       </w:r>
-      <w:bookmarkEnd w:id="330"/>
       <w:bookmarkEnd w:id="331"/>
+      <w:bookmarkEnd w:id="332"/>
       <w:r>
         <w:t xml:space="preserve"> </w:t>
       </w:r>
@@ -40178,7 +40372,7 @@
           <w:lang w:eastAsia="de-DE"/>
         </w:rPr>
       </w:pPr>
-      <w:bookmarkStart w:id="332" w:name="_mioConsistencyCheck125"/>
+      <w:bookmarkStart w:id="333" w:name="_mioConsistencyCheck125"/>
       <w:r>
         <w:rPr>
           <w:rFonts w:ascii="Source Sans 3" w:hAnsi="Source Sans 3" w:cs="SourceSansPro"/>
@@ -40206,7 +40400,7 @@
         </w:rPr>
         <w:t>™ Edge E84 MCU on ModusToolbox™</w:t>
       </w:r>
-      <w:bookmarkEnd w:id="332"/>
+      <w:bookmarkEnd w:id="333"/>
       <w:r>
         <w:rPr>
           <w:rFonts w:cs="SourceSansPro"/>
@@ -40217,9 +40411,9 @@
         <w:t xml:space="preserve"> </w:t>
       </w:r>
     </w:p>
-    <w:bookmarkStart w:id="333" w:name="_mioConsistencyCheck126"/>
-    <w:bookmarkStart w:id="334" w:name="_mioConsistencyCheck265"/>
-    <w:bookmarkStart w:id="335" w:name="_mioConsistencyCheck66"/>
+    <w:bookmarkStart w:id="334" w:name="_mioConsistencyCheck126"/>
+    <w:bookmarkStart w:id="335" w:name="_mioConsistencyCheck265"/>
+    <w:bookmarkStart w:id="336" w:name="_mioConsistencyCheck66"/>
     <w:p>
       <w:pPr>
         <w:pStyle w:val="ListParagraph"/>
@@ -40290,9 +40484,9 @@
         </w:rPr>
         <w:fldChar w:fldCharType="end"/>
       </w:r>
-      <w:bookmarkEnd w:id="333"/>
       <w:bookmarkEnd w:id="334"/>
       <w:bookmarkEnd w:id="335"/>
+      <w:bookmarkEnd w:id="336"/>
       <w:r>
         <w:rPr>
           <w:lang w:eastAsia="de-DE"/>
@@ -40304,8 +40498,8 @@
       <w:pPr>
         <w:pStyle w:val="Body"/>
       </w:pPr>
-      <w:bookmarkStart w:id="336" w:name="_mioConsistencyCheck382"/>
-      <w:bookmarkStart w:id="337" w:name="_mioConsistencyCheck111"/>
+      <w:bookmarkStart w:id="337" w:name="_mioConsistencyCheck382"/>
+      <w:bookmarkStart w:id="338" w:name="_mioConsistencyCheck111"/>
     </w:p>
     <w:p>
       <w:pPr>
@@ -40323,7 +40517,7 @@
         </w:rPr>
       </w:pPr>
     </w:p>
-    <w:bookmarkEnd w:id="224"/>
+    <w:bookmarkEnd w:id="225"/>
     <w:p>
       <w:pPr>
         <w:pStyle w:val="FigureTitle"/>
@@ -40351,9 +40545,9 @@
           <w:lang w:eastAsia="de-DE"/>
         </w:rPr>
       </w:pPr>
-      <w:bookmarkStart w:id="338" w:name="_mioConsistencyCheck419"/>
-    </w:p>
-    <w:bookmarkEnd w:id="338"/>
+      <w:bookmarkStart w:id="339" w:name="_mioConsistencyCheck419"/>
+    </w:p>
+    <w:bookmarkEnd w:id="339"/>
     <w:p>
       <w:pPr>
         <w:pStyle w:val="Body"/>
@@ -40381,11 +40575,11 @@
           <w:noProof/>
         </w:rPr>
       </w:pPr>
-      <w:bookmarkStart w:id="339" w:name="_mioConsistencyCheck420"/>
-    </w:p>
-    <w:bookmarkEnd w:id="336"/>
+      <w:bookmarkStart w:id="340" w:name="_mioConsistencyCheck420"/>
+    </w:p>
     <w:bookmarkEnd w:id="337"/>
-    <w:bookmarkEnd w:id="339"/>
+    <w:bookmarkEnd w:id="338"/>
+    <w:bookmarkEnd w:id="340"/>
     <w:p/>
     <w:sectPr>
       <w:headerReference w:type="even" r:id="rId78"/>
@@ -41397,7 +41591,7 @@
         <v:shape id="_x0000_s2052" type="#_x0000_t75" style="position:absolute;margin-left:-45.75pt;margin-top:62.5pt;width:602.45pt;height:287.2pt;z-index:-251642880;mso-position-horizontal-relative:text;mso-position-vertical-relative:text">
           <v:imagedata r:id="rId1" o:title=""/>
         </v:shape>
-        <o:OLEObject Type="Embed" ProgID="Visio.Drawing.15" ShapeID="_x0000_s2052" DrawAspect="Content" ObjectID="_1823712201" r:id="rId2"/>
+        <o:OLEObject Type="Embed" ProgID="Visio.Drawing.15" ShapeID="_x0000_s2052" DrawAspect="Content" ObjectID="_1823872294" r:id="rId2"/>
       </w:object>
     </w:r>
     <w:r>
@@ -42730,7 +42924,7 @@
         <v:shape id="_x0000_s2051" type="#_x0000_t75" style="position:absolute;margin-left:-45.75pt;margin-top:62.5pt;width:602.45pt;height:287.2pt;z-index:-251643904;mso-position-horizontal-relative:text;mso-position-vertical-relative:text">
           <v:imagedata r:id="rId1" o:title=""/>
         </v:shape>
-        <o:OLEObject Type="Embed" ProgID="Visio.Drawing.15" ShapeID="_x0000_s2051" DrawAspect="Content" ObjectID="_1823712202" r:id="rId2"/>
+        <o:OLEObject Type="Embed" ProgID="Visio.Drawing.15" ShapeID="_x0000_s2051" DrawAspect="Content" ObjectID="_1823872295" r:id="rId2"/>
       </w:object>
     </w:r>
     <w:r>
@@ -42938,8 +43132,8 @@
                                 <w:r>
                                   <w:t>IMPORTANT NOTICE</w:t>
                                 </w:r>
-                                <w:bookmarkStart w:id="340" w:name="ImportantNotice"/>
-                                <w:bookmarkEnd w:id="340"/>
+                                <w:bookmarkStart w:id="341" w:name="ImportantNotice"/>
+                                <w:bookmarkEnd w:id="341"/>
                               </w:p>
                               <w:p>
                                 <w:pPr>
@@ -43245,8 +43439,8 @@
                           <w:r>
                             <w:t>IMPORTANT NOTICE</w:t>
                           </w:r>
-                          <w:bookmarkStart w:id="341" w:name="ImportantNotice"/>
-                          <w:bookmarkEnd w:id="341"/>
+                          <w:bookmarkStart w:id="342" w:name="ImportantNotice"/>
+                          <w:bookmarkEnd w:id="342"/>
                         </w:p>
                         <w:p>
                           <w:pPr>
@@ -49819,6 +50013,12 @@
       </w:lvl>
     </w:lvlOverride>
   </w:num>
+  <w:num w:numId="29">
+    <w:abstractNumId w:val="10"/>
+  </w:num>
+  <w:num w:numId="30">
+    <w:abstractNumId w:val="12"/>
+  </w:num>
   <w:numIdMacAtCleanup w:val="28"/>
 </w:numbering>
 </file>
@@ -50392,9 +50592,7 @@
   <w:style w:type="character" w:default="1" w:styleId="DefaultParagraphFont">
     <w:name w:val="Default Paragraph Font"/>
     <w:uiPriority w:val="1"/>
-    <w:semiHidden/>
     <w:unhideWhenUsed/>
-    <w:rsid w:val="0029299B"/>
   </w:style>
   <w:style w:type="table" w:default="1" w:styleId="TableNormal">
     <w:name w:val="Normal Table"/>
@@ -50416,7 +50614,6 @@
     <w:uiPriority w:val="99"/>
     <w:semiHidden/>
     <w:unhideWhenUsed/>
-    <w:rsid w:val="0029299B"/>
   </w:style>
   <w:style w:type="paragraph" w:customStyle="1" w:styleId="Body">
     <w:name w:val="Body"/>
@@ -51169,7 +51366,7 @@
     <w:rsid w:val="0029299B"/>
     <w:pPr>
       <w:numPr>
-        <w:numId w:val="28"/>
+        <w:numId w:val="30"/>
       </w:numPr>
     </w:pPr>
   </w:style>
@@ -51706,7 +51903,7 @@
     <w:rsid w:val="0029299B"/>
     <w:pPr>
       <w:numPr>
-        <w:numId w:val="6"/>
+        <w:numId w:val="29"/>
       </w:numPr>
     </w:pPr>
   </w:style>
@@ -53000,6 +53197,7 @@
     <w:panose1 w:val="02070409020205020404"/>
     <w:charset w:val="00"/>
     <w:family w:val="modern"/>
+    <w:notTrueType/>
     <w:pitch w:val="fixed"/>
     <w:sig w:usb0="00000003" w:usb1="00000000" w:usb2="00000000" w:usb3="00000000" w:csb0="00000001" w:csb1="00000000"/>
   </w:font>
@@ -53122,6 +53320,8 @@
   <w:rsids>
     <w:rsidRoot w:val="00EC48F7"/>
     <w:rsid w:val="001857A4"/>
+    <w:rsid w:val="002B6646"/>
+    <w:rsid w:val="004669D2"/>
     <w:rsid w:val="00BF47D9"/>
     <w:rsid w:val="00E12A08"/>
     <w:rsid w:val="00EC48F7"/>
@@ -53878,6 +54078,21 @@
 </file>
 
 <file path=customXml/item1.xml><?xml version="1.0" encoding="utf-8"?>
+<p:properties xmlns:p="http://schemas.microsoft.com/office/2006/metadata/properties" xmlns:xsi="http://www.w3.org/2001/XMLSchema-instance" xmlns:pc="http://schemas.microsoft.com/office/infopath/2007/PartnerControls">
+  <documentManagement/>
+</p:properties>
+</file>
+
+<file path=customXml/item2.xml><?xml version="1.0" encoding="utf-8"?>
+<?mso-contentType ?>
+<FormTemplates xmlns="http://schemas.microsoft.com/sharepoint/v3/contenttype/forms">
+  <Display>DocumentLibraryForm</Display>
+  <Edit>DocumentLibraryForm</Edit>
+  <New>DocumentLibraryForm</New>
+</FormTemplates>
+</file>
+
+<file path=customXml/item3.xml><?xml version="1.0" encoding="utf-8"?>
 <ct:contentTypeSchema xmlns:ct="http://schemas.microsoft.com/office/2006/metadata/contentType" xmlns:ma="http://schemas.microsoft.com/office/2006/metadata/properties/metaAttributes" ct:_="" ma:_="" ma:contentTypeName="Document" ma:contentTypeID="0x01010030347378EA1C7B40B791B4A9FAEBC72E" ma:contentTypeVersion="1" ma:contentTypeDescription="Create a new document." ma:contentTypeScope="" ma:versionID="dac419b5e4b08ef6434e405bf3dae512">
   <xsd:schema xmlns:xsd="http://www.w3.org/2001/XMLSchema" xmlns:xs="http://www.w3.org/2001/XMLSchema" xmlns:p="http://schemas.microsoft.com/office/2006/metadata/properties" xmlns:ns2="0ff2502a-f5fc-4900-8b9d-01d591984867" targetNamespace="http://schemas.microsoft.com/office/2006/metadata/properties" ma:root="true" ma:fieldsID="8df1d2d8bf6da93316c8b7386a9c82fd" ns2:_="">
     <xsd:import namespace="0ff2502a-f5fc-4900-8b9d-01d591984867"/>
@@ -54017,16 +54232,7 @@
 </ct:contentTypeSchema>
 </file>
 
-<file path=customXml/item2.xml><?xml version="1.0" encoding="utf-8"?>
-<?mso-contentType ?>
-<FormTemplates xmlns="http://schemas.microsoft.com/sharepoint/v3/contenttype/forms">
-  <Display>DocumentLibraryForm</Display>
-  <Edit>DocumentLibraryForm</Edit>
-  <New>DocumentLibraryForm</New>
-</FormTemplates>
-</file>
-
-<file path=customXml/item3.xml><?xml version="1.0" encoding="utf-8"?>
+<file path=customXml/item4.xml><?xml version="1.0" encoding="utf-8"?>
 <DocsTemplateContainer xmlns="http://www.made-in-office.com/empower/docs/template/v1">
   <DocsTextTemplateDictionary/>
   <DocsImageTemplateDictionary/>
@@ -54182,6 +54388,18 @@
       <TimestampUtc>2023-08-07T12:57:01.087Z</TimestampUtc>
       <TextBlockMetadataId>ae651eb4-bf90-4c60-b3d9-7af05d89c4fa</TextBlockMetadataId>
     </TextBlockMetadata>
+    <TextBlockMetadata>
+      <ElementId>1a622969-9435-42df-b756-4af60deadd4b</ElementId>
+      <ContentTag>YzCqVxr4CkGOIjtz8kQsF1txdvNf0IhJnc8A53W8JnY=</ContentTag>
+      <TimestampUtc>2023-08-07T12:57:01.087Z</TimestampUtc>
+      <TextBlockMetadataId>78b63267-9661-4a5d-b21f-2cfaaeca01d6</TextBlockMetadataId>
+    </TextBlockMetadata>
+    <TextBlockMetadata>
+      <ElementId>1a622969-9435-42df-b756-4af60deadd4b</ElementId>
+      <ContentTag>YzCqVxr4CkGOIjtz8kQsF1txdvNf0IhJnc8A53W8JnY=</ContentTag>
+      <TimestampUtc>2023-08-07T12:57:01.087Z</TimestampUtc>
+      <TextBlockMetadataId>0ce3f8df-95fc-4a8f-b2ee-2a9eabfdcf38</TextBlockMetadataId>
+    </TextBlockMetadata>
   </TextBlockElements>
   <PlaceholderHiddenState>
     <HideablePlaceholderGuids/>
@@ -54189,17 +54407,28 @@
 </DocsTemplateContainer>
 </file>
 
-<file path=customXml/item4.xml><?xml version="1.0" encoding="utf-8"?>
-<p:properties xmlns:p="http://schemas.microsoft.com/office/2006/metadata/properties" xmlns:xsi="http://www.w3.org/2001/XMLSchema-instance" xmlns:pc="http://schemas.microsoft.com/office/infopath/2007/PartnerControls">
-  <documentManagement/>
-</p:properties>
-</file>
-
 <file path=customXml/item5.xml><?xml version="1.0" encoding="utf-8"?>
 <b:Sources xmlns:b="http://schemas.openxmlformats.org/officeDocument/2006/bibliography" xmlns="http://schemas.openxmlformats.org/officeDocument/2006/bibliography" SelectedStyle="\APA.XSL" StyleName="APA"/>
 </file>
 
 <file path=customXml/itemProps1.xml><?xml version="1.0" encoding="utf-8"?>
+<ds:datastoreItem xmlns:ds="http://schemas.openxmlformats.org/officeDocument/2006/customXml" ds:itemID="{2D743F90-B02F-45D5-9835-EA3B57C055FC}">
+  <ds:schemaRefs>
+    <ds:schemaRef ds:uri="http://schemas.microsoft.com/office/2006/metadata/properties"/>
+    <ds:schemaRef ds:uri="http://schemas.microsoft.com/office/infopath/2007/PartnerControls"/>
+  </ds:schemaRefs>
+</ds:datastoreItem>
+</file>
+
+<file path=customXml/itemProps2.xml><?xml version="1.0" encoding="utf-8"?>
+<ds:datastoreItem xmlns:ds="http://schemas.openxmlformats.org/officeDocument/2006/customXml" ds:itemID="{A6A899CE-B708-4D9D-B4A9-81256E8EE869}">
+  <ds:schemaRefs>
+    <ds:schemaRef ds:uri="http://schemas.microsoft.com/sharepoint/v3/contenttype/forms"/>
+  </ds:schemaRefs>
+</ds:datastoreItem>
+</file>
+
+<file path=customXml/itemProps3.xml><?xml version="1.0" encoding="utf-8"?>
 <ds:datastoreItem xmlns:ds="http://schemas.openxmlformats.org/officeDocument/2006/customXml" ds:itemID="{348D6D5F-AF49-4DAF-BEBA-00EA06977ED2}">
   <ds:schemaRefs>
     <ds:schemaRef ds:uri="http://schemas.microsoft.com/office/2006/metadata/contentType"/>
@@ -54217,33 +54446,16 @@
 </ds:datastoreItem>
 </file>
 
-<file path=customXml/itemProps2.xml><?xml version="1.0" encoding="utf-8"?>
-<ds:datastoreItem xmlns:ds="http://schemas.openxmlformats.org/officeDocument/2006/customXml" ds:itemID="{A6A899CE-B708-4D9D-B4A9-81256E8EE869}">
-  <ds:schemaRefs>
-    <ds:schemaRef ds:uri="http://schemas.microsoft.com/sharepoint/v3/contenttype/forms"/>
-  </ds:schemaRefs>
-</ds:datastoreItem>
-</file>
-
-<file path=customXml/itemProps3.xml><?xml version="1.0" encoding="utf-8"?>
-<ds:datastoreItem xmlns:ds="http://schemas.openxmlformats.org/officeDocument/2006/customXml" ds:itemID="{C6A105FA-8225-4E08-B80C-D37EDC461D90}">
+<file path=customXml/itemProps4.xml><?xml version="1.0" encoding="utf-8"?>
+<ds:datastoreItem xmlns:ds="http://schemas.openxmlformats.org/officeDocument/2006/customXml" ds:itemID="{301B121F-7553-4D55-A966-F9A16C036061}">
   <ds:schemaRefs>
     <ds:schemaRef ds:uri="http://www.made-in-office.com/empower/docs/template/v1"/>
   </ds:schemaRefs>
 </ds:datastoreItem>
 </file>
 
-<file path=customXml/itemProps4.xml><?xml version="1.0" encoding="utf-8"?>
-<ds:datastoreItem xmlns:ds="http://schemas.openxmlformats.org/officeDocument/2006/customXml" ds:itemID="{2D743F90-B02F-45D5-9835-EA3B57C055FC}">
-  <ds:schemaRefs>
-    <ds:schemaRef ds:uri="http://schemas.microsoft.com/office/2006/metadata/properties"/>
-    <ds:schemaRef ds:uri="http://schemas.microsoft.com/office/infopath/2007/PartnerControls"/>
-  </ds:schemaRefs>
-</ds:datastoreItem>
-</file>
-
 <file path=customXml/itemProps5.xml><?xml version="1.0" encoding="utf-8"?>
-<ds:datastoreItem xmlns:ds="http://schemas.openxmlformats.org/officeDocument/2006/customXml" ds:itemID="{1F0A0891-7AB6-4B65-86CC-CF739B6D6AA7}">
+<ds:datastoreItem xmlns:ds="http://schemas.openxmlformats.org/officeDocument/2006/customXml" ds:itemID="{5EE51105-22D4-4426-AEF2-E01C667CC721}">
   <ds:schemaRefs>
     <ds:schemaRef ds:uri="http://schemas.openxmlformats.org/officeDocument/2006/bibliography"/>
   </ds:schemaRefs>

</xml_diff>

<commit_message>
adding setdrivemode PDL API info and code snippet
</commit_message>
<xml_diff>
--- a/.internal/Manual/Intro to PSOC Edge E84 - Part 2 (E2)/PSoC Edge E84 Introductory E2 Training Manual -WIP_10_21_2025.docx
+++ b/.internal/Manual/Intro to PSOC Edge E84 - Part 2 (E2)/PSoC Edge E84 Introductory E2 Training Manual -WIP_10_21_2025.docx
@@ -4441,7 +4441,7 @@
                     <v:shape id="_x0000_i1025" type="#_x0000_t75" style="width:476pt;height:587.95pt" o:ole="">
                       <v:imagedata r:id="rId21" o:title=""/>
                     </v:shape>
-                    <o:OLEObject Type="Embed" ProgID="Visio.Drawing.15" ShapeID="_x0000_i1025" DrawAspect="Content" ObjectID="_1823872292" r:id="rId22"/>
+                    <o:OLEObject Type="Embed" ProgID="Visio.Drawing.15" ShapeID="_x0000_i1025" DrawAspect="Content" ObjectID="_1823873062" r:id="rId22"/>
                   </w:object>
                 </w:r>
               </w:p>
@@ -4611,7 +4611,7 @@
                     <v:shape id="_x0000_i1026" type="#_x0000_t75" style="width:116.45pt;height:113.95pt" o:ole="">
                       <v:imagedata r:id="rId23" o:title=""/>
                     </v:shape>
-                    <o:OLEObject Type="Embed" ProgID="Visio.Drawing.15" ShapeID="_x0000_i1026" DrawAspect="Content" ObjectID="_1823872293" r:id="rId24"/>
+                    <o:OLEObject Type="Embed" ProgID="Visio.Drawing.15" ShapeID="_x0000_i1026" DrawAspect="Content" ObjectID="_1823873063" r:id="rId24"/>
                   </w:object>
                 </w:r>
               </w:p>
@@ -13014,7 +13014,7 @@
     <w:p>
       <w:pPr>
         <w:spacing w:before="160" w:after="160"/>
-        <w:ind w:left="1418"/>
+        <w:ind w:left="709"/>
         <w:rPr>
           <w:rFonts w:ascii="Source Sans 3" w:hAnsi="Source Sans 3"/>
           <w:lang w:eastAsia="de-DE"/>
@@ -13106,7 +13106,7 @@
     <w:p>
       <w:pPr>
         <w:spacing w:before="160" w:after="160"/>
-        <w:ind w:left="709" w:firstLine="709"/>
+        <w:ind w:firstLine="709"/>
         <w:rPr>
           <w:rFonts w:ascii="Courier New" w:hAnsi="Courier New" w:cs="Courier New"/>
           <w:b/>
@@ -13131,7 +13131,7 @@
         <w:autoSpaceDE w:val="0"/>
         <w:autoSpaceDN w:val="0"/>
         <w:adjustRightInd w:val="0"/>
-        <w:ind w:left="1418"/>
+        <w:ind w:left="709"/>
         <w:rPr>
           <w:rFonts w:ascii="Courier New" w:hAnsi="Courier New" w:cs="Courier New"/>
           <w:sz w:val="18"/>
@@ -13146,15 +13146,23 @@
           <w:szCs w:val="18"/>
           <w:lang w:val="en-IN"/>
         </w:rPr>
-        <w:t xml:space="preserve">    /* Initialize LED */</w:t>
-      </w:r>
-    </w:p>
-    <w:p>
-      <w:pPr>
-        <w:autoSpaceDE w:val="0"/>
-        <w:autoSpaceDN w:val="0"/>
-        <w:adjustRightInd w:val="0"/>
-        <w:ind w:left="1418"/>
+        <w:t xml:space="preserve">    </w:t>
+      </w:r>
+      <w:r>
+        <w:rPr>
+          <w:rFonts w:ascii="Courier New" w:hAnsi="Courier New" w:cs="Courier New"/>
+          <w:sz w:val="18"/>
+          <w:szCs w:val="18"/>
+        </w:rPr>
+        <w:t>/* Set GPIO for use with LED */</w:t>
+      </w:r>
+    </w:p>
+    <w:p>
+      <w:pPr>
+        <w:autoSpaceDE w:val="0"/>
+        <w:autoSpaceDN w:val="0"/>
+        <w:adjustRightInd w:val="0"/>
+        <w:ind w:left="709"/>
         <w:rPr>
           <w:rFonts w:ascii="Courier New" w:hAnsi="Courier New" w:cs="Courier New"/>
           <w:color w:val="F97414"/>
@@ -13173,6 +13181,7 @@
         </w:rPr>
         <w:t xml:space="preserve">    </w:t>
       </w:r>
+      <w:bookmarkStart w:id="191" w:name="_Hlk213259926"/>
       <w:bookmarkEnd w:id="190"/>
       <w:proofErr w:type="spellStart"/>
       <w:r>
@@ -13194,6 +13203,7 @@
         </w:rPr>
         <w:t>SetDrivemode</w:t>
       </w:r>
+      <w:bookmarkEnd w:id="191"/>
       <w:proofErr w:type="spellEnd"/>
       <w:r>
         <w:rPr>
@@ -13220,23 +13230,21 @@
         <w:autoSpaceDE w:val="0"/>
         <w:autoSpaceDN w:val="0"/>
         <w:adjustRightInd w:val="0"/>
-        <w:ind w:left="1418"/>
-        <w:rPr>
-          <w:rFonts w:ascii="Courier New" w:hAnsi="Courier New" w:cs="Courier New"/>
-          <w:color w:val="F97414"/>
-          <w:sz w:val="18"/>
-          <w:szCs w:val="18"/>
-        </w:rPr>
-      </w:pPr>
-      <w:bookmarkStart w:id="191" w:name="_GoBack"/>
-      <w:bookmarkEnd w:id="191"/>
-    </w:p>
-    <w:p>
-      <w:pPr>
-        <w:autoSpaceDE w:val="0"/>
-        <w:autoSpaceDN w:val="0"/>
-        <w:adjustRightInd w:val="0"/>
-        <w:ind w:left="1418"/>
+        <w:ind w:left="709"/>
+        <w:rPr>
+          <w:rFonts w:ascii="Courier New" w:hAnsi="Courier New" w:cs="Courier New"/>
+          <w:color w:val="F97414"/>
+          <w:sz w:val="18"/>
+          <w:szCs w:val="18"/>
+        </w:rPr>
+      </w:pPr>
+    </w:p>
+    <w:p>
+      <w:pPr>
+        <w:autoSpaceDE w:val="0"/>
+        <w:autoSpaceDN w:val="0"/>
+        <w:adjustRightInd w:val="0"/>
+        <w:ind w:left="709"/>
         <w:rPr>
           <w:rFonts w:ascii="Courier New" w:hAnsi="Courier New" w:cs="Courier New"/>
           <w:b/>
@@ -13259,7 +13267,7 @@
     <w:p>
       <w:pPr>
         <w:spacing w:before="160" w:after="160"/>
-        <w:ind w:left="1418"/>
+        <w:ind w:left="709"/>
         <w:rPr>
           <w:rFonts w:ascii="Source Sans 3" w:hAnsi="Source Sans 3" w:cs="Consolas"/>
           <w:i/>
@@ -13301,7 +13309,7 @@
           <w:color w:val="000000"/>
           <w:lang w:val="en-IN"/>
         </w:rPr>
-        <w:t xml:space="preserve"> HAL </w:t>
+        <w:t xml:space="preserve"> </w:t>
       </w:r>
       <w:r>
         <w:rPr>
@@ -13310,7 +13318,7 @@
           <w:color w:val="000000"/>
           <w:lang w:val="en-IN"/>
         </w:rPr>
-        <w:t>API</w:t>
+        <w:t>PDL</w:t>
       </w:r>
       <w:r>
         <w:rPr>
@@ -13319,7 +13327,7 @@
           <w:color w:val="000000"/>
           <w:lang w:val="en-IN"/>
         </w:rPr>
-        <w:t>s</w:t>
+        <w:t xml:space="preserve"> </w:t>
       </w:r>
       <w:r>
         <w:rPr>
@@ -13328,42 +13336,8 @@
           <w:color w:val="000000"/>
           <w:lang w:val="en-IN"/>
         </w:rPr>
-        <w:t xml:space="preserve"> will be available in HAL documentation </w:t>
-      </w:r>
-      <w:bookmarkStart w:id="192" w:name="_mioConsistencyCheck168"/>
-      <w:bookmarkStart w:id="193" w:name="_mioConsistencyCheck64"/>
-      <w:r>
-        <w:fldChar w:fldCharType="begin"/>
-      </w:r>
-      <w:r>
-        <w:rPr>
-          <w:rFonts w:ascii="Source Sans 3" w:hAnsi="Source Sans 3"/>
-        </w:rPr>
-        <w:instrText xml:space="preserve"> HYPERLINK "https://infineon.github.io/mtb-hal-cat1/html/index.html" </w:instrText>
-      </w:r>
-      <w:r>
-        <w:fldChar w:fldCharType="separate"/>
-      </w:r>
-      <w:r>
-        <w:rPr>
-          <w:rStyle w:val="Hyperlink"/>
-          <w:rFonts w:ascii="Source Sans 3" w:hAnsi="Source Sans 3" w:cs="Consolas"/>
-          <w:i/>
-          <w:lang w:val="en-IN"/>
-        </w:rPr>
-        <w:t>https://infineon.github.io/mtb-hal-cat1/html/index.html</w:t>
-      </w:r>
-      <w:r>
-        <w:rPr>
-          <w:rStyle w:val="Hyperlink"/>
-          <w:rFonts w:ascii="Source Sans 3" w:hAnsi="Source Sans 3" w:cs="Consolas"/>
-          <w:i/>
-          <w:lang w:val="en-IN"/>
-        </w:rPr>
-        <w:fldChar w:fldCharType="end"/>
-      </w:r>
-      <w:bookmarkEnd w:id="192"/>
-      <w:bookmarkEnd w:id="193"/>
+        <w:t>API</w:t>
+      </w:r>
       <w:r>
         <w:rPr>
           <w:rFonts w:ascii="Source Sans 3" w:hAnsi="Source Sans 3" w:cs="Consolas"/>
@@ -13371,7 +13345,7 @@
           <w:color w:val="000000"/>
           <w:lang w:val="en-IN"/>
         </w:rPr>
-        <w:t xml:space="preserve"> </w:t>
+        <w:t>s</w:t>
       </w:r>
       <w:r>
         <w:rPr>
@@ -13380,7 +13354,7 @@
           <w:color w:val="000000"/>
           <w:lang w:val="en-IN"/>
         </w:rPr>
-        <w:t xml:space="preserve">, </w:t>
+        <w:t xml:space="preserve"> will be available in </w:t>
       </w:r>
       <w:r>
         <w:rPr>
@@ -13389,7 +13363,7 @@
           <w:color w:val="000000"/>
           <w:lang w:val="en-IN"/>
         </w:rPr>
-        <w:t>search</w:t>
+        <w:t>PDL</w:t>
       </w:r>
       <w:r>
         <w:rPr>
@@ -13398,30 +13372,110 @@
           <w:color w:val="000000"/>
           <w:lang w:val="en-IN"/>
         </w:rPr>
-        <w:t xml:space="preserve"> for particular function and get an overview of it. Here is an example for the </w:t>
-      </w:r>
+        <w:t xml:space="preserve"> documentation </w:t>
+      </w:r>
+      <w:bookmarkStart w:id="192" w:name="_mioConsistencyCheck168"/>
+      <w:bookmarkStart w:id="193" w:name="_mioConsistencyCheck64"/>
       <w:r>
         <w:rPr>
           <w:rFonts w:ascii="Source Sans 3" w:hAnsi="Source Sans 3" w:cs="Consolas"/>
-          <w:color w:val="000000"/>
-          <w:sz w:val="20"/>
-          <w:szCs w:val="20"/>
-          <w:lang w:val="en-IN"/>
-        </w:rPr>
-        <w:t xml:space="preserve">cyhal_gpio_init we used </w:t>
-      </w:r>
-    </w:p>
-    <w:p>
-      <w:pPr>
-        <w:spacing w:before="160" w:after="160"/>
-        <w:ind w:left="709" w:firstLine="709"/>
-        <w:rPr>
-          <w:rFonts w:cs="Consolas"/>
           <w:i/>
           <w:color w:val="000000"/>
           <w:lang w:val="en-IN"/>
         </w:rPr>
-      </w:pPr>
+        <w:t xml:space="preserve">can be found </w:t>
+      </w:r>
+      <w:hyperlink r:id="rId50" w:history="1">
+        <w:r>
+          <w:rPr>
+            <w:rStyle w:val="Hyperlink"/>
+            <w:rFonts w:ascii="Source Sans 3" w:hAnsi="Source Sans 3" w:cs="Consolas"/>
+            <w:i/>
+            <w:lang w:val="en-IN"/>
+          </w:rPr>
+          <w:t>here</w:t>
+        </w:r>
+        <w:bookmarkEnd w:id="192"/>
+        <w:bookmarkEnd w:id="193"/>
+      </w:hyperlink>
+      <w:r>
+        <w:rPr>
+          <w:rFonts w:ascii="Source Sans 3" w:hAnsi="Source Sans 3" w:cs="Consolas"/>
+          <w:i/>
+          <w:color w:val="000000"/>
+          <w:lang w:val="en-IN"/>
+        </w:rPr>
+        <w:t xml:space="preserve">, </w:t>
+      </w:r>
+      <w:r>
+        <w:rPr>
+          <w:rFonts w:ascii="Source Sans 3" w:hAnsi="Source Sans 3" w:cs="Consolas"/>
+          <w:i/>
+          <w:color w:val="000000"/>
+          <w:lang w:val="en-IN"/>
+        </w:rPr>
+        <w:t xml:space="preserve">where you can </w:t>
+      </w:r>
+      <w:r>
+        <w:rPr>
+          <w:rFonts w:ascii="Source Sans 3" w:hAnsi="Source Sans 3" w:cs="Consolas"/>
+          <w:i/>
+          <w:color w:val="000000"/>
+          <w:lang w:val="en-IN"/>
+        </w:rPr>
+        <w:t>search</w:t>
+      </w:r>
+      <w:r>
+        <w:rPr>
+          <w:rFonts w:ascii="Source Sans 3" w:hAnsi="Source Sans 3" w:cs="Consolas"/>
+          <w:i/>
+          <w:color w:val="000000"/>
+          <w:lang w:val="en-IN"/>
+        </w:rPr>
+        <w:t xml:space="preserve"> for particular function and get an overview of it. Here is an example for the </w:t>
+      </w:r>
+      <w:proofErr w:type="spellStart"/>
+      <w:r>
+        <w:rPr>
+          <w:rFonts w:ascii="Source Sans 3" w:hAnsi="Source Sans 3" w:cs="Consolas"/>
+          <w:color w:val="000000"/>
+        </w:rPr>
+        <w:t>Cy_GPIO_SetDrivemode</w:t>
+      </w:r>
+      <w:proofErr w:type="spellEnd"/>
+      <w:r>
+        <w:rPr>
+          <w:rFonts w:ascii="Source Sans 3" w:hAnsi="Source Sans 3" w:cs="Consolas"/>
+          <w:color w:val="000000"/>
+          <w:lang w:val="en-IN"/>
+        </w:rPr>
+        <w:t xml:space="preserve"> </w:t>
+      </w:r>
+      <w:r>
+        <w:rPr>
+          <w:rFonts w:ascii="Source Sans 3" w:hAnsi="Source Sans 3" w:cs="Consolas"/>
+          <w:i/>
+          <w:color w:val="000000"/>
+          <w:lang w:val="en-IN"/>
+        </w:rPr>
+        <w:t>we are using</w:t>
+      </w:r>
+      <w:r>
+        <w:rPr>
+          <w:rFonts w:ascii="Source Sans 3" w:hAnsi="Source Sans 3" w:cs="Consolas"/>
+          <w:color w:val="000000"/>
+          <w:lang w:val="en-IN"/>
+        </w:rPr>
+        <w:t>.</w:t>
+      </w:r>
+      <w:r>
+        <w:rPr>
+          <w:rFonts w:ascii="Source Sans 3" w:hAnsi="Source Sans 3" w:cs="Consolas"/>
+          <w:color w:val="000000"/>
+          <w:lang w:val="en-IN"/>
+        </w:rPr>
+        <w:t xml:space="preserve"> </w:t>
+      </w:r>
     </w:p>
     <w:p>
       <w:pPr>
@@ -13430,52 +13484,160 @@
         <w:jc w:val="center"/>
         <w:rPr>
           <w:rFonts w:cs="Consolas"/>
-          <w:i/>
           <w:color w:val="000000"/>
           <w:lang w:val="en-IN"/>
         </w:rPr>
       </w:pPr>
-      <w:r>
-        <w:rPr>
-          <w:noProof/>
-        </w:rPr>
-        <w:drawing>
-          <wp:inline distT="0" distB="0" distL="0" distR="0" wp14:anchorId="41072C33" wp14:editId="4B377319">
-            <wp:extent cx="5419871" cy="2652582"/>
-            <wp:effectExtent l="0" t="0" r="0" b="0"/>
-            <wp:docPr id="1674950464" name="Picture 1674950464"/>
-            <wp:cNvGraphicFramePr>
-              <a:graphicFrameLocks xmlns:a="http://schemas.openxmlformats.org/drawingml/2006/main" noChangeAspect="1"/>
-            </wp:cNvGraphicFramePr>
-            <a:graphic xmlns:a="http://schemas.openxmlformats.org/drawingml/2006/main">
-              <a:graphicData uri="http://schemas.openxmlformats.org/drawingml/2006/picture">
-                <pic:pic xmlns:pic="http://schemas.openxmlformats.org/drawingml/2006/picture">
-                  <pic:nvPicPr>
-                    <pic:cNvPr id="1" name=""/>
-                    <pic:cNvPicPr/>
-                  </pic:nvPicPr>
-                  <pic:blipFill>
-                    <a:blip r:embed="rId50"/>
-                    <a:stretch>
-                      <a:fillRect/>
-                    </a:stretch>
-                  </pic:blipFill>
-                  <pic:spPr>
-                    <a:xfrm>
-                      <a:off x="0" y="0"/>
-                      <a:ext cx="5435877" cy="2660416"/>
-                    </a:xfrm>
-                    <a:prstGeom prst="rect">
-                      <a:avLst/>
-                    </a:prstGeom>
-                  </pic:spPr>
-                </pic:pic>
-              </a:graphicData>
-            </a:graphic>
-          </wp:inline>
-        </w:drawing>
-      </w:r>
-    </w:p>
+    </w:p>
+    <w:sdt>
+      <w:sdtPr>
+        <w:rPr>
+          <w:rFonts w:cs="Consolas"/>
+          <w:color w:val="000000"/>
+          <w:lang w:val="en-IN"/>
+        </w:rPr>
+        <w:alias w:val="mioTextBlock"/>
+        <w:tag w:val="d56a32fe-1575-4527-bdc7-689b99f50dd5"/>
+        <w:id w:val="-1028331219"/>
+        <w:placeholder>
+          <w:docPart w:val="DefaultPlaceholder_-1854013440"/>
+        </w:placeholder>
+        <w15:appearance w15:val="hidden"/>
+      </w:sdtPr>
+      <w:sdtEndPr>
+        <w:rPr>
+          <w:b/>
+          <w:lang w:eastAsia="en-US"/>
+        </w:rPr>
+      </w:sdtEndPr>
+      <w:sdtContent>
+        <w:tbl>
+          <w:tblPr>
+            <w:tblStyle w:val="InfineonPicture"/>
+            <w:tblW w:w="5000" w:type="pct"/>
+            <w:tblCellMar>
+              <w:left w:w="0" w:type="dxa"/>
+              <w:right w:w="0" w:type="dxa"/>
+            </w:tblCellMar>
+            <w:tblLook w:val="05E0" w:firstRow="1" w:lastRow="1" w:firstColumn="1" w:lastColumn="1" w:noHBand="0" w:noVBand="1"/>
+          </w:tblPr>
+          <w:tblGrid>
+            <w:gridCol w:w="10763"/>
+          </w:tblGrid>
+          <w:tr>
+            <w:tc>
+              <w:tcPr>
+                <w:tcW w:w="5000" w:type="pct"/>
+              </w:tcPr>
+              <w:p>
+                <w:pPr>
+                  <w:pStyle w:val="TableCell-c"/>
+                </w:pPr>
+                <w:r>
+                  <w:rPr>
+                    <w:noProof/>
+                  </w:rPr>
+                  <w:drawing>
+                    <wp:inline distT="0" distB="0" distL="0" distR="0" wp14:anchorId="144CFEB3" wp14:editId="31BD0C16">
+                      <wp:extent cx="6554738" cy="2440141"/>
+                      <wp:effectExtent l="0" t="0" r="0" b="0"/>
+                      <wp:docPr id="1674950464" name="Picture 1674950464"/>
+                      <wp:cNvGraphicFramePr>
+                        <a:graphicFrameLocks xmlns:a="http://schemas.openxmlformats.org/drawingml/2006/main" noChangeAspect="1"/>
+                      </wp:cNvGraphicFramePr>
+                      <a:graphic xmlns:a="http://schemas.openxmlformats.org/drawingml/2006/main">
+                        <a:graphicData uri="http://schemas.openxmlformats.org/drawingml/2006/picture">
+                          <pic:pic xmlns:pic="http://schemas.openxmlformats.org/drawingml/2006/picture">
+                            <pic:nvPicPr>
+                              <pic:cNvPr id="1" name=""/>
+                              <pic:cNvPicPr/>
+                            </pic:nvPicPr>
+                            <pic:blipFill>
+                              <a:blip r:embed="rId51" cstate="print">
+                                <a:extLst>
+                                  <a:ext uri="{28A0092B-C50C-407E-A947-70E740481C1C}">
+                                    <a14:useLocalDpi xmlns:a14="http://schemas.microsoft.com/office/drawing/2010/main" val="0"/>
+                                  </a:ext>
+                                </a:extLst>
+                              </a:blip>
+                              <a:stretch>
+                                <a:fillRect/>
+                              </a:stretch>
+                            </pic:blipFill>
+                            <pic:spPr>
+                              <a:xfrm>
+                                <a:off x="0" y="0"/>
+                                <a:ext cx="6594725" cy="2455027"/>
+                              </a:xfrm>
+                              <a:prstGeom prst="rect">
+                                <a:avLst/>
+                              </a:prstGeom>
+                            </pic:spPr>
+                          </pic:pic>
+                        </a:graphicData>
+                      </a:graphic>
+                    </wp:inline>
+                  </w:drawing>
+                </w:r>
+              </w:p>
+            </w:tc>
+          </w:tr>
+        </w:tbl>
+        <w:p>
+          <w:pPr>
+            <w:pStyle w:val="Figuretitlenew"/>
+            <w:rPr>
+              <w:rFonts w:cs="Consolas"/>
+              <w:color w:val="000000"/>
+              <w:lang w:val="en-IN"/>
+            </w:rPr>
+          </w:pPr>
+          <w:r>
+            <w:t xml:space="preserve">Figure </w:t>
+          </w:r>
+          <w:r>
+            <w:fldChar w:fldCharType="begin"/>
+          </w:r>
+          <w:r>
+            <w:instrText xml:space="preserve"> SEQ Figure \* ARABIC </w:instrText>
+          </w:r>
+          <w:r>
+            <w:fldChar w:fldCharType="separate"/>
+          </w:r>
+          <w:r>
+            <w:rPr>
+              <w:noProof/>
+            </w:rPr>
+            <w:t>27</w:t>
+          </w:r>
+          <w:r>
+            <w:fldChar w:fldCharType="end"/>
+          </w:r>
+          <w:r>
+            <w:tab/>
+          </w:r>
+          <w:r>
+            <w:t xml:space="preserve">PDL API Online Reference - </w:t>
+          </w:r>
+          <w:proofErr w:type="spellStart"/>
+          <w:r>
+            <w:t>Cy_GPIO_</w:t>
+          </w:r>
+          <w:proofErr w:type="gramStart"/>
+          <w:r>
+            <w:t>SetDrivemode</w:t>
+          </w:r>
+          <w:proofErr w:type="spellEnd"/>
+          <w:r>
+            <w:t>(</w:t>
+          </w:r>
+          <w:proofErr w:type="gramEnd"/>
+          <w:r>
+            <w:t xml:space="preserve">) </w:t>
+          </w:r>
+        </w:p>
+      </w:sdtContent>
+    </w:sdt>
     <w:p>
       <w:pPr>
         <w:pStyle w:val="ListParagraph"/>
@@ -13978,7 +14140,7 @@
         <w:pStyle w:val="ListParagraph"/>
         <w:numPr>
           <w:ilvl w:val="0"/>
-          <w:numId w:val="21"/>
+          <w:numId w:val="20"/>
         </w:numPr>
         <w:spacing w:before="160" w:after="160"/>
         <w:rPr>
@@ -13986,6 +14148,8 @@
           <w:lang w:eastAsia="de-DE"/>
         </w:rPr>
       </w:pPr>
+      <w:bookmarkStart w:id="197" w:name="_GoBack"/>
+      <w:bookmarkEnd w:id="197"/>
       <w:r>
         <w:rPr>
           <w:rFonts w:ascii="Source Sans 3" w:hAnsi="Source Sans 3"/>
@@ -14094,14 +14258,15 @@
           <w:szCs w:val="18"/>
         </w:rPr>
       </w:pPr>
-      <w:bookmarkStart w:id="197" w:name="_mioConsistencyCheck172"/>
-      <w:r>
-        <w:rPr>
-          <w:rFonts w:ascii="Courier New" w:hAnsi="Courier New" w:cs="Courier New"/>
-          <w:color w:val="F97414"/>
-          <w:sz w:val="18"/>
-          <w:szCs w:val="18"/>
-        </w:rPr>
+      <w:bookmarkStart w:id="198" w:name="_mioConsistencyCheck172"/>
+      <w:r>
+        <w:rPr>
+          <w:rFonts w:ascii="Courier New" w:hAnsi="Courier New" w:cs="Courier New"/>
+          <w:color w:val="F97414"/>
+          <w:sz w:val="18"/>
+          <w:szCs w:val="18"/>
+        </w:rPr>
+        <w:lastRenderedPageBreak/>
         <w:t>printf("\x1b[2J\x1b[;H");</w:t>
       </w:r>
     </w:p>
@@ -14139,7 +14304,6 @@
           <w:sz w:val="18"/>
           <w:szCs w:val="18"/>
         </w:rPr>
-        <w:lastRenderedPageBreak/>
         <w:t>printf("****************** "</w:t>
       </w:r>
     </w:p>
@@ -14165,8 +14329,8 @@
         </w:rPr>
         <w:t>"</w:t>
       </w:r>
-      <w:bookmarkStart w:id="198" w:name="_mioConsistencyCheck289"/>
-      <w:bookmarkStart w:id="199" w:name="_mioConsistencyCheck70"/>
+      <w:bookmarkStart w:id="199" w:name="_mioConsistencyCheck289"/>
+      <w:bookmarkStart w:id="200" w:name="_mioConsistencyCheck70"/>
       <w:r>
         <w:rPr>
           <w:rFonts w:ascii="Courier New" w:hAnsi="Courier New" w:cs="Courier New"/>
@@ -14176,8 +14340,8 @@
         </w:rPr>
         <w:t>PSOC</w:t>
       </w:r>
-      <w:bookmarkEnd w:id="198"/>
       <w:bookmarkEnd w:id="199"/>
+      <w:bookmarkEnd w:id="200"/>
       <w:r>
         <w:rPr>
           <w:rFonts w:ascii="Courier New" w:hAnsi="Courier New" w:cs="Courier New"/>
@@ -14406,7 +14570,7 @@
         <w:t>-Software\r\n\n");</w:t>
       </w:r>
     </w:p>
-    <w:bookmarkEnd w:id="197"/>
+    <w:bookmarkEnd w:id="198"/>
     <w:p>
       <w:pPr>
         <w:spacing w:before="160" w:after="160"/>
@@ -14435,7 +14599,7 @@
         <w:pStyle w:val="ListParagraph"/>
         <w:numPr>
           <w:ilvl w:val="0"/>
-          <w:numId w:val="21"/>
+          <w:numId w:val="20"/>
         </w:numPr>
         <w:spacing w:before="160" w:after="160"/>
         <w:rPr>
@@ -14598,7 +14762,7 @@
           <w:szCs w:val="18"/>
         </w:rPr>
       </w:pPr>
-      <w:bookmarkStart w:id="200" w:name="_mioConsistencyCheck173"/>
+      <w:bookmarkStart w:id="201" w:name="_mioConsistencyCheck173"/>
       <w:proofErr w:type="spellStart"/>
       <w:r>
         <w:rPr>
@@ -14680,7 +14844,7 @@
         <w:t xml:space="preserve">   "resume blinking the user LED \r\n\r\n");</w:t>
       </w:r>
     </w:p>
-    <w:bookmarkEnd w:id="200"/>
+    <w:bookmarkEnd w:id="201"/>
     <w:p>
       <w:pPr>
         <w:spacing w:before="160" w:after="160"/>
@@ -14707,7 +14871,7 @@
         <w:pStyle w:val="ListParagraph"/>
         <w:numPr>
           <w:ilvl w:val="0"/>
-          <w:numId w:val="21"/>
+          <w:numId w:val="20"/>
         </w:numPr>
         <w:spacing w:before="160" w:after="160"/>
         <w:rPr>
@@ -14815,7 +14979,7 @@
           <w:szCs w:val="18"/>
         </w:rPr>
       </w:pPr>
-      <w:bookmarkStart w:id="201" w:name="_mioConsistencyCheck174"/>
+      <w:bookmarkStart w:id="202" w:name="_mioConsistencyCheck174"/>
       <w:r>
         <w:rPr>
           <w:rFonts w:ascii="Courier New" w:hAnsi="Courier New" w:cs="Courier New"/>
@@ -14826,7 +14990,7 @@
         <w:t>Cy_SysEnableCM55(CY_CORTEX_M55_APPL_ADDR, CM55_BOOT_WAIT_TIME_USEC);</w:t>
       </w:r>
     </w:p>
-    <w:bookmarkEnd w:id="201"/>
+    <w:bookmarkEnd w:id="202"/>
     <w:p>
       <w:pPr>
         <w:pStyle w:val="ListParagraph"/>
@@ -14864,7 +15028,7 @@
         <w:pStyle w:val="ListParagraph"/>
         <w:numPr>
           <w:ilvl w:val="0"/>
-          <w:numId w:val="21"/>
+          <w:numId w:val="20"/>
         </w:numPr>
         <w:spacing w:before="160" w:after="160"/>
         <w:rPr>
@@ -15309,13 +15473,14 @@
           <w:szCs w:val="18"/>
         </w:rPr>
       </w:pPr>
-      <w:bookmarkStart w:id="202" w:name="_Hlk192779201"/>
-      <w:r>
-        <w:rPr>
-          <w:rFonts w:ascii="Courier New" w:hAnsi="Courier New" w:cs="Courier New"/>
-          <w:sz w:val="18"/>
-          <w:szCs w:val="18"/>
-        </w:rPr>
+      <w:bookmarkStart w:id="203" w:name="_Hlk192779201"/>
+      <w:r>
+        <w:rPr>
+          <w:rFonts w:ascii="Courier New" w:hAnsi="Courier New" w:cs="Courier New"/>
+          <w:sz w:val="18"/>
+          <w:szCs w:val="18"/>
+        </w:rPr>
+        <w:lastRenderedPageBreak/>
         <w:t>/* Main loop */</w:t>
       </w:r>
     </w:p>
@@ -15332,8 +15497,8 @@
           <w:szCs w:val="18"/>
         </w:rPr>
       </w:pPr>
-      <w:bookmarkStart w:id="203" w:name="_mioConsistencyCheck175"/>
-      <w:bookmarkEnd w:id="202"/>
+      <w:bookmarkStart w:id="204" w:name="_mioConsistencyCheck175"/>
+      <w:bookmarkEnd w:id="203"/>
       <w:r>
         <w:rPr>
           <w:rFonts w:ascii="Courier New" w:hAnsi="Courier New" w:cs="Courier New"/>
@@ -15364,7 +15529,6 @@
           <w:sz w:val="18"/>
           <w:szCs w:val="18"/>
         </w:rPr>
-        <w:lastRenderedPageBreak/>
         <w:t>{</w:t>
       </w:r>
     </w:p>
@@ -15719,8 +15883,8 @@
           <w:szCs w:val="18"/>
         </w:rPr>
       </w:pPr>
-      <w:bookmarkStart w:id="204" w:name="_mioConsistencyCheck176"/>
-      <w:bookmarkEnd w:id="203"/>
+      <w:bookmarkStart w:id="205" w:name="_mioConsistencyCheck176"/>
+      <w:bookmarkEnd w:id="204"/>
       <w:r>
         <w:rPr>
           <w:rFonts w:ascii="Courier New" w:hAnsi="Courier New" w:cs="Courier New"/>
@@ -16056,8 +16220,8 @@
           <w:szCs w:val="18"/>
         </w:rPr>
       </w:pPr>
-      <w:bookmarkStart w:id="205" w:name="_mioConsistencyCheck177"/>
-      <w:bookmarkEnd w:id="204"/>
+      <w:bookmarkStart w:id="206" w:name="_mioConsistencyCheck177"/>
+      <w:bookmarkEnd w:id="205"/>
       <w:r>
         <w:rPr>
           <w:rFonts w:ascii="Courier New" w:hAnsi="Courier New" w:cs="Courier New"/>
@@ -16359,8 +16523,8 @@
           <w:szCs w:val="18"/>
         </w:rPr>
       </w:pPr>
-      <w:bookmarkStart w:id="206" w:name="_mioConsistencyCheck178"/>
-      <w:bookmarkEnd w:id="205"/>
+      <w:bookmarkStart w:id="207" w:name="_mioConsistencyCheck178"/>
+      <w:bookmarkEnd w:id="206"/>
       <w:proofErr w:type="spellStart"/>
       <w:r>
         <w:rPr>
@@ -16583,7 +16747,7 @@
         <w:t xml:space="preserve">        /* Clear the flag */</w:t>
       </w:r>
     </w:p>
-    <w:bookmarkEnd w:id="206"/>
+    <w:bookmarkEnd w:id="207"/>
     <w:p>
       <w:pPr>
         <w:autoSpaceDE w:val="0"/>
@@ -16606,7 +16770,7 @@
         </w:rPr>
         <w:t xml:space="preserve">        </w:t>
       </w:r>
-      <w:bookmarkStart w:id="207" w:name="_mioConsistencyCheck179"/>
+      <w:bookmarkStart w:id="208" w:name="_mioConsistencyCheck179"/>
       <w:proofErr w:type="spellStart"/>
       <w:r>
         <w:rPr>
@@ -16665,7 +16829,7 @@
         <w:t xml:space="preserve">        /* Invert the USER LED state */</w:t>
       </w:r>
     </w:p>
-    <w:bookmarkEnd w:id="207"/>
+    <w:bookmarkEnd w:id="208"/>
     <w:p>
       <w:pPr>
         <w:autoSpaceDE w:val="0"/>
@@ -16688,7 +16852,7 @@
         </w:rPr>
         <w:t xml:space="preserve">        </w:t>
       </w:r>
-      <w:bookmarkStart w:id="208" w:name="_mioConsistencyCheck180"/>
+      <w:bookmarkStart w:id="209" w:name="_mioConsistencyCheck180"/>
       <w:proofErr w:type="spellStart"/>
       <w:r>
         <w:rPr>
@@ -16765,7 +16929,7 @@
         <w:t xml:space="preserve"> //end forever for loop</w:t>
       </w:r>
     </w:p>
-    <w:bookmarkEnd w:id="208"/>
+    <w:bookmarkEnd w:id="209"/>
     <w:p>
       <w:pPr>
         <w:spacing w:before="160" w:after="160"/>
@@ -16789,7 +16953,7 @@
         <w:pStyle w:val="ListParagraph"/>
         <w:numPr>
           <w:ilvl w:val="0"/>
-          <w:numId w:val="21"/>
+          <w:numId w:val="20"/>
         </w:numPr>
         <w:spacing w:before="160" w:after="160"/>
         <w:rPr>
@@ -17365,14 +17529,15 @@
           <w:szCs w:val="18"/>
         </w:rPr>
       </w:pPr>
-      <w:bookmarkStart w:id="209" w:name="_mioConsistencyCheck181"/>
-      <w:r>
-        <w:rPr>
-          <w:rFonts w:ascii="Courier New" w:hAnsi="Courier New" w:cs="Courier New"/>
-          <w:color w:val="F97414"/>
-          <w:sz w:val="18"/>
-          <w:szCs w:val="18"/>
-        </w:rPr>
+      <w:bookmarkStart w:id="210" w:name="_mioConsistencyCheck181"/>
+      <w:r>
+        <w:rPr>
+          <w:rFonts w:ascii="Courier New" w:hAnsi="Courier New" w:cs="Courier New"/>
+          <w:color w:val="F97414"/>
+          <w:sz w:val="18"/>
+          <w:szCs w:val="18"/>
+        </w:rPr>
+        <w:lastRenderedPageBreak/>
         <w:t xml:space="preserve">void </w:t>
       </w:r>
       <w:proofErr w:type="spellStart"/>
@@ -17419,7 +17584,7 @@
         <w:t>{</w:t>
       </w:r>
     </w:p>
-    <w:bookmarkEnd w:id="209"/>
+    <w:bookmarkEnd w:id="210"/>
     <w:p>
       <w:pPr>
         <w:autoSpaceDE w:val="0"/>
@@ -17440,10 +17605,9 @@
           <w:sz w:val="18"/>
           <w:szCs w:val="18"/>
         </w:rPr>
-        <w:lastRenderedPageBreak/>
         <w:t xml:space="preserve">    </w:t>
       </w:r>
-      <w:bookmarkStart w:id="210" w:name="_mioConsistencyCheck182"/>
+      <w:bookmarkStart w:id="211" w:name="_mioConsistencyCheck182"/>
       <w:proofErr w:type="spellStart"/>
       <w:r>
         <w:rPr>
@@ -18205,7 +18369,7 @@
         <w:t xml:space="preserve">       duration */</w:t>
       </w:r>
     </w:p>
-    <w:bookmarkEnd w:id="210"/>
+    <w:bookmarkEnd w:id="211"/>
     <w:p>
       <w:pPr>
         <w:autoSpaceDE w:val="0"/>
@@ -18228,7 +18392,7 @@
         </w:rPr>
         <w:t xml:space="preserve">    </w:t>
       </w:r>
-      <w:bookmarkStart w:id="211" w:name="_mioConsistencyCheck183"/>
+      <w:bookmarkStart w:id="212" w:name="_mioConsistencyCheck183"/>
       <w:proofErr w:type="spellStart"/>
       <w:r>
         <w:rPr>
@@ -18327,7 +18491,7 @@
         <w:t xml:space="preserve">    /* Set the frequency of timer's clock source */</w:t>
       </w:r>
     </w:p>
-    <w:bookmarkEnd w:id="211"/>
+    <w:bookmarkEnd w:id="212"/>
     <w:p>
       <w:pPr>
         <w:autoSpaceDE w:val="0"/>
@@ -18350,7 +18514,7 @@
         </w:rPr>
         <w:t xml:space="preserve">    </w:t>
       </w:r>
-      <w:bookmarkStart w:id="212" w:name="_mioConsistencyCheck184"/>
+      <w:bookmarkStart w:id="213" w:name="_mioConsistencyCheck184"/>
       <w:proofErr w:type="spellStart"/>
       <w:r>
         <w:rPr>
@@ -18429,7 +18593,7 @@
         <w:t xml:space="preserve">    /* Assign the ISR to execute on timer interrupt */</w:t>
       </w:r>
     </w:p>
-    <w:bookmarkEnd w:id="212"/>
+    <w:bookmarkEnd w:id="213"/>
     <w:p>
       <w:pPr>
         <w:autoSpaceDE w:val="0"/>
@@ -18452,7 +18616,7 @@
         </w:rPr>
         <w:t xml:space="preserve">    </w:t>
       </w:r>
-      <w:bookmarkStart w:id="213" w:name="_mioConsistencyCheck185"/>
+      <w:bookmarkStart w:id="214" w:name="_mioConsistencyCheck185"/>
       <w:proofErr w:type="spellStart"/>
       <w:r>
         <w:rPr>
@@ -18551,7 +18715,7 @@
         <w:t xml:space="preserve">    /* Set the event on which timer interrupt occurs and enable it */</w:t>
       </w:r>
     </w:p>
-    <w:bookmarkEnd w:id="213"/>
+    <w:bookmarkEnd w:id="214"/>
     <w:p>
       <w:pPr>
         <w:autoSpaceDE w:val="0"/>
@@ -18574,7 +18738,7 @@
         </w:rPr>
         <w:t xml:space="preserve">    </w:t>
       </w:r>
-      <w:bookmarkStart w:id="214" w:name="_mioConsistencyCheck186"/>
+      <w:bookmarkStart w:id="215" w:name="_mioConsistencyCheck186"/>
       <w:proofErr w:type="spellStart"/>
       <w:r>
         <w:rPr>
@@ -18676,7 +18840,7 @@
         <w:t xml:space="preserve">    /* Start the timer with the configured settings */</w:t>
       </w:r>
     </w:p>
-    <w:bookmarkEnd w:id="214"/>
+    <w:bookmarkEnd w:id="215"/>
     <w:p>
       <w:pPr>
         <w:autoSpaceDE w:val="0"/>
@@ -18699,7 +18863,7 @@
         </w:rPr>
         <w:t xml:space="preserve">    </w:t>
       </w:r>
-      <w:bookmarkStart w:id="215" w:name="_mioConsistencyCheck187"/>
+      <w:bookmarkStart w:id="216" w:name="_mioConsistencyCheck187"/>
       <w:proofErr w:type="spellStart"/>
       <w:r>
         <w:rPr>
@@ -18764,7 +18928,7 @@
         <w:t>}</w:t>
       </w:r>
     </w:p>
-    <w:bookmarkEnd w:id="215"/>
+    <w:bookmarkEnd w:id="216"/>
     <w:p>
       <w:pPr>
         <w:autoSpaceDE w:val="0"/>
@@ -18808,7 +18972,7 @@
         <w:pStyle w:val="ListParagraph"/>
         <w:numPr>
           <w:ilvl w:val="0"/>
-          <w:numId w:val="21"/>
+          <w:numId w:val="20"/>
         </w:numPr>
         <w:spacing w:before="160" w:after="160"/>
         <w:rPr>
@@ -19231,7 +19395,7 @@
           <w:szCs w:val="18"/>
         </w:rPr>
       </w:pPr>
-      <w:bookmarkStart w:id="216" w:name="_mioConsistencyCheck188"/>
+      <w:bookmarkStart w:id="217" w:name="_mioConsistencyCheck188"/>
       <w:r>
         <w:rPr>
           <w:rFonts w:ascii="Courier New" w:hAnsi="Courier New" w:cs="Courier New"/>
@@ -19425,10 +19589,11 @@
           <w:sz w:val="18"/>
           <w:szCs w:val="18"/>
         </w:rPr>
+        <w:lastRenderedPageBreak/>
         <w:t xml:space="preserve">    /* Set the interrupt flag and process it from the main while(1) loop */</w:t>
       </w:r>
     </w:p>
-    <w:bookmarkEnd w:id="216"/>
+    <w:bookmarkEnd w:id="217"/>
     <w:p>
       <w:pPr>
         <w:autoSpaceDE w:val="0"/>
@@ -19451,7 +19616,7 @@
         </w:rPr>
         <w:t xml:space="preserve">    </w:t>
       </w:r>
-      <w:bookmarkStart w:id="217" w:name="_mioConsistencyCheck189"/>
+      <w:bookmarkStart w:id="218" w:name="_mioConsistencyCheck189"/>
       <w:proofErr w:type="spellStart"/>
       <w:r>
         <w:rPr>
@@ -19493,11 +19658,10 @@
           <w:sz w:val="18"/>
           <w:szCs w:val="18"/>
         </w:rPr>
-        <w:lastRenderedPageBreak/>
         <w:t>}</w:t>
       </w:r>
     </w:p>
-    <w:bookmarkEnd w:id="217"/>
+    <w:bookmarkEnd w:id="218"/>
     <w:p>
       <w:pPr>
         <w:pStyle w:val="ListParagraph"/>
@@ -19876,7 +20040,7 @@
           <w:szCs w:val="18"/>
         </w:rPr>
       </w:pPr>
-      <w:bookmarkStart w:id="218" w:name="_mioConsistencyCheck190"/>
+      <w:bookmarkStart w:id="219" w:name="_mioConsistencyCheck190"/>
       <w:r>
         <w:rPr>
           <w:rFonts w:ascii="Courier New" w:hAnsi="Courier New" w:cs="Courier New"/>
@@ -19976,7 +20140,7 @@
         <w:t>}</w:t>
       </w:r>
     </w:p>
-    <w:bookmarkEnd w:id="218"/>
+    <w:bookmarkEnd w:id="219"/>
     <w:p>
       <w:pPr>
         <w:pStyle w:val="ListParagraph"/>
@@ -20161,7 +20325,7 @@
                     <pic:cNvPicPr/>
                   </pic:nvPicPr>
                   <pic:blipFill>
-                    <a:blip r:embed="rId51">
+                    <a:blip r:embed="rId52">
                       <a:extLst>
                         <a:ext uri="{28A0092B-C50C-407E-A947-70E740481C1C}">
                           <a14:useLocalDpi xmlns:a14="http://schemas.microsoft.com/office/drawing/2010/main" val="0"/>
@@ -20295,7 +20459,7 @@
                     <pic:cNvPicPr/>
                   </pic:nvPicPr>
                   <pic:blipFill>
-                    <a:blip r:embed="rId52">
+                    <a:blip r:embed="rId53">
                       <a:extLst>
                         <a:ext uri="{28A0092B-C50C-407E-A947-70E740481C1C}">
                           <a14:useLocalDpi xmlns:a14="http://schemas.microsoft.com/office/drawing/2010/main" val="0"/>
@@ -20452,7 +20616,7 @@
                     <pic:cNvPicPr/>
                   </pic:nvPicPr>
                   <pic:blipFill>
-                    <a:blip r:embed="rId53"/>
+                    <a:blip r:embed="rId54"/>
                     <a:stretch>
                       <a:fillRect/>
                     </a:stretch>
@@ -20494,9 +20658,9 @@
           <w:lang w:eastAsia="de-DE"/>
         </w:rPr>
       </w:pPr>
-      <w:bookmarkStart w:id="219" w:name="_Toc212806544"/>
-      <w:bookmarkStart w:id="220" w:name="_mioConsistencyCheck411"/>
-      <w:bookmarkStart w:id="221" w:name="_mioConsistencyCheck116"/>
+      <w:bookmarkStart w:id="220" w:name="_Toc212806544"/>
+      <w:bookmarkStart w:id="221" w:name="_mioConsistencyCheck411"/>
+      <w:bookmarkStart w:id="222" w:name="_mioConsistencyCheck116"/>
       <w:r>
         <w:rPr>
           <w:rFonts w:ascii="Source Sans 3" w:hAnsi="Source Sans 3"/>
@@ -20508,7 +20672,7 @@
         </w:rPr>
         <w:t>Conclusion</w:t>
       </w:r>
-      <w:bookmarkEnd w:id="219"/>
+      <w:bookmarkEnd w:id="220"/>
       <w:r>
         <w:rPr>
           <w:b/>
@@ -20520,8 +20684,8 @@
         <w:t xml:space="preserve"> </w:t>
       </w:r>
     </w:p>
-    <w:bookmarkEnd w:id="220"/>
     <w:bookmarkEnd w:id="221"/>
+    <w:bookmarkEnd w:id="222"/>
     <w:p>
       <w:pPr>
         <w:pStyle w:val="Body"/>
@@ -20655,10 +20819,10 @@
           <w:lang w:eastAsia="de-DE"/>
         </w:rPr>
       </w:pPr>
-      <w:bookmarkStart w:id="222" w:name="_Toc212806545"/>
-      <w:bookmarkStart w:id="223" w:name="_mioConsistencyCheck412"/>
-      <w:bookmarkStart w:id="224" w:name="_mioConsistencyCheck117"/>
-      <w:bookmarkStart w:id="225" w:name="_mioConsistencyCheck418"/>
+      <w:bookmarkStart w:id="223" w:name="_Toc212806545"/>
+      <w:bookmarkStart w:id="224" w:name="_mioConsistencyCheck412"/>
+      <w:bookmarkStart w:id="225" w:name="_mioConsistencyCheck117"/>
+      <w:bookmarkStart w:id="226" w:name="_mioConsistencyCheck418"/>
       <w:r>
         <w:rPr>
           <w:rFonts w:ascii="Source Sans 3" w:hAnsi="Source Sans 3"/>
@@ -20671,10 +20835,10 @@
         <w:lastRenderedPageBreak/>
         <w:t>Code Example 2: IPC queues using HAL</w:t>
       </w:r>
-      <w:bookmarkEnd w:id="222"/>
-    </w:p>
-    <w:bookmarkEnd w:id="223"/>
+      <w:bookmarkEnd w:id="223"/>
+    </w:p>
     <w:bookmarkEnd w:id="224"/>
+    <w:bookmarkEnd w:id="225"/>
     <w:p>
       <w:pPr>
         <w:pStyle w:val="Body"/>
@@ -20690,14 +20854,14 @@
       <w:r>
         <w:t xml:space="preserve"> </w:t>
       </w:r>
-      <w:bookmarkStart w:id="226" w:name="_Toc212806546"/>
+      <w:bookmarkStart w:id="227" w:name="_Toc212806546"/>
       <w:r>
         <w:rPr>
           <w:rFonts w:ascii="Source Sans 3" w:hAnsi="Source Sans 3"/>
         </w:rPr>
         <w:t>Objective</w:t>
       </w:r>
-      <w:bookmarkEnd w:id="226"/>
+      <w:bookmarkEnd w:id="227"/>
     </w:p>
     <w:p>
       <w:pPr>
@@ -20721,14 +20885,14 @@
           <w:rFonts w:ascii="Source Sans 3" w:hAnsi="Source Sans 3"/>
         </w:rPr>
       </w:pPr>
-      <w:bookmarkStart w:id="227" w:name="_Toc212806547"/>
+      <w:bookmarkStart w:id="228" w:name="_Toc212806547"/>
       <w:r>
         <w:rPr>
           <w:rFonts w:ascii="Source Sans 3" w:hAnsi="Source Sans 3"/>
         </w:rPr>
         <w:t>Description</w:t>
       </w:r>
-      <w:bookmarkEnd w:id="227"/>
+      <w:bookmarkEnd w:id="228"/>
     </w:p>
     <w:p>
       <w:pPr>
@@ -20899,7 +21063,7 @@
                     <pic:cNvPicPr/>
                   </pic:nvPicPr>
                   <pic:blipFill>
-                    <a:blip r:embed="rId54"/>
+                    <a:blip r:embed="rId55"/>
                     <a:stretch>
                       <a:fillRect/>
                     </a:stretch>
@@ -20919,8 +21083,8 @@
           </wp:inline>
         </w:drawing>
       </w:r>
-      <w:bookmarkStart w:id="228" w:name="_mioConsistencyCheck310"/>
-      <w:bookmarkStart w:id="229" w:name="_mioConsistencyCheck85"/>
+      <w:bookmarkStart w:id="229" w:name="_mioConsistencyCheck310"/>
+      <w:bookmarkStart w:id="230" w:name="_mioConsistencyCheck85"/>
     </w:p>
     <w:p>
       <w:pPr>
@@ -20944,16 +21108,16 @@
       <w:pPr>
         <w:pStyle w:val="Heading2"/>
       </w:pPr>
-      <w:bookmarkStart w:id="230" w:name="_Toc212806548"/>
-      <w:bookmarkEnd w:id="228"/>
+      <w:bookmarkStart w:id="231" w:name="_Toc212806548"/>
       <w:bookmarkEnd w:id="229"/>
+      <w:bookmarkEnd w:id="230"/>
       <w:r>
         <w:rPr>
           <w:rFonts w:ascii="Source Sans 3" w:hAnsi="Source Sans 3"/>
         </w:rPr>
         <w:t>Flowchart</w:t>
       </w:r>
-      <w:bookmarkEnd w:id="230"/>
+      <w:bookmarkEnd w:id="231"/>
     </w:p>
     <w:p>
       <w:pPr>
@@ -20988,7 +21152,7 @@
                     <pic:cNvPicPr/>
                   </pic:nvPicPr>
                   <pic:blipFill>
-                    <a:blip r:embed="rId55">
+                    <a:blip r:embed="rId56">
                       <a:extLst>
                         <a:ext uri="{28A0092B-C50C-407E-A947-70E740481C1C}">
                           <a14:useLocalDpi xmlns:a14="http://schemas.microsoft.com/office/drawing/2010/main" val="0"/>
@@ -21024,7 +21188,7 @@
       <w:pPr>
         <w:pStyle w:val="Heading2"/>
       </w:pPr>
-      <w:bookmarkStart w:id="231" w:name="_Toc212806549"/>
+      <w:bookmarkStart w:id="232" w:name="_Toc212806549"/>
       <w:r>
         <w:rPr>
           <w:rFonts w:ascii="Source Sans 3" w:hAnsi="Source Sans 3"/>
@@ -21032,7 +21196,7 @@
         <w:lastRenderedPageBreak/>
         <w:t>Hardware Block Diagram</w:t>
       </w:r>
-      <w:bookmarkEnd w:id="231"/>
+      <w:bookmarkEnd w:id="232"/>
     </w:p>
     <w:p>
       <w:pPr>
@@ -21061,7 +21225,7 @@
                     </pic:cNvPicPr>
                   </pic:nvPicPr>
                   <pic:blipFill>
-                    <a:blip r:embed="rId56">
+                    <a:blip r:embed="rId57">
                       <a:extLst>
                         <a:ext uri="{28A0092B-C50C-407E-A947-70E740481C1C}">
                           <a14:useLocalDpi xmlns:a14="http://schemas.microsoft.com/office/drawing/2010/main" val="0"/>
@@ -21097,21 +21261,21 @@
       <w:pPr>
         <w:pStyle w:val="Heading2"/>
       </w:pPr>
-      <w:bookmarkStart w:id="232" w:name="_Toc212806550"/>
+      <w:bookmarkStart w:id="233" w:name="_Toc212806550"/>
       <w:r>
         <w:rPr>
           <w:rFonts w:ascii="Source Sans 3" w:hAnsi="Source Sans 3"/>
         </w:rPr>
         <w:t>Hardware Setup</w:t>
       </w:r>
-      <w:bookmarkEnd w:id="232"/>
+      <w:bookmarkEnd w:id="233"/>
     </w:p>
     <w:p>
       <w:pPr>
         <w:pStyle w:val="Body"/>
       </w:pPr>
-      <w:bookmarkStart w:id="233" w:name="_mioConsistencyCheck312"/>
-      <w:bookmarkStart w:id="234" w:name="_mioConsistencyCheck86"/>
+      <w:bookmarkStart w:id="234" w:name="_mioConsistencyCheck312"/>
+      <w:bookmarkStart w:id="235" w:name="_mioConsistencyCheck86"/>
     </w:p>
     <w:p>
       <w:pPr>
@@ -21138,7 +21302,7 @@
                     <pic:cNvPicPr/>
                   </pic:nvPicPr>
                   <pic:blipFill>
-                    <a:blip r:embed="rId57"/>
+                    <a:blip r:embed="rId58"/>
                     <a:stretch>
                       <a:fillRect/>
                     </a:stretch>
@@ -21188,9 +21352,9 @@
       <w:pPr>
         <w:pStyle w:val="Heading2"/>
       </w:pPr>
-      <w:bookmarkStart w:id="235" w:name="_Toc212806551"/>
-      <w:bookmarkEnd w:id="233"/>
+      <w:bookmarkStart w:id="236" w:name="_Toc212806551"/>
       <w:bookmarkEnd w:id="234"/>
+      <w:bookmarkEnd w:id="235"/>
       <w:r>
         <w:rPr>
           <w:rFonts w:ascii="Source Sans 3" w:hAnsi="Source Sans 3"/>
@@ -21198,7 +21362,7 @@
         <w:lastRenderedPageBreak/>
         <w:t>Project Creation</w:t>
       </w:r>
-      <w:bookmarkEnd w:id="235"/>
+      <w:bookmarkEnd w:id="236"/>
       <w:r>
         <w:t xml:space="preserve"> </w:t>
       </w:r>
@@ -21345,7 +21509,7 @@
                     </pic:cNvPicPr>
                   </pic:nvPicPr>
                   <pic:blipFill>
-                    <a:blip r:embed="rId58">
+                    <a:blip r:embed="rId59">
                       <a:extLst>
                         <a:ext uri="{28A0092B-C50C-407E-A947-70E740481C1C}">
                           <a14:useLocalDpi xmlns:a14="http://schemas.microsoft.com/office/drawing/2010/main" val="0"/>
@@ -21468,7 +21632,7 @@
                     </pic:cNvPicPr>
                   </pic:nvPicPr>
                   <pic:blipFill>
-                    <a:blip r:embed="rId59" cstate="print">
+                    <a:blip r:embed="rId60" cstate="print">
                       <a:extLst>
                         <a:ext uri="{28A0092B-C50C-407E-A947-70E740481C1C}">
                           <a14:useLocalDpi xmlns:a14="http://schemas.microsoft.com/office/drawing/2010/main" val="0"/>
@@ -21533,8 +21697,8 @@
         </w:rPr>
         <w:t xml:space="preserve">Clicking Next will take you to the next menu of the Project Creator which will ask you to select an application. Select the </w:t>
       </w:r>
-      <w:bookmarkStart w:id="236" w:name="_mioConsistencyCheck290"/>
-      <w:bookmarkStart w:id="237" w:name="_mioConsistencyCheck71"/>
+      <w:bookmarkStart w:id="237" w:name="_mioConsistencyCheck290"/>
+      <w:bookmarkStart w:id="238" w:name="_mioConsistencyCheck71"/>
       <w:r>
         <w:rPr>
           <w:rFonts w:ascii="Source Sans 3" w:hAnsi="Source Sans 3"/>
@@ -21542,8 +21706,8 @@
         </w:rPr>
         <w:t>PSOC</w:t>
       </w:r>
-      <w:bookmarkEnd w:id="236"/>
       <w:bookmarkEnd w:id="237"/>
+      <w:bookmarkEnd w:id="238"/>
       <w:r>
         <w:rPr>
           <w:rFonts w:ascii="Source Sans 3" w:hAnsi="Source Sans 3"/>
@@ -21667,7 +21831,7 @@
                     </pic:cNvPicPr>
                   </pic:nvPicPr>
                   <pic:blipFill>
-                    <a:blip r:embed="rId60" cstate="print">
+                    <a:blip r:embed="rId61" cstate="print">
                       <a:extLst>
                         <a:ext uri="{28A0092B-C50C-407E-A947-70E740481C1C}">
                           <a14:useLocalDpi xmlns:a14="http://schemas.microsoft.com/office/drawing/2010/main" val="0"/>
@@ -21757,7 +21921,7 @@
                     </pic:cNvPicPr>
                   </pic:nvPicPr>
                   <pic:blipFill>
-                    <a:blip r:embed="rId61">
+                    <a:blip r:embed="rId62">
                       <a:extLst>
                         <a:ext uri="{28A0092B-C50C-407E-A947-70E740481C1C}">
                           <a14:useLocalDpi xmlns:a14="http://schemas.microsoft.com/office/drawing/2010/main" val="0"/>
@@ -21915,7 +22079,7 @@
                     </pic:cNvPicPr>
                   </pic:nvPicPr>
                   <pic:blipFill>
-                    <a:blip r:embed="rId62">
+                    <a:blip r:embed="rId63">
                       <a:extLst>
                         <a:ext uri="{28A0092B-C50C-407E-A947-70E740481C1C}">
                           <a14:useLocalDpi xmlns:a14="http://schemas.microsoft.com/office/drawing/2010/main" val="0"/>
@@ -22069,8 +22233,8 @@
           <w:lang w:eastAsia="de-DE"/>
         </w:rPr>
       </w:pPr>
-      <w:bookmarkStart w:id="238" w:name="_mioConsistencyCheck315"/>
-      <w:bookmarkStart w:id="239" w:name="_mioConsistencyCheck87"/>
+      <w:bookmarkStart w:id="239" w:name="_mioConsistencyCheck315"/>
+      <w:bookmarkStart w:id="240" w:name="_mioConsistencyCheck87"/>
     </w:p>
     <w:p>
       <w:pPr>
@@ -22105,7 +22269,7 @@
                     </pic:cNvPicPr>
                   </pic:nvPicPr>
                   <pic:blipFill>
-                    <a:blip r:embed="rId63">
+                    <a:blip r:embed="rId64">
                       <a:extLst>
                         <a:ext uri="{28A0092B-C50C-407E-A947-70E740481C1C}">
                           <a14:useLocalDpi xmlns:a14="http://schemas.microsoft.com/office/drawing/2010/main" val="0"/>
@@ -22157,8 +22321,8 @@
         </w:rPr>
       </w:pPr>
     </w:p>
-    <w:bookmarkEnd w:id="238"/>
     <w:bookmarkEnd w:id="239"/>
+    <w:bookmarkEnd w:id="240"/>
     <w:p>
       <w:pPr>
         <w:pStyle w:val="ListParagraph"/>
@@ -22313,7 +22477,7 @@
                     </pic:cNvPicPr>
                   </pic:nvPicPr>
                   <pic:blipFill>
-                    <a:blip r:embed="rId64">
+                    <a:blip r:embed="rId65">
                       <a:extLst>
                         <a:ext uri="{28A0092B-C50C-407E-A947-70E740481C1C}">
                           <a14:useLocalDpi xmlns:a14="http://schemas.microsoft.com/office/drawing/2010/main" val="0"/>
@@ -22432,7 +22596,7 @@
                     </pic:cNvPicPr>
                   </pic:nvPicPr>
                   <pic:blipFill>
-                    <a:blip r:embed="rId65" cstate="print">
+                    <a:blip r:embed="rId66" cstate="print">
                       <a:extLst>
                         <a:ext uri="{28A0092B-C50C-407E-A947-70E740481C1C}">
                           <a14:useLocalDpi xmlns:a14="http://schemas.microsoft.com/office/drawing/2010/main" val="0"/>
@@ -22815,7 +22979,7 @@
           <w:noProof/>
         </w:rPr>
       </w:pPr>
-      <w:bookmarkStart w:id="240" w:name="_Hlk147320247"/>
+      <w:bookmarkStart w:id="241" w:name="_Hlk147320247"/>
       <w:r>
         <w:rPr>
           <w:rFonts w:ascii="Source Sans 3" w:hAnsi="Source Sans 3"/>
@@ -22956,7 +23120,7 @@
                     </pic:cNvPicPr>
                   </pic:nvPicPr>
                   <pic:blipFill>
-                    <a:blip r:embed="rId66">
+                    <a:blip r:embed="rId67">
                       <a:extLst>
                         <a:ext uri="{28A0092B-C50C-407E-A947-70E740481C1C}">
                           <a14:useLocalDpi xmlns:a14="http://schemas.microsoft.com/office/drawing/2010/main" val="0"/>
@@ -23128,7 +23292,7 @@
                     </pic:cNvPicPr>
                   </pic:nvPicPr>
                   <pic:blipFill>
-                    <a:blip r:embed="rId67">
+                    <a:blip r:embed="rId68">
                       <a:extLst>
                         <a:ext uri="{28A0092B-C50C-407E-A947-70E740481C1C}">
                           <a14:useLocalDpi xmlns:a14="http://schemas.microsoft.com/office/drawing/2010/main" val="0"/>
@@ -23257,7 +23421,7 @@
                     <pic:cNvPicPr/>
                   </pic:nvPicPr>
                   <pic:blipFill>
-                    <a:blip r:embed="rId68"/>
+                    <a:blip r:embed="rId69"/>
                     <a:stretch>
                       <a:fillRect/>
                     </a:stretch>
@@ -23401,7 +23565,7 @@
                     </pic:cNvPicPr>
                   </pic:nvPicPr>
                   <pic:blipFill>
-                    <a:blip r:embed="rId69">
+                    <a:blip r:embed="rId70">
                       <a:extLst>
                         <a:ext uri="{28A0092B-C50C-407E-A947-70E740481C1C}">
                           <a14:useLocalDpi xmlns:a14="http://schemas.microsoft.com/office/drawing/2010/main" val="0"/>
@@ -23537,7 +23701,7 @@
                     <pic:cNvPicPr/>
                   </pic:nvPicPr>
                   <pic:blipFill>
-                    <a:blip r:embed="rId68"/>
+                    <a:blip r:embed="rId69"/>
                     <a:stretch>
                       <a:fillRect/>
                     </a:stretch>
@@ -23666,7 +23830,7 @@
                     </pic:cNvPicPr>
                   </pic:nvPicPr>
                   <pic:blipFill>
-                    <a:blip r:embed="rId70">
+                    <a:blip r:embed="rId71">
                       <a:extLst>
                         <a:ext uri="{28A0092B-C50C-407E-A947-70E740481C1C}">
                           <a14:useLocalDpi xmlns:a14="http://schemas.microsoft.com/office/drawing/2010/main" val="0"/>
@@ -23710,8 +23874,8 @@
           <w:bCs/>
         </w:rPr>
       </w:pPr>
-      <w:bookmarkStart w:id="241" w:name="_Hlk147320439"/>
-      <w:bookmarkEnd w:id="240"/>
+      <w:bookmarkStart w:id="242" w:name="_Hlk147320439"/>
+      <w:bookmarkEnd w:id="241"/>
       <w:r>
         <w:rPr>
           <w:rFonts w:ascii="Source Sans 3" w:hAnsi="Source Sans 3"/>
@@ -23935,7 +24099,7 @@
           <w:szCs w:val="18"/>
         </w:rPr>
       </w:pPr>
-      <w:bookmarkStart w:id="242" w:name="_mioConsistencyCheck191"/>
+      <w:bookmarkStart w:id="243" w:name="_mioConsistencyCheck191"/>
       <w:r>
         <w:rPr>
           <w:rFonts w:ascii="Courier New" w:hAnsi="Courier New" w:cs="Courier New"/>
@@ -23966,7 +24130,7 @@
         <w:t>"</w:t>
       </w:r>
     </w:p>
-    <w:bookmarkEnd w:id="242"/>
+    <w:bookmarkEnd w:id="243"/>
     <w:p>
       <w:pPr>
         <w:autoSpaceDE w:val="0"/>
@@ -24063,7 +24227,7 @@
           <w:szCs w:val="18"/>
         </w:rPr>
       </w:pPr>
-      <w:bookmarkStart w:id="243" w:name="_mioConsistencyCheck192"/>
+      <w:bookmarkStart w:id="244" w:name="_mioConsistencyCheck192"/>
       <w:r>
         <w:rPr>
           <w:rFonts w:ascii="Courier New" w:hAnsi="Courier New" w:cs="Courier New"/>
@@ -24179,10 +24343,10 @@
           <w:szCs w:val="18"/>
         </w:rPr>
       </w:pPr>
-      <w:bookmarkStart w:id="244" w:name="_mioConsistencyCheck318"/>
-      <w:bookmarkStart w:id="245" w:name="_mioConsistencyCheck88"/>
-      <w:bookmarkEnd w:id="244"/>
+      <w:bookmarkStart w:id="245" w:name="_mioConsistencyCheck318"/>
+      <w:bookmarkStart w:id="246" w:name="_mioConsistencyCheck88"/>
       <w:bookmarkEnd w:id="245"/>
+      <w:bookmarkEnd w:id="246"/>
       <w:r>
         <w:rPr>
           <w:rFonts w:ascii="Courier New" w:hAnsi="Courier New" w:cs="Courier New"/>
@@ -24303,7 +24467,7 @@
         <w:t>#define MAX_TRNG_BIT_SIZE       (32UL)</w:t>
       </w:r>
     </w:p>
-    <w:bookmarkEnd w:id="243"/>
+    <w:bookmarkEnd w:id="244"/>
     <w:p>
       <w:pPr>
         <w:pStyle w:val="TableTitle"/>
@@ -24353,14 +24517,14 @@
         </w:rPr>
         <w:t xml:space="preserve"> </w:t>
       </w:r>
-      <w:bookmarkStart w:id="246" w:name="_Hlk147313194"/>
+      <w:bookmarkStart w:id="247" w:name="_Hlk147313194"/>
       <w:r>
         <w:rPr>
           <w:rFonts w:ascii="Source Sans 3" w:hAnsi="Source Sans 3"/>
         </w:rPr>
         <w:t xml:space="preserve">&lt;code snippet&gt; </w:t>
       </w:r>
-      <w:bookmarkEnd w:id="246"/>
+      <w:bookmarkEnd w:id="247"/>
       <w:r>
         <w:rPr>
           <w:rFonts w:ascii="Source Sans 3" w:hAnsi="Source Sans 3"/>
@@ -24383,7 +24547,7 @@
         </w:rPr>
         <w:t xml:space="preserve"> file</w:t>
       </w:r>
-      <w:bookmarkEnd w:id="241"/>
+      <w:bookmarkEnd w:id="242"/>
       <w:r>
         <w:rPr>
           <w:rFonts w:ascii="Source Sans 3" w:hAnsi="Source Sans 3"/>
@@ -24532,7 +24696,7 @@
           <w:szCs w:val="18"/>
         </w:rPr>
       </w:pPr>
-      <w:bookmarkStart w:id="247" w:name="_mioConsistencyCheck193"/>
+      <w:bookmarkStart w:id="248" w:name="_mioConsistencyCheck193"/>
       <w:r>
         <w:rPr>
           <w:rFonts w:ascii="Courier New" w:hAnsi="Courier New" w:cs="Courier New"/>
@@ -25448,7 +25612,7 @@
         <w:t xml:space="preserve"> = WDT_FLAG_RESET;</w:t>
       </w:r>
     </w:p>
-    <w:bookmarkEnd w:id="247"/>
+    <w:bookmarkEnd w:id="248"/>
     <w:p>
       <w:pPr>
         <w:autoSpaceDE w:val="0"/>
@@ -25559,7 +25723,7 @@
           <w:szCs w:val="18"/>
         </w:rPr>
       </w:pPr>
-      <w:bookmarkStart w:id="248" w:name="_mioConsistencyCheck194"/>
+      <w:bookmarkStart w:id="249" w:name="_mioConsistencyCheck194"/>
       <w:r>
         <w:rPr>
           <w:rFonts w:ascii="Courier New" w:hAnsi="Courier New" w:cs="Courier New"/>
@@ -25590,7 +25754,7 @@
         <w:t>(void);</w:t>
       </w:r>
     </w:p>
-    <w:bookmarkEnd w:id="248"/>
+    <w:bookmarkEnd w:id="249"/>
     <w:p>
       <w:pPr>
         <w:autoSpaceDE w:val="0"/>
@@ -25755,7 +25919,7 @@
           <w:lang w:val="en-IN"/>
         </w:rPr>
       </w:pPr>
-      <w:bookmarkStart w:id="249" w:name="_Hlk147320910"/>
+      <w:bookmarkStart w:id="250" w:name="_Hlk147320910"/>
       <w:r>
         <w:rPr>
           <w:rFonts w:ascii="Source Sans 3" w:hAnsi="Source Sans 3"/>
@@ -25764,7 +25928,7 @@
         <w:t>The below code is the variables required for the communication between the cores:</w:t>
       </w:r>
     </w:p>
-    <w:bookmarkEnd w:id="249"/>
+    <w:bookmarkEnd w:id="250"/>
     <w:p>
       <w:pPr>
         <w:autoSpaceDE w:val="0"/>
@@ -25986,7 +26150,7 @@
         <w:lastRenderedPageBreak/>
         <w:t xml:space="preserve">    </w:t>
       </w:r>
-      <w:bookmarkStart w:id="250" w:name="_mioConsistencyCheck195"/>
+      <w:bookmarkStart w:id="251" w:name="_mioConsistencyCheck195"/>
       <w:proofErr w:type="spellStart"/>
       <w:r>
         <w:rPr>
@@ -26028,7 +26192,7 @@
         <w:t>;</w:t>
       </w:r>
     </w:p>
-    <w:bookmarkEnd w:id="250"/>
+    <w:bookmarkEnd w:id="251"/>
     <w:p>
       <w:pPr>
         <w:autoSpaceDE w:val="0"/>
@@ -26051,7 +26215,7 @@
         </w:rPr>
         <w:t xml:space="preserve">    </w:t>
       </w:r>
-      <w:bookmarkStart w:id="251" w:name="_mioConsistencyCheck196"/>
+      <w:bookmarkStart w:id="252" w:name="_mioConsistencyCheck196"/>
       <w:proofErr w:type="spellStart"/>
       <w:r>
         <w:rPr>
@@ -26093,7 +26257,7 @@
         <w:t>;</w:t>
       </w:r>
     </w:p>
-    <w:bookmarkEnd w:id="251"/>
+    <w:bookmarkEnd w:id="252"/>
     <w:p>
       <w:pPr>
         <w:autoSpaceDE w:val="0"/>
@@ -26116,7 +26280,7 @@
         </w:rPr>
         <w:t xml:space="preserve">    </w:t>
       </w:r>
-      <w:bookmarkStart w:id="252" w:name="_mioConsistencyCheck197"/>
+      <w:bookmarkStart w:id="253" w:name="_mioConsistencyCheck197"/>
       <w:proofErr w:type="spellStart"/>
       <w:r>
         <w:rPr>
@@ -26158,7 +26322,7 @@
         <w:t>;</w:t>
       </w:r>
     </w:p>
-    <w:bookmarkEnd w:id="252"/>
+    <w:bookmarkEnd w:id="253"/>
     <w:p>
       <w:pPr>
         <w:autoSpaceDE w:val="0"/>
@@ -26182,7 +26346,7 @@
         </w:rPr>
         <w:t xml:space="preserve">    </w:t>
       </w:r>
-      <w:bookmarkStart w:id="253" w:name="_mioConsistencyCheck198"/>
+      <w:bookmarkStart w:id="254" w:name="_mioConsistencyCheck198"/>
       <w:r>
         <w:rPr>
           <w:rFonts w:ascii="Courier New" w:hAnsi="Courier New" w:cs="Courier New"/>
@@ -26219,7 +26383,7 @@
         <w:t xml:space="preserve">    cyhal_ipc_t task0_queue2;</w:t>
       </w:r>
     </w:p>
-    <w:bookmarkEnd w:id="253"/>
+    <w:bookmarkEnd w:id="254"/>
     <w:p>
       <w:pPr>
         <w:autoSpaceDE w:val="0"/>
@@ -26243,7 +26407,7 @@
         </w:rPr>
         <w:t xml:space="preserve">     </w:t>
       </w:r>
-      <w:bookmarkStart w:id="254" w:name="_mioConsistencyCheck199"/>
+      <w:bookmarkStart w:id="255" w:name="_mioConsistencyCheck199"/>
       <w:r>
         <w:rPr>
           <w:rFonts w:ascii="Courier New" w:hAnsi="Courier New" w:cs="Courier New"/>
@@ -26254,7 +26418,7 @@
         <w:t>void *queue1_pool, *queue2_pool;</w:t>
       </w:r>
     </w:p>
-    <w:bookmarkEnd w:id="254"/>
+    <w:bookmarkEnd w:id="255"/>
     <w:p>
       <w:pPr>
         <w:autoSpaceDE w:val="0"/>
@@ -26278,7 +26442,7 @@
         </w:rPr>
         <w:t xml:space="preserve">    </w:t>
       </w:r>
-      <w:bookmarkStart w:id="255" w:name="_mioConsistencyCheck200"/>
+      <w:bookmarkStart w:id="256" w:name="_mioConsistencyCheck200"/>
       <w:r>
         <w:rPr>
           <w:rFonts w:ascii="Courier New" w:hAnsi="Courier New" w:cs="Courier New"/>
@@ -26290,7 +26454,7 @@
         <w:t>cyhal_ipc_queue_t *queue1_handle, *queue2_handle;</w:t>
       </w:r>
     </w:p>
-    <w:bookmarkEnd w:id="255"/>
+    <w:bookmarkEnd w:id="256"/>
     <w:p>
       <w:pPr>
         <w:autoSpaceDE w:val="0"/>
@@ -26329,7 +26493,7 @@
         </w:rPr>
         <w:t xml:space="preserve">    </w:t>
       </w:r>
-      <w:bookmarkStart w:id="256" w:name="_mioConsistencyCheck201"/>
+      <w:bookmarkStart w:id="257" w:name="_mioConsistencyCheck201"/>
       <w:r>
         <w:rPr>
           <w:rFonts w:ascii="Courier New" w:hAnsi="Courier New" w:cs="Courier New"/>
@@ -26406,7 +26570,7 @@
         <w:t xml:space="preserve">    uint32_t task0_cmd = 0;</w:t>
       </w:r>
     </w:p>
-    <w:bookmarkEnd w:id="256"/>
+    <w:bookmarkEnd w:id="257"/>
     <w:p>
       <w:pPr>
         <w:autoSpaceDE w:val="0"/>
@@ -26622,7 +26786,7 @@
           <w:szCs w:val="18"/>
         </w:rPr>
       </w:pPr>
-      <w:bookmarkStart w:id="257" w:name="_mioConsistencyCheck202"/>
+      <w:bookmarkStart w:id="258" w:name="_mioConsistencyCheck202"/>
       <w:r>
         <w:rPr>
           <w:rFonts w:ascii="Courier New" w:hAnsi="Courier New" w:cs="Courier New"/>
@@ -26700,7 +26864,7 @@
         <w:t>(task0_msg));</w:t>
       </w:r>
     </w:p>
-    <w:bookmarkEnd w:id="257"/>
+    <w:bookmarkEnd w:id="258"/>
     <w:p>
       <w:pPr>
         <w:pStyle w:val="Body"/>
@@ -26876,7 +27040,7 @@
           <w:szCs w:val="18"/>
         </w:rPr>
       </w:pPr>
-      <w:bookmarkStart w:id="258" w:name="_mioConsistencyCheck203"/>
+      <w:bookmarkStart w:id="259" w:name="_mioConsistencyCheck203"/>
       <w:r>
         <w:rPr>
           <w:rFonts w:ascii="Courier New" w:hAnsi="Courier New" w:cs="Courier New"/>
@@ -27372,7 +27536,7 @@
         <w:t>(task0_msg);</w:t>
       </w:r>
     </w:p>
-    <w:bookmarkEnd w:id="258"/>
+    <w:bookmarkEnd w:id="259"/>
     <w:p>
       <w:pPr>
         <w:pStyle w:val="Body"/>
@@ -27549,7 +27713,7 @@
           <w:szCs w:val="18"/>
         </w:rPr>
       </w:pPr>
-      <w:bookmarkStart w:id="259" w:name="_mioConsistencyCheck204"/>
+      <w:bookmarkStart w:id="260" w:name="_mioConsistencyCheck204"/>
       <w:r>
         <w:rPr>
           <w:rFonts w:ascii="Courier New" w:hAnsi="Courier New" w:cs="Courier New"/>
@@ -27871,7 +28035,7 @@
         <w:t>(&amp;task0_queue1, CYHAL_IPC_QUEUE_WRITE, (uint8_t)IPC_QUEUE_IRQ_PRIORITY, true);</w:t>
       </w:r>
     </w:p>
-    <w:bookmarkEnd w:id="259"/>
+    <w:bookmarkEnd w:id="260"/>
     <w:p>
       <w:pPr>
         <w:pStyle w:val="NormalWeb"/>
@@ -28032,7 +28196,7 @@
           <w:szCs w:val="18"/>
         </w:rPr>
       </w:pPr>
-      <w:bookmarkStart w:id="260" w:name="_mioConsistencyCheck205"/>
+      <w:bookmarkStart w:id="261" w:name="_mioConsistencyCheck205"/>
       <w:r>
         <w:rPr>
           <w:rFonts w:ascii="Courier New" w:hAnsi="Courier New" w:cs="Courier New"/>
@@ -28043,7 +28207,7 @@
         <w:t>Cy_SysEnableCM55(CY_CM55_APP_BOOT_ADDR, CM55_BOOT_WAIT_TIME_US);</w:t>
       </w:r>
     </w:p>
-    <w:bookmarkEnd w:id="260"/>
+    <w:bookmarkEnd w:id="261"/>
     <w:p>
       <w:pPr>
         <w:pStyle w:val="Body"/>
@@ -28313,7 +28477,7 @@
           <w:szCs w:val="18"/>
         </w:rPr>
       </w:pPr>
-      <w:bookmarkStart w:id="261" w:name="_mioConsistencyCheck206"/>
+      <w:bookmarkStart w:id="262" w:name="_mioConsistencyCheck206"/>
       <w:r>
         <w:rPr>
           <w:rFonts w:ascii="Courier New" w:hAnsi="Courier New" w:cs="Courier New"/>
@@ -28348,7 +28512,7 @@
         <w:t>{</w:t>
       </w:r>
     </w:p>
-    <w:bookmarkEnd w:id="261"/>
+    <w:bookmarkEnd w:id="262"/>
     <w:p>
       <w:pPr>
         <w:autoSpaceDE w:val="0"/>
@@ -28371,7 +28535,7 @@
         </w:rPr>
         <w:t xml:space="preserve">    </w:t>
       </w:r>
-      <w:bookmarkStart w:id="262" w:name="_mioConsistencyCheck207"/>
+      <w:bookmarkStart w:id="263" w:name="_mioConsistencyCheck207"/>
       <w:proofErr w:type="spellStart"/>
       <w:r>
         <w:rPr>
@@ -28641,8 +28805,8 @@
           <w:szCs w:val="18"/>
         </w:rPr>
       </w:pPr>
-      <w:bookmarkStart w:id="263" w:name="_mioConsistencyCheck208"/>
-      <w:bookmarkEnd w:id="262"/>
+      <w:bookmarkStart w:id="264" w:name="_mioConsistencyCheck208"/>
+      <w:bookmarkEnd w:id="263"/>
       <w:r>
         <w:rPr>
           <w:rFonts w:ascii="Courier New" w:hAnsi="Courier New" w:cs="Courier New"/>
@@ -28698,8 +28862,8 @@
           <w:szCs w:val="18"/>
         </w:rPr>
       </w:pPr>
-      <w:bookmarkStart w:id="264" w:name="_mioConsistencyCheck209"/>
-      <w:bookmarkEnd w:id="263"/>
+      <w:bookmarkStart w:id="265" w:name="_mioConsistencyCheck209"/>
+      <w:bookmarkEnd w:id="264"/>
       <w:r>
         <w:rPr>
           <w:rFonts w:ascii="Courier New" w:hAnsi="Courier New" w:cs="Courier New"/>
@@ -28732,8 +28896,8 @@
           <w:szCs w:val="18"/>
         </w:rPr>
       </w:pPr>
-      <w:bookmarkStart w:id="265" w:name="_mioConsistencyCheck210"/>
-      <w:bookmarkEnd w:id="264"/>
+      <w:bookmarkStart w:id="266" w:name="_mioConsistencyCheck210"/>
+      <w:bookmarkEnd w:id="265"/>
       <w:r>
         <w:rPr>
           <w:rFonts w:ascii="Courier New" w:hAnsi="Courier New" w:cs="Courier New"/>
@@ -28788,8 +28952,8 @@
           <w:szCs w:val="18"/>
         </w:rPr>
       </w:pPr>
-      <w:bookmarkStart w:id="266" w:name="_mioConsistencyCheck211"/>
-      <w:bookmarkEnd w:id="265"/>
+      <w:bookmarkStart w:id="267" w:name="_mioConsistencyCheck211"/>
+      <w:bookmarkEnd w:id="266"/>
       <w:r>
         <w:rPr>
           <w:rFonts w:ascii="Courier New" w:hAnsi="Courier New" w:cs="Courier New"/>
@@ -29051,8 +29215,8 @@
           <w:szCs w:val="18"/>
         </w:rPr>
       </w:pPr>
-      <w:bookmarkStart w:id="267" w:name="_mioConsistencyCheck212"/>
-      <w:bookmarkEnd w:id="266"/>
+      <w:bookmarkStart w:id="268" w:name="_mioConsistencyCheck212"/>
+      <w:bookmarkEnd w:id="267"/>
       <w:r>
         <w:rPr>
           <w:rFonts w:ascii="Courier New" w:hAnsi="Courier New" w:cs="Courier New"/>
@@ -29170,8 +29334,8 @@
           <w:szCs w:val="18"/>
         </w:rPr>
       </w:pPr>
-      <w:bookmarkStart w:id="268" w:name="_mioConsistencyCheck213"/>
-      <w:bookmarkEnd w:id="267"/>
+      <w:bookmarkStart w:id="269" w:name="_mioConsistencyCheck213"/>
+      <w:bookmarkEnd w:id="268"/>
       <w:r>
         <w:rPr>
           <w:rFonts w:ascii="Courier New" w:hAnsi="Courier New" w:cs="Courier New"/>
@@ -29266,8 +29430,8 @@
           <w:szCs w:val="18"/>
         </w:rPr>
       </w:pPr>
-      <w:bookmarkStart w:id="269" w:name="_mioConsistencyCheck214"/>
-      <w:bookmarkEnd w:id="268"/>
+      <w:bookmarkStart w:id="270" w:name="_mioConsistencyCheck214"/>
+      <w:bookmarkEnd w:id="269"/>
       <w:r>
         <w:rPr>
           <w:rFonts w:ascii="Courier New" w:hAnsi="Courier New" w:cs="Courier New"/>
@@ -29509,8 +29673,8 @@
           <w:szCs w:val="18"/>
         </w:rPr>
       </w:pPr>
-      <w:bookmarkStart w:id="270" w:name="_mioConsistencyCheck215"/>
-      <w:bookmarkEnd w:id="269"/>
+      <w:bookmarkStart w:id="271" w:name="_mioConsistencyCheck215"/>
+      <w:bookmarkEnd w:id="270"/>
       <w:r>
         <w:rPr>
           <w:rFonts w:ascii="Courier New" w:hAnsi="Courier New" w:cs="Courier New"/>
@@ -29597,8 +29761,8 @@
           <w:szCs w:val="18"/>
         </w:rPr>
       </w:pPr>
-      <w:bookmarkStart w:id="271" w:name="_mioConsistencyCheck216"/>
-      <w:bookmarkEnd w:id="270"/>
+      <w:bookmarkStart w:id="272" w:name="_mioConsistencyCheck216"/>
+      <w:bookmarkEnd w:id="271"/>
       <w:r>
         <w:rPr>
           <w:rFonts w:ascii="Courier New" w:hAnsi="Courier New" w:cs="Courier New"/>
@@ -29654,8 +29818,8 @@
           <w:szCs w:val="18"/>
         </w:rPr>
       </w:pPr>
-      <w:bookmarkStart w:id="272" w:name="_mioConsistencyCheck217"/>
-      <w:bookmarkEnd w:id="271"/>
+      <w:bookmarkStart w:id="273" w:name="_mioConsistencyCheck217"/>
+      <w:bookmarkEnd w:id="272"/>
       <w:r>
         <w:rPr>
           <w:rFonts w:ascii="Courier New" w:hAnsi="Courier New" w:cs="Courier New"/>
@@ -29688,8 +29852,8 @@
           <w:szCs w:val="18"/>
         </w:rPr>
       </w:pPr>
-      <w:bookmarkStart w:id="273" w:name="_mioConsistencyCheck218"/>
-      <w:bookmarkEnd w:id="272"/>
+      <w:bookmarkStart w:id="274" w:name="_mioConsistencyCheck218"/>
+      <w:bookmarkEnd w:id="273"/>
       <w:r>
         <w:rPr>
           <w:rFonts w:ascii="Courier New" w:hAnsi="Courier New" w:cs="Courier New"/>
@@ -29753,8 +29917,8 @@
           <w:szCs w:val="18"/>
         </w:rPr>
       </w:pPr>
-      <w:bookmarkStart w:id="274" w:name="_mioConsistencyCheck219"/>
-      <w:bookmarkEnd w:id="273"/>
+      <w:bookmarkStart w:id="275" w:name="_mioConsistencyCheck219"/>
+      <w:bookmarkEnd w:id="274"/>
       <w:r>
         <w:rPr>
           <w:rFonts w:ascii="Courier New" w:hAnsi="Courier New" w:cs="Courier New"/>
@@ -29976,8 +30140,8 @@
           <w:szCs w:val="18"/>
         </w:rPr>
       </w:pPr>
-      <w:bookmarkStart w:id="275" w:name="_mioConsistencyCheck220"/>
-      <w:bookmarkEnd w:id="274"/>
+      <w:bookmarkStart w:id="276" w:name="_mioConsistencyCheck220"/>
+      <w:bookmarkEnd w:id="275"/>
       <w:r>
         <w:rPr>
           <w:rFonts w:ascii="Courier New" w:hAnsi="Courier New" w:cs="Courier New"/>
@@ -30033,8 +30197,8 @@
           <w:szCs w:val="18"/>
         </w:rPr>
       </w:pPr>
-      <w:bookmarkStart w:id="276" w:name="_mioConsistencyCheck221"/>
-      <w:bookmarkEnd w:id="275"/>
+      <w:bookmarkStart w:id="277" w:name="_mioConsistencyCheck221"/>
+      <w:bookmarkEnd w:id="276"/>
       <w:r>
         <w:rPr>
           <w:rFonts w:ascii="Courier New" w:hAnsi="Courier New" w:cs="Courier New"/>
@@ -30067,8 +30231,8 @@
           <w:szCs w:val="18"/>
         </w:rPr>
       </w:pPr>
-      <w:bookmarkStart w:id="277" w:name="_mioConsistencyCheck222"/>
-      <w:bookmarkEnd w:id="276"/>
+      <w:bookmarkStart w:id="278" w:name="_mioConsistencyCheck222"/>
+      <w:bookmarkEnd w:id="277"/>
       <w:r>
         <w:rPr>
           <w:rFonts w:ascii="Courier New" w:hAnsi="Courier New" w:cs="Courier New"/>
@@ -30101,8 +30265,8 @@
           <w:szCs w:val="18"/>
         </w:rPr>
       </w:pPr>
-      <w:bookmarkStart w:id="278" w:name="_mioConsistencyCheck223"/>
-      <w:bookmarkEnd w:id="277"/>
+      <w:bookmarkStart w:id="279" w:name="_mioConsistencyCheck223"/>
+      <w:bookmarkEnd w:id="278"/>
       <w:r>
         <w:rPr>
           <w:rFonts w:ascii="Courier New" w:hAnsi="Courier New" w:cs="Courier New"/>
@@ -30166,8 +30330,8 @@
           <w:szCs w:val="18"/>
         </w:rPr>
       </w:pPr>
-      <w:bookmarkStart w:id="279" w:name="_mioConsistencyCheck224"/>
-      <w:bookmarkEnd w:id="278"/>
+      <w:bookmarkStart w:id="280" w:name="_mioConsistencyCheck224"/>
+      <w:bookmarkEnd w:id="279"/>
       <w:r>
         <w:rPr>
           <w:rFonts w:ascii="Courier New" w:hAnsi="Courier New" w:cs="Courier New"/>
@@ -30389,8 +30553,8 @@
           <w:szCs w:val="18"/>
         </w:rPr>
       </w:pPr>
-      <w:bookmarkStart w:id="280" w:name="_mioConsistencyCheck225"/>
-      <w:bookmarkEnd w:id="279"/>
+      <w:bookmarkStart w:id="281" w:name="_mioConsistencyCheck225"/>
+      <w:bookmarkEnd w:id="280"/>
       <w:r>
         <w:rPr>
           <w:rFonts w:ascii="Courier New" w:hAnsi="Courier New" w:cs="Courier New"/>
@@ -30489,8 +30653,8 @@
           <w:szCs w:val="18"/>
         </w:rPr>
       </w:pPr>
-      <w:bookmarkStart w:id="281" w:name="_mioConsistencyCheck226"/>
-      <w:bookmarkEnd w:id="280"/>
+      <w:bookmarkStart w:id="282" w:name="_mioConsistencyCheck226"/>
+      <w:bookmarkEnd w:id="281"/>
       <w:r>
         <w:rPr>
           <w:rFonts w:ascii="Courier New" w:hAnsi="Courier New" w:cs="Courier New"/>
@@ -30523,8 +30687,8 @@
           <w:szCs w:val="18"/>
         </w:rPr>
       </w:pPr>
-      <w:bookmarkStart w:id="282" w:name="_mioConsistencyCheck227"/>
-      <w:bookmarkEnd w:id="281"/>
+      <w:bookmarkStart w:id="283" w:name="_mioConsistencyCheck227"/>
+      <w:bookmarkEnd w:id="282"/>
       <w:r>
         <w:rPr>
           <w:rFonts w:ascii="Courier New" w:hAnsi="Courier New" w:cs="Courier New"/>
@@ -30590,7 +30754,7 @@
         <w:t xml:space="preserve">        }</w:t>
       </w:r>
     </w:p>
-    <w:bookmarkEnd w:id="282"/>
+    <w:bookmarkEnd w:id="283"/>
     <w:p>
       <w:pPr>
         <w:autoSpaceDE w:val="0"/>
@@ -30628,7 +30792,7 @@
         </w:rPr>
         <w:t xml:space="preserve">    </w:t>
       </w:r>
-      <w:bookmarkStart w:id="283" w:name="_mioConsistencyCheck228"/>
+      <w:bookmarkStart w:id="284" w:name="_mioConsistencyCheck228"/>
       <w:r>
         <w:rPr>
           <w:rFonts w:ascii="Courier New" w:hAnsi="Courier New" w:cs="Courier New"/>
@@ -30662,7 +30826,7 @@
         <w:t>(&amp;task0_queue1)) */</w:t>
       </w:r>
     </w:p>
-    <w:bookmarkEnd w:id="283"/>
+    <w:bookmarkEnd w:id="284"/>
     <w:p>
       <w:pPr>
         <w:autoSpaceDE w:val="0"/>
@@ -30844,7 +31008,7 @@
           <w:szCs w:val="18"/>
         </w:rPr>
       </w:pPr>
-      <w:bookmarkStart w:id="284" w:name="_mioConsistencyCheck229"/>
+      <w:bookmarkStart w:id="285" w:name="_mioConsistencyCheck229"/>
       <w:r>
         <w:rPr>
           <w:rFonts w:ascii="Courier New" w:hAnsi="Courier New" w:cs="Courier New"/>
@@ -30921,7 +31085,7 @@
         <w:t xml:space="preserve">        /* Generate a random number */</w:t>
       </w:r>
     </w:p>
-    <w:bookmarkEnd w:id="284"/>
+    <w:bookmarkEnd w:id="285"/>
     <w:p>
       <w:pPr>
         <w:autoSpaceDE w:val="0"/>
@@ -30944,7 +31108,7 @@
         </w:rPr>
         <w:t xml:space="preserve">        </w:t>
       </w:r>
-      <w:bookmarkStart w:id="285" w:name="_mioConsistencyCheck230"/>
+      <w:bookmarkStart w:id="286" w:name="_mioConsistencyCheck230"/>
       <w:proofErr w:type="spellStart"/>
       <w:r>
         <w:rPr>
@@ -31428,7 +31592,7 @@
         <w:t xml:space="preserve">        }</w:t>
       </w:r>
     </w:p>
-    <w:bookmarkEnd w:id="285"/>
+    <w:bookmarkEnd w:id="286"/>
     <w:p>
       <w:pPr>
         <w:autoSpaceDE w:val="0"/>
@@ -31465,7 +31629,7 @@
         </w:rPr>
         <w:t xml:space="preserve">        </w:t>
       </w:r>
-      <w:bookmarkStart w:id="286" w:name="_mioConsistencyCheck231"/>
+      <w:bookmarkStart w:id="287" w:name="_mioConsistencyCheck231"/>
       <w:proofErr w:type="spellStart"/>
       <w:r>
         <w:rPr>
@@ -31542,7 +31706,7 @@
         <w:t xml:space="preserve"> */</w:t>
       </w:r>
     </w:p>
-    <w:bookmarkEnd w:id="286"/>
+    <w:bookmarkEnd w:id="287"/>
     <w:p>
       <w:pPr>
         <w:pStyle w:val="NormalWeb"/>
@@ -31880,7 +32044,7 @@
           <w:szCs w:val="18"/>
         </w:rPr>
       </w:pPr>
-      <w:bookmarkStart w:id="287" w:name="_mioConsistencyCheck232"/>
+      <w:bookmarkStart w:id="288" w:name="_mioConsistencyCheck232"/>
       <w:r>
         <w:rPr>
           <w:rFonts w:ascii="Courier New" w:hAnsi="Courier New" w:cs="Courier New"/>
@@ -32014,7 +32178,7 @@
         <w:t xml:space="preserve">    /* Get the Watchdog Interrupt Status */</w:t>
       </w:r>
     </w:p>
-    <w:bookmarkEnd w:id="287"/>
+    <w:bookmarkEnd w:id="288"/>
     <w:p>
       <w:pPr>
         <w:autoSpaceDE w:val="0"/>
@@ -32037,7 +32201,7 @@
         </w:rPr>
         <w:t xml:space="preserve">    </w:t>
       </w:r>
-      <w:bookmarkStart w:id="288" w:name="_mioConsistencyCheck233"/>
+      <w:bookmarkStart w:id="289" w:name="_mioConsistencyCheck233"/>
       <w:proofErr w:type="spellStart"/>
       <w:r>
         <w:rPr>
@@ -32182,7 +32346,7 @@
         <w:t xml:space="preserve">        /* Clear Watchdog Interrupt */</w:t>
       </w:r>
     </w:p>
-    <w:bookmarkEnd w:id="288"/>
+    <w:bookmarkEnd w:id="289"/>
     <w:p>
       <w:pPr>
         <w:autoSpaceDE w:val="0"/>
@@ -32205,7 +32369,7 @@
         </w:rPr>
         <w:t xml:space="preserve">        </w:t>
       </w:r>
-      <w:bookmarkStart w:id="289" w:name="_mioConsistencyCheck234"/>
+      <w:bookmarkStart w:id="290" w:name="_mioConsistencyCheck234"/>
       <w:proofErr w:type="spellStart"/>
       <w:r>
         <w:rPr>
@@ -32227,7 +32391,7 @@
         <w:t>(MCWDT_HW, CY_MCWDT_CTR0);</w:t>
       </w:r>
     </w:p>
-    <w:bookmarkEnd w:id="289"/>
+    <w:bookmarkEnd w:id="290"/>
     <w:p>
       <w:pPr>
         <w:autoSpaceDE w:val="0"/>
@@ -32265,7 +32429,7 @@
         </w:rPr>
         <w:t xml:space="preserve">        </w:t>
       </w:r>
-      <w:bookmarkStart w:id="290" w:name="_mioConsistencyCheck235"/>
+      <w:bookmarkStart w:id="291" w:name="_mioConsistencyCheck235"/>
       <w:r>
         <w:rPr>
           <w:rFonts w:ascii="Courier New" w:hAnsi="Courier New" w:cs="Courier New"/>
@@ -32277,7 +32441,7 @@
         <w:t>wdt_flag = WDT_FLAG_SET;</w:t>
       </w:r>
     </w:p>
-    <w:bookmarkEnd w:id="290"/>
+    <w:bookmarkEnd w:id="291"/>
     <w:p>
       <w:pPr>
         <w:autoSpaceDE w:val="0"/>
@@ -32301,7 +32465,7 @@
         </w:rPr>
         <w:t xml:space="preserve">    </w:t>
       </w:r>
-      <w:bookmarkStart w:id="291" w:name="_mioConsistencyCheck236"/>
+      <w:bookmarkStart w:id="292" w:name="_mioConsistencyCheck236"/>
       <w:r>
         <w:rPr>
           <w:rFonts w:ascii="Courier New" w:hAnsi="Courier New" w:cs="Courier New"/>
@@ -32335,7 +32499,7 @@
         <w:t>}</w:t>
       </w:r>
     </w:p>
-    <w:bookmarkEnd w:id="291"/>
+    <w:bookmarkEnd w:id="292"/>
     <w:p>
       <w:pPr>
         <w:pStyle w:val="Body"/>
@@ -32574,7 +32738,7 @@
                     </pic:cNvPicPr>
                   </pic:nvPicPr>
                   <pic:blipFill>
-                    <a:blip r:embed="rId71">
+                    <a:blip r:embed="rId72">
                       <a:extLst>
                         <a:ext uri="{28A0092B-C50C-407E-A947-70E740481C1C}">
                           <a14:useLocalDpi xmlns:a14="http://schemas.microsoft.com/office/drawing/2010/main" val="0"/>
@@ -32904,7 +33068,7 @@
           <w:szCs w:val="18"/>
         </w:rPr>
       </w:pPr>
-      <w:bookmarkStart w:id="292" w:name="_mioConsistencyCheck237"/>
+      <w:bookmarkStart w:id="293" w:name="_mioConsistencyCheck237"/>
       <w:r>
         <w:rPr>
           <w:rFonts w:ascii="Courier New" w:hAnsi="Courier New" w:cs="Courier New"/>
@@ -32935,7 +33099,7 @@
         <w:t>"</w:t>
       </w:r>
     </w:p>
-    <w:bookmarkEnd w:id="292"/>
+    <w:bookmarkEnd w:id="293"/>
     <w:p>
       <w:pPr>
         <w:autoSpaceDE w:val="0"/>
@@ -33032,7 +33196,7 @@
           <w:szCs w:val="18"/>
         </w:rPr>
       </w:pPr>
-      <w:bookmarkStart w:id="293" w:name="_mioConsistencyCheck238"/>
+      <w:bookmarkStart w:id="294" w:name="_mioConsistencyCheck238"/>
       <w:r>
         <w:rPr>
           <w:rFonts w:ascii="Courier New" w:hAnsi="Courier New" w:cs="Courier New"/>
@@ -33132,7 +33296,7 @@
         <w:t>#define BTN_DEBOUNCE_DELAY_MS (100U)</w:t>
       </w:r>
     </w:p>
-    <w:bookmarkEnd w:id="293"/>
+    <w:bookmarkEnd w:id="294"/>
     <w:p>
       <w:pPr>
         <w:autoSpaceDE w:val="0"/>
@@ -33229,7 +33393,7 @@
           <w:szCs w:val="18"/>
         </w:rPr>
       </w:pPr>
-      <w:bookmarkStart w:id="294" w:name="_mioConsistencyCheck239"/>
+      <w:bookmarkStart w:id="295" w:name="_mioConsistencyCheck239"/>
       <w:r>
         <w:rPr>
           <w:rFonts w:ascii="Courier New" w:hAnsi="Courier New" w:cs="Courier New"/>
@@ -33369,7 +33533,7 @@
         <w:t xml:space="preserve"> = BTN_INIT_VAL;</w:t>
       </w:r>
     </w:p>
-    <w:bookmarkEnd w:id="294"/>
+    <w:bookmarkEnd w:id="295"/>
     <w:p>
       <w:pPr>
         <w:pStyle w:val="Body"/>
@@ -33566,7 +33730,7 @@
           <w:szCs w:val="18"/>
         </w:rPr>
       </w:pPr>
-      <w:bookmarkStart w:id="295" w:name="_mioConsistencyCheck240"/>
+      <w:bookmarkStart w:id="296" w:name="_mioConsistencyCheck240"/>
       <w:r>
         <w:rPr>
           <w:rFonts w:ascii="Courier New" w:hAnsi="Courier New" w:cs="Courier New"/>
@@ -33637,7 +33801,7 @@
         <w:t xml:space="preserve"> event);</w:t>
       </w:r>
     </w:p>
-    <w:bookmarkEnd w:id="295"/>
+    <w:bookmarkEnd w:id="296"/>
     <w:p>
       <w:pPr>
         <w:autoSpaceDE w:val="0"/>
@@ -33734,7 +33898,7 @@
           <w:szCs w:val="18"/>
         </w:rPr>
       </w:pPr>
-      <w:bookmarkStart w:id="296" w:name="_mioConsistencyCheck241"/>
+      <w:bookmarkStart w:id="297" w:name="_mioConsistencyCheck241"/>
       <w:r>
         <w:rPr>
           <w:rFonts w:ascii="Courier New" w:hAnsi="Courier New" w:cs="Courier New"/>
@@ -34109,7 +34273,7 @@
         <w:t>};</w:t>
       </w:r>
     </w:p>
-    <w:bookmarkEnd w:id="296"/>
+    <w:bookmarkEnd w:id="297"/>
     <w:p>
       <w:pPr>
         <w:pStyle w:val="TableTitle"/>
@@ -34366,7 +34530,7 @@
         </w:rPr>
         <w:t xml:space="preserve">    </w:t>
       </w:r>
-      <w:bookmarkStart w:id="297" w:name="_mioConsistencyCheck242"/>
+      <w:bookmarkStart w:id="298" w:name="_mioConsistencyCheck242"/>
       <w:proofErr w:type="spellStart"/>
       <w:r>
         <w:rPr>
@@ -34388,7 +34552,7 @@
         <w:t xml:space="preserve"> result;</w:t>
       </w:r>
     </w:p>
-    <w:bookmarkEnd w:id="297"/>
+    <w:bookmarkEnd w:id="298"/>
     <w:p>
       <w:pPr>
         <w:autoSpaceDE w:val="0"/>
@@ -34412,7 +34576,7 @@
         </w:rPr>
         <w:t xml:space="preserve">    </w:t>
       </w:r>
-      <w:bookmarkStart w:id="298" w:name="_mioConsistencyCheck243"/>
+      <w:bookmarkStart w:id="299" w:name="_mioConsistencyCheck243"/>
       <w:r>
         <w:rPr>
           <w:rFonts w:ascii="Courier New" w:hAnsi="Courier New" w:cs="Courier New"/>
@@ -34449,7 +34613,7 @@
         <w:t xml:space="preserve">    cyhal_ipc_t task1_queue2;</w:t>
       </w:r>
     </w:p>
-    <w:bookmarkEnd w:id="298"/>
+    <w:bookmarkEnd w:id="299"/>
     <w:p>
       <w:pPr>
         <w:autoSpaceDE w:val="0"/>
@@ -34488,7 +34652,7 @@
         </w:rPr>
         <w:t xml:space="preserve">    </w:t>
       </w:r>
-      <w:bookmarkStart w:id="299" w:name="_mioConsistencyCheck244"/>
+      <w:bookmarkStart w:id="300" w:name="_mioConsistencyCheck244"/>
       <w:r>
         <w:rPr>
           <w:rFonts w:ascii="Courier New" w:hAnsi="Courier New" w:cs="Courier New"/>
@@ -34522,7 +34686,7 @@
         <w:t xml:space="preserve">    uint32_t task1_msg;</w:t>
       </w:r>
     </w:p>
-    <w:bookmarkEnd w:id="299"/>
+    <w:bookmarkEnd w:id="300"/>
     <w:p>
       <w:pPr>
         <w:pStyle w:val="Body"/>
@@ -34727,7 +34891,7 @@
           <w:szCs w:val="18"/>
         </w:rPr>
       </w:pPr>
-      <w:bookmarkStart w:id="300" w:name="_mioConsistencyCheck245"/>
+      <w:bookmarkStart w:id="301" w:name="_mioConsistencyCheck245"/>
       <w:r>
         <w:rPr>
           <w:rFonts w:ascii="Courier New" w:hAnsi="Courier New" w:cs="Courier New"/>
@@ -34873,7 +35037,7 @@
         <w:t xml:space="preserve">    }</w:t>
       </w:r>
     </w:p>
-    <w:bookmarkEnd w:id="300"/>
+    <w:bookmarkEnd w:id="301"/>
     <w:p>
       <w:pPr>
         <w:pStyle w:val="Body"/>
@@ -35129,7 +35293,7 @@
         </w:rPr>
         <w:t xml:space="preserve">    </w:t>
       </w:r>
-      <w:bookmarkStart w:id="301" w:name="_mioConsistencyCheck246"/>
+      <w:bookmarkStart w:id="302" w:name="_mioConsistencyCheck246"/>
       <w:r>
         <w:rPr>
           <w:rFonts w:ascii="Courier New" w:hAnsi="Courier New" w:cs="Courier New"/>
@@ -35252,7 +35416,7 @@
         <w:t xml:space="preserve">    }</w:t>
       </w:r>
     </w:p>
-    <w:bookmarkEnd w:id="301"/>
+    <w:bookmarkEnd w:id="302"/>
     <w:p>
       <w:pPr>
         <w:pStyle w:val="NormalWeb"/>
@@ -35466,7 +35630,7 @@
           <w:szCs w:val="18"/>
         </w:rPr>
       </w:pPr>
-      <w:bookmarkStart w:id="302" w:name="_mioConsistencyCheck247"/>
+      <w:bookmarkStart w:id="303" w:name="_mioConsistencyCheck247"/>
       <w:r>
         <w:rPr>
           <w:rFonts w:ascii="Courier New" w:hAnsi="Courier New" w:cs="Courier New"/>
@@ -35580,7 +35744,7 @@
         <w:t>{</w:t>
       </w:r>
     </w:p>
-    <w:bookmarkEnd w:id="302"/>
+    <w:bookmarkEnd w:id="303"/>
     <w:p>
       <w:pPr>
         <w:autoSpaceDE w:val="0"/>
@@ -35603,7 +35767,7 @@
         </w:rPr>
         <w:t xml:space="preserve">    </w:t>
       </w:r>
-      <w:bookmarkStart w:id="303" w:name="_mioConsistencyCheck248"/>
+      <w:bookmarkStart w:id="304" w:name="_mioConsistencyCheck248"/>
       <w:r>
         <w:rPr>
           <w:rFonts w:ascii="Courier New" w:hAnsi="Courier New" w:cs="Courier New"/>
@@ -35794,8 +35958,8 @@
           <w:lang w:eastAsia="en-US"/>
         </w:rPr>
       </w:pPr>
-      <w:bookmarkStart w:id="304" w:name="_mioConsistencyCheck65"/>
-      <w:bookmarkEnd w:id="303"/>
+      <w:bookmarkStart w:id="305" w:name="_mioConsistencyCheck65"/>
+      <w:bookmarkEnd w:id="304"/>
       <w:r>
         <w:rPr>
           <w:rFonts w:ascii="Courier New" w:hAnsi="Courier New" w:cs="Courier New"/>
@@ -35807,7 +35971,7 @@
         <w:t xml:space="preserve"> CYHAL_GPIO_DRIVE_STRONG, CYBSP_LED_STATE_OFF);</w:t>
       </w:r>
     </w:p>
-    <w:bookmarkEnd w:id="304"/>
+    <w:bookmarkEnd w:id="305"/>
     <w:p>
       <w:pPr>
         <w:pStyle w:val="Body"/>
@@ -35973,7 +36137,7 @@
           <w:szCs w:val="18"/>
         </w:rPr>
       </w:pPr>
-      <w:bookmarkStart w:id="305" w:name="_mioConsistencyCheck249"/>
+      <w:bookmarkStart w:id="306" w:name="_mioConsistencyCheck249"/>
       <w:proofErr w:type="spellStart"/>
       <w:r>
         <w:rPr>
@@ -36254,8 +36418,8 @@
           <w:szCs w:val="18"/>
         </w:rPr>
       </w:pPr>
-      <w:bookmarkStart w:id="306" w:name="_mioConsistencyCheck291"/>
-      <w:bookmarkStart w:id="307" w:name="_mioConsistencyCheck72"/>
+      <w:bookmarkStart w:id="307" w:name="_mioConsistencyCheck291"/>
+      <w:bookmarkStart w:id="308" w:name="_mioConsistencyCheck72"/>
       <w:r>
         <w:rPr>
           <w:rFonts w:ascii="Courier New" w:hAnsi="Courier New" w:cs="Courier New"/>
@@ -36265,8 +36429,8 @@
         </w:rPr>
         <w:t>PSOC</w:t>
       </w:r>
-      <w:bookmarkEnd w:id="306"/>
       <w:bookmarkEnd w:id="307"/>
+      <w:bookmarkEnd w:id="308"/>
       <w:r>
         <w:rPr>
           <w:rFonts w:ascii="Courier New" w:hAnsi="Courier New" w:cs="Courier New"/>
@@ -36490,7 +36654,7 @@
         <w:t xml:space="preserve"> = false;</w:t>
       </w:r>
     </w:p>
-    <w:bookmarkEnd w:id="305"/>
+    <w:bookmarkEnd w:id="306"/>
     <w:p>
       <w:pPr>
         <w:pStyle w:val="NormalWeb"/>
@@ -36539,7 +36703,7 @@
           <w:lang w:val="en-IN"/>
         </w:rPr>
       </w:pPr>
-      <w:bookmarkStart w:id="308" w:name="_mioConsistencyCheck119"/>
+      <w:bookmarkStart w:id="309" w:name="_mioConsistencyCheck119"/>
       <w:r>
         <w:rPr>
           <w:rFonts w:ascii="Source Sans 3" w:hAnsi="Source Sans 3"/>
@@ -36612,7 +36776,7 @@
         <w:t xml:space="preserve">IPC handles </w:t>
       </w:r>
     </w:p>
-    <w:bookmarkEnd w:id="308"/>
+    <w:bookmarkEnd w:id="309"/>
     <w:p>
       <w:pPr>
         <w:pStyle w:val="TableTitle"/>
@@ -36674,7 +36838,7 @@
           <w:szCs w:val="18"/>
         </w:rPr>
       </w:pPr>
-      <w:bookmarkStart w:id="309" w:name="_mioConsistencyCheck250"/>
+      <w:bookmarkStart w:id="310" w:name="_mioConsistencyCheck250"/>
       <w:r>
         <w:rPr>
           <w:rFonts w:ascii="Courier New" w:hAnsi="Courier New" w:cs="Courier New"/>
@@ -36708,7 +36872,7 @@
         <w:t>{</w:t>
       </w:r>
     </w:p>
-    <w:bookmarkEnd w:id="309"/>
+    <w:bookmarkEnd w:id="310"/>
     <w:p>
       <w:pPr>
         <w:autoSpaceDE w:val="0"/>
@@ -36745,7 +36909,7 @@
         </w:rPr>
         <w:t xml:space="preserve">    </w:t>
       </w:r>
-      <w:bookmarkStart w:id="310" w:name="_mioConsistencyCheck251"/>
+      <w:bookmarkStart w:id="311" w:name="_mioConsistencyCheck251"/>
       <w:proofErr w:type="spellStart"/>
       <w:r>
         <w:rPr>
@@ -36870,7 +37034,7 @@
         <w:t xml:space="preserve">        /* Button debounce delay */</w:t>
       </w:r>
     </w:p>
-    <w:bookmarkEnd w:id="310"/>
+    <w:bookmarkEnd w:id="311"/>
     <w:p>
       <w:pPr>
         <w:autoSpaceDE w:val="0"/>
@@ -36893,7 +37057,7 @@
         </w:rPr>
         <w:t xml:space="preserve">        </w:t>
       </w:r>
-      <w:bookmarkStart w:id="311" w:name="_mioConsistencyCheck252"/>
+      <w:bookmarkStart w:id="312" w:name="_mioConsistencyCheck252"/>
       <w:proofErr w:type="spellStart"/>
       <w:r>
         <w:rPr>
@@ -37028,8 +37192,8 @@
           <w:szCs w:val="18"/>
         </w:rPr>
       </w:pPr>
-      <w:bookmarkStart w:id="312" w:name="_mioConsistencyCheck253"/>
-      <w:bookmarkEnd w:id="311"/>
+      <w:bookmarkStart w:id="313" w:name="_mioConsistencyCheck253"/>
+      <w:bookmarkEnd w:id="312"/>
       <w:r>
         <w:rPr>
           <w:rFonts w:ascii="Courier New" w:hAnsi="Courier New" w:cs="Courier New"/>
@@ -37142,8 +37306,8 @@
           <w:szCs w:val="18"/>
         </w:rPr>
       </w:pPr>
-      <w:bookmarkStart w:id="313" w:name="_mioConsistencyCheck254"/>
-      <w:bookmarkEnd w:id="312"/>
+      <w:bookmarkStart w:id="314" w:name="_mioConsistencyCheck254"/>
+      <w:bookmarkEnd w:id="313"/>
       <w:r>
         <w:rPr>
           <w:rFonts w:ascii="Courier New" w:hAnsi="Courier New" w:cs="Courier New"/>
@@ -37197,7 +37361,7 @@
         <w:t xml:space="preserve">        }</w:t>
       </w:r>
     </w:p>
-    <w:bookmarkEnd w:id="313"/>
+    <w:bookmarkEnd w:id="314"/>
     <w:p>
       <w:pPr>
         <w:autoSpaceDE w:val="0"/>
@@ -37234,7 +37398,7 @@
         </w:rPr>
         <w:t xml:space="preserve">        </w:t>
       </w:r>
-      <w:bookmarkStart w:id="314" w:name="_mioConsistencyCheck255"/>
+      <w:bookmarkStart w:id="315" w:name="_mioConsistencyCheck255"/>
       <w:proofErr w:type="spellStart"/>
       <w:r>
         <w:rPr>
@@ -37256,7 +37420,7 @@
         <w:t xml:space="preserve"> = false;</w:t>
       </w:r>
     </w:p>
-    <w:bookmarkEnd w:id="314"/>
+    <w:bookmarkEnd w:id="315"/>
     <w:p>
       <w:pPr>
         <w:autoSpaceDE w:val="0"/>
@@ -37279,7 +37443,7 @@
         </w:rPr>
         <w:t xml:space="preserve">        </w:t>
       </w:r>
-      <w:bookmarkStart w:id="315" w:name="_mioConsistencyCheck256"/>
+      <w:bookmarkStart w:id="316" w:name="_mioConsistencyCheck256"/>
       <w:proofErr w:type="spellStart"/>
       <w:r>
         <w:rPr>
@@ -37507,7 +37671,7 @@
         <w:t xml:space="preserve">        {</w:t>
       </w:r>
     </w:p>
-    <w:bookmarkEnd w:id="315"/>
+    <w:bookmarkEnd w:id="316"/>
     <w:p>
       <w:pPr>
         <w:autoSpaceDE w:val="0"/>
@@ -37535,7 +37699,7 @@
           <w:szCs w:val="18"/>
         </w:rPr>
       </w:pPr>
-      <w:bookmarkStart w:id="316" w:name="_mioConsistencyCheck257"/>
+      <w:bookmarkStart w:id="317" w:name="_mioConsistencyCheck257"/>
       <w:r>
         <w:rPr>
           <w:rFonts w:ascii="Courier New" w:hAnsi="Courier New" w:cs="Courier New"/>
@@ -37579,8 +37743,8 @@
           <w:szCs w:val="18"/>
         </w:rPr>
       </w:pPr>
-      <w:bookmarkStart w:id="317" w:name="_mioConsistencyCheck258"/>
-      <w:bookmarkEnd w:id="316"/>
+      <w:bookmarkStart w:id="318" w:name="_mioConsistencyCheck258"/>
+      <w:bookmarkEnd w:id="317"/>
       <w:r>
         <w:rPr>
           <w:rFonts w:ascii="Courier New" w:hAnsi="Courier New" w:cs="Courier New"/>
@@ -37611,7 +37775,7 @@
         <w:t>(&amp;task1_queue2);</w:t>
       </w:r>
     </w:p>
-    <w:bookmarkEnd w:id="317"/>
+    <w:bookmarkEnd w:id="318"/>
     <w:p>
       <w:pPr>
         <w:autoSpaceDE w:val="0"/>
@@ -37653,7 +37817,7 @@
           <w:szCs w:val="18"/>
         </w:rPr>
       </w:pPr>
-      <w:bookmarkStart w:id="318" w:name="_mioConsistencyCheck259"/>
+      <w:bookmarkStart w:id="319" w:name="_mioConsistencyCheck259"/>
       <w:r>
         <w:rPr>
           <w:rFonts w:ascii="Courier New" w:hAnsi="Courier New" w:cs="Courier New"/>
@@ -37697,8 +37861,8 @@
           <w:szCs w:val="18"/>
         </w:rPr>
       </w:pPr>
-      <w:bookmarkStart w:id="319" w:name="_mioConsistencyCheck260"/>
-      <w:bookmarkEnd w:id="318"/>
+      <w:bookmarkStart w:id="320" w:name="_mioConsistencyCheck260"/>
+      <w:bookmarkEnd w:id="319"/>
       <w:r>
         <w:rPr>
           <w:rFonts w:ascii="Courier New" w:hAnsi="Courier New" w:cs="Courier New"/>
@@ -38271,8 +38435,8 @@
           <w:szCs w:val="18"/>
         </w:rPr>
       </w:pPr>
-      <w:bookmarkStart w:id="320" w:name="_mioConsistencyCheck261"/>
-      <w:bookmarkEnd w:id="319"/>
+      <w:bookmarkStart w:id="321" w:name="_mioConsistencyCheck261"/>
+      <w:bookmarkEnd w:id="320"/>
       <w:r>
         <w:rPr>
           <w:rFonts w:ascii="Courier New" w:hAnsi="Courier New" w:cs="Courier New"/>
@@ -38316,8 +38480,8 @@
           <w:szCs w:val="18"/>
         </w:rPr>
       </w:pPr>
-      <w:bookmarkStart w:id="321" w:name="_mioConsistencyCheck262"/>
-      <w:bookmarkEnd w:id="320"/>
+      <w:bookmarkStart w:id="322" w:name="_mioConsistencyCheck262"/>
+      <w:bookmarkEnd w:id="321"/>
       <w:r>
         <w:rPr>
           <w:rFonts w:ascii="Courier New" w:hAnsi="Courier New" w:cs="Courier New"/>
@@ -39030,7 +39194,7 @@
         <w:t>/* close main loop */</w:t>
       </w:r>
     </w:p>
-    <w:bookmarkEnd w:id="321"/>
+    <w:bookmarkEnd w:id="322"/>
     <w:p>
       <w:pPr>
         <w:pStyle w:val="TableTitle"/>
@@ -39065,7 +39229,7 @@
           <w:rFonts w:ascii="Source Sans 3" w:hAnsi="Source Sans 3"/>
         </w:rPr>
       </w:pPr>
-      <w:bookmarkStart w:id="322" w:name="_mioConsistencyCheck120"/>
+      <w:bookmarkStart w:id="323" w:name="_mioConsistencyCheck120"/>
       <w:r>
         <w:rPr>
           <w:rFonts w:ascii="Source Sans 3" w:hAnsi="Source Sans 3"/>
@@ -39136,7 +39300,7 @@
         <w:t>main function</w:t>
       </w:r>
     </w:p>
-    <w:bookmarkEnd w:id="322"/>
+    <w:bookmarkEnd w:id="323"/>
     <w:p>
       <w:pPr>
         <w:pStyle w:val="Body"/>
@@ -39457,7 +39621,7 @@
           <w:lang w:val="en-IN"/>
         </w:rPr>
       </w:pPr>
-      <w:bookmarkStart w:id="323" w:name="_mioConsistencyCheck263"/>
+      <w:bookmarkStart w:id="324" w:name="_mioConsistencyCheck263"/>
       <w:r>
         <w:rPr>
           <w:rFonts w:ascii="Courier New" w:hAnsi="Courier New" w:cs="Courier New"/>
@@ -39632,7 +39796,7 @@
         <w:t xml:space="preserve">    CY_UNUSED_PARAMETER(event);</w:t>
       </w:r>
     </w:p>
-    <w:bookmarkEnd w:id="323"/>
+    <w:bookmarkEnd w:id="324"/>
     <w:p>
       <w:pPr>
         <w:autoSpaceDE w:val="0"/>
@@ -39672,7 +39836,7 @@
         </w:rPr>
         <w:t xml:space="preserve">    </w:t>
       </w:r>
-      <w:bookmarkStart w:id="324" w:name="_mioConsistencyCheck264"/>
+      <w:bookmarkStart w:id="325" w:name="_mioConsistencyCheck264"/>
       <w:proofErr w:type="spellStart"/>
       <w:r>
         <w:rPr>
@@ -39721,7 +39885,7 @@
         <w:t>}</w:t>
       </w:r>
     </w:p>
-    <w:bookmarkEnd w:id="324"/>
+    <w:bookmarkEnd w:id="325"/>
     <w:p>
       <w:pPr>
         <w:pStyle w:val="Body"/>
@@ -39769,7 +39933,7 @@
           <w:lang w:val="en-IN"/>
         </w:rPr>
       </w:pPr>
-      <w:bookmarkStart w:id="325" w:name="_mioConsistencyCheck121"/>
+      <w:bookmarkStart w:id="326" w:name="_mioConsistencyCheck121"/>
       <w:r>
         <w:rPr>
           <w:rFonts w:ascii="Source Sans 3" w:hAnsi="Source Sans 3" w:cs="Consolas"/>
@@ -39923,7 +40087,7 @@
                     </pic:cNvPicPr>
                   </pic:nvPicPr>
                   <pic:blipFill>
-                    <a:blip r:embed="rId72">
+                    <a:blip r:embed="rId73">
                       <a:extLst>
                         <a:ext uri="{28A0092B-C50C-407E-A947-70E740481C1C}">
                           <a14:useLocalDpi xmlns:a14="http://schemas.microsoft.com/office/drawing/2010/main" val="0"/>
@@ -40055,8 +40219,8 @@
           <w:lang w:val="en-IN"/>
         </w:rPr>
       </w:pPr>
-      <w:bookmarkStart w:id="326" w:name="_mioConsistencyCheck122"/>
-      <w:bookmarkEnd w:id="325"/>
+      <w:bookmarkStart w:id="327" w:name="_mioConsistencyCheck122"/>
+      <w:bookmarkEnd w:id="326"/>
       <w:r>
         <w:rPr>
           <w:rFonts w:ascii="Source Sans 3" w:hAnsi="Source Sans 3"/>
@@ -40225,7 +40389,7 @@
                     <pic:cNvPicPr/>
                   </pic:nvPicPr>
                   <pic:blipFill>
-                    <a:blip r:embed="rId73">
+                    <a:blip r:embed="rId74">
                       <a:extLst>
                         <a:ext uri="{28A0092B-C50C-407E-A947-70E740481C1C}">
                           <a14:useLocalDpi xmlns:a14="http://schemas.microsoft.com/office/drawing/2010/main" val="0"/>
@@ -40273,9 +40437,9 @@
           <w:lang w:eastAsia="de-DE"/>
         </w:rPr>
       </w:pPr>
-      <w:bookmarkStart w:id="327" w:name="_Toc212806552"/>
-      <w:bookmarkStart w:id="328" w:name="_mioConsistencyCheck413"/>
-      <w:bookmarkStart w:id="329" w:name="_mioConsistencyCheck118"/>
+      <w:bookmarkStart w:id="328" w:name="_Toc212806552"/>
+      <w:bookmarkStart w:id="329" w:name="_mioConsistencyCheck413"/>
+      <w:bookmarkStart w:id="330" w:name="_mioConsistencyCheck118"/>
       <w:r>
         <w:rPr>
           <w:rFonts w:ascii="Source Sans 3" w:hAnsi="Source Sans 3"/>
@@ -40288,8 +40452,8 @@
         <w:lastRenderedPageBreak/>
         <w:t>Conclusion</w:t>
       </w:r>
-      <w:bookmarkEnd w:id="326"/>
       <w:bookmarkEnd w:id="327"/>
+      <w:bookmarkEnd w:id="328"/>
       <w:r>
         <w:rPr>
           <w:b/>
@@ -40308,9 +40472,9 @@
           <w:rFonts w:ascii="Source Sans 3" w:hAnsi="Source Sans 3"/>
         </w:rPr>
       </w:pPr>
-      <w:bookmarkStart w:id="330" w:name="_mioConsistencyCheck123"/>
-      <w:bookmarkEnd w:id="328"/>
+      <w:bookmarkStart w:id="331" w:name="_mioConsistencyCheck123"/>
       <w:bookmarkEnd w:id="329"/>
+      <w:bookmarkEnd w:id="330"/>
       <w:r>
         <w:rPr>
           <w:rFonts w:ascii="Source Sans 3" w:hAnsi="Source Sans 3"/>
@@ -40330,7 +40494,7 @@
         <w:t xml:space="preserve"> E84 IPC HAL Queue application using Modus Tool Box, figured out to use IPC HAL Libraries and communication between two cores using IPC queues.</w:t>
       </w:r>
     </w:p>
-    <w:bookmarkEnd w:id="330"/>
+    <w:bookmarkEnd w:id="331"/>
     <w:p>
       <w:pPr>
         <w:pStyle w:val="Body"/>
@@ -40345,8 +40509,8 @@
       <w:pPr>
         <w:pStyle w:val="Heading1"/>
       </w:pPr>
-      <w:bookmarkStart w:id="331" w:name="_Toc212806553"/>
-      <w:bookmarkStart w:id="332" w:name="_mioConsistencyCheck124"/>
+      <w:bookmarkStart w:id="332" w:name="_Toc212806553"/>
+      <w:bookmarkStart w:id="333" w:name="_mioConsistencyCheck124"/>
       <w:r>
         <w:rPr>
           <w:rFonts w:ascii="Source Sans 3" w:hAnsi="Source Sans 3"/>
@@ -40354,8 +40518,8 @@
         <w:lastRenderedPageBreak/>
         <w:t>References</w:t>
       </w:r>
-      <w:bookmarkEnd w:id="331"/>
       <w:bookmarkEnd w:id="332"/>
+      <w:bookmarkEnd w:id="333"/>
       <w:r>
         <w:t xml:space="preserve"> </w:t>
       </w:r>
@@ -40372,7 +40536,7 @@
           <w:lang w:eastAsia="de-DE"/>
         </w:rPr>
       </w:pPr>
-      <w:bookmarkStart w:id="333" w:name="_mioConsistencyCheck125"/>
+      <w:bookmarkStart w:id="334" w:name="_mioConsistencyCheck125"/>
       <w:r>
         <w:rPr>
           <w:rFonts w:ascii="Source Sans 3" w:hAnsi="Source Sans 3" w:cs="SourceSansPro"/>
@@ -40400,7 +40564,7 @@
         </w:rPr>
         <w:t>™ Edge E84 MCU on ModusToolbox™</w:t>
       </w:r>
-      <w:bookmarkEnd w:id="333"/>
+      <w:bookmarkEnd w:id="334"/>
       <w:r>
         <w:rPr>
           <w:rFonts w:cs="SourceSansPro"/>
@@ -40411,9 +40575,9 @@
         <w:t xml:space="preserve"> </w:t>
       </w:r>
     </w:p>
-    <w:bookmarkStart w:id="334" w:name="_mioConsistencyCheck126"/>
-    <w:bookmarkStart w:id="335" w:name="_mioConsistencyCheck265"/>
-    <w:bookmarkStart w:id="336" w:name="_mioConsistencyCheck66"/>
+    <w:bookmarkStart w:id="335" w:name="_mioConsistencyCheck126"/>
+    <w:bookmarkStart w:id="336" w:name="_mioConsistencyCheck265"/>
+    <w:bookmarkStart w:id="337" w:name="_mioConsistencyCheck66"/>
     <w:p>
       <w:pPr>
         <w:pStyle w:val="ListParagraph"/>
@@ -40484,9 +40648,9 @@
         </w:rPr>
         <w:fldChar w:fldCharType="end"/>
       </w:r>
-      <w:bookmarkEnd w:id="334"/>
       <w:bookmarkEnd w:id="335"/>
       <w:bookmarkEnd w:id="336"/>
+      <w:bookmarkEnd w:id="337"/>
       <w:r>
         <w:rPr>
           <w:lang w:eastAsia="de-DE"/>
@@ -40498,8 +40662,8 @@
       <w:pPr>
         <w:pStyle w:val="Body"/>
       </w:pPr>
-      <w:bookmarkStart w:id="337" w:name="_mioConsistencyCheck382"/>
-      <w:bookmarkStart w:id="338" w:name="_mioConsistencyCheck111"/>
+      <w:bookmarkStart w:id="338" w:name="_mioConsistencyCheck382"/>
+      <w:bookmarkStart w:id="339" w:name="_mioConsistencyCheck111"/>
     </w:p>
     <w:p>
       <w:pPr>
@@ -40517,7 +40681,7 @@
         </w:rPr>
       </w:pPr>
     </w:p>
-    <w:bookmarkEnd w:id="225"/>
+    <w:bookmarkEnd w:id="226"/>
     <w:p>
       <w:pPr>
         <w:pStyle w:val="FigureTitle"/>
@@ -40525,7 +40689,7 @@
           <w:b/>
         </w:rPr>
         <w:sectPr>
-          <w:headerReference w:type="default" r:id="rId74"/>
+          <w:headerReference w:type="default" r:id="rId75"/>
           <w:footnotePr>
             <w:numRestart w:val="eachPage"/>
           </w:footnotePr>
@@ -40545,16 +40709,16 @@
           <w:lang w:eastAsia="de-DE"/>
         </w:rPr>
       </w:pPr>
-      <w:bookmarkStart w:id="339" w:name="_mioConsistencyCheck419"/>
-    </w:p>
-    <w:bookmarkEnd w:id="339"/>
+      <w:bookmarkStart w:id="340" w:name="_mioConsistencyCheck419"/>
+    </w:p>
+    <w:bookmarkEnd w:id="340"/>
     <w:p>
       <w:pPr>
         <w:pStyle w:val="Body"/>
         <w:sectPr>
-          <w:headerReference w:type="even" r:id="rId75"/>
-          <w:headerReference w:type="default" r:id="rId76"/>
-          <w:footerReference w:type="default" r:id="rId77"/>
+          <w:headerReference w:type="even" r:id="rId76"/>
+          <w:headerReference w:type="default" r:id="rId77"/>
+          <w:footerReference w:type="default" r:id="rId78"/>
           <w:footnotePr>
             <w:numRestart w:val="eachPage"/>
           </w:footnotePr>
@@ -40575,16 +40739,16 @@
           <w:noProof/>
         </w:rPr>
       </w:pPr>
-      <w:bookmarkStart w:id="340" w:name="_mioConsistencyCheck420"/>
-    </w:p>
-    <w:bookmarkEnd w:id="337"/>
+      <w:bookmarkStart w:id="341" w:name="_mioConsistencyCheck420"/>
+    </w:p>
     <w:bookmarkEnd w:id="338"/>
-    <w:bookmarkEnd w:id="340"/>
+    <w:bookmarkEnd w:id="339"/>
+    <w:bookmarkEnd w:id="341"/>
     <w:p/>
     <w:sectPr>
-      <w:headerReference w:type="even" r:id="rId78"/>
-      <w:headerReference w:type="default" r:id="rId79"/>
-      <w:footerReference w:type="default" r:id="rId80"/>
+      <w:headerReference w:type="even" r:id="rId79"/>
+      <w:headerReference w:type="default" r:id="rId80"/>
+      <w:footerReference w:type="default" r:id="rId81"/>
       <w:footnotePr>
         <w:numRestart w:val="eachPage"/>
       </w:footnotePr>
@@ -41591,7 +41755,7 @@
         <v:shape id="_x0000_s2052" type="#_x0000_t75" style="position:absolute;margin-left:-45.75pt;margin-top:62.5pt;width:602.45pt;height:287.2pt;z-index:-251642880;mso-position-horizontal-relative:text;mso-position-vertical-relative:text">
           <v:imagedata r:id="rId1" o:title=""/>
         </v:shape>
-        <o:OLEObject Type="Embed" ProgID="Visio.Drawing.15" ShapeID="_x0000_s2052" DrawAspect="Content" ObjectID="_1823872294" r:id="rId2"/>
+        <o:OLEObject Type="Embed" ProgID="Visio.Drawing.15" ShapeID="_x0000_s2052" DrawAspect="Content" ObjectID="_1823873064" r:id="rId2"/>
       </w:object>
     </w:r>
     <w:r>
@@ -42924,7 +43088,7 @@
         <v:shape id="_x0000_s2051" type="#_x0000_t75" style="position:absolute;margin-left:-45.75pt;margin-top:62.5pt;width:602.45pt;height:287.2pt;z-index:-251643904;mso-position-horizontal-relative:text;mso-position-vertical-relative:text">
           <v:imagedata r:id="rId1" o:title=""/>
         </v:shape>
-        <o:OLEObject Type="Embed" ProgID="Visio.Drawing.15" ShapeID="_x0000_s2051" DrawAspect="Content" ObjectID="_1823872295" r:id="rId2"/>
+        <o:OLEObject Type="Embed" ProgID="Visio.Drawing.15" ShapeID="_x0000_s2051" DrawAspect="Content" ObjectID="_1823873065" r:id="rId2"/>
       </w:object>
     </w:r>
     <w:r>
@@ -43132,8 +43296,8 @@
                                 <w:r>
                                   <w:t>IMPORTANT NOTICE</w:t>
                                 </w:r>
-                                <w:bookmarkStart w:id="341" w:name="ImportantNotice"/>
-                                <w:bookmarkEnd w:id="341"/>
+                                <w:bookmarkStart w:id="342" w:name="ImportantNotice"/>
+                                <w:bookmarkEnd w:id="342"/>
                               </w:p>
                               <w:p>
                                 <w:pPr>
@@ -43439,8 +43603,8 @@
                           <w:r>
                             <w:t>IMPORTANT NOTICE</w:t>
                           </w:r>
-                          <w:bookmarkStart w:id="342" w:name="ImportantNotice"/>
-                          <w:bookmarkEnd w:id="342"/>
+                          <w:bookmarkStart w:id="343" w:name="ImportantNotice"/>
+                          <w:bookmarkEnd w:id="343"/>
                         </w:p>
                         <w:p>
                           <w:pPr>
@@ -49303,7 +49467,7 @@
   <w:abstractNum w:abstractNumId="23" w15:restartNumberingAfterBreak="0">
     <w:nsid w:val="65FD6B6E"/>
     <w:multiLevelType w:val="hybridMultilevel"/>
-    <w:tmpl w:val="C904420E"/>
+    <w:tmpl w:val="63EE3840"/>
     <w:lvl w:ilvl="0" w:tplc="74509132">
       <w:start w:val="3"/>
       <w:numFmt w:val="decimal"/>
@@ -54400,6 +54564,12 @@
       <TimestampUtc>2023-08-07T12:57:01.087Z</TimestampUtc>
       <TextBlockMetadataId>0ce3f8df-95fc-4a8f-b2ee-2a9eabfdcf38</TextBlockMetadataId>
     </TextBlockMetadata>
+    <TextBlockMetadata>
+      <ElementId>1a622969-9435-42df-b756-4af60deadd4b</ElementId>
+      <ContentTag>YzCqVxr4CkGOIjtz8kQsF1txdvNf0IhJnc8A53W8JnY=</ContentTag>
+      <TimestampUtc>2023-08-07T12:57:01.087Z</TimestampUtc>
+      <TextBlockMetadataId>d56a32fe-1575-4527-bdc7-689b99f50dd5</TextBlockMetadataId>
+    </TextBlockMetadata>
   </TextBlockElements>
   <PlaceholderHiddenState>
     <HideablePlaceholderGuids/>
@@ -54447,7 +54617,7 @@
 </file>
 
 <file path=customXml/itemProps4.xml><?xml version="1.0" encoding="utf-8"?>
-<ds:datastoreItem xmlns:ds="http://schemas.openxmlformats.org/officeDocument/2006/customXml" ds:itemID="{301B121F-7553-4D55-A966-F9A16C036061}">
+<ds:datastoreItem xmlns:ds="http://schemas.openxmlformats.org/officeDocument/2006/customXml" ds:itemID="{2645D7AC-B135-440D-AE25-4A480AC2BFDD}">
   <ds:schemaRefs>
     <ds:schemaRef ds:uri="http://www.made-in-office.com/empower/docs/template/v1"/>
   </ds:schemaRefs>
@@ -54455,7 +54625,7 @@
 </file>
 
 <file path=customXml/itemProps5.xml><?xml version="1.0" encoding="utf-8"?>
-<ds:datastoreItem xmlns:ds="http://schemas.openxmlformats.org/officeDocument/2006/customXml" ds:itemID="{5EE51105-22D4-4426-AEF2-E01C667CC721}">
+<ds:datastoreItem xmlns:ds="http://schemas.openxmlformats.org/officeDocument/2006/customXml" ds:itemID="{27ED0896-C364-442C-A09C-1FD29C4F89B0}">
   <ds:schemaRefs>
     <ds:schemaRef ds:uri="http://schemas.openxmlformats.org/officeDocument/2006/bibliography"/>
   </ds:schemaRefs>

</xml_diff>